<commit_message>
FIX EVERYTHING ALL AT ONCE
</commit_message>
<xml_diff>
--- a/backend/templates/Berkas Luar Kota - Laporan.docx
+++ b/backend/templates/Berkas Luar Kota - Laporan.docx
@@ -1,7 +1,12 @@
 
 <file path=word/document.xml><?xml version="1.0" encoding="utf-8"?>
-<w:document xmlns:wpc="http://schemas.microsoft.com/office/word/2010/wordprocessingCanvas" xmlns:cx="http://schemas.microsoft.com/office/drawing/2014/chartex" xmlns:cx1="http://schemas.microsoft.com/office/drawing/2015/9/8/chartex" xmlns:cx2="http://schemas.microsoft.com/office/drawing/2015/10/21/chartex" xmlns:cx3="http://schemas.microsoft.com/office/drawing/2016/5/9/chartex" xmlns:cx4="http://schemas.microsoft.com/office/drawing/2016/5/10/chartex" xmlns:cx5="http://schemas.microsoft.com/office/drawing/2016/5/11/chartex" xmlns:cx6="http://schemas.microsoft.com/office/drawing/2016/5/12/chartex" xmlns:cx7="http://schemas.microsoft.com/office/drawing/2016/5/13/chartex" xmlns:cx8="http://schemas.microsoft.com/office/drawing/2016/5/14/chartex" xmlns:mc="http://schemas.openxmlformats.org/markup-compatibility/2006" xmlns:aink="http://schemas.microsoft.com/office/drawing/2016/ink" xmlns:am3d="http://schemas.microsoft.com/office/drawing/2017/model3d" xmlns:o="urn:schemas-microsoft-com:office:office" xmlns:r="http://schemas.openxmlformats.org/officeDocument/2006/relationships" xmlns:m="http://schemas.openxmlformats.org/officeDocument/2006/math" xmlns:v="urn:schemas-microsoft-com:vml" xmlns:wp14="http://schemas.microsoft.com/office/word/2010/wordprocessingDrawing" xmlns:wp="http://schemas.openxmlformats.org/drawingml/2006/wordprocessingDrawing" xmlns:w10="urn:schemas-microsoft-com:office:word" xmlns:w="http://schemas.openxmlformats.org/wordprocessingml/2006/main" xmlns:w14="http://schemas.microsoft.com/office/word/2010/wordml" xmlns:w15="http://schemas.microsoft.com/office/word/2012/wordml" xmlns:w16cex="http://schemas.microsoft.com/office/word/2018/wordml/cex" xmlns:w16cid="http://schemas.microsoft.com/office/word/2016/wordml/cid" xmlns:w16="http://schemas.microsoft.com/office/word/2018/wordml" xmlns:w16sdtdh="http://schemas.microsoft.com/office/word/2020/wordml/sdtdatahash" xmlns:w16se="http://schemas.microsoft.com/office/word/2015/wordml/symex" xmlns:wpg="http://schemas.microsoft.com/office/word/2010/wordprocessingGroup" xmlns:wpi="http://schemas.microsoft.com/office/word/2010/wordprocessingInk" xmlns:wne="http://schemas.microsoft.com/office/word/2006/wordml" xmlns:wps="http://schemas.microsoft.com/office/word/2010/wordprocessingShape" mc:Ignorable="w14 w15 w16se w16cid w16 w16cex w16sdtdh wp14">
+<w:document xmlns:wpc="http://schemas.microsoft.com/office/word/2010/wordprocessingCanvas" xmlns:cx="http://schemas.microsoft.com/office/drawing/2014/chartex" xmlns:cx1="http://schemas.microsoft.com/office/drawing/2015/9/8/chartex" xmlns:cx2="http://schemas.microsoft.com/office/drawing/2015/10/21/chartex" xmlns:cx3="http://schemas.microsoft.com/office/drawing/2016/5/9/chartex" xmlns:cx4="http://schemas.microsoft.com/office/drawing/2016/5/10/chartex" xmlns:cx5="http://schemas.microsoft.com/office/drawing/2016/5/11/chartex" xmlns:cx6="http://schemas.microsoft.com/office/drawing/2016/5/12/chartex" xmlns:cx7="http://schemas.microsoft.com/office/drawing/2016/5/13/chartex" xmlns:cx8="http://schemas.microsoft.com/office/drawing/2016/5/14/chartex" xmlns:mc="http://schemas.openxmlformats.org/markup-compatibility/2006" xmlns:aink="http://schemas.microsoft.com/office/drawing/2016/ink" xmlns:am3d="http://schemas.microsoft.com/office/drawing/2017/model3d" xmlns:o="urn:schemas-microsoft-com:office:office" xmlns:oel="http://schemas.microsoft.com/office/2019/extlst" xmlns:r="http://schemas.openxmlformats.org/officeDocument/2006/relationships" xmlns:m="http://schemas.openxmlformats.org/officeDocument/2006/math" xmlns:v="urn:schemas-microsoft-com:vml" xmlns:wp14="http://schemas.microsoft.com/office/word/2010/wordprocessingDrawing" xmlns:wp="http://schemas.openxmlformats.org/drawingml/2006/wordprocessingDrawing" xmlns:w10="urn:schemas-microsoft-com:office:word" xmlns:w="http://schemas.openxmlformats.org/wordprocessingml/2006/main" xmlns:w14="http://schemas.microsoft.com/office/word/2010/wordml" xmlns:w15="http://schemas.microsoft.com/office/word/2012/wordml" xmlns:w16cex="http://schemas.microsoft.com/office/word/2018/wordml/cex" xmlns:w16cid="http://schemas.microsoft.com/office/word/2016/wordml/cid" xmlns:w16="http://schemas.microsoft.com/office/word/2018/wordml" xmlns:w16du="http://schemas.microsoft.com/office/word/2023/wordml/word16du" xmlns:w16sdtdh="http://schemas.microsoft.com/office/word/2020/wordml/sdtdatahash" xmlns:w16sdtfl="http://schemas.microsoft.com/office/word/2024/wordml/sdtformatlock" xmlns:w16se="http://schemas.microsoft.com/office/word/2015/wordml/symex" xmlns:wpg="http://schemas.microsoft.com/office/word/2010/wordprocessingGroup" xmlns:wpi="http://schemas.microsoft.com/office/word/2010/wordprocessingInk" xmlns:wne="http://schemas.microsoft.com/office/word/2006/wordml" xmlns:wps="http://schemas.microsoft.com/office/word/2010/wordprocessingShape" mc:Ignorable="w14 w15 w16se w16cid w16 w16cex w16sdtdh w16sdtfl w16du wp14">
   <w:body>
+    <w:p>
+      <w:pPr>
+        <w:pStyle w:val="Header"/>
+      </w:pPr>
+    </w:p>
     <w:p>
       <w:pPr>
         <w:pStyle w:val="Heading1"/>
@@ -56,38 +61,14 @@
         <w:rPr>
           <w:lang w:val="en-US"/>
         </w:rPr>
-        <w:t>{{</w:t>
-      </w:r>
-      <w:proofErr w:type="spellStart"/>
-      <w:r>
-        <w:rPr>
-          <w:lang w:val="en-US"/>
-        </w:rPr>
-        <w:t>kota</w:t>
-      </w:r>
-      <w:proofErr w:type="spellEnd"/>
+        <w:t>{{kota</w:t>
+      </w:r>
       <w:r>
         <w:rPr>
           <w:spacing w:val="-2"/>
           <w:lang w:val="en-US"/>
         </w:rPr>
-        <w:t>}}, {{</w:t>
-      </w:r>
-      <w:proofErr w:type="spellStart"/>
-      <w:r>
-        <w:rPr>
-          <w:spacing w:val="-2"/>
-          <w:lang w:val="en-US"/>
-        </w:rPr>
-        <w:t>provinsi</w:t>
-      </w:r>
-      <w:proofErr w:type="spellEnd"/>
-      <w:r>
-        <w:rPr>
-          <w:spacing w:val="-2"/>
-          <w:lang w:val="en-US"/>
-        </w:rPr>
-        <w:t>}}</w:t>
+        <w:t>}}, {{provinsi}}</w:t>
       </w:r>
     </w:p>
     <w:p>
@@ -100,75 +81,11 @@
           <w:lang w:val="en-US"/>
         </w:rPr>
       </w:pPr>
-      <w:proofErr w:type="spellStart"/>
       <w:r>
         <w:rPr>
           <w:lang w:val="en-US"/>
         </w:rPr>
-        <w:t>Tanggal</w:t>
-      </w:r>
-      <w:proofErr w:type="spellEnd"/>
-      <w:r>
-        <w:rPr>
-          <w:lang w:val="en-US"/>
-        </w:rPr>
-        <w:t xml:space="preserve"> {{</w:t>
-      </w:r>
-      <w:proofErr w:type="spellStart"/>
-      <w:r>
-        <w:rPr>
-          <w:lang w:val="en-US"/>
-        </w:rPr>
-        <w:t>tanggal_mulai</w:t>
-      </w:r>
-      <w:proofErr w:type="spellEnd"/>
-      <w:r>
-        <w:rPr>
-          <w:lang w:val="en-US"/>
-        </w:rPr>
-        <w:t>}} – {{</w:t>
-      </w:r>
-      <w:proofErr w:type="spellStart"/>
-      <w:r>
-        <w:rPr>
-          <w:lang w:val="en-US"/>
-        </w:rPr>
-        <w:t>tanggal_selesai</w:t>
-      </w:r>
-      <w:proofErr w:type="spellEnd"/>
-      <w:r>
-        <w:rPr>
-          <w:lang w:val="en-US"/>
-        </w:rPr>
-        <w:t>}} {{</w:t>
-      </w:r>
-      <w:proofErr w:type="spellStart"/>
-      <w:r>
-        <w:rPr>
-          <w:lang w:val="en-US"/>
-        </w:rPr>
-        <w:t>bulan</w:t>
-      </w:r>
-      <w:proofErr w:type="spellEnd"/>
-      <w:r>
-        <w:rPr>
-          <w:lang w:val="en-US"/>
-        </w:rPr>
-        <w:t>}} {{</w:t>
-      </w:r>
-      <w:proofErr w:type="spellStart"/>
-      <w:r>
-        <w:rPr>
-          <w:lang w:val="en-US"/>
-        </w:rPr>
-        <w:t>tahun</w:t>
-      </w:r>
-      <w:proofErr w:type="spellEnd"/>
-      <w:r>
-        <w:rPr>
-          <w:lang w:val="en-US"/>
-        </w:rPr>
-        <w:t>}}</w:t>
+        <w:t>Tanggal {{tanggal_mulai}} – {{tanggal_selesai}} {{bulan}} {{tahun}}</w:t>
       </w:r>
     </w:p>
     <w:p>
@@ -340,21 +257,7 @@
         <w:rPr>
           <w:lang w:val="en-US"/>
         </w:rPr>
-        <w:t>{{</w:t>
-      </w:r>
-      <w:proofErr w:type="spellStart"/>
-      <w:r>
-        <w:rPr>
-          <w:lang w:val="en-US"/>
-        </w:rPr>
-        <w:t>no_surat</w:t>
-      </w:r>
-      <w:proofErr w:type="spellEnd"/>
-      <w:r>
-        <w:rPr>
-          <w:lang w:val="en-US"/>
-        </w:rPr>
-        <w:t>}}</w:t>
+        <w:t>{{no_surat}}</w:t>
       </w:r>
       <w:r>
         <w:rPr>
@@ -380,140 +283,78 @@
           <w:spacing w:val="-2"/>
           <w:lang w:val="en-US"/>
         </w:rPr>
-        <w:t>_</w:t>
-      </w:r>
-      <w:proofErr w:type="spellStart"/>
+        <w:t>_no_surat}}</w:t>
+      </w:r>
+      <w:r>
+        <w:rPr>
+          <w:spacing w:val="-2"/>
+        </w:rPr>
+        <w:t>/</w:t>
+      </w:r>
       <w:r>
         <w:rPr>
           <w:spacing w:val="-2"/>
           <w:lang w:val="en-US"/>
         </w:rPr>
-        <w:t>no_surat</w:t>
-      </w:r>
-      <w:proofErr w:type="spellEnd"/>
+        <w:t>{{tahun}}</w:t>
+      </w:r>
+      <w:r>
+        <w:rPr>
+          <w:spacing w:val="29"/>
+        </w:rPr>
+        <w:t xml:space="preserve"> </w:t>
+      </w:r>
+      <w:r>
+        <w:rPr>
+          <w:spacing w:val="-2"/>
+        </w:rPr>
+        <w:t>Tanggal</w:t>
+      </w:r>
       <w:r>
         <w:rPr>
           <w:spacing w:val="-2"/>
           <w:lang w:val="en-US"/>
         </w:rPr>
-        <w:t>}}</w:t>
-      </w:r>
-      <w:r>
-        <w:rPr>
-          <w:spacing w:val="-2"/>
-        </w:rPr>
-        <w:t>/</w:t>
-      </w:r>
-      <w:r>
-        <w:rPr>
-          <w:spacing w:val="-2"/>
+        <w:t xml:space="preserve"> {{tanggal_no_surat}}</w:t>
+      </w:r>
+      <w:r>
+        <w:rPr>
+          <w:spacing w:val="-13"/>
+        </w:rPr>
+        <w:t xml:space="preserve"> </w:t>
+      </w:r>
+      <w:r>
+        <w:t>2026</w:t>
+      </w:r>
+      <w:r>
+        <w:rPr>
+          <w:spacing w:val="-13"/>
+        </w:rPr>
+        <w:t xml:space="preserve"> </w:t>
+      </w:r>
+      <w:r>
+        <w:t>dalam</w:t>
+      </w:r>
+      <w:r>
+        <w:rPr>
+          <w:spacing w:val="-15"/>
+        </w:rPr>
+        <w:t xml:space="preserve"> </w:t>
+      </w:r>
+      <w:r>
+        <w:t>rangka</w:t>
+      </w:r>
+      <w:r>
+        <w:rPr>
+          <w:spacing w:val="-12"/>
+        </w:rPr>
+        <w:t xml:space="preserve"> </w:t>
+      </w:r>
+      <w:r>
+        <w:rPr>
           <w:lang w:val="en-US"/>
         </w:rPr>
-        <w:t>{{</w:t>
-      </w:r>
-      <w:proofErr w:type="spellStart"/>
-      <w:r>
-        <w:rPr>
-          <w:spacing w:val="-2"/>
-          <w:lang w:val="en-US"/>
-        </w:rPr>
-        <w:t>tahun</w:t>
-      </w:r>
-      <w:proofErr w:type="spellEnd"/>
-      <w:r>
-        <w:rPr>
-          <w:spacing w:val="-2"/>
-          <w:lang w:val="en-US"/>
-        </w:rPr>
-        <w:t>}}</w:t>
-      </w:r>
-      <w:r>
-        <w:rPr>
-          <w:spacing w:val="29"/>
-        </w:rPr>
-        <w:t xml:space="preserve"> </w:t>
-      </w:r>
-      <w:r>
-        <w:rPr>
-          <w:spacing w:val="-2"/>
-        </w:rPr>
-        <w:t>Tanggal</w:t>
-      </w:r>
-      <w:r>
-        <w:rPr>
-          <w:spacing w:val="-2"/>
-          <w:lang w:val="en-US"/>
-        </w:rPr>
-        <w:t xml:space="preserve"> {{</w:t>
-      </w:r>
-      <w:proofErr w:type="spellStart"/>
-      <w:r>
-        <w:rPr>
-          <w:spacing w:val="-2"/>
-          <w:lang w:val="en-US"/>
-        </w:rPr>
-        <w:t>tanggal_no_surat</w:t>
-      </w:r>
-      <w:proofErr w:type="spellEnd"/>
-      <w:r>
-        <w:rPr>
-          <w:spacing w:val="-2"/>
-          <w:lang w:val="en-US"/>
-        </w:rPr>
-        <w:t>}}</w:t>
-      </w:r>
-      <w:r>
-        <w:rPr>
-          <w:spacing w:val="-13"/>
-        </w:rPr>
-        <w:t xml:space="preserve"> </w:t>
-      </w:r>
-      <w:r>
-        <w:t>2026</w:t>
-      </w:r>
-      <w:r>
-        <w:rPr>
-          <w:spacing w:val="-13"/>
-        </w:rPr>
-        <w:t xml:space="preserve"> </w:t>
-      </w:r>
-      <w:r>
-        <w:t>dalam</w:t>
-      </w:r>
-      <w:r>
-        <w:rPr>
-          <w:spacing w:val="-15"/>
-        </w:rPr>
-        <w:t xml:space="preserve"> </w:t>
-      </w:r>
-      <w:r>
-        <w:t>rangka</w:t>
-      </w:r>
-      <w:r>
-        <w:rPr>
-          <w:spacing w:val="-12"/>
-        </w:rPr>
-        <w:t xml:space="preserve"> </w:t>
-      </w:r>
-      <w:r>
-        <w:rPr>
-          <w:lang w:val="en-US"/>
-        </w:rPr>
-        <w:t>{{</w:t>
-      </w:r>
-      <w:proofErr w:type="spellStart"/>
-      <w:r>
-        <w:rPr>
-          <w:lang w:val="en-US"/>
-        </w:rPr>
-        <w:t>tujuan_perjalanan</w:t>
-      </w:r>
-      <w:proofErr w:type="spellEnd"/>
-      <w:r>
-        <w:rPr>
-          <w:lang w:val="en-US"/>
-        </w:rPr>
-        <w:t>}}</w:t>
+        <w:t>{{tujuan_perjalanan}}</w:t>
       </w:r>
       <w:r>
         <w:rPr>
@@ -562,39 +403,7 @@
           <w:spacing w:val="-10"/>
           <w:lang w:val="en-US"/>
         </w:rPr>
-        <w:t>{{</w:t>
-      </w:r>
-      <w:proofErr w:type="spellStart"/>
-      <w:r>
-        <w:rPr>
-          <w:spacing w:val="-10"/>
-          <w:lang w:val="en-US"/>
-        </w:rPr>
-        <w:t>kota</w:t>
-      </w:r>
-      <w:proofErr w:type="spellEnd"/>
-      <w:r>
-        <w:rPr>
-          <w:spacing w:val="-10"/>
-          <w:lang w:val="en-US"/>
-        </w:rPr>
-        <w:t>}}, {{</w:t>
-      </w:r>
-      <w:proofErr w:type="spellStart"/>
-      <w:r>
-        <w:rPr>
-          <w:spacing w:val="-10"/>
-          <w:lang w:val="en-US"/>
-        </w:rPr>
-        <w:t>provinsi</w:t>
-      </w:r>
-      <w:proofErr w:type="spellEnd"/>
-      <w:r>
-        <w:rPr>
-          <w:spacing w:val="-10"/>
-          <w:lang w:val="en-US"/>
-        </w:rPr>
-        <w:t>}}</w:t>
+        <w:t>{{kota}}, {{provinsi}}</w:t>
       </w:r>
       <w:r>
         <w:rPr>
@@ -1214,7 +1023,7 @@
           <w:headerReference w:type="default" r:id="rId7"/>
           <w:type w:val="continuous"/>
           <w:pgSz w:w="12240" w:h="20160"/>
-          <w:pgMar w:top="1200" w:right="1080" w:bottom="280" w:left="1080" w:header="720" w:footer="720" w:gutter="0"/>
+          <w:pgMar w:top="1200" w:right="1080" w:bottom="280" w:left="1080" w:header="397" w:footer="720" w:gutter="0"/>
           <w:cols w:space="720"/>
           <w:docGrid w:linePitch="299"/>
         </w:sectPr>
@@ -1223,21 +1032,7 @@
         <w:rPr>
           <w:lang w:val="en-US"/>
         </w:rPr>
-        <w:t>{{</w:t>
-      </w:r>
-      <w:proofErr w:type="spellStart"/>
-      <w:r>
-        <w:rPr>
-          <w:lang w:val="en-US"/>
-        </w:rPr>
-        <w:t>isi_laporan</w:t>
-      </w:r>
-      <w:proofErr w:type="spellEnd"/>
-      <w:r>
-        <w:rPr>
-          <w:lang w:val="en-US"/>
-        </w:rPr>
-        <w:t>}}</w:t>
+        <w:t>{{isi_laporan}}</w:t>
       </w:r>
     </w:p>
     <w:p>
@@ -1378,7 +1173,6 @@
         </w:rPr>
         <w:t>{{</w:t>
       </w:r>
-      <w:proofErr w:type="spellStart"/>
       <w:r>
         <w:rPr>
           <w:lang w:val="en-US"/>
@@ -1391,7 +1185,6 @@
         </w:rPr>
         <w:t>dikeluarkan</w:t>
       </w:r>
-      <w:proofErr w:type="spellEnd"/>
       <w:r>
         <w:rPr>
           <w:lang w:val="en-US"/>
@@ -1511,23 +1304,7 @@
                 <w:spacing w:val="-2"/>
                 <w:lang w:val="en-US"/>
               </w:rPr>
-              <w:t>{{</w:t>
-            </w:r>
-            <w:proofErr w:type="spellStart"/>
-            <w:r>
-              <w:rPr>
-                <w:spacing w:val="-2"/>
-                <w:lang w:val="en-US"/>
-              </w:rPr>
-              <w:t>no_urut_satu</w:t>
-            </w:r>
-            <w:proofErr w:type="spellEnd"/>
-            <w:r>
-              <w:rPr>
-                <w:spacing w:val="-2"/>
-                <w:lang w:val="en-US"/>
-              </w:rPr>
-              <w:t>}}</w:t>
+              <w:t>{{no_urut_satu}}</w:t>
             </w:r>
           </w:p>
         </w:tc>
@@ -1548,21 +1325,7 @@
               <w:rPr>
                 <w:lang w:val="en-US"/>
               </w:rPr>
-              <w:t>{{</w:t>
-            </w:r>
-            <w:proofErr w:type="spellStart"/>
-            <w:r>
-              <w:rPr>
-                <w:lang w:val="en-US"/>
-              </w:rPr>
-              <w:t>nama_petugas_satu</w:t>
-            </w:r>
-            <w:proofErr w:type="spellEnd"/>
-            <w:r>
-              <w:rPr>
-                <w:lang w:val="en-US"/>
-              </w:rPr>
-              <w:t>}}</w:t>
+              <w:t>{{nama_petugas_satu}}</w:t>
             </w:r>
           </w:p>
           <w:p>
@@ -1580,14 +1343,12 @@
               </w:rPr>
               <w:t>NIP. {{</w:t>
             </w:r>
-            <w:proofErr w:type="spellStart"/>
             <w:r>
               <w:rPr>
                 <w:lang w:val="en-US"/>
               </w:rPr>
               <w:t>nip_petugas_satu</w:t>
             </w:r>
-            <w:proofErr w:type="spellEnd"/>
             <w:r>
               <w:rPr>
                 <w:lang w:val="en-US"/>
@@ -1611,37 +1372,13 @@
                 <w:spacing w:val="-2"/>
                 <w:lang w:val="en-US"/>
               </w:rPr>
-              <w:t>{{</w:t>
-            </w:r>
-            <w:proofErr w:type="spellStart"/>
+              <w:t>{{no_urut_ttd_satu}}</w:t>
+            </w:r>
             <w:r>
               <w:rPr>
                 <w:spacing w:val="-2"/>
-                <w:lang w:val="en-US"/>
-              </w:rPr>
-              <w:t>no_urut_ttd_satu</w:t>
-            </w:r>
-            <w:proofErr w:type="spellEnd"/>
-            <w:proofErr w:type="gramStart"/>
-            <w:r>
-              <w:rPr>
-                <w:spacing w:val="-2"/>
-                <w:lang w:val="en-US"/>
-              </w:rPr>
-              <w:t>}}</w:t>
-            </w:r>
-            <w:r>
-              <w:rPr>
-                <w:spacing w:val="-2"/>
-              </w:rPr>
-              <w:t>…</w:t>
-            </w:r>
-            <w:proofErr w:type="gramEnd"/>
-            <w:r>
-              <w:rPr>
-                <w:spacing w:val="-2"/>
-              </w:rPr>
-              <w:t>…………………..</w:t>
+              </w:rPr>
+              <w:t>……………………..</w:t>
             </w:r>
           </w:p>
         </w:tc>
@@ -1674,23 +1411,7 @@
                 <w:spacing w:val="-2"/>
                 <w:lang w:val="en-US"/>
               </w:rPr>
-              <w:t>{{</w:t>
-            </w:r>
-            <w:proofErr w:type="spellStart"/>
-            <w:r>
-              <w:rPr>
-                <w:spacing w:val="-2"/>
-                <w:lang w:val="en-US"/>
-              </w:rPr>
-              <w:t>no_urut_dua</w:t>
-            </w:r>
-            <w:proofErr w:type="spellEnd"/>
-            <w:r>
-              <w:rPr>
-                <w:spacing w:val="-2"/>
-                <w:lang w:val="en-US"/>
-              </w:rPr>
-              <w:t>}}</w:t>
+              <w:t>{{no_urut_dua}}</w:t>
             </w:r>
           </w:p>
         </w:tc>
@@ -1721,21 +1442,7 @@
               <w:rPr>
                 <w:lang w:val="en-US"/>
               </w:rPr>
-              <w:t>{{</w:t>
-            </w:r>
-            <w:proofErr w:type="spellStart"/>
-            <w:r>
-              <w:rPr>
-                <w:lang w:val="en-US"/>
-              </w:rPr>
-              <w:t>nama_petugas_dua</w:t>
-            </w:r>
-            <w:proofErr w:type="spellEnd"/>
-            <w:r>
-              <w:rPr>
-                <w:lang w:val="en-US"/>
-              </w:rPr>
-              <w:t>}}</w:t>
+              <w:t>{{nama_petugas_dua}}</w:t>
             </w:r>
           </w:p>
           <w:p>
@@ -1754,21 +1461,7 @@
               <w:rPr>
                 <w:lang w:val="en-US"/>
               </w:rPr>
-              <w:t>{{</w:t>
-            </w:r>
-            <w:proofErr w:type="spellStart"/>
-            <w:r>
-              <w:rPr>
-                <w:lang w:val="en-US"/>
-              </w:rPr>
-              <w:t>nip_petugas_dua</w:t>
-            </w:r>
-            <w:proofErr w:type="spellEnd"/>
-            <w:r>
-              <w:rPr>
-                <w:lang w:val="en-US"/>
-              </w:rPr>
-              <w:t>}}</w:t>
+              <w:t>{{nip_petugas_dua}}</w:t>
             </w:r>
           </w:p>
         </w:tc>
@@ -1796,37 +1489,13 @@
                 <w:spacing w:val="-2"/>
                 <w:lang w:val="en-US"/>
               </w:rPr>
-              <w:t>{{</w:t>
-            </w:r>
-            <w:proofErr w:type="spellStart"/>
+              <w:t>{{no_urut_ttd_dua}}</w:t>
+            </w:r>
             <w:r>
               <w:rPr>
                 <w:spacing w:val="-2"/>
-                <w:lang w:val="en-US"/>
-              </w:rPr>
-              <w:t>no_urut_ttd_dua</w:t>
-            </w:r>
-            <w:proofErr w:type="spellEnd"/>
-            <w:proofErr w:type="gramStart"/>
-            <w:r>
-              <w:rPr>
-                <w:spacing w:val="-2"/>
-                <w:lang w:val="en-US"/>
-              </w:rPr>
-              <w:t>}}</w:t>
-            </w:r>
-            <w:r>
-              <w:rPr>
-                <w:spacing w:val="-2"/>
-              </w:rPr>
-              <w:t>…</w:t>
-            </w:r>
-            <w:proofErr w:type="gramEnd"/>
-            <w:r>
-              <w:rPr>
-                <w:spacing w:val="-2"/>
-              </w:rPr>
-              <w:t>…………………..</w:t>
+              </w:rPr>
+              <w:t>……………………..</w:t>
             </w:r>
           </w:p>
         </w:tc>
@@ -1859,23 +1528,7 @@
                 <w:spacing w:val="-2"/>
                 <w:lang w:val="en-US"/>
               </w:rPr>
-              <w:t>{{</w:t>
-            </w:r>
-            <w:proofErr w:type="spellStart"/>
-            <w:r>
-              <w:rPr>
-                <w:spacing w:val="-2"/>
-                <w:lang w:val="en-US"/>
-              </w:rPr>
-              <w:t>no_urut_tiga</w:t>
-            </w:r>
-            <w:proofErr w:type="spellEnd"/>
-            <w:r>
-              <w:rPr>
-                <w:spacing w:val="-2"/>
-                <w:lang w:val="en-US"/>
-              </w:rPr>
-              <w:t>}}</w:t>
+              <w:t>{{no_urut_tiga}}</w:t>
             </w:r>
           </w:p>
         </w:tc>
@@ -1906,21 +1559,7 @@
               <w:rPr>
                 <w:lang w:val="en-US"/>
               </w:rPr>
-              <w:t>{{</w:t>
-            </w:r>
-            <w:proofErr w:type="spellStart"/>
-            <w:r>
-              <w:rPr>
-                <w:lang w:val="en-US"/>
-              </w:rPr>
-              <w:t>nama_petugas_tiga</w:t>
-            </w:r>
-            <w:proofErr w:type="spellEnd"/>
-            <w:r>
-              <w:rPr>
-                <w:lang w:val="en-US"/>
-              </w:rPr>
-              <w:t>}}</w:t>
+              <w:t>{{nama_petugas_tiga}}</w:t>
             </w:r>
           </w:p>
           <w:p>
@@ -1939,21 +1578,7 @@
               <w:rPr>
                 <w:lang w:val="en-US"/>
               </w:rPr>
-              <w:t>{{</w:t>
-            </w:r>
-            <w:proofErr w:type="spellStart"/>
-            <w:r>
-              <w:rPr>
-                <w:lang w:val="en-US"/>
-              </w:rPr>
-              <w:t>nip_petugas_tiga</w:t>
-            </w:r>
-            <w:proofErr w:type="spellEnd"/>
-            <w:r>
-              <w:rPr>
-                <w:lang w:val="en-US"/>
-              </w:rPr>
-              <w:t>}}</w:t>
+              <w:t>{{nip_petugas_tiga}}</w:t>
             </w:r>
           </w:p>
         </w:tc>
@@ -1982,37 +1607,13 @@
                 <w:spacing w:val="-2"/>
                 <w:lang w:val="en-US"/>
               </w:rPr>
-              <w:t>{{</w:t>
-            </w:r>
-            <w:proofErr w:type="spellStart"/>
+              <w:t>{{no_urut_ttd_tiga}}</w:t>
+            </w:r>
             <w:r>
               <w:rPr>
                 <w:spacing w:val="-2"/>
-                <w:lang w:val="en-US"/>
-              </w:rPr>
-              <w:t>no_urut_ttd_tiga</w:t>
-            </w:r>
-            <w:proofErr w:type="spellEnd"/>
-            <w:proofErr w:type="gramStart"/>
-            <w:r>
-              <w:rPr>
-                <w:spacing w:val="-2"/>
-                <w:lang w:val="en-US"/>
-              </w:rPr>
-              <w:t>}}</w:t>
-            </w:r>
-            <w:r>
-              <w:rPr>
-                <w:spacing w:val="-2"/>
-              </w:rPr>
-              <w:t>…</w:t>
-            </w:r>
-            <w:proofErr w:type="gramEnd"/>
-            <w:r>
-              <w:rPr>
-                <w:spacing w:val="-2"/>
-              </w:rPr>
-              <w:t>…………………..</w:t>
+              </w:rPr>
+              <w:t>……………………..</w:t>
             </w:r>
           </w:p>
         </w:tc>
@@ -2045,23 +1646,7 @@
                 <w:spacing w:val="-2"/>
                 <w:lang w:val="en-US"/>
               </w:rPr>
-              <w:t>{{</w:t>
-            </w:r>
-            <w:proofErr w:type="spellStart"/>
-            <w:r>
-              <w:rPr>
-                <w:spacing w:val="-2"/>
-                <w:lang w:val="en-US"/>
-              </w:rPr>
-              <w:t>no_urut_empat</w:t>
-            </w:r>
-            <w:proofErr w:type="spellEnd"/>
-            <w:r>
-              <w:rPr>
-                <w:spacing w:val="-2"/>
-                <w:lang w:val="en-US"/>
-              </w:rPr>
-              <w:t>}}</w:t>
+              <w:t>{{no_urut_empat}}</w:t>
             </w:r>
           </w:p>
         </w:tc>
@@ -2092,21 +1677,7 @@
               <w:rPr>
                 <w:lang w:val="en-US"/>
               </w:rPr>
-              <w:t>{{</w:t>
-            </w:r>
-            <w:proofErr w:type="spellStart"/>
-            <w:r>
-              <w:rPr>
-                <w:lang w:val="en-US"/>
-              </w:rPr>
-              <w:t>nama_petugas_empat</w:t>
-            </w:r>
-            <w:proofErr w:type="spellEnd"/>
-            <w:r>
-              <w:rPr>
-                <w:lang w:val="en-US"/>
-              </w:rPr>
-              <w:t>}}</w:t>
+              <w:t>{{nama_petugas_empat}}</w:t>
             </w:r>
           </w:p>
           <w:p>
@@ -2125,21 +1696,7 @@
               <w:rPr>
                 <w:lang w:val="en-US"/>
               </w:rPr>
-              <w:t>{{</w:t>
-            </w:r>
-            <w:proofErr w:type="spellStart"/>
-            <w:r>
-              <w:rPr>
-                <w:lang w:val="en-US"/>
-              </w:rPr>
-              <w:t>nip_petugas_empat</w:t>
-            </w:r>
-            <w:proofErr w:type="spellEnd"/>
-            <w:r>
-              <w:rPr>
-                <w:lang w:val="en-US"/>
-              </w:rPr>
-              <w:t>}}</w:t>
+              <w:t>{{nip_petugas_empat}}</w:t>
             </w:r>
           </w:p>
         </w:tc>
@@ -2170,37 +1727,13 @@
                 <w:spacing w:val="-2"/>
                 <w:lang w:val="en-US"/>
               </w:rPr>
-              <w:t>{{</w:t>
-            </w:r>
-            <w:proofErr w:type="spellStart"/>
+              <w:t>{{no_urut_ttd_empat}}</w:t>
+            </w:r>
             <w:r>
               <w:rPr>
                 <w:spacing w:val="-2"/>
-                <w:lang w:val="en-US"/>
-              </w:rPr>
-              <w:t>no_urut_ttd_empat</w:t>
-            </w:r>
-            <w:proofErr w:type="spellEnd"/>
-            <w:proofErr w:type="gramStart"/>
-            <w:r>
-              <w:rPr>
-                <w:spacing w:val="-2"/>
-                <w:lang w:val="en-US"/>
-              </w:rPr>
-              <w:t>}}</w:t>
-            </w:r>
-            <w:r>
-              <w:rPr>
-                <w:spacing w:val="-2"/>
-              </w:rPr>
-              <w:t>…</w:t>
-            </w:r>
-            <w:proofErr w:type="gramEnd"/>
-            <w:r>
-              <w:rPr>
-                <w:spacing w:val="-2"/>
-              </w:rPr>
-              <w:t>…………………..</w:t>
+              </w:rPr>
+              <w:t>……………………..</w:t>
             </w:r>
             <w:r>
               <w:tab/>
@@ -2236,23 +1769,7 @@
                 <w:spacing w:val="-2"/>
                 <w:lang w:val="en-US"/>
               </w:rPr>
-              <w:t>{{</w:t>
-            </w:r>
-            <w:proofErr w:type="spellStart"/>
-            <w:r>
-              <w:rPr>
-                <w:spacing w:val="-2"/>
-                <w:lang w:val="en-US"/>
-              </w:rPr>
-              <w:t>no_urut_lima</w:t>
-            </w:r>
-            <w:proofErr w:type="spellEnd"/>
-            <w:r>
-              <w:rPr>
-                <w:spacing w:val="-2"/>
-                <w:lang w:val="en-US"/>
-              </w:rPr>
-              <w:t>}}</w:t>
+              <w:t>{{no_urut_lima}}</w:t>
             </w:r>
           </w:p>
         </w:tc>
@@ -2283,21 +1800,7 @@
               <w:rPr>
                 <w:lang w:val="en-US"/>
               </w:rPr>
-              <w:t>{{</w:t>
-            </w:r>
-            <w:proofErr w:type="spellStart"/>
-            <w:r>
-              <w:rPr>
-                <w:lang w:val="en-US"/>
-              </w:rPr>
-              <w:t>nama_petugas_lima</w:t>
-            </w:r>
-            <w:proofErr w:type="spellEnd"/>
-            <w:r>
-              <w:rPr>
-                <w:lang w:val="en-US"/>
-              </w:rPr>
-              <w:t>}}</w:t>
+              <w:t>{{nama_petugas_lima}}</w:t>
             </w:r>
           </w:p>
           <w:p>
@@ -2316,21 +1819,7 @@
               <w:rPr>
                 <w:lang w:val="en-US"/>
               </w:rPr>
-              <w:t>{{</w:t>
-            </w:r>
-            <w:proofErr w:type="spellStart"/>
-            <w:r>
-              <w:rPr>
-                <w:lang w:val="en-US"/>
-              </w:rPr>
-              <w:t>nip_petugas_lima</w:t>
-            </w:r>
-            <w:proofErr w:type="spellEnd"/>
-            <w:r>
-              <w:rPr>
-                <w:lang w:val="en-US"/>
-              </w:rPr>
-              <w:t>}}</w:t>
+              <w:t>{{nip_petugas_lima}}</w:t>
             </w:r>
           </w:p>
         </w:tc>
@@ -2361,37 +1850,13 @@
                 <w:spacing w:val="-2"/>
                 <w:lang w:val="en-US"/>
               </w:rPr>
-              <w:t>{{</w:t>
-            </w:r>
-            <w:proofErr w:type="spellStart"/>
+              <w:t>{{no_urut_ttd_lima}}</w:t>
+            </w:r>
             <w:r>
               <w:rPr>
                 <w:spacing w:val="-2"/>
-                <w:lang w:val="en-US"/>
-              </w:rPr>
-              <w:t>no_urut_ttd_lima</w:t>
-            </w:r>
-            <w:proofErr w:type="spellEnd"/>
-            <w:proofErr w:type="gramStart"/>
-            <w:r>
-              <w:rPr>
-                <w:spacing w:val="-2"/>
-                <w:lang w:val="en-US"/>
-              </w:rPr>
-              <w:t>}}</w:t>
-            </w:r>
-            <w:r>
-              <w:rPr>
-                <w:spacing w:val="-2"/>
-              </w:rPr>
-              <w:t>…</w:t>
-            </w:r>
-            <w:proofErr w:type="gramEnd"/>
-            <w:r>
-              <w:rPr>
-                <w:spacing w:val="-2"/>
-              </w:rPr>
-              <w:t>…………………..</w:t>
+              </w:rPr>
+              <w:t>……………………..</w:t>
             </w:r>
             <w:r>
               <w:tab/>
@@ -2427,23 +1892,7 @@
                 <w:spacing w:val="-2"/>
                 <w:lang w:val="en-US"/>
               </w:rPr>
-              <w:t>{{</w:t>
-            </w:r>
-            <w:proofErr w:type="spellStart"/>
-            <w:r>
-              <w:rPr>
-                <w:spacing w:val="-2"/>
-                <w:lang w:val="en-US"/>
-              </w:rPr>
-              <w:t>no_urut_enam</w:t>
-            </w:r>
-            <w:proofErr w:type="spellEnd"/>
-            <w:r>
-              <w:rPr>
-                <w:spacing w:val="-2"/>
-                <w:lang w:val="en-US"/>
-              </w:rPr>
-              <w:t>}}</w:t>
+              <w:t>{{no_urut_enam}}</w:t>
             </w:r>
           </w:p>
         </w:tc>
@@ -2474,21 +1923,7 @@
               <w:rPr>
                 <w:lang w:val="en-US"/>
               </w:rPr>
-              <w:t>{{</w:t>
-            </w:r>
-            <w:proofErr w:type="spellStart"/>
-            <w:r>
-              <w:rPr>
-                <w:lang w:val="en-US"/>
-              </w:rPr>
-              <w:t>nama_petugas_enam</w:t>
-            </w:r>
-            <w:proofErr w:type="spellEnd"/>
-            <w:r>
-              <w:rPr>
-                <w:lang w:val="en-US"/>
-              </w:rPr>
-              <w:t>}}</w:t>
+              <w:t>{{nama_petugas_enam}}</w:t>
             </w:r>
           </w:p>
           <w:p>
@@ -2507,21 +1942,7 @@
               <w:rPr>
                 <w:lang w:val="en-US"/>
               </w:rPr>
-              <w:t>{{</w:t>
-            </w:r>
-            <w:proofErr w:type="spellStart"/>
-            <w:r>
-              <w:rPr>
-                <w:lang w:val="en-US"/>
-              </w:rPr>
-              <w:t>nip_petugas_enam</w:t>
-            </w:r>
-            <w:proofErr w:type="spellEnd"/>
-            <w:r>
-              <w:rPr>
-                <w:lang w:val="en-US"/>
-              </w:rPr>
-              <w:t>}}</w:t>
+              <w:t>{{nip_petugas_enam}}</w:t>
             </w:r>
           </w:p>
         </w:tc>
@@ -2553,37 +1974,13 @@
                 <w:spacing w:val="-2"/>
                 <w:lang w:val="en-US"/>
               </w:rPr>
-              <w:t>{{</w:t>
-            </w:r>
-            <w:proofErr w:type="spellStart"/>
+              <w:t>{{no_urut_ttd_enam}}</w:t>
+            </w:r>
             <w:r>
               <w:rPr>
                 <w:spacing w:val="-2"/>
-                <w:lang w:val="en-US"/>
-              </w:rPr>
-              <w:t>no_urut_ttd_enam</w:t>
-            </w:r>
-            <w:proofErr w:type="spellEnd"/>
-            <w:proofErr w:type="gramStart"/>
-            <w:r>
-              <w:rPr>
-                <w:spacing w:val="-2"/>
-                <w:lang w:val="en-US"/>
-              </w:rPr>
-              <w:t>}}</w:t>
-            </w:r>
-            <w:r>
-              <w:rPr>
-                <w:spacing w:val="-2"/>
-              </w:rPr>
-              <w:t>…</w:t>
-            </w:r>
-            <w:proofErr w:type="gramEnd"/>
-            <w:r>
-              <w:rPr>
-                <w:spacing w:val="-2"/>
-              </w:rPr>
-              <w:t>…………………..</w:t>
+              </w:rPr>
+              <w:t>……………………..</w:t>
             </w:r>
             <w:r>
               <w:tab/>
@@ -2623,23 +2020,7 @@
                 <w:spacing w:val="-2"/>
                 <w:lang w:val="en-US"/>
               </w:rPr>
-              <w:t>{{</w:t>
-            </w:r>
-            <w:proofErr w:type="spellStart"/>
-            <w:r>
-              <w:rPr>
-                <w:spacing w:val="-2"/>
-                <w:lang w:val="en-US"/>
-              </w:rPr>
-              <w:t>no_urut_tujuh</w:t>
-            </w:r>
-            <w:proofErr w:type="spellEnd"/>
-            <w:r>
-              <w:rPr>
-                <w:spacing w:val="-2"/>
-                <w:lang w:val="en-US"/>
-              </w:rPr>
-              <w:t>}}</w:t>
+              <w:t>{{no_urut_tujuh}}</w:t>
             </w:r>
           </w:p>
         </w:tc>
@@ -2680,21 +2061,7 @@
               <w:rPr>
                 <w:lang w:val="en-US"/>
               </w:rPr>
-              <w:t>{{</w:t>
-            </w:r>
-            <w:proofErr w:type="spellStart"/>
-            <w:r>
-              <w:rPr>
-                <w:lang w:val="en-US"/>
-              </w:rPr>
-              <w:t>nama_petugas_tujuh</w:t>
-            </w:r>
-            <w:proofErr w:type="spellEnd"/>
-            <w:r>
-              <w:rPr>
-                <w:lang w:val="en-US"/>
-              </w:rPr>
-              <w:t>}}</w:t>
+              <w:t>{{nama_petugas_tujuh}}</w:t>
             </w:r>
           </w:p>
           <w:p>
@@ -2716,21 +2083,7 @@
               <w:rPr>
                 <w:lang w:val="en-US"/>
               </w:rPr>
-              <w:t>{{</w:t>
-            </w:r>
-            <w:proofErr w:type="spellStart"/>
-            <w:r>
-              <w:rPr>
-                <w:lang w:val="en-US"/>
-              </w:rPr>
-              <w:t>nip_petugas_tujuh</w:t>
-            </w:r>
-            <w:proofErr w:type="spellEnd"/>
-            <w:r>
-              <w:rPr>
-                <w:lang w:val="en-US"/>
-              </w:rPr>
-              <w:t>}}</w:t>
+              <w:t>{{nip_petugas_tujuh}}</w:t>
             </w:r>
           </w:p>
         </w:tc>
@@ -2762,37 +2115,13 @@
                 <w:spacing w:val="-2"/>
                 <w:lang w:val="en-US"/>
               </w:rPr>
-              <w:t>{{</w:t>
-            </w:r>
-            <w:proofErr w:type="spellStart"/>
+              <w:t>{{no_urut_ttd_tujuh}}</w:t>
+            </w:r>
             <w:r>
               <w:rPr>
                 <w:spacing w:val="-2"/>
-                <w:lang w:val="en-US"/>
-              </w:rPr>
-              <w:t>no_urut_ttd_tujuh</w:t>
-            </w:r>
-            <w:proofErr w:type="spellEnd"/>
-            <w:proofErr w:type="gramStart"/>
-            <w:r>
-              <w:rPr>
-                <w:spacing w:val="-2"/>
-                <w:lang w:val="en-US"/>
-              </w:rPr>
-              <w:t>}}</w:t>
-            </w:r>
-            <w:r>
-              <w:rPr>
-                <w:spacing w:val="-2"/>
-              </w:rPr>
-              <w:t>…</w:t>
-            </w:r>
-            <w:proofErr w:type="gramEnd"/>
-            <w:r>
-              <w:rPr>
-                <w:spacing w:val="-2"/>
-              </w:rPr>
-              <w:t>…………………..</w:t>
+              </w:rPr>
+              <w:t>……………………..</w:t>
             </w:r>
           </w:p>
         </w:tc>
@@ -2919,21 +2248,7 @@
               <w:rPr>
                 <w:lang w:val="en-US"/>
               </w:rPr>
-              <w:t>{{</w:t>
-            </w:r>
-            <w:proofErr w:type="spellStart"/>
-            <w:r>
-              <w:rPr>
-                <w:lang w:val="en-US"/>
-              </w:rPr>
-              <w:t>foto_dokumentasi_satu</w:t>
-            </w:r>
-            <w:proofErr w:type="spellEnd"/>
-            <w:r>
-              <w:rPr>
-                <w:lang w:val="en-US"/>
-              </w:rPr>
-              <w:t>}}</w:t>
+              <w:t>{{foto_dokumentasi_satu}}</w:t>
             </w:r>
           </w:p>
         </w:tc>
@@ -2976,21 +2291,7 @@
               <w:rPr>
                 <w:lang w:val="en-US"/>
               </w:rPr>
-              <w:t>{{</w:t>
-            </w:r>
-            <w:proofErr w:type="spellStart"/>
-            <w:r>
-              <w:rPr>
-                <w:lang w:val="en-US"/>
-              </w:rPr>
-              <w:t>foto_dokumentasi_dua</w:t>
-            </w:r>
-            <w:proofErr w:type="spellEnd"/>
-            <w:r>
-              <w:rPr>
-                <w:lang w:val="en-US"/>
-              </w:rPr>
-              <w:t>}}</w:t>
+              <w:t>{{foto_dokumentasi_dua}}</w:t>
             </w:r>
           </w:p>
         </w:tc>
@@ -3024,21 +2325,7 @@
               <w:rPr>
                 <w:lang w:val="en-US"/>
               </w:rPr>
-              <w:t>{{</w:t>
-            </w:r>
-            <w:proofErr w:type="spellStart"/>
-            <w:r>
-              <w:rPr>
-                <w:lang w:val="en-US"/>
-              </w:rPr>
-              <w:t>foto_dokumentasi_tiga</w:t>
-            </w:r>
-            <w:proofErr w:type="spellEnd"/>
-            <w:r>
-              <w:rPr>
-                <w:lang w:val="en-US"/>
-              </w:rPr>
-              <w:t>}}</w:t>
+              <w:t>{{foto_dokumentasi_tiga}}</w:t>
             </w:r>
           </w:p>
         </w:tc>
@@ -3117,21 +2404,7 @@
               <w:rPr>
                 <w:lang w:val="en-US"/>
               </w:rPr>
-              <w:t>{{</w:t>
-            </w:r>
-            <w:proofErr w:type="spellStart"/>
-            <w:r>
-              <w:rPr>
-                <w:lang w:val="en-US"/>
-              </w:rPr>
-              <w:t>foto_dokumentasi_empat</w:t>
-            </w:r>
-            <w:proofErr w:type="spellEnd"/>
-            <w:r>
-              <w:rPr>
-                <w:lang w:val="en-US"/>
-              </w:rPr>
-              <w:t>}}</w:t>
+              <w:t>{{foto_dokumentasi_empat}}</w:t>
             </w:r>
           </w:p>
         </w:tc>
@@ -3158,7 +2431,7 @@
 </file>
 
 <file path=word/endnotes.xml><?xml version="1.0" encoding="utf-8"?>
-<w:endnotes xmlns:wpc="http://schemas.microsoft.com/office/word/2010/wordprocessingCanvas" xmlns:cx="http://schemas.microsoft.com/office/drawing/2014/chartex" xmlns:cx1="http://schemas.microsoft.com/office/drawing/2015/9/8/chartex" xmlns:cx2="http://schemas.microsoft.com/office/drawing/2015/10/21/chartex" xmlns:cx3="http://schemas.microsoft.com/office/drawing/2016/5/9/chartex" xmlns:cx4="http://schemas.microsoft.com/office/drawing/2016/5/10/chartex" xmlns:cx5="http://schemas.microsoft.com/office/drawing/2016/5/11/chartex" xmlns:cx6="http://schemas.microsoft.com/office/drawing/2016/5/12/chartex" xmlns:cx7="http://schemas.microsoft.com/office/drawing/2016/5/13/chartex" xmlns:cx8="http://schemas.microsoft.com/office/drawing/2016/5/14/chartex" xmlns:mc="http://schemas.openxmlformats.org/markup-compatibility/2006" xmlns:aink="http://schemas.microsoft.com/office/drawing/2016/ink" xmlns:am3d="http://schemas.microsoft.com/office/drawing/2017/model3d" xmlns:o="urn:schemas-microsoft-com:office:office" xmlns:r="http://schemas.openxmlformats.org/officeDocument/2006/relationships" xmlns:m="http://schemas.openxmlformats.org/officeDocument/2006/math" xmlns:v="urn:schemas-microsoft-com:vml" xmlns:wp14="http://schemas.microsoft.com/office/word/2010/wordprocessingDrawing" xmlns:wp="http://schemas.openxmlformats.org/drawingml/2006/wordprocessingDrawing" xmlns:w10="urn:schemas-microsoft-com:office:word" xmlns:w="http://schemas.openxmlformats.org/wordprocessingml/2006/main" xmlns:w14="http://schemas.microsoft.com/office/word/2010/wordml" xmlns:w15="http://schemas.microsoft.com/office/word/2012/wordml" xmlns:w16cex="http://schemas.microsoft.com/office/word/2018/wordml/cex" xmlns:w16cid="http://schemas.microsoft.com/office/word/2016/wordml/cid" xmlns:w16="http://schemas.microsoft.com/office/word/2018/wordml" xmlns:w16sdtdh="http://schemas.microsoft.com/office/word/2020/wordml/sdtdatahash" xmlns:w16se="http://schemas.microsoft.com/office/word/2015/wordml/symex" xmlns:wpg="http://schemas.microsoft.com/office/word/2010/wordprocessingGroup" xmlns:wpi="http://schemas.microsoft.com/office/word/2010/wordprocessingInk" xmlns:wne="http://schemas.microsoft.com/office/word/2006/wordml" xmlns:wps="http://schemas.microsoft.com/office/word/2010/wordprocessingShape" mc:Ignorable="w14 w15 w16se w16cid w16 w16cex w16sdtdh wp14">
+<w:endnotes xmlns:wpc="http://schemas.microsoft.com/office/word/2010/wordprocessingCanvas" xmlns:cx="http://schemas.microsoft.com/office/drawing/2014/chartex" xmlns:cx1="http://schemas.microsoft.com/office/drawing/2015/9/8/chartex" xmlns:cx2="http://schemas.microsoft.com/office/drawing/2015/10/21/chartex" xmlns:cx3="http://schemas.microsoft.com/office/drawing/2016/5/9/chartex" xmlns:cx4="http://schemas.microsoft.com/office/drawing/2016/5/10/chartex" xmlns:cx5="http://schemas.microsoft.com/office/drawing/2016/5/11/chartex" xmlns:cx6="http://schemas.microsoft.com/office/drawing/2016/5/12/chartex" xmlns:cx7="http://schemas.microsoft.com/office/drawing/2016/5/13/chartex" xmlns:cx8="http://schemas.microsoft.com/office/drawing/2016/5/14/chartex" xmlns:mc="http://schemas.openxmlformats.org/markup-compatibility/2006" xmlns:aink="http://schemas.microsoft.com/office/drawing/2016/ink" xmlns:am3d="http://schemas.microsoft.com/office/drawing/2017/model3d" xmlns:o="urn:schemas-microsoft-com:office:office" xmlns:oel="http://schemas.microsoft.com/office/2019/extlst" xmlns:r="http://schemas.openxmlformats.org/officeDocument/2006/relationships" xmlns:m="http://schemas.openxmlformats.org/officeDocument/2006/math" xmlns:v="urn:schemas-microsoft-com:vml" xmlns:wp14="http://schemas.microsoft.com/office/word/2010/wordprocessingDrawing" xmlns:wp="http://schemas.openxmlformats.org/drawingml/2006/wordprocessingDrawing" xmlns:w10="urn:schemas-microsoft-com:office:word" xmlns:w="http://schemas.openxmlformats.org/wordprocessingml/2006/main" xmlns:w14="http://schemas.microsoft.com/office/word/2010/wordml" xmlns:w15="http://schemas.microsoft.com/office/word/2012/wordml" xmlns:w16cex="http://schemas.microsoft.com/office/word/2018/wordml/cex" xmlns:w16cid="http://schemas.microsoft.com/office/word/2016/wordml/cid" xmlns:w16="http://schemas.microsoft.com/office/word/2018/wordml" xmlns:w16du="http://schemas.microsoft.com/office/word/2023/wordml/word16du" xmlns:w16sdtdh="http://schemas.microsoft.com/office/word/2020/wordml/sdtdatahash" xmlns:w16sdtfl="http://schemas.microsoft.com/office/word/2024/wordml/sdtformatlock" xmlns:w16se="http://schemas.microsoft.com/office/word/2015/wordml/symex" xmlns:wpg="http://schemas.microsoft.com/office/word/2010/wordprocessingGroup" xmlns:wpi="http://schemas.microsoft.com/office/word/2010/wordprocessingInk" xmlns:wne="http://schemas.microsoft.com/office/word/2006/wordml" xmlns:wps="http://schemas.microsoft.com/office/word/2010/wordprocessingShape" mc:Ignorable="w14 w15 w16se w16cid w16 w16cex w16sdtdh w16sdtfl w16du wp14">
   <w:endnote w:type="separator" w:id="-1">
     <w:p>
       <w:r>
@@ -3177,7 +2450,7 @@
 </file>
 
 <file path=word/footnotes.xml><?xml version="1.0" encoding="utf-8"?>
-<w:footnotes xmlns:wpc="http://schemas.microsoft.com/office/word/2010/wordprocessingCanvas" xmlns:cx="http://schemas.microsoft.com/office/drawing/2014/chartex" xmlns:cx1="http://schemas.microsoft.com/office/drawing/2015/9/8/chartex" xmlns:cx2="http://schemas.microsoft.com/office/drawing/2015/10/21/chartex" xmlns:cx3="http://schemas.microsoft.com/office/drawing/2016/5/9/chartex" xmlns:cx4="http://schemas.microsoft.com/office/drawing/2016/5/10/chartex" xmlns:cx5="http://schemas.microsoft.com/office/drawing/2016/5/11/chartex" xmlns:cx6="http://schemas.microsoft.com/office/drawing/2016/5/12/chartex" xmlns:cx7="http://schemas.microsoft.com/office/drawing/2016/5/13/chartex" xmlns:cx8="http://schemas.microsoft.com/office/drawing/2016/5/14/chartex" xmlns:mc="http://schemas.openxmlformats.org/markup-compatibility/2006" xmlns:aink="http://schemas.microsoft.com/office/drawing/2016/ink" xmlns:am3d="http://schemas.microsoft.com/office/drawing/2017/model3d" xmlns:o="urn:schemas-microsoft-com:office:office" xmlns:r="http://schemas.openxmlformats.org/officeDocument/2006/relationships" xmlns:m="http://schemas.openxmlformats.org/officeDocument/2006/math" xmlns:v="urn:schemas-microsoft-com:vml" xmlns:wp14="http://schemas.microsoft.com/office/word/2010/wordprocessingDrawing" xmlns:wp="http://schemas.openxmlformats.org/drawingml/2006/wordprocessingDrawing" xmlns:w10="urn:schemas-microsoft-com:office:word" xmlns:w="http://schemas.openxmlformats.org/wordprocessingml/2006/main" xmlns:w14="http://schemas.microsoft.com/office/word/2010/wordml" xmlns:w15="http://schemas.microsoft.com/office/word/2012/wordml" xmlns:w16cex="http://schemas.microsoft.com/office/word/2018/wordml/cex" xmlns:w16cid="http://schemas.microsoft.com/office/word/2016/wordml/cid" xmlns:w16="http://schemas.microsoft.com/office/word/2018/wordml" xmlns:w16sdtdh="http://schemas.microsoft.com/office/word/2020/wordml/sdtdatahash" xmlns:w16se="http://schemas.microsoft.com/office/word/2015/wordml/symex" xmlns:wpg="http://schemas.microsoft.com/office/word/2010/wordprocessingGroup" xmlns:wpi="http://schemas.microsoft.com/office/word/2010/wordprocessingInk" xmlns:wne="http://schemas.microsoft.com/office/word/2006/wordml" xmlns:wps="http://schemas.microsoft.com/office/word/2010/wordprocessingShape" mc:Ignorable="w14 w15 w16se w16cid w16 w16cex w16sdtdh wp14">
+<w:footnotes xmlns:wpc="http://schemas.microsoft.com/office/word/2010/wordprocessingCanvas" xmlns:cx="http://schemas.microsoft.com/office/drawing/2014/chartex" xmlns:cx1="http://schemas.microsoft.com/office/drawing/2015/9/8/chartex" xmlns:cx2="http://schemas.microsoft.com/office/drawing/2015/10/21/chartex" xmlns:cx3="http://schemas.microsoft.com/office/drawing/2016/5/9/chartex" xmlns:cx4="http://schemas.microsoft.com/office/drawing/2016/5/10/chartex" xmlns:cx5="http://schemas.microsoft.com/office/drawing/2016/5/11/chartex" xmlns:cx6="http://schemas.microsoft.com/office/drawing/2016/5/12/chartex" xmlns:cx7="http://schemas.microsoft.com/office/drawing/2016/5/13/chartex" xmlns:cx8="http://schemas.microsoft.com/office/drawing/2016/5/14/chartex" xmlns:mc="http://schemas.openxmlformats.org/markup-compatibility/2006" xmlns:aink="http://schemas.microsoft.com/office/drawing/2016/ink" xmlns:am3d="http://schemas.microsoft.com/office/drawing/2017/model3d" xmlns:o="urn:schemas-microsoft-com:office:office" xmlns:oel="http://schemas.microsoft.com/office/2019/extlst" xmlns:r="http://schemas.openxmlformats.org/officeDocument/2006/relationships" xmlns:m="http://schemas.openxmlformats.org/officeDocument/2006/math" xmlns:v="urn:schemas-microsoft-com:vml" xmlns:wp14="http://schemas.microsoft.com/office/word/2010/wordprocessingDrawing" xmlns:wp="http://schemas.openxmlformats.org/drawingml/2006/wordprocessingDrawing" xmlns:w10="urn:schemas-microsoft-com:office:word" xmlns:w="http://schemas.openxmlformats.org/wordprocessingml/2006/main" xmlns:w14="http://schemas.microsoft.com/office/word/2010/wordml" xmlns:w15="http://schemas.microsoft.com/office/word/2012/wordml" xmlns:w16cex="http://schemas.microsoft.com/office/word/2018/wordml/cex" xmlns:w16cid="http://schemas.microsoft.com/office/word/2016/wordml/cid" xmlns:w16="http://schemas.microsoft.com/office/word/2018/wordml" xmlns:w16du="http://schemas.microsoft.com/office/word/2023/wordml/word16du" xmlns:w16sdtdh="http://schemas.microsoft.com/office/word/2020/wordml/sdtdatahash" xmlns:w16sdtfl="http://schemas.microsoft.com/office/word/2024/wordml/sdtformatlock" xmlns:w16se="http://schemas.microsoft.com/office/word/2015/wordml/symex" xmlns:wpg="http://schemas.microsoft.com/office/word/2010/wordprocessingGroup" xmlns:wpi="http://schemas.microsoft.com/office/word/2010/wordprocessingInk" xmlns:wne="http://schemas.microsoft.com/office/word/2006/wordml" xmlns:wps="http://schemas.microsoft.com/office/word/2010/wordprocessingShape" mc:Ignorable="w14 w15 w16se w16cid w16 w16cex w16sdtdh w16sdtfl w16du wp14">
   <w:footnote w:type="separator" w:id="-1">
     <w:p>
       <w:r>
@@ -3196,938 +2469,584 @@
 </file>
 
 <file path=word/header1.xml><?xml version="1.0" encoding="utf-8"?>
-<w:hdr xmlns:wpc="http://schemas.microsoft.com/office/word/2010/wordprocessingCanvas" xmlns:cx="http://schemas.microsoft.com/office/drawing/2014/chartex" xmlns:cx1="http://schemas.microsoft.com/office/drawing/2015/9/8/chartex" xmlns:cx2="http://schemas.microsoft.com/office/drawing/2015/10/21/chartex" xmlns:cx3="http://schemas.microsoft.com/office/drawing/2016/5/9/chartex" xmlns:cx4="http://schemas.microsoft.com/office/drawing/2016/5/10/chartex" xmlns:cx5="http://schemas.microsoft.com/office/drawing/2016/5/11/chartex" xmlns:cx6="http://schemas.microsoft.com/office/drawing/2016/5/12/chartex" xmlns:cx7="http://schemas.microsoft.com/office/drawing/2016/5/13/chartex" xmlns:cx8="http://schemas.microsoft.com/office/drawing/2016/5/14/chartex" xmlns:mc="http://schemas.openxmlformats.org/markup-compatibility/2006" xmlns:aink="http://schemas.microsoft.com/office/drawing/2016/ink" xmlns:am3d="http://schemas.microsoft.com/office/drawing/2017/model3d" xmlns:o="urn:schemas-microsoft-com:office:office" xmlns:r="http://schemas.openxmlformats.org/officeDocument/2006/relationships" xmlns:m="http://schemas.openxmlformats.org/officeDocument/2006/math" xmlns:v="urn:schemas-microsoft-com:vml" xmlns:wp14="http://schemas.microsoft.com/office/word/2010/wordprocessingDrawing" xmlns:wp="http://schemas.openxmlformats.org/drawingml/2006/wordprocessingDrawing" xmlns:w10="urn:schemas-microsoft-com:office:word" xmlns:w="http://schemas.openxmlformats.org/wordprocessingml/2006/main" xmlns:w14="http://schemas.microsoft.com/office/word/2010/wordml" xmlns:w15="http://schemas.microsoft.com/office/word/2012/wordml" xmlns:w16cex="http://schemas.microsoft.com/office/word/2018/wordml/cex" xmlns:w16cid="http://schemas.microsoft.com/office/word/2016/wordml/cid" xmlns:w16="http://schemas.microsoft.com/office/word/2018/wordml" xmlns:w16sdtdh="http://schemas.microsoft.com/office/word/2020/wordml/sdtdatahash" xmlns:w16se="http://schemas.microsoft.com/office/word/2015/wordml/symex" xmlns:wpg="http://schemas.microsoft.com/office/word/2010/wordprocessingGroup" xmlns:wpi="http://schemas.microsoft.com/office/word/2010/wordprocessingInk" xmlns:wne="http://schemas.microsoft.com/office/word/2006/wordml" xmlns:wps="http://schemas.microsoft.com/office/word/2010/wordprocessingShape" mc:Ignorable="w14 w15 w16se w16cid w16 w16cex w16sdtdh wp14">
-  <w:p>
-    <w:pPr>
-      <w:pStyle w:val="Header"/>
-    </w:pPr>
-  </w:p>
-  <w:p>
-    <w:pPr>
-      <w:pStyle w:val="Header"/>
-    </w:pPr>
-  </w:p>
-  <w:p>
-    <w:pPr>
-      <w:pStyle w:val="Header"/>
-    </w:pPr>
-  </w:p>
-  <w:p>
-    <w:pPr>
-      <w:pStyle w:val="Header"/>
-    </w:pPr>
-    <w:r>
-      <w:rPr>
-        <w:noProof/>
-      </w:rPr>
-      <w:drawing>
-        <wp:anchor distT="0" distB="0" distL="114300" distR="114300" simplePos="0" relativeHeight="251660800" behindDoc="1" locked="0" layoutInCell="1" allowOverlap="1" wp14:anchorId="0FE1153B" wp14:editId="48F82311">
-          <wp:simplePos x="0" y="0"/>
-          <wp:positionH relativeFrom="column">
-            <wp:posOffset>-353695</wp:posOffset>
-          </wp:positionH>
-          <wp:positionV relativeFrom="paragraph">
-            <wp:posOffset>-185420</wp:posOffset>
-          </wp:positionV>
-          <wp:extent cx="648970" cy="819785"/>
-          <wp:effectExtent l="0" t="0" r="0" b="0"/>
-          <wp:wrapTight wrapText="bothSides">
-            <wp:wrapPolygon edited="0">
-              <wp:start x="8243" y="0"/>
-              <wp:lineTo x="3804" y="3012"/>
-              <wp:lineTo x="0" y="7027"/>
-              <wp:lineTo x="0" y="10039"/>
-              <wp:lineTo x="8877" y="16564"/>
-              <wp:lineTo x="2536" y="17568"/>
-              <wp:lineTo x="0" y="18572"/>
-              <wp:lineTo x="0" y="21081"/>
-              <wp:lineTo x="20924" y="21081"/>
-              <wp:lineTo x="20924" y="19074"/>
-              <wp:lineTo x="19656" y="18070"/>
-              <wp:lineTo x="12047" y="16564"/>
-              <wp:lineTo x="20924" y="9537"/>
-              <wp:lineTo x="20924" y="7027"/>
-              <wp:lineTo x="16485" y="3012"/>
-              <wp:lineTo x="12681" y="0"/>
-              <wp:lineTo x="8243" y="0"/>
-            </wp:wrapPolygon>
-          </wp:wrapTight>
-          <wp:docPr id="2" name="Picture 2"/>
-          <wp:cNvGraphicFramePr>
-            <a:graphicFrameLocks xmlns:a="http://schemas.openxmlformats.org/drawingml/2006/main" noChangeAspect="1"/>
-          </wp:cNvGraphicFramePr>
-          <a:graphic xmlns:a="http://schemas.openxmlformats.org/drawingml/2006/main">
-            <a:graphicData uri="http://schemas.openxmlformats.org/drawingml/2006/picture">
-              <pic:pic xmlns:pic="http://schemas.openxmlformats.org/drawingml/2006/picture">
-                <pic:nvPicPr>
-                  <pic:cNvPr id="1" name="Picture 1"/>
-                  <pic:cNvPicPr>
-                    <a:picLocks noChangeAspect="1"/>
-                  </pic:cNvPicPr>
-                </pic:nvPicPr>
-                <pic:blipFill>
-                  <a:blip r:embed="rId1" cstate="print">
-                    <a:extLst>
-                      <a:ext uri="{28A0092B-C50C-407E-A947-70E740481C1C}">
-                        <a14:useLocalDpi xmlns:a14="http://schemas.microsoft.com/office/drawing/2010/main" val="0"/>
-                      </a:ext>
-                    </a:extLst>
-                  </a:blip>
-                  <a:stretch>
-                    <a:fillRect/>
-                  </a:stretch>
-                </pic:blipFill>
-                <pic:spPr>
-                  <a:xfrm>
-                    <a:off x="0" y="0"/>
-                    <a:ext cx="648970" cy="819785"/>
-                  </a:xfrm>
-                  <a:prstGeom prst="rect">
-                    <a:avLst/>
-                  </a:prstGeom>
-                </pic:spPr>
-              </pic:pic>
-            </a:graphicData>
-          </a:graphic>
-        </wp:anchor>
-      </w:drawing>
-    </w:r>
-    <w:r>
-      <w:rPr>
-        <w:noProof/>
-      </w:rPr>
-      <w:drawing>
-        <wp:anchor distT="0" distB="0" distL="114300" distR="114300" simplePos="0" relativeHeight="251659776" behindDoc="1" locked="0" layoutInCell="1" allowOverlap="1" wp14:anchorId="72662A93" wp14:editId="547C3CB7">
-          <wp:simplePos x="0" y="0"/>
-          <wp:positionH relativeFrom="column">
-            <wp:posOffset>356870</wp:posOffset>
-          </wp:positionH>
-          <wp:positionV relativeFrom="paragraph">
-            <wp:posOffset>-388620</wp:posOffset>
-          </wp:positionV>
-          <wp:extent cx="78740" cy="1292225"/>
-          <wp:effectExtent l="0" t="0" r="0" b="3175"/>
-          <wp:wrapTight wrapText="bothSides">
-            <wp:wrapPolygon edited="0">
-              <wp:start x="0" y="0"/>
-              <wp:lineTo x="0" y="21335"/>
-              <wp:lineTo x="15677" y="21335"/>
-              <wp:lineTo x="15677" y="0"/>
-              <wp:lineTo x="0" y="0"/>
-            </wp:wrapPolygon>
-          </wp:wrapTight>
-          <wp:docPr id="3" name="Picture 3"/>
-          <wp:cNvGraphicFramePr>
-            <a:graphicFrameLocks xmlns:a="http://schemas.openxmlformats.org/drawingml/2006/main" noChangeAspect="1"/>
-          </wp:cNvGraphicFramePr>
-          <a:graphic xmlns:a="http://schemas.openxmlformats.org/drawingml/2006/main">
-            <a:graphicData uri="http://schemas.openxmlformats.org/drawingml/2006/picture">
-              <pic:pic xmlns:pic="http://schemas.openxmlformats.org/drawingml/2006/picture">
-                <pic:nvPicPr>
-                  <pic:cNvPr id="2" name="Picture 2"/>
-                  <pic:cNvPicPr>
-                    <a:picLocks noChangeAspect="1"/>
-                  </pic:cNvPicPr>
-                </pic:nvPicPr>
-                <pic:blipFill>
-                  <a:blip r:embed="rId2" cstate="print">
-                    <a:extLst>
-                      <a:ext uri="{28A0092B-C50C-407E-A947-70E740481C1C}">
-                        <a14:useLocalDpi xmlns:a14="http://schemas.microsoft.com/office/drawing/2010/main" val="0"/>
-                      </a:ext>
-                    </a:extLst>
-                  </a:blip>
-                  <a:stretch>
-                    <a:fillRect/>
-                  </a:stretch>
-                </pic:blipFill>
-                <pic:spPr>
-                  <a:xfrm>
-                    <a:off x="0" y="0"/>
-                    <a:ext cx="78740" cy="1292225"/>
-                  </a:xfrm>
-                  <a:prstGeom prst="rect">
-                    <a:avLst/>
-                  </a:prstGeom>
-                </pic:spPr>
-              </pic:pic>
-            </a:graphicData>
-          </a:graphic>
-        </wp:anchor>
-      </w:drawing>
-    </w:r>
-    <w:r>
-      <w:rPr>
-        <w:noProof/>
-      </w:rPr>
-      <mc:AlternateContent>
-        <mc:Choice Requires="wps">
-          <w:drawing>
-            <wp:anchor distT="45720" distB="45720" distL="114300" distR="114300" simplePos="0" relativeHeight="251661824" behindDoc="0" locked="0" layoutInCell="1" allowOverlap="1" wp14:anchorId="3D32274D" wp14:editId="481A8140">
-              <wp:simplePos x="0" y="0"/>
-              <wp:positionH relativeFrom="column">
-                <wp:posOffset>506095</wp:posOffset>
-              </wp:positionH>
-              <wp:positionV relativeFrom="paragraph">
-                <wp:posOffset>-353060</wp:posOffset>
-              </wp:positionV>
-              <wp:extent cx="6191250" cy="1207770"/>
-              <wp:effectExtent l="0" t="0" r="0" b="0"/>
-              <wp:wrapSquare wrapText="bothSides"/>
-              <wp:docPr id="217" name="Text Box 2"/>
-              <wp:cNvGraphicFramePr>
-                <a:graphicFrameLocks xmlns:a="http://schemas.openxmlformats.org/drawingml/2006/main"/>
-              </wp:cNvGraphicFramePr>
-              <a:graphic xmlns:a="http://schemas.openxmlformats.org/drawingml/2006/main">
-                <a:graphicData uri="http://schemas.microsoft.com/office/word/2010/wordprocessingShape">
-                  <wps:wsp>
-                    <wps:cNvSpPr txBox="1">
-                      <a:spLocks noChangeArrowheads="1"/>
-                    </wps:cNvSpPr>
-                    <wps:spPr bwMode="auto">
-                      <a:xfrm>
-                        <a:off x="0" y="0"/>
-                        <a:ext cx="6191250" cy="1207770"/>
-                      </a:xfrm>
-                      <a:prstGeom prst="rect">
-                        <a:avLst/>
-                      </a:prstGeom>
-                      <a:solidFill>
-                        <a:srgbClr val="FFFFFF"/>
-                      </a:solidFill>
-                      <a:ln w="9525">
-                        <a:noFill/>
-                        <a:miter lim="800000"/>
-                      </a:ln>
-                    </wps:spPr>
-                    <wps:txbx>
-                      <w:txbxContent>
-                        <w:p>
-                          <w:pPr>
-                            <w:rPr>
-                              <w:rFonts w:ascii="Arial Narrow" w:hAnsi="Arial Narrow"/>
-                              <w:szCs w:val="24"/>
-                            </w:rPr>
-                          </w:pPr>
-                        </w:p>
-                        <w:p>
-                          <w:pPr>
-                            <w:rPr>
-                              <w:rFonts w:ascii="Arial Narrow" w:hAnsi="Arial Narrow"/>
-                              <w:sz w:val="28"/>
-                              <w:szCs w:val="28"/>
-                            </w:rPr>
-                          </w:pPr>
-                          <w:r>
-                            <w:rPr>
-                              <w:rFonts w:ascii="Arial Narrow" w:hAnsi="Arial Narrow"/>
-                              <w:sz w:val="28"/>
-                              <w:szCs w:val="28"/>
-                            </w:rPr>
-                            <w:t>KEMENTERIAN KETENAGAKERJAAN REPUBLIK INDONESIA</w:t>
-                          </w:r>
-                        </w:p>
-                        <w:p>
-                          <w:pPr>
-                            <w:rPr>
-                              <w:rFonts w:ascii="Arial Narrow" w:hAnsi="Arial Narrow"/>
-                              <w:b/>
-                              <w:color w:val="284A61"/>
-                              <w:sz w:val="32"/>
-                              <w:szCs w:val="32"/>
-                            </w:rPr>
-                          </w:pPr>
-                          <w:r>
-                            <w:rPr>
-                              <w:rFonts w:ascii="Arial Narrow" w:hAnsi="Arial Narrow"/>
-                              <w:b/>
-                              <w:color w:val="284A61"/>
-                              <w:sz w:val="32"/>
-                              <w:szCs w:val="32"/>
-                            </w:rPr>
-                            <w:t>SEKRETARIAT JENDERAL</w:t>
-                          </w:r>
-                        </w:p>
-                        <w:p>
-                          <w:pPr>
-                            <w:rPr>
-                              <w:rFonts w:ascii="Arial Narrow" w:hAnsi="Arial Narrow"/>
-                              <w:color w:val="000000" w:themeColor="text1"/>
-                              <w:sz w:val="18"/>
-                              <w:szCs w:val="18"/>
-                            </w:rPr>
-                          </w:pPr>
-                          <w:r>
-                            <w:rPr>
-                              <w:rFonts w:ascii="Arial Narrow" w:hAnsi="Arial Narrow"/>
-                              <w:color w:val="000000" w:themeColor="text1"/>
-                              <w:sz w:val="18"/>
-                              <w:szCs w:val="18"/>
-                            </w:rPr>
-                            <w:t>Jalan Jenderal Gatot Subroto Kaveling 51, Kelurahan Kuningan Timur, Kecamatan Setiabudi, Kota Jakarta Selatan, Provinsi DKI Jakarta 12950</w:t>
-                          </w:r>
-                        </w:p>
-                        <w:p>
-                          <w:pPr>
-                            <w:rPr>
-                              <w:rFonts w:ascii="Arial Narrow" w:hAnsi="Arial Narrow"/>
-                              <w:color w:val="000000" w:themeColor="text1"/>
-                              <w:sz w:val="18"/>
-                              <w:szCs w:val="18"/>
-                            </w:rPr>
-                          </w:pPr>
-                          <w:r>
-                            <w:rPr>
-                              <w:rFonts w:ascii="Arial Narrow" w:hAnsi="Arial Narrow"/>
-                              <w:noProof/>
-                              <w:color w:val="000000" w:themeColor="text1"/>
-                              <w:sz w:val="18"/>
-                              <w:szCs w:val="18"/>
-                            </w:rPr>
-                            <w:drawing>
-                              <wp:inline distT="0" distB="0" distL="0" distR="0" wp14:anchorId="425DBE8A" wp14:editId="21639D56">
-                                <wp:extent cx="130810" cy="133350"/>
-                                <wp:effectExtent l="0" t="0" r="2540" b="0"/>
-                                <wp:docPr id="4" name="Picture 4"/>
-                                <wp:cNvGraphicFramePr>
-                                  <a:graphicFrameLocks xmlns:a="http://schemas.openxmlformats.org/drawingml/2006/main" noChangeAspect="1"/>
-                                </wp:cNvGraphicFramePr>
-                                <a:graphic xmlns:a="http://schemas.openxmlformats.org/drawingml/2006/main">
-                                  <a:graphicData uri="http://schemas.openxmlformats.org/drawingml/2006/picture">
-                                    <pic:pic xmlns:pic="http://schemas.openxmlformats.org/drawingml/2006/picture">
-                                      <pic:nvPicPr>
-                                        <pic:cNvPr id="25" name="Picture 25"/>
-                                        <pic:cNvPicPr>
-                                          <a:picLocks noChangeAspect="1"/>
-                                        </pic:cNvPicPr>
-                                      </pic:nvPicPr>
-                                      <pic:blipFill>
-                                        <a:blip r:embed="rId3" cstate="print">
-                                          <a:extLst>
-                                            <a:ext uri="{28A0092B-C50C-407E-A947-70E740481C1C}">
-                                              <a14:useLocalDpi xmlns:a14="http://schemas.microsoft.com/office/drawing/2010/main" val="0"/>
-                                            </a:ext>
-                                          </a:extLst>
-                                        </a:blip>
-                                        <a:stretch>
-                                          <a:fillRect/>
-                                        </a:stretch>
-                                      </pic:blipFill>
-                                      <pic:spPr>
-                                        <a:xfrm>
-                                          <a:off x="0" y="0"/>
-                                          <a:ext cx="169397" cy="173336"/>
-                                        </a:xfrm>
-                                        <a:prstGeom prst="rect">
-                                          <a:avLst/>
-                                        </a:prstGeom>
-                                      </pic:spPr>
-                                    </pic:pic>
-                                  </a:graphicData>
-                                </a:graphic>
-                              </wp:inline>
-                            </w:drawing>
-                          </w:r>
-                          <w:r>
-                            <w:rPr>
-                              <w:rFonts w:ascii="Arial Narrow" w:hAnsi="Arial Narrow"/>
-                              <w:color w:val="000000" w:themeColor="text1"/>
-                              <w:sz w:val="18"/>
-                              <w:szCs w:val="18"/>
-                            </w:rPr>
-                            <w:t xml:space="preserve"> </w:t>
-                          </w:r>
-                          <w:hyperlink r:id="rId4" w:history="1">
-                            <w:r>
-                              <w:rPr>
-                                <w:rFonts w:ascii="Arial Narrow" w:hAnsi="Arial Narrow"/>
-                                <w:sz w:val="18"/>
-                                <w:szCs w:val="18"/>
-                              </w:rPr>
-                              <w:t>www.kemnaker.go.id</w:t>
-                            </w:r>
-                          </w:hyperlink>
-                          <w:r>
-                            <w:rPr>
-                              <w:rFonts w:ascii="Arial Narrow" w:hAnsi="Arial Narrow"/>
-                              <w:sz w:val="18"/>
-                              <w:szCs w:val="18"/>
-                            </w:rPr>
-                            <w:tab/>
-                            <w:t xml:space="preserve"> </w:t>
-                          </w:r>
-                          <w:r>
-                            <w:rPr>
-                              <w:rFonts w:ascii="Arial Narrow" w:hAnsi="Arial Narrow"/>
-                              <w:noProof/>
-                              <w:sz w:val="18"/>
-                              <w:szCs w:val="18"/>
-                            </w:rPr>
-                            <w:drawing>
-                              <wp:inline distT="0" distB="0" distL="0" distR="0" wp14:anchorId="0597A09F" wp14:editId="24F9A5F7">
-                                <wp:extent cx="118745" cy="78740"/>
-                                <wp:effectExtent l="0" t="0" r="0" b="0"/>
-                                <wp:docPr id="5" name="Picture 5"/>
-                                <wp:cNvGraphicFramePr>
-                                  <a:graphicFrameLocks xmlns:a="http://schemas.openxmlformats.org/drawingml/2006/main" noChangeAspect="1"/>
-                                </wp:cNvGraphicFramePr>
-                                <a:graphic xmlns:a="http://schemas.openxmlformats.org/drawingml/2006/main">
-                                  <a:graphicData uri="http://schemas.openxmlformats.org/drawingml/2006/picture">
-                                    <pic:pic xmlns:pic="http://schemas.openxmlformats.org/drawingml/2006/picture">
-                                      <pic:nvPicPr>
-                                        <pic:cNvPr id="26" name="Picture 26"/>
-                                        <pic:cNvPicPr>
-                                          <a:picLocks noChangeAspect="1"/>
-                                        </pic:cNvPicPr>
-                                      </pic:nvPicPr>
-                                      <pic:blipFill>
-                                        <a:blip r:embed="rId5" cstate="print">
-                                          <a:extLst>
-                                            <a:ext uri="{28A0092B-C50C-407E-A947-70E740481C1C}">
-                                              <a14:useLocalDpi xmlns:a14="http://schemas.microsoft.com/office/drawing/2010/main" val="0"/>
-                                            </a:ext>
-                                          </a:extLst>
-                                        </a:blip>
-                                        <a:stretch>
-                                          <a:fillRect/>
-                                        </a:stretch>
-                                      </pic:blipFill>
-                                      <pic:spPr>
-                                        <a:xfrm>
-                                          <a:off x="0" y="0"/>
-                                          <a:ext cx="118872" cy="79248"/>
-                                        </a:xfrm>
-                                        <a:prstGeom prst="rect">
-                                          <a:avLst/>
-                                        </a:prstGeom>
-                                      </pic:spPr>
-                                    </pic:pic>
-                                  </a:graphicData>
-                                </a:graphic>
-                              </wp:inline>
-                            </w:drawing>
-                          </w:r>
-                          <w:r>
-                            <w:rPr>
-                              <w:rFonts w:ascii="Arial Narrow" w:hAnsi="Arial Narrow"/>
-                              <w:sz w:val="18"/>
-                              <w:szCs w:val="18"/>
-                            </w:rPr>
-                            <w:t xml:space="preserve"> </w:t>
-                          </w:r>
-                          <w:hyperlink r:id="rId6" w:history="1">
-                            <w:r>
-                              <w:rPr>
-                                <w:rFonts w:ascii="Arial Narrow" w:hAnsi="Arial Narrow"/>
-                                <w:sz w:val="18"/>
-                                <w:szCs w:val="18"/>
-                              </w:rPr>
-                              <w:t>persuratan@kemnaker.go.id</w:t>
-                            </w:r>
-                          </w:hyperlink>
-                          <w:r>
-                            <w:rPr>
-                              <w:rFonts w:ascii="Arial Narrow" w:hAnsi="Arial Narrow"/>
-                              <w:sz w:val="18"/>
-                              <w:szCs w:val="18"/>
-                            </w:rPr>
-                            <w:tab/>
-                          </w:r>
-                          <w:r>
-                            <w:rPr>
-                              <w:rFonts w:ascii="Arial Narrow" w:hAnsi="Arial Narrow"/>
-                              <w:color w:val="000000" w:themeColor="text1"/>
-                              <w:sz w:val="18"/>
-                              <w:szCs w:val="18"/>
-                            </w:rPr>
-                            <w:tab/>
-                          </w:r>
-                          <w:r>
-                            <w:rPr>
-                              <w:rFonts w:ascii="Arial Narrow" w:hAnsi="Arial Narrow"/>
-                              <w:noProof/>
-                              <w:color w:val="000000" w:themeColor="text1"/>
-                              <w:sz w:val="18"/>
-                              <w:szCs w:val="18"/>
-                            </w:rPr>
-                            <w:drawing>
-                              <wp:inline distT="0" distB="0" distL="0" distR="0" wp14:anchorId="1860C309" wp14:editId="5326DCA0">
-                                <wp:extent cx="100330" cy="100330"/>
-                                <wp:effectExtent l="0" t="0" r="0" b="0"/>
-                                <wp:docPr id="6" name="Picture 6"/>
-                                <wp:cNvGraphicFramePr>
-                                  <a:graphicFrameLocks xmlns:a="http://schemas.openxmlformats.org/drawingml/2006/main" noChangeAspect="1"/>
-                                </wp:cNvGraphicFramePr>
-                                <a:graphic xmlns:a="http://schemas.openxmlformats.org/drawingml/2006/main">
-                                  <a:graphicData uri="http://schemas.openxmlformats.org/drawingml/2006/picture">
-                                    <pic:pic xmlns:pic="http://schemas.openxmlformats.org/drawingml/2006/picture">
-                                      <pic:nvPicPr>
-                                        <pic:cNvPr id="27" name="Picture 27"/>
-                                        <pic:cNvPicPr>
-                                          <a:picLocks noChangeAspect="1"/>
-                                        </pic:cNvPicPr>
-                                      </pic:nvPicPr>
-                                      <pic:blipFill>
-                                        <a:blip r:embed="rId7" cstate="print">
-                                          <a:extLst>
-                                            <a:ext uri="{28A0092B-C50C-407E-A947-70E740481C1C}">
-                                              <a14:useLocalDpi xmlns:a14="http://schemas.microsoft.com/office/drawing/2010/main" val="0"/>
-                                            </a:ext>
-                                          </a:extLst>
-                                        </a:blip>
-                                        <a:stretch>
-                                          <a:fillRect/>
-                                        </a:stretch>
-                                      </pic:blipFill>
-                                      <pic:spPr>
-                                        <a:xfrm>
-                                          <a:off x="0" y="0"/>
-                                          <a:ext cx="100584" cy="100584"/>
-                                        </a:xfrm>
-                                        <a:prstGeom prst="rect">
-                                          <a:avLst/>
-                                        </a:prstGeom>
-                                      </pic:spPr>
-                                    </pic:pic>
-                                  </a:graphicData>
-                                </a:graphic>
-                              </wp:inline>
-                            </w:drawing>
-                          </w:r>
-                          <w:r>
-                            <w:rPr>
-                              <w:rFonts w:ascii="Arial Narrow" w:hAnsi="Arial Narrow"/>
-                              <w:color w:val="000000" w:themeColor="text1"/>
-                              <w:sz w:val="18"/>
-                              <w:szCs w:val="18"/>
-                            </w:rPr>
-                            <w:t xml:space="preserve"> 1500630</w:t>
-                          </w:r>
-                        </w:p>
-                      </w:txbxContent>
-                    </wps:txbx>
-                    <wps:bodyPr rot="0" vert="horz" wrap="square" lIns="91440" tIns="45720" rIns="91440" bIns="45720" anchor="t" anchorCtr="0">
-                      <a:noAutofit/>
-                    </wps:bodyPr>
-                  </wps:wsp>
-                </a:graphicData>
-              </a:graphic>
-            </wp:anchor>
-          </w:drawing>
-        </mc:Choice>
-        <mc:Fallback>
-          <w:pict>
-            <v:shapetype w14:anchorId="3D32274D" id="_x0000_t202" coordsize="21600,21600" o:spt="202" path="m,l,21600r21600,l21600,xe">
-              <v:stroke joinstyle="miter"/>
-              <v:path gradientshapeok="t" o:connecttype="rect"/>
-            </v:shapetype>
-            <v:shape id="Text Box 2" o:spid="_x0000_s1026" type="#_x0000_t202" style="position:absolute;margin-left:39.85pt;margin-top:-27.8pt;width:487.5pt;height:95.1pt;z-index:251661824;visibility:visible;mso-wrap-style:square;mso-wrap-distance-left:9pt;mso-wrap-distance-top:3.6pt;mso-wrap-distance-right:9pt;mso-wrap-distance-bottom:3.6pt;mso-position-horizontal:absolute;mso-position-horizontal-relative:text;mso-position-vertical:absolute;mso-position-vertical-relative:text;v-text-anchor:top" o:gfxdata="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" stroked="f">
-              <v:textbox>
-                <w:txbxContent>
-                  <w:p>
-                    <w:pPr>
-                      <w:rPr>
-                        <w:rFonts w:ascii="Arial Narrow" w:hAnsi="Arial Narrow"/>
-                        <w:szCs w:val="24"/>
-                      </w:rPr>
-                    </w:pPr>
-                  </w:p>
-                  <w:p>
-                    <w:pPr>
-                      <w:rPr>
-                        <w:rFonts w:ascii="Arial Narrow" w:hAnsi="Arial Narrow"/>
-                        <w:sz w:val="28"/>
-                        <w:szCs w:val="28"/>
-                      </w:rPr>
-                    </w:pPr>
-                    <w:r>
-                      <w:rPr>
-                        <w:rFonts w:ascii="Arial Narrow" w:hAnsi="Arial Narrow"/>
-                        <w:sz w:val="28"/>
-                        <w:szCs w:val="28"/>
-                      </w:rPr>
-                      <w:t>KEMENTERIAN KETENAGAKERJAAN REPUBLIK INDONESIA</w:t>
-                    </w:r>
-                  </w:p>
-                  <w:p>
-                    <w:pPr>
-                      <w:rPr>
-                        <w:rFonts w:ascii="Arial Narrow" w:hAnsi="Arial Narrow"/>
-                        <w:b/>
-                        <w:color w:val="284A61"/>
-                        <w:sz w:val="32"/>
-                        <w:szCs w:val="32"/>
-                      </w:rPr>
-                    </w:pPr>
-                    <w:r>
-                      <w:rPr>
-                        <w:rFonts w:ascii="Arial Narrow" w:hAnsi="Arial Narrow"/>
-                        <w:b/>
-                        <w:color w:val="284A61"/>
-                        <w:sz w:val="32"/>
-                        <w:szCs w:val="32"/>
-                      </w:rPr>
-                      <w:t>SEKRETARIAT JENDERAL</w:t>
-                    </w:r>
-                  </w:p>
-                  <w:p>
-                    <w:pPr>
-                      <w:rPr>
-                        <w:rFonts w:ascii="Arial Narrow" w:hAnsi="Arial Narrow"/>
-                        <w:color w:val="000000" w:themeColor="text1"/>
-                        <w:sz w:val="18"/>
-                        <w:szCs w:val="18"/>
-                      </w:rPr>
-                    </w:pPr>
-                    <w:r>
-                      <w:rPr>
-                        <w:rFonts w:ascii="Arial Narrow" w:hAnsi="Arial Narrow"/>
-                        <w:color w:val="000000" w:themeColor="text1"/>
-                        <w:sz w:val="18"/>
-                        <w:szCs w:val="18"/>
-                      </w:rPr>
-                      <w:t>Jalan Jenderal Gatot Subroto Kaveling 51, Kelurahan Kuningan Timur, Kecamatan Setiabudi, Kota Jakarta Selatan, Provinsi DKI Jakarta 12950</w:t>
-                    </w:r>
-                  </w:p>
-                  <w:p>
-                    <w:pPr>
-                      <w:rPr>
-                        <w:rFonts w:ascii="Arial Narrow" w:hAnsi="Arial Narrow"/>
-                        <w:color w:val="000000" w:themeColor="text1"/>
-                        <w:sz w:val="18"/>
-                        <w:szCs w:val="18"/>
-                      </w:rPr>
-                    </w:pPr>
-                    <w:r>
-                      <w:rPr>
-                        <w:rFonts w:ascii="Arial Narrow" w:hAnsi="Arial Narrow"/>
-                        <w:noProof/>
-                        <w:color w:val="000000" w:themeColor="text1"/>
-                        <w:sz w:val="18"/>
-                        <w:szCs w:val="18"/>
-                      </w:rPr>
-                      <w:drawing>
-                        <wp:inline distT="0" distB="0" distL="0" distR="0" wp14:anchorId="425DBE8A" wp14:editId="21639D56">
-                          <wp:extent cx="130810" cy="133350"/>
-                          <wp:effectExtent l="0" t="0" r="2540" b="0"/>
-                          <wp:docPr id="4" name="Picture 4"/>
-                          <wp:cNvGraphicFramePr>
-                            <a:graphicFrameLocks xmlns:a="http://schemas.openxmlformats.org/drawingml/2006/main" noChangeAspect="1"/>
-                          </wp:cNvGraphicFramePr>
-                          <a:graphic xmlns:a="http://schemas.openxmlformats.org/drawingml/2006/main">
-                            <a:graphicData uri="http://schemas.openxmlformats.org/drawingml/2006/picture">
-                              <pic:pic xmlns:pic="http://schemas.openxmlformats.org/drawingml/2006/picture">
-                                <pic:nvPicPr>
-                                  <pic:cNvPr id="25" name="Picture 25"/>
-                                  <pic:cNvPicPr>
-                                    <a:picLocks noChangeAspect="1"/>
-                                  </pic:cNvPicPr>
-                                </pic:nvPicPr>
-                                <pic:blipFill>
-                                  <a:blip r:embed="rId3" cstate="print">
-                                    <a:extLst>
-                                      <a:ext uri="{28A0092B-C50C-407E-A947-70E740481C1C}">
-                                        <a14:useLocalDpi xmlns:a14="http://schemas.microsoft.com/office/drawing/2010/main" val="0"/>
-                                      </a:ext>
-                                    </a:extLst>
-                                  </a:blip>
-                                  <a:stretch>
-                                    <a:fillRect/>
-                                  </a:stretch>
-                                </pic:blipFill>
-                                <pic:spPr>
-                                  <a:xfrm>
-                                    <a:off x="0" y="0"/>
-                                    <a:ext cx="169397" cy="173336"/>
-                                  </a:xfrm>
-                                  <a:prstGeom prst="rect">
-                                    <a:avLst/>
-                                  </a:prstGeom>
-                                </pic:spPr>
-                              </pic:pic>
-                            </a:graphicData>
-                          </a:graphic>
-                        </wp:inline>
-                      </w:drawing>
-                    </w:r>
-                    <w:r>
-                      <w:rPr>
-                        <w:rFonts w:ascii="Arial Narrow" w:hAnsi="Arial Narrow"/>
-                        <w:color w:val="000000" w:themeColor="text1"/>
-                        <w:sz w:val="18"/>
-                        <w:szCs w:val="18"/>
-                      </w:rPr>
-                      <w:t xml:space="preserve"> </w:t>
-                    </w:r>
-                    <w:hyperlink r:id="rId8" w:history="1">
-                      <w:r>
-                        <w:rPr>
-                          <w:rFonts w:ascii="Arial Narrow" w:hAnsi="Arial Narrow"/>
-                          <w:sz w:val="18"/>
-                          <w:szCs w:val="18"/>
-                        </w:rPr>
-                        <w:t>www.kemnaker.go.id</w:t>
-                      </w:r>
-                    </w:hyperlink>
-                    <w:r>
-                      <w:rPr>
-                        <w:rFonts w:ascii="Arial Narrow" w:hAnsi="Arial Narrow"/>
-                        <w:sz w:val="18"/>
-                        <w:szCs w:val="18"/>
-                      </w:rPr>
-                      <w:tab/>
-                      <w:t xml:space="preserve"> </w:t>
-                    </w:r>
-                    <w:r>
-                      <w:rPr>
-                        <w:rFonts w:ascii="Arial Narrow" w:hAnsi="Arial Narrow"/>
-                        <w:noProof/>
-                        <w:sz w:val="18"/>
-                        <w:szCs w:val="18"/>
-                      </w:rPr>
-                      <w:drawing>
-                        <wp:inline distT="0" distB="0" distL="0" distR="0" wp14:anchorId="0597A09F" wp14:editId="24F9A5F7">
-                          <wp:extent cx="118745" cy="78740"/>
-                          <wp:effectExtent l="0" t="0" r="0" b="0"/>
-                          <wp:docPr id="5" name="Picture 5"/>
-                          <wp:cNvGraphicFramePr>
-                            <a:graphicFrameLocks xmlns:a="http://schemas.openxmlformats.org/drawingml/2006/main" noChangeAspect="1"/>
-                          </wp:cNvGraphicFramePr>
-                          <a:graphic xmlns:a="http://schemas.openxmlformats.org/drawingml/2006/main">
-                            <a:graphicData uri="http://schemas.openxmlformats.org/drawingml/2006/picture">
-                              <pic:pic xmlns:pic="http://schemas.openxmlformats.org/drawingml/2006/picture">
-                                <pic:nvPicPr>
-                                  <pic:cNvPr id="26" name="Picture 26"/>
-                                  <pic:cNvPicPr>
-                                    <a:picLocks noChangeAspect="1"/>
-                                  </pic:cNvPicPr>
-                                </pic:nvPicPr>
-                                <pic:blipFill>
-                                  <a:blip r:embed="rId5" cstate="print">
-                                    <a:extLst>
-                                      <a:ext uri="{28A0092B-C50C-407E-A947-70E740481C1C}">
-                                        <a14:useLocalDpi xmlns:a14="http://schemas.microsoft.com/office/drawing/2010/main" val="0"/>
-                                      </a:ext>
-                                    </a:extLst>
-                                  </a:blip>
-                                  <a:stretch>
-                                    <a:fillRect/>
-                                  </a:stretch>
-                                </pic:blipFill>
-                                <pic:spPr>
-                                  <a:xfrm>
-                                    <a:off x="0" y="0"/>
-                                    <a:ext cx="118872" cy="79248"/>
-                                  </a:xfrm>
-                                  <a:prstGeom prst="rect">
-                                    <a:avLst/>
-                                  </a:prstGeom>
-                                </pic:spPr>
-                              </pic:pic>
-                            </a:graphicData>
-                          </a:graphic>
-                        </wp:inline>
-                      </w:drawing>
-                    </w:r>
-                    <w:r>
-                      <w:rPr>
-                        <w:rFonts w:ascii="Arial Narrow" w:hAnsi="Arial Narrow"/>
-                        <w:sz w:val="18"/>
-                        <w:szCs w:val="18"/>
-                      </w:rPr>
-                      <w:t xml:space="preserve"> </w:t>
-                    </w:r>
-                    <w:hyperlink r:id="rId9" w:history="1">
-                      <w:r>
-                        <w:rPr>
-                          <w:rFonts w:ascii="Arial Narrow" w:hAnsi="Arial Narrow"/>
-                          <w:sz w:val="18"/>
-                          <w:szCs w:val="18"/>
-                        </w:rPr>
-                        <w:t>persuratan@kemnaker.go.id</w:t>
-                      </w:r>
-                    </w:hyperlink>
-                    <w:r>
-                      <w:rPr>
-                        <w:rFonts w:ascii="Arial Narrow" w:hAnsi="Arial Narrow"/>
-                        <w:sz w:val="18"/>
-                        <w:szCs w:val="18"/>
-                      </w:rPr>
-                      <w:tab/>
-                    </w:r>
-                    <w:r>
-                      <w:rPr>
-                        <w:rFonts w:ascii="Arial Narrow" w:hAnsi="Arial Narrow"/>
-                        <w:color w:val="000000" w:themeColor="text1"/>
-                        <w:sz w:val="18"/>
-                        <w:szCs w:val="18"/>
-                      </w:rPr>
-                      <w:tab/>
-                    </w:r>
-                    <w:r>
-                      <w:rPr>
-                        <w:rFonts w:ascii="Arial Narrow" w:hAnsi="Arial Narrow"/>
-                        <w:noProof/>
-                        <w:color w:val="000000" w:themeColor="text1"/>
-                        <w:sz w:val="18"/>
-                        <w:szCs w:val="18"/>
-                      </w:rPr>
-                      <w:drawing>
-                        <wp:inline distT="0" distB="0" distL="0" distR="0" wp14:anchorId="1860C309" wp14:editId="5326DCA0">
-                          <wp:extent cx="100330" cy="100330"/>
-                          <wp:effectExtent l="0" t="0" r="0" b="0"/>
-                          <wp:docPr id="6" name="Picture 6"/>
-                          <wp:cNvGraphicFramePr>
-                            <a:graphicFrameLocks xmlns:a="http://schemas.openxmlformats.org/drawingml/2006/main" noChangeAspect="1"/>
-                          </wp:cNvGraphicFramePr>
-                          <a:graphic xmlns:a="http://schemas.openxmlformats.org/drawingml/2006/main">
-                            <a:graphicData uri="http://schemas.openxmlformats.org/drawingml/2006/picture">
-                              <pic:pic xmlns:pic="http://schemas.openxmlformats.org/drawingml/2006/picture">
-                                <pic:nvPicPr>
-                                  <pic:cNvPr id="27" name="Picture 27"/>
-                                  <pic:cNvPicPr>
-                                    <a:picLocks noChangeAspect="1"/>
-                                  </pic:cNvPicPr>
-                                </pic:nvPicPr>
-                                <pic:blipFill>
-                                  <a:blip r:embed="rId7" cstate="print">
-                                    <a:extLst>
-                                      <a:ext uri="{28A0092B-C50C-407E-A947-70E740481C1C}">
-                                        <a14:useLocalDpi xmlns:a14="http://schemas.microsoft.com/office/drawing/2010/main" val="0"/>
-                                      </a:ext>
-                                    </a:extLst>
-                                  </a:blip>
-                                  <a:stretch>
-                                    <a:fillRect/>
-                                  </a:stretch>
-                                </pic:blipFill>
-                                <pic:spPr>
-                                  <a:xfrm>
-                                    <a:off x="0" y="0"/>
-                                    <a:ext cx="100584" cy="100584"/>
-                                  </a:xfrm>
-                                  <a:prstGeom prst="rect">
-                                    <a:avLst/>
-                                  </a:prstGeom>
-                                </pic:spPr>
-                              </pic:pic>
-                            </a:graphicData>
-                          </a:graphic>
-                        </wp:inline>
-                      </w:drawing>
-                    </w:r>
-                    <w:r>
-                      <w:rPr>
-                        <w:rFonts w:ascii="Arial Narrow" w:hAnsi="Arial Narrow"/>
-                        <w:color w:val="000000" w:themeColor="text1"/>
-                        <w:sz w:val="18"/>
-                        <w:szCs w:val="18"/>
-                      </w:rPr>
-                      <w:t xml:space="preserve"> 1500630</w:t>
-                    </w:r>
-                  </w:p>
-                </w:txbxContent>
-              </v:textbox>
-              <w10:wrap type="square"/>
-            </v:shape>
-          </w:pict>
-        </mc:Fallback>
-      </mc:AlternateContent>
-    </w:r>
-  </w:p>
-  <w:p>
-    <w:pPr>
-      <w:pStyle w:val="Header"/>
-    </w:pPr>
-  </w:p>
-  <w:p>
-    <w:pPr>
-      <w:pStyle w:val="Header"/>
-    </w:pPr>
-  </w:p>
-  <w:p>
-    <w:pPr>
-      <w:pStyle w:val="Header"/>
-    </w:pPr>
-  </w:p>
-  <w:p>
-    <w:pPr>
-      <w:pStyle w:val="Header"/>
-      <w:rPr>
-        <w:lang w:val="en-US"/>
-      </w:rPr>
-    </w:pPr>
-  </w:p>
-  <w:p>
-    <w:pPr>
-      <w:pStyle w:val="Header"/>
-    </w:pPr>
-    <w:r>
-      <w:rPr>
-        <w:noProof/>
-      </w:rPr>
-      <mc:AlternateContent>
-        <mc:Choice Requires="wps">
-          <w:drawing>
-            <wp:anchor distT="0" distB="0" distL="114300" distR="114300" simplePos="0" relativeHeight="251658752" behindDoc="0" locked="0" layoutInCell="1" allowOverlap="1" wp14:anchorId="7BF12C82" wp14:editId="5858F746">
-              <wp:simplePos x="0" y="0"/>
-              <wp:positionH relativeFrom="column">
-                <wp:posOffset>-352425</wp:posOffset>
-              </wp:positionH>
-              <wp:positionV relativeFrom="paragraph">
-                <wp:posOffset>168275</wp:posOffset>
-              </wp:positionV>
-              <wp:extent cx="7096125" cy="0"/>
-              <wp:effectExtent l="0" t="19050" r="28575" b="19050"/>
-              <wp:wrapNone/>
-              <wp:docPr id="1" name="Straight Connector 1"/>
-              <wp:cNvGraphicFramePr/>
-              <a:graphic xmlns:a="http://schemas.openxmlformats.org/drawingml/2006/main">
-                <a:graphicData uri="http://schemas.microsoft.com/office/word/2010/wordprocessingShape">
-                  <wps:wsp>
-                    <wps:cNvCnPr/>
-                    <wps:spPr>
-                      <a:xfrm>
-                        <a:off x="0" y="0"/>
-                        <a:ext cx="7096125" cy="0"/>
-                      </a:xfrm>
-                      <a:prstGeom prst="line">
-                        <a:avLst/>
-                      </a:prstGeom>
-                      <a:ln w="28575"/>
-                    </wps:spPr>
-                    <wps:style>
-                      <a:lnRef idx="1">
-                        <a:schemeClr val="dk1"/>
-                      </a:lnRef>
-                      <a:fillRef idx="0">
-                        <a:schemeClr val="dk1"/>
-                      </a:fillRef>
-                      <a:effectRef idx="0">
-                        <a:schemeClr val="dk1"/>
-                      </a:effectRef>
-                      <a:fontRef idx="minor">
-                        <a:schemeClr val="tx1"/>
-                      </a:fontRef>
-                    </wps:style>
-                    <wps:bodyPr/>
-                  </wps:wsp>
-                </a:graphicData>
-              </a:graphic>
-              <wp14:sizeRelH relativeFrom="margin">
-                <wp14:pctWidth>0</wp14:pctWidth>
-              </wp14:sizeRelH>
-            </wp:anchor>
-          </w:drawing>
-        </mc:Choice>
-        <mc:Fallback>
-          <w:pict>
-            <v:line w14:anchorId="0A93245E" id="Straight Connector 1" o:spid="_x0000_s1026" style="position:absolute;z-index:251658752;visibility:visible;mso-wrap-style:square;mso-width-percent:0;mso-wrap-distance-left:9pt;mso-wrap-distance-top:0;mso-wrap-distance-right:9pt;mso-wrap-distance-bottom:0;mso-position-horizontal:absolute;mso-position-horizontal-relative:text;mso-position-vertical:absolute;mso-position-vertical-relative:text;mso-width-percent:0;mso-width-relative:margin" from="-27.75pt,13.25pt" to="531pt,13.25pt" o:gfxdata="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" strokecolor="black [3040]" strokeweight="2.25pt"/>
-          </w:pict>
-        </mc:Fallback>
-      </mc:AlternateContent>
-    </w:r>
-  </w:p>
+<w:hdr xmlns:wpc="http://schemas.microsoft.com/office/word/2010/wordprocessingCanvas" xmlns:cx="http://schemas.microsoft.com/office/drawing/2014/chartex" xmlns:cx1="http://schemas.microsoft.com/office/drawing/2015/9/8/chartex" xmlns:cx2="http://schemas.microsoft.com/office/drawing/2015/10/21/chartex" xmlns:cx3="http://schemas.microsoft.com/office/drawing/2016/5/9/chartex" xmlns:cx4="http://schemas.microsoft.com/office/drawing/2016/5/10/chartex" xmlns:cx5="http://schemas.microsoft.com/office/drawing/2016/5/11/chartex" xmlns:cx6="http://schemas.microsoft.com/office/drawing/2016/5/12/chartex" xmlns:cx7="http://schemas.microsoft.com/office/drawing/2016/5/13/chartex" xmlns:cx8="http://schemas.microsoft.com/office/drawing/2016/5/14/chartex" xmlns:mc="http://schemas.openxmlformats.org/markup-compatibility/2006" xmlns:aink="http://schemas.microsoft.com/office/drawing/2016/ink" xmlns:am3d="http://schemas.microsoft.com/office/drawing/2017/model3d" xmlns:o="urn:schemas-microsoft-com:office:office" xmlns:oel="http://schemas.microsoft.com/office/2019/extlst" xmlns:r="http://schemas.openxmlformats.org/officeDocument/2006/relationships" xmlns:m="http://schemas.openxmlformats.org/officeDocument/2006/math" xmlns:v="urn:schemas-microsoft-com:vml" xmlns:wp14="http://schemas.microsoft.com/office/word/2010/wordprocessingDrawing" xmlns:wp="http://schemas.openxmlformats.org/drawingml/2006/wordprocessingDrawing" xmlns:w10="urn:schemas-microsoft-com:office:word" xmlns:w="http://schemas.openxmlformats.org/wordprocessingml/2006/main" xmlns:w14="http://schemas.microsoft.com/office/word/2010/wordml" xmlns:w15="http://schemas.microsoft.com/office/word/2012/wordml" xmlns:w16cex="http://schemas.microsoft.com/office/word/2018/wordml/cex" xmlns:w16cid="http://schemas.microsoft.com/office/word/2016/wordml/cid" xmlns:w16="http://schemas.microsoft.com/office/word/2018/wordml" xmlns:w16du="http://schemas.microsoft.com/office/word/2023/wordml/word16du" xmlns:w16sdtdh="http://schemas.microsoft.com/office/word/2020/wordml/sdtdatahash" xmlns:w16sdtfl="http://schemas.microsoft.com/office/word/2024/wordml/sdtformatlock" xmlns:w16se="http://schemas.microsoft.com/office/word/2015/wordml/symex" xmlns:wpg="http://schemas.microsoft.com/office/word/2010/wordprocessingGroup" xmlns:wpi="http://schemas.microsoft.com/office/word/2010/wordprocessingInk" xmlns:wne="http://schemas.microsoft.com/office/word/2006/wordml" xmlns:wps="http://schemas.microsoft.com/office/word/2010/wordprocessingShape" mc:Ignorable="w14 w15 w16se w16cid w16 w16cex w16sdtdh w16sdtfl w16du wp14">
+  <w:tbl>
+    <w:tblPr>
+      <w:tblStyle w:val="TableGrid"/>
+      <w:tblW w:w="0" w:type="auto"/>
+      <w:tblLook w:val="04A0" w:firstRow="1" w:lastRow="0" w:firstColumn="1" w:lastColumn="0" w:noHBand="0" w:noVBand="1"/>
+    </w:tblPr>
+    <w:tblGrid>
+      <w:gridCol w:w="1384"/>
+      <w:gridCol w:w="8912"/>
+    </w:tblGrid>
+    <w:tr>
+      <w:trPr>
+        <w:trHeight w:val="1975"/>
+      </w:trPr>
+      <w:tc>
+        <w:tcPr>
+          <w:tcW w:w="1384" w:type="dxa"/>
+          <w:tcBorders>
+            <w:top w:val="nil"/>
+            <w:left w:val="nil"/>
+            <w:bottom w:val="nil"/>
+            <w:right w:val="nil"/>
+          </w:tcBorders>
+        </w:tcPr>
+        <w:p>
+          <w:pPr>
+            <w:pStyle w:val="Header"/>
+          </w:pPr>
+          <w:r>
+            <w:rPr>
+              <w:noProof/>
+            </w:rPr>
+            <w:drawing>
+              <wp:anchor distT="0" distB="0" distL="114300" distR="114300" simplePos="0" relativeHeight="251637760" behindDoc="1" locked="0" layoutInCell="1" allowOverlap="1" wp14:anchorId="76776B0B" wp14:editId="5E5288A5">
+                <wp:simplePos x="0" y="0"/>
+                <wp:positionH relativeFrom="column">
+                  <wp:posOffset>689379</wp:posOffset>
+                </wp:positionH>
+                <wp:positionV relativeFrom="paragraph">
+                  <wp:posOffset>-11875</wp:posOffset>
+                </wp:positionV>
+                <wp:extent cx="78740" cy="1292225"/>
+                <wp:effectExtent l="0" t="0" r="0" b="3175"/>
+                <wp:wrapTight wrapText="bothSides">
+                  <wp:wrapPolygon edited="0">
+                    <wp:start x="0" y="0"/>
+                    <wp:lineTo x="0" y="21335"/>
+                    <wp:lineTo x="15677" y="21335"/>
+                    <wp:lineTo x="15677" y="0"/>
+                    <wp:lineTo x="0" y="0"/>
+                  </wp:wrapPolygon>
+                </wp:wrapTight>
+                <wp:docPr id="3" name="Picture 3"/>
+                <wp:cNvGraphicFramePr>
+                  <a:graphicFrameLocks xmlns:a="http://schemas.openxmlformats.org/drawingml/2006/main" noChangeAspect="1"/>
+                </wp:cNvGraphicFramePr>
+                <a:graphic xmlns:a="http://schemas.openxmlformats.org/drawingml/2006/main">
+                  <a:graphicData uri="http://schemas.openxmlformats.org/drawingml/2006/picture">
+                    <pic:pic xmlns:pic="http://schemas.openxmlformats.org/drawingml/2006/picture">
+                      <pic:nvPicPr>
+                        <pic:cNvPr id="2" name="Picture 2"/>
+                        <pic:cNvPicPr>
+                          <a:picLocks noChangeAspect="1"/>
+                        </pic:cNvPicPr>
+                      </pic:nvPicPr>
+                      <pic:blipFill>
+                        <a:blip r:embed="rId1" cstate="print">
+                          <a:extLst>
+                            <a:ext uri="{28A0092B-C50C-407E-A947-70E740481C1C}">
+                              <a14:useLocalDpi xmlns:a14="http://schemas.microsoft.com/office/drawing/2010/main" val="0"/>
+                            </a:ext>
+                          </a:extLst>
+                        </a:blip>
+                        <a:stretch>
+                          <a:fillRect/>
+                        </a:stretch>
+                      </pic:blipFill>
+                      <pic:spPr>
+                        <a:xfrm>
+                          <a:off x="0" y="0"/>
+                          <a:ext cx="78740" cy="1292225"/>
+                        </a:xfrm>
+                        <a:prstGeom prst="rect">
+                          <a:avLst/>
+                        </a:prstGeom>
+                      </pic:spPr>
+                    </pic:pic>
+                  </a:graphicData>
+                </a:graphic>
+              </wp:anchor>
+            </w:drawing>
+          </w:r>
+        </w:p>
+        <w:p>
+          <w:pPr>
+            <w:pStyle w:val="Header"/>
+          </w:pPr>
+          <w:r>
+            <w:rPr>
+              <w:noProof/>
+            </w:rPr>
+            <w:drawing>
+              <wp:anchor distT="0" distB="0" distL="114300" distR="114300" simplePos="0" relativeHeight="251676672" behindDoc="1" locked="0" layoutInCell="1" allowOverlap="1" wp14:anchorId="1F510154" wp14:editId="615CF181">
+                <wp:simplePos x="0" y="0"/>
+                <wp:positionH relativeFrom="column">
+                  <wp:posOffset>5847</wp:posOffset>
+                </wp:positionH>
+                <wp:positionV relativeFrom="paragraph">
+                  <wp:posOffset>100602</wp:posOffset>
+                </wp:positionV>
+                <wp:extent cx="648970" cy="819785"/>
+                <wp:effectExtent l="0" t="0" r="0" b="0"/>
+                <wp:wrapTight wrapText="bothSides">
+                  <wp:wrapPolygon edited="0">
+                    <wp:start x="8243" y="0"/>
+                    <wp:lineTo x="3804" y="3012"/>
+                    <wp:lineTo x="0" y="7027"/>
+                    <wp:lineTo x="0" y="10039"/>
+                    <wp:lineTo x="8877" y="16564"/>
+                    <wp:lineTo x="2536" y="17568"/>
+                    <wp:lineTo x="0" y="18572"/>
+                    <wp:lineTo x="0" y="21081"/>
+                    <wp:lineTo x="20924" y="21081"/>
+                    <wp:lineTo x="20924" y="19074"/>
+                    <wp:lineTo x="19656" y="18070"/>
+                    <wp:lineTo x="12047" y="16564"/>
+                    <wp:lineTo x="20924" y="9537"/>
+                    <wp:lineTo x="20924" y="7027"/>
+                    <wp:lineTo x="16485" y="3012"/>
+                    <wp:lineTo x="12681" y="0"/>
+                    <wp:lineTo x="8243" y="0"/>
+                  </wp:wrapPolygon>
+                </wp:wrapTight>
+                <wp:docPr id="2" name="Picture 2"/>
+                <wp:cNvGraphicFramePr>
+                  <a:graphicFrameLocks xmlns:a="http://schemas.openxmlformats.org/drawingml/2006/main" noChangeAspect="1"/>
+                </wp:cNvGraphicFramePr>
+                <a:graphic xmlns:a="http://schemas.openxmlformats.org/drawingml/2006/main">
+                  <a:graphicData uri="http://schemas.openxmlformats.org/drawingml/2006/picture">
+                    <pic:pic xmlns:pic="http://schemas.openxmlformats.org/drawingml/2006/picture">
+                      <pic:nvPicPr>
+                        <pic:cNvPr id="1" name="Picture 1"/>
+                        <pic:cNvPicPr>
+                          <a:picLocks noChangeAspect="1"/>
+                        </pic:cNvPicPr>
+                      </pic:nvPicPr>
+                      <pic:blipFill>
+                        <a:blip r:embed="rId2" cstate="print">
+                          <a:extLst>
+                            <a:ext uri="{28A0092B-C50C-407E-A947-70E740481C1C}">
+                              <a14:useLocalDpi xmlns:a14="http://schemas.microsoft.com/office/drawing/2010/main" val="0"/>
+                            </a:ext>
+                          </a:extLst>
+                        </a:blip>
+                        <a:stretch>
+                          <a:fillRect/>
+                        </a:stretch>
+                      </pic:blipFill>
+                      <pic:spPr>
+                        <a:xfrm>
+                          <a:off x="0" y="0"/>
+                          <a:ext cx="648970" cy="819785"/>
+                        </a:xfrm>
+                        <a:prstGeom prst="rect">
+                          <a:avLst/>
+                        </a:prstGeom>
+                      </pic:spPr>
+                    </pic:pic>
+                  </a:graphicData>
+                </a:graphic>
+              </wp:anchor>
+            </w:drawing>
+          </w:r>
+        </w:p>
+        <w:p>
+          <w:pPr>
+            <w:pStyle w:val="Header"/>
+          </w:pPr>
+        </w:p>
+      </w:tc>
+      <w:tc>
+        <w:tcPr>
+          <w:tcW w:w="8912" w:type="dxa"/>
+          <w:tcBorders>
+            <w:top w:val="nil"/>
+            <w:left w:val="nil"/>
+            <w:bottom w:val="nil"/>
+            <w:right w:val="nil"/>
+          </w:tcBorders>
+        </w:tcPr>
+        <w:p>
+          <w:pPr>
+            <w:rPr>
+              <w:rFonts w:ascii="Arial Narrow" w:hAnsi="Arial Narrow"/>
+              <w:szCs w:val="24"/>
+            </w:rPr>
+          </w:pPr>
+        </w:p>
+        <w:p>
+          <w:pPr>
+            <w:rPr>
+              <w:rFonts w:ascii="Arial Narrow" w:hAnsi="Arial Narrow"/>
+              <w:sz w:val="28"/>
+              <w:szCs w:val="28"/>
+            </w:rPr>
+          </w:pPr>
+          <w:r>
+            <w:rPr>
+              <w:rFonts w:ascii="Arial Narrow" w:hAnsi="Arial Narrow"/>
+              <w:sz w:val="28"/>
+              <w:szCs w:val="28"/>
+            </w:rPr>
+            <w:t>KEMENTERIAN KETENAGAKERJAAN REPUBLIK INDONESIA</w:t>
+          </w:r>
+        </w:p>
+        <w:p>
+          <w:pPr>
+            <w:rPr>
+              <w:rFonts w:ascii="Arial Narrow" w:hAnsi="Arial Narrow"/>
+              <w:b/>
+              <w:color w:val="284A61"/>
+              <w:sz w:val="32"/>
+              <w:szCs w:val="32"/>
+            </w:rPr>
+          </w:pPr>
+          <w:r>
+            <w:rPr>
+              <w:rFonts w:ascii="Arial Narrow" w:hAnsi="Arial Narrow"/>
+              <w:color w:val="284A61"/>
+              <w:sz w:val="32"/>
+              <w:szCs w:val="32"/>
+            </w:rPr>
+            <w:t>SEKRETARIAT JENDERAL</w:t>
+          </w:r>
+        </w:p>
+        <w:p>
+          <w:pPr>
+            <w:rPr>
+              <w:rFonts w:ascii="Arial Narrow" w:hAnsi="Arial Narrow"/>
+              <w:color w:val="000000" w:themeColor="text1"/>
+              <w:sz w:val="18"/>
+              <w:szCs w:val="18"/>
+            </w:rPr>
+          </w:pPr>
+          <w:r>
+            <w:rPr>
+              <w:rFonts w:ascii="Arial Narrow" w:hAnsi="Arial Narrow"/>
+              <w:color w:val="000000" w:themeColor="text1"/>
+              <w:sz w:val="18"/>
+              <w:szCs w:val="18"/>
+            </w:rPr>
+            <w:t>Jalan Jenderal Gatot Subroto Kaveling 51, Kelurahan Kuningan Timur, Kecamatan Setiabudi, Kota Jakarta Selatan, Provinsi DKI Jakarta 12950</w:t>
+          </w:r>
+        </w:p>
+        <w:p>
+          <w:pPr>
+            <w:rPr>
+              <w:rFonts w:ascii="Arial Narrow" w:hAnsi="Arial Narrow"/>
+              <w:color w:val="000000" w:themeColor="text1"/>
+              <w:sz w:val="18"/>
+              <w:szCs w:val="18"/>
+            </w:rPr>
+          </w:pPr>
+          <w:r>
+            <w:rPr>
+              <w:rFonts w:ascii="Arial Narrow" w:hAnsi="Arial Narrow"/>
+              <w:noProof/>
+              <w:color w:val="000000" w:themeColor="text1"/>
+              <w:sz w:val="18"/>
+              <w:szCs w:val="18"/>
+            </w:rPr>
+            <w:drawing>
+              <wp:inline distT="0" distB="0" distL="0" distR="0" wp14:anchorId="58DF80D0" wp14:editId="115D9584">
+                <wp:extent cx="130810" cy="133350"/>
+                <wp:effectExtent l="0" t="0" r="2540" b="0"/>
+                <wp:docPr id="4" name="Picture 4"/>
+                <wp:cNvGraphicFramePr>
+                  <a:graphicFrameLocks xmlns:a="http://schemas.openxmlformats.org/drawingml/2006/main" noChangeAspect="1"/>
+                </wp:cNvGraphicFramePr>
+                <a:graphic xmlns:a="http://schemas.openxmlformats.org/drawingml/2006/main">
+                  <a:graphicData uri="http://schemas.openxmlformats.org/drawingml/2006/picture">
+                    <pic:pic xmlns:pic="http://schemas.openxmlformats.org/drawingml/2006/picture">
+                      <pic:nvPicPr>
+                        <pic:cNvPr id="25" name="Picture 25"/>
+                        <pic:cNvPicPr>
+                          <a:picLocks noChangeAspect="1"/>
+                        </pic:cNvPicPr>
+                      </pic:nvPicPr>
+                      <pic:blipFill>
+                        <a:blip r:embed="rId3" cstate="print">
+                          <a:extLst>
+                            <a:ext uri="{28A0092B-C50C-407E-A947-70E740481C1C}">
+                              <a14:useLocalDpi xmlns:a14="http://schemas.microsoft.com/office/drawing/2010/main" val="0"/>
+                            </a:ext>
+                          </a:extLst>
+                        </a:blip>
+                        <a:stretch>
+                          <a:fillRect/>
+                        </a:stretch>
+                      </pic:blipFill>
+                      <pic:spPr>
+                        <a:xfrm>
+                          <a:off x="0" y="0"/>
+                          <a:ext cx="169397" cy="173336"/>
+                        </a:xfrm>
+                        <a:prstGeom prst="rect">
+                          <a:avLst/>
+                        </a:prstGeom>
+                      </pic:spPr>
+                    </pic:pic>
+                  </a:graphicData>
+                </a:graphic>
+              </wp:inline>
+            </w:drawing>
+          </w:r>
+          <w:r>
+            <w:rPr>
+              <w:rFonts w:ascii="Arial Narrow" w:hAnsi="Arial Narrow"/>
+              <w:color w:val="000000" w:themeColor="text1"/>
+              <w:sz w:val="18"/>
+              <w:szCs w:val="18"/>
+            </w:rPr>
+            <w:t xml:space="preserve"> </w:t>
+          </w:r>
+          <w:hyperlink r:id="rId4" w:history="1">
+            <w:r>
+              <w:rPr>
+                <w:rFonts w:ascii="Arial Narrow" w:hAnsi="Arial Narrow"/>
+                <w:sz w:val="18"/>
+                <w:szCs w:val="18"/>
+              </w:rPr>
+              <w:t>www.kemnaker.go.id</w:t>
+            </w:r>
+          </w:hyperlink>
+          <w:r>
+            <w:rPr>
+              <w:rFonts w:ascii="Arial Narrow" w:hAnsi="Arial Narrow"/>
+              <w:sz w:val="18"/>
+              <w:szCs w:val="18"/>
+            </w:rPr>
+            <w:tab/>
+            <w:t xml:space="preserve"> </w:t>
+          </w:r>
+          <w:r>
+            <w:rPr>
+              <w:rFonts w:ascii="Arial Narrow" w:hAnsi="Arial Narrow"/>
+              <w:noProof/>
+              <w:sz w:val="18"/>
+              <w:szCs w:val="18"/>
+            </w:rPr>
+            <w:drawing>
+              <wp:inline distT="0" distB="0" distL="0" distR="0" wp14:anchorId="4E3DAD4A" wp14:editId="2F2DBC89">
+                <wp:extent cx="118745" cy="78740"/>
+                <wp:effectExtent l="0" t="0" r="0" b="0"/>
+                <wp:docPr id="5" name="Picture 5"/>
+                <wp:cNvGraphicFramePr>
+                  <a:graphicFrameLocks xmlns:a="http://schemas.openxmlformats.org/drawingml/2006/main" noChangeAspect="1"/>
+                </wp:cNvGraphicFramePr>
+                <a:graphic xmlns:a="http://schemas.openxmlformats.org/drawingml/2006/main">
+                  <a:graphicData uri="http://schemas.openxmlformats.org/drawingml/2006/picture">
+                    <pic:pic xmlns:pic="http://schemas.openxmlformats.org/drawingml/2006/picture">
+                      <pic:nvPicPr>
+                        <pic:cNvPr id="26" name="Picture 26"/>
+                        <pic:cNvPicPr>
+                          <a:picLocks noChangeAspect="1"/>
+                        </pic:cNvPicPr>
+                      </pic:nvPicPr>
+                      <pic:blipFill>
+                        <a:blip r:embed="rId5" cstate="print">
+                          <a:extLst>
+                            <a:ext uri="{28A0092B-C50C-407E-A947-70E740481C1C}">
+                              <a14:useLocalDpi xmlns:a14="http://schemas.microsoft.com/office/drawing/2010/main" val="0"/>
+                            </a:ext>
+                          </a:extLst>
+                        </a:blip>
+                        <a:stretch>
+                          <a:fillRect/>
+                        </a:stretch>
+                      </pic:blipFill>
+                      <pic:spPr>
+                        <a:xfrm>
+                          <a:off x="0" y="0"/>
+                          <a:ext cx="118872" cy="79248"/>
+                        </a:xfrm>
+                        <a:prstGeom prst="rect">
+                          <a:avLst/>
+                        </a:prstGeom>
+                      </pic:spPr>
+                    </pic:pic>
+                  </a:graphicData>
+                </a:graphic>
+              </wp:inline>
+            </w:drawing>
+          </w:r>
+          <w:r>
+            <w:rPr>
+              <w:rFonts w:ascii="Arial Narrow" w:hAnsi="Arial Narrow"/>
+              <w:sz w:val="18"/>
+              <w:szCs w:val="18"/>
+            </w:rPr>
+            <w:t xml:space="preserve"> </w:t>
+          </w:r>
+          <w:hyperlink r:id="rId6" w:history="1">
+            <w:r>
+              <w:rPr>
+                <w:rFonts w:ascii="Arial Narrow" w:hAnsi="Arial Narrow"/>
+                <w:sz w:val="18"/>
+                <w:szCs w:val="18"/>
+              </w:rPr>
+              <w:t>persuratan@kemnaker.go.id</w:t>
+            </w:r>
+          </w:hyperlink>
+          <w:r>
+            <w:rPr>
+              <w:rFonts w:ascii="Arial Narrow" w:hAnsi="Arial Narrow"/>
+              <w:sz w:val="18"/>
+              <w:szCs w:val="18"/>
+            </w:rPr>
+            <w:tab/>
+          </w:r>
+          <w:r>
+            <w:rPr>
+              <w:rFonts w:ascii="Arial Narrow" w:hAnsi="Arial Narrow"/>
+              <w:color w:val="000000" w:themeColor="text1"/>
+              <w:sz w:val="18"/>
+              <w:szCs w:val="18"/>
+            </w:rPr>
+            <w:tab/>
+          </w:r>
+          <w:r>
+            <w:rPr>
+              <w:rFonts w:ascii="Arial Narrow" w:hAnsi="Arial Narrow"/>
+              <w:noProof/>
+              <w:color w:val="000000" w:themeColor="text1"/>
+              <w:sz w:val="18"/>
+              <w:szCs w:val="18"/>
+            </w:rPr>
+            <w:drawing>
+              <wp:inline distT="0" distB="0" distL="0" distR="0" wp14:anchorId="08A6A6A5" wp14:editId="7C53B75E">
+                <wp:extent cx="100330" cy="100330"/>
+                <wp:effectExtent l="0" t="0" r="0" b="0"/>
+                <wp:docPr id="6" name="Picture 6"/>
+                <wp:cNvGraphicFramePr>
+                  <a:graphicFrameLocks xmlns:a="http://schemas.openxmlformats.org/drawingml/2006/main" noChangeAspect="1"/>
+                </wp:cNvGraphicFramePr>
+                <a:graphic xmlns:a="http://schemas.openxmlformats.org/drawingml/2006/main">
+                  <a:graphicData uri="http://schemas.openxmlformats.org/drawingml/2006/picture">
+                    <pic:pic xmlns:pic="http://schemas.openxmlformats.org/drawingml/2006/picture">
+                      <pic:nvPicPr>
+                        <pic:cNvPr id="27" name="Picture 27"/>
+                        <pic:cNvPicPr>
+                          <a:picLocks noChangeAspect="1"/>
+                        </pic:cNvPicPr>
+                      </pic:nvPicPr>
+                      <pic:blipFill>
+                        <a:blip r:embed="rId7" cstate="print">
+                          <a:extLst>
+                            <a:ext uri="{28A0092B-C50C-407E-A947-70E740481C1C}">
+                              <a14:useLocalDpi xmlns:a14="http://schemas.microsoft.com/office/drawing/2010/main" val="0"/>
+                            </a:ext>
+                          </a:extLst>
+                        </a:blip>
+                        <a:stretch>
+                          <a:fillRect/>
+                        </a:stretch>
+                      </pic:blipFill>
+                      <pic:spPr>
+                        <a:xfrm>
+                          <a:off x="0" y="0"/>
+                          <a:ext cx="100584" cy="100584"/>
+                        </a:xfrm>
+                        <a:prstGeom prst="rect">
+                          <a:avLst/>
+                        </a:prstGeom>
+                      </pic:spPr>
+                    </pic:pic>
+                  </a:graphicData>
+                </a:graphic>
+              </wp:inline>
+            </w:drawing>
+          </w:r>
+          <w:r>
+            <w:rPr>
+              <w:rFonts w:ascii="Arial Narrow" w:hAnsi="Arial Narrow"/>
+              <w:color w:val="000000" w:themeColor="text1"/>
+              <w:sz w:val="18"/>
+              <w:szCs w:val="18"/>
+            </w:rPr>
+            <w:t xml:space="preserve"> 1500630</w:t>
+          </w:r>
+        </w:p>
+        <w:p>
+          <w:r>
+            <w:rPr>
+              <w:noProof/>
+            </w:rPr>
+            <mc:AlternateContent>
+              <mc:Choice Requires="wps">
+                <w:drawing>
+                  <wp:anchor distT="0" distB="0" distL="114300" distR="114300" simplePos="0" relativeHeight="251715584" behindDoc="0" locked="0" layoutInCell="1" allowOverlap="1" wp14:anchorId="61DF1CE0" wp14:editId="2151E423">
+                    <wp:simplePos x="0" y="0"/>
+                    <wp:positionH relativeFrom="column">
+                      <wp:posOffset>-840740</wp:posOffset>
+                    </wp:positionH>
+                    <wp:positionV relativeFrom="paragraph">
+                      <wp:posOffset>135255</wp:posOffset>
+                    </wp:positionV>
+                    <wp:extent cx="6228000" cy="0"/>
+                    <wp:effectExtent l="38100" t="19050" r="59055" b="114300"/>
+                    <wp:wrapNone/>
+                    <wp:docPr id="718829074" name="Straight Connector 2"/>
+                    <wp:cNvGraphicFramePr/>
+                    <a:graphic xmlns:a="http://schemas.openxmlformats.org/drawingml/2006/main">
+                      <a:graphicData uri="http://schemas.microsoft.com/office/word/2010/wordprocessingShape">
+                        <wps:wsp>
+                          <wps:cNvCnPr/>
+                          <wps:spPr>
+                            <a:xfrm flipV="1">
+                              <a:off x="0" y="0"/>
+                              <a:ext cx="6228000" cy="0"/>
+                            </a:xfrm>
+                            <a:prstGeom prst="line">
+                              <a:avLst/>
+                            </a:prstGeom>
+                            <a:effectLst>
+                              <a:outerShdw blurRad="50800" dist="38100" dir="5400000" algn="t" rotWithShape="0">
+                                <a:prstClr val="black">
+                                  <a:alpha val="40000"/>
+                                </a:prstClr>
+                              </a:outerShdw>
+                            </a:effectLst>
+                          </wps:spPr>
+                          <wps:style>
+                            <a:lnRef idx="2">
+                              <a:schemeClr val="dk1"/>
+                            </a:lnRef>
+                            <a:fillRef idx="0">
+                              <a:schemeClr val="dk1"/>
+                            </a:fillRef>
+                            <a:effectRef idx="1">
+                              <a:schemeClr val="dk1"/>
+                            </a:effectRef>
+                            <a:fontRef idx="minor">
+                              <a:schemeClr val="tx1"/>
+                            </a:fontRef>
+                          </wps:style>
+                          <wps:bodyPr/>
+                        </wps:wsp>
+                      </a:graphicData>
+                    </a:graphic>
+                    <wp14:sizeRelH relativeFrom="margin">
+                      <wp14:pctWidth>0</wp14:pctWidth>
+                    </wp14:sizeRelH>
+                    <wp14:sizeRelV relativeFrom="margin">
+                      <wp14:pctHeight>0</wp14:pctHeight>
+                    </wp14:sizeRelV>
+                  </wp:anchor>
+                </w:drawing>
+              </mc:Choice>
+              <mc:Fallback>
+                <w:pict>
+                  <v:line w14:anchorId="7B8B2D5C" id="Straight Connector 2" o:spid="_x0000_s1026" style="position:absolute;flip:y;z-index:251715584;visibility:visible;mso-wrap-style:square;mso-width-percent:0;mso-height-percent:0;mso-wrap-distance-left:9pt;mso-wrap-distance-top:0;mso-wrap-distance-right:9pt;mso-wrap-distance-bottom:0;mso-position-horizontal:absolute;mso-position-horizontal-relative:text;mso-position-vertical:absolute;mso-position-vertical-relative:text;mso-width-percent:0;mso-height-percent:0;mso-width-relative:margin;mso-height-relative:margin" from="-66.2pt,10.65pt" to="424.2pt,10.65pt" o:gfxdata="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" strokecolor="black [3200]" strokeweight="2pt">
+                    <v:shadow on="t" color="black" opacity="26214f" origin=",-.5" offset="0,3pt"/>
+                  </v:line>
+                </w:pict>
+              </mc:Fallback>
+            </mc:AlternateContent>
+          </w:r>
+        </w:p>
+        <w:p>
+          <w:pPr>
+            <w:pStyle w:val="Header"/>
+          </w:pPr>
+        </w:p>
+      </w:tc>
+    </w:tr>
+  </w:tbl>
   <w:p>
     <w:pPr>
       <w:pStyle w:val="Header"/>
@@ -4137,7 +3056,7 @@
 </file>
 
 <file path=word/header2.xml><?xml version="1.0" encoding="utf-8"?>
-<w:hdr xmlns:wpc="http://schemas.microsoft.com/office/word/2010/wordprocessingCanvas" xmlns:cx="http://schemas.microsoft.com/office/drawing/2014/chartex" xmlns:cx1="http://schemas.microsoft.com/office/drawing/2015/9/8/chartex" xmlns:cx2="http://schemas.microsoft.com/office/drawing/2015/10/21/chartex" xmlns:cx3="http://schemas.microsoft.com/office/drawing/2016/5/9/chartex" xmlns:cx4="http://schemas.microsoft.com/office/drawing/2016/5/10/chartex" xmlns:cx5="http://schemas.microsoft.com/office/drawing/2016/5/11/chartex" xmlns:cx6="http://schemas.microsoft.com/office/drawing/2016/5/12/chartex" xmlns:cx7="http://schemas.microsoft.com/office/drawing/2016/5/13/chartex" xmlns:cx8="http://schemas.microsoft.com/office/drawing/2016/5/14/chartex" xmlns:mc="http://schemas.openxmlformats.org/markup-compatibility/2006" xmlns:aink="http://schemas.microsoft.com/office/drawing/2016/ink" xmlns:am3d="http://schemas.microsoft.com/office/drawing/2017/model3d" xmlns:o="urn:schemas-microsoft-com:office:office" xmlns:r="http://schemas.openxmlformats.org/officeDocument/2006/relationships" xmlns:m="http://schemas.openxmlformats.org/officeDocument/2006/math" xmlns:v="urn:schemas-microsoft-com:vml" xmlns:wp14="http://schemas.microsoft.com/office/word/2010/wordprocessingDrawing" xmlns:wp="http://schemas.openxmlformats.org/drawingml/2006/wordprocessingDrawing" xmlns:w10="urn:schemas-microsoft-com:office:word" xmlns:w="http://schemas.openxmlformats.org/wordprocessingml/2006/main" xmlns:w14="http://schemas.microsoft.com/office/word/2010/wordml" xmlns:w15="http://schemas.microsoft.com/office/word/2012/wordml" xmlns:w16cex="http://schemas.microsoft.com/office/word/2018/wordml/cex" xmlns:w16cid="http://schemas.microsoft.com/office/word/2016/wordml/cid" xmlns:w16="http://schemas.microsoft.com/office/word/2018/wordml" xmlns:w16sdtdh="http://schemas.microsoft.com/office/word/2020/wordml/sdtdatahash" xmlns:w16se="http://schemas.microsoft.com/office/word/2015/wordml/symex" xmlns:wpg="http://schemas.microsoft.com/office/word/2010/wordprocessingGroup" xmlns:wpi="http://schemas.microsoft.com/office/word/2010/wordprocessingInk" xmlns:wne="http://schemas.microsoft.com/office/word/2006/wordml" xmlns:wps="http://schemas.microsoft.com/office/word/2010/wordprocessingShape" mc:Ignorable="w14 w15 w16se w16cid w16 w16cex w16sdtdh wp14">
+<w:hdr xmlns:wpc="http://schemas.microsoft.com/office/word/2010/wordprocessingCanvas" xmlns:cx="http://schemas.microsoft.com/office/drawing/2014/chartex" xmlns:cx1="http://schemas.microsoft.com/office/drawing/2015/9/8/chartex" xmlns:cx2="http://schemas.microsoft.com/office/drawing/2015/10/21/chartex" xmlns:cx3="http://schemas.microsoft.com/office/drawing/2016/5/9/chartex" xmlns:cx4="http://schemas.microsoft.com/office/drawing/2016/5/10/chartex" xmlns:cx5="http://schemas.microsoft.com/office/drawing/2016/5/11/chartex" xmlns:cx6="http://schemas.microsoft.com/office/drawing/2016/5/12/chartex" xmlns:cx7="http://schemas.microsoft.com/office/drawing/2016/5/13/chartex" xmlns:cx8="http://schemas.microsoft.com/office/drawing/2016/5/14/chartex" xmlns:mc="http://schemas.openxmlformats.org/markup-compatibility/2006" xmlns:aink="http://schemas.microsoft.com/office/drawing/2016/ink" xmlns:am3d="http://schemas.microsoft.com/office/drawing/2017/model3d" xmlns:o="urn:schemas-microsoft-com:office:office" xmlns:oel="http://schemas.microsoft.com/office/2019/extlst" xmlns:r="http://schemas.openxmlformats.org/officeDocument/2006/relationships" xmlns:m="http://schemas.openxmlformats.org/officeDocument/2006/math" xmlns:v="urn:schemas-microsoft-com:vml" xmlns:wp14="http://schemas.microsoft.com/office/word/2010/wordprocessingDrawing" xmlns:wp="http://schemas.openxmlformats.org/drawingml/2006/wordprocessingDrawing" xmlns:w10="urn:schemas-microsoft-com:office:word" xmlns:w="http://schemas.openxmlformats.org/wordprocessingml/2006/main" xmlns:w14="http://schemas.microsoft.com/office/word/2010/wordml" xmlns:w15="http://schemas.microsoft.com/office/word/2012/wordml" xmlns:w16cex="http://schemas.microsoft.com/office/word/2018/wordml/cex" xmlns:w16cid="http://schemas.microsoft.com/office/word/2016/wordml/cid" xmlns:w16="http://schemas.microsoft.com/office/word/2018/wordml" xmlns:w16du="http://schemas.microsoft.com/office/word/2023/wordml/word16du" xmlns:w16sdtdh="http://schemas.microsoft.com/office/word/2020/wordml/sdtdatahash" xmlns:w16sdtfl="http://schemas.microsoft.com/office/word/2024/wordml/sdtformatlock" xmlns:w16se="http://schemas.microsoft.com/office/word/2015/wordml/symex" xmlns:wpg="http://schemas.microsoft.com/office/word/2010/wordprocessingGroup" xmlns:wpi="http://schemas.microsoft.com/office/word/2010/wordprocessingInk" xmlns:wne="http://schemas.microsoft.com/office/word/2006/wordml" xmlns:wps="http://schemas.microsoft.com/office/word/2010/wordprocessingShape" mc:Ignorable="w14 w15 w16se w16cid w16 w16cex w16sdtdh w16sdtfl w16du wp14">
   <w:p>
     <w:pPr>
       <w:pStyle w:val="BodyText"/>
@@ -4151,7 +3070,7 @@
 </file>
 
 <file path=word/numbering.xml><?xml version="1.0" encoding="utf-8"?>
-<w:numbering xmlns:wpc="http://schemas.microsoft.com/office/word/2010/wordprocessingCanvas" xmlns:cx="http://schemas.microsoft.com/office/drawing/2014/chartex" xmlns:cx1="http://schemas.microsoft.com/office/drawing/2015/9/8/chartex" xmlns:cx2="http://schemas.microsoft.com/office/drawing/2015/10/21/chartex" xmlns:cx3="http://schemas.microsoft.com/office/drawing/2016/5/9/chartex" xmlns:cx4="http://schemas.microsoft.com/office/drawing/2016/5/10/chartex" xmlns:cx5="http://schemas.microsoft.com/office/drawing/2016/5/11/chartex" xmlns:cx6="http://schemas.microsoft.com/office/drawing/2016/5/12/chartex" xmlns:cx7="http://schemas.microsoft.com/office/drawing/2016/5/13/chartex" xmlns:cx8="http://schemas.microsoft.com/office/drawing/2016/5/14/chartex" xmlns:mc="http://schemas.openxmlformats.org/markup-compatibility/2006" xmlns:aink="http://schemas.microsoft.com/office/drawing/2016/ink" xmlns:am3d="http://schemas.microsoft.com/office/drawing/2017/model3d" xmlns:o="urn:schemas-microsoft-com:office:office" xmlns:r="http://schemas.openxmlformats.org/officeDocument/2006/relationships" xmlns:m="http://schemas.openxmlformats.org/officeDocument/2006/math" xmlns:v="urn:schemas-microsoft-com:vml" xmlns:wp14="http://schemas.microsoft.com/office/word/2010/wordprocessingDrawing" xmlns:wp="http://schemas.openxmlformats.org/drawingml/2006/wordprocessingDrawing" xmlns:w10="urn:schemas-microsoft-com:office:word" xmlns:w="http://schemas.openxmlformats.org/wordprocessingml/2006/main" xmlns:w14="http://schemas.microsoft.com/office/word/2010/wordml" xmlns:w15="http://schemas.microsoft.com/office/word/2012/wordml" xmlns:w16cex="http://schemas.microsoft.com/office/word/2018/wordml/cex" xmlns:w16cid="http://schemas.microsoft.com/office/word/2016/wordml/cid" xmlns:w16="http://schemas.microsoft.com/office/word/2018/wordml" xmlns:w16sdtdh="http://schemas.microsoft.com/office/word/2020/wordml/sdtdatahash" xmlns:w16se="http://schemas.microsoft.com/office/word/2015/wordml/symex" xmlns:wpg="http://schemas.microsoft.com/office/word/2010/wordprocessingGroup" xmlns:wpi="http://schemas.microsoft.com/office/word/2010/wordprocessingInk" xmlns:wne="http://schemas.microsoft.com/office/word/2006/wordml" xmlns:wps="http://schemas.microsoft.com/office/word/2010/wordprocessingShape" mc:Ignorable="w14 w15 w16se w16cid w16 w16cex w16sdtdh wp14">
+<w:numbering xmlns:wpc="http://schemas.microsoft.com/office/word/2010/wordprocessingCanvas" xmlns:cx="http://schemas.microsoft.com/office/drawing/2014/chartex" xmlns:cx1="http://schemas.microsoft.com/office/drawing/2015/9/8/chartex" xmlns:cx2="http://schemas.microsoft.com/office/drawing/2015/10/21/chartex" xmlns:cx3="http://schemas.microsoft.com/office/drawing/2016/5/9/chartex" xmlns:cx4="http://schemas.microsoft.com/office/drawing/2016/5/10/chartex" xmlns:cx5="http://schemas.microsoft.com/office/drawing/2016/5/11/chartex" xmlns:cx6="http://schemas.microsoft.com/office/drawing/2016/5/12/chartex" xmlns:cx7="http://schemas.microsoft.com/office/drawing/2016/5/13/chartex" xmlns:cx8="http://schemas.microsoft.com/office/drawing/2016/5/14/chartex" xmlns:mc="http://schemas.openxmlformats.org/markup-compatibility/2006" xmlns:aink="http://schemas.microsoft.com/office/drawing/2016/ink" xmlns:am3d="http://schemas.microsoft.com/office/drawing/2017/model3d" xmlns:o="urn:schemas-microsoft-com:office:office" xmlns:oel="http://schemas.microsoft.com/office/2019/extlst" xmlns:r="http://schemas.openxmlformats.org/officeDocument/2006/relationships" xmlns:m="http://schemas.openxmlformats.org/officeDocument/2006/math" xmlns:v="urn:schemas-microsoft-com:vml" xmlns:wp14="http://schemas.microsoft.com/office/word/2010/wordprocessingDrawing" xmlns:wp="http://schemas.openxmlformats.org/drawingml/2006/wordprocessingDrawing" xmlns:w10="urn:schemas-microsoft-com:office:word" xmlns:w="http://schemas.openxmlformats.org/wordprocessingml/2006/main" xmlns:w14="http://schemas.microsoft.com/office/word/2010/wordml" xmlns:w15="http://schemas.microsoft.com/office/word/2012/wordml" xmlns:w16cex="http://schemas.microsoft.com/office/word/2018/wordml/cex" xmlns:w16cid="http://schemas.microsoft.com/office/word/2016/wordml/cid" xmlns:w16="http://schemas.microsoft.com/office/word/2018/wordml" xmlns:w16du="http://schemas.microsoft.com/office/word/2023/wordml/word16du" xmlns:w16sdtdh="http://schemas.microsoft.com/office/word/2020/wordml/sdtdatahash" xmlns:w16sdtfl="http://schemas.microsoft.com/office/word/2024/wordml/sdtformatlock" xmlns:w16se="http://schemas.microsoft.com/office/word/2015/wordml/symex" xmlns:wpg="http://schemas.microsoft.com/office/word/2010/wordprocessingGroup" xmlns:wpi="http://schemas.microsoft.com/office/word/2010/wordprocessingInk" xmlns:wne="http://schemas.microsoft.com/office/word/2006/wordml" xmlns:wps="http://schemas.microsoft.com/office/word/2010/wordprocessingShape" mc:Ignorable="w14 w15 w16se w16cid w16 w16cex w16sdtdh w16sdtfl w16du wp14">
   <w:abstractNum w:abstractNumId="0" w15:restartNumberingAfterBreak="0">
     <w:nsid w:val="17A1327C"/>
     <w:multiLevelType w:val="hybridMultilevel"/>
@@ -4285,14 +3204,14 @@
       </w:rPr>
     </w:lvl>
   </w:abstractNum>
-  <w:num w:numId="1">
+  <w:num w:numId="1" w16cid:durableId="1781340690">
     <w:abstractNumId w:val="0"/>
   </w:num>
 </w:numbering>
 </file>
 
 <file path=word/styles.xml><?xml version="1.0" encoding="utf-8"?>
-<w:styles xmlns:mc="http://schemas.openxmlformats.org/markup-compatibility/2006" xmlns:r="http://schemas.openxmlformats.org/officeDocument/2006/relationships" xmlns:w="http://schemas.openxmlformats.org/wordprocessingml/2006/main" xmlns:w14="http://schemas.microsoft.com/office/word/2010/wordml" xmlns:w15="http://schemas.microsoft.com/office/word/2012/wordml" xmlns:w16cex="http://schemas.microsoft.com/office/word/2018/wordml/cex" xmlns:w16cid="http://schemas.microsoft.com/office/word/2016/wordml/cid" xmlns:w16="http://schemas.microsoft.com/office/word/2018/wordml" xmlns:w16sdtdh="http://schemas.microsoft.com/office/word/2020/wordml/sdtdatahash" xmlns:w16se="http://schemas.microsoft.com/office/word/2015/wordml/symex" mc:Ignorable="w14 w15 w16se w16cid w16 w16cex w16sdtdh">
+<w:styles xmlns:mc="http://schemas.openxmlformats.org/markup-compatibility/2006" xmlns:r="http://schemas.openxmlformats.org/officeDocument/2006/relationships" xmlns:w="http://schemas.openxmlformats.org/wordprocessingml/2006/main" xmlns:w14="http://schemas.microsoft.com/office/word/2010/wordml" xmlns:w15="http://schemas.microsoft.com/office/word/2012/wordml" xmlns:w16cex="http://schemas.microsoft.com/office/word/2018/wordml/cex" xmlns:w16cid="http://schemas.microsoft.com/office/word/2016/wordml/cid" xmlns:w16="http://schemas.microsoft.com/office/word/2018/wordml" xmlns:w16du="http://schemas.microsoft.com/office/word/2023/wordml/word16du" xmlns:w16sdtdh="http://schemas.microsoft.com/office/word/2020/wordml/sdtdatahash" xmlns:w16sdtfl="http://schemas.microsoft.com/office/word/2024/wordml/sdtformatlock" xmlns:w16se="http://schemas.microsoft.com/office/word/2015/wordml/symex" mc:Ignorable="w14 w15 w16se w16cid w16 w16cex w16sdtdh w16sdtfl w16du">
   <w:docDefaults>
     <w:rPrDefault>
       <w:rPr>
@@ -4828,6 +3747,84 @@
       <w:lang w:val="id"/>
     </w:rPr>
   </w:style>
+  <w:style w:type="table" w:styleId="TableGrid">
+    <w:name w:val="Table Grid"/>
+    <w:basedOn w:val="TableNormal"/>
+    <w:uiPriority w:val="39"/>
+    <w:rsid w:val="007F494A"/>
+    <w:tblPr>
+      <w:tblBorders>
+        <w:top w:val="single" w:sz="4" w:space="0" w:color="auto"/>
+        <w:left w:val="single" w:sz="4" w:space="0" w:color="auto"/>
+        <w:bottom w:val="single" w:sz="4" w:space="0" w:color="auto"/>
+        <w:right w:val="single" w:sz="4" w:space="0" w:color="auto"/>
+        <w:insideH w:val="single" w:sz="4" w:space="0" w:color="auto"/>
+        <w:insideV w:val="single" w:sz="4" w:space="0" w:color="auto"/>
+      </w:tblBorders>
+    </w:tblPr>
+  </w:style>
+  <w:style w:type="table" w:styleId="PlainTable4">
+    <w:name w:val="Plain Table 4"/>
+    <w:basedOn w:val="TableNormal"/>
+    <w:uiPriority w:val="44"/>
+    <w:rsid w:val="00510C70"/>
+    <w:tblPr>
+      <w:tblStyleRowBandSize w:val="1"/>
+      <w:tblStyleColBandSize w:val="1"/>
+    </w:tblPr>
+    <w:tblStylePr w:type="firstRow">
+      <w:rPr>
+        <w:b/>
+        <w:bCs/>
+      </w:rPr>
+    </w:tblStylePr>
+    <w:tblStylePr w:type="lastRow">
+      <w:rPr>
+        <w:b/>
+        <w:bCs/>
+      </w:rPr>
+    </w:tblStylePr>
+    <w:tblStylePr w:type="firstCol">
+      <w:rPr>
+        <w:b/>
+        <w:bCs/>
+      </w:rPr>
+    </w:tblStylePr>
+    <w:tblStylePr w:type="lastCol">
+      <w:rPr>
+        <w:b/>
+        <w:bCs/>
+      </w:rPr>
+    </w:tblStylePr>
+    <w:tblStylePr w:type="band1Vert">
+      <w:tblPr/>
+      <w:tcPr>
+        <w:shd w:val="clear" w:color="auto" w:fill="F2F2F2" w:themeFill="background1" w:themeFillShade="F2"/>
+      </w:tcPr>
+    </w:tblStylePr>
+    <w:tblStylePr w:type="band1Horz">
+      <w:tblPr/>
+      <w:tcPr>
+        <w:shd w:val="clear" w:color="auto" w:fill="F2F2F2" w:themeFill="background1" w:themeFillShade="F2"/>
+      </w:tcPr>
+    </w:tblStylePr>
+  </w:style>
+  <w:style w:type="table" w:styleId="TableGridLight">
+    <w:name w:val="Grid Table Light"/>
+    <w:basedOn w:val="TableNormal"/>
+    <w:uiPriority w:val="40"/>
+    <w:rsid w:val="003B28B5"/>
+    <w:tblPr>
+      <w:tblBorders>
+        <w:top w:val="single" w:sz="4" w:space="0" w:color="BFBFBF" w:themeColor="background1" w:themeShade="BF"/>
+        <w:left w:val="single" w:sz="4" w:space="0" w:color="BFBFBF" w:themeColor="background1" w:themeShade="BF"/>
+        <w:bottom w:val="single" w:sz="4" w:space="0" w:color="BFBFBF" w:themeColor="background1" w:themeShade="BF"/>
+        <w:right w:val="single" w:sz="4" w:space="0" w:color="BFBFBF" w:themeColor="background1" w:themeShade="BF"/>
+        <w:insideH w:val="single" w:sz="4" w:space="0" w:color="BFBFBF" w:themeColor="background1" w:themeShade="BF"/>
+        <w:insideV w:val="single" w:sz="4" w:space="0" w:color="BFBFBF" w:themeColor="background1" w:themeShade="BF"/>
+      </w:tblBorders>
+    </w:tblPr>
+  </w:style>
 </w:styles>
 </file>
 

</xml_diff>

<commit_message>
FIX FOTO UPLOAD DOKUMENTASI
</commit_message>
<xml_diff>
--- a/backend/templates/Berkas Luar Kota - Laporan.docx
+++ b/backend/templates/Berkas Luar Kota - Laporan.docx
@@ -85,7 +85,7 @@
         <w:rPr>
           <w:lang w:val="en-US"/>
         </w:rPr>
-        <w:t>Tanggal {{tanggal_mulai}} – {{tanggal_selesai}} {{bulan}} {{tahun}}</w:t>
+        <w:t>Tanggal {{tanggal_mulai}} – {{tanggal_selesai}}</w:t>
       </w:r>
     </w:p>
     <w:p>
@@ -137,6 +137,7 @@
           <w:tab w:val="left" w:pos="6160"/>
         </w:tabs>
         <w:ind w:left="2881" w:right="354" w:hanging="1954"/>
+        <w:jc w:val="both"/>
         <w:rPr>
           <w:lang w:val="en-US"/>
         </w:rPr>
@@ -161,10 +162,7 @@
         <w:t>1.</w:t>
       </w:r>
       <w:r>
-        <w:rPr>
-          <w:spacing w:val="80"/>
-        </w:rPr>
-        <w:t xml:space="preserve"> </w:t>
+        <w:t xml:space="preserve">  </w:t>
       </w:r>
       <w:r>
         <w:t>Surat</w:t>
@@ -2194,6 +2192,7 @@
     <w:p>
       <w:pPr>
         <w:pStyle w:val="BodyText"/>
+        <w:jc w:val="center"/>
         <w:rPr>
           <w:rFonts w:ascii="Arial"/>
           <w:b/>
@@ -2205,40 +2204,44 @@
       <w:pPr>
         <w:pStyle w:val="BodyText"/>
         <w:spacing w:before="132" w:after="1"/>
-        <w:rPr>
-          <w:rFonts w:ascii="Arial"/>
-          <w:b/>
-          <w:sz w:val="20"/>
+        <w:jc w:val="center"/>
+        <w:rPr>
+          <w:lang w:val="en-US"/>
         </w:rPr>
       </w:pPr>
     </w:p>
     <w:tbl>
       <w:tblPr>
+        <w:tblStyle w:val="TableGrid"/>
         <w:tblW w:w="0" w:type="auto"/>
-        <w:tblInd w:w="3804" w:type="dxa"/>
-        <w:tblLayout w:type="fixed"/>
-        <w:tblCellMar>
-          <w:left w:w="0" w:type="dxa"/>
-          <w:right w:w="0" w:type="dxa"/>
-        </w:tblCellMar>
-        <w:tblLook w:val="01E0" w:firstRow="1" w:lastRow="1" w:firstColumn="1" w:lastColumn="1" w:noHBand="0" w:noVBand="0"/>
+        <w:jc w:val="center"/>
+        <w:tblBorders>
+          <w:top w:val="none" w:sz="0" w:space="0" w:color="auto"/>
+          <w:left w:val="none" w:sz="0" w:space="0" w:color="auto"/>
+          <w:bottom w:val="none" w:sz="0" w:space="0" w:color="auto"/>
+          <w:right w:val="none" w:sz="0" w:space="0" w:color="auto"/>
+          <w:insideH w:val="none" w:sz="0" w:space="0" w:color="auto"/>
+          <w:insideV w:val="none" w:sz="0" w:space="0" w:color="auto"/>
+        </w:tblBorders>
+        <w:tblLook w:val="04A0" w:firstRow="1" w:lastRow="0" w:firstColumn="1" w:lastColumn="0" w:noHBand="0" w:noVBand="1"/>
       </w:tblPr>
       <w:tblGrid>
-        <w:gridCol w:w="2859"/>
+        <w:gridCol w:w="5669"/>
       </w:tblGrid>
       <w:tr>
         <w:trPr>
-          <w:trHeight w:val="2499"/>
+          <w:trHeight w:val="2268"/>
+          <w:jc w:val="center"/>
         </w:trPr>
         <w:tc>
           <w:tcPr>
-            <w:tcW w:w="2859" w:type="dxa"/>
+            <w:tcW w:w="5669" w:type="dxa"/>
+            <w:vAlign w:val="center"/>
           </w:tcPr>
           <w:p>
             <w:pPr>
-              <w:pStyle w:val="TableParagraph"/>
-              <w:spacing w:line="247" w:lineRule="exact"/>
-              <w:ind w:left="5"/>
+              <w:pStyle w:val="BodyText"/>
+              <w:spacing w:before="132" w:after="1"/>
               <w:jc w:val="center"/>
               <w:rPr>
                 <w:lang w:val="en-US"/>
@@ -2255,37 +2258,22 @@
       </w:tr>
       <w:tr>
         <w:trPr>
-          <w:trHeight w:val="4817"/>
+          <w:trHeight w:val="2268"/>
+          <w:jc w:val="center"/>
         </w:trPr>
         <w:tc>
           <w:tcPr>
-            <w:tcW w:w="2859" w:type="dxa"/>
+            <w:tcW w:w="5669" w:type="dxa"/>
+            <w:vAlign w:val="center"/>
           </w:tcPr>
           <w:p>
             <w:pPr>
-              <w:pStyle w:val="TableParagraph"/>
-              <w:rPr>
-                <w:rFonts w:ascii="Arial"/>
-                <w:b/>
-              </w:rPr>
-            </w:pPr>
-          </w:p>
-          <w:p>
-            <w:pPr>
-              <w:pStyle w:val="TableParagraph"/>
-              <w:spacing w:before="222"/>
-              <w:rPr>
-                <w:rFonts w:ascii="Arial"/>
-                <w:b/>
-              </w:rPr>
-            </w:pPr>
-          </w:p>
-          <w:p>
-            <w:pPr>
-              <w:pStyle w:val="TableParagraph"/>
-              <w:spacing w:before="1"/>
-              <w:ind w:left="5"/>
+              <w:pStyle w:val="BodyText"/>
+              <w:spacing w:before="132" w:after="1"/>
               <w:jc w:val="center"/>
+              <w:rPr>
+                <w:lang w:val="en-US"/>
+              </w:rPr>
             </w:pPr>
             <w:r>
               <w:rPr>
@@ -2298,28 +2286,22 @@
       </w:tr>
       <w:tr>
         <w:trPr>
-          <w:trHeight w:val="2564"/>
+          <w:trHeight w:val="2268"/>
+          <w:jc w:val="center"/>
         </w:trPr>
         <w:tc>
           <w:tcPr>
-            <w:tcW w:w="2859" w:type="dxa"/>
+            <w:tcW w:w="5669" w:type="dxa"/>
+            <w:vAlign w:val="center"/>
           </w:tcPr>
           <w:p>
             <w:pPr>
-              <w:pStyle w:val="TableParagraph"/>
-              <w:spacing w:before="34"/>
-              <w:rPr>
-                <w:rFonts w:ascii="Arial"/>
-                <w:b/>
-              </w:rPr>
-            </w:pPr>
-          </w:p>
-          <w:p>
-            <w:pPr>
-              <w:pStyle w:val="TableParagraph"/>
-              <w:spacing w:before="1" w:line="233" w:lineRule="exact"/>
-              <w:ind w:left="5" w:right="5"/>
+              <w:pStyle w:val="BodyText"/>
+              <w:spacing w:before="132" w:after="1"/>
               <w:jc w:val="center"/>
+              <w:rPr>
+                <w:lang w:val="en-US"/>
+              </w:rPr>
             </w:pPr>
             <w:r>
               <w:rPr>
@@ -2332,72 +2314,23 @@
       </w:tr>
       <w:tr>
         <w:trPr>
-          <w:trHeight w:val="2564"/>
+          <w:trHeight w:val="2268"/>
+          <w:jc w:val="center"/>
         </w:trPr>
         <w:tc>
           <w:tcPr>
-            <w:tcW w:w="2859" w:type="dxa"/>
+            <w:tcW w:w="5669" w:type="dxa"/>
+            <w:vAlign w:val="center"/>
           </w:tcPr>
           <w:p>
             <w:pPr>
-              <w:pStyle w:val="TableParagraph"/>
+              <w:pStyle w:val="BodyText"/>
+              <w:spacing w:before="132" w:after="1"/>
+              <w:jc w:val="center"/>
               <w:rPr>
                 <w:rFonts w:ascii="Arial"/>
                 <w:b/>
-              </w:rPr>
-            </w:pPr>
-          </w:p>
-          <w:p>
-            <w:pPr>
-              <w:pStyle w:val="TableParagraph"/>
-              <w:rPr>
-                <w:rFonts w:ascii="Arial"/>
-                <w:b/>
-              </w:rPr>
-            </w:pPr>
-          </w:p>
-          <w:p>
-            <w:pPr>
-              <w:pStyle w:val="TableParagraph"/>
-              <w:rPr>
-                <w:rFonts w:ascii="Arial"/>
-                <w:b/>
-              </w:rPr>
-            </w:pPr>
-          </w:p>
-          <w:p>
-            <w:pPr>
-              <w:pStyle w:val="TableParagraph"/>
-              <w:rPr>
-                <w:rFonts w:ascii="Arial"/>
-                <w:b/>
-              </w:rPr>
-            </w:pPr>
-          </w:p>
-          <w:p>
-            <w:pPr>
-              <w:pStyle w:val="TableParagraph"/>
-              <w:rPr>
-                <w:rFonts w:ascii="Arial"/>
-                <w:b/>
-              </w:rPr>
-            </w:pPr>
-          </w:p>
-          <w:p>
-            <w:pPr>
-              <w:pStyle w:val="TableParagraph"/>
-              <w:rPr>
-                <w:rFonts w:ascii="Arial"/>
-                <w:b/>
-              </w:rPr>
-            </w:pPr>
-          </w:p>
-          <w:p>
-            <w:pPr>
-              <w:pStyle w:val="TableParagraph"/>
-              <w:rPr>
-                <w:rFonts w:ascii="Arial"/>
-                <w:b/>
+                <w:sz w:val="20"/>
               </w:rPr>
             </w:pPr>
             <w:r>
@@ -2410,6 +2343,18 @@
         </w:tc>
       </w:tr>
     </w:tbl>
+    <w:p>
+      <w:pPr>
+        <w:pStyle w:val="BodyText"/>
+        <w:spacing w:before="132" w:after="1"/>
+        <w:jc w:val="center"/>
+        <w:rPr>
+          <w:rFonts w:ascii="Arial"/>
+          <w:b/>
+          <w:sz w:val="20"/>
+        </w:rPr>
+      </w:pPr>
+    </w:p>
     <w:p>
       <w:pPr>
         <w:pStyle w:val="BodyText"/>
@@ -2689,7 +2634,6 @@
           <w:pPr>
             <w:rPr>
               <w:rFonts w:ascii="Arial Narrow" w:hAnsi="Arial Narrow"/>
-              <w:b/>
               <w:color w:val="284A61"/>
               <w:sz w:val="32"/>
               <w:szCs w:val="32"/>
@@ -2709,20 +2653,12 @@
           <w:pPr>
             <w:rPr>
               <w:rFonts w:ascii="Arial Narrow" w:hAnsi="Arial Narrow"/>
-              <w:color w:val="000000" w:themeColor="text1"/>
-              <w:sz w:val="18"/>
-              <w:szCs w:val="18"/>
+              <w:b/>
+              <w:color w:val="284A61"/>
+              <w:sz w:val="32"/>
+              <w:szCs w:val="32"/>
             </w:rPr>
           </w:pPr>
-          <w:r>
-            <w:rPr>
-              <w:rFonts w:ascii="Arial Narrow" w:hAnsi="Arial Narrow"/>
-              <w:color w:val="000000" w:themeColor="text1"/>
-              <w:sz w:val="18"/>
-              <w:szCs w:val="18"/>
-            </w:rPr>
-            <w:t>Jalan Jenderal Gatot Subroto Kaveling 51, Kelurahan Kuningan Timur, Kecamatan Setiabudi, Kota Jakarta Selatan, Provinsi DKI Jakarta 12950</w:t>
-          </w:r>
         </w:p>
         <w:p>
           <w:pPr>
@@ -2733,6 +2669,82 @@
               <w:szCs w:val="18"/>
             </w:rPr>
           </w:pPr>
+          <w:r>
+            <w:rPr>
+              <w:noProof/>
+            </w:rPr>
+            <mc:AlternateContent>
+              <mc:Choice Requires="wps">
+                <w:drawing>
+                  <wp:anchor distT="0" distB="0" distL="114300" distR="114300" simplePos="0" relativeHeight="251658240" behindDoc="0" locked="0" layoutInCell="1" allowOverlap="1" wp14:anchorId="61DF1CE0" wp14:editId="54731A68">
+                    <wp:simplePos x="0" y="0"/>
+                    <wp:positionH relativeFrom="column">
+                      <wp:posOffset>-840740</wp:posOffset>
+                    </wp:positionH>
+                    <wp:positionV relativeFrom="paragraph">
+                      <wp:posOffset>255270</wp:posOffset>
+                    </wp:positionV>
+                    <wp:extent cx="6228000" cy="0"/>
+                    <wp:effectExtent l="38100" t="19050" r="59055" b="114300"/>
+                    <wp:wrapNone/>
+                    <wp:docPr id="718829074" name="Straight Connector 2"/>
+                    <wp:cNvGraphicFramePr/>
+                    <a:graphic xmlns:a="http://schemas.openxmlformats.org/drawingml/2006/main">
+                      <a:graphicData uri="http://schemas.microsoft.com/office/word/2010/wordprocessingShape">
+                        <wps:wsp>
+                          <wps:cNvCnPr/>
+                          <wps:spPr>
+                            <a:xfrm flipV="1">
+                              <a:off x="0" y="0"/>
+                              <a:ext cx="6228000" cy="0"/>
+                            </a:xfrm>
+                            <a:prstGeom prst="line">
+                              <a:avLst/>
+                            </a:prstGeom>
+                            <a:effectLst>
+                              <a:outerShdw blurRad="50800" dist="38100" dir="5400000" algn="t" rotWithShape="0">
+                                <a:prstClr val="black">
+                                  <a:alpha val="40000"/>
+                                </a:prstClr>
+                              </a:outerShdw>
+                            </a:effectLst>
+                          </wps:spPr>
+                          <wps:style>
+                            <a:lnRef idx="2">
+                              <a:schemeClr val="dk1"/>
+                            </a:lnRef>
+                            <a:fillRef idx="0">
+                              <a:schemeClr val="dk1"/>
+                            </a:fillRef>
+                            <a:effectRef idx="1">
+                              <a:schemeClr val="dk1"/>
+                            </a:effectRef>
+                            <a:fontRef idx="minor">
+                              <a:schemeClr val="tx1"/>
+                            </a:fontRef>
+                          </wps:style>
+                          <wps:bodyPr/>
+                        </wps:wsp>
+                      </a:graphicData>
+                    </a:graphic>
+                    <wp14:sizeRelH relativeFrom="margin">
+                      <wp14:pctWidth>0</wp14:pctWidth>
+                    </wp14:sizeRelH>
+                    <wp14:sizeRelV relativeFrom="margin">
+                      <wp14:pctHeight>0</wp14:pctHeight>
+                    </wp14:sizeRelV>
+                  </wp:anchor>
+                </w:drawing>
+              </mc:Choice>
+              <mc:Fallback>
+                <w:pict>
+                  <v:line w14:anchorId="59B0F3CE" id="Straight Connector 2" o:spid="_x0000_s1026" style="position:absolute;flip:y;z-index:251658240;visibility:visible;mso-wrap-style:square;mso-width-percent:0;mso-height-percent:0;mso-wrap-distance-left:9pt;mso-wrap-distance-top:0;mso-wrap-distance-right:9pt;mso-wrap-distance-bottom:0;mso-position-horizontal:absolute;mso-position-horizontal-relative:text;mso-position-vertical:absolute;mso-position-vertical-relative:text;mso-width-percent:0;mso-height-percent:0;mso-width-relative:margin;mso-height-relative:margin" from="-66.2pt,20.1pt" to="424.2pt,20.1pt" o:gfxdata="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" strokecolor="black [3200]" strokeweight="2pt">
+                    <v:shadow on="t" color="black" opacity="26214f" origin=",-.5" offset="0,3pt"/>
+                  </v:line>
+                </w:pict>
+              </mc:Fallback>
+            </mc:AlternateContent>
+          </w:r>
           <w:r>
             <w:rPr>
               <w:rFonts w:ascii="Arial Narrow" w:hAnsi="Arial Narrow"/>
@@ -2961,84 +2973,7 @@
             <w:t xml:space="preserve"> 1500630</w:t>
           </w:r>
         </w:p>
-        <w:p>
-          <w:r>
-            <w:rPr>
-              <w:noProof/>
-            </w:rPr>
-            <mc:AlternateContent>
-              <mc:Choice Requires="wps">
-                <w:drawing>
-                  <wp:anchor distT="0" distB="0" distL="114300" distR="114300" simplePos="0" relativeHeight="251715584" behindDoc="0" locked="0" layoutInCell="1" allowOverlap="1" wp14:anchorId="61DF1CE0" wp14:editId="2151E423">
-                    <wp:simplePos x="0" y="0"/>
-                    <wp:positionH relativeFrom="column">
-                      <wp:posOffset>-840740</wp:posOffset>
-                    </wp:positionH>
-                    <wp:positionV relativeFrom="paragraph">
-                      <wp:posOffset>135255</wp:posOffset>
-                    </wp:positionV>
-                    <wp:extent cx="6228000" cy="0"/>
-                    <wp:effectExtent l="38100" t="19050" r="59055" b="114300"/>
-                    <wp:wrapNone/>
-                    <wp:docPr id="718829074" name="Straight Connector 2"/>
-                    <wp:cNvGraphicFramePr/>
-                    <a:graphic xmlns:a="http://schemas.openxmlformats.org/drawingml/2006/main">
-                      <a:graphicData uri="http://schemas.microsoft.com/office/word/2010/wordprocessingShape">
-                        <wps:wsp>
-                          <wps:cNvCnPr/>
-                          <wps:spPr>
-                            <a:xfrm flipV="1">
-                              <a:off x="0" y="0"/>
-                              <a:ext cx="6228000" cy="0"/>
-                            </a:xfrm>
-                            <a:prstGeom prst="line">
-                              <a:avLst/>
-                            </a:prstGeom>
-                            <a:effectLst>
-                              <a:outerShdw blurRad="50800" dist="38100" dir="5400000" algn="t" rotWithShape="0">
-                                <a:prstClr val="black">
-                                  <a:alpha val="40000"/>
-                                </a:prstClr>
-                              </a:outerShdw>
-                            </a:effectLst>
-                          </wps:spPr>
-                          <wps:style>
-                            <a:lnRef idx="2">
-                              <a:schemeClr val="dk1"/>
-                            </a:lnRef>
-                            <a:fillRef idx="0">
-                              <a:schemeClr val="dk1"/>
-                            </a:fillRef>
-                            <a:effectRef idx="1">
-                              <a:schemeClr val="dk1"/>
-                            </a:effectRef>
-                            <a:fontRef idx="minor">
-                              <a:schemeClr val="tx1"/>
-                            </a:fontRef>
-                          </wps:style>
-                          <wps:bodyPr/>
-                        </wps:wsp>
-                      </a:graphicData>
-                    </a:graphic>
-                    <wp14:sizeRelH relativeFrom="margin">
-                      <wp14:pctWidth>0</wp14:pctWidth>
-                    </wp14:sizeRelH>
-                    <wp14:sizeRelV relativeFrom="margin">
-                      <wp14:pctHeight>0</wp14:pctHeight>
-                    </wp14:sizeRelV>
-                  </wp:anchor>
-                </w:drawing>
-              </mc:Choice>
-              <mc:Fallback>
-                <w:pict>
-                  <v:line w14:anchorId="7B8B2D5C" id="Straight Connector 2" o:spid="_x0000_s1026" style="position:absolute;flip:y;z-index:251715584;visibility:visible;mso-wrap-style:square;mso-width-percent:0;mso-height-percent:0;mso-wrap-distance-left:9pt;mso-wrap-distance-top:0;mso-wrap-distance-right:9pt;mso-wrap-distance-bottom:0;mso-position-horizontal:absolute;mso-position-horizontal-relative:text;mso-position-vertical:absolute;mso-position-vertical-relative:text;mso-width-percent:0;mso-height-percent:0;mso-width-relative:margin;mso-height-relative:margin" from="-66.2pt,10.65pt" to="424.2pt,10.65pt" o:gfxdata="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" strokecolor="black [3200]" strokeweight="2pt">
-                    <v:shadow on="t" color="black" opacity="26214f" origin=",-.5" offset="0,3pt"/>
-                  </v:line>
-                </w:pict>
-              </mc:Fallback>
-            </mc:AlternateContent>
-          </w:r>
-        </w:p>
+        <w:p/>
         <w:p>
           <w:pPr>
             <w:pStyle w:val="Header"/>

</xml_diff>

<commit_message>
Kemenangan Yang hampir didapat
</commit_message>
<xml_diff>
--- a/backend/templates/Berkas Luar Kota - Laporan.docx
+++ b/backend/templates/Berkas Luar Kota - Laporan.docx
@@ -1018,10 +1018,15 @@
           <w:lang w:val="en-US"/>
         </w:rPr>
         <w:sectPr>
-          <w:headerReference w:type="default" r:id="rId7"/>
+          <w:headerReference w:type="even" r:id="rId7"/>
+          <w:headerReference w:type="default" r:id="rId8"/>
+          <w:footerReference w:type="even" r:id="rId9"/>
+          <w:footerReference w:type="default" r:id="rId10"/>
+          <w:headerReference w:type="first" r:id="rId11"/>
+          <w:footerReference w:type="first" r:id="rId12"/>
           <w:type w:val="continuous"/>
           <w:pgSz w:w="12240" w:h="20160"/>
-          <w:pgMar w:top="1200" w:right="1080" w:bottom="280" w:left="1080" w:header="397" w:footer="720" w:gutter="0"/>
+          <w:pgMar w:top="1200" w:right="1080" w:bottom="280" w:left="1080" w:header="340" w:footer="720" w:gutter="0"/>
           <w:cols w:space="720"/>
           <w:docGrid w:linePitch="299"/>
         </w:sectPr>
@@ -2129,6 +2134,7 @@
       <w:pPr>
         <w:pStyle w:val="TableParagraph"/>
         <w:sectPr>
+          <w:headerReference w:type="first" r:id="rId13"/>
           <w:pgSz w:w="12240" w:h="20160"/>
           <w:pgMar w:top="1420" w:right="1080" w:bottom="280" w:left="1080" w:header="720" w:footer="720" w:gutter="0"/>
           <w:cols w:space="720"/>
@@ -2366,7 +2372,7 @@
       </w:pPr>
     </w:p>
     <w:sectPr>
-      <w:headerReference w:type="default" r:id="rId8"/>
+      <w:headerReference w:type="default" r:id="rId14"/>
       <w:pgSz w:w="12240" w:h="20160"/>
       <w:pgMar w:top="1480" w:right="1080" w:bottom="280" w:left="1080" w:header="1245" w:footer="0" w:gutter="0"/>
       <w:cols w:space="720"/>
@@ -2394,6 +2400,36 @@
 </w:endnotes>
 </file>
 
+<file path=word/footer1.xml><?xml version="1.0" encoding="utf-8"?>
+<w:ftr xmlns:wpc="http://schemas.microsoft.com/office/word/2010/wordprocessingCanvas" xmlns:cx="http://schemas.microsoft.com/office/drawing/2014/chartex" xmlns:cx1="http://schemas.microsoft.com/office/drawing/2015/9/8/chartex" xmlns:cx2="http://schemas.microsoft.com/office/drawing/2015/10/21/chartex" xmlns:cx3="http://schemas.microsoft.com/office/drawing/2016/5/9/chartex" xmlns:cx4="http://schemas.microsoft.com/office/drawing/2016/5/10/chartex" xmlns:cx5="http://schemas.microsoft.com/office/drawing/2016/5/11/chartex" xmlns:cx6="http://schemas.microsoft.com/office/drawing/2016/5/12/chartex" xmlns:cx7="http://schemas.microsoft.com/office/drawing/2016/5/13/chartex" xmlns:cx8="http://schemas.microsoft.com/office/drawing/2016/5/14/chartex" xmlns:mc="http://schemas.openxmlformats.org/markup-compatibility/2006" xmlns:aink="http://schemas.microsoft.com/office/drawing/2016/ink" xmlns:am3d="http://schemas.microsoft.com/office/drawing/2017/model3d" xmlns:o="urn:schemas-microsoft-com:office:office" xmlns:oel="http://schemas.microsoft.com/office/2019/extlst" xmlns:r="http://schemas.openxmlformats.org/officeDocument/2006/relationships" xmlns:m="http://schemas.openxmlformats.org/officeDocument/2006/math" xmlns:v="urn:schemas-microsoft-com:vml" xmlns:wp14="http://schemas.microsoft.com/office/word/2010/wordprocessingDrawing" xmlns:wp="http://schemas.openxmlformats.org/drawingml/2006/wordprocessingDrawing" xmlns:w10="urn:schemas-microsoft-com:office:word" xmlns:w="http://schemas.openxmlformats.org/wordprocessingml/2006/main" xmlns:w14="http://schemas.microsoft.com/office/word/2010/wordml" xmlns:w15="http://schemas.microsoft.com/office/word/2012/wordml" xmlns:w16cex="http://schemas.microsoft.com/office/word/2018/wordml/cex" xmlns:w16cid="http://schemas.microsoft.com/office/word/2016/wordml/cid" xmlns:w16="http://schemas.microsoft.com/office/word/2018/wordml" xmlns:w16du="http://schemas.microsoft.com/office/word/2023/wordml/word16du" xmlns:w16sdtdh="http://schemas.microsoft.com/office/word/2020/wordml/sdtdatahash" xmlns:w16sdtfl="http://schemas.microsoft.com/office/word/2024/wordml/sdtformatlock" xmlns:w16se="http://schemas.microsoft.com/office/word/2015/wordml/symex" xmlns:wpg="http://schemas.microsoft.com/office/word/2010/wordprocessingGroup" xmlns:wpi="http://schemas.microsoft.com/office/word/2010/wordprocessingInk" xmlns:wne="http://schemas.microsoft.com/office/word/2006/wordml" xmlns:wps="http://schemas.microsoft.com/office/word/2010/wordprocessingShape" mc:Ignorable="w14 w15 w16se w16cid w16 w16cex w16sdtdh w16sdtfl w16du wp14">
+  <w:p>
+    <w:pPr>
+      <w:pStyle w:val="Footer"/>
+    </w:pPr>
+  </w:p>
+</w:ftr>
+</file>
+
+<file path=word/footer2.xml><?xml version="1.0" encoding="utf-8"?>
+<w:ftr xmlns:wpc="http://schemas.microsoft.com/office/word/2010/wordprocessingCanvas" xmlns:cx="http://schemas.microsoft.com/office/drawing/2014/chartex" xmlns:cx1="http://schemas.microsoft.com/office/drawing/2015/9/8/chartex" xmlns:cx2="http://schemas.microsoft.com/office/drawing/2015/10/21/chartex" xmlns:cx3="http://schemas.microsoft.com/office/drawing/2016/5/9/chartex" xmlns:cx4="http://schemas.microsoft.com/office/drawing/2016/5/10/chartex" xmlns:cx5="http://schemas.microsoft.com/office/drawing/2016/5/11/chartex" xmlns:cx6="http://schemas.microsoft.com/office/drawing/2016/5/12/chartex" xmlns:cx7="http://schemas.microsoft.com/office/drawing/2016/5/13/chartex" xmlns:cx8="http://schemas.microsoft.com/office/drawing/2016/5/14/chartex" xmlns:mc="http://schemas.openxmlformats.org/markup-compatibility/2006" xmlns:aink="http://schemas.microsoft.com/office/drawing/2016/ink" xmlns:am3d="http://schemas.microsoft.com/office/drawing/2017/model3d" xmlns:o="urn:schemas-microsoft-com:office:office" xmlns:oel="http://schemas.microsoft.com/office/2019/extlst" xmlns:r="http://schemas.openxmlformats.org/officeDocument/2006/relationships" xmlns:m="http://schemas.openxmlformats.org/officeDocument/2006/math" xmlns:v="urn:schemas-microsoft-com:vml" xmlns:wp14="http://schemas.microsoft.com/office/word/2010/wordprocessingDrawing" xmlns:wp="http://schemas.openxmlformats.org/drawingml/2006/wordprocessingDrawing" xmlns:w10="urn:schemas-microsoft-com:office:word" xmlns:w="http://schemas.openxmlformats.org/wordprocessingml/2006/main" xmlns:w14="http://schemas.microsoft.com/office/word/2010/wordml" xmlns:w15="http://schemas.microsoft.com/office/word/2012/wordml" xmlns:w16cex="http://schemas.microsoft.com/office/word/2018/wordml/cex" xmlns:w16cid="http://schemas.microsoft.com/office/word/2016/wordml/cid" xmlns:w16="http://schemas.microsoft.com/office/word/2018/wordml" xmlns:w16du="http://schemas.microsoft.com/office/word/2023/wordml/word16du" xmlns:w16sdtdh="http://schemas.microsoft.com/office/word/2020/wordml/sdtdatahash" xmlns:w16sdtfl="http://schemas.microsoft.com/office/word/2024/wordml/sdtformatlock" xmlns:w16se="http://schemas.microsoft.com/office/word/2015/wordml/symex" xmlns:wpg="http://schemas.microsoft.com/office/word/2010/wordprocessingGroup" xmlns:wpi="http://schemas.microsoft.com/office/word/2010/wordprocessingInk" xmlns:wne="http://schemas.microsoft.com/office/word/2006/wordml" xmlns:wps="http://schemas.microsoft.com/office/word/2010/wordprocessingShape" mc:Ignorable="w14 w15 w16se w16cid w16 w16cex w16sdtdh w16sdtfl w16du wp14">
+  <w:p>
+    <w:pPr>
+      <w:pStyle w:val="Footer"/>
+    </w:pPr>
+  </w:p>
+</w:ftr>
+</file>
+
+<file path=word/footer3.xml><?xml version="1.0" encoding="utf-8"?>
+<w:ftr xmlns:wpc="http://schemas.microsoft.com/office/word/2010/wordprocessingCanvas" xmlns:cx="http://schemas.microsoft.com/office/drawing/2014/chartex" xmlns:cx1="http://schemas.microsoft.com/office/drawing/2015/9/8/chartex" xmlns:cx2="http://schemas.microsoft.com/office/drawing/2015/10/21/chartex" xmlns:cx3="http://schemas.microsoft.com/office/drawing/2016/5/9/chartex" xmlns:cx4="http://schemas.microsoft.com/office/drawing/2016/5/10/chartex" xmlns:cx5="http://schemas.microsoft.com/office/drawing/2016/5/11/chartex" xmlns:cx6="http://schemas.microsoft.com/office/drawing/2016/5/12/chartex" xmlns:cx7="http://schemas.microsoft.com/office/drawing/2016/5/13/chartex" xmlns:cx8="http://schemas.microsoft.com/office/drawing/2016/5/14/chartex" xmlns:mc="http://schemas.openxmlformats.org/markup-compatibility/2006" xmlns:aink="http://schemas.microsoft.com/office/drawing/2016/ink" xmlns:am3d="http://schemas.microsoft.com/office/drawing/2017/model3d" xmlns:o="urn:schemas-microsoft-com:office:office" xmlns:oel="http://schemas.microsoft.com/office/2019/extlst" xmlns:r="http://schemas.openxmlformats.org/officeDocument/2006/relationships" xmlns:m="http://schemas.openxmlformats.org/officeDocument/2006/math" xmlns:v="urn:schemas-microsoft-com:vml" xmlns:wp14="http://schemas.microsoft.com/office/word/2010/wordprocessingDrawing" xmlns:wp="http://schemas.openxmlformats.org/drawingml/2006/wordprocessingDrawing" xmlns:w10="urn:schemas-microsoft-com:office:word" xmlns:w="http://schemas.openxmlformats.org/wordprocessingml/2006/main" xmlns:w14="http://schemas.microsoft.com/office/word/2010/wordml" xmlns:w15="http://schemas.microsoft.com/office/word/2012/wordml" xmlns:w16cex="http://schemas.microsoft.com/office/word/2018/wordml/cex" xmlns:w16cid="http://schemas.microsoft.com/office/word/2016/wordml/cid" xmlns:w16="http://schemas.microsoft.com/office/word/2018/wordml" xmlns:w16du="http://schemas.microsoft.com/office/word/2023/wordml/word16du" xmlns:w16sdtdh="http://schemas.microsoft.com/office/word/2020/wordml/sdtdatahash" xmlns:w16sdtfl="http://schemas.microsoft.com/office/word/2024/wordml/sdtformatlock" xmlns:w16se="http://schemas.microsoft.com/office/word/2015/wordml/symex" xmlns:wpg="http://schemas.microsoft.com/office/word/2010/wordprocessingGroup" xmlns:wpi="http://schemas.microsoft.com/office/word/2010/wordprocessingInk" xmlns:wne="http://schemas.microsoft.com/office/word/2006/wordml" xmlns:wps="http://schemas.microsoft.com/office/word/2010/wordprocessingShape" mc:Ignorable="w14 w15 w16se w16cid w16 w16cex w16sdtdh w16sdtfl w16du wp14">
+  <w:p>
+    <w:pPr>
+      <w:pStyle w:val="Footer"/>
+    </w:pPr>
+  </w:p>
+</w:ftr>
+</file>
+
 <file path=word/footnotes.xml><?xml version="1.0" encoding="utf-8"?>
 <w:footnotes xmlns:wpc="http://schemas.microsoft.com/office/word/2010/wordprocessingCanvas" xmlns:cx="http://schemas.microsoft.com/office/drawing/2014/chartex" xmlns:cx1="http://schemas.microsoft.com/office/drawing/2015/9/8/chartex" xmlns:cx2="http://schemas.microsoft.com/office/drawing/2015/10/21/chartex" xmlns:cx3="http://schemas.microsoft.com/office/drawing/2016/5/9/chartex" xmlns:cx4="http://schemas.microsoft.com/office/drawing/2016/5/10/chartex" xmlns:cx5="http://schemas.microsoft.com/office/drawing/2016/5/11/chartex" xmlns:cx6="http://schemas.microsoft.com/office/drawing/2016/5/12/chartex" xmlns:cx7="http://schemas.microsoft.com/office/drawing/2016/5/13/chartex" xmlns:cx8="http://schemas.microsoft.com/office/drawing/2016/5/14/chartex" xmlns:mc="http://schemas.openxmlformats.org/markup-compatibility/2006" xmlns:aink="http://schemas.microsoft.com/office/drawing/2016/ink" xmlns:am3d="http://schemas.microsoft.com/office/drawing/2017/model3d" xmlns:o="urn:schemas-microsoft-com:office:office" xmlns:oel="http://schemas.microsoft.com/office/2019/extlst" xmlns:r="http://schemas.openxmlformats.org/officeDocument/2006/relationships" xmlns:m="http://schemas.openxmlformats.org/officeDocument/2006/math" xmlns:v="urn:schemas-microsoft-com:vml" xmlns:wp14="http://schemas.microsoft.com/office/word/2010/wordprocessingDrawing" xmlns:wp="http://schemas.openxmlformats.org/drawingml/2006/wordprocessingDrawing" xmlns:w10="urn:schemas-microsoft-com:office:word" xmlns:w="http://schemas.openxmlformats.org/wordprocessingml/2006/main" xmlns:w14="http://schemas.microsoft.com/office/word/2010/wordml" xmlns:w15="http://schemas.microsoft.com/office/word/2012/wordml" xmlns:w16cex="http://schemas.microsoft.com/office/word/2018/wordml/cex" xmlns:w16cid="http://schemas.microsoft.com/office/word/2016/wordml/cid" xmlns:w16="http://schemas.microsoft.com/office/word/2018/wordml" xmlns:w16du="http://schemas.microsoft.com/office/word/2023/wordml/word16du" xmlns:w16sdtdh="http://schemas.microsoft.com/office/word/2020/wordml/sdtdatahash" xmlns:w16sdtfl="http://schemas.microsoft.com/office/word/2024/wordml/sdtformatlock" xmlns:w16se="http://schemas.microsoft.com/office/word/2015/wordml/symex" xmlns:wpg="http://schemas.microsoft.com/office/word/2010/wordprocessingGroup" xmlns:wpi="http://schemas.microsoft.com/office/word/2010/wordprocessingInk" xmlns:wne="http://schemas.microsoft.com/office/word/2006/wordml" xmlns:wps="http://schemas.microsoft.com/office/word/2010/wordprocessingShape" mc:Ignorable="w14 w15 w16se w16cid w16 w16cex w16sdtdh w16sdtfl w16du wp14">
   <w:footnote w:type="separator" w:id="-1">
@@ -2415,23 +2451,33 @@
 
 <file path=word/header1.xml><?xml version="1.0" encoding="utf-8"?>
 <w:hdr xmlns:wpc="http://schemas.microsoft.com/office/word/2010/wordprocessingCanvas" xmlns:cx="http://schemas.microsoft.com/office/drawing/2014/chartex" xmlns:cx1="http://schemas.microsoft.com/office/drawing/2015/9/8/chartex" xmlns:cx2="http://schemas.microsoft.com/office/drawing/2015/10/21/chartex" xmlns:cx3="http://schemas.microsoft.com/office/drawing/2016/5/9/chartex" xmlns:cx4="http://schemas.microsoft.com/office/drawing/2016/5/10/chartex" xmlns:cx5="http://schemas.microsoft.com/office/drawing/2016/5/11/chartex" xmlns:cx6="http://schemas.microsoft.com/office/drawing/2016/5/12/chartex" xmlns:cx7="http://schemas.microsoft.com/office/drawing/2016/5/13/chartex" xmlns:cx8="http://schemas.microsoft.com/office/drawing/2016/5/14/chartex" xmlns:mc="http://schemas.openxmlformats.org/markup-compatibility/2006" xmlns:aink="http://schemas.microsoft.com/office/drawing/2016/ink" xmlns:am3d="http://schemas.microsoft.com/office/drawing/2017/model3d" xmlns:o="urn:schemas-microsoft-com:office:office" xmlns:oel="http://schemas.microsoft.com/office/2019/extlst" xmlns:r="http://schemas.openxmlformats.org/officeDocument/2006/relationships" xmlns:m="http://schemas.openxmlformats.org/officeDocument/2006/math" xmlns:v="urn:schemas-microsoft-com:vml" xmlns:wp14="http://schemas.microsoft.com/office/word/2010/wordprocessingDrawing" xmlns:wp="http://schemas.openxmlformats.org/drawingml/2006/wordprocessingDrawing" xmlns:w10="urn:schemas-microsoft-com:office:word" xmlns:w="http://schemas.openxmlformats.org/wordprocessingml/2006/main" xmlns:w14="http://schemas.microsoft.com/office/word/2010/wordml" xmlns:w15="http://schemas.microsoft.com/office/word/2012/wordml" xmlns:w16cex="http://schemas.microsoft.com/office/word/2018/wordml/cex" xmlns:w16cid="http://schemas.microsoft.com/office/word/2016/wordml/cid" xmlns:w16="http://schemas.microsoft.com/office/word/2018/wordml" xmlns:w16du="http://schemas.microsoft.com/office/word/2023/wordml/word16du" xmlns:w16sdtdh="http://schemas.microsoft.com/office/word/2020/wordml/sdtdatahash" xmlns:w16sdtfl="http://schemas.microsoft.com/office/word/2024/wordml/sdtformatlock" xmlns:w16se="http://schemas.microsoft.com/office/word/2015/wordml/symex" xmlns:wpg="http://schemas.microsoft.com/office/word/2010/wordprocessingGroup" xmlns:wpi="http://schemas.microsoft.com/office/word/2010/wordprocessingInk" xmlns:wne="http://schemas.microsoft.com/office/word/2006/wordml" xmlns:wps="http://schemas.microsoft.com/office/word/2010/wordprocessingShape" mc:Ignorable="w14 w15 w16se w16cid w16 w16cex w16sdtdh w16sdtfl w16du wp14">
+  <w:p>
+    <w:pPr>
+      <w:pStyle w:val="Header"/>
+    </w:pPr>
+  </w:p>
+</w:hdr>
+</file>
+
+<file path=word/header2.xml><?xml version="1.0" encoding="utf-8"?>
+<w:hdr xmlns:wpc="http://schemas.microsoft.com/office/word/2010/wordprocessingCanvas" xmlns:cx="http://schemas.microsoft.com/office/drawing/2014/chartex" xmlns:cx1="http://schemas.microsoft.com/office/drawing/2015/9/8/chartex" xmlns:cx2="http://schemas.microsoft.com/office/drawing/2015/10/21/chartex" xmlns:cx3="http://schemas.microsoft.com/office/drawing/2016/5/9/chartex" xmlns:cx4="http://schemas.microsoft.com/office/drawing/2016/5/10/chartex" xmlns:cx5="http://schemas.microsoft.com/office/drawing/2016/5/11/chartex" xmlns:cx6="http://schemas.microsoft.com/office/drawing/2016/5/12/chartex" xmlns:cx7="http://schemas.microsoft.com/office/drawing/2016/5/13/chartex" xmlns:cx8="http://schemas.microsoft.com/office/drawing/2016/5/14/chartex" xmlns:mc="http://schemas.openxmlformats.org/markup-compatibility/2006" xmlns:aink="http://schemas.microsoft.com/office/drawing/2016/ink" xmlns:am3d="http://schemas.microsoft.com/office/drawing/2017/model3d" xmlns:o="urn:schemas-microsoft-com:office:office" xmlns:oel="http://schemas.microsoft.com/office/2019/extlst" xmlns:r="http://schemas.openxmlformats.org/officeDocument/2006/relationships" xmlns:m="http://schemas.openxmlformats.org/officeDocument/2006/math" xmlns:v="urn:schemas-microsoft-com:vml" xmlns:wp14="http://schemas.microsoft.com/office/word/2010/wordprocessingDrawing" xmlns:wp="http://schemas.openxmlformats.org/drawingml/2006/wordprocessingDrawing" xmlns:w10="urn:schemas-microsoft-com:office:word" xmlns:w="http://schemas.openxmlformats.org/wordprocessingml/2006/main" xmlns:w14="http://schemas.microsoft.com/office/word/2010/wordml" xmlns:w15="http://schemas.microsoft.com/office/word/2012/wordml" xmlns:w16cex="http://schemas.microsoft.com/office/word/2018/wordml/cex" xmlns:w16cid="http://schemas.microsoft.com/office/word/2016/wordml/cid" xmlns:w16="http://schemas.microsoft.com/office/word/2018/wordml" xmlns:w16du="http://schemas.microsoft.com/office/word/2023/wordml/word16du" xmlns:w16sdtdh="http://schemas.microsoft.com/office/word/2020/wordml/sdtdatahash" xmlns:w16sdtfl="http://schemas.microsoft.com/office/word/2024/wordml/sdtformatlock" xmlns:w16se="http://schemas.microsoft.com/office/word/2015/wordml/symex" xmlns:wpg="http://schemas.microsoft.com/office/word/2010/wordprocessingGroup" xmlns:wpi="http://schemas.microsoft.com/office/word/2010/wordprocessingInk" xmlns:wne="http://schemas.microsoft.com/office/word/2006/wordml" xmlns:wps="http://schemas.microsoft.com/office/word/2010/wordprocessingShape" mc:Ignorable="w14 w15 w16se w16cid w16 w16cex w16sdtdh w16sdtfl w16du wp14">
   <w:tbl>
     <w:tblPr>
       <w:tblStyle w:val="TableGrid"/>
-      <w:tblW w:w="0" w:type="auto"/>
+      <w:tblW w:w="10641" w:type="dxa"/>
       <w:tblLook w:val="04A0" w:firstRow="1" w:lastRow="0" w:firstColumn="1" w:lastColumn="0" w:noHBand="0" w:noVBand="1"/>
     </w:tblPr>
     <w:tblGrid>
-      <w:gridCol w:w="1384"/>
-      <w:gridCol w:w="8912"/>
+      <w:gridCol w:w="1430"/>
+      <w:gridCol w:w="9211"/>
     </w:tblGrid>
     <w:tr>
       <w:trPr>
-        <w:trHeight w:val="1975"/>
+        <w:trHeight w:val="1867"/>
       </w:trPr>
       <w:tc>
         <w:tcPr>
-          <w:tcW w:w="1384" w:type="dxa"/>
+          <w:tcW w:w="1430" w:type="dxa"/>
           <w:tcBorders>
             <w:top w:val="nil"/>
             <w:left w:val="nil"/>
@@ -2448,7 +2494,7 @@
               <w:noProof/>
             </w:rPr>
             <w:drawing>
-              <wp:anchor distT="0" distB="0" distL="114300" distR="114300" simplePos="0" relativeHeight="251637760" behindDoc="1" locked="0" layoutInCell="1" allowOverlap="1" wp14:anchorId="76776B0B" wp14:editId="5E5288A5">
+              <wp:anchor distT="0" distB="0" distL="114300" distR="114300" simplePos="0" relativeHeight="251656192" behindDoc="1" locked="0" layoutInCell="1" allowOverlap="1" wp14:anchorId="76776B0B" wp14:editId="5E5288A5">
                 <wp:simplePos x="0" y="0"/>
                 <wp:positionH relativeFrom="column">
                   <wp:posOffset>689379</wp:posOffset>
@@ -2517,7 +2563,7 @@
               <w:noProof/>
             </w:rPr>
             <w:drawing>
-              <wp:anchor distT="0" distB="0" distL="114300" distR="114300" simplePos="0" relativeHeight="251676672" behindDoc="1" locked="0" layoutInCell="1" allowOverlap="1" wp14:anchorId="1F510154" wp14:editId="615CF181">
+              <wp:anchor distT="0" distB="0" distL="114300" distR="114300" simplePos="0" relativeHeight="251664384" behindDoc="1" locked="0" layoutInCell="1" allowOverlap="1" wp14:anchorId="1F510154" wp14:editId="615CF181">
                 <wp:simplePos x="0" y="0"/>
                 <wp:positionH relativeFrom="column">
                   <wp:posOffset>5847</wp:posOffset>
@@ -2597,7 +2643,7 @@
       </w:tc>
       <w:tc>
         <w:tcPr>
-          <w:tcW w:w="8912" w:type="dxa"/>
+          <w:tcW w:w="9211" w:type="dxa"/>
           <w:tcBorders>
             <w:top w:val="nil"/>
             <w:left w:val="nil"/>
@@ -2610,6 +2656,15 @@
             <w:rPr>
               <w:rFonts w:ascii="Arial Narrow" w:hAnsi="Arial Narrow"/>
               <w:szCs w:val="24"/>
+            </w:rPr>
+          </w:pPr>
+        </w:p>
+        <w:p>
+          <w:pPr>
+            <w:rPr>
+              <w:rFonts w:ascii="Arial Narrow" w:hAnsi="Arial Narrow"/>
+              <w:sz w:val="28"/>
+              <w:szCs w:val="28"/>
             </w:rPr>
           </w:pPr>
         </w:p>
@@ -2669,309 +2724,6 @@
               <w:szCs w:val="18"/>
             </w:rPr>
           </w:pPr>
-          <w:r>
-            <w:rPr>
-              <w:noProof/>
-            </w:rPr>
-            <mc:AlternateContent>
-              <mc:Choice Requires="wps">
-                <w:drawing>
-                  <wp:anchor distT="0" distB="0" distL="114300" distR="114300" simplePos="0" relativeHeight="251658240" behindDoc="0" locked="0" layoutInCell="1" allowOverlap="1" wp14:anchorId="61DF1CE0" wp14:editId="54731A68">
-                    <wp:simplePos x="0" y="0"/>
-                    <wp:positionH relativeFrom="column">
-                      <wp:posOffset>-840740</wp:posOffset>
-                    </wp:positionH>
-                    <wp:positionV relativeFrom="paragraph">
-                      <wp:posOffset>255270</wp:posOffset>
-                    </wp:positionV>
-                    <wp:extent cx="6228000" cy="0"/>
-                    <wp:effectExtent l="38100" t="19050" r="59055" b="114300"/>
-                    <wp:wrapNone/>
-                    <wp:docPr id="718829074" name="Straight Connector 2"/>
-                    <wp:cNvGraphicFramePr/>
-                    <a:graphic xmlns:a="http://schemas.openxmlformats.org/drawingml/2006/main">
-                      <a:graphicData uri="http://schemas.microsoft.com/office/word/2010/wordprocessingShape">
-                        <wps:wsp>
-                          <wps:cNvCnPr/>
-                          <wps:spPr>
-                            <a:xfrm flipV="1">
-                              <a:off x="0" y="0"/>
-                              <a:ext cx="6228000" cy="0"/>
-                            </a:xfrm>
-                            <a:prstGeom prst="line">
-                              <a:avLst/>
-                            </a:prstGeom>
-                            <a:effectLst>
-                              <a:outerShdw blurRad="50800" dist="38100" dir="5400000" algn="t" rotWithShape="0">
-                                <a:prstClr val="black">
-                                  <a:alpha val="40000"/>
-                                </a:prstClr>
-                              </a:outerShdw>
-                            </a:effectLst>
-                          </wps:spPr>
-                          <wps:style>
-                            <a:lnRef idx="2">
-                              <a:schemeClr val="dk1"/>
-                            </a:lnRef>
-                            <a:fillRef idx="0">
-                              <a:schemeClr val="dk1"/>
-                            </a:fillRef>
-                            <a:effectRef idx="1">
-                              <a:schemeClr val="dk1"/>
-                            </a:effectRef>
-                            <a:fontRef idx="minor">
-                              <a:schemeClr val="tx1"/>
-                            </a:fontRef>
-                          </wps:style>
-                          <wps:bodyPr/>
-                        </wps:wsp>
-                      </a:graphicData>
-                    </a:graphic>
-                    <wp14:sizeRelH relativeFrom="margin">
-                      <wp14:pctWidth>0</wp14:pctWidth>
-                    </wp14:sizeRelH>
-                    <wp14:sizeRelV relativeFrom="margin">
-                      <wp14:pctHeight>0</wp14:pctHeight>
-                    </wp14:sizeRelV>
-                  </wp:anchor>
-                </w:drawing>
-              </mc:Choice>
-              <mc:Fallback>
-                <w:pict>
-                  <v:line w14:anchorId="59B0F3CE" id="Straight Connector 2" o:spid="_x0000_s1026" style="position:absolute;flip:y;z-index:251658240;visibility:visible;mso-wrap-style:square;mso-width-percent:0;mso-height-percent:0;mso-wrap-distance-left:9pt;mso-wrap-distance-top:0;mso-wrap-distance-right:9pt;mso-wrap-distance-bottom:0;mso-position-horizontal:absolute;mso-position-horizontal-relative:text;mso-position-vertical:absolute;mso-position-vertical-relative:text;mso-width-percent:0;mso-height-percent:0;mso-width-relative:margin;mso-height-relative:margin" from="-66.2pt,20.1pt" to="424.2pt,20.1pt" o:gfxdata="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" strokecolor="black [3200]" strokeweight="2pt">
-                    <v:shadow on="t" color="black" opacity="26214f" origin=",-.5" offset="0,3pt"/>
-                  </v:line>
-                </w:pict>
-              </mc:Fallback>
-            </mc:AlternateContent>
-          </w:r>
-          <w:r>
-            <w:rPr>
-              <w:rFonts w:ascii="Arial Narrow" w:hAnsi="Arial Narrow"/>
-              <w:noProof/>
-              <w:color w:val="000000" w:themeColor="text1"/>
-              <w:sz w:val="18"/>
-              <w:szCs w:val="18"/>
-            </w:rPr>
-            <w:drawing>
-              <wp:inline distT="0" distB="0" distL="0" distR="0" wp14:anchorId="58DF80D0" wp14:editId="115D9584">
-                <wp:extent cx="130810" cy="133350"/>
-                <wp:effectExtent l="0" t="0" r="2540" b="0"/>
-                <wp:docPr id="4" name="Picture 4"/>
-                <wp:cNvGraphicFramePr>
-                  <a:graphicFrameLocks xmlns:a="http://schemas.openxmlformats.org/drawingml/2006/main" noChangeAspect="1"/>
-                </wp:cNvGraphicFramePr>
-                <a:graphic xmlns:a="http://schemas.openxmlformats.org/drawingml/2006/main">
-                  <a:graphicData uri="http://schemas.openxmlformats.org/drawingml/2006/picture">
-                    <pic:pic xmlns:pic="http://schemas.openxmlformats.org/drawingml/2006/picture">
-                      <pic:nvPicPr>
-                        <pic:cNvPr id="25" name="Picture 25"/>
-                        <pic:cNvPicPr>
-                          <a:picLocks noChangeAspect="1"/>
-                        </pic:cNvPicPr>
-                      </pic:nvPicPr>
-                      <pic:blipFill>
-                        <a:blip r:embed="rId3" cstate="print">
-                          <a:extLst>
-                            <a:ext uri="{28A0092B-C50C-407E-A947-70E740481C1C}">
-                              <a14:useLocalDpi xmlns:a14="http://schemas.microsoft.com/office/drawing/2010/main" val="0"/>
-                            </a:ext>
-                          </a:extLst>
-                        </a:blip>
-                        <a:stretch>
-                          <a:fillRect/>
-                        </a:stretch>
-                      </pic:blipFill>
-                      <pic:spPr>
-                        <a:xfrm>
-                          <a:off x="0" y="0"/>
-                          <a:ext cx="169397" cy="173336"/>
-                        </a:xfrm>
-                        <a:prstGeom prst="rect">
-                          <a:avLst/>
-                        </a:prstGeom>
-                      </pic:spPr>
-                    </pic:pic>
-                  </a:graphicData>
-                </a:graphic>
-              </wp:inline>
-            </w:drawing>
-          </w:r>
-          <w:r>
-            <w:rPr>
-              <w:rFonts w:ascii="Arial Narrow" w:hAnsi="Arial Narrow"/>
-              <w:color w:val="000000" w:themeColor="text1"/>
-              <w:sz w:val="18"/>
-              <w:szCs w:val="18"/>
-            </w:rPr>
-            <w:t xml:space="preserve"> </w:t>
-          </w:r>
-          <w:hyperlink r:id="rId4" w:history="1">
-            <w:r>
-              <w:rPr>
-                <w:rFonts w:ascii="Arial Narrow" w:hAnsi="Arial Narrow"/>
-                <w:sz w:val="18"/>
-                <w:szCs w:val="18"/>
-              </w:rPr>
-              <w:t>www.kemnaker.go.id</w:t>
-            </w:r>
-          </w:hyperlink>
-          <w:r>
-            <w:rPr>
-              <w:rFonts w:ascii="Arial Narrow" w:hAnsi="Arial Narrow"/>
-              <w:sz w:val="18"/>
-              <w:szCs w:val="18"/>
-            </w:rPr>
-            <w:tab/>
-            <w:t xml:space="preserve"> </w:t>
-          </w:r>
-          <w:r>
-            <w:rPr>
-              <w:rFonts w:ascii="Arial Narrow" w:hAnsi="Arial Narrow"/>
-              <w:noProof/>
-              <w:sz w:val="18"/>
-              <w:szCs w:val="18"/>
-            </w:rPr>
-            <w:drawing>
-              <wp:inline distT="0" distB="0" distL="0" distR="0" wp14:anchorId="4E3DAD4A" wp14:editId="2F2DBC89">
-                <wp:extent cx="118745" cy="78740"/>
-                <wp:effectExtent l="0" t="0" r="0" b="0"/>
-                <wp:docPr id="5" name="Picture 5"/>
-                <wp:cNvGraphicFramePr>
-                  <a:graphicFrameLocks xmlns:a="http://schemas.openxmlformats.org/drawingml/2006/main" noChangeAspect="1"/>
-                </wp:cNvGraphicFramePr>
-                <a:graphic xmlns:a="http://schemas.openxmlformats.org/drawingml/2006/main">
-                  <a:graphicData uri="http://schemas.openxmlformats.org/drawingml/2006/picture">
-                    <pic:pic xmlns:pic="http://schemas.openxmlformats.org/drawingml/2006/picture">
-                      <pic:nvPicPr>
-                        <pic:cNvPr id="26" name="Picture 26"/>
-                        <pic:cNvPicPr>
-                          <a:picLocks noChangeAspect="1"/>
-                        </pic:cNvPicPr>
-                      </pic:nvPicPr>
-                      <pic:blipFill>
-                        <a:blip r:embed="rId5" cstate="print">
-                          <a:extLst>
-                            <a:ext uri="{28A0092B-C50C-407E-A947-70E740481C1C}">
-                              <a14:useLocalDpi xmlns:a14="http://schemas.microsoft.com/office/drawing/2010/main" val="0"/>
-                            </a:ext>
-                          </a:extLst>
-                        </a:blip>
-                        <a:stretch>
-                          <a:fillRect/>
-                        </a:stretch>
-                      </pic:blipFill>
-                      <pic:spPr>
-                        <a:xfrm>
-                          <a:off x="0" y="0"/>
-                          <a:ext cx="118872" cy="79248"/>
-                        </a:xfrm>
-                        <a:prstGeom prst="rect">
-                          <a:avLst/>
-                        </a:prstGeom>
-                      </pic:spPr>
-                    </pic:pic>
-                  </a:graphicData>
-                </a:graphic>
-              </wp:inline>
-            </w:drawing>
-          </w:r>
-          <w:r>
-            <w:rPr>
-              <w:rFonts w:ascii="Arial Narrow" w:hAnsi="Arial Narrow"/>
-              <w:sz w:val="18"/>
-              <w:szCs w:val="18"/>
-            </w:rPr>
-            <w:t xml:space="preserve"> </w:t>
-          </w:r>
-          <w:hyperlink r:id="rId6" w:history="1">
-            <w:r>
-              <w:rPr>
-                <w:rFonts w:ascii="Arial Narrow" w:hAnsi="Arial Narrow"/>
-                <w:sz w:val="18"/>
-                <w:szCs w:val="18"/>
-              </w:rPr>
-              <w:t>persuratan@kemnaker.go.id</w:t>
-            </w:r>
-          </w:hyperlink>
-          <w:r>
-            <w:rPr>
-              <w:rFonts w:ascii="Arial Narrow" w:hAnsi="Arial Narrow"/>
-              <w:sz w:val="18"/>
-              <w:szCs w:val="18"/>
-            </w:rPr>
-            <w:tab/>
-          </w:r>
-          <w:r>
-            <w:rPr>
-              <w:rFonts w:ascii="Arial Narrow" w:hAnsi="Arial Narrow"/>
-              <w:color w:val="000000" w:themeColor="text1"/>
-              <w:sz w:val="18"/>
-              <w:szCs w:val="18"/>
-            </w:rPr>
-            <w:tab/>
-          </w:r>
-          <w:r>
-            <w:rPr>
-              <w:rFonts w:ascii="Arial Narrow" w:hAnsi="Arial Narrow"/>
-              <w:noProof/>
-              <w:color w:val="000000" w:themeColor="text1"/>
-              <w:sz w:val="18"/>
-              <w:szCs w:val="18"/>
-            </w:rPr>
-            <w:drawing>
-              <wp:inline distT="0" distB="0" distL="0" distR="0" wp14:anchorId="08A6A6A5" wp14:editId="7C53B75E">
-                <wp:extent cx="100330" cy="100330"/>
-                <wp:effectExtent l="0" t="0" r="0" b="0"/>
-                <wp:docPr id="6" name="Picture 6"/>
-                <wp:cNvGraphicFramePr>
-                  <a:graphicFrameLocks xmlns:a="http://schemas.openxmlformats.org/drawingml/2006/main" noChangeAspect="1"/>
-                </wp:cNvGraphicFramePr>
-                <a:graphic xmlns:a="http://schemas.openxmlformats.org/drawingml/2006/main">
-                  <a:graphicData uri="http://schemas.openxmlformats.org/drawingml/2006/picture">
-                    <pic:pic xmlns:pic="http://schemas.openxmlformats.org/drawingml/2006/picture">
-                      <pic:nvPicPr>
-                        <pic:cNvPr id="27" name="Picture 27"/>
-                        <pic:cNvPicPr>
-                          <a:picLocks noChangeAspect="1"/>
-                        </pic:cNvPicPr>
-                      </pic:nvPicPr>
-                      <pic:blipFill>
-                        <a:blip r:embed="rId7" cstate="print">
-                          <a:extLst>
-                            <a:ext uri="{28A0092B-C50C-407E-A947-70E740481C1C}">
-                              <a14:useLocalDpi xmlns:a14="http://schemas.microsoft.com/office/drawing/2010/main" val="0"/>
-                            </a:ext>
-                          </a:extLst>
-                        </a:blip>
-                        <a:stretch>
-                          <a:fillRect/>
-                        </a:stretch>
-                      </pic:blipFill>
-                      <pic:spPr>
-                        <a:xfrm>
-                          <a:off x="0" y="0"/>
-                          <a:ext cx="100584" cy="100584"/>
-                        </a:xfrm>
-                        <a:prstGeom prst="rect">
-                          <a:avLst/>
-                        </a:prstGeom>
-                      </pic:spPr>
-                    </pic:pic>
-                  </a:graphicData>
-                </a:graphic>
-              </wp:inline>
-            </w:drawing>
-          </w:r>
-          <w:r>
-            <w:rPr>
-              <w:rFonts w:ascii="Arial Narrow" w:hAnsi="Arial Narrow"/>
-              <w:color w:val="000000" w:themeColor="text1"/>
-              <w:sz w:val="18"/>
-              <w:szCs w:val="18"/>
-            </w:rPr>
-            <w:t xml:space="preserve"> 1500630</w:t>
-          </w:r>
         </w:p>
         <w:p/>
         <w:p>
@@ -2990,7 +2742,27 @@
 </w:hdr>
 </file>
 
-<file path=word/header2.xml><?xml version="1.0" encoding="utf-8"?>
+<file path=word/header3.xml><?xml version="1.0" encoding="utf-8"?>
+<w:hdr xmlns:wpc="http://schemas.microsoft.com/office/word/2010/wordprocessingCanvas" xmlns:cx="http://schemas.microsoft.com/office/drawing/2014/chartex" xmlns:cx1="http://schemas.microsoft.com/office/drawing/2015/9/8/chartex" xmlns:cx2="http://schemas.microsoft.com/office/drawing/2015/10/21/chartex" xmlns:cx3="http://schemas.microsoft.com/office/drawing/2016/5/9/chartex" xmlns:cx4="http://schemas.microsoft.com/office/drawing/2016/5/10/chartex" xmlns:cx5="http://schemas.microsoft.com/office/drawing/2016/5/11/chartex" xmlns:cx6="http://schemas.microsoft.com/office/drawing/2016/5/12/chartex" xmlns:cx7="http://schemas.microsoft.com/office/drawing/2016/5/13/chartex" xmlns:cx8="http://schemas.microsoft.com/office/drawing/2016/5/14/chartex" xmlns:mc="http://schemas.openxmlformats.org/markup-compatibility/2006" xmlns:aink="http://schemas.microsoft.com/office/drawing/2016/ink" xmlns:am3d="http://schemas.microsoft.com/office/drawing/2017/model3d" xmlns:o="urn:schemas-microsoft-com:office:office" xmlns:oel="http://schemas.microsoft.com/office/2019/extlst" xmlns:r="http://schemas.openxmlformats.org/officeDocument/2006/relationships" xmlns:m="http://schemas.openxmlformats.org/officeDocument/2006/math" xmlns:v="urn:schemas-microsoft-com:vml" xmlns:wp14="http://schemas.microsoft.com/office/word/2010/wordprocessingDrawing" xmlns:wp="http://schemas.openxmlformats.org/drawingml/2006/wordprocessingDrawing" xmlns:w10="urn:schemas-microsoft-com:office:word" xmlns:w="http://schemas.openxmlformats.org/wordprocessingml/2006/main" xmlns:w14="http://schemas.microsoft.com/office/word/2010/wordml" xmlns:w15="http://schemas.microsoft.com/office/word/2012/wordml" xmlns:w16cex="http://schemas.microsoft.com/office/word/2018/wordml/cex" xmlns:w16cid="http://schemas.microsoft.com/office/word/2016/wordml/cid" xmlns:w16="http://schemas.microsoft.com/office/word/2018/wordml" xmlns:w16du="http://schemas.microsoft.com/office/word/2023/wordml/word16du" xmlns:w16sdtdh="http://schemas.microsoft.com/office/word/2020/wordml/sdtdatahash" xmlns:w16sdtfl="http://schemas.microsoft.com/office/word/2024/wordml/sdtformatlock" xmlns:w16se="http://schemas.microsoft.com/office/word/2015/wordml/symex" xmlns:wpg="http://schemas.microsoft.com/office/word/2010/wordprocessingGroup" xmlns:wpi="http://schemas.microsoft.com/office/word/2010/wordprocessingInk" xmlns:wne="http://schemas.microsoft.com/office/word/2006/wordml" xmlns:wps="http://schemas.microsoft.com/office/word/2010/wordprocessingShape" mc:Ignorable="w14 w15 w16se w16cid w16 w16cex w16sdtdh w16sdtfl w16du wp14">
+  <w:p>
+    <w:pPr>
+      <w:pStyle w:val="Header"/>
+    </w:pPr>
+  </w:p>
+</w:hdr>
+</file>
+
+<file path=word/header4.xml><?xml version="1.0" encoding="utf-8"?>
+<w:hdr xmlns:wpc="http://schemas.microsoft.com/office/word/2010/wordprocessingCanvas" xmlns:cx="http://schemas.microsoft.com/office/drawing/2014/chartex" xmlns:cx1="http://schemas.microsoft.com/office/drawing/2015/9/8/chartex" xmlns:cx2="http://schemas.microsoft.com/office/drawing/2015/10/21/chartex" xmlns:cx3="http://schemas.microsoft.com/office/drawing/2016/5/9/chartex" xmlns:cx4="http://schemas.microsoft.com/office/drawing/2016/5/10/chartex" xmlns:cx5="http://schemas.microsoft.com/office/drawing/2016/5/11/chartex" xmlns:cx6="http://schemas.microsoft.com/office/drawing/2016/5/12/chartex" xmlns:cx7="http://schemas.microsoft.com/office/drawing/2016/5/13/chartex" xmlns:cx8="http://schemas.microsoft.com/office/drawing/2016/5/14/chartex" xmlns:mc="http://schemas.openxmlformats.org/markup-compatibility/2006" xmlns:aink="http://schemas.microsoft.com/office/drawing/2016/ink" xmlns:am3d="http://schemas.microsoft.com/office/drawing/2017/model3d" xmlns:o="urn:schemas-microsoft-com:office:office" xmlns:oel="http://schemas.microsoft.com/office/2019/extlst" xmlns:r="http://schemas.openxmlformats.org/officeDocument/2006/relationships" xmlns:m="http://schemas.openxmlformats.org/officeDocument/2006/math" xmlns:v="urn:schemas-microsoft-com:vml" xmlns:wp14="http://schemas.microsoft.com/office/word/2010/wordprocessingDrawing" xmlns:wp="http://schemas.openxmlformats.org/drawingml/2006/wordprocessingDrawing" xmlns:w10="urn:schemas-microsoft-com:office:word" xmlns:w="http://schemas.openxmlformats.org/wordprocessingml/2006/main" xmlns:w14="http://schemas.microsoft.com/office/word/2010/wordml" xmlns:w15="http://schemas.microsoft.com/office/word/2012/wordml" xmlns:w16cex="http://schemas.microsoft.com/office/word/2018/wordml/cex" xmlns:w16cid="http://schemas.microsoft.com/office/word/2016/wordml/cid" xmlns:w16="http://schemas.microsoft.com/office/word/2018/wordml" xmlns:w16du="http://schemas.microsoft.com/office/word/2023/wordml/word16du" xmlns:w16sdtdh="http://schemas.microsoft.com/office/word/2020/wordml/sdtdatahash" xmlns:w16sdtfl="http://schemas.microsoft.com/office/word/2024/wordml/sdtformatlock" xmlns:w16se="http://schemas.microsoft.com/office/word/2015/wordml/symex" xmlns:wpg="http://schemas.microsoft.com/office/word/2010/wordprocessingGroup" xmlns:wpi="http://schemas.microsoft.com/office/word/2010/wordprocessingInk" xmlns:wne="http://schemas.microsoft.com/office/word/2006/wordml" xmlns:wps="http://schemas.microsoft.com/office/word/2010/wordprocessingShape" mc:Ignorable="w14 w15 w16se w16cid w16 w16cex w16sdtdh w16sdtfl w16du wp14">
+  <w:p>
+    <w:pPr>
+      <w:pStyle w:val="Header"/>
+    </w:pPr>
+  </w:p>
+</w:hdr>
+</file>
+
+<file path=word/header5.xml><?xml version="1.0" encoding="utf-8"?>
 <w:hdr xmlns:wpc="http://schemas.microsoft.com/office/word/2010/wordprocessingCanvas" xmlns:cx="http://schemas.microsoft.com/office/drawing/2014/chartex" xmlns:cx1="http://schemas.microsoft.com/office/drawing/2015/9/8/chartex" xmlns:cx2="http://schemas.microsoft.com/office/drawing/2015/10/21/chartex" xmlns:cx3="http://schemas.microsoft.com/office/drawing/2016/5/9/chartex" xmlns:cx4="http://schemas.microsoft.com/office/drawing/2016/5/10/chartex" xmlns:cx5="http://schemas.microsoft.com/office/drawing/2016/5/11/chartex" xmlns:cx6="http://schemas.microsoft.com/office/drawing/2016/5/12/chartex" xmlns:cx7="http://schemas.microsoft.com/office/drawing/2016/5/13/chartex" xmlns:cx8="http://schemas.microsoft.com/office/drawing/2016/5/14/chartex" xmlns:mc="http://schemas.openxmlformats.org/markup-compatibility/2006" xmlns:aink="http://schemas.microsoft.com/office/drawing/2016/ink" xmlns:am3d="http://schemas.microsoft.com/office/drawing/2017/model3d" xmlns:o="urn:schemas-microsoft-com:office:office" xmlns:oel="http://schemas.microsoft.com/office/2019/extlst" xmlns:r="http://schemas.openxmlformats.org/officeDocument/2006/relationships" xmlns:m="http://schemas.openxmlformats.org/officeDocument/2006/math" xmlns:v="urn:schemas-microsoft-com:vml" xmlns:wp14="http://schemas.microsoft.com/office/word/2010/wordprocessingDrawing" xmlns:wp="http://schemas.openxmlformats.org/drawingml/2006/wordprocessingDrawing" xmlns:w10="urn:schemas-microsoft-com:office:word" xmlns:w="http://schemas.openxmlformats.org/wordprocessingml/2006/main" xmlns:w14="http://schemas.microsoft.com/office/word/2010/wordml" xmlns:w15="http://schemas.microsoft.com/office/word/2012/wordml" xmlns:w16cex="http://schemas.microsoft.com/office/word/2018/wordml/cex" xmlns:w16cid="http://schemas.microsoft.com/office/word/2016/wordml/cid" xmlns:w16="http://schemas.microsoft.com/office/word/2018/wordml" xmlns:w16du="http://schemas.microsoft.com/office/word/2023/wordml/word16du" xmlns:w16sdtdh="http://schemas.microsoft.com/office/word/2020/wordml/sdtdatahash" xmlns:w16sdtfl="http://schemas.microsoft.com/office/word/2024/wordml/sdtformatlock" xmlns:w16se="http://schemas.microsoft.com/office/word/2015/wordml/symex" xmlns:wpg="http://schemas.microsoft.com/office/word/2010/wordprocessingGroup" xmlns:wpi="http://schemas.microsoft.com/office/word/2010/wordprocessingInk" xmlns:wne="http://schemas.microsoft.com/office/word/2006/wordml" xmlns:wps="http://schemas.microsoft.com/office/word/2010/wordprocessingShape" mc:Ignorable="w14 w15 w16se w16cid w16 w16cex w16sdtdh w16sdtfl w16du wp14">
   <w:p>
     <w:pPr>

</xml_diff>

<commit_message>
feat: implement shared reports, privacy controls, cost aggregation, and Pengaturan module
</commit_message>
<xml_diff>
--- a/backend/templates/Berkas Luar Kota - Laporan.docx
+++ b/backend/templates/Berkas Luar Kota - Laporan.docx
@@ -2,11 +2,279 @@
 <file path=word/document.xml><?xml version="1.0" encoding="utf-8"?>
 <w:document xmlns:wpc="http://schemas.microsoft.com/office/word/2010/wordprocessingCanvas" xmlns:cx="http://schemas.microsoft.com/office/drawing/2014/chartex" xmlns:cx1="http://schemas.microsoft.com/office/drawing/2015/9/8/chartex" xmlns:cx2="http://schemas.microsoft.com/office/drawing/2015/10/21/chartex" xmlns:cx3="http://schemas.microsoft.com/office/drawing/2016/5/9/chartex" xmlns:cx4="http://schemas.microsoft.com/office/drawing/2016/5/10/chartex" xmlns:cx5="http://schemas.microsoft.com/office/drawing/2016/5/11/chartex" xmlns:cx6="http://schemas.microsoft.com/office/drawing/2016/5/12/chartex" xmlns:cx7="http://schemas.microsoft.com/office/drawing/2016/5/13/chartex" xmlns:cx8="http://schemas.microsoft.com/office/drawing/2016/5/14/chartex" xmlns:mc="http://schemas.openxmlformats.org/markup-compatibility/2006" xmlns:aink="http://schemas.microsoft.com/office/drawing/2016/ink" xmlns:am3d="http://schemas.microsoft.com/office/drawing/2017/model3d" xmlns:o="urn:schemas-microsoft-com:office:office" xmlns:oel="http://schemas.microsoft.com/office/2019/extlst" xmlns:r="http://schemas.openxmlformats.org/officeDocument/2006/relationships" xmlns:m="http://schemas.openxmlformats.org/officeDocument/2006/math" xmlns:v="urn:schemas-microsoft-com:vml" xmlns:wp14="http://schemas.microsoft.com/office/word/2010/wordprocessingDrawing" xmlns:wp="http://schemas.openxmlformats.org/drawingml/2006/wordprocessingDrawing" xmlns:w10="urn:schemas-microsoft-com:office:word" xmlns:w="http://schemas.openxmlformats.org/wordprocessingml/2006/main" xmlns:w14="http://schemas.microsoft.com/office/word/2010/wordml" xmlns:w15="http://schemas.microsoft.com/office/word/2012/wordml" xmlns:w16cex="http://schemas.microsoft.com/office/word/2018/wordml/cex" xmlns:w16cid="http://schemas.microsoft.com/office/word/2016/wordml/cid" xmlns:w16="http://schemas.microsoft.com/office/word/2018/wordml" xmlns:w16du="http://schemas.microsoft.com/office/word/2023/wordml/word16du" xmlns:w16sdtdh="http://schemas.microsoft.com/office/word/2020/wordml/sdtdatahash" xmlns:w16sdtfl="http://schemas.microsoft.com/office/word/2024/wordml/sdtformatlock" xmlns:w16se="http://schemas.microsoft.com/office/word/2015/wordml/symex" xmlns:wpg="http://schemas.microsoft.com/office/word/2010/wordprocessingGroup" xmlns:wpi="http://schemas.microsoft.com/office/word/2010/wordprocessingInk" xmlns:wne="http://schemas.microsoft.com/office/word/2006/wordml" xmlns:wps="http://schemas.microsoft.com/office/word/2010/wordprocessingShape" mc:Ignorable="w14 w15 w16se w16cid w16 w16cex w16sdtdh w16sdtfl w16du wp14">
   <w:body>
-    <w:p>
-      <w:pPr>
-        <w:pStyle w:val="Header"/>
-      </w:pPr>
-    </w:p>
+    <w:tbl>
+      <w:tblPr>
+        <w:tblStyle w:val="TableGrid"/>
+        <w:tblW w:w="10641" w:type="dxa"/>
+        <w:tblLook w:val="04A0" w:firstRow="1" w:lastRow="0" w:firstColumn="1" w:lastColumn="0" w:noHBand="0" w:noVBand="1"/>
+      </w:tblPr>
+      <w:tblGrid>
+        <w:gridCol w:w="1430"/>
+        <w:gridCol w:w="9211"/>
+      </w:tblGrid>
+      <w:tr>
+        <w:trPr>
+          <w:trHeight w:val="1867"/>
+        </w:trPr>
+        <w:tc>
+          <w:tcPr>
+            <w:tcW w:w="1430" w:type="dxa"/>
+            <w:tcBorders>
+              <w:top w:val="nil"/>
+              <w:left w:val="nil"/>
+              <w:bottom w:val="nil"/>
+              <w:right w:val="nil"/>
+            </w:tcBorders>
+          </w:tcPr>
+          <w:p>
+            <w:pPr>
+              <w:pStyle w:val="Header"/>
+            </w:pPr>
+            <w:r>
+              <w:rPr>
+                <w:noProof/>
+              </w:rPr>
+              <w:drawing>
+                <wp:anchor distT="0" distB="0" distL="114300" distR="114300" simplePos="0" relativeHeight="251659264" behindDoc="1" locked="0" layoutInCell="1" allowOverlap="1" wp14:anchorId="55624262" wp14:editId="35998551">
+                  <wp:simplePos x="0" y="0"/>
+                  <wp:positionH relativeFrom="column">
+                    <wp:posOffset>689379</wp:posOffset>
+                  </wp:positionH>
+                  <wp:positionV relativeFrom="paragraph">
+                    <wp:posOffset>-11875</wp:posOffset>
+                  </wp:positionV>
+                  <wp:extent cx="78740" cy="1292225"/>
+                  <wp:effectExtent l="0" t="0" r="0" b="3175"/>
+                  <wp:wrapTight wrapText="bothSides">
+                    <wp:wrapPolygon edited="0">
+                      <wp:start x="0" y="0"/>
+                      <wp:lineTo x="0" y="21335"/>
+                      <wp:lineTo x="15677" y="21335"/>
+                      <wp:lineTo x="15677" y="0"/>
+                      <wp:lineTo x="0" y="0"/>
+                    </wp:wrapPolygon>
+                  </wp:wrapTight>
+                  <wp:docPr id="3" name="Picture 3"/>
+                  <wp:cNvGraphicFramePr>
+                    <a:graphicFrameLocks xmlns:a="http://schemas.openxmlformats.org/drawingml/2006/main" noChangeAspect="1"/>
+                  </wp:cNvGraphicFramePr>
+                  <a:graphic xmlns:a="http://schemas.openxmlformats.org/drawingml/2006/main">
+                    <a:graphicData uri="http://schemas.openxmlformats.org/drawingml/2006/picture">
+                      <pic:pic xmlns:pic="http://schemas.openxmlformats.org/drawingml/2006/picture">
+                        <pic:nvPicPr>
+                          <pic:cNvPr id="2" name="Picture 2"/>
+                          <pic:cNvPicPr>
+                            <a:picLocks noChangeAspect="1"/>
+                          </pic:cNvPicPr>
+                        </pic:nvPicPr>
+                        <pic:blipFill>
+                          <a:blip r:embed="rId7" cstate="print">
+                            <a:extLst>
+                              <a:ext uri="{28A0092B-C50C-407E-A947-70E740481C1C}">
+                                <a14:useLocalDpi xmlns:a14="http://schemas.microsoft.com/office/drawing/2010/main" val="0"/>
+                              </a:ext>
+                            </a:extLst>
+                          </a:blip>
+                          <a:stretch>
+                            <a:fillRect/>
+                          </a:stretch>
+                        </pic:blipFill>
+                        <pic:spPr>
+                          <a:xfrm>
+                            <a:off x="0" y="0"/>
+                            <a:ext cx="78740" cy="1292225"/>
+                          </a:xfrm>
+                          <a:prstGeom prst="rect">
+                            <a:avLst/>
+                          </a:prstGeom>
+                        </pic:spPr>
+                      </pic:pic>
+                    </a:graphicData>
+                  </a:graphic>
+                </wp:anchor>
+              </w:drawing>
+            </w:r>
+          </w:p>
+          <w:p>
+            <w:pPr>
+              <w:pStyle w:val="Header"/>
+            </w:pPr>
+            <w:r>
+              <w:rPr>
+                <w:noProof/>
+              </w:rPr>
+              <w:drawing>
+                <wp:anchor distT="0" distB="0" distL="114300" distR="114300" simplePos="0" relativeHeight="251660288" behindDoc="1" locked="0" layoutInCell="1" allowOverlap="1" wp14:anchorId="5D9C347D" wp14:editId="4C9684DD">
+                  <wp:simplePos x="0" y="0"/>
+                  <wp:positionH relativeFrom="column">
+                    <wp:posOffset>5847</wp:posOffset>
+                  </wp:positionH>
+                  <wp:positionV relativeFrom="paragraph">
+                    <wp:posOffset>100602</wp:posOffset>
+                  </wp:positionV>
+                  <wp:extent cx="648970" cy="819785"/>
+                  <wp:effectExtent l="0" t="0" r="0" b="0"/>
+                  <wp:wrapTight wrapText="bothSides">
+                    <wp:wrapPolygon edited="0">
+                      <wp:start x="8243" y="0"/>
+                      <wp:lineTo x="3804" y="3012"/>
+                      <wp:lineTo x="0" y="7027"/>
+                      <wp:lineTo x="0" y="10039"/>
+                      <wp:lineTo x="8877" y="16564"/>
+                      <wp:lineTo x="2536" y="17568"/>
+                      <wp:lineTo x="0" y="18572"/>
+                      <wp:lineTo x="0" y="21081"/>
+                      <wp:lineTo x="20924" y="21081"/>
+                      <wp:lineTo x="20924" y="19074"/>
+                      <wp:lineTo x="19656" y="18070"/>
+                      <wp:lineTo x="12047" y="16564"/>
+                      <wp:lineTo x="20924" y="9537"/>
+                      <wp:lineTo x="20924" y="7027"/>
+                      <wp:lineTo x="16485" y="3012"/>
+                      <wp:lineTo x="12681" y="0"/>
+                      <wp:lineTo x="8243" y="0"/>
+                    </wp:wrapPolygon>
+                  </wp:wrapTight>
+                  <wp:docPr id="2" name="Picture 2"/>
+                  <wp:cNvGraphicFramePr>
+                    <a:graphicFrameLocks xmlns:a="http://schemas.openxmlformats.org/drawingml/2006/main" noChangeAspect="1"/>
+                  </wp:cNvGraphicFramePr>
+                  <a:graphic xmlns:a="http://schemas.openxmlformats.org/drawingml/2006/main">
+                    <a:graphicData uri="http://schemas.openxmlformats.org/drawingml/2006/picture">
+                      <pic:pic xmlns:pic="http://schemas.openxmlformats.org/drawingml/2006/picture">
+                        <pic:nvPicPr>
+                          <pic:cNvPr id="1" name="Picture 1"/>
+                          <pic:cNvPicPr>
+                            <a:picLocks noChangeAspect="1"/>
+                          </pic:cNvPicPr>
+                        </pic:nvPicPr>
+                        <pic:blipFill>
+                          <a:blip r:embed="rId8" cstate="print">
+                            <a:extLst>
+                              <a:ext uri="{28A0092B-C50C-407E-A947-70E740481C1C}">
+                                <a14:useLocalDpi xmlns:a14="http://schemas.microsoft.com/office/drawing/2010/main" val="0"/>
+                              </a:ext>
+                            </a:extLst>
+                          </a:blip>
+                          <a:stretch>
+                            <a:fillRect/>
+                          </a:stretch>
+                        </pic:blipFill>
+                        <pic:spPr>
+                          <a:xfrm>
+                            <a:off x="0" y="0"/>
+                            <a:ext cx="648970" cy="819785"/>
+                          </a:xfrm>
+                          <a:prstGeom prst="rect">
+                            <a:avLst/>
+                          </a:prstGeom>
+                        </pic:spPr>
+                      </pic:pic>
+                    </a:graphicData>
+                  </a:graphic>
+                </wp:anchor>
+              </w:drawing>
+            </w:r>
+          </w:p>
+          <w:p>
+            <w:pPr>
+              <w:pStyle w:val="Header"/>
+            </w:pPr>
+          </w:p>
+        </w:tc>
+        <w:tc>
+          <w:tcPr>
+            <w:tcW w:w="9211" w:type="dxa"/>
+            <w:tcBorders>
+              <w:top w:val="nil"/>
+              <w:left w:val="nil"/>
+              <w:bottom w:val="nil"/>
+              <w:right w:val="nil"/>
+            </w:tcBorders>
+          </w:tcPr>
+          <w:p>
+            <w:pPr>
+              <w:rPr>
+                <w:rFonts w:ascii="Arial Narrow" w:hAnsi="Arial Narrow"/>
+                <w:szCs w:val="24"/>
+              </w:rPr>
+            </w:pPr>
+          </w:p>
+          <w:p>
+            <w:pPr>
+              <w:rPr>
+                <w:rFonts w:ascii="Arial Narrow" w:hAnsi="Arial Narrow"/>
+                <w:sz w:val="28"/>
+                <w:szCs w:val="28"/>
+              </w:rPr>
+            </w:pPr>
+          </w:p>
+          <w:p>
+            <w:pPr>
+              <w:rPr>
+                <w:rFonts w:ascii="Arial Narrow" w:hAnsi="Arial Narrow"/>
+                <w:sz w:val="28"/>
+                <w:szCs w:val="28"/>
+              </w:rPr>
+            </w:pPr>
+            <w:r>
+              <w:rPr>
+                <w:rFonts w:ascii="Arial Narrow" w:hAnsi="Arial Narrow"/>
+                <w:sz w:val="28"/>
+                <w:szCs w:val="28"/>
+              </w:rPr>
+              <w:t>KEMENTERIAN KETENAGAKERJAAN REPUBLIK INDONESIA</w:t>
+            </w:r>
+          </w:p>
+          <w:p>
+            <w:pPr>
+              <w:rPr>
+                <w:rFonts w:ascii="Arial Narrow" w:hAnsi="Arial Narrow"/>
+                <w:color w:val="284A61"/>
+                <w:sz w:val="32"/>
+                <w:szCs w:val="32"/>
+              </w:rPr>
+            </w:pPr>
+            <w:r>
+              <w:rPr>
+                <w:rFonts w:ascii="Arial Narrow" w:hAnsi="Arial Narrow"/>
+                <w:color w:val="284A61"/>
+                <w:sz w:val="32"/>
+                <w:szCs w:val="32"/>
+              </w:rPr>
+              <w:t>SEKRETARIAT JENDERAL</w:t>
+            </w:r>
+          </w:p>
+          <w:p>
+            <w:pPr>
+              <w:rPr>
+                <w:rFonts w:ascii="Arial Narrow" w:hAnsi="Arial Narrow"/>
+                <w:b/>
+                <w:color w:val="284A61"/>
+                <w:sz w:val="32"/>
+                <w:szCs w:val="32"/>
+              </w:rPr>
+            </w:pPr>
+          </w:p>
+          <w:p>
+            <w:pPr>
+              <w:rPr>
+                <w:rFonts w:ascii="Arial Narrow" w:hAnsi="Arial Narrow"/>
+                <w:color w:val="000000" w:themeColor="text1"/>
+                <w:sz w:val="18"/>
+                <w:szCs w:val="18"/>
+              </w:rPr>
+            </w:pPr>
+          </w:p>
+          <w:p/>
+          <w:p>
+            <w:pPr>
+              <w:pStyle w:val="Header"/>
+            </w:pPr>
+          </w:p>
+        </w:tc>
+      </w:tr>
+    </w:tbl>
     <w:p>
       <w:pPr>
         <w:pStyle w:val="Heading1"/>
@@ -1018,12 +1286,6 @@
           <w:lang w:val="en-US"/>
         </w:rPr>
         <w:sectPr>
-          <w:headerReference w:type="even" r:id="rId7"/>
-          <w:headerReference w:type="default" r:id="rId8"/>
-          <w:footerReference w:type="even" r:id="rId9"/>
-          <w:footerReference w:type="default" r:id="rId10"/>
-          <w:headerReference w:type="first" r:id="rId11"/>
-          <w:footerReference w:type="first" r:id="rId12"/>
           <w:type w:val="continuous"/>
           <w:pgSz w:w="12240" w:h="20160"/>
           <w:pgMar w:top="1200" w:right="1080" w:bottom="280" w:left="1080" w:header="340" w:footer="720" w:gutter="0"/>
@@ -1307,7 +1569,7 @@
                 <w:spacing w:val="-2"/>
                 <w:lang w:val="en-US"/>
               </w:rPr>
-              <w:t>{{no_urut_satu}}</w:t>
+              <w:t>{{no_urut}}</w:t>
             </w:r>
           </w:p>
         </w:tc>
@@ -1375,7 +1637,7 @@
                 <w:spacing w:val="-2"/>
                 <w:lang w:val="en-US"/>
               </w:rPr>
-              <w:t>{{no_urut_ttd_satu}}</w:t>
+              <w:t>{{no_urut}}</w:t>
             </w:r>
             <w:r>
               <w:rPr>
@@ -1414,7 +1676,7 @@
                 <w:spacing w:val="-2"/>
                 <w:lang w:val="en-US"/>
               </w:rPr>
-              <w:t>{{no_urut_dua}}</w:t>
+              <w:t>{{no_urut}}</w:t>
             </w:r>
           </w:p>
         </w:tc>
@@ -1492,7 +1754,21 @@
                 <w:spacing w:val="-2"/>
                 <w:lang w:val="en-US"/>
               </w:rPr>
-              <w:t>{{no_urut_ttd_dua}}</w:t>
+              <w:t>{{no</w:t>
+            </w:r>
+            <w:r>
+              <w:rPr>
+                <w:spacing w:val="-2"/>
+                <w:lang w:val="en-US"/>
+              </w:rPr>
+              <w:t>_urut</w:t>
+            </w:r>
+            <w:r>
+              <w:rPr>
+                <w:spacing w:val="-2"/>
+                <w:lang w:val="en-US"/>
+              </w:rPr>
+              <w:t>}}</w:t>
             </w:r>
             <w:r>
               <w:rPr>
@@ -1531,7 +1807,7 @@
                 <w:spacing w:val="-2"/>
                 <w:lang w:val="en-US"/>
               </w:rPr>
-              <w:t>{{no_urut_tiga}}</w:t>
+              <w:t>{{no_urut}}</w:t>
             </w:r>
           </w:p>
         </w:tc>
@@ -1610,7 +1886,7 @@
                 <w:spacing w:val="-2"/>
                 <w:lang w:val="en-US"/>
               </w:rPr>
-              <w:t>{{no_urut_ttd_tiga}}</w:t>
+              <w:t>{{no_urut}}</w:t>
             </w:r>
             <w:r>
               <w:rPr>
@@ -1649,7 +1925,7 @@
                 <w:spacing w:val="-2"/>
                 <w:lang w:val="en-US"/>
               </w:rPr>
-              <w:t>{{no_urut_empat}}</w:t>
+              <w:t>{{no_urut}}</w:t>
             </w:r>
           </w:p>
         </w:tc>
@@ -1730,16 +2006,13 @@
                 <w:spacing w:val="-2"/>
                 <w:lang w:val="en-US"/>
               </w:rPr>
-              <w:t>{{no_urut_ttd_empat}}</w:t>
+              <w:t>{{no_urut}}</w:t>
             </w:r>
             <w:r>
               <w:rPr>
                 <w:spacing w:val="-2"/>
               </w:rPr>
               <w:t>……………………..</w:t>
-            </w:r>
-            <w:r>
-              <w:tab/>
             </w:r>
           </w:p>
         </w:tc>
@@ -1772,7 +2045,7 @@
                 <w:spacing w:val="-2"/>
                 <w:lang w:val="en-US"/>
               </w:rPr>
-              <w:t>{{no_urut_lima}}</w:t>
+              <w:t>{{no_urut}}</w:t>
             </w:r>
           </w:p>
         </w:tc>
@@ -1853,16 +2126,13 @@
                 <w:spacing w:val="-2"/>
                 <w:lang w:val="en-US"/>
               </w:rPr>
-              <w:t>{{no_urut_ttd_lima}}</w:t>
+              <w:t>{{no_urut}}</w:t>
             </w:r>
             <w:r>
               <w:rPr>
                 <w:spacing w:val="-2"/>
               </w:rPr>
               <w:t>……………………..</w:t>
-            </w:r>
-            <w:r>
-              <w:tab/>
             </w:r>
           </w:p>
         </w:tc>
@@ -1895,7 +2165,7 @@
                 <w:spacing w:val="-2"/>
                 <w:lang w:val="en-US"/>
               </w:rPr>
-              <w:t>{{no_urut_enam}}</w:t>
+              <w:t>{{no_urut}}</w:t>
             </w:r>
           </w:p>
         </w:tc>
@@ -1977,16 +2247,13 @@
                 <w:spacing w:val="-2"/>
                 <w:lang w:val="en-US"/>
               </w:rPr>
-              <w:t>{{no_urut_ttd_enam}}</w:t>
+              <w:t>{{no_urut}}</w:t>
             </w:r>
             <w:r>
               <w:rPr>
                 <w:spacing w:val="-2"/>
               </w:rPr>
               <w:t>……………………..</w:t>
-            </w:r>
-            <w:r>
-              <w:tab/>
             </w:r>
           </w:p>
         </w:tc>
@@ -2023,7 +2290,7 @@
                 <w:spacing w:val="-2"/>
                 <w:lang w:val="en-US"/>
               </w:rPr>
-              <w:t>{{no_urut_tujuh}}</w:t>
+              <w:t>{{no_urut}}</w:t>
             </w:r>
           </w:p>
         </w:tc>
@@ -2118,7 +2385,7 @@
                 <w:spacing w:val="-2"/>
                 <w:lang w:val="en-US"/>
               </w:rPr>
-              <w:t>{{no_urut_ttd_tujuh}}</w:t>
+              <w:t>{{no_urut}}</w:t>
             </w:r>
             <w:r>
               <w:rPr>
@@ -2134,7 +2401,7 @@
       <w:pPr>
         <w:pStyle w:val="TableParagraph"/>
         <w:sectPr>
-          <w:headerReference w:type="first" r:id="rId13"/>
+          <w:headerReference w:type="first" r:id="rId9"/>
           <w:pgSz w:w="12240" w:h="20160"/>
           <w:pgMar w:top="1420" w:right="1080" w:bottom="280" w:left="1080" w:header="720" w:footer="720" w:gutter="0"/>
           <w:cols w:space="720"/>
@@ -2221,27 +2488,19 @@
         <w:tblStyle w:val="TableGrid"/>
         <w:tblW w:w="0" w:type="auto"/>
         <w:jc w:val="center"/>
-        <w:tblBorders>
-          <w:top w:val="none" w:sz="0" w:space="0" w:color="auto"/>
-          <w:left w:val="none" w:sz="0" w:space="0" w:color="auto"/>
-          <w:bottom w:val="none" w:sz="0" w:space="0" w:color="auto"/>
-          <w:right w:val="none" w:sz="0" w:space="0" w:color="auto"/>
-          <w:insideH w:val="none" w:sz="0" w:space="0" w:color="auto"/>
-          <w:insideV w:val="none" w:sz="0" w:space="0" w:color="auto"/>
-        </w:tblBorders>
         <w:tblLook w:val="04A0" w:firstRow="1" w:lastRow="0" w:firstColumn="1" w:lastColumn="0" w:noHBand="0" w:noVBand="1"/>
       </w:tblPr>
       <w:tblGrid>
-        <w:gridCol w:w="5669"/>
+        <w:gridCol w:w="7860"/>
       </w:tblGrid>
       <w:tr>
         <w:trPr>
-          <w:trHeight w:val="2268"/>
+          <w:trHeight w:val="3118"/>
           <w:jc w:val="center"/>
         </w:trPr>
         <w:tc>
           <w:tcPr>
-            <w:tcW w:w="5669" w:type="dxa"/>
+            <w:tcW w:w="7860" w:type="dxa"/>
             <w:vAlign w:val="center"/>
           </w:tcPr>
           <w:p>
@@ -2264,12 +2523,12 @@
       </w:tr>
       <w:tr>
         <w:trPr>
-          <w:trHeight w:val="2268"/>
+          <w:trHeight w:val="3241"/>
           <w:jc w:val="center"/>
         </w:trPr>
         <w:tc>
           <w:tcPr>
-            <w:tcW w:w="5669" w:type="dxa"/>
+            <w:tcW w:w="7860" w:type="dxa"/>
             <w:vAlign w:val="center"/>
           </w:tcPr>
           <w:p>
@@ -2292,12 +2551,12 @@
       </w:tr>
       <w:tr>
         <w:trPr>
-          <w:trHeight w:val="2268"/>
+          <w:trHeight w:val="2968"/>
           <w:jc w:val="center"/>
         </w:trPr>
         <w:tc>
           <w:tcPr>
-            <w:tcW w:w="5669" w:type="dxa"/>
+            <w:tcW w:w="7860" w:type="dxa"/>
             <w:vAlign w:val="center"/>
           </w:tcPr>
           <w:p>
@@ -2320,12 +2579,12 @@
       </w:tr>
       <w:tr>
         <w:trPr>
-          <w:trHeight w:val="2268"/>
+          <w:trHeight w:val="2826"/>
           <w:jc w:val="center"/>
         </w:trPr>
         <w:tc>
           <w:tcPr>
-            <w:tcW w:w="5669" w:type="dxa"/>
+            <w:tcW w:w="7860" w:type="dxa"/>
             <w:vAlign w:val="center"/>
           </w:tcPr>
           <w:p>
@@ -2372,7 +2631,7 @@
       </w:pPr>
     </w:p>
     <w:sectPr>
-      <w:headerReference w:type="default" r:id="rId14"/>
+      <w:headerReference w:type="default" r:id="rId10"/>
       <w:pgSz w:w="12240" w:h="20160"/>
       <w:pgMar w:top="1480" w:right="1080" w:bottom="280" w:left="1080" w:header="1245" w:footer="0" w:gutter="0"/>
       <w:cols w:space="720"/>
@@ -2398,36 +2657,6 @@
     </w:p>
   </w:endnote>
 </w:endnotes>
-</file>
-
-<file path=word/footer1.xml><?xml version="1.0" encoding="utf-8"?>
-<w:ftr xmlns:wpc="http://schemas.microsoft.com/office/word/2010/wordprocessingCanvas" xmlns:cx="http://schemas.microsoft.com/office/drawing/2014/chartex" xmlns:cx1="http://schemas.microsoft.com/office/drawing/2015/9/8/chartex" xmlns:cx2="http://schemas.microsoft.com/office/drawing/2015/10/21/chartex" xmlns:cx3="http://schemas.microsoft.com/office/drawing/2016/5/9/chartex" xmlns:cx4="http://schemas.microsoft.com/office/drawing/2016/5/10/chartex" xmlns:cx5="http://schemas.microsoft.com/office/drawing/2016/5/11/chartex" xmlns:cx6="http://schemas.microsoft.com/office/drawing/2016/5/12/chartex" xmlns:cx7="http://schemas.microsoft.com/office/drawing/2016/5/13/chartex" xmlns:cx8="http://schemas.microsoft.com/office/drawing/2016/5/14/chartex" xmlns:mc="http://schemas.openxmlformats.org/markup-compatibility/2006" xmlns:aink="http://schemas.microsoft.com/office/drawing/2016/ink" xmlns:am3d="http://schemas.microsoft.com/office/drawing/2017/model3d" xmlns:o="urn:schemas-microsoft-com:office:office" xmlns:oel="http://schemas.microsoft.com/office/2019/extlst" xmlns:r="http://schemas.openxmlformats.org/officeDocument/2006/relationships" xmlns:m="http://schemas.openxmlformats.org/officeDocument/2006/math" xmlns:v="urn:schemas-microsoft-com:vml" xmlns:wp14="http://schemas.microsoft.com/office/word/2010/wordprocessingDrawing" xmlns:wp="http://schemas.openxmlformats.org/drawingml/2006/wordprocessingDrawing" xmlns:w10="urn:schemas-microsoft-com:office:word" xmlns:w="http://schemas.openxmlformats.org/wordprocessingml/2006/main" xmlns:w14="http://schemas.microsoft.com/office/word/2010/wordml" xmlns:w15="http://schemas.microsoft.com/office/word/2012/wordml" xmlns:w16cex="http://schemas.microsoft.com/office/word/2018/wordml/cex" xmlns:w16cid="http://schemas.microsoft.com/office/word/2016/wordml/cid" xmlns:w16="http://schemas.microsoft.com/office/word/2018/wordml" xmlns:w16du="http://schemas.microsoft.com/office/word/2023/wordml/word16du" xmlns:w16sdtdh="http://schemas.microsoft.com/office/word/2020/wordml/sdtdatahash" xmlns:w16sdtfl="http://schemas.microsoft.com/office/word/2024/wordml/sdtformatlock" xmlns:w16se="http://schemas.microsoft.com/office/word/2015/wordml/symex" xmlns:wpg="http://schemas.microsoft.com/office/word/2010/wordprocessingGroup" xmlns:wpi="http://schemas.microsoft.com/office/word/2010/wordprocessingInk" xmlns:wne="http://schemas.microsoft.com/office/word/2006/wordml" xmlns:wps="http://schemas.microsoft.com/office/word/2010/wordprocessingShape" mc:Ignorable="w14 w15 w16se w16cid w16 w16cex w16sdtdh w16sdtfl w16du wp14">
-  <w:p>
-    <w:pPr>
-      <w:pStyle w:val="Footer"/>
-    </w:pPr>
-  </w:p>
-</w:ftr>
-</file>
-
-<file path=word/footer2.xml><?xml version="1.0" encoding="utf-8"?>
-<w:ftr xmlns:wpc="http://schemas.microsoft.com/office/word/2010/wordprocessingCanvas" xmlns:cx="http://schemas.microsoft.com/office/drawing/2014/chartex" xmlns:cx1="http://schemas.microsoft.com/office/drawing/2015/9/8/chartex" xmlns:cx2="http://schemas.microsoft.com/office/drawing/2015/10/21/chartex" xmlns:cx3="http://schemas.microsoft.com/office/drawing/2016/5/9/chartex" xmlns:cx4="http://schemas.microsoft.com/office/drawing/2016/5/10/chartex" xmlns:cx5="http://schemas.microsoft.com/office/drawing/2016/5/11/chartex" xmlns:cx6="http://schemas.microsoft.com/office/drawing/2016/5/12/chartex" xmlns:cx7="http://schemas.microsoft.com/office/drawing/2016/5/13/chartex" xmlns:cx8="http://schemas.microsoft.com/office/drawing/2016/5/14/chartex" xmlns:mc="http://schemas.openxmlformats.org/markup-compatibility/2006" xmlns:aink="http://schemas.microsoft.com/office/drawing/2016/ink" xmlns:am3d="http://schemas.microsoft.com/office/drawing/2017/model3d" xmlns:o="urn:schemas-microsoft-com:office:office" xmlns:oel="http://schemas.microsoft.com/office/2019/extlst" xmlns:r="http://schemas.openxmlformats.org/officeDocument/2006/relationships" xmlns:m="http://schemas.openxmlformats.org/officeDocument/2006/math" xmlns:v="urn:schemas-microsoft-com:vml" xmlns:wp14="http://schemas.microsoft.com/office/word/2010/wordprocessingDrawing" xmlns:wp="http://schemas.openxmlformats.org/drawingml/2006/wordprocessingDrawing" xmlns:w10="urn:schemas-microsoft-com:office:word" xmlns:w="http://schemas.openxmlformats.org/wordprocessingml/2006/main" xmlns:w14="http://schemas.microsoft.com/office/word/2010/wordml" xmlns:w15="http://schemas.microsoft.com/office/word/2012/wordml" xmlns:w16cex="http://schemas.microsoft.com/office/word/2018/wordml/cex" xmlns:w16cid="http://schemas.microsoft.com/office/word/2016/wordml/cid" xmlns:w16="http://schemas.microsoft.com/office/word/2018/wordml" xmlns:w16du="http://schemas.microsoft.com/office/word/2023/wordml/word16du" xmlns:w16sdtdh="http://schemas.microsoft.com/office/word/2020/wordml/sdtdatahash" xmlns:w16sdtfl="http://schemas.microsoft.com/office/word/2024/wordml/sdtformatlock" xmlns:w16se="http://schemas.microsoft.com/office/word/2015/wordml/symex" xmlns:wpg="http://schemas.microsoft.com/office/word/2010/wordprocessingGroup" xmlns:wpi="http://schemas.microsoft.com/office/word/2010/wordprocessingInk" xmlns:wne="http://schemas.microsoft.com/office/word/2006/wordml" xmlns:wps="http://schemas.microsoft.com/office/word/2010/wordprocessingShape" mc:Ignorable="w14 w15 w16se w16cid w16 w16cex w16sdtdh w16sdtfl w16du wp14">
-  <w:p>
-    <w:pPr>
-      <w:pStyle w:val="Footer"/>
-    </w:pPr>
-  </w:p>
-</w:ftr>
-</file>
-
-<file path=word/footer3.xml><?xml version="1.0" encoding="utf-8"?>
-<w:ftr xmlns:wpc="http://schemas.microsoft.com/office/word/2010/wordprocessingCanvas" xmlns:cx="http://schemas.microsoft.com/office/drawing/2014/chartex" xmlns:cx1="http://schemas.microsoft.com/office/drawing/2015/9/8/chartex" xmlns:cx2="http://schemas.microsoft.com/office/drawing/2015/10/21/chartex" xmlns:cx3="http://schemas.microsoft.com/office/drawing/2016/5/9/chartex" xmlns:cx4="http://schemas.microsoft.com/office/drawing/2016/5/10/chartex" xmlns:cx5="http://schemas.microsoft.com/office/drawing/2016/5/11/chartex" xmlns:cx6="http://schemas.microsoft.com/office/drawing/2016/5/12/chartex" xmlns:cx7="http://schemas.microsoft.com/office/drawing/2016/5/13/chartex" xmlns:cx8="http://schemas.microsoft.com/office/drawing/2016/5/14/chartex" xmlns:mc="http://schemas.openxmlformats.org/markup-compatibility/2006" xmlns:aink="http://schemas.microsoft.com/office/drawing/2016/ink" xmlns:am3d="http://schemas.microsoft.com/office/drawing/2017/model3d" xmlns:o="urn:schemas-microsoft-com:office:office" xmlns:oel="http://schemas.microsoft.com/office/2019/extlst" xmlns:r="http://schemas.openxmlformats.org/officeDocument/2006/relationships" xmlns:m="http://schemas.openxmlformats.org/officeDocument/2006/math" xmlns:v="urn:schemas-microsoft-com:vml" xmlns:wp14="http://schemas.microsoft.com/office/word/2010/wordprocessingDrawing" xmlns:wp="http://schemas.openxmlformats.org/drawingml/2006/wordprocessingDrawing" xmlns:w10="urn:schemas-microsoft-com:office:word" xmlns:w="http://schemas.openxmlformats.org/wordprocessingml/2006/main" xmlns:w14="http://schemas.microsoft.com/office/word/2010/wordml" xmlns:w15="http://schemas.microsoft.com/office/word/2012/wordml" xmlns:w16cex="http://schemas.microsoft.com/office/word/2018/wordml/cex" xmlns:w16cid="http://schemas.microsoft.com/office/word/2016/wordml/cid" xmlns:w16="http://schemas.microsoft.com/office/word/2018/wordml" xmlns:w16du="http://schemas.microsoft.com/office/word/2023/wordml/word16du" xmlns:w16sdtdh="http://schemas.microsoft.com/office/word/2020/wordml/sdtdatahash" xmlns:w16sdtfl="http://schemas.microsoft.com/office/word/2024/wordml/sdtformatlock" xmlns:w16se="http://schemas.microsoft.com/office/word/2015/wordml/symex" xmlns:wpg="http://schemas.microsoft.com/office/word/2010/wordprocessingGroup" xmlns:wpi="http://schemas.microsoft.com/office/word/2010/wordprocessingInk" xmlns:wne="http://schemas.microsoft.com/office/word/2006/wordml" xmlns:wps="http://schemas.microsoft.com/office/word/2010/wordprocessingShape" mc:Ignorable="w14 w15 w16se w16cid w16 w16cex w16sdtdh w16sdtfl w16du wp14">
-  <w:p>
-    <w:pPr>
-      <w:pStyle w:val="Footer"/>
-    </w:pPr>
-  </w:p>
-</w:ftr>
 </file>
 
 <file path=word/footnotes.xml><?xml version="1.0" encoding="utf-8"?>
@@ -2460,309 +2689,6 @@
 </file>
 
 <file path=word/header2.xml><?xml version="1.0" encoding="utf-8"?>
-<w:hdr xmlns:wpc="http://schemas.microsoft.com/office/word/2010/wordprocessingCanvas" xmlns:cx="http://schemas.microsoft.com/office/drawing/2014/chartex" xmlns:cx1="http://schemas.microsoft.com/office/drawing/2015/9/8/chartex" xmlns:cx2="http://schemas.microsoft.com/office/drawing/2015/10/21/chartex" xmlns:cx3="http://schemas.microsoft.com/office/drawing/2016/5/9/chartex" xmlns:cx4="http://schemas.microsoft.com/office/drawing/2016/5/10/chartex" xmlns:cx5="http://schemas.microsoft.com/office/drawing/2016/5/11/chartex" xmlns:cx6="http://schemas.microsoft.com/office/drawing/2016/5/12/chartex" xmlns:cx7="http://schemas.microsoft.com/office/drawing/2016/5/13/chartex" xmlns:cx8="http://schemas.microsoft.com/office/drawing/2016/5/14/chartex" xmlns:mc="http://schemas.openxmlformats.org/markup-compatibility/2006" xmlns:aink="http://schemas.microsoft.com/office/drawing/2016/ink" xmlns:am3d="http://schemas.microsoft.com/office/drawing/2017/model3d" xmlns:o="urn:schemas-microsoft-com:office:office" xmlns:oel="http://schemas.microsoft.com/office/2019/extlst" xmlns:r="http://schemas.openxmlformats.org/officeDocument/2006/relationships" xmlns:m="http://schemas.openxmlformats.org/officeDocument/2006/math" xmlns:v="urn:schemas-microsoft-com:vml" xmlns:wp14="http://schemas.microsoft.com/office/word/2010/wordprocessingDrawing" xmlns:wp="http://schemas.openxmlformats.org/drawingml/2006/wordprocessingDrawing" xmlns:w10="urn:schemas-microsoft-com:office:word" xmlns:w="http://schemas.openxmlformats.org/wordprocessingml/2006/main" xmlns:w14="http://schemas.microsoft.com/office/word/2010/wordml" xmlns:w15="http://schemas.microsoft.com/office/word/2012/wordml" xmlns:w16cex="http://schemas.microsoft.com/office/word/2018/wordml/cex" xmlns:w16cid="http://schemas.microsoft.com/office/word/2016/wordml/cid" xmlns:w16="http://schemas.microsoft.com/office/word/2018/wordml" xmlns:w16du="http://schemas.microsoft.com/office/word/2023/wordml/word16du" xmlns:w16sdtdh="http://schemas.microsoft.com/office/word/2020/wordml/sdtdatahash" xmlns:w16sdtfl="http://schemas.microsoft.com/office/word/2024/wordml/sdtformatlock" xmlns:w16se="http://schemas.microsoft.com/office/word/2015/wordml/symex" xmlns:wpg="http://schemas.microsoft.com/office/word/2010/wordprocessingGroup" xmlns:wpi="http://schemas.microsoft.com/office/word/2010/wordprocessingInk" xmlns:wne="http://schemas.microsoft.com/office/word/2006/wordml" xmlns:wps="http://schemas.microsoft.com/office/word/2010/wordprocessingShape" mc:Ignorable="w14 w15 w16se w16cid w16 w16cex w16sdtdh w16sdtfl w16du wp14">
-  <w:tbl>
-    <w:tblPr>
-      <w:tblStyle w:val="TableGrid"/>
-      <w:tblW w:w="10641" w:type="dxa"/>
-      <w:tblLook w:val="04A0" w:firstRow="1" w:lastRow="0" w:firstColumn="1" w:lastColumn="0" w:noHBand="0" w:noVBand="1"/>
-    </w:tblPr>
-    <w:tblGrid>
-      <w:gridCol w:w="1430"/>
-      <w:gridCol w:w="9211"/>
-    </w:tblGrid>
-    <w:tr>
-      <w:trPr>
-        <w:trHeight w:val="1867"/>
-      </w:trPr>
-      <w:tc>
-        <w:tcPr>
-          <w:tcW w:w="1430" w:type="dxa"/>
-          <w:tcBorders>
-            <w:top w:val="nil"/>
-            <w:left w:val="nil"/>
-            <w:bottom w:val="nil"/>
-            <w:right w:val="nil"/>
-          </w:tcBorders>
-        </w:tcPr>
-        <w:p>
-          <w:pPr>
-            <w:pStyle w:val="Header"/>
-          </w:pPr>
-          <w:r>
-            <w:rPr>
-              <w:noProof/>
-            </w:rPr>
-            <w:drawing>
-              <wp:anchor distT="0" distB="0" distL="114300" distR="114300" simplePos="0" relativeHeight="251656192" behindDoc="1" locked="0" layoutInCell="1" allowOverlap="1" wp14:anchorId="76776B0B" wp14:editId="5E5288A5">
-                <wp:simplePos x="0" y="0"/>
-                <wp:positionH relativeFrom="column">
-                  <wp:posOffset>689379</wp:posOffset>
-                </wp:positionH>
-                <wp:positionV relativeFrom="paragraph">
-                  <wp:posOffset>-11875</wp:posOffset>
-                </wp:positionV>
-                <wp:extent cx="78740" cy="1292225"/>
-                <wp:effectExtent l="0" t="0" r="0" b="3175"/>
-                <wp:wrapTight wrapText="bothSides">
-                  <wp:wrapPolygon edited="0">
-                    <wp:start x="0" y="0"/>
-                    <wp:lineTo x="0" y="21335"/>
-                    <wp:lineTo x="15677" y="21335"/>
-                    <wp:lineTo x="15677" y="0"/>
-                    <wp:lineTo x="0" y="0"/>
-                  </wp:wrapPolygon>
-                </wp:wrapTight>
-                <wp:docPr id="3" name="Picture 3"/>
-                <wp:cNvGraphicFramePr>
-                  <a:graphicFrameLocks xmlns:a="http://schemas.openxmlformats.org/drawingml/2006/main" noChangeAspect="1"/>
-                </wp:cNvGraphicFramePr>
-                <a:graphic xmlns:a="http://schemas.openxmlformats.org/drawingml/2006/main">
-                  <a:graphicData uri="http://schemas.openxmlformats.org/drawingml/2006/picture">
-                    <pic:pic xmlns:pic="http://schemas.openxmlformats.org/drawingml/2006/picture">
-                      <pic:nvPicPr>
-                        <pic:cNvPr id="2" name="Picture 2"/>
-                        <pic:cNvPicPr>
-                          <a:picLocks noChangeAspect="1"/>
-                        </pic:cNvPicPr>
-                      </pic:nvPicPr>
-                      <pic:blipFill>
-                        <a:blip r:embed="rId1" cstate="print">
-                          <a:extLst>
-                            <a:ext uri="{28A0092B-C50C-407E-A947-70E740481C1C}">
-                              <a14:useLocalDpi xmlns:a14="http://schemas.microsoft.com/office/drawing/2010/main" val="0"/>
-                            </a:ext>
-                          </a:extLst>
-                        </a:blip>
-                        <a:stretch>
-                          <a:fillRect/>
-                        </a:stretch>
-                      </pic:blipFill>
-                      <pic:spPr>
-                        <a:xfrm>
-                          <a:off x="0" y="0"/>
-                          <a:ext cx="78740" cy="1292225"/>
-                        </a:xfrm>
-                        <a:prstGeom prst="rect">
-                          <a:avLst/>
-                        </a:prstGeom>
-                      </pic:spPr>
-                    </pic:pic>
-                  </a:graphicData>
-                </a:graphic>
-              </wp:anchor>
-            </w:drawing>
-          </w:r>
-        </w:p>
-        <w:p>
-          <w:pPr>
-            <w:pStyle w:val="Header"/>
-          </w:pPr>
-          <w:r>
-            <w:rPr>
-              <w:noProof/>
-            </w:rPr>
-            <w:drawing>
-              <wp:anchor distT="0" distB="0" distL="114300" distR="114300" simplePos="0" relativeHeight="251664384" behindDoc="1" locked="0" layoutInCell="1" allowOverlap="1" wp14:anchorId="1F510154" wp14:editId="615CF181">
-                <wp:simplePos x="0" y="0"/>
-                <wp:positionH relativeFrom="column">
-                  <wp:posOffset>5847</wp:posOffset>
-                </wp:positionH>
-                <wp:positionV relativeFrom="paragraph">
-                  <wp:posOffset>100602</wp:posOffset>
-                </wp:positionV>
-                <wp:extent cx="648970" cy="819785"/>
-                <wp:effectExtent l="0" t="0" r="0" b="0"/>
-                <wp:wrapTight wrapText="bothSides">
-                  <wp:wrapPolygon edited="0">
-                    <wp:start x="8243" y="0"/>
-                    <wp:lineTo x="3804" y="3012"/>
-                    <wp:lineTo x="0" y="7027"/>
-                    <wp:lineTo x="0" y="10039"/>
-                    <wp:lineTo x="8877" y="16564"/>
-                    <wp:lineTo x="2536" y="17568"/>
-                    <wp:lineTo x="0" y="18572"/>
-                    <wp:lineTo x="0" y="21081"/>
-                    <wp:lineTo x="20924" y="21081"/>
-                    <wp:lineTo x="20924" y="19074"/>
-                    <wp:lineTo x="19656" y="18070"/>
-                    <wp:lineTo x="12047" y="16564"/>
-                    <wp:lineTo x="20924" y="9537"/>
-                    <wp:lineTo x="20924" y="7027"/>
-                    <wp:lineTo x="16485" y="3012"/>
-                    <wp:lineTo x="12681" y="0"/>
-                    <wp:lineTo x="8243" y="0"/>
-                  </wp:wrapPolygon>
-                </wp:wrapTight>
-                <wp:docPr id="2" name="Picture 2"/>
-                <wp:cNvGraphicFramePr>
-                  <a:graphicFrameLocks xmlns:a="http://schemas.openxmlformats.org/drawingml/2006/main" noChangeAspect="1"/>
-                </wp:cNvGraphicFramePr>
-                <a:graphic xmlns:a="http://schemas.openxmlformats.org/drawingml/2006/main">
-                  <a:graphicData uri="http://schemas.openxmlformats.org/drawingml/2006/picture">
-                    <pic:pic xmlns:pic="http://schemas.openxmlformats.org/drawingml/2006/picture">
-                      <pic:nvPicPr>
-                        <pic:cNvPr id="1" name="Picture 1"/>
-                        <pic:cNvPicPr>
-                          <a:picLocks noChangeAspect="1"/>
-                        </pic:cNvPicPr>
-                      </pic:nvPicPr>
-                      <pic:blipFill>
-                        <a:blip r:embed="rId2" cstate="print">
-                          <a:extLst>
-                            <a:ext uri="{28A0092B-C50C-407E-A947-70E740481C1C}">
-                              <a14:useLocalDpi xmlns:a14="http://schemas.microsoft.com/office/drawing/2010/main" val="0"/>
-                            </a:ext>
-                          </a:extLst>
-                        </a:blip>
-                        <a:stretch>
-                          <a:fillRect/>
-                        </a:stretch>
-                      </pic:blipFill>
-                      <pic:spPr>
-                        <a:xfrm>
-                          <a:off x="0" y="0"/>
-                          <a:ext cx="648970" cy="819785"/>
-                        </a:xfrm>
-                        <a:prstGeom prst="rect">
-                          <a:avLst/>
-                        </a:prstGeom>
-                      </pic:spPr>
-                    </pic:pic>
-                  </a:graphicData>
-                </a:graphic>
-              </wp:anchor>
-            </w:drawing>
-          </w:r>
-        </w:p>
-        <w:p>
-          <w:pPr>
-            <w:pStyle w:val="Header"/>
-          </w:pPr>
-        </w:p>
-      </w:tc>
-      <w:tc>
-        <w:tcPr>
-          <w:tcW w:w="9211" w:type="dxa"/>
-          <w:tcBorders>
-            <w:top w:val="nil"/>
-            <w:left w:val="nil"/>
-            <w:bottom w:val="nil"/>
-            <w:right w:val="nil"/>
-          </w:tcBorders>
-        </w:tcPr>
-        <w:p>
-          <w:pPr>
-            <w:rPr>
-              <w:rFonts w:ascii="Arial Narrow" w:hAnsi="Arial Narrow"/>
-              <w:szCs w:val="24"/>
-            </w:rPr>
-          </w:pPr>
-        </w:p>
-        <w:p>
-          <w:pPr>
-            <w:rPr>
-              <w:rFonts w:ascii="Arial Narrow" w:hAnsi="Arial Narrow"/>
-              <w:sz w:val="28"/>
-              <w:szCs w:val="28"/>
-            </w:rPr>
-          </w:pPr>
-        </w:p>
-        <w:p>
-          <w:pPr>
-            <w:rPr>
-              <w:rFonts w:ascii="Arial Narrow" w:hAnsi="Arial Narrow"/>
-              <w:sz w:val="28"/>
-              <w:szCs w:val="28"/>
-            </w:rPr>
-          </w:pPr>
-          <w:r>
-            <w:rPr>
-              <w:rFonts w:ascii="Arial Narrow" w:hAnsi="Arial Narrow"/>
-              <w:sz w:val="28"/>
-              <w:szCs w:val="28"/>
-            </w:rPr>
-            <w:t>KEMENTERIAN KETENAGAKERJAAN REPUBLIK INDONESIA</w:t>
-          </w:r>
-        </w:p>
-        <w:p>
-          <w:pPr>
-            <w:rPr>
-              <w:rFonts w:ascii="Arial Narrow" w:hAnsi="Arial Narrow"/>
-              <w:color w:val="284A61"/>
-              <w:sz w:val="32"/>
-              <w:szCs w:val="32"/>
-            </w:rPr>
-          </w:pPr>
-          <w:r>
-            <w:rPr>
-              <w:rFonts w:ascii="Arial Narrow" w:hAnsi="Arial Narrow"/>
-              <w:color w:val="284A61"/>
-              <w:sz w:val="32"/>
-              <w:szCs w:val="32"/>
-            </w:rPr>
-            <w:t>SEKRETARIAT JENDERAL</w:t>
-          </w:r>
-        </w:p>
-        <w:p>
-          <w:pPr>
-            <w:rPr>
-              <w:rFonts w:ascii="Arial Narrow" w:hAnsi="Arial Narrow"/>
-              <w:b/>
-              <w:color w:val="284A61"/>
-              <w:sz w:val="32"/>
-              <w:szCs w:val="32"/>
-            </w:rPr>
-          </w:pPr>
-        </w:p>
-        <w:p>
-          <w:pPr>
-            <w:rPr>
-              <w:rFonts w:ascii="Arial Narrow" w:hAnsi="Arial Narrow"/>
-              <w:color w:val="000000" w:themeColor="text1"/>
-              <w:sz w:val="18"/>
-              <w:szCs w:val="18"/>
-            </w:rPr>
-          </w:pPr>
-        </w:p>
-        <w:p/>
-        <w:p>
-          <w:pPr>
-            <w:pStyle w:val="Header"/>
-          </w:pPr>
-        </w:p>
-      </w:tc>
-    </w:tr>
-  </w:tbl>
-  <w:p>
-    <w:pPr>
-      <w:pStyle w:val="Header"/>
-    </w:pPr>
-  </w:p>
-</w:hdr>
-</file>
-
-<file path=word/header3.xml><?xml version="1.0" encoding="utf-8"?>
-<w:hdr xmlns:wpc="http://schemas.microsoft.com/office/word/2010/wordprocessingCanvas" xmlns:cx="http://schemas.microsoft.com/office/drawing/2014/chartex" xmlns:cx1="http://schemas.microsoft.com/office/drawing/2015/9/8/chartex" xmlns:cx2="http://schemas.microsoft.com/office/drawing/2015/10/21/chartex" xmlns:cx3="http://schemas.microsoft.com/office/drawing/2016/5/9/chartex" xmlns:cx4="http://schemas.microsoft.com/office/drawing/2016/5/10/chartex" xmlns:cx5="http://schemas.microsoft.com/office/drawing/2016/5/11/chartex" xmlns:cx6="http://schemas.microsoft.com/office/drawing/2016/5/12/chartex" xmlns:cx7="http://schemas.microsoft.com/office/drawing/2016/5/13/chartex" xmlns:cx8="http://schemas.microsoft.com/office/drawing/2016/5/14/chartex" xmlns:mc="http://schemas.openxmlformats.org/markup-compatibility/2006" xmlns:aink="http://schemas.microsoft.com/office/drawing/2016/ink" xmlns:am3d="http://schemas.microsoft.com/office/drawing/2017/model3d" xmlns:o="urn:schemas-microsoft-com:office:office" xmlns:oel="http://schemas.microsoft.com/office/2019/extlst" xmlns:r="http://schemas.openxmlformats.org/officeDocument/2006/relationships" xmlns:m="http://schemas.openxmlformats.org/officeDocument/2006/math" xmlns:v="urn:schemas-microsoft-com:vml" xmlns:wp14="http://schemas.microsoft.com/office/word/2010/wordprocessingDrawing" xmlns:wp="http://schemas.openxmlformats.org/drawingml/2006/wordprocessingDrawing" xmlns:w10="urn:schemas-microsoft-com:office:word" xmlns:w="http://schemas.openxmlformats.org/wordprocessingml/2006/main" xmlns:w14="http://schemas.microsoft.com/office/word/2010/wordml" xmlns:w15="http://schemas.microsoft.com/office/word/2012/wordml" xmlns:w16cex="http://schemas.microsoft.com/office/word/2018/wordml/cex" xmlns:w16cid="http://schemas.microsoft.com/office/word/2016/wordml/cid" xmlns:w16="http://schemas.microsoft.com/office/word/2018/wordml" xmlns:w16du="http://schemas.microsoft.com/office/word/2023/wordml/word16du" xmlns:w16sdtdh="http://schemas.microsoft.com/office/word/2020/wordml/sdtdatahash" xmlns:w16sdtfl="http://schemas.microsoft.com/office/word/2024/wordml/sdtformatlock" xmlns:w16se="http://schemas.microsoft.com/office/word/2015/wordml/symex" xmlns:wpg="http://schemas.microsoft.com/office/word/2010/wordprocessingGroup" xmlns:wpi="http://schemas.microsoft.com/office/word/2010/wordprocessingInk" xmlns:wne="http://schemas.microsoft.com/office/word/2006/wordml" xmlns:wps="http://schemas.microsoft.com/office/word/2010/wordprocessingShape" mc:Ignorable="w14 w15 w16se w16cid w16 w16cex w16sdtdh w16sdtfl w16du wp14">
-  <w:p>
-    <w:pPr>
-      <w:pStyle w:val="Header"/>
-    </w:pPr>
-  </w:p>
-</w:hdr>
-</file>
-
-<file path=word/header4.xml><?xml version="1.0" encoding="utf-8"?>
-<w:hdr xmlns:wpc="http://schemas.microsoft.com/office/word/2010/wordprocessingCanvas" xmlns:cx="http://schemas.microsoft.com/office/drawing/2014/chartex" xmlns:cx1="http://schemas.microsoft.com/office/drawing/2015/9/8/chartex" xmlns:cx2="http://schemas.microsoft.com/office/drawing/2015/10/21/chartex" xmlns:cx3="http://schemas.microsoft.com/office/drawing/2016/5/9/chartex" xmlns:cx4="http://schemas.microsoft.com/office/drawing/2016/5/10/chartex" xmlns:cx5="http://schemas.microsoft.com/office/drawing/2016/5/11/chartex" xmlns:cx6="http://schemas.microsoft.com/office/drawing/2016/5/12/chartex" xmlns:cx7="http://schemas.microsoft.com/office/drawing/2016/5/13/chartex" xmlns:cx8="http://schemas.microsoft.com/office/drawing/2016/5/14/chartex" xmlns:mc="http://schemas.openxmlformats.org/markup-compatibility/2006" xmlns:aink="http://schemas.microsoft.com/office/drawing/2016/ink" xmlns:am3d="http://schemas.microsoft.com/office/drawing/2017/model3d" xmlns:o="urn:schemas-microsoft-com:office:office" xmlns:oel="http://schemas.microsoft.com/office/2019/extlst" xmlns:r="http://schemas.openxmlformats.org/officeDocument/2006/relationships" xmlns:m="http://schemas.openxmlformats.org/officeDocument/2006/math" xmlns:v="urn:schemas-microsoft-com:vml" xmlns:wp14="http://schemas.microsoft.com/office/word/2010/wordprocessingDrawing" xmlns:wp="http://schemas.openxmlformats.org/drawingml/2006/wordprocessingDrawing" xmlns:w10="urn:schemas-microsoft-com:office:word" xmlns:w="http://schemas.openxmlformats.org/wordprocessingml/2006/main" xmlns:w14="http://schemas.microsoft.com/office/word/2010/wordml" xmlns:w15="http://schemas.microsoft.com/office/word/2012/wordml" xmlns:w16cex="http://schemas.microsoft.com/office/word/2018/wordml/cex" xmlns:w16cid="http://schemas.microsoft.com/office/word/2016/wordml/cid" xmlns:w16="http://schemas.microsoft.com/office/word/2018/wordml" xmlns:w16du="http://schemas.microsoft.com/office/word/2023/wordml/word16du" xmlns:w16sdtdh="http://schemas.microsoft.com/office/word/2020/wordml/sdtdatahash" xmlns:w16sdtfl="http://schemas.microsoft.com/office/word/2024/wordml/sdtformatlock" xmlns:w16se="http://schemas.microsoft.com/office/word/2015/wordml/symex" xmlns:wpg="http://schemas.microsoft.com/office/word/2010/wordprocessingGroup" xmlns:wpi="http://schemas.microsoft.com/office/word/2010/wordprocessingInk" xmlns:wne="http://schemas.microsoft.com/office/word/2006/wordml" xmlns:wps="http://schemas.microsoft.com/office/word/2010/wordprocessingShape" mc:Ignorable="w14 w15 w16se w16cid w16 w16cex w16sdtdh w16sdtfl w16du wp14">
-  <w:p>
-    <w:pPr>
-      <w:pStyle w:val="Header"/>
-    </w:pPr>
-  </w:p>
-</w:hdr>
-</file>
-
-<file path=word/header5.xml><?xml version="1.0" encoding="utf-8"?>
 <w:hdr xmlns:wpc="http://schemas.microsoft.com/office/word/2010/wordprocessingCanvas" xmlns:cx="http://schemas.microsoft.com/office/drawing/2014/chartex" xmlns:cx1="http://schemas.microsoft.com/office/drawing/2015/9/8/chartex" xmlns:cx2="http://schemas.microsoft.com/office/drawing/2015/10/21/chartex" xmlns:cx3="http://schemas.microsoft.com/office/drawing/2016/5/9/chartex" xmlns:cx4="http://schemas.microsoft.com/office/drawing/2016/5/10/chartex" xmlns:cx5="http://schemas.microsoft.com/office/drawing/2016/5/11/chartex" xmlns:cx6="http://schemas.microsoft.com/office/drawing/2016/5/12/chartex" xmlns:cx7="http://schemas.microsoft.com/office/drawing/2016/5/13/chartex" xmlns:cx8="http://schemas.microsoft.com/office/drawing/2016/5/14/chartex" xmlns:mc="http://schemas.openxmlformats.org/markup-compatibility/2006" xmlns:aink="http://schemas.microsoft.com/office/drawing/2016/ink" xmlns:am3d="http://schemas.microsoft.com/office/drawing/2017/model3d" xmlns:o="urn:schemas-microsoft-com:office:office" xmlns:oel="http://schemas.microsoft.com/office/2019/extlst" xmlns:r="http://schemas.openxmlformats.org/officeDocument/2006/relationships" xmlns:m="http://schemas.openxmlformats.org/officeDocument/2006/math" xmlns:v="urn:schemas-microsoft-com:vml" xmlns:wp14="http://schemas.microsoft.com/office/word/2010/wordprocessingDrawing" xmlns:wp="http://schemas.openxmlformats.org/drawingml/2006/wordprocessingDrawing" xmlns:w10="urn:schemas-microsoft-com:office:word" xmlns:w="http://schemas.openxmlformats.org/wordprocessingml/2006/main" xmlns:w14="http://schemas.microsoft.com/office/word/2010/wordml" xmlns:w15="http://schemas.microsoft.com/office/word/2012/wordml" xmlns:w16cex="http://schemas.microsoft.com/office/word/2018/wordml/cex" xmlns:w16cid="http://schemas.microsoft.com/office/word/2016/wordml/cid" xmlns:w16="http://schemas.microsoft.com/office/word/2018/wordml" xmlns:w16du="http://schemas.microsoft.com/office/word/2023/wordml/word16du" xmlns:w16sdtdh="http://schemas.microsoft.com/office/word/2020/wordml/sdtdatahash" xmlns:w16sdtfl="http://schemas.microsoft.com/office/word/2024/wordml/sdtformatlock" xmlns:w16se="http://schemas.microsoft.com/office/word/2015/wordml/symex" xmlns:wpg="http://schemas.microsoft.com/office/word/2010/wordprocessingGroup" xmlns:wpi="http://schemas.microsoft.com/office/word/2010/wordprocessingInk" xmlns:wne="http://schemas.microsoft.com/office/word/2006/wordml" xmlns:wps="http://schemas.microsoft.com/office/word/2010/wordprocessingShape" mc:Ignorable="w14 w15 w16se w16cid w16 w16cex w16sdtdh w16sdtfl w16du wp14">
   <w:p>
     <w:pPr>

</xml_diff>

<commit_message>
fix: production-ready PDF preview, IDM bypass, and comprehensive DOCX data mapping
</commit_message>
<xml_diff>
--- a/backend/templates/Berkas Luar Kota - Laporan.docx
+++ b/backend/templates/Berkas Luar Kota - Laporan.docx
@@ -1,6 +1,6 @@
 
 <file path=word/document.xml><?xml version="1.0" encoding="utf-8"?>
-<w:document xmlns:wpc="http://schemas.microsoft.com/office/word/2010/wordprocessingCanvas" xmlns:cx="http://schemas.microsoft.com/office/drawing/2014/chartex" xmlns:cx1="http://schemas.microsoft.com/office/drawing/2015/9/8/chartex" xmlns:cx2="http://schemas.microsoft.com/office/drawing/2015/10/21/chartex" xmlns:cx3="http://schemas.microsoft.com/office/drawing/2016/5/9/chartex" xmlns:cx4="http://schemas.microsoft.com/office/drawing/2016/5/10/chartex" xmlns:cx5="http://schemas.microsoft.com/office/drawing/2016/5/11/chartex" xmlns:cx6="http://schemas.microsoft.com/office/drawing/2016/5/12/chartex" xmlns:cx7="http://schemas.microsoft.com/office/drawing/2016/5/13/chartex" xmlns:cx8="http://schemas.microsoft.com/office/drawing/2016/5/14/chartex" xmlns:mc="http://schemas.openxmlformats.org/markup-compatibility/2006" xmlns:aink="http://schemas.microsoft.com/office/drawing/2016/ink" xmlns:am3d="http://schemas.microsoft.com/office/drawing/2017/model3d" xmlns:o="urn:schemas-microsoft-com:office:office" xmlns:oel="http://schemas.microsoft.com/office/2019/extlst" xmlns:r="http://schemas.openxmlformats.org/officeDocument/2006/relationships" xmlns:m="http://schemas.openxmlformats.org/officeDocument/2006/math" xmlns:v="urn:schemas-microsoft-com:vml" xmlns:wp14="http://schemas.microsoft.com/office/word/2010/wordprocessingDrawing" xmlns:wp="http://schemas.openxmlformats.org/drawingml/2006/wordprocessingDrawing" xmlns:w10="urn:schemas-microsoft-com:office:word" xmlns:w="http://schemas.openxmlformats.org/wordprocessingml/2006/main" xmlns:w14="http://schemas.microsoft.com/office/word/2010/wordml" xmlns:w15="http://schemas.microsoft.com/office/word/2012/wordml" xmlns:w16cex="http://schemas.microsoft.com/office/word/2018/wordml/cex" xmlns:w16cid="http://schemas.microsoft.com/office/word/2016/wordml/cid" xmlns:w16="http://schemas.microsoft.com/office/word/2018/wordml" xmlns:w16du="http://schemas.microsoft.com/office/word/2023/wordml/word16du" xmlns:w16sdtdh="http://schemas.microsoft.com/office/word/2020/wordml/sdtdatahash" xmlns:w16sdtfl="http://schemas.microsoft.com/office/word/2024/wordml/sdtformatlock" xmlns:w16se="http://schemas.microsoft.com/office/word/2015/wordml/symex" xmlns:wpg="http://schemas.microsoft.com/office/word/2010/wordprocessingGroup" xmlns:wpi="http://schemas.microsoft.com/office/word/2010/wordprocessingInk" xmlns:wne="http://schemas.microsoft.com/office/word/2006/wordml" xmlns:wps="http://schemas.microsoft.com/office/word/2010/wordprocessingShape" mc:Ignorable="w14 w15 w16se w16cid w16 w16cex w16sdtdh w16sdtfl w16du wp14">
+<w:document xmlns:wpc="http://schemas.microsoft.com/office/word/2010/wordprocessingCanvas" xmlns:cx="http://schemas.microsoft.com/office/drawing/2014/chartex" xmlns:cx1="http://schemas.microsoft.com/office/drawing/2015/9/8/chartex" xmlns:cx2="http://schemas.microsoft.com/office/drawing/2015/10/21/chartex" xmlns:cx3="http://schemas.microsoft.com/office/drawing/2016/5/9/chartex" xmlns:cx4="http://schemas.microsoft.com/office/drawing/2016/5/10/chartex" xmlns:cx5="http://schemas.microsoft.com/office/drawing/2016/5/11/chartex" xmlns:cx6="http://schemas.microsoft.com/office/drawing/2016/5/12/chartex" xmlns:cx7="http://schemas.microsoft.com/office/drawing/2016/5/13/chartex" xmlns:cx8="http://schemas.microsoft.com/office/drawing/2016/5/14/chartex" xmlns:mc="http://schemas.openxmlformats.org/markup-compatibility/2006" xmlns:aink="http://schemas.microsoft.com/office/drawing/2016/ink" xmlns:am3d="http://schemas.microsoft.com/office/drawing/2017/model3d" xmlns:o="urn:schemas-microsoft-com:office:office" xmlns:oel="http://schemas.microsoft.com/office/2019/extlst" xmlns:r="http://schemas.openxmlformats.org/officeDocument/2006/relationships" xmlns:m="http://schemas.openxmlformats.org/officeDocument/2006/math" xmlns:v="urn:schemas-microsoft-com:vml" xmlns:wp14="http://schemas.microsoft.com/office/word/2010/wordprocessingDrawing" xmlns:wp="http://schemas.openxmlformats.org/drawingml/2006/wordprocessingDrawing" xmlns:w10="urn:schemas-microsoft-com:office:word" xmlns:w="http://schemas.openxmlformats.org/wordprocessingml/2006/main" xmlns:w14="http://schemas.microsoft.com/office/word/2010/wordml" xmlns:w15="http://schemas.microsoft.com/office/word/2012/wordml" xmlns:w16cex="http://schemas.microsoft.com/office/word/2018/wordml/cex" xmlns:w16cid="http://schemas.microsoft.com/office/word/2016/wordml/cid" xmlns:w16="http://schemas.microsoft.com/office/word/2018/wordml" xmlns:w16sdtdh="http://schemas.microsoft.com/office/word/2020/wordml/sdtdatahash" xmlns:w16se="http://schemas.microsoft.com/office/word/2015/wordml/symex" xmlns:wpg="http://schemas.microsoft.com/office/word/2010/wordprocessingGroup" xmlns:wpi="http://schemas.microsoft.com/office/word/2010/wordprocessingInk" xmlns:wne="http://schemas.microsoft.com/office/word/2006/wordml" xmlns:wps="http://schemas.microsoft.com/office/word/2010/wordprocessingShape" mc:Ignorable="w14 w15 w16se w16cid w16 w16cex w16sdtdh wp14">
   <w:body>
     <w:tbl>
       <w:tblPr>
@@ -295,7 +295,7 @@
         <w:ind w:right="139"/>
         <w:jc w:val="center"/>
         <w:rPr>
-          <w:lang w:val="en-US"/>
+          <w:lang w:val="sv-SE"/>
         </w:rPr>
       </w:pPr>
       <w:r>
@@ -327,14 +327,14 @@
       </w:r>
       <w:r>
         <w:rPr>
-          <w:lang w:val="en-US"/>
+          <w:lang w:val="sv-SE"/>
         </w:rPr>
         <w:t>{{kota</w:t>
       </w:r>
       <w:r>
         <w:rPr>
           <w:spacing w:val="-2"/>
-          <w:lang w:val="en-US"/>
+          <w:lang w:val="sv-SE"/>
         </w:rPr>
         <w:t>}}, {{provinsi}}</w:t>
       </w:r>
@@ -349,11 +349,47 @@
           <w:lang w:val="en-US"/>
         </w:rPr>
       </w:pPr>
+      <w:proofErr w:type="spellStart"/>
       <w:r>
         <w:rPr>
           <w:lang w:val="en-US"/>
         </w:rPr>
-        <w:t>Tanggal {{tanggal_mulai}} – {{tanggal_selesai}}</w:t>
+        <w:t>Tanggal</w:t>
+      </w:r>
+      <w:proofErr w:type="spellEnd"/>
+      <w:r>
+        <w:rPr>
+          <w:lang w:val="en-US"/>
+        </w:rPr>
+        <w:t xml:space="preserve"> {{</w:t>
+      </w:r>
+      <w:proofErr w:type="spellStart"/>
+      <w:r>
+        <w:rPr>
+          <w:lang w:val="en-US"/>
+        </w:rPr>
+        <w:t>tanggal_mulai</w:t>
+      </w:r>
+      <w:proofErr w:type="spellEnd"/>
+      <w:r>
+        <w:rPr>
+          <w:lang w:val="en-US"/>
+        </w:rPr>
+        <w:t>}} – {{</w:t>
+      </w:r>
+      <w:proofErr w:type="spellStart"/>
+      <w:r>
+        <w:rPr>
+          <w:lang w:val="en-US"/>
+        </w:rPr>
+        <w:t>tanggal_selesai</w:t>
+      </w:r>
+      <w:proofErr w:type="spellEnd"/>
+      <w:r>
+        <w:rPr>
+          <w:lang w:val="en-US"/>
+        </w:rPr>
+        <w:t>}}</w:t>
       </w:r>
     </w:p>
     <w:p>
@@ -389,13 +425,936 @@
     <w:p>
       <w:pPr>
         <w:pStyle w:val="BodyText"/>
+        <w:tabs>
+          <w:tab w:val="left" w:pos="3332"/>
+        </w:tabs>
         <w:spacing w:before="248"/>
         <w:rPr>
           <w:rFonts w:ascii="Arial"/>
           <w:b/>
         </w:rPr>
       </w:pPr>
+      <w:r>
+        <w:rPr>
+          <w:rFonts w:ascii="Arial"/>
+          <w:b/>
+        </w:rPr>
+        <w:tab/>
+      </w:r>
     </w:p>
+    <w:tbl>
+      <w:tblPr>
+        <w:tblStyle w:val="TableGrid"/>
+        <w:tblpPr w:leftFromText="180" w:rightFromText="180" w:vertAnchor="text" w:horzAnchor="margin" w:tblpXSpec="right" w:tblpY="27"/>
+        <w:tblW w:w="0" w:type="auto"/>
+        <w:tblBorders>
+          <w:top w:val="none" w:sz="0" w:space="0" w:color="auto"/>
+          <w:left w:val="none" w:sz="0" w:space="0" w:color="auto"/>
+          <w:bottom w:val="none" w:sz="0" w:space="0" w:color="auto"/>
+          <w:right w:val="none" w:sz="0" w:space="0" w:color="auto"/>
+          <w:insideH w:val="none" w:sz="0" w:space="0" w:color="auto"/>
+          <w:insideV w:val="none" w:sz="0" w:space="0" w:color="auto"/>
+        </w:tblBorders>
+        <w:tblLook w:val="04A0" w:firstRow="1" w:lastRow="0" w:firstColumn="1" w:lastColumn="0" w:noHBand="0" w:noVBand="1"/>
+      </w:tblPr>
+      <w:tblGrid>
+        <w:gridCol w:w="425"/>
+        <w:gridCol w:w="7308"/>
+      </w:tblGrid>
+      <w:tr>
+        <w:tc>
+          <w:tcPr>
+            <w:tcW w:w="425" w:type="dxa"/>
+          </w:tcPr>
+          <w:p>
+            <w:pPr>
+              <w:pStyle w:val="BodyText"/>
+              <w:spacing w:before="2"/>
+              <w:jc w:val="center"/>
+            </w:pPr>
+            <w:r>
+              <w:t>1.</w:t>
+            </w:r>
+          </w:p>
+        </w:tc>
+        <w:tc>
+          <w:tcPr>
+            <w:tcW w:w="7308" w:type="dxa"/>
+          </w:tcPr>
+          <w:p>
+            <w:pPr>
+              <w:pStyle w:val="BodyText"/>
+              <w:tabs>
+                <w:tab w:val="left" w:pos="2204"/>
+                <w:tab w:val="left" w:pos="2530"/>
+                <w:tab w:val="left" w:pos="6160"/>
+              </w:tabs>
+              <w:ind w:right="354"/>
+              <w:jc w:val="both"/>
+            </w:pPr>
+            <w:r>
+              <w:t>Surat</w:t>
+            </w:r>
+            <w:r>
+              <w:rPr>
+                <w:spacing w:val="40"/>
+              </w:rPr>
+              <w:t xml:space="preserve"> </w:t>
+            </w:r>
+            <w:r>
+              <w:t>Tugas</w:t>
+            </w:r>
+            <w:r>
+              <w:rPr>
+                <w:spacing w:val="40"/>
+              </w:rPr>
+              <w:t xml:space="preserve"> </w:t>
+            </w:r>
+            <w:r>
+              <w:t>Kepala</w:t>
+            </w:r>
+            <w:r>
+              <w:rPr>
+                <w:spacing w:val="40"/>
+              </w:rPr>
+              <w:t xml:space="preserve"> </w:t>
+            </w:r>
+            <w:r>
+              <w:t>Biro</w:t>
+            </w:r>
+            <w:r>
+              <w:rPr>
+                <w:spacing w:val="40"/>
+              </w:rPr>
+              <w:t xml:space="preserve"> </w:t>
+            </w:r>
+            <w:r>
+              <w:t>Umum</w:t>
+            </w:r>
+            <w:r>
+              <w:rPr>
+                <w:spacing w:val="40"/>
+              </w:rPr>
+              <w:t xml:space="preserve"> </w:t>
+            </w:r>
+            <w:r>
+              <w:t>Sekretariat</w:t>
+            </w:r>
+            <w:r>
+              <w:rPr>
+                <w:spacing w:val="40"/>
+              </w:rPr>
+              <w:t xml:space="preserve"> </w:t>
+            </w:r>
+            <w:r>
+              <w:t>Jenderal</w:t>
+            </w:r>
+            <w:r>
+              <w:rPr>
+                <w:spacing w:val="40"/>
+              </w:rPr>
+              <w:t xml:space="preserve"> </w:t>
+            </w:r>
+            <w:r>
+              <w:t>Kementerian Ketenagakerjaan</w:t>
+            </w:r>
+            <w:r>
+              <w:t xml:space="preserve"> </w:t>
+            </w:r>
+            <w:r>
+              <w:t>Nomor</w:t>
+            </w:r>
+            <w:r>
+              <w:rPr>
+                <w:spacing w:val="-14"/>
+              </w:rPr>
+              <w:t xml:space="preserve"> </w:t>
+            </w:r>
+            <w:r>
+              <w:rPr>
+                <w:spacing w:val="-5"/>
+              </w:rPr>
+              <w:t>1/</w:t>
+            </w:r>
+            <w:r>
+              <w:t>{{no_surat}}</w:t>
+            </w:r>
+            <w:r>
+              <w:rPr>
+                <w:spacing w:val="-2"/>
+              </w:rPr>
+              <w:t>/UM.06.00/</w:t>
+            </w:r>
+            <w:r>
+              <w:rPr>
+                <w:spacing w:val="-2"/>
+              </w:rPr>
+              <w:t>{{b</w:t>
+            </w:r>
+            <w:r>
+              <w:rPr>
+                <w:spacing w:val="-2"/>
+              </w:rPr>
+              <w:t>ulan</w:t>
+            </w:r>
+            <w:r>
+              <w:rPr>
+                <w:spacing w:val="-2"/>
+              </w:rPr>
+              <w:t>_no_surat}}</w:t>
+            </w:r>
+            <w:r>
+              <w:rPr>
+                <w:spacing w:val="-2"/>
+              </w:rPr>
+              <w:t>/</w:t>
+            </w:r>
+            <w:r>
+              <w:rPr>
+                <w:spacing w:val="-2"/>
+              </w:rPr>
+              <w:t>{{tahun}}</w:t>
+            </w:r>
+            <w:r>
+              <w:rPr>
+                <w:spacing w:val="29"/>
+              </w:rPr>
+              <w:t xml:space="preserve"> </w:t>
+            </w:r>
+            <w:r>
+              <w:rPr>
+                <w:spacing w:val="-2"/>
+              </w:rPr>
+              <w:t>Tanggal</w:t>
+            </w:r>
+            <w:r>
+              <w:rPr>
+                <w:spacing w:val="-2"/>
+              </w:rPr>
+              <w:t xml:space="preserve"> {{tanggal_no_surat}}</w:t>
+            </w:r>
+            <w:r>
+              <w:rPr>
+                <w:spacing w:val="-13"/>
+              </w:rPr>
+              <w:t xml:space="preserve"> </w:t>
+            </w:r>
+            <w:r>
+              <w:t>2026</w:t>
+            </w:r>
+            <w:r>
+              <w:rPr>
+                <w:spacing w:val="-13"/>
+              </w:rPr>
+              <w:t xml:space="preserve"> </w:t>
+            </w:r>
+            <w:r>
+              <w:t>dalam</w:t>
+            </w:r>
+            <w:r>
+              <w:rPr>
+                <w:spacing w:val="-15"/>
+              </w:rPr>
+              <w:t xml:space="preserve"> </w:t>
+            </w:r>
+            <w:r>
+              <w:t>rangka</w:t>
+            </w:r>
+            <w:r>
+              <w:rPr>
+                <w:spacing w:val="-12"/>
+              </w:rPr>
+              <w:t xml:space="preserve"> </w:t>
+            </w:r>
+            <w:r>
+              <w:t>{{tujuan_perjalanan}}</w:t>
+            </w:r>
+            <w:r>
+              <w:rPr>
+                <w:spacing w:val="-9"/>
+              </w:rPr>
+              <w:t xml:space="preserve"> </w:t>
+            </w:r>
+            <w:r>
+              <w:t>kunjungan</w:t>
+            </w:r>
+            <w:r>
+              <w:rPr>
+                <w:spacing w:val="-7"/>
+              </w:rPr>
+              <w:t xml:space="preserve"> </w:t>
+            </w:r>
+            <w:r>
+              <w:rPr>
+                <w:spacing w:val="-2"/>
+              </w:rPr>
+              <w:t>kerja</w:t>
+            </w:r>
+            <w:r>
+              <w:t xml:space="preserve"> {{stakeholder}}</w:t>
+            </w:r>
+            <w:r>
+              <w:rPr>
+                <w:spacing w:val="-4"/>
+              </w:rPr>
+              <w:t xml:space="preserve"> </w:t>
+            </w:r>
+            <w:r>
+              <w:t>di</w:t>
+            </w:r>
+            <w:r>
+              <w:rPr>
+                <w:spacing w:val="-10"/>
+              </w:rPr>
+              <w:t xml:space="preserve"> </w:t>
+            </w:r>
+            <w:r>
+              <w:rPr>
+                <w:spacing w:val="-10"/>
+              </w:rPr>
+              <w:t>{{kota}}, {{provinsi}}</w:t>
+            </w:r>
+            <w:r>
+              <w:rPr>
+                <w:spacing w:val="-2"/>
+              </w:rPr>
+              <w:t>;</w:t>
+            </w:r>
+          </w:p>
+        </w:tc>
+      </w:tr>
+      <w:tr>
+        <w:tc>
+          <w:tcPr>
+            <w:tcW w:w="425" w:type="dxa"/>
+          </w:tcPr>
+          <w:p>
+            <w:pPr>
+              <w:pStyle w:val="BodyText"/>
+              <w:spacing w:before="2"/>
+              <w:jc w:val="center"/>
+            </w:pPr>
+            <w:r>
+              <w:t>2.</w:t>
+            </w:r>
+          </w:p>
+        </w:tc>
+        <w:tc>
+          <w:tcPr>
+            <w:tcW w:w="7308" w:type="dxa"/>
+          </w:tcPr>
+          <w:p>
+            <w:pPr>
+              <w:tabs>
+                <w:tab w:val="left" w:pos="2915"/>
+              </w:tabs>
+              <w:spacing w:before="2"/>
+              <w:ind w:right="352"/>
+              <w:jc w:val="both"/>
+            </w:pPr>
+            <w:r>
+              <w:t>Peraturan</w:t>
+            </w:r>
+            <w:r>
+              <w:rPr>
+                <w:spacing w:val="-5"/>
+              </w:rPr>
+              <w:t xml:space="preserve"> </w:t>
+            </w:r>
+            <w:r>
+              <w:t>Menteri</w:t>
+            </w:r>
+            <w:r>
+              <w:rPr>
+                <w:spacing w:val="-11"/>
+              </w:rPr>
+              <w:t xml:space="preserve"> </w:t>
+            </w:r>
+            <w:r>
+              <w:t>Keuangan</w:t>
+            </w:r>
+            <w:r>
+              <w:rPr>
+                <w:spacing w:val="-8"/>
+              </w:rPr>
+              <w:t xml:space="preserve"> </w:t>
+            </w:r>
+            <w:r>
+              <w:t>No.</w:t>
+            </w:r>
+            <w:r>
+              <w:rPr>
+                <w:spacing w:val="-9"/>
+              </w:rPr>
+              <w:t xml:space="preserve"> </w:t>
+            </w:r>
+            <w:r>
+              <w:t>119</w:t>
+            </w:r>
+            <w:r>
+              <w:rPr>
+                <w:spacing w:val="-8"/>
+              </w:rPr>
+              <w:t xml:space="preserve"> </w:t>
+            </w:r>
+            <w:r>
+              <w:t>Tahun</w:t>
+            </w:r>
+            <w:r>
+              <w:rPr>
+                <w:spacing w:val="-8"/>
+              </w:rPr>
+              <w:t xml:space="preserve"> </w:t>
+            </w:r>
+            <w:r>
+              <w:t>2023</w:t>
+            </w:r>
+            <w:r>
+              <w:rPr>
+                <w:spacing w:val="-8"/>
+              </w:rPr>
+              <w:t xml:space="preserve"> </w:t>
+            </w:r>
+            <w:r>
+              <w:t xml:space="preserve">tentang Perubahan atas PMK No. 113/PMK.05/2012 tentang Perjalanan Dinas dalam negeri bagi Pejabat Negara, Pegawai Negeri dan Pegawai Tidak </w:t>
+            </w:r>
+            <w:r>
+              <w:rPr>
+                <w:spacing w:val="-2"/>
+              </w:rPr>
+              <w:t>Tetap;</w:t>
+            </w:r>
+          </w:p>
+        </w:tc>
+      </w:tr>
+      <w:tr>
+        <w:tc>
+          <w:tcPr>
+            <w:tcW w:w="425" w:type="dxa"/>
+          </w:tcPr>
+          <w:p>
+            <w:pPr>
+              <w:pStyle w:val="BodyText"/>
+              <w:spacing w:before="2"/>
+              <w:jc w:val="center"/>
+            </w:pPr>
+            <w:r>
+              <w:t>3.</w:t>
+            </w:r>
+          </w:p>
+        </w:tc>
+        <w:tc>
+          <w:tcPr>
+            <w:tcW w:w="7308" w:type="dxa"/>
+          </w:tcPr>
+          <w:p>
+            <w:pPr>
+              <w:tabs>
+                <w:tab w:val="left" w:pos="2895"/>
+              </w:tabs>
+              <w:ind w:right="362"/>
+              <w:jc w:val="both"/>
+            </w:pPr>
+            <w:r>
+              <w:t>Peraturan</w:t>
+            </w:r>
+            <w:r>
+              <w:rPr>
+                <w:spacing w:val="-15"/>
+              </w:rPr>
+              <w:t xml:space="preserve"> </w:t>
+            </w:r>
+            <w:r>
+              <w:t>Menteri</w:t>
+            </w:r>
+            <w:r>
+              <w:rPr>
+                <w:spacing w:val="-14"/>
+              </w:rPr>
+              <w:t xml:space="preserve"> </w:t>
+            </w:r>
+            <w:r>
+              <w:t>Ketenagakerjaan</w:t>
+            </w:r>
+            <w:r>
+              <w:rPr>
+                <w:spacing w:val="-12"/>
+              </w:rPr>
+              <w:t xml:space="preserve"> </w:t>
+            </w:r>
+            <w:r>
+              <w:t>Nomor</w:t>
+            </w:r>
+            <w:r>
+              <w:rPr>
+                <w:spacing w:val="-14"/>
+              </w:rPr>
+              <w:t xml:space="preserve"> </w:t>
+            </w:r>
+            <w:r>
+              <w:t>20</w:t>
+            </w:r>
+            <w:r>
+              <w:rPr>
+                <w:spacing w:val="37"/>
+              </w:rPr>
+              <w:t xml:space="preserve"> </w:t>
+            </w:r>
+            <w:r>
+              <w:t>Tahun</w:t>
+            </w:r>
+            <w:r>
+              <w:rPr>
+                <w:spacing w:val="-12"/>
+              </w:rPr>
+              <w:t xml:space="preserve"> </w:t>
+            </w:r>
+            <w:r>
+              <w:t>2024</w:t>
+            </w:r>
+            <w:r>
+              <w:rPr>
+                <w:spacing w:val="-12"/>
+              </w:rPr>
+              <w:t xml:space="preserve"> </w:t>
+            </w:r>
+            <w:r>
+              <w:t>tanggal</w:t>
+            </w:r>
+            <w:r>
+              <w:rPr>
+                <w:spacing w:val="-16"/>
+              </w:rPr>
+              <w:t xml:space="preserve"> </w:t>
+            </w:r>
+            <w:r>
+              <w:t xml:space="preserve">30 Desember 2024 tentang Organisasi dan Tata Kerja Kementerian </w:t>
+            </w:r>
+            <w:r>
+              <w:rPr>
+                <w:spacing w:val="-2"/>
+              </w:rPr>
+              <w:t>Ketenagakerjaan;</w:t>
+            </w:r>
+          </w:p>
+        </w:tc>
+      </w:tr>
+      <w:tr>
+        <w:tc>
+          <w:tcPr>
+            <w:tcW w:w="425" w:type="dxa"/>
+          </w:tcPr>
+          <w:p>
+            <w:pPr>
+              <w:pStyle w:val="BodyText"/>
+              <w:spacing w:before="2"/>
+              <w:jc w:val="center"/>
+            </w:pPr>
+            <w:r>
+              <w:t>4.</w:t>
+            </w:r>
+          </w:p>
+        </w:tc>
+        <w:tc>
+          <w:tcPr>
+            <w:tcW w:w="7308" w:type="dxa"/>
+          </w:tcPr>
+          <w:p>
+            <w:pPr>
+              <w:tabs>
+                <w:tab w:val="left" w:pos="2895"/>
+              </w:tabs>
+              <w:ind w:right="359"/>
+              <w:jc w:val="both"/>
+            </w:pPr>
+            <w:r>
+              <w:t>Keputusan</w:t>
+            </w:r>
+            <w:r>
+              <w:rPr>
+                <w:spacing w:val="-16"/>
+              </w:rPr>
+              <w:t xml:space="preserve"> </w:t>
+            </w:r>
+            <w:r>
+              <w:t>Menteri</w:t>
+            </w:r>
+            <w:r>
+              <w:rPr>
+                <w:spacing w:val="-15"/>
+              </w:rPr>
+              <w:t xml:space="preserve"> </w:t>
+            </w:r>
+            <w:r>
+              <w:t>Ketenagakerjaan</w:t>
+            </w:r>
+            <w:r>
+              <w:rPr>
+                <w:spacing w:val="-14"/>
+              </w:rPr>
+              <w:t xml:space="preserve"> </w:t>
+            </w:r>
+            <w:r>
+              <w:t>Nomor</w:t>
+            </w:r>
+            <w:r>
+              <w:rPr>
+                <w:spacing w:val="-15"/>
+              </w:rPr>
+              <w:t xml:space="preserve"> </w:t>
+            </w:r>
+            <w:r>
+              <w:t>460</w:t>
+            </w:r>
+            <w:r>
+              <w:rPr>
+                <w:spacing w:val="-13"/>
+              </w:rPr>
+              <w:t xml:space="preserve"> </w:t>
+            </w:r>
+            <w:r>
+              <w:t>tanggal</w:t>
+            </w:r>
+            <w:r>
+              <w:rPr>
+                <w:spacing w:val="-16"/>
+              </w:rPr>
+              <w:t xml:space="preserve"> </w:t>
+            </w:r>
+            <w:r>
+              <w:t>23</w:t>
+            </w:r>
+            <w:r>
+              <w:rPr>
+                <w:spacing w:val="-12"/>
+              </w:rPr>
+              <w:t xml:space="preserve"> </w:t>
+            </w:r>
+            <w:r>
+              <w:t>Desember 2025,</w:t>
+            </w:r>
+            <w:r>
+              <w:rPr>
+                <w:spacing w:val="-4"/>
+              </w:rPr>
+              <w:t xml:space="preserve"> </w:t>
+            </w:r>
+            <w:r>
+              <w:t>tentang</w:t>
+            </w:r>
+            <w:r>
+              <w:rPr>
+                <w:spacing w:val="-7"/>
+              </w:rPr>
+              <w:t xml:space="preserve"> </w:t>
+            </w:r>
+            <w:r>
+              <w:t>Pengangkatan</w:t>
+            </w:r>
+            <w:r>
+              <w:rPr>
+                <w:spacing w:val="-7"/>
+              </w:rPr>
+              <w:t xml:space="preserve"> </w:t>
+            </w:r>
+            <w:r>
+              <w:t>Pejabat</w:t>
+            </w:r>
+            <w:r>
+              <w:rPr>
+                <w:spacing w:val="-4"/>
+              </w:rPr>
+              <w:t xml:space="preserve"> </w:t>
+            </w:r>
+            <w:r>
+              <w:t>Perbendaharaan</w:t>
+            </w:r>
+            <w:r>
+              <w:rPr>
+                <w:spacing w:val="-4"/>
+              </w:rPr>
+              <w:t xml:space="preserve"> </w:t>
+            </w:r>
+            <w:r>
+              <w:t>Negara</w:t>
+            </w:r>
+            <w:r>
+              <w:rPr>
+                <w:spacing w:val="-4"/>
+              </w:rPr>
+              <w:t xml:space="preserve"> </w:t>
+            </w:r>
+            <w:r>
+              <w:t>selaku Kuasa Pengguna Anggaran (KPA)/Kuasa Pengguna Barang (KPB) Daftar Isian Pelaksanaan Anggaran (DIPA) Bidang Ketenagakerjaan pada Kantor Pusat Kementerian Ketenagakerjaan;</w:t>
+            </w:r>
+          </w:p>
+        </w:tc>
+      </w:tr>
+      <w:tr>
+        <w:tc>
+          <w:tcPr>
+            <w:tcW w:w="425" w:type="dxa"/>
+          </w:tcPr>
+          <w:p>
+            <w:pPr>
+              <w:pStyle w:val="BodyText"/>
+              <w:spacing w:before="2"/>
+              <w:jc w:val="center"/>
+            </w:pPr>
+            <w:r>
+              <w:t>5.</w:t>
+            </w:r>
+          </w:p>
+        </w:tc>
+        <w:tc>
+          <w:tcPr>
+            <w:tcW w:w="7308" w:type="dxa"/>
+          </w:tcPr>
+          <w:p>
+            <w:pPr>
+              <w:tabs>
+                <w:tab w:val="left" w:pos="2895"/>
+              </w:tabs>
+              <w:spacing w:line="242" w:lineRule="auto"/>
+              <w:ind w:right="359"/>
+              <w:jc w:val="both"/>
+            </w:pPr>
+            <w:r>
+              <w:t>Surat</w:t>
+            </w:r>
+            <w:r>
+              <w:rPr>
+                <w:spacing w:val="-14"/>
+              </w:rPr>
+              <w:t xml:space="preserve"> </w:t>
+            </w:r>
+            <w:r>
+              <w:t>Keputusan</w:t>
+            </w:r>
+            <w:r>
+              <w:rPr>
+                <w:spacing w:val="-8"/>
+              </w:rPr>
+              <w:t xml:space="preserve"> </w:t>
+            </w:r>
+            <w:r>
+              <w:t>Kuasa</w:t>
+            </w:r>
+            <w:r>
+              <w:rPr>
+                <w:spacing w:val="-13"/>
+              </w:rPr>
+              <w:t xml:space="preserve"> </w:t>
+            </w:r>
+            <w:r>
+              <w:t>Pengguna</w:t>
+            </w:r>
+            <w:r>
+              <w:rPr>
+                <w:spacing w:val="-13"/>
+              </w:rPr>
+              <w:t xml:space="preserve"> </w:t>
+            </w:r>
+            <w:r>
+              <w:t>Anggaran</w:t>
+            </w:r>
+            <w:r>
+              <w:rPr>
+                <w:spacing w:val="-8"/>
+              </w:rPr>
+              <w:t xml:space="preserve"> </w:t>
+            </w:r>
+            <w:r>
+              <w:t>(KPA)</w:t>
+            </w:r>
+            <w:r>
+              <w:rPr>
+                <w:spacing w:val="-12"/>
+              </w:rPr>
+              <w:t xml:space="preserve"> </w:t>
+            </w:r>
+            <w:r>
+              <w:t>/Kuasa</w:t>
+            </w:r>
+            <w:r>
+              <w:rPr>
+                <w:spacing w:val="-13"/>
+              </w:rPr>
+              <w:t xml:space="preserve"> </w:t>
+            </w:r>
+            <w:r>
+              <w:t>Pengguna Barang</w:t>
+            </w:r>
+            <w:r>
+              <w:rPr>
+                <w:spacing w:val="-16"/>
+              </w:rPr>
+              <w:t xml:space="preserve"> </w:t>
+            </w:r>
+            <w:r>
+              <w:t>(KPB)</w:t>
+            </w:r>
+            <w:r>
+              <w:rPr>
+                <w:spacing w:val="-20"/>
+              </w:rPr>
+              <w:t xml:space="preserve"> </w:t>
+            </w:r>
+            <w:r>
+              <w:t>Sekretariat</w:t>
+            </w:r>
+            <w:r>
+              <w:rPr>
+                <w:spacing w:val="-15"/>
+              </w:rPr>
+              <w:t xml:space="preserve"> </w:t>
+            </w:r>
+            <w:r>
+              <w:t>Jenderal</w:t>
+            </w:r>
+            <w:r>
+              <w:rPr>
+                <w:spacing w:val="-15"/>
+              </w:rPr>
+              <w:t xml:space="preserve"> </w:t>
+            </w:r>
+            <w:r>
+              <w:t>NOMOR</w:t>
+            </w:r>
+            <w:r>
+              <w:rPr>
+                <w:spacing w:val="-16"/>
+              </w:rPr>
+              <w:t xml:space="preserve"> </w:t>
+            </w:r>
+            <w:r>
+              <w:t>1/02/KU.04/I/2026</w:t>
+            </w:r>
+            <w:r>
+              <w:rPr>
+                <w:spacing w:val="-17"/>
+              </w:rPr>
+              <w:t xml:space="preserve"> </w:t>
+            </w:r>
+            <w:r>
+              <w:t>tanggal</w:t>
+            </w:r>
+            <w:r>
+              <w:t xml:space="preserve"> </w:t>
+            </w:r>
+            <w:r>
+              <w:t>2 Januari 2026 tentang Pejabat Pembuat Komitmen DIPA Unit Sekretariat Jenderal Kementerian Ketenagakerjaan Tahun 2026;</w:t>
+            </w:r>
+          </w:p>
+        </w:tc>
+      </w:tr>
+      <w:tr>
+        <w:tc>
+          <w:tcPr>
+            <w:tcW w:w="425" w:type="dxa"/>
+          </w:tcPr>
+          <w:p>
+            <w:pPr>
+              <w:pStyle w:val="BodyText"/>
+              <w:spacing w:before="2"/>
+              <w:jc w:val="center"/>
+            </w:pPr>
+            <w:r>
+              <w:t>6.</w:t>
+            </w:r>
+          </w:p>
+        </w:tc>
+        <w:tc>
+          <w:tcPr>
+            <w:tcW w:w="7308" w:type="dxa"/>
+          </w:tcPr>
+          <w:p>
+            <w:pPr>
+              <w:tabs>
+                <w:tab w:val="left" w:pos="2895"/>
+              </w:tabs>
+              <w:ind w:right="355"/>
+              <w:jc w:val="both"/>
+            </w:pPr>
+            <w:r>
+              <w:t>DIPA Unit Sekretariat Jenderal Kementerian Ketenagakerjaan Tahun 2026,</w:t>
+            </w:r>
+            <w:r>
+              <w:rPr>
+                <w:spacing w:val="-8"/>
+              </w:rPr>
+              <w:t xml:space="preserve"> </w:t>
+            </w:r>
+            <w:r>
+              <w:t>NOMOR</w:t>
+            </w:r>
+            <w:r>
+              <w:rPr>
+                <w:spacing w:val="-5"/>
+              </w:rPr>
+              <w:t xml:space="preserve"> </w:t>
+            </w:r>
+            <w:r>
+              <w:t>:</w:t>
+            </w:r>
+            <w:r>
+              <w:rPr>
+                <w:spacing w:val="-4"/>
+              </w:rPr>
+              <w:t xml:space="preserve"> </w:t>
+            </w:r>
+            <w:r>
+              <w:t>SP</w:t>
+            </w:r>
+            <w:r>
+              <w:rPr>
+                <w:spacing w:val="-8"/>
+              </w:rPr>
+              <w:t xml:space="preserve"> </w:t>
+            </w:r>
+            <w:r>
+              <w:t>DIPA-026.01.1.450938/2026</w:t>
+            </w:r>
+            <w:r>
+              <w:rPr>
+                <w:spacing w:val="-4"/>
+              </w:rPr>
+              <w:t xml:space="preserve"> </w:t>
+            </w:r>
+            <w:r>
+              <w:t>tanggal</w:t>
+            </w:r>
+            <w:r>
+              <w:rPr>
+                <w:spacing w:val="-5"/>
+              </w:rPr>
+              <w:t xml:space="preserve"> </w:t>
+            </w:r>
+            <w:r>
+              <w:t>1</w:t>
+            </w:r>
+            <w:r>
+              <w:rPr>
+                <w:spacing w:val="-4"/>
+              </w:rPr>
+              <w:t xml:space="preserve"> </w:t>
+            </w:r>
+            <w:r>
+              <w:t>Desember</w:t>
+            </w:r>
+            <w:r>
+              <w:t xml:space="preserve"> </w:t>
+            </w:r>
+            <w:r>
+              <w:rPr>
+                <w:spacing w:val="-2"/>
+              </w:rPr>
+              <w:t>2025.</w:t>
+            </w:r>
+          </w:p>
+        </w:tc>
+      </w:tr>
+    </w:tbl>
     <w:p>
       <w:pPr>
         <w:pStyle w:val="BodyText"/>
@@ -407,13 +1366,13 @@
         <w:ind w:left="2881" w:right="354" w:hanging="1954"/>
         <w:jc w:val="both"/>
         <w:rPr>
-          <w:lang w:val="en-US"/>
-        </w:rPr>
-      </w:pPr>
-      <w:r>
-        <w:rPr>
           <w:spacing w:val="-2"/>
         </w:rPr>
+      </w:pPr>
+      <w:r>
+        <w:rPr>
+          <w:spacing w:val="-2"/>
+        </w:rPr>
         <w:t>Dasar</w:t>
       </w:r>
       <w:r>
@@ -424,800 +1383,6 @@
           <w:spacing w:val="-10"/>
         </w:rPr>
         <w:t>:</w:t>
-      </w:r>
-      <w:r>
-        <w:tab/>
-        <w:t>1.</w:t>
-      </w:r>
-      <w:r>
-        <w:t xml:space="preserve">  </w:t>
-      </w:r>
-      <w:r>
-        <w:t>Surat</w:t>
-      </w:r>
-      <w:r>
-        <w:rPr>
-          <w:spacing w:val="40"/>
-        </w:rPr>
-        <w:t xml:space="preserve"> </w:t>
-      </w:r>
-      <w:r>
-        <w:t>Tugas</w:t>
-      </w:r>
-      <w:r>
-        <w:rPr>
-          <w:spacing w:val="40"/>
-        </w:rPr>
-        <w:t xml:space="preserve"> </w:t>
-      </w:r>
-      <w:r>
-        <w:t>Kepala</w:t>
-      </w:r>
-      <w:r>
-        <w:rPr>
-          <w:spacing w:val="40"/>
-        </w:rPr>
-        <w:t xml:space="preserve"> </w:t>
-      </w:r>
-      <w:r>
-        <w:t>Biro</w:t>
-      </w:r>
-      <w:r>
-        <w:rPr>
-          <w:spacing w:val="40"/>
-        </w:rPr>
-        <w:t xml:space="preserve"> </w:t>
-      </w:r>
-      <w:r>
-        <w:t>Umum</w:t>
-      </w:r>
-      <w:r>
-        <w:rPr>
-          <w:spacing w:val="40"/>
-        </w:rPr>
-        <w:t xml:space="preserve"> </w:t>
-      </w:r>
-      <w:r>
-        <w:t>Sekretariat</w:t>
-      </w:r>
-      <w:r>
-        <w:rPr>
-          <w:spacing w:val="40"/>
-        </w:rPr>
-        <w:t xml:space="preserve"> </w:t>
-      </w:r>
-      <w:r>
-        <w:t>Jenderal</w:t>
-      </w:r>
-      <w:r>
-        <w:rPr>
-          <w:spacing w:val="40"/>
-        </w:rPr>
-        <w:t xml:space="preserve"> </w:t>
-      </w:r>
-      <w:r>
-        <w:t>Kementerian Ketenagakerjaan</w:t>
-      </w:r>
-      <w:r>
-        <w:rPr>
-          <w:spacing w:val="-12"/>
-        </w:rPr>
-        <w:t xml:space="preserve"> </w:t>
-      </w:r>
-      <w:r>
-        <w:t>Nomor</w:t>
-      </w:r>
-      <w:r>
-        <w:rPr>
-          <w:spacing w:val="-14"/>
-        </w:rPr>
-        <w:t xml:space="preserve"> </w:t>
-      </w:r>
-      <w:r>
-        <w:rPr>
-          <w:spacing w:val="-5"/>
-        </w:rPr>
-        <w:t>1/</w:t>
-      </w:r>
-      <w:r>
-        <w:rPr>
-          <w:lang w:val="en-US"/>
-        </w:rPr>
-        <w:t>{{no_surat}}</w:t>
-      </w:r>
-      <w:r>
-        <w:rPr>
-          <w:spacing w:val="-2"/>
-        </w:rPr>
-        <w:t>/UM.06.00/</w:t>
-      </w:r>
-      <w:r>
-        <w:rPr>
-          <w:spacing w:val="-2"/>
-          <w:lang w:val="en-US"/>
-        </w:rPr>
-        <w:t>{{b</w:t>
-      </w:r>
-      <w:r>
-        <w:rPr>
-          <w:spacing w:val="-2"/>
-        </w:rPr>
-        <w:t>ulan</w:t>
-      </w:r>
-      <w:r>
-        <w:rPr>
-          <w:spacing w:val="-2"/>
-          <w:lang w:val="en-US"/>
-        </w:rPr>
-        <w:t>_no_surat}}</w:t>
-      </w:r>
-      <w:r>
-        <w:rPr>
-          <w:spacing w:val="-2"/>
-        </w:rPr>
-        <w:t>/</w:t>
-      </w:r>
-      <w:r>
-        <w:rPr>
-          <w:spacing w:val="-2"/>
-          <w:lang w:val="en-US"/>
-        </w:rPr>
-        <w:t>{{tahun}}</w:t>
-      </w:r>
-      <w:r>
-        <w:rPr>
-          <w:spacing w:val="29"/>
-        </w:rPr>
-        <w:t xml:space="preserve"> </w:t>
-      </w:r>
-      <w:r>
-        <w:rPr>
-          <w:spacing w:val="-2"/>
-        </w:rPr>
-        <w:t>Tanggal</w:t>
-      </w:r>
-      <w:r>
-        <w:rPr>
-          <w:spacing w:val="-2"/>
-          <w:lang w:val="en-US"/>
-        </w:rPr>
-        <w:t xml:space="preserve"> {{tanggal_no_surat}}</w:t>
-      </w:r>
-      <w:r>
-        <w:rPr>
-          <w:spacing w:val="-13"/>
-        </w:rPr>
-        <w:t xml:space="preserve"> </w:t>
-      </w:r>
-      <w:r>
-        <w:t>2026</w:t>
-      </w:r>
-      <w:r>
-        <w:rPr>
-          <w:spacing w:val="-13"/>
-        </w:rPr>
-        <w:t xml:space="preserve"> </w:t>
-      </w:r>
-      <w:r>
-        <w:t>dalam</w:t>
-      </w:r>
-      <w:r>
-        <w:rPr>
-          <w:spacing w:val="-15"/>
-        </w:rPr>
-        <w:t xml:space="preserve"> </w:t>
-      </w:r>
-      <w:r>
-        <w:t>rangka</w:t>
-      </w:r>
-      <w:r>
-        <w:rPr>
-          <w:spacing w:val="-12"/>
-        </w:rPr>
-        <w:t xml:space="preserve"> </w:t>
-      </w:r>
-      <w:r>
-        <w:rPr>
-          <w:lang w:val="en-US"/>
-        </w:rPr>
-        <w:t>{{tujuan_perjalanan}}</w:t>
-      </w:r>
-      <w:r>
-        <w:rPr>
-          <w:spacing w:val="-9"/>
-        </w:rPr>
-        <w:t xml:space="preserve"> </w:t>
-      </w:r>
-      <w:r>
-        <w:t>kunjungan</w:t>
-      </w:r>
-      <w:r>
-        <w:rPr>
-          <w:spacing w:val="-7"/>
-        </w:rPr>
-        <w:t xml:space="preserve"> </w:t>
-      </w:r>
-      <w:r>
-        <w:rPr>
-          <w:spacing w:val="-2"/>
-        </w:rPr>
-        <w:t>kerja</w:t>
-      </w:r>
-      <w:r>
-        <w:rPr>
-          <w:lang w:val="en-US"/>
-        </w:rPr>
-        <w:t xml:space="preserve"> {{stakeholder}}</w:t>
-      </w:r>
-      <w:r>
-        <w:rPr>
-          <w:spacing w:val="-4"/>
-        </w:rPr>
-        <w:t xml:space="preserve"> </w:t>
-      </w:r>
-      <w:r>
-        <w:t>di</w:t>
-      </w:r>
-      <w:r>
-        <w:rPr>
-          <w:spacing w:val="-10"/>
-        </w:rPr>
-        <w:t xml:space="preserve"> </w:t>
-      </w:r>
-      <w:r>
-        <w:rPr>
-          <w:spacing w:val="-10"/>
-          <w:lang w:val="en-US"/>
-        </w:rPr>
-        <w:t>{{kota}}, {{provinsi}}</w:t>
-      </w:r>
-      <w:r>
-        <w:rPr>
-          <w:spacing w:val="-2"/>
-        </w:rPr>
-        <w:t>;</w:t>
-      </w:r>
-    </w:p>
-    <w:p>
-      <w:pPr>
-        <w:pStyle w:val="ListParagraph"/>
-        <w:numPr>
-          <w:ilvl w:val="1"/>
-          <w:numId w:val="1"/>
-        </w:numPr>
-        <w:tabs>
-          <w:tab w:val="left" w:pos="2915"/>
-        </w:tabs>
-        <w:spacing w:before="2"/>
-        <w:ind w:right="352"/>
-        <w:jc w:val="both"/>
-      </w:pPr>
-      <w:r>
-        <w:t>Peraturan</w:t>
-      </w:r>
-      <w:r>
-        <w:rPr>
-          <w:spacing w:val="-5"/>
-        </w:rPr>
-        <w:t xml:space="preserve"> </w:t>
-      </w:r>
-      <w:r>
-        <w:t>Menteri</w:t>
-      </w:r>
-      <w:r>
-        <w:rPr>
-          <w:spacing w:val="-11"/>
-        </w:rPr>
-        <w:t xml:space="preserve"> </w:t>
-      </w:r>
-      <w:r>
-        <w:t>Keuangan</w:t>
-      </w:r>
-      <w:r>
-        <w:rPr>
-          <w:spacing w:val="-8"/>
-        </w:rPr>
-        <w:t xml:space="preserve"> </w:t>
-      </w:r>
-      <w:r>
-        <w:t>No.</w:t>
-      </w:r>
-      <w:r>
-        <w:rPr>
-          <w:spacing w:val="-9"/>
-        </w:rPr>
-        <w:t xml:space="preserve"> </w:t>
-      </w:r>
-      <w:r>
-        <w:t>119</w:t>
-      </w:r>
-      <w:r>
-        <w:rPr>
-          <w:spacing w:val="-8"/>
-        </w:rPr>
-        <w:t xml:space="preserve"> </w:t>
-      </w:r>
-      <w:r>
-        <w:t>Tahun</w:t>
-      </w:r>
-      <w:r>
-        <w:rPr>
-          <w:spacing w:val="-8"/>
-        </w:rPr>
-        <w:t xml:space="preserve"> </w:t>
-      </w:r>
-      <w:r>
-        <w:t>2023</w:t>
-      </w:r>
-      <w:r>
-        <w:rPr>
-          <w:spacing w:val="-8"/>
-        </w:rPr>
-        <w:t xml:space="preserve"> </w:t>
-      </w:r>
-      <w:r>
-        <w:t xml:space="preserve">tentang Perubahan atas PMK No. 113/PMK.05/2012 tentang Perjalanan Dinas dalam negeri bagi Pejabat Negara, Pegawai Negeri dan Pegawai Tidak </w:t>
-      </w:r>
-      <w:r>
-        <w:rPr>
-          <w:spacing w:val="-2"/>
-        </w:rPr>
-        <w:t>Tetap;</w:t>
-      </w:r>
-    </w:p>
-    <w:p>
-      <w:pPr>
-        <w:pStyle w:val="ListParagraph"/>
-        <w:numPr>
-          <w:ilvl w:val="1"/>
-          <w:numId w:val="1"/>
-        </w:numPr>
-        <w:tabs>
-          <w:tab w:val="left" w:pos="2895"/>
-        </w:tabs>
-        <w:ind w:left="2895" w:right="362"/>
-        <w:jc w:val="both"/>
-      </w:pPr>
-      <w:r>
-        <w:t>Peraturan</w:t>
-      </w:r>
-      <w:r>
-        <w:rPr>
-          <w:spacing w:val="-15"/>
-        </w:rPr>
-        <w:t xml:space="preserve"> </w:t>
-      </w:r>
-      <w:r>
-        <w:t>Menteri</w:t>
-      </w:r>
-      <w:r>
-        <w:rPr>
-          <w:spacing w:val="-14"/>
-        </w:rPr>
-        <w:t xml:space="preserve"> </w:t>
-      </w:r>
-      <w:r>
-        <w:t>Ketenagakerjaan</w:t>
-      </w:r>
-      <w:r>
-        <w:rPr>
-          <w:spacing w:val="-12"/>
-        </w:rPr>
-        <w:t xml:space="preserve"> </w:t>
-      </w:r>
-      <w:r>
-        <w:t>Nomor</w:t>
-      </w:r>
-      <w:r>
-        <w:rPr>
-          <w:spacing w:val="-14"/>
-        </w:rPr>
-        <w:t xml:space="preserve"> </w:t>
-      </w:r>
-      <w:r>
-        <w:t>20</w:t>
-      </w:r>
-      <w:r>
-        <w:rPr>
-          <w:spacing w:val="37"/>
-        </w:rPr>
-        <w:t xml:space="preserve"> </w:t>
-      </w:r>
-      <w:r>
-        <w:t>Tahun</w:t>
-      </w:r>
-      <w:r>
-        <w:rPr>
-          <w:spacing w:val="-12"/>
-        </w:rPr>
-        <w:t xml:space="preserve"> </w:t>
-      </w:r>
-      <w:r>
-        <w:t>2024</w:t>
-      </w:r>
-      <w:r>
-        <w:rPr>
-          <w:spacing w:val="-12"/>
-        </w:rPr>
-        <w:t xml:space="preserve"> </w:t>
-      </w:r>
-      <w:r>
-        <w:t>tanggal</w:t>
-      </w:r>
-      <w:r>
-        <w:rPr>
-          <w:spacing w:val="-16"/>
-        </w:rPr>
-        <w:t xml:space="preserve"> </w:t>
-      </w:r>
-      <w:r>
-        <w:t xml:space="preserve">30 Desember 2024 tentang Organisasi dan Tata Kerja Kementerian </w:t>
-      </w:r>
-      <w:r>
-        <w:rPr>
-          <w:spacing w:val="-2"/>
-        </w:rPr>
-        <w:t>Ketenagakerjaan;</w:t>
-      </w:r>
-    </w:p>
-    <w:p>
-      <w:pPr>
-        <w:pStyle w:val="ListParagraph"/>
-        <w:numPr>
-          <w:ilvl w:val="1"/>
-          <w:numId w:val="1"/>
-        </w:numPr>
-        <w:tabs>
-          <w:tab w:val="left" w:pos="2895"/>
-        </w:tabs>
-        <w:ind w:left="2895" w:right="359"/>
-        <w:jc w:val="both"/>
-      </w:pPr>
-      <w:r>
-        <w:t>Keputusan</w:t>
-      </w:r>
-      <w:r>
-        <w:rPr>
-          <w:spacing w:val="-16"/>
-        </w:rPr>
-        <w:t xml:space="preserve"> </w:t>
-      </w:r>
-      <w:r>
-        <w:t>Menteri</w:t>
-      </w:r>
-      <w:r>
-        <w:rPr>
-          <w:spacing w:val="-15"/>
-        </w:rPr>
-        <w:t xml:space="preserve"> </w:t>
-      </w:r>
-      <w:r>
-        <w:t>Ketenagakerjaan</w:t>
-      </w:r>
-      <w:r>
-        <w:rPr>
-          <w:spacing w:val="-14"/>
-        </w:rPr>
-        <w:t xml:space="preserve"> </w:t>
-      </w:r>
-      <w:r>
-        <w:t>Nomor</w:t>
-      </w:r>
-      <w:r>
-        <w:rPr>
-          <w:spacing w:val="-15"/>
-        </w:rPr>
-        <w:t xml:space="preserve"> </w:t>
-      </w:r>
-      <w:r>
-        <w:t>460</w:t>
-      </w:r>
-      <w:r>
-        <w:rPr>
-          <w:spacing w:val="-13"/>
-        </w:rPr>
-        <w:t xml:space="preserve"> </w:t>
-      </w:r>
-      <w:r>
-        <w:t>tanggal</w:t>
-      </w:r>
-      <w:r>
-        <w:rPr>
-          <w:spacing w:val="-16"/>
-        </w:rPr>
-        <w:t xml:space="preserve"> </w:t>
-      </w:r>
-      <w:r>
-        <w:t>23</w:t>
-      </w:r>
-      <w:r>
-        <w:rPr>
-          <w:spacing w:val="-12"/>
-        </w:rPr>
-        <w:t xml:space="preserve"> </w:t>
-      </w:r>
-      <w:r>
-        <w:t>Desember 2025,</w:t>
-      </w:r>
-      <w:r>
-        <w:rPr>
-          <w:spacing w:val="-4"/>
-        </w:rPr>
-        <w:t xml:space="preserve"> </w:t>
-      </w:r>
-      <w:r>
-        <w:t>tentang</w:t>
-      </w:r>
-      <w:r>
-        <w:rPr>
-          <w:spacing w:val="-7"/>
-        </w:rPr>
-        <w:t xml:space="preserve"> </w:t>
-      </w:r>
-      <w:r>
-        <w:t>Pengangkatan</w:t>
-      </w:r>
-      <w:r>
-        <w:rPr>
-          <w:spacing w:val="-7"/>
-        </w:rPr>
-        <w:t xml:space="preserve"> </w:t>
-      </w:r>
-      <w:r>
-        <w:t>Pejabat</w:t>
-      </w:r>
-      <w:r>
-        <w:rPr>
-          <w:spacing w:val="-4"/>
-        </w:rPr>
-        <w:t xml:space="preserve"> </w:t>
-      </w:r>
-      <w:r>
-        <w:t>Perbendaharaan</w:t>
-      </w:r>
-      <w:r>
-        <w:rPr>
-          <w:spacing w:val="-4"/>
-        </w:rPr>
-        <w:t xml:space="preserve"> </w:t>
-      </w:r>
-      <w:r>
-        <w:t>Negara</w:t>
-      </w:r>
-      <w:r>
-        <w:rPr>
-          <w:spacing w:val="-4"/>
-        </w:rPr>
-        <w:t xml:space="preserve"> </w:t>
-      </w:r>
-      <w:r>
-        <w:t>selaku Kuasa Pengguna Anggaran (KPA)/Kuasa Pengguna Barang (KPB) Daftar Isian Pelaksanaan Anggaran (DIPA) Bidang Ketenagakerjaan pada Kantor Pusat Kementerian Ketenagakerjaan;</w:t>
-      </w:r>
-    </w:p>
-    <w:p>
-      <w:pPr>
-        <w:pStyle w:val="ListParagraph"/>
-        <w:numPr>
-          <w:ilvl w:val="1"/>
-          <w:numId w:val="1"/>
-        </w:numPr>
-        <w:tabs>
-          <w:tab w:val="left" w:pos="2895"/>
-        </w:tabs>
-        <w:spacing w:line="242" w:lineRule="auto"/>
-        <w:ind w:left="2895" w:right="359"/>
-        <w:jc w:val="both"/>
-      </w:pPr>
-      <w:r>
-        <w:t>Surat</w:t>
-      </w:r>
-      <w:r>
-        <w:rPr>
-          <w:spacing w:val="-14"/>
-        </w:rPr>
-        <w:t xml:space="preserve"> </w:t>
-      </w:r>
-      <w:r>
-        <w:t>Keputusan</w:t>
-      </w:r>
-      <w:r>
-        <w:rPr>
-          <w:spacing w:val="-8"/>
-        </w:rPr>
-        <w:t xml:space="preserve"> </w:t>
-      </w:r>
-      <w:r>
-        <w:t>Kuasa</w:t>
-      </w:r>
-      <w:r>
-        <w:rPr>
-          <w:spacing w:val="-13"/>
-        </w:rPr>
-        <w:t xml:space="preserve"> </w:t>
-      </w:r>
-      <w:r>
-        <w:t>Pengguna</w:t>
-      </w:r>
-      <w:r>
-        <w:rPr>
-          <w:spacing w:val="-13"/>
-        </w:rPr>
-        <w:t xml:space="preserve"> </w:t>
-      </w:r>
-      <w:r>
-        <w:t>Anggaran</w:t>
-      </w:r>
-      <w:r>
-        <w:rPr>
-          <w:spacing w:val="-8"/>
-        </w:rPr>
-        <w:t xml:space="preserve"> </w:t>
-      </w:r>
-      <w:r>
-        <w:t>(KPA)</w:t>
-      </w:r>
-      <w:r>
-        <w:rPr>
-          <w:spacing w:val="-12"/>
-        </w:rPr>
-        <w:t xml:space="preserve"> </w:t>
-      </w:r>
-      <w:r>
-        <w:t>/Kuasa</w:t>
-      </w:r>
-      <w:r>
-        <w:rPr>
-          <w:spacing w:val="-13"/>
-        </w:rPr>
-        <w:t xml:space="preserve"> </w:t>
-      </w:r>
-      <w:r>
-        <w:t>Pengguna Barang</w:t>
-      </w:r>
-      <w:r>
-        <w:rPr>
-          <w:spacing w:val="-16"/>
-        </w:rPr>
-        <w:t xml:space="preserve"> </w:t>
-      </w:r>
-      <w:r>
-        <w:t>(KPB)</w:t>
-      </w:r>
-      <w:r>
-        <w:rPr>
-          <w:spacing w:val="-20"/>
-        </w:rPr>
-        <w:t xml:space="preserve"> </w:t>
-      </w:r>
-      <w:r>
-        <w:t>Sekretariat</w:t>
-      </w:r>
-      <w:r>
-        <w:rPr>
-          <w:spacing w:val="-15"/>
-        </w:rPr>
-        <w:t xml:space="preserve"> </w:t>
-      </w:r>
-      <w:r>
-        <w:t>Jenderal</w:t>
-      </w:r>
-      <w:r>
-        <w:rPr>
-          <w:spacing w:val="-15"/>
-        </w:rPr>
-        <w:t xml:space="preserve"> </w:t>
-      </w:r>
-      <w:r>
-        <w:t>NOMOR</w:t>
-      </w:r>
-      <w:r>
-        <w:rPr>
-          <w:spacing w:val="-16"/>
-        </w:rPr>
-        <w:t xml:space="preserve"> </w:t>
-      </w:r>
-      <w:r>
-        <w:t>1/02/KU.04/I/2026</w:t>
-      </w:r>
-      <w:r>
-        <w:rPr>
-          <w:spacing w:val="-17"/>
-        </w:rPr>
-        <w:t xml:space="preserve"> </w:t>
-      </w:r>
-      <w:r>
-        <w:t>tanggal</w:t>
-      </w:r>
-    </w:p>
-    <w:p>
-      <w:pPr>
-        <w:pStyle w:val="BodyText"/>
-        <w:spacing w:line="237" w:lineRule="auto"/>
-        <w:ind w:left="2895" w:right="361"/>
-        <w:jc w:val="both"/>
-      </w:pPr>
-      <w:r>
-        <w:t>2 Januari 2026 tentang Pejabat Pembuat Komitmen DIPA Unit Sekretariat Jenderal Kementerian Ketenagakerjaan Tahun 2026;</w:t>
-      </w:r>
-    </w:p>
-    <w:p>
-      <w:pPr>
-        <w:pStyle w:val="ListParagraph"/>
-        <w:numPr>
-          <w:ilvl w:val="1"/>
-          <w:numId w:val="1"/>
-        </w:numPr>
-        <w:tabs>
-          <w:tab w:val="left" w:pos="2895"/>
-        </w:tabs>
-        <w:ind w:left="2895" w:right="355"/>
-        <w:jc w:val="both"/>
-      </w:pPr>
-      <w:r>
-        <w:t>DIPA Unit Sekretariat Jenderal Kementerian Ketenagakerjaan Tahun 2026,</w:t>
-      </w:r>
-      <w:r>
-        <w:rPr>
-          <w:spacing w:val="-8"/>
-        </w:rPr>
-        <w:t xml:space="preserve"> </w:t>
-      </w:r>
-      <w:r>
-        <w:t>NOMOR</w:t>
-      </w:r>
-      <w:r>
-        <w:rPr>
-          <w:spacing w:val="-5"/>
-        </w:rPr>
-        <w:t xml:space="preserve"> </w:t>
-      </w:r>
-      <w:r>
-        <w:t>:</w:t>
-      </w:r>
-      <w:r>
-        <w:rPr>
-          <w:spacing w:val="-4"/>
-        </w:rPr>
-        <w:t xml:space="preserve"> </w:t>
-      </w:r>
-      <w:r>
-        <w:t>SP</w:t>
-      </w:r>
-      <w:r>
-        <w:rPr>
-          <w:spacing w:val="-8"/>
-        </w:rPr>
-        <w:t xml:space="preserve"> </w:t>
-      </w:r>
-      <w:r>
-        <w:t>DIPA-026.01.1.450938/2026</w:t>
-      </w:r>
-      <w:r>
-        <w:rPr>
-          <w:spacing w:val="-4"/>
-        </w:rPr>
-        <w:t xml:space="preserve"> </w:t>
-      </w:r>
-      <w:r>
-        <w:t>tanggal</w:t>
-      </w:r>
-      <w:r>
-        <w:rPr>
-          <w:spacing w:val="-5"/>
-        </w:rPr>
-        <w:t xml:space="preserve"> </w:t>
-      </w:r>
-      <w:r>
-        <w:t>1</w:t>
-      </w:r>
-      <w:r>
-        <w:rPr>
-          <w:spacing w:val="-4"/>
-        </w:rPr>
-        <w:t xml:space="preserve"> </w:t>
-      </w:r>
-      <w:r>
-        <w:t>Desember</w:t>
       </w:r>
     </w:p>
     <w:p>
@@ -1226,12 +1391,78 @@
         <w:spacing w:before="2"/>
         <w:ind w:left="2895"/>
       </w:pPr>
-      <w:r>
-        <w:rPr>
-          <w:spacing w:val="-2"/>
-        </w:rPr>
-        <w:t>2025.</w:t>
-      </w:r>
+    </w:p>
+    <w:p>
+      <w:pPr>
+        <w:pStyle w:val="BodyText"/>
+        <w:spacing w:before="248"/>
+      </w:pPr>
+    </w:p>
+    <w:p>
+      <w:pPr>
+        <w:pStyle w:val="BodyText"/>
+        <w:spacing w:before="248"/>
+      </w:pPr>
+    </w:p>
+    <w:p>
+      <w:pPr>
+        <w:pStyle w:val="BodyText"/>
+        <w:spacing w:before="248"/>
+      </w:pPr>
+    </w:p>
+    <w:p>
+      <w:pPr>
+        <w:pStyle w:val="BodyText"/>
+        <w:spacing w:before="248"/>
+      </w:pPr>
+    </w:p>
+    <w:p>
+      <w:pPr>
+        <w:pStyle w:val="BodyText"/>
+        <w:spacing w:before="248"/>
+      </w:pPr>
+    </w:p>
+    <w:p>
+      <w:pPr>
+        <w:pStyle w:val="BodyText"/>
+        <w:spacing w:before="248"/>
+      </w:pPr>
+    </w:p>
+    <w:p>
+      <w:pPr>
+        <w:pStyle w:val="BodyText"/>
+        <w:spacing w:before="248"/>
+      </w:pPr>
+    </w:p>
+    <w:p>
+      <w:pPr>
+        <w:pStyle w:val="BodyText"/>
+        <w:spacing w:before="248"/>
+      </w:pPr>
+    </w:p>
+    <w:p>
+      <w:pPr>
+        <w:pStyle w:val="BodyText"/>
+        <w:spacing w:before="248"/>
+      </w:pPr>
+    </w:p>
+    <w:p>
+      <w:pPr>
+        <w:pStyle w:val="BodyText"/>
+        <w:spacing w:before="248"/>
+      </w:pPr>
+    </w:p>
+    <w:p>
+      <w:pPr>
+        <w:pStyle w:val="BodyText"/>
+        <w:spacing w:before="248"/>
+      </w:pPr>
+    </w:p>
+    <w:p>
+      <w:pPr>
+        <w:pStyle w:val="BodyText"/>
+        <w:spacing w:before="248"/>
+      </w:pPr>
     </w:p>
     <w:p>
       <w:pPr>
@@ -1297,7 +1528,21 @@
         <w:rPr>
           <w:lang w:val="en-US"/>
         </w:rPr>
-        <w:t>{{isi_laporan}}</w:t>
+        <w:t>{{</w:t>
+      </w:r>
+      <w:proofErr w:type="spellStart"/>
+      <w:r>
+        <w:rPr>
+          <w:lang w:val="en-US"/>
+        </w:rPr>
+        <w:t>isi_laporan</w:t>
+      </w:r>
+      <w:proofErr w:type="spellEnd"/>
+      <w:r>
+        <w:rPr>
+          <w:lang w:val="en-US"/>
+        </w:rPr>
+        <w:t>}}</w:t>
       </w:r>
     </w:p>
     <w:p>
@@ -1416,13 +1661,13 @@
         </w:tabs>
         <w:jc w:val="right"/>
         <w:rPr>
-          <w:lang w:val="en-US"/>
+          <w:lang w:val="sv-SE"/>
         </w:rPr>
       </w:pPr>
       <w:r>
         <w:rPr>
           <w:spacing w:val="-16"/>
-          <w:lang w:val="en-US"/>
+          <w:lang w:val="sv-SE"/>
         </w:rPr>
         <w:t>Jakarta,</w:t>
       </w:r>
@@ -1434,25 +1679,25 @@
       </w:r>
       <w:r>
         <w:rPr>
-          <w:lang w:val="en-US"/>
+          <w:lang w:val="sv-SE"/>
         </w:rPr>
         <w:t>{{</w:t>
       </w:r>
       <w:r>
         <w:rPr>
-          <w:lang w:val="en-US"/>
+          <w:lang w:val="sv-SE"/>
         </w:rPr>
         <w:t>tanggal_</w:t>
       </w:r>
       <w:r>
         <w:rPr>
-          <w:lang w:val="en-US"/>
+          <w:lang w:val="sv-SE"/>
         </w:rPr>
         <w:t>dikeluarkan</w:t>
       </w:r>
       <w:r>
         <w:rPr>
-          <w:lang w:val="en-US"/>
+          <w:lang w:val="sv-SE"/>
         </w:rPr>
         <w:t>}}</w:t>
       </w:r>
@@ -1569,7 +1814,23 @@
                 <w:spacing w:val="-2"/>
                 <w:lang w:val="en-US"/>
               </w:rPr>
-              <w:t>{{no_urut}}</w:t>
+              <w:t>{{</w:t>
+            </w:r>
+            <w:proofErr w:type="spellStart"/>
+            <w:r>
+              <w:rPr>
+                <w:spacing w:val="-2"/>
+                <w:lang w:val="en-US"/>
+              </w:rPr>
+              <w:t>no_urut</w:t>
+            </w:r>
+            <w:proofErr w:type="spellEnd"/>
+            <w:r>
+              <w:rPr>
+                <w:spacing w:val="-2"/>
+                <w:lang w:val="en-US"/>
+              </w:rPr>
+              <w:t>}}</w:t>
             </w:r>
           </w:p>
         </w:tc>
@@ -1590,7 +1851,21 @@
               <w:rPr>
                 <w:lang w:val="en-US"/>
               </w:rPr>
-              <w:t>{{nama_petugas_satu}}</w:t>
+              <w:t>{{</w:t>
+            </w:r>
+            <w:proofErr w:type="spellStart"/>
+            <w:r>
+              <w:rPr>
+                <w:lang w:val="en-US"/>
+              </w:rPr>
+              <w:t>nama_petugas_satu</w:t>
+            </w:r>
+            <w:proofErr w:type="spellEnd"/>
+            <w:r>
+              <w:rPr>
+                <w:lang w:val="en-US"/>
+              </w:rPr>
+              <w:t>}}</w:t>
             </w:r>
           </w:p>
           <w:p>
@@ -1608,12 +1883,14 @@
               </w:rPr>
               <w:t>NIP. {{</w:t>
             </w:r>
+            <w:proofErr w:type="spellStart"/>
             <w:r>
               <w:rPr>
                 <w:lang w:val="en-US"/>
               </w:rPr>
               <w:t>nip_petugas_satu</w:t>
             </w:r>
+            <w:proofErr w:type="spellEnd"/>
             <w:r>
               <w:rPr>
                 <w:lang w:val="en-US"/>
@@ -1637,13 +1914,37 @@
                 <w:spacing w:val="-2"/>
                 <w:lang w:val="en-US"/>
               </w:rPr>
-              <w:t>{{no_urut}}</w:t>
-            </w:r>
-            <w:r>
-              <w:rPr>
-                <w:spacing w:val="-2"/>
-              </w:rPr>
-              <w:t>……………………..</w:t>
+              <w:t>{{</w:t>
+            </w:r>
+            <w:proofErr w:type="spellStart"/>
+            <w:r>
+              <w:rPr>
+                <w:spacing w:val="-2"/>
+                <w:lang w:val="en-US"/>
+              </w:rPr>
+              <w:t>no_urut</w:t>
+            </w:r>
+            <w:proofErr w:type="spellEnd"/>
+            <w:proofErr w:type="gramStart"/>
+            <w:r>
+              <w:rPr>
+                <w:spacing w:val="-2"/>
+                <w:lang w:val="en-US"/>
+              </w:rPr>
+              <w:t>}}</w:t>
+            </w:r>
+            <w:r>
+              <w:rPr>
+                <w:spacing w:val="-2"/>
+              </w:rPr>
+              <w:t>…</w:t>
+            </w:r>
+            <w:proofErr w:type="gramEnd"/>
+            <w:r>
+              <w:rPr>
+                <w:spacing w:val="-2"/>
+              </w:rPr>
+              <w:t>…………………..</w:t>
             </w:r>
           </w:p>
         </w:tc>
@@ -1676,7 +1977,23 @@
                 <w:spacing w:val="-2"/>
                 <w:lang w:val="en-US"/>
               </w:rPr>
-              <w:t>{{no_urut}}</w:t>
+              <w:t>{{</w:t>
+            </w:r>
+            <w:proofErr w:type="spellStart"/>
+            <w:r>
+              <w:rPr>
+                <w:spacing w:val="-2"/>
+                <w:lang w:val="en-US"/>
+              </w:rPr>
+              <w:t>no_urut</w:t>
+            </w:r>
+            <w:proofErr w:type="spellEnd"/>
+            <w:r>
+              <w:rPr>
+                <w:spacing w:val="-2"/>
+                <w:lang w:val="en-US"/>
+              </w:rPr>
+              <w:t>}}</w:t>
             </w:r>
           </w:p>
         </w:tc>
@@ -1689,9 +2006,6 @@
               <w:pStyle w:val="TableParagraph"/>
               <w:spacing w:line="247" w:lineRule="exact"/>
               <w:ind w:left="145"/>
-              <w:rPr>
-                <w:lang w:val="en-US"/>
-              </w:rPr>
             </w:pPr>
           </w:p>
           <w:p>
@@ -1699,14 +2013,8 @@
               <w:pStyle w:val="TableParagraph"/>
               <w:spacing w:line="247" w:lineRule="exact"/>
               <w:ind w:left="145"/>
-              <w:rPr>
-                <w:lang w:val="en-US"/>
-              </w:rPr>
-            </w:pPr>
-            <w:r>
-              <w:rPr>
-                <w:lang w:val="en-US"/>
-              </w:rPr>
+            </w:pPr>
+            <w:r>
               <w:t>{{nama_petugas_dua}}</w:t>
             </w:r>
           </w:p>
@@ -1717,15 +2025,9 @@
               <w:ind w:left="145"/>
             </w:pPr>
             <w:r>
-              <w:rPr>
-                <w:lang w:val="en-US"/>
-              </w:rPr>
               <w:t xml:space="preserve">NIP. </w:t>
             </w:r>
             <w:r>
-              <w:rPr>
-                <w:lang w:val="en-US"/>
-              </w:rPr>
               <w:t>{{nip_petugas_dua}}</w:t>
             </w:r>
           </w:p>
@@ -1740,7 +2042,6 @@
               <w:ind w:right="51"/>
               <w:rPr>
                 <w:spacing w:val="-2"/>
-                <w:lang w:val="en-US"/>
               </w:rPr>
             </w:pPr>
           </w:p>
@@ -1754,7 +2055,15 @@
                 <w:spacing w:val="-2"/>
                 <w:lang w:val="en-US"/>
               </w:rPr>
-              <w:t>{{no</w:t>
+              <w:t>{{</w:t>
+            </w:r>
+            <w:proofErr w:type="spellStart"/>
+            <w:r>
+              <w:rPr>
+                <w:spacing w:val="-2"/>
+                <w:lang w:val="en-US"/>
+              </w:rPr>
+              <w:t>no</w:t>
             </w:r>
             <w:r>
               <w:rPr>
@@ -1763,6 +2072,8 @@
               </w:rPr>
               <w:t>_urut</w:t>
             </w:r>
+            <w:proofErr w:type="spellEnd"/>
+            <w:proofErr w:type="gramStart"/>
             <w:r>
               <w:rPr>
                 <w:spacing w:val="-2"/>
@@ -1774,7 +2085,14 @@
               <w:rPr>
                 <w:spacing w:val="-2"/>
               </w:rPr>
-              <w:t>……………………..</w:t>
+              <w:t>…</w:t>
+            </w:r>
+            <w:proofErr w:type="gramEnd"/>
+            <w:r>
+              <w:rPr>
+                <w:spacing w:val="-2"/>
+              </w:rPr>
+              <w:t>…………………..</w:t>
             </w:r>
           </w:p>
         </w:tc>
@@ -1807,7 +2125,23 @@
                 <w:spacing w:val="-2"/>
                 <w:lang w:val="en-US"/>
               </w:rPr>
-              <w:t>{{no_urut}}</w:t>
+              <w:t>{{</w:t>
+            </w:r>
+            <w:proofErr w:type="spellStart"/>
+            <w:r>
+              <w:rPr>
+                <w:spacing w:val="-2"/>
+                <w:lang w:val="en-US"/>
+              </w:rPr>
+              <w:t>no_urut</w:t>
+            </w:r>
+            <w:proofErr w:type="spellEnd"/>
+            <w:r>
+              <w:rPr>
+                <w:spacing w:val="-2"/>
+                <w:lang w:val="en-US"/>
+              </w:rPr>
+              <w:t>}}</w:t>
             </w:r>
           </w:p>
         </w:tc>
@@ -1830,14 +2164,8 @@
               <w:pStyle w:val="TableParagraph"/>
               <w:spacing w:line="247" w:lineRule="exact"/>
               <w:ind w:left="145"/>
-              <w:rPr>
-                <w:lang w:val="en-US"/>
-              </w:rPr>
-            </w:pPr>
-            <w:r>
-              <w:rPr>
-                <w:lang w:val="en-US"/>
-              </w:rPr>
+            </w:pPr>
+            <w:r>
               <w:t>{{nama_petugas_tiga}}</w:t>
             </w:r>
           </w:p>
@@ -1848,15 +2176,9 @@
               <w:ind w:left="145"/>
             </w:pPr>
             <w:r>
-              <w:rPr>
-                <w:lang w:val="en-US"/>
-              </w:rPr>
               <w:t xml:space="preserve">NIP. </w:t>
             </w:r>
             <w:r>
-              <w:rPr>
-                <w:lang w:val="en-US"/>
-              </w:rPr>
               <w:t>{{nip_petugas_tiga}}</w:t>
             </w:r>
           </w:p>
@@ -1886,13 +2208,37 @@
                 <w:spacing w:val="-2"/>
                 <w:lang w:val="en-US"/>
               </w:rPr>
-              <w:t>{{no_urut}}</w:t>
-            </w:r>
-            <w:r>
-              <w:rPr>
-                <w:spacing w:val="-2"/>
-              </w:rPr>
-              <w:t>……………………..</w:t>
+              <w:t>{{</w:t>
+            </w:r>
+            <w:proofErr w:type="spellStart"/>
+            <w:r>
+              <w:rPr>
+                <w:spacing w:val="-2"/>
+                <w:lang w:val="en-US"/>
+              </w:rPr>
+              <w:t>no_urut</w:t>
+            </w:r>
+            <w:proofErr w:type="spellEnd"/>
+            <w:proofErr w:type="gramStart"/>
+            <w:r>
+              <w:rPr>
+                <w:spacing w:val="-2"/>
+                <w:lang w:val="en-US"/>
+              </w:rPr>
+              <w:t>}}</w:t>
+            </w:r>
+            <w:r>
+              <w:rPr>
+                <w:spacing w:val="-2"/>
+              </w:rPr>
+              <w:t>…</w:t>
+            </w:r>
+            <w:proofErr w:type="gramEnd"/>
+            <w:r>
+              <w:rPr>
+                <w:spacing w:val="-2"/>
+              </w:rPr>
+              <w:t>…………………..</w:t>
             </w:r>
           </w:p>
         </w:tc>
@@ -1925,7 +2271,23 @@
                 <w:spacing w:val="-2"/>
                 <w:lang w:val="en-US"/>
               </w:rPr>
-              <w:t>{{no_urut}}</w:t>
+              <w:t>{{</w:t>
+            </w:r>
+            <w:proofErr w:type="spellStart"/>
+            <w:r>
+              <w:rPr>
+                <w:spacing w:val="-2"/>
+                <w:lang w:val="en-US"/>
+              </w:rPr>
+              <w:t>no_urut</w:t>
+            </w:r>
+            <w:proofErr w:type="spellEnd"/>
+            <w:r>
+              <w:rPr>
+                <w:spacing w:val="-2"/>
+                <w:lang w:val="en-US"/>
+              </w:rPr>
+              <w:t>}}</w:t>
             </w:r>
           </w:p>
         </w:tc>
@@ -1948,14 +2310,8 @@
               <w:pStyle w:val="TableParagraph"/>
               <w:spacing w:line="247" w:lineRule="exact"/>
               <w:ind w:left="145"/>
-              <w:rPr>
-                <w:lang w:val="en-US"/>
-              </w:rPr>
-            </w:pPr>
-            <w:r>
-              <w:rPr>
-                <w:lang w:val="en-US"/>
-              </w:rPr>
+            </w:pPr>
+            <w:r>
               <w:t>{{nama_petugas_empat}}</w:t>
             </w:r>
           </w:p>
@@ -1966,15 +2322,9 @@
               <w:ind w:left="145"/>
             </w:pPr>
             <w:r>
-              <w:rPr>
-                <w:lang w:val="en-US"/>
-              </w:rPr>
               <w:t xml:space="preserve">NIP. </w:t>
             </w:r>
             <w:r>
-              <w:rPr>
-                <w:lang w:val="en-US"/>
-              </w:rPr>
               <w:t>{{nip_petugas_empat}}</w:t>
             </w:r>
           </w:p>
@@ -2006,13 +2356,37 @@
                 <w:spacing w:val="-2"/>
                 <w:lang w:val="en-US"/>
               </w:rPr>
-              <w:t>{{no_urut}}</w:t>
-            </w:r>
-            <w:r>
-              <w:rPr>
-                <w:spacing w:val="-2"/>
-              </w:rPr>
-              <w:t>……………………..</w:t>
+              <w:t>{{</w:t>
+            </w:r>
+            <w:proofErr w:type="spellStart"/>
+            <w:r>
+              <w:rPr>
+                <w:spacing w:val="-2"/>
+                <w:lang w:val="en-US"/>
+              </w:rPr>
+              <w:t>no_urut</w:t>
+            </w:r>
+            <w:proofErr w:type="spellEnd"/>
+            <w:proofErr w:type="gramStart"/>
+            <w:r>
+              <w:rPr>
+                <w:spacing w:val="-2"/>
+                <w:lang w:val="en-US"/>
+              </w:rPr>
+              <w:t>}}</w:t>
+            </w:r>
+            <w:r>
+              <w:rPr>
+                <w:spacing w:val="-2"/>
+              </w:rPr>
+              <w:t>…</w:t>
+            </w:r>
+            <w:proofErr w:type="gramEnd"/>
+            <w:r>
+              <w:rPr>
+                <w:spacing w:val="-2"/>
+              </w:rPr>
+              <w:t>…………………..</w:t>
             </w:r>
           </w:p>
         </w:tc>
@@ -2045,7 +2419,23 @@
                 <w:spacing w:val="-2"/>
                 <w:lang w:val="en-US"/>
               </w:rPr>
-              <w:t>{{no_urut}}</w:t>
+              <w:t>{{</w:t>
+            </w:r>
+            <w:proofErr w:type="spellStart"/>
+            <w:r>
+              <w:rPr>
+                <w:spacing w:val="-2"/>
+                <w:lang w:val="en-US"/>
+              </w:rPr>
+              <w:t>no_urut</w:t>
+            </w:r>
+            <w:proofErr w:type="spellEnd"/>
+            <w:r>
+              <w:rPr>
+                <w:spacing w:val="-2"/>
+                <w:lang w:val="en-US"/>
+              </w:rPr>
+              <w:t>}}</w:t>
             </w:r>
           </w:p>
         </w:tc>
@@ -2068,14 +2458,8 @@
               <w:pStyle w:val="TableParagraph"/>
               <w:spacing w:line="247" w:lineRule="exact"/>
               <w:ind w:left="145"/>
-              <w:rPr>
-                <w:lang w:val="en-US"/>
-              </w:rPr>
-            </w:pPr>
-            <w:r>
-              <w:rPr>
-                <w:lang w:val="en-US"/>
-              </w:rPr>
+            </w:pPr>
+            <w:r>
               <w:t>{{nama_petugas_lima}}</w:t>
             </w:r>
           </w:p>
@@ -2086,15 +2470,9 @@
               <w:ind w:left="145"/>
             </w:pPr>
             <w:r>
-              <w:rPr>
-                <w:lang w:val="en-US"/>
-              </w:rPr>
               <w:t xml:space="preserve">NIP. </w:t>
             </w:r>
             <w:r>
-              <w:rPr>
-                <w:lang w:val="en-US"/>
-              </w:rPr>
               <w:t>{{nip_petugas_lima}}</w:t>
             </w:r>
           </w:p>
@@ -2126,13 +2504,37 @@
                 <w:spacing w:val="-2"/>
                 <w:lang w:val="en-US"/>
               </w:rPr>
-              <w:t>{{no_urut}}</w:t>
-            </w:r>
-            <w:r>
-              <w:rPr>
-                <w:spacing w:val="-2"/>
-              </w:rPr>
-              <w:t>……………………..</w:t>
+              <w:t>{{</w:t>
+            </w:r>
+            <w:proofErr w:type="spellStart"/>
+            <w:r>
+              <w:rPr>
+                <w:spacing w:val="-2"/>
+                <w:lang w:val="en-US"/>
+              </w:rPr>
+              <w:t>no_urut</w:t>
+            </w:r>
+            <w:proofErr w:type="spellEnd"/>
+            <w:proofErr w:type="gramStart"/>
+            <w:r>
+              <w:rPr>
+                <w:spacing w:val="-2"/>
+                <w:lang w:val="en-US"/>
+              </w:rPr>
+              <w:t>}}</w:t>
+            </w:r>
+            <w:r>
+              <w:rPr>
+                <w:spacing w:val="-2"/>
+              </w:rPr>
+              <w:t>…</w:t>
+            </w:r>
+            <w:proofErr w:type="gramEnd"/>
+            <w:r>
+              <w:rPr>
+                <w:spacing w:val="-2"/>
+              </w:rPr>
+              <w:t>…………………..</w:t>
             </w:r>
           </w:p>
         </w:tc>
@@ -2165,7 +2567,23 @@
                 <w:spacing w:val="-2"/>
                 <w:lang w:val="en-US"/>
               </w:rPr>
-              <w:t>{{no_urut}}</w:t>
+              <w:t>{{</w:t>
+            </w:r>
+            <w:proofErr w:type="spellStart"/>
+            <w:r>
+              <w:rPr>
+                <w:spacing w:val="-2"/>
+                <w:lang w:val="en-US"/>
+              </w:rPr>
+              <w:t>no_urut</w:t>
+            </w:r>
+            <w:proofErr w:type="spellEnd"/>
+            <w:r>
+              <w:rPr>
+                <w:spacing w:val="-2"/>
+                <w:lang w:val="en-US"/>
+              </w:rPr>
+              <w:t>}}</w:t>
             </w:r>
           </w:p>
         </w:tc>
@@ -2189,12 +2607,12 @@
               <w:spacing w:line="247" w:lineRule="exact"/>
               <w:ind w:left="145"/>
               <w:rPr>
-                <w:lang w:val="en-US"/>
-              </w:rPr>
-            </w:pPr>
-            <w:r>
-              <w:rPr>
-                <w:lang w:val="en-US"/>
+                <w:lang w:val="sv-SE"/>
+              </w:rPr>
+            </w:pPr>
+            <w:r>
+              <w:rPr>
+                <w:lang w:val="sv-SE"/>
               </w:rPr>
               <w:t>{{nama_petugas_enam}}</w:t>
             </w:r>
@@ -2207,13 +2625,13 @@
             </w:pPr>
             <w:r>
               <w:rPr>
-                <w:lang w:val="en-US"/>
+                <w:lang w:val="sv-SE"/>
               </w:rPr>
               <w:t xml:space="preserve">NIP. </w:t>
             </w:r>
             <w:r>
               <w:rPr>
-                <w:lang w:val="en-US"/>
+                <w:lang w:val="sv-SE"/>
               </w:rPr>
               <w:t>{{nip_petugas_enam}}</w:t>
             </w:r>
@@ -2247,13 +2665,37 @@
                 <w:spacing w:val="-2"/>
                 <w:lang w:val="en-US"/>
               </w:rPr>
-              <w:t>{{no_urut}}</w:t>
-            </w:r>
-            <w:r>
-              <w:rPr>
-                <w:spacing w:val="-2"/>
-              </w:rPr>
-              <w:t>……………………..</w:t>
+              <w:t>{{</w:t>
+            </w:r>
+            <w:proofErr w:type="spellStart"/>
+            <w:r>
+              <w:rPr>
+                <w:spacing w:val="-2"/>
+                <w:lang w:val="en-US"/>
+              </w:rPr>
+              <w:t>no_urut</w:t>
+            </w:r>
+            <w:proofErr w:type="spellEnd"/>
+            <w:proofErr w:type="gramStart"/>
+            <w:r>
+              <w:rPr>
+                <w:spacing w:val="-2"/>
+                <w:lang w:val="en-US"/>
+              </w:rPr>
+              <w:t>}}</w:t>
+            </w:r>
+            <w:r>
+              <w:rPr>
+                <w:spacing w:val="-2"/>
+              </w:rPr>
+              <w:t>…</w:t>
+            </w:r>
+            <w:proofErr w:type="gramEnd"/>
+            <w:r>
+              <w:rPr>
+                <w:spacing w:val="-2"/>
+              </w:rPr>
+              <w:t>…………………..</w:t>
             </w:r>
           </w:p>
         </w:tc>
@@ -2290,7 +2732,23 @@
                 <w:spacing w:val="-2"/>
                 <w:lang w:val="en-US"/>
               </w:rPr>
-              <w:t>{{no_urut}}</w:t>
+              <w:t>{{</w:t>
+            </w:r>
+            <w:proofErr w:type="spellStart"/>
+            <w:r>
+              <w:rPr>
+                <w:spacing w:val="-2"/>
+                <w:lang w:val="en-US"/>
+              </w:rPr>
+              <w:t>no_urut</w:t>
+            </w:r>
+            <w:proofErr w:type="spellEnd"/>
+            <w:r>
+              <w:rPr>
+                <w:spacing w:val="-2"/>
+                <w:lang w:val="en-US"/>
+              </w:rPr>
+              <w:t>}}</w:t>
             </w:r>
           </w:p>
         </w:tc>
@@ -2303,9 +2761,6 @@
               <w:pStyle w:val="TableParagraph"/>
               <w:spacing w:line="247" w:lineRule="exact"/>
               <w:ind w:left="145"/>
-              <w:rPr>
-                <w:lang w:val="en-US"/>
-              </w:rPr>
             </w:pPr>
           </w:p>
           <w:p>
@@ -2313,9 +2768,6 @@
               <w:pStyle w:val="TableParagraph"/>
               <w:spacing w:line="247" w:lineRule="exact"/>
               <w:ind w:left="145"/>
-              <w:rPr>
-                <w:lang w:val="en-US"/>
-              </w:rPr>
             </w:pPr>
           </w:p>
           <w:p>
@@ -2323,14 +2775,8 @@
               <w:pStyle w:val="TableParagraph"/>
               <w:spacing w:line="247" w:lineRule="exact"/>
               <w:ind w:left="145"/>
-              <w:rPr>
-                <w:lang w:val="en-US"/>
-              </w:rPr>
-            </w:pPr>
-            <w:r>
-              <w:rPr>
-                <w:lang w:val="en-US"/>
-              </w:rPr>
+            </w:pPr>
+            <w:r>
               <w:t>{{nama_petugas_tujuh}}</w:t>
             </w:r>
           </w:p>
@@ -2344,15 +2790,9 @@
               </w:rPr>
             </w:pPr>
             <w:r>
-              <w:rPr>
-                <w:lang w:val="en-US"/>
-              </w:rPr>
               <w:t xml:space="preserve">  NIP. </w:t>
             </w:r>
             <w:r>
-              <w:rPr>
-                <w:lang w:val="en-US"/>
-              </w:rPr>
               <w:t>{{nip_petugas_tujuh}}</w:t>
             </w:r>
           </w:p>
@@ -2367,7 +2807,6 @@
               <w:spacing w:before="111"/>
               <w:rPr>
                 <w:spacing w:val="-2"/>
-                <w:lang w:val="en-US"/>
               </w:rPr>
             </w:pPr>
           </w:p>
@@ -2385,13 +2824,37 @@
                 <w:spacing w:val="-2"/>
                 <w:lang w:val="en-US"/>
               </w:rPr>
-              <w:t>{{no_urut}}</w:t>
-            </w:r>
-            <w:r>
-              <w:rPr>
-                <w:spacing w:val="-2"/>
-              </w:rPr>
-              <w:t>……………………..</w:t>
+              <w:t>{{</w:t>
+            </w:r>
+            <w:proofErr w:type="spellStart"/>
+            <w:r>
+              <w:rPr>
+                <w:spacing w:val="-2"/>
+                <w:lang w:val="en-US"/>
+              </w:rPr>
+              <w:t>no_urut</w:t>
+            </w:r>
+            <w:proofErr w:type="spellEnd"/>
+            <w:proofErr w:type="gramStart"/>
+            <w:r>
+              <w:rPr>
+                <w:spacing w:val="-2"/>
+                <w:lang w:val="en-US"/>
+              </w:rPr>
+              <w:t>}}</w:t>
+            </w:r>
+            <w:r>
+              <w:rPr>
+                <w:spacing w:val="-2"/>
+              </w:rPr>
+              <w:t>…</w:t>
+            </w:r>
+            <w:proofErr w:type="gramEnd"/>
+            <w:r>
+              <w:rPr>
+                <w:spacing w:val="-2"/>
+              </w:rPr>
+              <w:t>…………………..</w:t>
             </w:r>
           </w:p>
         </w:tc>
@@ -2488,6 +2951,14 @@
         <w:tblStyle w:val="TableGrid"/>
         <w:tblW w:w="0" w:type="auto"/>
         <w:jc w:val="center"/>
+        <w:tblBorders>
+          <w:top w:val="none" w:sz="0" w:space="0" w:color="auto"/>
+          <w:left w:val="none" w:sz="0" w:space="0" w:color="auto"/>
+          <w:bottom w:val="none" w:sz="0" w:space="0" w:color="auto"/>
+          <w:right w:val="none" w:sz="0" w:space="0" w:color="auto"/>
+          <w:insideH w:val="none" w:sz="0" w:space="0" w:color="auto"/>
+          <w:insideV w:val="none" w:sz="0" w:space="0" w:color="auto"/>
+        </w:tblBorders>
         <w:tblLook w:val="04A0" w:firstRow="1" w:lastRow="0" w:firstColumn="1" w:lastColumn="0" w:noHBand="0" w:noVBand="1"/>
       </w:tblPr>
       <w:tblGrid>
@@ -2516,7 +2987,21 @@
               <w:rPr>
                 <w:lang w:val="en-US"/>
               </w:rPr>
-              <w:t>{{foto_dokumentasi_satu}}</w:t>
+              <w:t>{{</w:t>
+            </w:r>
+            <w:proofErr w:type="spellStart"/>
+            <w:r>
+              <w:rPr>
+                <w:lang w:val="en-US"/>
+              </w:rPr>
+              <w:t>foto_dokumentasi_satu</w:t>
+            </w:r>
+            <w:proofErr w:type="spellEnd"/>
+            <w:r>
+              <w:rPr>
+                <w:lang w:val="en-US"/>
+              </w:rPr>
+              <w:t>}}</w:t>
             </w:r>
           </w:p>
         </w:tc>
@@ -2544,7 +3029,21 @@
               <w:rPr>
                 <w:lang w:val="en-US"/>
               </w:rPr>
-              <w:t>{{foto_dokumentasi_dua}}</w:t>
+              <w:t>{{</w:t>
+            </w:r>
+            <w:proofErr w:type="spellStart"/>
+            <w:r>
+              <w:rPr>
+                <w:lang w:val="en-US"/>
+              </w:rPr>
+              <w:t>foto_dokumentasi_dua</w:t>
+            </w:r>
+            <w:proofErr w:type="spellEnd"/>
+            <w:r>
+              <w:rPr>
+                <w:lang w:val="en-US"/>
+              </w:rPr>
+              <w:t>}}</w:t>
             </w:r>
           </w:p>
         </w:tc>
@@ -2572,7 +3071,21 @@
               <w:rPr>
                 <w:lang w:val="en-US"/>
               </w:rPr>
-              <w:t>{{foto_dokumentasi_tiga}}</w:t>
+              <w:t>{{</w:t>
+            </w:r>
+            <w:proofErr w:type="spellStart"/>
+            <w:r>
+              <w:rPr>
+                <w:lang w:val="en-US"/>
+              </w:rPr>
+              <w:t>foto_dokumentasi_tiga</w:t>
+            </w:r>
+            <w:proofErr w:type="spellEnd"/>
+            <w:r>
+              <w:rPr>
+                <w:lang w:val="en-US"/>
+              </w:rPr>
+              <w:t>}}</w:t>
             </w:r>
           </w:p>
         </w:tc>
@@ -2593,6 +3106,16 @@
               <w:spacing w:before="132" w:after="1"/>
               <w:jc w:val="center"/>
               <w:rPr>
+                <w:lang w:val="en-US"/>
+              </w:rPr>
+            </w:pPr>
+          </w:p>
+          <w:p>
+            <w:pPr>
+              <w:pStyle w:val="BodyText"/>
+              <w:spacing w:before="132" w:after="1"/>
+              <w:jc w:val="center"/>
+              <w:rPr>
                 <w:rFonts w:ascii="Arial"/>
                 <w:b/>
                 <w:sz w:val="20"/>
@@ -2602,7 +3125,21 @@
               <w:rPr>
                 <w:lang w:val="en-US"/>
               </w:rPr>
-              <w:t>{{foto_dokumentasi_empat}}</w:t>
+              <w:t>{{</w:t>
+            </w:r>
+            <w:proofErr w:type="spellStart"/>
+            <w:r>
+              <w:rPr>
+                <w:lang w:val="en-US"/>
+              </w:rPr>
+              <w:t>foto_dokumentasi_empat</w:t>
+            </w:r>
+            <w:proofErr w:type="spellEnd"/>
+            <w:r>
+              <w:rPr>
+                <w:lang w:val="en-US"/>
+              </w:rPr>
+              <w:t>}}</w:t>
             </w:r>
           </w:p>
         </w:tc>
@@ -2641,7 +3178,7 @@
 </file>
 
 <file path=word/endnotes.xml><?xml version="1.0" encoding="utf-8"?>
-<w:endnotes xmlns:wpc="http://schemas.microsoft.com/office/word/2010/wordprocessingCanvas" xmlns:cx="http://schemas.microsoft.com/office/drawing/2014/chartex" xmlns:cx1="http://schemas.microsoft.com/office/drawing/2015/9/8/chartex" xmlns:cx2="http://schemas.microsoft.com/office/drawing/2015/10/21/chartex" xmlns:cx3="http://schemas.microsoft.com/office/drawing/2016/5/9/chartex" xmlns:cx4="http://schemas.microsoft.com/office/drawing/2016/5/10/chartex" xmlns:cx5="http://schemas.microsoft.com/office/drawing/2016/5/11/chartex" xmlns:cx6="http://schemas.microsoft.com/office/drawing/2016/5/12/chartex" xmlns:cx7="http://schemas.microsoft.com/office/drawing/2016/5/13/chartex" xmlns:cx8="http://schemas.microsoft.com/office/drawing/2016/5/14/chartex" xmlns:mc="http://schemas.openxmlformats.org/markup-compatibility/2006" xmlns:aink="http://schemas.microsoft.com/office/drawing/2016/ink" xmlns:am3d="http://schemas.microsoft.com/office/drawing/2017/model3d" xmlns:o="urn:schemas-microsoft-com:office:office" xmlns:oel="http://schemas.microsoft.com/office/2019/extlst" xmlns:r="http://schemas.openxmlformats.org/officeDocument/2006/relationships" xmlns:m="http://schemas.openxmlformats.org/officeDocument/2006/math" xmlns:v="urn:schemas-microsoft-com:vml" xmlns:wp14="http://schemas.microsoft.com/office/word/2010/wordprocessingDrawing" xmlns:wp="http://schemas.openxmlformats.org/drawingml/2006/wordprocessingDrawing" xmlns:w10="urn:schemas-microsoft-com:office:word" xmlns:w="http://schemas.openxmlformats.org/wordprocessingml/2006/main" xmlns:w14="http://schemas.microsoft.com/office/word/2010/wordml" xmlns:w15="http://schemas.microsoft.com/office/word/2012/wordml" xmlns:w16cex="http://schemas.microsoft.com/office/word/2018/wordml/cex" xmlns:w16cid="http://schemas.microsoft.com/office/word/2016/wordml/cid" xmlns:w16="http://schemas.microsoft.com/office/word/2018/wordml" xmlns:w16du="http://schemas.microsoft.com/office/word/2023/wordml/word16du" xmlns:w16sdtdh="http://schemas.microsoft.com/office/word/2020/wordml/sdtdatahash" xmlns:w16sdtfl="http://schemas.microsoft.com/office/word/2024/wordml/sdtformatlock" xmlns:w16se="http://schemas.microsoft.com/office/word/2015/wordml/symex" xmlns:wpg="http://schemas.microsoft.com/office/word/2010/wordprocessingGroup" xmlns:wpi="http://schemas.microsoft.com/office/word/2010/wordprocessingInk" xmlns:wne="http://schemas.microsoft.com/office/word/2006/wordml" xmlns:wps="http://schemas.microsoft.com/office/word/2010/wordprocessingShape" mc:Ignorable="w14 w15 w16se w16cid w16 w16cex w16sdtdh w16sdtfl w16du wp14">
+<w:endnotes xmlns:wpc="http://schemas.microsoft.com/office/word/2010/wordprocessingCanvas" xmlns:cx="http://schemas.microsoft.com/office/drawing/2014/chartex" xmlns:cx1="http://schemas.microsoft.com/office/drawing/2015/9/8/chartex" xmlns:cx2="http://schemas.microsoft.com/office/drawing/2015/10/21/chartex" xmlns:cx3="http://schemas.microsoft.com/office/drawing/2016/5/9/chartex" xmlns:cx4="http://schemas.microsoft.com/office/drawing/2016/5/10/chartex" xmlns:cx5="http://schemas.microsoft.com/office/drawing/2016/5/11/chartex" xmlns:cx6="http://schemas.microsoft.com/office/drawing/2016/5/12/chartex" xmlns:cx7="http://schemas.microsoft.com/office/drawing/2016/5/13/chartex" xmlns:cx8="http://schemas.microsoft.com/office/drawing/2016/5/14/chartex" xmlns:mc="http://schemas.openxmlformats.org/markup-compatibility/2006" xmlns:aink="http://schemas.microsoft.com/office/drawing/2016/ink" xmlns:am3d="http://schemas.microsoft.com/office/drawing/2017/model3d" xmlns:o="urn:schemas-microsoft-com:office:office" xmlns:oel="http://schemas.microsoft.com/office/2019/extlst" xmlns:r="http://schemas.openxmlformats.org/officeDocument/2006/relationships" xmlns:m="http://schemas.openxmlformats.org/officeDocument/2006/math" xmlns:v="urn:schemas-microsoft-com:vml" xmlns:wp14="http://schemas.microsoft.com/office/word/2010/wordprocessingDrawing" xmlns:wp="http://schemas.openxmlformats.org/drawingml/2006/wordprocessingDrawing" xmlns:w10="urn:schemas-microsoft-com:office:word" xmlns:w="http://schemas.openxmlformats.org/wordprocessingml/2006/main" xmlns:w14="http://schemas.microsoft.com/office/word/2010/wordml" xmlns:w15="http://schemas.microsoft.com/office/word/2012/wordml" xmlns:w16cex="http://schemas.microsoft.com/office/word/2018/wordml/cex" xmlns:w16cid="http://schemas.microsoft.com/office/word/2016/wordml/cid" xmlns:w16="http://schemas.microsoft.com/office/word/2018/wordml" xmlns:w16sdtdh="http://schemas.microsoft.com/office/word/2020/wordml/sdtdatahash" xmlns:w16se="http://schemas.microsoft.com/office/word/2015/wordml/symex" xmlns:wpg="http://schemas.microsoft.com/office/word/2010/wordprocessingGroup" xmlns:wpi="http://schemas.microsoft.com/office/word/2010/wordprocessingInk" xmlns:wne="http://schemas.microsoft.com/office/word/2006/wordml" xmlns:wps="http://schemas.microsoft.com/office/word/2010/wordprocessingShape" mc:Ignorable="w14 w15 w16se w16cid w16 w16cex w16sdtdh wp14">
   <w:endnote w:type="separator" w:id="-1">
     <w:p>
       <w:r>
@@ -2660,7 +3197,7 @@
 </file>
 
 <file path=word/footnotes.xml><?xml version="1.0" encoding="utf-8"?>
-<w:footnotes xmlns:wpc="http://schemas.microsoft.com/office/word/2010/wordprocessingCanvas" xmlns:cx="http://schemas.microsoft.com/office/drawing/2014/chartex" xmlns:cx1="http://schemas.microsoft.com/office/drawing/2015/9/8/chartex" xmlns:cx2="http://schemas.microsoft.com/office/drawing/2015/10/21/chartex" xmlns:cx3="http://schemas.microsoft.com/office/drawing/2016/5/9/chartex" xmlns:cx4="http://schemas.microsoft.com/office/drawing/2016/5/10/chartex" xmlns:cx5="http://schemas.microsoft.com/office/drawing/2016/5/11/chartex" xmlns:cx6="http://schemas.microsoft.com/office/drawing/2016/5/12/chartex" xmlns:cx7="http://schemas.microsoft.com/office/drawing/2016/5/13/chartex" xmlns:cx8="http://schemas.microsoft.com/office/drawing/2016/5/14/chartex" xmlns:mc="http://schemas.openxmlformats.org/markup-compatibility/2006" xmlns:aink="http://schemas.microsoft.com/office/drawing/2016/ink" xmlns:am3d="http://schemas.microsoft.com/office/drawing/2017/model3d" xmlns:o="urn:schemas-microsoft-com:office:office" xmlns:oel="http://schemas.microsoft.com/office/2019/extlst" xmlns:r="http://schemas.openxmlformats.org/officeDocument/2006/relationships" xmlns:m="http://schemas.openxmlformats.org/officeDocument/2006/math" xmlns:v="urn:schemas-microsoft-com:vml" xmlns:wp14="http://schemas.microsoft.com/office/word/2010/wordprocessingDrawing" xmlns:wp="http://schemas.openxmlformats.org/drawingml/2006/wordprocessingDrawing" xmlns:w10="urn:schemas-microsoft-com:office:word" xmlns:w="http://schemas.openxmlformats.org/wordprocessingml/2006/main" xmlns:w14="http://schemas.microsoft.com/office/word/2010/wordml" xmlns:w15="http://schemas.microsoft.com/office/word/2012/wordml" xmlns:w16cex="http://schemas.microsoft.com/office/word/2018/wordml/cex" xmlns:w16cid="http://schemas.microsoft.com/office/word/2016/wordml/cid" xmlns:w16="http://schemas.microsoft.com/office/word/2018/wordml" xmlns:w16du="http://schemas.microsoft.com/office/word/2023/wordml/word16du" xmlns:w16sdtdh="http://schemas.microsoft.com/office/word/2020/wordml/sdtdatahash" xmlns:w16sdtfl="http://schemas.microsoft.com/office/word/2024/wordml/sdtformatlock" xmlns:w16se="http://schemas.microsoft.com/office/word/2015/wordml/symex" xmlns:wpg="http://schemas.microsoft.com/office/word/2010/wordprocessingGroup" xmlns:wpi="http://schemas.microsoft.com/office/word/2010/wordprocessingInk" xmlns:wne="http://schemas.microsoft.com/office/word/2006/wordml" xmlns:wps="http://schemas.microsoft.com/office/word/2010/wordprocessingShape" mc:Ignorable="w14 w15 w16se w16cid w16 w16cex w16sdtdh w16sdtfl w16du wp14">
+<w:footnotes xmlns:wpc="http://schemas.microsoft.com/office/word/2010/wordprocessingCanvas" xmlns:cx="http://schemas.microsoft.com/office/drawing/2014/chartex" xmlns:cx1="http://schemas.microsoft.com/office/drawing/2015/9/8/chartex" xmlns:cx2="http://schemas.microsoft.com/office/drawing/2015/10/21/chartex" xmlns:cx3="http://schemas.microsoft.com/office/drawing/2016/5/9/chartex" xmlns:cx4="http://schemas.microsoft.com/office/drawing/2016/5/10/chartex" xmlns:cx5="http://schemas.microsoft.com/office/drawing/2016/5/11/chartex" xmlns:cx6="http://schemas.microsoft.com/office/drawing/2016/5/12/chartex" xmlns:cx7="http://schemas.microsoft.com/office/drawing/2016/5/13/chartex" xmlns:cx8="http://schemas.microsoft.com/office/drawing/2016/5/14/chartex" xmlns:mc="http://schemas.openxmlformats.org/markup-compatibility/2006" xmlns:aink="http://schemas.microsoft.com/office/drawing/2016/ink" xmlns:am3d="http://schemas.microsoft.com/office/drawing/2017/model3d" xmlns:o="urn:schemas-microsoft-com:office:office" xmlns:oel="http://schemas.microsoft.com/office/2019/extlst" xmlns:r="http://schemas.openxmlformats.org/officeDocument/2006/relationships" xmlns:m="http://schemas.openxmlformats.org/officeDocument/2006/math" xmlns:v="urn:schemas-microsoft-com:vml" xmlns:wp14="http://schemas.microsoft.com/office/word/2010/wordprocessingDrawing" xmlns:wp="http://schemas.openxmlformats.org/drawingml/2006/wordprocessingDrawing" xmlns:w10="urn:schemas-microsoft-com:office:word" xmlns:w="http://schemas.openxmlformats.org/wordprocessingml/2006/main" xmlns:w14="http://schemas.microsoft.com/office/word/2010/wordml" xmlns:w15="http://schemas.microsoft.com/office/word/2012/wordml" xmlns:w16cex="http://schemas.microsoft.com/office/word/2018/wordml/cex" xmlns:w16cid="http://schemas.microsoft.com/office/word/2016/wordml/cid" xmlns:w16="http://schemas.microsoft.com/office/word/2018/wordml" xmlns:w16sdtdh="http://schemas.microsoft.com/office/word/2020/wordml/sdtdatahash" xmlns:w16se="http://schemas.microsoft.com/office/word/2015/wordml/symex" xmlns:wpg="http://schemas.microsoft.com/office/word/2010/wordprocessingGroup" xmlns:wpi="http://schemas.microsoft.com/office/word/2010/wordprocessingInk" xmlns:wne="http://schemas.microsoft.com/office/word/2006/wordml" xmlns:wps="http://schemas.microsoft.com/office/word/2010/wordprocessingShape" mc:Ignorable="w14 w15 w16se w16cid w16 w16cex w16sdtdh wp14">
   <w:footnote w:type="separator" w:id="-1">
     <w:p>
       <w:r>
@@ -2679,7 +3216,7 @@
 </file>
 
 <file path=word/header1.xml><?xml version="1.0" encoding="utf-8"?>
-<w:hdr xmlns:wpc="http://schemas.microsoft.com/office/word/2010/wordprocessingCanvas" xmlns:cx="http://schemas.microsoft.com/office/drawing/2014/chartex" xmlns:cx1="http://schemas.microsoft.com/office/drawing/2015/9/8/chartex" xmlns:cx2="http://schemas.microsoft.com/office/drawing/2015/10/21/chartex" xmlns:cx3="http://schemas.microsoft.com/office/drawing/2016/5/9/chartex" xmlns:cx4="http://schemas.microsoft.com/office/drawing/2016/5/10/chartex" xmlns:cx5="http://schemas.microsoft.com/office/drawing/2016/5/11/chartex" xmlns:cx6="http://schemas.microsoft.com/office/drawing/2016/5/12/chartex" xmlns:cx7="http://schemas.microsoft.com/office/drawing/2016/5/13/chartex" xmlns:cx8="http://schemas.microsoft.com/office/drawing/2016/5/14/chartex" xmlns:mc="http://schemas.openxmlformats.org/markup-compatibility/2006" xmlns:aink="http://schemas.microsoft.com/office/drawing/2016/ink" xmlns:am3d="http://schemas.microsoft.com/office/drawing/2017/model3d" xmlns:o="urn:schemas-microsoft-com:office:office" xmlns:oel="http://schemas.microsoft.com/office/2019/extlst" xmlns:r="http://schemas.openxmlformats.org/officeDocument/2006/relationships" xmlns:m="http://schemas.openxmlformats.org/officeDocument/2006/math" xmlns:v="urn:schemas-microsoft-com:vml" xmlns:wp14="http://schemas.microsoft.com/office/word/2010/wordprocessingDrawing" xmlns:wp="http://schemas.openxmlformats.org/drawingml/2006/wordprocessingDrawing" xmlns:w10="urn:schemas-microsoft-com:office:word" xmlns:w="http://schemas.openxmlformats.org/wordprocessingml/2006/main" xmlns:w14="http://schemas.microsoft.com/office/word/2010/wordml" xmlns:w15="http://schemas.microsoft.com/office/word/2012/wordml" xmlns:w16cex="http://schemas.microsoft.com/office/word/2018/wordml/cex" xmlns:w16cid="http://schemas.microsoft.com/office/word/2016/wordml/cid" xmlns:w16="http://schemas.microsoft.com/office/word/2018/wordml" xmlns:w16du="http://schemas.microsoft.com/office/word/2023/wordml/word16du" xmlns:w16sdtdh="http://schemas.microsoft.com/office/word/2020/wordml/sdtdatahash" xmlns:w16sdtfl="http://schemas.microsoft.com/office/word/2024/wordml/sdtformatlock" xmlns:w16se="http://schemas.microsoft.com/office/word/2015/wordml/symex" xmlns:wpg="http://schemas.microsoft.com/office/word/2010/wordprocessingGroup" xmlns:wpi="http://schemas.microsoft.com/office/word/2010/wordprocessingInk" xmlns:wne="http://schemas.microsoft.com/office/word/2006/wordml" xmlns:wps="http://schemas.microsoft.com/office/word/2010/wordprocessingShape" mc:Ignorable="w14 w15 w16se w16cid w16 w16cex w16sdtdh w16sdtfl w16du wp14">
+<w:hdr xmlns:wpc="http://schemas.microsoft.com/office/word/2010/wordprocessingCanvas" xmlns:cx="http://schemas.microsoft.com/office/drawing/2014/chartex" xmlns:cx1="http://schemas.microsoft.com/office/drawing/2015/9/8/chartex" xmlns:cx2="http://schemas.microsoft.com/office/drawing/2015/10/21/chartex" xmlns:cx3="http://schemas.microsoft.com/office/drawing/2016/5/9/chartex" xmlns:cx4="http://schemas.microsoft.com/office/drawing/2016/5/10/chartex" xmlns:cx5="http://schemas.microsoft.com/office/drawing/2016/5/11/chartex" xmlns:cx6="http://schemas.microsoft.com/office/drawing/2016/5/12/chartex" xmlns:cx7="http://schemas.microsoft.com/office/drawing/2016/5/13/chartex" xmlns:cx8="http://schemas.microsoft.com/office/drawing/2016/5/14/chartex" xmlns:mc="http://schemas.openxmlformats.org/markup-compatibility/2006" xmlns:aink="http://schemas.microsoft.com/office/drawing/2016/ink" xmlns:am3d="http://schemas.microsoft.com/office/drawing/2017/model3d" xmlns:o="urn:schemas-microsoft-com:office:office" xmlns:oel="http://schemas.microsoft.com/office/2019/extlst" xmlns:r="http://schemas.openxmlformats.org/officeDocument/2006/relationships" xmlns:m="http://schemas.openxmlformats.org/officeDocument/2006/math" xmlns:v="urn:schemas-microsoft-com:vml" xmlns:wp14="http://schemas.microsoft.com/office/word/2010/wordprocessingDrawing" xmlns:wp="http://schemas.openxmlformats.org/drawingml/2006/wordprocessingDrawing" xmlns:w10="urn:schemas-microsoft-com:office:word" xmlns:w="http://schemas.openxmlformats.org/wordprocessingml/2006/main" xmlns:w14="http://schemas.microsoft.com/office/word/2010/wordml" xmlns:w15="http://schemas.microsoft.com/office/word/2012/wordml" xmlns:w16cex="http://schemas.microsoft.com/office/word/2018/wordml/cex" xmlns:w16cid="http://schemas.microsoft.com/office/word/2016/wordml/cid" xmlns:w16="http://schemas.microsoft.com/office/word/2018/wordml" xmlns:w16sdtdh="http://schemas.microsoft.com/office/word/2020/wordml/sdtdatahash" xmlns:w16se="http://schemas.microsoft.com/office/word/2015/wordml/symex" xmlns:wpg="http://schemas.microsoft.com/office/word/2010/wordprocessingGroup" xmlns:wpi="http://schemas.microsoft.com/office/word/2010/wordprocessingInk" xmlns:wne="http://schemas.microsoft.com/office/word/2006/wordml" xmlns:wps="http://schemas.microsoft.com/office/word/2010/wordprocessingShape" mc:Ignorable="w14 w15 w16se w16cid w16 w16cex w16sdtdh wp14">
   <w:p>
     <w:pPr>
       <w:pStyle w:val="Header"/>
@@ -2689,7 +3226,7 @@
 </file>
 
 <file path=word/header2.xml><?xml version="1.0" encoding="utf-8"?>
-<w:hdr xmlns:wpc="http://schemas.microsoft.com/office/word/2010/wordprocessingCanvas" xmlns:cx="http://schemas.microsoft.com/office/drawing/2014/chartex" xmlns:cx1="http://schemas.microsoft.com/office/drawing/2015/9/8/chartex" xmlns:cx2="http://schemas.microsoft.com/office/drawing/2015/10/21/chartex" xmlns:cx3="http://schemas.microsoft.com/office/drawing/2016/5/9/chartex" xmlns:cx4="http://schemas.microsoft.com/office/drawing/2016/5/10/chartex" xmlns:cx5="http://schemas.microsoft.com/office/drawing/2016/5/11/chartex" xmlns:cx6="http://schemas.microsoft.com/office/drawing/2016/5/12/chartex" xmlns:cx7="http://schemas.microsoft.com/office/drawing/2016/5/13/chartex" xmlns:cx8="http://schemas.microsoft.com/office/drawing/2016/5/14/chartex" xmlns:mc="http://schemas.openxmlformats.org/markup-compatibility/2006" xmlns:aink="http://schemas.microsoft.com/office/drawing/2016/ink" xmlns:am3d="http://schemas.microsoft.com/office/drawing/2017/model3d" xmlns:o="urn:schemas-microsoft-com:office:office" xmlns:oel="http://schemas.microsoft.com/office/2019/extlst" xmlns:r="http://schemas.openxmlformats.org/officeDocument/2006/relationships" xmlns:m="http://schemas.openxmlformats.org/officeDocument/2006/math" xmlns:v="urn:schemas-microsoft-com:vml" xmlns:wp14="http://schemas.microsoft.com/office/word/2010/wordprocessingDrawing" xmlns:wp="http://schemas.openxmlformats.org/drawingml/2006/wordprocessingDrawing" xmlns:w10="urn:schemas-microsoft-com:office:word" xmlns:w="http://schemas.openxmlformats.org/wordprocessingml/2006/main" xmlns:w14="http://schemas.microsoft.com/office/word/2010/wordml" xmlns:w15="http://schemas.microsoft.com/office/word/2012/wordml" xmlns:w16cex="http://schemas.microsoft.com/office/word/2018/wordml/cex" xmlns:w16cid="http://schemas.microsoft.com/office/word/2016/wordml/cid" xmlns:w16="http://schemas.microsoft.com/office/word/2018/wordml" xmlns:w16du="http://schemas.microsoft.com/office/word/2023/wordml/word16du" xmlns:w16sdtdh="http://schemas.microsoft.com/office/word/2020/wordml/sdtdatahash" xmlns:w16sdtfl="http://schemas.microsoft.com/office/word/2024/wordml/sdtformatlock" xmlns:w16se="http://schemas.microsoft.com/office/word/2015/wordml/symex" xmlns:wpg="http://schemas.microsoft.com/office/word/2010/wordprocessingGroup" xmlns:wpi="http://schemas.microsoft.com/office/word/2010/wordprocessingInk" xmlns:wne="http://schemas.microsoft.com/office/word/2006/wordml" xmlns:wps="http://schemas.microsoft.com/office/word/2010/wordprocessingShape" mc:Ignorable="w14 w15 w16se w16cid w16 w16cex w16sdtdh w16sdtfl w16du wp14">
+<w:hdr xmlns:wpc="http://schemas.microsoft.com/office/word/2010/wordprocessingCanvas" xmlns:cx="http://schemas.microsoft.com/office/drawing/2014/chartex" xmlns:cx1="http://schemas.microsoft.com/office/drawing/2015/9/8/chartex" xmlns:cx2="http://schemas.microsoft.com/office/drawing/2015/10/21/chartex" xmlns:cx3="http://schemas.microsoft.com/office/drawing/2016/5/9/chartex" xmlns:cx4="http://schemas.microsoft.com/office/drawing/2016/5/10/chartex" xmlns:cx5="http://schemas.microsoft.com/office/drawing/2016/5/11/chartex" xmlns:cx6="http://schemas.microsoft.com/office/drawing/2016/5/12/chartex" xmlns:cx7="http://schemas.microsoft.com/office/drawing/2016/5/13/chartex" xmlns:cx8="http://schemas.microsoft.com/office/drawing/2016/5/14/chartex" xmlns:mc="http://schemas.openxmlformats.org/markup-compatibility/2006" xmlns:aink="http://schemas.microsoft.com/office/drawing/2016/ink" xmlns:am3d="http://schemas.microsoft.com/office/drawing/2017/model3d" xmlns:o="urn:schemas-microsoft-com:office:office" xmlns:oel="http://schemas.microsoft.com/office/2019/extlst" xmlns:r="http://schemas.openxmlformats.org/officeDocument/2006/relationships" xmlns:m="http://schemas.openxmlformats.org/officeDocument/2006/math" xmlns:v="urn:schemas-microsoft-com:vml" xmlns:wp14="http://schemas.microsoft.com/office/word/2010/wordprocessingDrawing" xmlns:wp="http://schemas.openxmlformats.org/drawingml/2006/wordprocessingDrawing" xmlns:w10="urn:schemas-microsoft-com:office:word" xmlns:w="http://schemas.openxmlformats.org/wordprocessingml/2006/main" xmlns:w14="http://schemas.microsoft.com/office/word/2010/wordml" xmlns:w15="http://schemas.microsoft.com/office/word/2012/wordml" xmlns:w16cex="http://schemas.microsoft.com/office/word/2018/wordml/cex" xmlns:w16cid="http://schemas.microsoft.com/office/word/2016/wordml/cid" xmlns:w16="http://schemas.microsoft.com/office/word/2018/wordml" xmlns:w16sdtdh="http://schemas.microsoft.com/office/word/2020/wordml/sdtdatahash" xmlns:w16se="http://schemas.microsoft.com/office/word/2015/wordml/symex" xmlns:wpg="http://schemas.microsoft.com/office/word/2010/wordprocessingGroup" xmlns:wpi="http://schemas.microsoft.com/office/word/2010/wordprocessingInk" xmlns:wne="http://schemas.microsoft.com/office/word/2006/wordml" xmlns:wps="http://schemas.microsoft.com/office/word/2010/wordprocessingShape" mc:Ignorable="w14 w15 w16se w16cid w16 w16cex w16sdtdh wp14">
   <w:p>
     <w:pPr>
       <w:pStyle w:val="BodyText"/>
@@ -2703,8 +3240,106 @@
 </file>
 
 <file path=word/numbering.xml><?xml version="1.0" encoding="utf-8"?>
-<w:numbering xmlns:wpc="http://schemas.microsoft.com/office/word/2010/wordprocessingCanvas" xmlns:cx="http://schemas.microsoft.com/office/drawing/2014/chartex" xmlns:cx1="http://schemas.microsoft.com/office/drawing/2015/9/8/chartex" xmlns:cx2="http://schemas.microsoft.com/office/drawing/2015/10/21/chartex" xmlns:cx3="http://schemas.microsoft.com/office/drawing/2016/5/9/chartex" xmlns:cx4="http://schemas.microsoft.com/office/drawing/2016/5/10/chartex" xmlns:cx5="http://schemas.microsoft.com/office/drawing/2016/5/11/chartex" xmlns:cx6="http://schemas.microsoft.com/office/drawing/2016/5/12/chartex" xmlns:cx7="http://schemas.microsoft.com/office/drawing/2016/5/13/chartex" xmlns:cx8="http://schemas.microsoft.com/office/drawing/2016/5/14/chartex" xmlns:mc="http://schemas.openxmlformats.org/markup-compatibility/2006" xmlns:aink="http://schemas.microsoft.com/office/drawing/2016/ink" xmlns:am3d="http://schemas.microsoft.com/office/drawing/2017/model3d" xmlns:o="urn:schemas-microsoft-com:office:office" xmlns:oel="http://schemas.microsoft.com/office/2019/extlst" xmlns:r="http://schemas.openxmlformats.org/officeDocument/2006/relationships" xmlns:m="http://schemas.openxmlformats.org/officeDocument/2006/math" xmlns:v="urn:schemas-microsoft-com:vml" xmlns:wp14="http://schemas.microsoft.com/office/word/2010/wordprocessingDrawing" xmlns:wp="http://schemas.openxmlformats.org/drawingml/2006/wordprocessingDrawing" xmlns:w10="urn:schemas-microsoft-com:office:word" xmlns:w="http://schemas.openxmlformats.org/wordprocessingml/2006/main" xmlns:w14="http://schemas.microsoft.com/office/word/2010/wordml" xmlns:w15="http://schemas.microsoft.com/office/word/2012/wordml" xmlns:w16cex="http://schemas.microsoft.com/office/word/2018/wordml/cex" xmlns:w16cid="http://schemas.microsoft.com/office/word/2016/wordml/cid" xmlns:w16="http://schemas.microsoft.com/office/word/2018/wordml" xmlns:w16du="http://schemas.microsoft.com/office/word/2023/wordml/word16du" xmlns:w16sdtdh="http://schemas.microsoft.com/office/word/2020/wordml/sdtdatahash" xmlns:w16sdtfl="http://schemas.microsoft.com/office/word/2024/wordml/sdtformatlock" xmlns:w16se="http://schemas.microsoft.com/office/word/2015/wordml/symex" xmlns:wpg="http://schemas.microsoft.com/office/word/2010/wordprocessingGroup" xmlns:wpi="http://schemas.microsoft.com/office/word/2010/wordprocessingInk" xmlns:wne="http://schemas.microsoft.com/office/word/2006/wordml" xmlns:wps="http://schemas.microsoft.com/office/word/2010/wordprocessingShape" mc:Ignorable="w14 w15 w16se w16cid w16 w16cex w16sdtdh w16sdtfl w16du wp14">
+<w:numbering xmlns:wpc="http://schemas.microsoft.com/office/word/2010/wordprocessingCanvas" xmlns:cx="http://schemas.microsoft.com/office/drawing/2014/chartex" xmlns:cx1="http://schemas.microsoft.com/office/drawing/2015/9/8/chartex" xmlns:cx2="http://schemas.microsoft.com/office/drawing/2015/10/21/chartex" xmlns:cx3="http://schemas.microsoft.com/office/drawing/2016/5/9/chartex" xmlns:cx4="http://schemas.microsoft.com/office/drawing/2016/5/10/chartex" xmlns:cx5="http://schemas.microsoft.com/office/drawing/2016/5/11/chartex" xmlns:cx6="http://schemas.microsoft.com/office/drawing/2016/5/12/chartex" xmlns:cx7="http://schemas.microsoft.com/office/drawing/2016/5/13/chartex" xmlns:cx8="http://schemas.microsoft.com/office/drawing/2016/5/14/chartex" xmlns:mc="http://schemas.openxmlformats.org/markup-compatibility/2006" xmlns:aink="http://schemas.microsoft.com/office/drawing/2016/ink" xmlns:am3d="http://schemas.microsoft.com/office/drawing/2017/model3d" xmlns:o="urn:schemas-microsoft-com:office:office" xmlns:oel="http://schemas.microsoft.com/office/2019/extlst" xmlns:r="http://schemas.openxmlformats.org/officeDocument/2006/relationships" xmlns:m="http://schemas.openxmlformats.org/officeDocument/2006/math" xmlns:v="urn:schemas-microsoft-com:vml" xmlns:wp14="http://schemas.microsoft.com/office/word/2010/wordprocessingDrawing" xmlns:wp="http://schemas.openxmlformats.org/drawingml/2006/wordprocessingDrawing" xmlns:w10="urn:schemas-microsoft-com:office:word" xmlns:w="http://schemas.openxmlformats.org/wordprocessingml/2006/main" xmlns:w14="http://schemas.microsoft.com/office/word/2010/wordml" xmlns:w15="http://schemas.microsoft.com/office/word/2012/wordml" xmlns:w16cex="http://schemas.microsoft.com/office/word/2018/wordml/cex" xmlns:w16cid="http://schemas.microsoft.com/office/word/2016/wordml/cid" xmlns:w16="http://schemas.microsoft.com/office/word/2018/wordml" xmlns:w16sdtdh="http://schemas.microsoft.com/office/word/2020/wordml/sdtdatahash" xmlns:w16se="http://schemas.microsoft.com/office/word/2015/wordml/symex" xmlns:wpg="http://schemas.microsoft.com/office/word/2010/wordprocessingGroup" xmlns:wpi="http://schemas.microsoft.com/office/word/2010/wordprocessingInk" xmlns:wne="http://schemas.microsoft.com/office/word/2006/wordml" xmlns:wps="http://schemas.microsoft.com/office/word/2010/wordprocessingShape" mc:Ignorable="w14 w15 w16se w16cid w16 w16cex w16sdtdh wp14">
   <w:abstractNum w:abstractNumId="0" w15:restartNumberingAfterBreak="0">
+    <w:nsid w:val="0CEB530B"/>
+    <w:multiLevelType w:val="hybridMultilevel"/>
+    <w:tmpl w:val="2CC839D8"/>
+    <w:lvl w:ilvl="0" w:tplc="2D4298EC">
+      <w:start w:val="2"/>
+      <w:numFmt w:val="decimal"/>
+      <w:lvlText w:val="%1."/>
+      <w:lvlJc w:val="left"/>
+      <w:pPr>
+        <w:ind w:left="2915" w:hanging="360"/>
+      </w:pPr>
+      <w:rPr>
+        <w:rFonts w:ascii="Arial MT" w:eastAsia="Arial MT" w:hAnsi="Arial MT" w:cs="Arial MT" w:hint="default"/>
+        <w:b w:val="0"/>
+        <w:bCs w:val="0"/>
+        <w:i w:val="0"/>
+        <w:iCs w:val="0"/>
+        <w:spacing w:val="0"/>
+        <w:w w:val="100"/>
+        <w:sz w:val="22"/>
+        <w:szCs w:val="22"/>
+        <w:lang w:val="id" w:eastAsia="en-US" w:bidi="ar-SA"/>
+      </w:rPr>
+    </w:lvl>
+    <w:lvl w:ilvl="1" w:tplc="38090019" w:tentative="1">
+      <w:start w:val="1"/>
+      <w:numFmt w:val="lowerLetter"/>
+      <w:lvlText w:val="%2."/>
+      <w:lvlJc w:val="left"/>
+      <w:pPr>
+        <w:ind w:left="1440" w:hanging="360"/>
+      </w:pPr>
+    </w:lvl>
+    <w:lvl w:ilvl="2" w:tplc="3809001B" w:tentative="1">
+      <w:start w:val="1"/>
+      <w:numFmt w:val="lowerRoman"/>
+      <w:lvlText w:val="%3."/>
+      <w:lvlJc w:val="right"/>
+      <w:pPr>
+        <w:ind w:left="2160" w:hanging="180"/>
+      </w:pPr>
+    </w:lvl>
+    <w:lvl w:ilvl="3" w:tplc="3809000F" w:tentative="1">
+      <w:start w:val="1"/>
+      <w:numFmt w:val="decimal"/>
+      <w:lvlText w:val="%4."/>
+      <w:lvlJc w:val="left"/>
+      <w:pPr>
+        <w:ind w:left="2880" w:hanging="360"/>
+      </w:pPr>
+    </w:lvl>
+    <w:lvl w:ilvl="4" w:tplc="38090019" w:tentative="1">
+      <w:start w:val="1"/>
+      <w:numFmt w:val="lowerLetter"/>
+      <w:lvlText w:val="%5."/>
+      <w:lvlJc w:val="left"/>
+      <w:pPr>
+        <w:ind w:left="3600" w:hanging="360"/>
+      </w:pPr>
+    </w:lvl>
+    <w:lvl w:ilvl="5" w:tplc="3809001B" w:tentative="1">
+      <w:start w:val="1"/>
+      <w:numFmt w:val="lowerRoman"/>
+      <w:lvlText w:val="%6."/>
+      <w:lvlJc w:val="right"/>
+      <w:pPr>
+        <w:ind w:left="4320" w:hanging="180"/>
+      </w:pPr>
+    </w:lvl>
+    <w:lvl w:ilvl="6" w:tplc="3809000F" w:tentative="1">
+      <w:start w:val="1"/>
+      <w:numFmt w:val="decimal"/>
+      <w:lvlText w:val="%7."/>
+      <w:lvlJc w:val="left"/>
+      <w:pPr>
+        <w:ind w:left="5040" w:hanging="360"/>
+      </w:pPr>
+    </w:lvl>
+    <w:lvl w:ilvl="7" w:tplc="38090019" w:tentative="1">
+      <w:start w:val="1"/>
+      <w:numFmt w:val="lowerLetter"/>
+      <w:lvlText w:val="%8."/>
+      <w:lvlJc w:val="left"/>
+      <w:pPr>
+        <w:ind w:left="5760" w:hanging="360"/>
+      </w:pPr>
+    </w:lvl>
+    <w:lvl w:ilvl="8" w:tplc="3809001B" w:tentative="1">
+      <w:start w:val="1"/>
+      <w:numFmt w:val="lowerRoman"/>
+      <w:lvlText w:val="%9."/>
+      <w:lvlJc w:val="right"/>
+      <w:pPr>
+        <w:ind w:left="6480" w:hanging="180"/>
+      </w:pPr>
+    </w:lvl>
+  </w:abstractNum>
+  <w:abstractNum w:abstractNumId="1" w15:restartNumberingAfterBreak="0">
     <w:nsid w:val="17A1327C"/>
     <w:multiLevelType w:val="hybridMultilevel"/>
     <w:tmpl w:val="F79254AE"/>
@@ -2715,7 +3350,6 @@
       <w:lvlJc w:val="left"/>
       <w:pPr>
         <w:ind w:left="1210" w:hanging="284"/>
-        <w:jc w:val="left"/>
       </w:pPr>
       <w:rPr>
         <w:rFonts w:ascii="Arial" w:eastAsia="Arial" w:hAnsi="Arial" w:cs="Arial" w:hint="default"/>
@@ -2737,7 +3371,6 @@
       <w:lvlJc w:val="left"/>
       <w:pPr>
         <w:ind w:left="2915" w:hanging="360"/>
-        <w:jc w:val="left"/>
       </w:pPr>
       <w:rPr>
         <w:rFonts w:ascii="Arial MT" w:eastAsia="Arial MT" w:hAnsi="Arial MT" w:cs="Arial MT" w:hint="default"/>
@@ -2837,14 +3470,421 @@
       </w:rPr>
     </w:lvl>
   </w:abstractNum>
+  <w:abstractNum w:abstractNumId="2" w15:restartNumberingAfterBreak="0">
+    <w:nsid w:val="199C1DED"/>
+    <w:multiLevelType w:val="hybridMultilevel"/>
+    <w:tmpl w:val="671E61FE"/>
+    <w:lvl w:ilvl="0" w:tplc="2D4298EC">
+      <w:start w:val="2"/>
+      <w:numFmt w:val="decimal"/>
+      <w:lvlText w:val="%1."/>
+      <w:lvlJc w:val="left"/>
+      <w:pPr>
+        <w:ind w:left="2915" w:hanging="360"/>
+      </w:pPr>
+      <w:rPr>
+        <w:rFonts w:ascii="Arial MT" w:eastAsia="Arial MT" w:hAnsi="Arial MT" w:cs="Arial MT" w:hint="default"/>
+        <w:b w:val="0"/>
+        <w:bCs w:val="0"/>
+        <w:i w:val="0"/>
+        <w:iCs w:val="0"/>
+        <w:spacing w:val="0"/>
+        <w:w w:val="100"/>
+        <w:sz w:val="22"/>
+        <w:szCs w:val="22"/>
+        <w:lang w:val="id" w:eastAsia="en-US" w:bidi="ar-SA"/>
+      </w:rPr>
+    </w:lvl>
+    <w:lvl w:ilvl="1" w:tplc="38090019" w:tentative="1">
+      <w:start w:val="1"/>
+      <w:numFmt w:val="lowerLetter"/>
+      <w:lvlText w:val="%2."/>
+      <w:lvlJc w:val="left"/>
+      <w:pPr>
+        <w:ind w:left="1440" w:hanging="360"/>
+      </w:pPr>
+    </w:lvl>
+    <w:lvl w:ilvl="2" w:tplc="3809001B" w:tentative="1">
+      <w:start w:val="1"/>
+      <w:numFmt w:val="lowerRoman"/>
+      <w:lvlText w:val="%3."/>
+      <w:lvlJc w:val="right"/>
+      <w:pPr>
+        <w:ind w:left="2160" w:hanging="180"/>
+      </w:pPr>
+    </w:lvl>
+    <w:lvl w:ilvl="3" w:tplc="3809000F" w:tentative="1">
+      <w:start w:val="1"/>
+      <w:numFmt w:val="decimal"/>
+      <w:lvlText w:val="%4."/>
+      <w:lvlJc w:val="left"/>
+      <w:pPr>
+        <w:ind w:left="2880" w:hanging="360"/>
+      </w:pPr>
+    </w:lvl>
+    <w:lvl w:ilvl="4" w:tplc="38090019" w:tentative="1">
+      <w:start w:val="1"/>
+      <w:numFmt w:val="lowerLetter"/>
+      <w:lvlText w:val="%5."/>
+      <w:lvlJc w:val="left"/>
+      <w:pPr>
+        <w:ind w:left="3600" w:hanging="360"/>
+      </w:pPr>
+    </w:lvl>
+    <w:lvl w:ilvl="5" w:tplc="3809001B" w:tentative="1">
+      <w:start w:val="1"/>
+      <w:numFmt w:val="lowerRoman"/>
+      <w:lvlText w:val="%6."/>
+      <w:lvlJc w:val="right"/>
+      <w:pPr>
+        <w:ind w:left="4320" w:hanging="180"/>
+      </w:pPr>
+    </w:lvl>
+    <w:lvl w:ilvl="6" w:tplc="3809000F" w:tentative="1">
+      <w:start w:val="1"/>
+      <w:numFmt w:val="decimal"/>
+      <w:lvlText w:val="%7."/>
+      <w:lvlJc w:val="left"/>
+      <w:pPr>
+        <w:ind w:left="5040" w:hanging="360"/>
+      </w:pPr>
+    </w:lvl>
+    <w:lvl w:ilvl="7" w:tplc="38090019" w:tentative="1">
+      <w:start w:val="1"/>
+      <w:numFmt w:val="lowerLetter"/>
+      <w:lvlText w:val="%8."/>
+      <w:lvlJc w:val="left"/>
+      <w:pPr>
+        <w:ind w:left="5760" w:hanging="360"/>
+      </w:pPr>
+    </w:lvl>
+    <w:lvl w:ilvl="8" w:tplc="3809001B" w:tentative="1">
+      <w:start w:val="1"/>
+      <w:numFmt w:val="lowerRoman"/>
+      <w:lvlText w:val="%9."/>
+      <w:lvlJc w:val="right"/>
+      <w:pPr>
+        <w:ind w:left="6480" w:hanging="180"/>
+      </w:pPr>
+    </w:lvl>
+  </w:abstractNum>
+  <w:abstractNum w:abstractNumId="3" w15:restartNumberingAfterBreak="0">
+    <w:nsid w:val="25E27E72"/>
+    <w:multiLevelType w:val="hybridMultilevel"/>
+    <w:tmpl w:val="731A163E"/>
+    <w:lvl w:ilvl="0" w:tplc="2D4298EC">
+      <w:start w:val="2"/>
+      <w:numFmt w:val="decimal"/>
+      <w:lvlText w:val="%1."/>
+      <w:lvlJc w:val="left"/>
+      <w:pPr>
+        <w:ind w:left="2915" w:hanging="360"/>
+      </w:pPr>
+      <w:rPr>
+        <w:rFonts w:ascii="Arial MT" w:eastAsia="Arial MT" w:hAnsi="Arial MT" w:cs="Arial MT" w:hint="default"/>
+        <w:b w:val="0"/>
+        <w:bCs w:val="0"/>
+        <w:i w:val="0"/>
+        <w:iCs w:val="0"/>
+        <w:spacing w:val="0"/>
+        <w:w w:val="100"/>
+        <w:sz w:val="22"/>
+        <w:szCs w:val="22"/>
+        <w:lang w:val="id" w:eastAsia="en-US" w:bidi="ar-SA"/>
+      </w:rPr>
+    </w:lvl>
+    <w:lvl w:ilvl="1" w:tplc="38090019" w:tentative="1">
+      <w:start w:val="1"/>
+      <w:numFmt w:val="lowerLetter"/>
+      <w:lvlText w:val="%2."/>
+      <w:lvlJc w:val="left"/>
+      <w:pPr>
+        <w:ind w:left="1440" w:hanging="360"/>
+      </w:pPr>
+    </w:lvl>
+    <w:lvl w:ilvl="2" w:tplc="3809001B" w:tentative="1">
+      <w:start w:val="1"/>
+      <w:numFmt w:val="lowerRoman"/>
+      <w:lvlText w:val="%3."/>
+      <w:lvlJc w:val="right"/>
+      <w:pPr>
+        <w:ind w:left="2160" w:hanging="180"/>
+      </w:pPr>
+    </w:lvl>
+    <w:lvl w:ilvl="3" w:tplc="3809000F" w:tentative="1">
+      <w:start w:val="1"/>
+      <w:numFmt w:val="decimal"/>
+      <w:lvlText w:val="%4."/>
+      <w:lvlJc w:val="left"/>
+      <w:pPr>
+        <w:ind w:left="2880" w:hanging="360"/>
+      </w:pPr>
+    </w:lvl>
+    <w:lvl w:ilvl="4" w:tplc="38090019" w:tentative="1">
+      <w:start w:val="1"/>
+      <w:numFmt w:val="lowerLetter"/>
+      <w:lvlText w:val="%5."/>
+      <w:lvlJc w:val="left"/>
+      <w:pPr>
+        <w:ind w:left="3600" w:hanging="360"/>
+      </w:pPr>
+    </w:lvl>
+    <w:lvl w:ilvl="5" w:tplc="3809001B" w:tentative="1">
+      <w:start w:val="1"/>
+      <w:numFmt w:val="lowerRoman"/>
+      <w:lvlText w:val="%6."/>
+      <w:lvlJc w:val="right"/>
+      <w:pPr>
+        <w:ind w:left="4320" w:hanging="180"/>
+      </w:pPr>
+    </w:lvl>
+    <w:lvl w:ilvl="6" w:tplc="3809000F" w:tentative="1">
+      <w:start w:val="1"/>
+      <w:numFmt w:val="decimal"/>
+      <w:lvlText w:val="%7."/>
+      <w:lvlJc w:val="left"/>
+      <w:pPr>
+        <w:ind w:left="5040" w:hanging="360"/>
+      </w:pPr>
+    </w:lvl>
+    <w:lvl w:ilvl="7" w:tplc="38090019" w:tentative="1">
+      <w:start w:val="1"/>
+      <w:numFmt w:val="lowerLetter"/>
+      <w:lvlText w:val="%8."/>
+      <w:lvlJc w:val="left"/>
+      <w:pPr>
+        <w:ind w:left="5760" w:hanging="360"/>
+      </w:pPr>
+    </w:lvl>
+    <w:lvl w:ilvl="8" w:tplc="3809001B" w:tentative="1">
+      <w:start w:val="1"/>
+      <w:numFmt w:val="lowerRoman"/>
+      <w:lvlText w:val="%9."/>
+      <w:lvlJc w:val="right"/>
+      <w:pPr>
+        <w:ind w:left="6480" w:hanging="180"/>
+      </w:pPr>
+    </w:lvl>
+  </w:abstractNum>
+  <w:abstractNum w:abstractNumId="4" w15:restartNumberingAfterBreak="0">
+    <w:nsid w:val="3A075974"/>
+    <w:multiLevelType w:val="hybridMultilevel"/>
+    <w:tmpl w:val="0582C264"/>
+    <w:lvl w:ilvl="0" w:tplc="2D4298EC">
+      <w:start w:val="2"/>
+      <w:numFmt w:val="decimal"/>
+      <w:lvlText w:val="%1."/>
+      <w:lvlJc w:val="left"/>
+      <w:pPr>
+        <w:ind w:left="2915" w:hanging="360"/>
+      </w:pPr>
+      <w:rPr>
+        <w:rFonts w:ascii="Arial MT" w:eastAsia="Arial MT" w:hAnsi="Arial MT" w:cs="Arial MT" w:hint="default"/>
+        <w:b w:val="0"/>
+        <w:bCs w:val="0"/>
+        <w:i w:val="0"/>
+        <w:iCs w:val="0"/>
+        <w:spacing w:val="0"/>
+        <w:w w:val="100"/>
+        <w:sz w:val="22"/>
+        <w:szCs w:val="22"/>
+        <w:lang w:val="id" w:eastAsia="en-US" w:bidi="ar-SA"/>
+      </w:rPr>
+    </w:lvl>
+    <w:lvl w:ilvl="1" w:tplc="38090019" w:tentative="1">
+      <w:start w:val="1"/>
+      <w:numFmt w:val="lowerLetter"/>
+      <w:lvlText w:val="%2."/>
+      <w:lvlJc w:val="left"/>
+      <w:pPr>
+        <w:ind w:left="1440" w:hanging="360"/>
+      </w:pPr>
+    </w:lvl>
+    <w:lvl w:ilvl="2" w:tplc="3809001B" w:tentative="1">
+      <w:start w:val="1"/>
+      <w:numFmt w:val="lowerRoman"/>
+      <w:lvlText w:val="%3."/>
+      <w:lvlJc w:val="right"/>
+      <w:pPr>
+        <w:ind w:left="2160" w:hanging="180"/>
+      </w:pPr>
+    </w:lvl>
+    <w:lvl w:ilvl="3" w:tplc="3809000F" w:tentative="1">
+      <w:start w:val="1"/>
+      <w:numFmt w:val="decimal"/>
+      <w:lvlText w:val="%4."/>
+      <w:lvlJc w:val="left"/>
+      <w:pPr>
+        <w:ind w:left="2880" w:hanging="360"/>
+      </w:pPr>
+    </w:lvl>
+    <w:lvl w:ilvl="4" w:tplc="38090019" w:tentative="1">
+      <w:start w:val="1"/>
+      <w:numFmt w:val="lowerLetter"/>
+      <w:lvlText w:val="%5."/>
+      <w:lvlJc w:val="left"/>
+      <w:pPr>
+        <w:ind w:left="3600" w:hanging="360"/>
+      </w:pPr>
+    </w:lvl>
+    <w:lvl w:ilvl="5" w:tplc="3809001B" w:tentative="1">
+      <w:start w:val="1"/>
+      <w:numFmt w:val="lowerRoman"/>
+      <w:lvlText w:val="%6."/>
+      <w:lvlJc w:val="right"/>
+      <w:pPr>
+        <w:ind w:left="4320" w:hanging="180"/>
+      </w:pPr>
+    </w:lvl>
+    <w:lvl w:ilvl="6" w:tplc="3809000F" w:tentative="1">
+      <w:start w:val="1"/>
+      <w:numFmt w:val="decimal"/>
+      <w:lvlText w:val="%7."/>
+      <w:lvlJc w:val="left"/>
+      <w:pPr>
+        <w:ind w:left="5040" w:hanging="360"/>
+      </w:pPr>
+    </w:lvl>
+    <w:lvl w:ilvl="7" w:tplc="38090019" w:tentative="1">
+      <w:start w:val="1"/>
+      <w:numFmt w:val="lowerLetter"/>
+      <w:lvlText w:val="%8."/>
+      <w:lvlJc w:val="left"/>
+      <w:pPr>
+        <w:ind w:left="5760" w:hanging="360"/>
+      </w:pPr>
+    </w:lvl>
+    <w:lvl w:ilvl="8" w:tplc="3809001B" w:tentative="1">
+      <w:start w:val="1"/>
+      <w:numFmt w:val="lowerRoman"/>
+      <w:lvlText w:val="%9."/>
+      <w:lvlJc w:val="right"/>
+      <w:pPr>
+        <w:ind w:left="6480" w:hanging="180"/>
+      </w:pPr>
+    </w:lvl>
+  </w:abstractNum>
+  <w:abstractNum w:abstractNumId="5" w15:restartNumberingAfterBreak="0">
+    <w:nsid w:val="624B1B7E"/>
+    <w:multiLevelType w:val="hybridMultilevel"/>
+    <w:tmpl w:val="E36A1104"/>
+    <w:lvl w:ilvl="0" w:tplc="2D4298EC">
+      <w:start w:val="2"/>
+      <w:numFmt w:val="decimal"/>
+      <w:lvlText w:val="%1."/>
+      <w:lvlJc w:val="left"/>
+      <w:pPr>
+        <w:ind w:left="2915" w:hanging="360"/>
+      </w:pPr>
+      <w:rPr>
+        <w:rFonts w:ascii="Arial MT" w:eastAsia="Arial MT" w:hAnsi="Arial MT" w:cs="Arial MT" w:hint="default"/>
+        <w:b w:val="0"/>
+        <w:bCs w:val="0"/>
+        <w:i w:val="0"/>
+        <w:iCs w:val="0"/>
+        <w:spacing w:val="0"/>
+        <w:w w:val="100"/>
+        <w:sz w:val="22"/>
+        <w:szCs w:val="22"/>
+        <w:lang w:val="id" w:eastAsia="en-US" w:bidi="ar-SA"/>
+      </w:rPr>
+    </w:lvl>
+    <w:lvl w:ilvl="1" w:tplc="38090019" w:tentative="1">
+      <w:start w:val="1"/>
+      <w:numFmt w:val="lowerLetter"/>
+      <w:lvlText w:val="%2."/>
+      <w:lvlJc w:val="left"/>
+      <w:pPr>
+        <w:ind w:left="1440" w:hanging="360"/>
+      </w:pPr>
+    </w:lvl>
+    <w:lvl w:ilvl="2" w:tplc="3809001B" w:tentative="1">
+      <w:start w:val="1"/>
+      <w:numFmt w:val="lowerRoman"/>
+      <w:lvlText w:val="%3."/>
+      <w:lvlJc w:val="right"/>
+      <w:pPr>
+        <w:ind w:left="2160" w:hanging="180"/>
+      </w:pPr>
+    </w:lvl>
+    <w:lvl w:ilvl="3" w:tplc="3809000F" w:tentative="1">
+      <w:start w:val="1"/>
+      <w:numFmt w:val="decimal"/>
+      <w:lvlText w:val="%4."/>
+      <w:lvlJc w:val="left"/>
+      <w:pPr>
+        <w:ind w:left="2880" w:hanging="360"/>
+      </w:pPr>
+    </w:lvl>
+    <w:lvl w:ilvl="4" w:tplc="38090019" w:tentative="1">
+      <w:start w:val="1"/>
+      <w:numFmt w:val="lowerLetter"/>
+      <w:lvlText w:val="%5."/>
+      <w:lvlJc w:val="left"/>
+      <w:pPr>
+        <w:ind w:left="3600" w:hanging="360"/>
+      </w:pPr>
+    </w:lvl>
+    <w:lvl w:ilvl="5" w:tplc="3809001B" w:tentative="1">
+      <w:start w:val="1"/>
+      <w:numFmt w:val="lowerRoman"/>
+      <w:lvlText w:val="%6."/>
+      <w:lvlJc w:val="right"/>
+      <w:pPr>
+        <w:ind w:left="4320" w:hanging="180"/>
+      </w:pPr>
+    </w:lvl>
+    <w:lvl w:ilvl="6" w:tplc="3809000F" w:tentative="1">
+      <w:start w:val="1"/>
+      <w:numFmt w:val="decimal"/>
+      <w:lvlText w:val="%7."/>
+      <w:lvlJc w:val="left"/>
+      <w:pPr>
+        <w:ind w:left="5040" w:hanging="360"/>
+      </w:pPr>
+    </w:lvl>
+    <w:lvl w:ilvl="7" w:tplc="38090019" w:tentative="1">
+      <w:start w:val="1"/>
+      <w:numFmt w:val="lowerLetter"/>
+      <w:lvlText w:val="%8."/>
+      <w:lvlJc w:val="left"/>
+      <w:pPr>
+        <w:ind w:left="5760" w:hanging="360"/>
+      </w:pPr>
+    </w:lvl>
+    <w:lvl w:ilvl="8" w:tplc="3809001B" w:tentative="1">
+      <w:start w:val="1"/>
+      <w:numFmt w:val="lowerRoman"/>
+      <w:lvlText w:val="%9."/>
+      <w:lvlJc w:val="right"/>
+      <w:pPr>
+        <w:ind w:left="6480" w:hanging="180"/>
+      </w:pPr>
+    </w:lvl>
+  </w:abstractNum>
   <w:num w:numId="1" w16cid:durableId="1781340690">
+    <w:abstractNumId w:val="1"/>
+  </w:num>
+  <w:num w:numId="2" w16cid:durableId="61216923">
+    <w:abstractNumId w:val="2"/>
+  </w:num>
+  <w:num w:numId="3" w16cid:durableId="623467952">
+    <w:abstractNumId w:val="5"/>
+  </w:num>
+  <w:num w:numId="4" w16cid:durableId="1681004111">
     <w:abstractNumId w:val="0"/>
+  </w:num>
+  <w:num w:numId="5" w16cid:durableId="2003047719">
+    <w:abstractNumId w:val="3"/>
+  </w:num>
+  <w:num w:numId="6" w16cid:durableId="1766724767">
+    <w:abstractNumId w:val="4"/>
   </w:num>
 </w:numbering>
 </file>
 
 <file path=word/styles.xml><?xml version="1.0" encoding="utf-8"?>
-<w:styles xmlns:mc="http://schemas.openxmlformats.org/markup-compatibility/2006" xmlns:r="http://schemas.openxmlformats.org/officeDocument/2006/relationships" xmlns:w="http://schemas.openxmlformats.org/wordprocessingml/2006/main" xmlns:w14="http://schemas.microsoft.com/office/word/2010/wordml" xmlns:w15="http://schemas.microsoft.com/office/word/2012/wordml" xmlns:w16cex="http://schemas.microsoft.com/office/word/2018/wordml/cex" xmlns:w16cid="http://schemas.microsoft.com/office/word/2016/wordml/cid" xmlns:w16="http://schemas.microsoft.com/office/word/2018/wordml" xmlns:w16du="http://schemas.microsoft.com/office/word/2023/wordml/word16du" xmlns:w16sdtdh="http://schemas.microsoft.com/office/word/2020/wordml/sdtdatahash" xmlns:w16sdtfl="http://schemas.microsoft.com/office/word/2024/wordml/sdtformatlock" xmlns:w16se="http://schemas.microsoft.com/office/word/2015/wordml/symex" mc:Ignorable="w14 w15 w16se w16cid w16 w16cex w16sdtdh w16sdtfl w16du">
+<w:styles xmlns:mc="http://schemas.openxmlformats.org/markup-compatibility/2006" xmlns:r="http://schemas.openxmlformats.org/officeDocument/2006/relationships" xmlns:w="http://schemas.openxmlformats.org/wordprocessingml/2006/main" xmlns:w14="http://schemas.microsoft.com/office/word/2010/wordml" xmlns:w15="http://schemas.microsoft.com/office/word/2012/wordml" xmlns:w16cex="http://schemas.microsoft.com/office/word/2018/wordml/cex" xmlns:w16cid="http://schemas.microsoft.com/office/word/2016/wordml/cid" xmlns:w16="http://schemas.microsoft.com/office/word/2018/wordml" xmlns:w16sdtdh="http://schemas.microsoft.com/office/word/2020/wordml/sdtdatahash" xmlns:w16se="http://schemas.microsoft.com/office/word/2015/wordml/symex" mc:Ignorable="w14 w15 w16se w16cid w16 w16cex w16sdtdh">
   <w:docDefaults>
     <w:rPrDefault>
       <w:rPr>
@@ -3293,6 +4333,7 @@
   <w:style w:type="paragraph" w:styleId="BodyText">
     <w:name w:val="Body Text"/>
     <w:basedOn w:val="Normal"/>
+    <w:link w:val="BodyTextChar"/>
     <w:uiPriority w:val="1"/>
     <w:qFormat/>
   </w:style>
@@ -3457,6 +4498,17 @@
         <w:insideV w:val="single" w:sz="4" w:space="0" w:color="BFBFBF" w:themeColor="background1" w:themeShade="BF"/>
       </w:tblBorders>
     </w:tblPr>
+  </w:style>
+  <w:style w:type="character" w:customStyle="1" w:styleId="BodyTextChar">
+    <w:name w:val="Body Text Char"/>
+    <w:basedOn w:val="DefaultParagraphFont"/>
+    <w:link w:val="BodyText"/>
+    <w:uiPriority w:val="1"/>
+    <w:rsid w:val="00C648D7"/>
+    <w:rPr>
+      <w:rFonts w:ascii="Arial MT" w:eastAsia="Arial MT" w:hAnsi="Arial MT" w:cs="Arial MT"/>
+      <w:lang w:val="id"/>
+    </w:rPr>
   </w:style>
 </w:styles>
 </file>

</xml_diff>

<commit_message>
fix: document generation updates and frontend bugfixes
</commit_message>
<xml_diff>
--- a/backend/templates/Berkas Luar Kota - Laporan.docx
+++ b/backend/templates/Berkas Luar Kota - Laporan.docx
@@ -441,12 +441,19 @@
         </w:rPr>
         <w:tab/>
       </w:r>
+      <w:r>
+        <w:rPr>
+          <w:rFonts w:ascii="Arial"/>
+          <w:b/>
+        </w:rPr>
+        <w:tab/>
+      </w:r>
     </w:p>
     <w:tbl>
       <w:tblPr>
         <w:tblStyle w:val="TableGrid"/>
-        <w:tblpPr w:leftFromText="180" w:rightFromText="180" w:vertAnchor="text" w:horzAnchor="margin" w:tblpXSpec="right" w:tblpY="27"/>
-        <w:tblW w:w="0" w:type="auto"/>
+        <w:tblW w:w="4603" w:type="pct"/>
+        <w:tblInd w:w="817" w:type="dxa"/>
         <w:tblBorders>
           <w:top w:val="none" w:sz="0" w:space="0" w:color="auto"/>
           <w:left w:val="none" w:sz="0" w:space="0" w:color="auto"/>
@@ -458,1018 +465,978 @@
         <w:tblLook w:val="04A0" w:firstRow="1" w:lastRow="0" w:firstColumn="1" w:lastColumn="0" w:noHBand="0" w:noVBand="1"/>
       </w:tblPr>
       <w:tblGrid>
-        <w:gridCol w:w="425"/>
-        <w:gridCol w:w="7308"/>
+        <w:gridCol w:w="9478"/>
       </w:tblGrid>
       <w:tr>
         <w:tc>
           <w:tcPr>
-            <w:tcW w:w="425" w:type="dxa"/>
+            <w:tcW w:w="5000" w:type="pct"/>
           </w:tcPr>
-          <w:p>
-            <w:pPr>
-              <w:pStyle w:val="BodyText"/>
-              <w:spacing w:before="2"/>
+          <w:tbl>
+            <w:tblPr>
+              <w:tblStyle w:val="TableGrid"/>
+              <w:tblpPr w:leftFromText="180" w:rightFromText="180" w:vertAnchor="text" w:horzAnchor="page" w:tblpX="1997" w:tblpY="-27"/>
+              <w:tblOverlap w:val="never"/>
+              <w:tblW w:w="0" w:type="auto"/>
+              <w:tblBorders>
+                <w:top w:val="none" w:sz="0" w:space="0" w:color="auto"/>
+                <w:left w:val="none" w:sz="0" w:space="0" w:color="auto"/>
+                <w:bottom w:val="none" w:sz="0" w:space="0" w:color="auto"/>
+                <w:right w:val="none" w:sz="0" w:space="0" w:color="auto"/>
+                <w:insideH w:val="none" w:sz="0" w:space="0" w:color="auto"/>
+                <w:insideV w:val="none" w:sz="0" w:space="0" w:color="auto"/>
+              </w:tblBorders>
+              <w:tblLook w:val="04A0" w:firstRow="1" w:lastRow="0" w:firstColumn="1" w:lastColumn="0" w:noHBand="0" w:noVBand="1"/>
+            </w:tblPr>
+            <w:tblGrid>
+              <w:gridCol w:w="425"/>
+              <w:gridCol w:w="7308"/>
+            </w:tblGrid>
+            <w:tr>
+              <w:tc>
+                <w:tcPr>
+                  <w:tcW w:w="425" w:type="dxa"/>
+                </w:tcPr>
+                <w:p>
+                  <w:pPr>
+                    <w:pStyle w:val="BodyText"/>
+                    <w:spacing w:before="2"/>
+                    <w:jc w:val="center"/>
+                  </w:pPr>
+                  <w:r>
+                    <w:t>1.</w:t>
+                  </w:r>
+                </w:p>
+              </w:tc>
+              <w:tc>
+                <w:tcPr>
+                  <w:tcW w:w="7308" w:type="dxa"/>
+                </w:tcPr>
+                <w:p>
+                  <w:pPr>
+                    <w:pStyle w:val="BodyText"/>
+                    <w:tabs>
+                      <w:tab w:val="left" w:pos="2204"/>
+                      <w:tab w:val="left" w:pos="2530"/>
+                      <w:tab w:val="left" w:pos="6160"/>
+                    </w:tabs>
+                    <w:ind w:right="354"/>
+                    <w:jc w:val="both"/>
+                  </w:pPr>
+                  <w:r>
+                    <w:t>Surat</w:t>
+                  </w:r>
+                  <w:r>
+                    <w:rPr>
+                      <w:spacing w:val="40"/>
+                    </w:rPr>
+                    <w:t xml:space="preserve"> </w:t>
+                  </w:r>
+                  <w:r>
+                    <w:t>Tugas</w:t>
+                  </w:r>
+                  <w:r>
+                    <w:rPr>
+                      <w:spacing w:val="40"/>
+                    </w:rPr>
+                    <w:t xml:space="preserve"> </w:t>
+                  </w:r>
+                  <w:r>
+                    <w:t>Kepala</w:t>
+                  </w:r>
+                  <w:r>
+                    <w:rPr>
+                      <w:spacing w:val="40"/>
+                    </w:rPr>
+                    <w:t xml:space="preserve"> </w:t>
+                  </w:r>
+                  <w:r>
+                    <w:t>Biro</w:t>
+                  </w:r>
+                  <w:r>
+                    <w:rPr>
+                      <w:spacing w:val="40"/>
+                    </w:rPr>
+                    <w:t xml:space="preserve"> </w:t>
+                  </w:r>
+                  <w:r>
+                    <w:t>Umum</w:t>
+                  </w:r>
+                  <w:r>
+                    <w:rPr>
+                      <w:spacing w:val="40"/>
+                    </w:rPr>
+                    <w:t xml:space="preserve"> </w:t>
+                  </w:r>
+                  <w:r>
+                    <w:t>Sekretariat</w:t>
+                  </w:r>
+                  <w:r>
+                    <w:rPr>
+                      <w:spacing w:val="40"/>
+                    </w:rPr>
+                    <w:t xml:space="preserve"> </w:t>
+                  </w:r>
+                  <w:r>
+                    <w:t>Jenderal</w:t>
+                  </w:r>
+                  <w:r>
+                    <w:rPr>
+                      <w:spacing w:val="40"/>
+                    </w:rPr>
+                    <w:t xml:space="preserve"> </w:t>
+                  </w:r>
+                  <w:r>
+                    <w:t>Kementerian Ketenagakerjaan Nomor</w:t>
+                  </w:r>
+                  <w:r>
+                    <w:rPr>
+                      <w:spacing w:val="-14"/>
+                    </w:rPr>
+                    <w:t xml:space="preserve"> </w:t>
+                  </w:r>
+                  <w:r>
+                    <w:rPr>
+                      <w:spacing w:val="-5"/>
+                    </w:rPr>
+                    <w:t>1/</w:t>
+                  </w:r>
+                  <w:r>
+                    <w:t>{{no_surat}}</w:t>
+                  </w:r>
+                  <w:r>
+                    <w:rPr>
+                      <w:spacing w:val="-2"/>
+                    </w:rPr>
+                    <w:t>/UM.06.00/{{bulan_romawi}}/{{tahun_saat_ini}}</w:t>
+                  </w:r>
+                  <w:r>
+                    <w:rPr>
+                      <w:spacing w:val="29"/>
+                    </w:rPr>
+                    <w:t xml:space="preserve"> </w:t>
+                  </w:r>
+                  <w:r>
+                    <w:rPr>
+                      <w:spacing w:val="-2"/>
+                    </w:rPr>
+                    <w:t>Tanggal {{tanggal_no_surat}}</w:t>
+                  </w:r>
+                  <w:r>
+                    <w:rPr>
+                      <w:spacing w:val="-13"/>
+                    </w:rPr>
+                    <w:t xml:space="preserve"> </w:t>
+                  </w:r>
+                  <w:r>
+                    <w:t>2026</w:t>
+                  </w:r>
+                  <w:r>
+                    <w:rPr>
+                      <w:spacing w:val="-13"/>
+                    </w:rPr>
+                    <w:t xml:space="preserve"> </w:t>
+                  </w:r>
+                  <w:r>
+                    <w:t>dalam</w:t>
+                  </w:r>
+                  <w:r>
+                    <w:rPr>
+                      <w:spacing w:val="-15"/>
+                    </w:rPr>
+                    <w:t xml:space="preserve"> </w:t>
+                  </w:r>
+                  <w:r>
+                    <w:t>rangka</w:t>
+                  </w:r>
+                  <w:r>
+                    <w:rPr>
+                      <w:spacing w:val="-12"/>
+                    </w:rPr>
+                    <w:t xml:space="preserve"> </w:t>
+                  </w:r>
+                  <w:r>
+                    <w:t>{{tujuan_perjalanan}}</w:t>
+                  </w:r>
+                  <w:r>
+                    <w:rPr>
+                      <w:spacing w:val="-9"/>
+                    </w:rPr>
+                    <w:t xml:space="preserve"> </w:t>
+                  </w:r>
+                  <w:r>
+                    <w:t>kunjungan</w:t>
+                  </w:r>
+                  <w:r>
+                    <w:rPr>
+                      <w:spacing w:val="-7"/>
+                    </w:rPr>
+                    <w:t xml:space="preserve"> </w:t>
+                  </w:r>
+                  <w:r>
+                    <w:rPr>
+                      <w:spacing w:val="-2"/>
+                    </w:rPr>
+                    <w:t>kerja</w:t>
+                  </w:r>
+                  <w:r>
+                    <w:t xml:space="preserve"> {{stakeholder}}</w:t>
+                  </w:r>
+                  <w:r>
+                    <w:rPr>
+                      <w:spacing w:val="-4"/>
+                    </w:rPr>
+                    <w:t xml:space="preserve"> </w:t>
+                  </w:r>
+                  <w:r>
+                    <w:t>di</w:t>
+                  </w:r>
+                  <w:r>
+                    <w:rPr>
+                      <w:spacing w:val="-10"/>
+                    </w:rPr>
+                    <w:t xml:space="preserve"> {{kota}}, {{provinsi}}</w:t>
+                  </w:r>
+                  <w:r>
+                    <w:rPr>
+                      <w:spacing w:val="-2"/>
+                    </w:rPr>
+                    <w:t>;</w:t>
+                  </w:r>
+                </w:p>
+              </w:tc>
+            </w:tr>
+            <w:tr>
+              <w:tc>
+                <w:tcPr>
+                  <w:tcW w:w="425" w:type="dxa"/>
+                </w:tcPr>
+                <w:p>
+                  <w:pPr>
+                    <w:pStyle w:val="BodyText"/>
+                    <w:spacing w:before="2"/>
+                    <w:jc w:val="center"/>
+                  </w:pPr>
+                  <w:r>
+                    <w:t>2.</w:t>
+                  </w:r>
+                </w:p>
+              </w:tc>
+              <w:tc>
+                <w:tcPr>
+                  <w:tcW w:w="7308" w:type="dxa"/>
+                </w:tcPr>
+                <w:p>
+                  <w:pPr>
+                    <w:tabs>
+                      <w:tab w:val="left" w:pos="2915"/>
+                    </w:tabs>
+                    <w:spacing w:before="2"/>
+                    <w:ind w:right="352"/>
+                    <w:jc w:val="both"/>
+                  </w:pPr>
+                  <w:r>
+                    <w:t>Peraturan</w:t>
+                  </w:r>
+                  <w:r>
+                    <w:rPr>
+                      <w:spacing w:val="-5"/>
+                    </w:rPr>
+                    <w:t xml:space="preserve"> </w:t>
+                  </w:r>
+                  <w:r>
+                    <w:t>Menteri</w:t>
+                  </w:r>
+                  <w:r>
+                    <w:rPr>
+                      <w:spacing w:val="-11"/>
+                    </w:rPr>
+                    <w:t xml:space="preserve"> </w:t>
+                  </w:r>
+                  <w:r>
+                    <w:t>Keuangan</w:t>
+                  </w:r>
+                  <w:r>
+                    <w:rPr>
+                      <w:spacing w:val="-8"/>
+                    </w:rPr>
+                    <w:t xml:space="preserve"> </w:t>
+                  </w:r>
+                  <w:r>
+                    <w:t>No.</w:t>
+                  </w:r>
+                  <w:r>
+                    <w:rPr>
+                      <w:spacing w:val="-9"/>
+                    </w:rPr>
+                    <w:t xml:space="preserve"> </w:t>
+                  </w:r>
+                  <w:r>
+                    <w:t>119</w:t>
+                  </w:r>
+                  <w:r>
+                    <w:rPr>
+                      <w:spacing w:val="-8"/>
+                    </w:rPr>
+                    <w:t xml:space="preserve"> </w:t>
+                  </w:r>
+                  <w:r>
+                    <w:t>Tahun</w:t>
+                  </w:r>
+                  <w:r>
+                    <w:rPr>
+                      <w:spacing w:val="-8"/>
+                    </w:rPr>
+                    <w:t xml:space="preserve"> </w:t>
+                  </w:r>
+                  <w:r>
+                    <w:t>2023</w:t>
+                  </w:r>
+                  <w:r>
+                    <w:rPr>
+                      <w:spacing w:val="-8"/>
+                    </w:rPr>
+                    <w:t xml:space="preserve"> </w:t>
+                  </w:r>
+                  <w:r>
+                    <w:t xml:space="preserve">tentang Perubahan atas PMK No. 113/PMK.05/2012 tentang Perjalanan Dinas dalam negeri bagi Pejabat Negara, Pegawai Negeri dan Pegawai Tidak </w:t>
+                  </w:r>
+                  <w:r>
+                    <w:rPr>
+                      <w:spacing w:val="-2"/>
+                    </w:rPr>
+                    <w:t>Tetap;</w:t>
+                  </w:r>
+                </w:p>
+              </w:tc>
+            </w:tr>
+            <w:tr>
+              <w:tc>
+                <w:tcPr>
+                  <w:tcW w:w="425" w:type="dxa"/>
+                </w:tcPr>
+                <w:p>
+                  <w:pPr>
+                    <w:pStyle w:val="BodyText"/>
+                    <w:spacing w:before="2"/>
+                    <w:jc w:val="center"/>
+                  </w:pPr>
+                  <w:r>
+                    <w:t>3.</w:t>
+                  </w:r>
+                </w:p>
+              </w:tc>
+              <w:tc>
+                <w:tcPr>
+                  <w:tcW w:w="7308" w:type="dxa"/>
+                </w:tcPr>
+                <w:p>
+                  <w:pPr>
+                    <w:tabs>
+                      <w:tab w:val="left" w:pos="2895"/>
+                    </w:tabs>
+                    <w:ind w:right="362"/>
+                    <w:jc w:val="both"/>
+                  </w:pPr>
+                  <w:r>
+                    <w:t>Peraturan</w:t>
+                  </w:r>
+                  <w:r>
+                    <w:rPr>
+                      <w:spacing w:val="-15"/>
+                    </w:rPr>
+                    <w:t xml:space="preserve"> </w:t>
+                  </w:r>
+                  <w:r>
+                    <w:t>Menteri</w:t>
+                  </w:r>
+                  <w:r>
+                    <w:rPr>
+                      <w:spacing w:val="-14"/>
+                    </w:rPr>
+                    <w:t xml:space="preserve"> </w:t>
+                  </w:r>
+                  <w:r>
+                    <w:t>Ketenagakerjaan</w:t>
+                  </w:r>
+                  <w:r>
+                    <w:rPr>
+                      <w:spacing w:val="-12"/>
+                    </w:rPr>
+                    <w:t xml:space="preserve"> </w:t>
+                  </w:r>
+                  <w:r>
+                    <w:t>Nomor</w:t>
+                  </w:r>
+                  <w:r>
+                    <w:rPr>
+                      <w:spacing w:val="-14"/>
+                    </w:rPr>
+                    <w:t xml:space="preserve"> </w:t>
+                  </w:r>
+                  <w:r>
+                    <w:t>20</w:t>
+                  </w:r>
+                  <w:r>
+                    <w:rPr>
+                      <w:spacing w:val="37"/>
+                    </w:rPr>
+                    <w:t xml:space="preserve"> </w:t>
+                  </w:r>
+                  <w:r>
+                    <w:t>Tahun</w:t>
+                  </w:r>
+                  <w:r>
+                    <w:rPr>
+                      <w:spacing w:val="-12"/>
+                    </w:rPr>
+                    <w:t xml:space="preserve"> </w:t>
+                  </w:r>
+                  <w:r>
+                    <w:t>2024</w:t>
+                  </w:r>
+                  <w:r>
+                    <w:rPr>
+                      <w:spacing w:val="-12"/>
+                    </w:rPr>
+                    <w:t xml:space="preserve"> </w:t>
+                  </w:r>
+                  <w:r>
+                    <w:t>tanggal</w:t>
+                  </w:r>
+                  <w:r>
+                    <w:rPr>
+                      <w:spacing w:val="-16"/>
+                    </w:rPr>
+                    <w:t xml:space="preserve"> </w:t>
+                  </w:r>
+                  <w:r>
+                    <w:t xml:space="preserve">30 Desember 2024 tentang Organisasi dan Tata Kerja Kementerian </w:t>
+                  </w:r>
+                  <w:r>
+                    <w:rPr>
+                      <w:spacing w:val="-2"/>
+                    </w:rPr>
+                    <w:t>Ketenagakerjaan;</w:t>
+                  </w:r>
+                </w:p>
+              </w:tc>
+            </w:tr>
+            <w:tr>
+              <w:tc>
+                <w:tcPr>
+                  <w:tcW w:w="425" w:type="dxa"/>
+                </w:tcPr>
+                <w:p>
+                  <w:pPr>
+                    <w:pStyle w:val="BodyText"/>
+                    <w:spacing w:before="2"/>
+                    <w:jc w:val="center"/>
+                  </w:pPr>
+                  <w:r>
+                    <w:t>4.</w:t>
+                  </w:r>
+                </w:p>
+              </w:tc>
+              <w:tc>
+                <w:tcPr>
+                  <w:tcW w:w="7308" w:type="dxa"/>
+                </w:tcPr>
+                <w:p>
+                  <w:pPr>
+                    <w:tabs>
+                      <w:tab w:val="left" w:pos="2895"/>
+                    </w:tabs>
+                    <w:ind w:right="359"/>
+                    <w:jc w:val="both"/>
+                  </w:pPr>
+                  <w:r>
+                    <w:t>Keputusan</w:t>
+                  </w:r>
+                  <w:r>
+                    <w:rPr>
+                      <w:spacing w:val="-16"/>
+                    </w:rPr>
+                    <w:t xml:space="preserve"> </w:t>
+                  </w:r>
+                  <w:r>
+                    <w:t>Menteri</w:t>
+                  </w:r>
+                  <w:r>
+                    <w:rPr>
+                      <w:spacing w:val="-15"/>
+                    </w:rPr>
+                    <w:t xml:space="preserve"> </w:t>
+                  </w:r>
+                  <w:r>
+                    <w:t>Ketenagakerjaan</w:t>
+                  </w:r>
+                  <w:r>
+                    <w:rPr>
+                      <w:spacing w:val="-14"/>
+                    </w:rPr>
+                    <w:t xml:space="preserve"> </w:t>
+                  </w:r>
+                  <w:r>
+                    <w:t>Nomor</w:t>
+                  </w:r>
+                  <w:r>
+                    <w:rPr>
+                      <w:spacing w:val="-15"/>
+                    </w:rPr>
+                    <w:t xml:space="preserve"> </w:t>
+                  </w:r>
+                  <w:r>
+                    <w:t>460</w:t>
+                  </w:r>
+                  <w:r>
+                    <w:rPr>
+                      <w:spacing w:val="-13"/>
+                    </w:rPr>
+                    <w:t xml:space="preserve"> </w:t>
+                  </w:r>
+                  <w:r>
+                    <w:t>tanggal</w:t>
+                  </w:r>
+                  <w:r>
+                    <w:rPr>
+                      <w:spacing w:val="-16"/>
+                    </w:rPr>
+                    <w:t xml:space="preserve"> </w:t>
+                  </w:r>
+                  <w:r>
+                    <w:t>23</w:t>
+                  </w:r>
+                  <w:r>
+                    <w:rPr>
+                      <w:spacing w:val="-12"/>
+                    </w:rPr>
+                    <w:t xml:space="preserve"> </w:t>
+                  </w:r>
+                  <w:r>
+                    <w:t>Desember 2025,</w:t>
+                  </w:r>
+                  <w:r>
+                    <w:rPr>
+                      <w:spacing w:val="-4"/>
+                    </w:rPr>
+                    <w:t xml:space="preserve"> </w:t>
+                  </w:r>
+                  <w:r>
+                    <w:t>tentang</w:t>
+                  </w:r>
+                  <w:r>
+                    <w:rPr>
+                      <w:spacing w:val="-7"/>
+                    </w:rPr>
+                    <w:t xml:space="preserve"> </w:t>
+                  </w:r>
+                  <w:r>
+                    <w:t>Pengangkatan</w:t>
+                  </w:r>
+                  <w:r>
+                    <w:rPr>
+                      <w:spacing w:val="-7"/>
+                    </w:rPr>
+                    <w:t xml:space="preserve"> </w:t>
+                  </w:r>
+                  <w:r>
+                    <w:t>Pejabat</w:t>
+                  </w:r>
+                  <w:r>
+                    <w:rPr>
+                      <w:spacing w:val="-4"/>
+                    </w:rPr>
+                    <w:t xml:space="preserve"> </w:t>
+                  </w:r>
+                  <w:r>
+                    <w:t>Perbendaharaan</w:t>
+                  </w:r>
+                  <w:r>
+                    <w:rPr>
+                      <w:spacing w:val="-4"/>
+                    </w:rPr>
+                    <w:t xml:space="preserve"> </w:t>
+                  </w:r>
+                  <w:r>
+                    <w:t>Negara</w:t>
+                  </w:r>
+                  <w:r>
+                    <w:rPr>
+                      <w:spacing w:val="-4"/>
+                    </w:rPr>
+                    <w:t xml:space="preserve"> </w:t>
+                  </w:r>
+                  <w:r>
+                    <w:t>selaku Kuasa Pengguna Anggaran (KPA)/Kuasa Pengguna Barang (KPB) Daftar Isian Pelaksanaan Anggaran (DIPA) Bidang Ketenagakerjaan pada Kantor Pusat Kementerian Ketenagakerjaan;</w:t>
+                  </w:r>
+                </w:p>
+              </w:tc>
+            </w:tr>
+            <w:tr>
+              <w:tc>
+                <w:tcPr>
+                  <w:tcW w:w="425" w:type="dxa"/>
+                </w:tcPr>
+                <w:p>
+                  <w:pPr>
+                    <w:pStyle w:val="BodyText"/>
+                    <w:spacing w:before="2"/>
+                    <w:jc w:val="center"/>
+                  </w:pPr>
+                  <w:r>
+                    <w:t>5.</w:t>
+                  </w:r>
+                </w:p>
+              </w:tc>
+              <w:tc>
+                <w:tcPr>
+                  <w:tcW w:w="7308" w:type="dxa"/>
+                </w:tcPr>
+                <w:p>
+                  <w:pPr>
+                    <w:tabs>
+                      <w:tab w:val="left" w:pos="2895"/>
+                    </w:tabs>
+                    <w:spacing w:line="242" w:lineRule="auto"/>
+                    <w:ind w:right="359"/>
+                    <w:jc w:val="both"/>
+                  </w:pPr>
+                  <w:r>
+                    <w:t>Surat</w:t>
+                  </w:r>
+                  <w:r>
+                    <w:rPr>
+                      <w:spacing w:val="-14"/>
+                    </w:rPr>
+                    <w:t xml:space="preserve"> </w:t>
+                  </w:r>
+                  <w:r>
+                    <w:t>Keputusan</w:t>
+                  </w:r>
+                  <w:r>
+                    <w:rPr>
+                      <w:spacing w:val="-8"/>
+                    </w:rPr>
+                    <w:t xml:space="preserve"> </w:t>
+                  </w:r>
+                  <w:r>
+                    <w:t>Kuasa</w:t>
+                  </w:r>
+                  <w:r>
+                    <w:rPr>
+                      <w:spacing w:val="-13"/>
+                    </w:rPr>
+                    <w:t xml:space="preserve"> </w:t>
+                  </w:r>
+                  <w:r>
+                    <w:t>Pengguna</w:t>
+                  </w:r>
+                  <w:r>
+                    <w:rPr>
+                      <w:spacing w:val="-13"/>
+                    </w:rPr>
+                    <w:t xml:space="preserve"> </w:t>
+                  </w:r>
+                  <w:r>
+                    <w:t>Anggaran</w:t>
+                  </w:r>
+                  <w:r>
+                    <w:rPr>
+                      <w:spacing w:val="-8"/>
+                    </w:rPr>
+                    <w:t xml:space="preserve"> </w:t>
+                  </w:r>
+                  <w:r>
+                    <w:t>(KPA)</w:t>
+                  </w:r>
+                  <w:r>
+                    <w:rPr>
+                      <w:spacing w:val="-12"/>
+                    </w:rPr>
+                    <w:t xml:space="preserve"> </w:t>
+                  </w:r>
+                  <w:r>
+                    <w:t>/Kuasa</w:t>
+                  </w:r>
+                  <w:r>
+                    <w:rPr>
+                      <w:spacing w:val="-13"/>
+                    </w:rPr>
+                    <w:t xml:space="preserve"> </w:t>
+                  </w:r>
+                  <w:r>
+                    <w:t>Pengguna Barang</w:t>
+                  </w:r>
+                  <w:r>
+                    <w:rPr>
+                      <w:spacing w:val="-16"/>
+                    </w:rPr>
+                    <w:t xml:space="preserve"> </w:t>
+                  </w:r>
+                  <w:r>
+                    <w:t>(KPB)</w:t>
+                  </w:r>
+                  <w:r>
+                    <w:rPr>
+                      <w:spacing w:val="-20"/>
+                    </w:rPr>
+                    <w:t xml:space="preserve"> </w:t>
+                  </w:r>
+                  <w:r>
+                    <w:t>Sekretariat</w:t>
+                  </w:r>
+                  <w:r>
+                    <w:rPr>
+                      <w:spacing w:val="-15"/>
+                    </w:rPr>
+                    <w:t xml:space="preserve"> </w:t>
+                  </w:r>
+                  <w:r>
+                    <w:t>Jenderal</w:t>
+                  </w:r>
+                  <w:r>
+                    <w:rPr>
+                      <w:spacing w:val="-15"/>
+                    </w:rPr>
+                    <w:t xml:space="preserve"> </w:t>
+                  </w:r>
+                  <w:r>
+                    <w:t>NOMOR</w:t>
+                  </w:r>
+                  <w:r>
+                    <w:rPr>
+                      <w:spacing w:val="-16"/>
+                    </w:rPr>
+                    <w:t xml:space="preserve"> </w:t>
+                  </w:r>
+                  <w:r>
+                    <w:t>1/02/KU.04/I/2026</w:t>
+                  </w:r>
+                  <w:r>
+                    <w:rPr>
+                      <w:spacing w:val="-17"/>
+                    </w:rPr>
+                    <w:t xml:space="preserve"> </w:t>
+                  </w:r>
+                  <w:r>
+                    <w:t>tanggal 2 Januari 2026 tentang Pejabat Pembuat Komitmen DIPA Unit Sekretariat Jenderal Kementerian Ketenagakerjaan Tahun 2026;</w:t>
+                  </w:r>
+                </w:p>
+              </w:tc>
+            </w:tr>
+            <w:tr>
+              <w:trPr>
+                <w:trHeight w:val="376"/>
+              </w:trPr>
+              <w:tc>
+                <w:tcPr>
+                  <w:tcW w:w="425" w:type="dxa"/>
+                </w:tcPr>
+                <w:p>
+                  <w:pPr>
+                    <w:pStyle w:val="BodyText"/>
+                    <w:spacing w:before="2"/>
+                    <w:jc w:val="center"/>
+                  </w:pPr>
+                  <w:r>
+                    <w:t>6.</w:t>
+                  </w:r>
+                </w:p>
+              </w:tc>
+              <w:tc>
+                <w:tcPr>
+                  <w:tcW w:w="7308" w:type="dxa"/>
+                </w:tcPr>
+                <w:p>
+                  <w:pPr>
+                    <w:tabs>
+                      <w:tab w:val="left" w:pos="2895"/>
+                    </w:tabs>
+                    <w:ind w:right="355"/>
+                    <w:jc w:val="both"/>
+                  </w:pPr>
+                  <w:r>
+                    <w:t>DIPA Unit Sekretariat Jenderal Kementerian Ketenagakerjaan Tahun 2026,</w:t>
+                  </w:r>
+                  <w:r>
+                    <w:rPr>
+                      <w:spacing w:val="-8"/>
+                    </w:rPr>
+                    <w:t xml:space="preserve"> </w:t>
+                  </w:r>
+                  <w:r>
+                    <w:t>NOMOR</w:t>
+                  </w:r>
+                  <w:r>
+                    <w:rPr>
+                      <w:spacing w:val="-5"/>
+                    </w:rPr>
+                    <w:t xml:space="preserve"> </w:t>
+                  </w:r>
+                  <w:r>
+                    <w:t>:</w:t>
+                  </w:r>
+                  <w:r>
+                    <w:rPr>
+                      <w:spacing w:val="-4"/>
+                    </w:rPr>
+                    <w:t xml:space="preserve"> </w:t>
+                  </w:r>
+                  <w:r>
+                    <w:t>SP</w:t>
+                  </w:r>
+                  <w:r>
+                    <w:rPr>
+                      <w:spacing w:val="-8"/>
+                    </w:rPr>
+                    <w:t xml:space="preserve"> </w:t>
+                  </w:r>
+                  <w:r>
+                    <w:t>DIPA-026.01.1.450938/2026</w:t>
+                  </w:r>
+                  <w:r>
+                    <w:rPr>
+                      <w:spacing w:val="-4"/>
+                    </w:rPr>
+                    <w:t xml:space="preserve"> </w:t>
+                  </w:r>
+                  <w:r>
+                    <w:t>tanggal</w:t>
+                  </w:r>
+                  <w:r>
+                    <w:rPr>
+                      <w:spacing w:val="-5"/>
+                    </w:rPr>
+                    <w:t xml:space="preserve"> </w:t>
+                  </w:r>
+                  <w:r>
+                    <w:t>1</w:t>
+                  </w:r>
+                  <w:r>
+                    <w:rPr>
+                      <w:spacing w:val="-4"/>
+                    </w:rPr>
+                    <w:t xml:space="preserve"> </w:t>
+                  </w:r>
+                  <w:r>
+                    <w:t xml:space="preserve">Desember </w:t>
+                  </w:r>
+                  <w:r>
+                    <w:rPr>
+                      <w:spacing w:val="-2"/>
+                    </w:rPr>
+                    <w:t>2025.</w:t>
+                  </w:r>
+                </w:p>
+              </w:tc>
+            </w:tr>
+          </w:tbl>
+          <w:tbl>
+            <w:tblPr>
+              <w:tblStyle w:val="TableGrid"/>
+              <w:tblW w:w="784" w:type="pct"/>
+              <w:tblBorders>
+                <w:top w:val="none" w:sz="0" w:space="0" w:color="auto"/>
+                <w:left w:val="none" w:sz="0" w:space="0" w:color="auto"/>
+                <w:bottom w:val="none" w:sz="0" w:space="0" w:color="auto"/>
+                <w:right w:val="none" w:sz="0" w:space="0" w:color="auto"/>
+                <w:insideH w:val="none" w:sz="0" w:space="0" w:color="auto"/>
+                <w:insideV w:val="none" w:sz="0" w:space="0" w:color="auto"/>
+              </w:tblBorders>
+              <w:tblLook w:val="04A0" w:firstRow="1" w:lastRow="0" w:firstColumn="1" w:lastColumn="0" w:noHBand="0" w:noVBand="1"/>
+            </w:tblPr>
+            <w:tblGrid>
+              <w:gridCol w:w="1452"/>
+            </w:tblGrid>
+            <w:tr>
+              <w:tc>
+                <w:tcPr>
+                  <w:tcW w:w="5000" w:type="pct"/>
+                </w:tcPr>
+                <w:p>
+                  <w:pPr>
+                    <w:pStyle w:val="BodyText"/>
+                    <w:tabs>
+                      <w:tab w:val="left" w:pos="2204"/>
+                      <w:tab w:val="left" w:pos="2530"/>
+                      <w:tab w:val="left" w:pos="6160"/>
+                    </w:tabs>
+                    <w:jc w:val="both"/>
+                    <w:rPr>
+                      <w:spacing w:val="-2"/>
+                    </w:rPr>
+                  </w:pPr>
+                  <w:r>
+                    <w:rPr>
+                      <w:spacing w:val="-2"/>
+                    </w:rPr>
+                    <w:t>Dasar</w:t>
+                  </w:r>
+                  <w:r>
+                    <w:t xml:space="preserve">      :</w:t>
+                  </w:r>
+                </w:p>
+              </w:tc>
+            </w:tr>
+          </w:tbl>
+          <w:p/>
+          <w:p/>
+          <w:p/>
+          <w:p/>
+          <w:p/>
+          <w:p/>
+          <w:p/>
+          <w:p/>
+          <w:p/>
+          <w:p/>
+          <w:p/>
+          <w:p/>
+          <w:p/>
+          <w:p/>
+          <w:p/>
+          <w:p/>
+          <w:p/>
+          <w:p/>
+          <w:p/>
+          <w:p/>
+          <w:p>
+            <w:pPr>
+              <w:rPr>
+                <w:spacing w:val="-2"/>
+              </w:rPr>
+            </w:pPr>
+          </w:p>
+          <w:p>
+            <w:pPr>
+              <w:rPr>
+                <w:spacing w:val="-2"/>
+              </w:rPr>
+            </w:pPr>
+          </w:p>
+          <w:p>
+            <w:pPr>
               <w:jc w:val="center"/>
             </w:pPr>
-            <w:r>
-              <w:t>1.</w:t>
-            </w:r>
-          </w:p>
-        </w:tc>
-        <w:tc>
-          <w:tcPr>
-            <w:tcW w:w="7308" w:type="dxa"/>
-          </w:tcPr>
-          <w:p>
-            <w:pPr>
-              <w:pStyle w:val="BodyText"/>
-              <w:tabs>
-                <w:tab w:val="left" w:pos="2204"/>
-                <w:tab w:val="left" w:pos="2530"/>
-                <w:tab w:val="left" w:pos="6160"/>
-              </w:tabs>
-              <w:ind w:right="354"/>
-              <w:jc w:val="both"/>
-            </w:pPr>
-            <w:r>
-              <w:t>Surat</w:t>
-            </w:r>
-            <w:r>
-              <w:rPr>
-                <w:spacing w:val="40"/>
-              </w:rPr>
-              <w:t xml:space="preserve"> </w:t>
-            </w:r>
-            <w:r>
-              <w:t>Tugas</w:t>
-            </w:r>
-            <w:r>
-              <w:rPr>
-                <w:spacing w:val="40"/>
-              </w:rPr>
-              <w:t xml:space="preserve"> </w:t>
-            </w:r>
-            <w:r>
-              <w:t>Kepala</w:t>
-            </w:r>
-            <w:r>
-              <w:rPr>
-                <w:spacing w:val="40"/>
-              </w:rPr>
-              <w:t xml:space="preserve"> </w:t>
-            </w:r>
-            <w:r>
-              <w:t>Biro</w:t>
-            </w:r>
-            <w:r>
-              <w:rPr>
-                <w:spacing w:val="40"/>
-              </w:rPr>
-              <w:t xml:space="preserve"> </w:t>
-            </w:r>
-            <w:r>
-              <w:t>Umum</w:t>
-            </w:r>
-            <w:r>
-              <w:rPr>
-                <w:spacing w:val="40"/>
-              </w:rPr>
-              <w:t xml:space="preserve"> </w:t>
-            </w:r>
-            <w:r>
-              <w:t>Sekretariat</w:t>
-            </w:r>
-            <w:r>
-              <w:rPr>
-                <w:spacing w:val="40"/>
-              </w:rPr>
-              <w:t xml:space="preserve"> </w:t>
-            </w:r>
-            <w:r>
-              <w:t>Jenderal</w:t>
-            </w:r>
-            <w:r>
-              <w:rPr>
-                <w:spacing w:val="40"/>
-              </w:rPr>
-              <w:t xml:space="preserve"> </w:t>
-            </w:r>
-            <w:r>
-              <w:t>Kementerian Ketenagakerjaan</w:t>
-            </w:r>
-            <w:r>
-              <w:t xml:space="preserve"> </w:t>
-            </w:r>
-            <w:r>
-              <w:t>Nomor</w:t>
-            </w:r>
-            <w:r>
-              <w:rPr>
-                <w:spacing w:val="-14"/>
-              </w:rPr>
-              <w:t xml:space="preserve"> </w:t>
-            </w:r>
-            <w:r>
-              <w:rPr>
-                <w:spacing w:val="-5"/>
-              </w:rPr>
-              <w:t>1/</w:t>
-            </w:r>
-            <w:r>
-              <w:t>{{no_surat}}</w:t>
-            </w:r>
-            <w:r>
-              <w:rPr>
-                <w:spacing w:val="-2"/>
-              </w:rPr>
-              <w:t>/UM.06.00/</w:t>
-            </w:r>
-            <w:r>
-              <w:rPr>
-                <w:spacing w:val="-2"/>
-              </w:rPr>
-              <w:t>{{b</w:t>
-            </w:r>
-            <w:r>
-              <w:rPr>
-                <w:spacing w:val="-2"/>
-              </w:rPr>
-              <w:t>ulan</w:t>
-            </w:r>
-            <w:r>
-              <w:rPr>
-                <w:spacing w:val="-2"/>
-              </w:rPr>
-              <w:t>_no_surat}}</w:t>
-            </w:r>
-            <w:r>
-              <w:rPr>
-                <w:spacing w:val="-2"/>
-              </w:rPr>
-              <w:t>/</w:t>
-            </w:r>
-            <w:r>
-              <w:rPr>
-                <w:spacing w:val="-2"/>
-              </w:rPr>
-              <w:t>{{tahun}}</w:t>
-            </w:r>
-            <w:r>
-              <w:rPr>
-                <w:spacing w:val="29"/>
-              </w:rPr>
-              <w:t xml:space="preserve"> </w:t>
-            </w:r>
-            <w:r>
-              <w:rPr>
-                <w:spacing w:val="-2"/>
-              </w:rPr>
-              <w:t>Tanggal</w:t>
-            </w:r>
-            <w:r>
-              <w:rPr>
-                <w:spacing w:val="-2"/>
-              </w:rPr>
-              <w:t xml:space="preserve"> {{tanggal_no_surat}}</w:t>
-            </w:r>
-            <w:r>
-              <w:rPr>
-                <w:spacing w:val="-13"/>
-              </w:rPr>
-              <w:t xml:space="preserve"> </w:t>
-            </w:r>
-            <w:r>
-              <w:t>2026</w:t>
-            </w:r>
-            <w:r>
-              <w:rPr>
-                <w:spacing w:val="-13"/>
-              </w:rPr>
-              <w:t xml:space="preserve"> </w:t>
-            </w:r>
-            <w:r>
-              <w:t>dalam</w:t>
-            </w:r>
-            <w:r>
-              <w:rPr>
-                <w:spacing w:val="-15"/>
-              </w:rPr>
-              <w:t xml:space="preserve"> </w:t>
-            </w:r>
-            <w:r>
-              <w:t>rangka</w:t>
-            </w:r>
-            <w:r>
-              <w:rPr>
-                <w:spacing w:val="-12"/>
-              </w:rPr>
-              <w:t xml:space="preserve"> </w:t>
-            </w:r>
-            <w:r>
-              <w:t>{{tujuan_perjalanan}}</w:t>
-            </w:r>
-            <w:r>
-              <w:rPr>
-                <w:spacing w:val="-9"/>
-              </w:rPr>
-              <w:t xml:space="preserve"> </w:t>
-            </w:r>
-            <w:r>
-              <w:t>kunjungan</w:t>
-            </w:r>
-            <w:r>
-              <w:rPr>
-                <w:spacing w:val="-7"/>
-              </w:rPr>
-              <w:t xml:space="preserve"> </w:t>
-            </w:r>
-            <w:r>
-              <w:rPr>
-                <w:spacing w:val="-2"/>
-              </w:rPr>
-              <w:t>kerja</w:t>
-            </w:r>
-            <w:r>
-              <w:t xml:space="preserve"> {{stakeholder}}</w:t>
-            </w:r>
-            <w:r>
-              <w:rPr>
-                <w:spacing w:val="-4"/>
-              </w:rPr>
-              <w:t xml:space="preserve"> </w:t>
-            </w:r>
-            <w:r>
-              <w:t>di</w:t>
-            </w:r>
-            <w:r>
-              <w:rPr>
-                <w:spacing w:val="-10"/>
-              </w:rPr>
-              <w:t xml:space="preserve"> </w:t>
-            </w:r>
-            <w:r>
-              <w:rPr>
-                <w:spacing w:val="-10"/>
-              </w:rPr>
-              <w:t>{{kota}}, {{provinsi}}</w:t>
-            </w:r>
-            <w:r>
-              <w:rPr>
-                <w:spacing w:val="-2"/>
-              </w:rPr>
-              <w:t>;</w:t>
-            </w:r>
-          </w:p>
-        </w:tc>
-      </w:tr>
-      <w:tr>
-        <w:tc>
-          <w:tcPr>
-            <w:tcW w:w="425" w:type="dxa"/>
-          </w:tcPr>
-          <w:p>
-            <w:pPr>
-              <w:pStyle w:val="BodyText"/>
-              <w:spacing w:before="2"/>
+          </w:p>
+          <w:p>
+            <w:pPr>
               <w:jc w:val="center"/>
             </w:pPr>
-            <w:r>
-              <w:t>2.</w:t>
-            </w:r>
-          </w:p>
-        </w:tc>
-        <w:tc>
-          <w:tcPr>
-            <w:tcW w:w="7308" w:type="dxa"/>
-          </w:tcPr>
-          <w:p>
-            <w:pPr>
-              <w:tabs>
-                <w:tab w:val="left" w:pos="2915"/>
-              </w:tabs>
-              <w:spacing w:before="2"/>
-              <w:ind w:right="352"/>
-              <w:jc w:val="both"/>
-            </w:pPr>
-            <w:r>
-              <w:t>Peraturan</w:t>
-            </w:r>
-            <w:r>
-              <w:rPr>
-                <w:spacing w:val="-5"/>
-              </w:rPr>
-              <w:t xml:space="preserve"> </w:t>
-            </w:r>
-            <w:r>
-              <w:t>Menteri</w:t>
-            </w:r>
-            <w:r>
-              <w:rPr>
-                <w:spacing w:val="-11"/>
-              </w:rPr>
-              <w:t xml:space="preserve"> </w:t>
-            </w:r>
-            <w:r>
-              <w:t>Keuangan</w:t>
-            </w:r>
-            <w:r>
-              <w:rPr>
-                <w:spacing w:val="-8"/>
-              </w:rPr>
-              <w:t xml:space="preserve"> </w:t>
-            </w:r>
-            <w:r>
-              <w:t>No.</w:t>
-            </w:r>
-            <w:r>
-              <w:rPr>
-                <w:spacing w:val="-9"/>
-              </w:rPr>
-              <w:t xml:space="preserve"> </w:t>
-            </w:r>
-            <w:r>
-              <w:t>119</w:t>
-            </w:r>
-            <w:r>
-              <w:rPr>
-                <w:spacing w:val="-8"/>
-              </w:rPr>
-              <w:t xml:space="preserve"> </w:t>
-            </w:r>
-            <w:r>
-              <w:t>Tahun</w:t>
-            </w:r>
-            <w:r>
-              <w:rPr>
-                <w:spacing w:val="-8"/>
-              </w:rPr>
-              <w:t xml:space="preserve"> </w:t>
-            </w:r>
-            <w:r>
-              <w:t>2023</w:t>
-            </w:r>
-            <w:r>
-              <w:rPr>
-                <w:spacing w:val="-8"/>
-              </w:rPr>
-              <w:t xml:space="preserve"> </w:t>
-            </w:r>
-            <w:r>
-              <w:t xml:space="preserve">tentang Perubahan atas PMK No. 113/PMK.05/2012 tentang Perjalanan Dinas dalam negeri bagi Pejabat Negara, Pegawai Negeri dan Pegawai Tidak </w:t>
-            </w:r>
-            <w:r>
-              <w:rPr>
-                <w:spacing w:val="-2"/>
-              </w:rPr>
-              <w:t>Tetap;</w:t>
-            </w:r>
-          </w:p>
-        </w:tc>
-      </w:tr>
-      <w:tr>
-        <w:tc>
-          <w:tcPr>
-            <w:tcW w:w="425" w:type="dxa"/>
-          </w:tcPr>
-          <w:p>
-            <w:pPr>
-              <w:pStyle w:val="BodyText"/>
-              <w:spacing w:before="2"/>
+          </w:p>
+          <w:p>
+            <w:pPr>
               <w:jc w:val="center"/>
             </w:pPr>
-            <w:r>
-              <w:t>3.</w:t>
-            </w:r>
-          </w:p>
-        </w:tc>
-        <w:tc>
-          <w:tcPr>
-            <w:tcW w:w="7308" w:type="dxa"/>
-          </w:tcPr>
-          <w:p>
-            <w:pPr>
-              <w:tabs>
-                <w:tab w:val="left" w:pos="2895"/>
-              </w:tabs>
-              <w:ind w:right="362"/>
-              <w:jc w:val="both"/>
-            </w:pPr>
-            <w:r>
-              <w:t>Peraturan</w:t>
-            </w:r>
-            <w:r>
-              <w:rPr>
-                <w:spacing w:val="-15"/>
-              </w:rPr>
-              <w:t xml:space="preserve"> </w:t>
-            </w:r>
-            <w:r>
-              <w:t>Menteri</w:t>
-            </w:r>
-            <w:r>
-              <w:rPr>
-                <w:spacing w:val="-14"/>
-              </w:rPr>
-              <w:t xml:space="preserve"> </w:t>
-            </w:r>
-            <w:r>
-              <w:t>Ketenagakerjaan</w:t>
-            </w:r>
-            <w:r>
-              <w:rPr>
-                <w:spacing w:val="-12"/>
-              </w:rPr>
-              <w:t xml:space="preserve"> </w:t>
-            </w:r>
-            <w:r>
-              <w:t>Nomor</w:t>
-            </w:r>
-            <w:r>
-              <w:rPr>
-                <w:spacing w:val="-14"/>
-              </w:rPr>
-              <w:t xml:space="preserve"> </w:t>
-            </w:r>
-            <w:r>
-              <w:t>20</w:t>
-            </w:r>
-            <w:r>
-              <w:rPr>
-                <w:spacing w:val="37"/>
-              </w:rPr>
-              <w:t xml:space="preserve"> </w:t>
-            </w:r>
-            <w:r>
-              <w:t>Tahun</w:t>
-            </w:r>
-            <w:r>
-              <w:rPr>
-                <w:spacing w:val="-12"/>
-              </w:rPr>
-              <w:t xml:space="preserve"> </w:t>
-            </w:r>
-            <w:r>
-              <w:t>2024</w:t>
-            </w:r>
-            <w:r>
-              <w:rPr>
-                <w:spacing w:val="-12"/>
-              </w:rPr>
-              <w:t xml:space="preserve"> </w:t>
-            </w:r>
-            <w:r>
-              <w:t>tanggal</w:t>
-            </w:r>
-            <w:r>
-              <w:rPr>
-                <w:spacing w:val="-16"/>
-              </w:rPr>
-              <w:t xml:space="preserve"> </w:t>
-            </w:r>
-            <w:r>
-              <w:t xml:space="preserve">30 Desember 2024 tentang Organisasi dan Tata Kerja Kementerian </w:t>
-            </w:r>
-            <w:r>
-              <w:rPr>
-                <w:spacing w:val="-2"/>
-              </w:rPr>
-              <w:t>Ketenagakerjaan;</w:t>
-            </w:r>
-          </w:p>
-        </w:tc>
-      </w:tr>
-      <w:tr>
-        <w:tc>
-          <w:tcPr>
-            <w:tcW w:w="425" w:type="dxa"/>
-          </w:tcPr>
-          <w:p>
-            <w:pPr>
-              <w:pStyle w:val="BodyText"/>
-              <w:spacing w:before="2"/>
+          </w:p>
+          <w:p>
+            <w:pPr>
               <w:jc w:val="center"/>
             </w:pPr>
-            <w:r>
-              <w:t>4.</w:t>
-            </w:r>
-          </w:p>
-        </w:tc>
-        <w:tc>
-          <w:tcPr>
-            <w:tcW w:w="7308" w:type="dxa"/>
-          </w:tcPr>
-          <w:p>
-            <w:pPr>
-              <w:tabs>
-                <w:tab w:val="left" w:pos="2895"/>
-              </w:tabs>
-              <w:ind w:right="359"/>
-              <w:jc w:val="both"/>
-            </w:pPr>
-            <w:r>
-              <w:t>Keputusan</w:t>
-            </w:r>
-            <w:r>
-              <w:rPr>
-                <w:spacing w:val="-16"/>
-              </w:rPr>
-              <w:t xml:space="preserve"> </w:t>
-            </w:r>
-            <w:r>
-              <w:t>Menteri</w:t>
-            </w:r>
-            <w:r>
-              <w:rPr>
-                <w:spacing w:val="-15"/>
-              </w:rPr>
-              <w:t xml:space="preserve"> </w:t>
-            </w:r>
-            <w:r>
-              <w:t>Ketenagakerjaan</w:t>
-            </w:r>
-            <w:r>
-              <w:rPr>
-                <w:spacing w:val="-14"/>
-              </w:rPr>
-              <w:t xml:space="preserve"> </w:t>
-            </w:r>
-            <w:r>
-              <w:t>Nomor</w:t>
-            </w:r>
-            <w:r>
-              <w:rPr>
-                <w:spacing w:val="-15"/>
-              </w:rPr>
-              <w:t xml:space="preserve"> </w:t>
-            </w:r>
-            <w:r>
-              <w:t>460</w:t>
-            </w:r>
-            <w:r>
-              <w:rPr>
-                <w:spacing w:val="-13"/>
-              </w:rPr>
-              <w:t xml:space="preserve"> </w:t>
-            </w:r>
-            <w:r>
-              <w:t>tanggal</w:t>
-            </w:r>
-            <w:r>
-              <w:rPr>
-                <w:spacing w:val="-16"/>
-              </w:rPr>
-              <w:t xml:space="preserve"> </w:t>
-            </w:r>
-            <w:r>
-              <w:t>23</w:t>
-            </w:r>
-            <w:r>
-              <w:rPr>
-                <w:spacing w:val="-12"/>
-              </w:rPr>
-              <w:t xml:space="preserve"> </w:t>
-            </w:r>
-            <w:r>
-              <w:t>Desember 2025,</w:t>
-            </w:r>
-            <w:r>
-              <w:rPr>
-                <w:spacing w:val="-4"/>
-              </w:rPr>
-              <w:t xml:space="preserve"> </w:t>
-            </w:r>
-            <w:r>
-              <w:t>tentang</w:t>
-            </w:r>
-            <w:r>
-              <w:rPr>
-                <w:spacing w:val="-7"/>
-              </w:rPr>
-              <w:t xml:space="preserve"> </w:t>
-            </w:r>
-            <w:r>
-              <w:t>Pengangkatan</w:t>
-            </w:r>
-            <w:r>
-              <w:rPr>
-                <w:spacing w:val="-7"/>
-              </w:rPr>
-              <w:t xml:space="preserve"> </w:t>
-            </w:r>
-            <w:r>
-              <w:t>Pejabat</w:t>
-            </w:r>
-            <w:r>
-              <w:rPr>
-                <w:spacing w:val="-4"/>
-              </w:rPr>
-              <w:t xml:space="preserve"> </w:t>
-            </w:r>
-            <w:r>
-              <w:t>Perbendaharaan</w:t>
-            </w:r>
-            <w:r>
-              <w:rPr>
-                <w:spacing w:val="-4"/>
-              </w:rPr>
-              <w:t xml:space="preserve"> </w:t>
-            </w:r>
-            <w:r>
-              <w:t>Negara</w:t>
-            </w:r>
-            <w:r>
-              <w:rPr>
-                <w:spacing w:val="-4"/>
-              </w:rPr>
-              <w:t xml:space="preserve"> </w:t>
-            </w:r>
-            <w:r>
-              <w:t>selaku Kuasa Pengguna Anggaran (KPA)/Kuasa Pengguna Barang (KPB) Daftar Isian Pelaksanaan Anggaran (DIPA) Bidang Ketenagakerjaan pada Kantor Pusat Kementerian Ketenagakerjaan;</w:t>
-            </w:r>
-          </w:p>
-        </w:tc>
-      </w:tr>
-      <w:tr>
-        <w:tc>
-          <w:tcPr>
-            <w:tcW w:w="425" w:type="dxa"/>
-          </w:tcPr>
-          <w:p>
-            <w:pPr>
-              <w:pStyle w:val="BodyText"/>
-              <w:spacing w:before="2"/>
-              <w:jc w:val="center"/>
-            </w:pPr>
-            <w:r>
-              <w:t>5.</w:t>
-            </w:r>
-          </w:p>
-        </w:tc>
-        <w:tc>
-          <w:tcPr>
-            <w:tcW w:w="7308" w:type="dxa"/>
-          </w:tcPr>
-          <w:p>
-            <w:pPr>
-              <w:tabs>
-                <w:tab w:val="left" w:pos="2895"/>
-              </w:tabs>
-              <w:spacing w:line="242" w:lineRule="auto"/>
-              <w:ind w:right="359"/>
-              <w:jc w:val="both"/>
-            </w:pPr>
-            <w:r>
-              <w:t>Surat</w:t>
-            </w:r>
-            <w:r>
-              <w:rPr>
-                <w:spacing w:val="-14"/>
-              </w:rPr>
-              <w:t xml:space="preserve"> </w:t>
-            </w:r>
-            <w:r>
-              <w:t>Keputusan</w:t>
-            </w:r>
-            <w:r>
-              <w:rPr>
-                <w:spacing w:val="-8"/>
-              </w:rPr>
-              <w:t xml:space="preserve"> </w:t>
-            </w:r>
-            <w:r>
-              <w:t>Kuasa</w:t>
-            </w:r>
-            <w:r>
-              <w:rPr>
-                <w:spacing w:val="-13"/>
-              </w:rPr>
-              <w:t xml:space="preserve"> </w:t>
-            </w:r>
-            <w:r>
-              <w:t>Pengguna</w:t>
-            </w:r>
-            <w:r>
-              <w:rPr>
-                <w:spacing w:val="-13"/>
-              </w:rPr>
-              <w:t xml:space="preserve"> </w:t>
-            </w:r>
-            <w:r>
-              <w:t>Anggaran</w:t>
-            </w:r>
-            <w:r>
-              <w:rPr>
-                <w:spacing w:val="-8"/>
-              </w:rPr>
-              <w:t xml:space="preserve"> </w:t>
-            </w:r>
-            <w:r>
-              <w:t>(KPA)</w:t>
-            </w:r>
-            <w:r>
-              <w:rPr>
-                <w:spacing w:val="-12"/>
-              </w:rPr>
-              <w:t xml:space="preserve"> </w:t>
-            </w:r>
-            <w:r>
-              <w:t>/Kuasa</w:t>
-            </w:r>
-            <w:r>
-              <w:rPr>
-                <w:spacing w:val="-13"/>
-              </w:rPr>
-              <w:t xml:space="preserve"> </w:t>
-            </w:r>
-            <w:r>
-              <w:t>Pengguna Barang</w:t>
-            </w:r>
-            <w:r>
-              <w:rPr>
-                <w:spacing w:val="-16"/>
-              </w:rPr>
-              <w:t xml:space="preserve"> </w:t>
-            </w:r>
-            <w:r>
-              <w:t>(KPB)</w:t>
-            </w:r>
-            <w:r>
-              <w:rPr>
-                <w:spacing w:val="-20"/>
-              </w:rPr>
-              <w:t xml:space="preserve"> </w:t>
-            </w:r>
-            <w:r>
-              <w:t>Sekretariat</w:t>
-            </w:r>
-            <w:r>
-              <w:rPr>
-                <w:spacing w:val="-15"/>
-              </w:rPr>
-              <w:t xml:space="preserve"> </w:t>
-            </w:r>
-            <w:r>
-              <w:t>Jenderal</w:t>
-            </w:r>
-            <w:r>
-              <w:rPr>
-                <w:spacing w:val="-15"/>
-              </w:rPr>
-              <w:t xml:space="preserve"> </w:t>
-            </w:r>
-            <w:r>
-              <w:t>NOMOR</w:t>
-            </w:r>
-            <w:r>
-              <w:rPr>
-                <w:spacing w:val="-16"/>
-              </w:rPr>
-              <w:t xml:space="preserve"> </w:t>
-            </w:r>
-            <w:r>
-              <w:t>1/02/KU.04/I/2026</w:t>
-            </w:r>
-            <w:r>
-              <w:rPr>
-                <w:spacing w:val="-17"/>
-              </w:rPr>
-              <w:t xml:space="preserve"> </w:t>
-            </w:r>
-            <w:r>
-              <w:t>tanggal</w:t>
-            </w:r>
-            <w:r>
-              <w:t xml:space="preserve"> </w:t>
-            </w:r>
-            <w:r>
-              <w:t>2 Januari 2026 tentang Pejabat Pembuat Komitmen DIPA Unit Sekretariat Jenderal Kementerian Ketenagakerjaan Tahun 2026;</w:t>
-            </w:r>
-          </w:p>
-        </w:tc>
-      </w:tr>
-      <w:tr>
-        <w:tc>
-          <w:tcPr>
-            <w:tcW w:w="425" w:type="dxa"/>
-          </w:tcPr>
-          <w:p>
-            <w:pPr>
-              <w:pStyle w:val="BodyText"/>
-              <w:spacing w:before="2"/>
-              <w:jc w:val="center"/>
-            </w:pPr>
-            <w:r>
-              <w:t>6.</w:t>
-            </w:r>
-          </w:p>
-        </w:tc>
-        <w:tc>
-          <w:tcPr>
-            <w:tcW w:w="7308" w:type="dxa"/>
-          </w:tcPr>
-          <w:p>
-            <w:pPr>
-              <w:tabs>
-                <w:tab w:val="left" w:pos="2895"/>
-              </w:tabs>
-              <w:ind w:right="355"/>
-              <w:jc w:val="both"/>
-            </w:pPr>
-            <w:r>
-              <w:t>DIPA Unit Sekretariat Jenderal Kementerian Ketenagakerjaan Tahun 2026,</w:t>
-            </w:r>
-            <w:r>
-              <w:rPr>
-                <w:spacing w:val="-8"/>
-              </w:rPr>
-              <w:t xml:space="preserve"> </w:t>
-            </w:r>
-            <w:r>
-              <w:t>NOMOR</w:t>
-            </w:r>
-            <w:r>
-              <w:rPr>
-                <w:spacing w:val="-5"/>
-              </w:rPr>
-              <w:t xml:space="preserve"> </w:t>
-            </w:r>
-            <w:r>
-              <w:t>:</w:t>
-            </w:r>
-            <w:r>
-              <w:rPr>
-                <w:spacing w:val="-4"/>
-              </w:rPr>
-              <w:t xml:space="preserve"> </w:t>
-            </w:r>
-            <w:r>
-              <w:t>SP</w:t>
-            </w:r>
-            <w:r>
-              <w:rPr>
-                <w:spacing w:val="-8"/>
-              </w:rPr>
-              <w:t xml:space="preserve"> </w:t>
-            </w:r>
-            <w:r>
-              <w:t>DIPA-026.01.1.450938/2026</w:t>
-            </w:r>
-            <w:r>
-              <w:rPr>
-                <w:spacing w:val="-4"/>
-              </w:rPr>
-              <w:t xml:space="preserve"> </w:t>
-            </w:r>
-            <w:r>
-              <w:t>tanggal</w:t>
-            </w:r>
-            <w:r>
-              <w:rPr>
-                <w:spacing w:val="-5"/>
-              </w:rPr>
-              <w:t xml:space="preserve"> </w:t>
-            </w:r>
-            <w:r>
-              <w:t>1</w:t>
-            </w:r>
-            <w:r>
-              <w:rPr>
-                <w:spacing w:val="-4"/>
-              </w:rPr>
-              <w:t xml:space="preserve"> </w:t>
-            </w:r>
-            <w:r>
-              <w:t>Desember</w:t>
-            </w:r>
-            <w:r>
-              <w:t xml:space="preserve"> </w:t>
-            </w:r>
-            <w:r>
-              <w:rPr>
-                <w:spacing w:val="-2"/>
-              </w:rPr>
-              <w:t>2025.</w:t>
-            </w:r>
           </w:p>
         </w:tc>
       </w:tr>
     </w:tbl>
-    <w:p>
-      <w:pPr>
-        <w:pStyle w:val="BodyText"/>
-        <w:tabs>
-          <w:tab w:val="left" w:pos="2204"/>
-          <w:tab w:val="left" w:pos="2530"/>
-          <w:tab w:val="left" w:pos="6160"/>
-        </w:tabs>
-        <w:ind w:left="2881" w:right="354" w:hanging="1954"/>
-        <w:jc w:val="both"/>
-        <w:rPr>
-          <w:spacing w:val="-2"/>
-        </w:rPr>
-      </w:pPr>
-      <w:r>
-        <w:rPr>
-          <w:spacing w:val="-2"/>
-        </w:rPr>
-        <w:t>Dasar</w:t>
-      </w:r>
-      <w:r>
-        <w:tab/>
-      </w:r>
-      <w:r>
-        <w:rPr>
-          <w:spacing w:val="-10"/>
-        </w:rPr>
-        <w:t>:</w:t>
-      </w:r>
-    </w:p>
-    <w:p>
-      <w:pPr>
-        <w:pStyle w:val="BodyText"/>
-        <w:spacing w:before="2"/>
-        <w:ind w:left="2895"/>
-      </w:pPr>
-    </w:p>
-    <w:p>
-      <w:pPr>
-        <w:pStyle w:val="BodyText"/>
-        <w:spacing w:before="248"/>
-      </w:pPr>
-    </w:p>
-    <w:p>
-      <w:pPr>
-        <w:pStyle w:val="BodyText"/>
-        <w:spacing w:before="248"/>
-      </w:pPr>
-    </w:p>
-    <w:p>
-      <w:pPr>
-        <w:pStyle w:val="BodyText"/>
-        <w:spacing w:before="248"/>
-      </w:pPr>
-    </w:p>
-    <w:p>
-      <w:pPr>
-        <w:pStyle w:val="BodyText"/>
-        <w:spacing w:before="248"/>
-      </w:pPr>
-    </w:p>
-    <w:p>
-      <w:pPr>
-        <w:pStyle w:val="BodyText"/>
-        <w:spacing w:before="248"/>
-      </w:pPr>
-    </w:p>
-    <w:p>
-      <w:pPr>
-        <w:pStyle w:val="BodyText"/>
-        <w:spacing w:before="248"/>
-      </w:pPr>
-    </w:p>
-    <w:p>
-      <w:pPr>
-        <w:pStyle w:val="BodyText"/>
-        <w:spacing w:before="248"/>
-      </w:pPr>
-    </w:p>
-    <w:p>
-      <w:pPr>
-        <w:pStyle w:val="BodyText"/>
-        <w:spacing w:before="248"/>
-      </w:pPr>
-    </w:p>
-    <w:p>
-      <w:pPr>
-        <w:pStyle w:val="BodyText"/>
-        <w:spacing w:before="248"/>
-      </w:pPr>
-    </w:p>
-    <w:p>
-      <w:pPr>
-        <w:pStyle w:val="BodyText"/>
-        <w:spacing w:before="248"/>
-      </w:pPr>
-    </w:p>
-    <w:p>
-      <w:pPr>
-        <w:pStyle w:val="BodyText"/>
-        <w:spacing w:before="248"/>
-      </w:pPr>
-    </w:p>
-    <w:p>
-      <w:pPr>
-        <w:pStyle w:val="BodyText"/>
-        <w:spacing w:before="248"/>
-      </w:pPr>
-    </w:p>
-    <w:p>
-      <w:pPr>
-        <w:pStyle w:val="BodyText"/>
-        <w:spacing w:before="248"/>
-      </w:pPr>
-    </w:p>
     <w:p>
       <w:pPr>
         <w:pStyle w:val="Heading1"/>
@@ -1778,8 +1745,8 @@
     </w:p>
     <w:tbl>
       <w:tblPr>
-        <w:tblW w:w="10557" w:type="dxa"/>
-        <w:tblInd w:w="221" w:type="dxa"/>
+        <w:tblW w:w="10494" w:type="dxa"/>
+        <w:tblInd w:w="284" w:type="dxa"/>
         <w:tblLayout w:type="fixed"/>
         <w:tblCellMar>
           <w:left w:w="0" w:type="dxa"/>
@@ -1788,8 +1755,8 @@
         <w:tblLook w:val="01E0" w:firstRow="1" w:lastRow="1" w:firstColumn="1" w:lastColumn="1" w:noHBand="0" w:noVBand="0"/>
       </w:tblPr>
       <w:tblGrid>
-        <w:gridCol w:w="1906"/>
-        <w:gridCol w:w="5391"/>
+        <w:gridCol w:w="2268"/>
+        <w:gridCol w:w="4966"/>
         <w:gridCol w:w="3260"/>
       </w:tblGrid>
       <w:tr>
@@ -1798,7 +1765,7 @@
         </w:trPr>
         <w:tc>
           <w:tcPr>
-            <w:tcW w:w="1906" w:type="dxa"/>
+            <w:tcW w:w="2268" w:type="dxa"/>
           </w:tcPr>
           <w:p>
             <w:pPr>
@@ -1824,6 +1791,13 @@
               </w:rPr>
               <w:t>no_urut</w:t>
             </w:r>
+            <w:r>
+              <w:rPr>
+                <w:spacing w:val="-2"/>
+                <w:lang w:val="en-US"/>
+              </w:rPr>
+              <w:t>_satu</w:t>
+            </w:r>
             <w:proofErr w:type="spellEnd"/>
             <w:r>
               <w:rPr>
@@ -1836,7 +1810,7 @@
         </w:tc>
         <w:tc>
           <w:tcPr>
-            <w:tcW w:w="5391" w:type="dxa"/>
+            <w:tcW w:w="4966" w:type="dxa"/>
           </w:tcPr>
           <w:p>
             <w:pPr>
@@ -1924,8 +1898,14 @@
               </w:rPr>
               <w:t>no_urut</w:t>
             </w:r>
+            <w:r>
+              <w:rPr>
+                <w:spacing w:val="-2"/>
+                <w:lang w:val="en-US"/>
+              </w:rPr>
+              <w:t>_satu</w:t>
+            </w:r>
             <w:proofErr w:type="spellEnd"/>
-            <w:proofErr w:type="gramStart"/>
             <w:r>
               <w:rPr>
                 <w:spacing w:val="-2"/>
@@ -1937,14 +1917,7 @@
               <w:rPr>
                 <w:spacing w:val="-2"/>
               </w:rPr>
-              <w:t>…</w:t>
-            </w:r>
-            <w:proofErr w:type="gramEnd"/>
-            <w:r>
-              <w:rPr>
-                <w:spacing w:val="-2"/>
-              </w:rPr>
-              <w:t>…………………..</w:t>
+              <w:t>……………………..</w:t>
             </w:r>
           </w:p>
         </w:tc>
@@ -1955,7 +1928,7 @@
         </w:trPr>
         <w:tc>
           <w:tcPr>
-            <w:tcW w:w="1906" w:type="dxa"/>
+            <w:tcW w:w="2268" w:type="dxa"/>
           </w:tcPr>
           <w:p>
             <w:pPr>
@@ -1986,6 +1959,13 @@
                 <w:lang w:val="en-US"/>
               </w:rPr>
               <w:t>no_urut</w:t>
+            </w:r>
+            <w:r>
+              <w:rPr>
+                <w:spacing w:val="-2"/>
+                <w:lang w:val="en-US"/>
+              </w:rPr>
+              <w:t>_dua</w:t>
             </w:r>
             <w:proofErr w:type="spellEnd"/>
             <w:r>
@@ -1999,7 +1979,7 @@
         </w:tc>
         <w:tc>
           <w:tcPr>
-            <w:tcW w:w="5391" w:type="dxa"/>
+            <w:tcW w:w="4966" w:type="dxa"/>
           </w:tcPr>
           <w:p>
             <w:pPr>
@@ -2072,8 +2052,14 @@
               </w:rPr>
               <w:t>_urut</w:t>
             </w:r>
+            <w:r>
+              <w:rPr>
+                <w:spacing w:val="-2"/>
+                <w:lang w:val="en-US"/>
+              </w:rPr>
+              <w:t>_dua</w:t>
+            </w:r>
             <w:proofErr w:type="spellEnd"/>
-            <w:proofErr w:type="gramStart"/>
             <w:r>
               <w:rPr>
                 <w:spacing w:val="-2"/>
@@ -2085,14 +2071,7 @@
               <w:rPr>
                 <w:spacing w:val="-2"/>
               </w:rPr>
-              <w:t>…</w:t>
-            </w:r>
-            <w:proofErr w:type="gramEnd"/>
-            <w:r>
-              <w:rPr>
-                <w:spacing w:val="-2"/>
-              </w:rPr>
-              <w:t>…………………..</w:t>
+              <w:t>……………………..</w:t>
             </w:r>
           </w:p>
         </w:tc>
@@ -2103,7 +2082,7 @@
         </w:trPr>
         <w:tc>
           <w:tcPr>
-            <w:tcW w:w="1906" w:type="dxa"/>
+            <w:tcW w:w="2268" w:type="dxa"/>
           </w:tcPr>
           <w:p>
             <w:pPr>
@@ -2134,6 +2113,13 @@
                 <w:lang w:val="en-US"/>
               </w:rPr>
               <w:t>no_urut</w:t>
+            </w:r>
+            <w:r>
+              <w:rPr>
+                <w:spacing w:val="-2"/>
+                <w:lang w:val="en-US"/>
+              </w:rPr>
+              <w:t>_tiga</w:t>
             </w:r>
             <w:proofErr w:type="spellEnd"/>
             <w:r>
@@ -2147,7 +2133,7 @@
         </w:tc>
         <w:tc>
           <w:tcPr>
-            <w:tcW w:w="5391" w:type="dxa"/>
+            <w:tcW w:w="4966" w:type="dxa"/>
           </w:tcPr>
           <w:p>
             <w:pPr>
@@ -2218,8 +2204,14 @@
               </w:rPr>
               <w:t>no_urut</w:t>
             </w:r>
+            <w:r>
+              <w:rPr>
+                <w:spacing w:val="-2"/>
+                <w:lang w:val="en-US"/>
+              </w:rPr>
+              <w:t>_tiga</w:t>
+            </w:r>
             <w:proofErr w:type="spellEnd"/>
-            <w:proofErr w:type="gramStart"/>
             <w:r>
               <w:rPr>
                 <w:spacing w:val="-2"/>
@@ -2231,14 +2223,7 @@
               <w:rPr>
                 <w:spacing w:val="-2"/>
               </w:rPr>
-              <w:t>…</w:t>
-            </w:r>
-            <w:proofErr w:type="gramEnd"/>
-            <w:r>
-              <w:rPr>
-                <w:spacing w:val="-2"/>
-              </w:rPr>
-              <w:t>…………………..</w:t>
+              <w:t>……………………..</w:t>
             </w:r>
           </w:p>
         </w:tc>
@@ -2249,7 +2234,7 @@
         </w:trPr>
         <w:tc>
           <w:tcPr>
-            <w:tcW w:w="1906" w:type="dxa"/>
+            <w:tcW w:w="2268" w:type="dxa"/>
           </w:tcPr>
           <w:p>
             <w:pPr>
@@ -2280,6 +2265,13 @@
                 <w:lang w:val="en-US"/>
               </w:rPr>
               <w:t>no_urut</w:t>
+            </w:r>
+            <w:r>
+              <w:rPr>
+                <w:spacing w:val="-2"/>
+                <w:lang w:val="en-US"/>
+              </w:rPr>
+              <w:t>_empat</w:t>
             </w:r>
             <w:proofErr w:type="spellEnd"/>
             <w:r>
@@ -2293,7 +2285,7 @@
         </w:tc>
         <w:tc>
           <w:tcPr>
-            <w:tcW w:w="5391" w:type="dxa"/>
+            <w:tcW w:w="4966" w:type="dxa"/>
           </w:tcPr>
           <w:p>
             <w:pPr>
@@ -2366,8 +2358,14 @@
               </w:rPr>
               <w:t>no_urut</w:t>
             </w:r>
+            <w:r>
+              <w:rPr>
+                <w:spacing w:val="-2"/>
+                <w:lang w:val="en-US"/>
+              </w:rPr>
+              <w:t>_empat</w:t>
+            </w:r>
             <w:proofErr w:type="spellEnd"/>
-            <w:proofErr w:type="gramStart"/>
             <w:r>
               <w:rPr>
                 <w:spacing w:val="-2"/>
@@ -2379,14 +2377,7 @@
               <w:rPr>
                 <w:spacing w:val="-2"/>
               </w:rPr>
-              <w:t>…</w:t>
-            </w:r>
-            <w:proofErr w:type="gramEnd"/>
-            <w:r>
-              <w:rPr>
-                <w:spacing w:val="-2"/>
-              </w:rPr>
-              <w:t>…………………..</w:t>
+              <w:t>……………………..</w:t>
             </w:r>
           </w:p>
         </w:tc>
@@ -2397,7 +2388,7 @@
         </w:trPr>
         <w:tc>
           <w:tcPr>
-            <w:tcW w:w="1906" w:type="dxa"/>
+            <w:tcW w:w="2268" w:type="dxa"/>
           </w:tcPr>
           <w:p>
             <w:pPr>
@@ -2428,6 +2419,13 @@
                 <w:lang w:val="en-US"/>
               </w:rPr>
               <w:t>no_urut</w:t>
+            </w:r>
+            <w:r>
+              <w:rPr>
+                <w:spacing w:val="-2"/>
+                <w:lang w:val="en-US"/>
+              </w:rPr>
+              <w:t>_lima</w:t>
             </w:r>
             <w:proofErr w:type="spellEnd"/>
             <w:r>
@@ -2441,7 +2439,7 @@
         </w:tc>
         <w:tc>
           <w:tcPr>
-            <w:tcW w:w="5391" w:type="dxa"/>
+            <w:tcW w:w="4966" w:type="dxa"/>
           </w:tcPr>
           <w:p>
             <w:pPr>
@@ -2514,8 +2512,14 @@
               </w:rPr>
               <w:t>no_urut</w:t>
             </w:r>
+            <w:r>
+              <w:rPr>
+                <w:spacing w:val="-2"/>
+                <w:lang w:val="en-US"/>
+              </w:rPr>
+              <w:t>_lima</w:t>
+            </w:r>
             <w:proofErr w:type="spellEnd"/>
-            <w:proofErr w:type="gramStart"/>
             <w:r>
               <w:rPr>
                 <w:spacing w:val="-2"/>
@@ -2527,14 +2531,7 @@
               <w:rPr>
                 <w:spacing w:val="-2"/>
               </w:rPr>
-              <w:t>…</w:t>
-            </w:r>
-            <w:proofErr w:type="gramEnd"/>
-            <w:r>
-              <w:rPr>
-                <w:spacing w:val="-2"/>
-              </w:rPr>
-              <w:t>…………………..</w:t>
+              <w:t>……………………..</w:t>
             </w:r>
           </w:p>
         </w:tc>
@@ -2545,7 +2542,7 @@
         </w:trPr>
         <w:tc>
           <w:tcPr>
-            <w:tcW w:w="1906" w:type="dxa"/>
+            <w:tcW w:w="2268" w:type="dxa"/>
           </w:tcPr>
           <w:p>
             <w:pPr>
@@ -2576,6 +2573,13 @@
                 <w:lang w:val="en-US"/>
               </w:rPr>
               <w:t>no_urut</w:t>
+            </w:r>
+            <w:r>
+              <w:rPr>
+                <w:spacing w:val="-2"/>
+                <w:lang w:val="en-US"/>
+              </w:rPr>
+              <w:t>_enam</w:t>
             </w:r>
             <w:proofErr w:type="spellEnd"/>
             <w:r>
@@ -2589,7 +2593,7 @@
         </w:tc>
         <w:tc>
           <w:tcPr>
-            <w:tcW w:w="5391" w:type="dxa"/>
+            <w:tcW w:w="4966" w:type="dxa"/>
           </w:tcPr>
           <w:p>
             <w:pPr>
@@ -2675,8 +2679,14 @@
               </w:rPr>
               <w:t>no_urut</w:t>
             </w:r>
+            <w:r>
+              <w:rPr>
+                <w:spacing w:val="-2"/>
+                <w:lang w:val="en-US"/>
+              </w:rPr>
+              <w:t>_enam</w:t>
+            </w:r>
             <w:proofErr w:type="spellEnd"/>
-            <w:proofErr w:type="gramStart"/>
             <w:r>
               <w:rPr>
                 <w:spacing w:val="-2"/>
@@ -2688,14 +2698,7 @@
               <w:rPr>
                 <w:spacing w:val="-2"/>
               </w:rPr>
-              <w:t>…</w:t>
-            </w:r>
-            <w:proofErr w:type="gramEnd"/>
-            <w:r>
-              <w:rPr>
-                <w:spacing w:val="-2"/>
-              </w:rPr>
-              <w:t>…………………..</w:t>
+              <w:t>……………………..</w:t>
             </w:r>
           </w:p>
         </w:tc>
@@ -2706,7 +2709,7 @@
         </w:trPr>
         <w:tc>
           <w:tcPr>
-            <w:tcW w:w="1906" w:type="dxa"/>
+            <w:tcW w:w="2268" w:type="dxa"/>
           </w:tcPr>
           <w:p>
             <w:pPr>
@@ -2741,6 +2744,13 @@
                 <w:lang w:val="en-US"/>
               </w:rPr>
               <w:t>no_urut</w:t>
+            </w:r>
+            <w:r>
+              <w:rPr>
+                <w:spacing w:val="-2"/>
+                <w:lang w:val="en-US"/>
+              </w:rPr>
+              <w:t>_tujuh</w:t>
             </w:r>
             <w:proofErr w:type="spellEnd"/>
             <w:r>
@@ -2754,7 +2764,7 @@
         </w:tc>
         <w:tc>
           <w:tcPr>
-            <w:tcW w:w="5391" w:type="dxa"/>
+            <w:tcW w:w="4966" w:type="dxa"/>
           </w:tcPr>
           <w:p>
             <w:pPr>
@@ -2834,8 +2844,14 @@
               </w:rPr>
               <w:t>no_urut</w:t>
             </w:r>
+            <w:r>
+              <w:rPr>
+                <w:spacing w:val="-2"/>
+                <w:lang w:val="en-US"/>
+              </w:rPr>
+              <w:t>_tujuh</w:t>
+            </w:r>
             <w:proofErr w:type="spellEnd"/>
-            <w:proofErr w:type="gramStart"/>
             <w:r>
               <w:rPr>
                 <w:spacing w:val="-2"/>
@@ -2847,14 +2863,7 @@
               <w:rPr>
                 <w:spacing w:val="-2"/>
               </w:rPr>
-              <w:t>…</w:t>
-            </w:r>
-            <w:proofErr w:type="gramEnd"/>
-            <w:r>
-              <w:rPr>
-                <w:spacing w:val="-2"/>
-              </w:rPr>
-              <w:t>…………………..</w:t>
+              <w:t>……………………..</w:t>
             </w:r>
           </w:p>
         </w:tc>
@@ -2898,37 +2907,6 @@
     <w:p>
       <w:pPr>
         <w:pStyle w:val="BodyText"/>
-        <w:rPr>
-          <w:rFonts w:ascii="Arial"/>
-          <w:b/>
-          <w:sz w:val="20"/>
-        </w:rPr>
-      </w:pPr>
-    </w:p>
-    <w:p>
-      <w:pPr>
-        <w:pStyle w:val="BodyText"/>
-        <w:rPr>
-          <w:rFonts w:ascii="Arial"/>
-          <w:b/>
-          <w:sz w:val="20"/>
-        </w:rPr>
-      </w:pPr>
-    </w:p>
-    <w:p>
-      <w:pPr>
-        <w:pStyle w:val="BodyText"/>
-        <w:rPr>
-          <w:rFonts w:ascii="Arial"/>
-          <w:b/>
-          <w:sz w:val="20"/>
-        </w:rPr>
-      </w:pPr>
-    </w:p>
-    <w:p>
-      <w:pPr>
-        <w:pStyle w:val="BodyText"/>
-        <w:jc w:val="center"/>
         <w:rPr>
           <w:rFonts w:ascii="Arial"/>
           <w:b/>

</xml_diff>

<commit_message>
fix(laporan): resolve pdf generation issues, clean empty docx runs, and map variables
</commit_message>
<xml_diff>
--- a/backend/templates/Berkas Luar Kota - Laporan.docx
+++ b/backend/templates/Berkas Luar Kota - Laporan.docx
@@ -2,279 +2,6 @@
 <file path=word/document.xml><?xml version="1.0" encoding="utf-8"?>
 <w:document xmlns:wpc="http://schemas.microsoft.com/office/word/2010/wordprocessingCanvas" xmlns:cx="http://schemas.microsoft.com/office/drawing/2014/chartex" xmlns:cx1="http://schemas.microsoft.com/office/drawing/2015/9/8/chartex" xmlns:cx2="http://schemas.microsoft.com/office/drawing/2015/10/21/chartex" xmlns:cx3="http://schemas.microsoft.com/office/drawing/2016/5/9/chartex" xmlns:cx4="http://schemas.microsoft.com/office/drawing/2016/5/10/chartex" xmlns:cx5="http://schemas.microsoft.com/office/drawing/2016/5/11/chartex" xmlns:cx6="http://schemas.microsoft.com/office/drawing/2016/5/12/chartex" xmlns:cx7="http://schemas.microsoft.com/office/drawing/2016/5/13/chartex" xmlns:cx8="http://schemas.microsoft.com/office/drawing/2016/5/14/chartex" xmlns:mc="http://schemas.openxmlformats.org/markup-compatibility/2006" xmlns:aink="http://schemas.microsoft.com/office/drawing/2016/ink" xmlns:am3d="http://schemas.microsoft.com/office/drawing/2017/model3d" xmlns:o="urn:schemas-microsoft-com:office:office" xmlns:oel="http://schemas.microsoft.com/office/2019/extlst" xmlns:r="http://schemas.openxmlformats.org/officeDocument/2006/relationships" xmlns:m="http://schemas.openxmlformats.org/officeDocument/2006/math" xmlns:v="urn:schemas-microsoft-com:vml" xmlns:wp14="http://schemas.microsoft.com/office/word/2010/wordprocessingDrawing" xmlns:wp="http://schemas.openxmlformats.org/drawingml/2006/wordprocessingDrawing" xmlns:w10="urn:schemas-microsoft-com:office:word" xmlns:w="http://schemas.openxmlformats.org/wordprocessingml/2006/main" xmlns:w14="http://schemas.microsoft.com/office/word/2010/wordml" xmlns:w15="http://schemas.microsoft.com/office/word/2012/wordml" xmlns:w16cex="http://schemas.microsoft.com/office/word/2018/wordml/cex" xmlns:w16cid="http://schemas.microsoft.com/office/word/2016/wordml/cid" xmlns:w16="http://schemas.microsoft.com/office/word/2018/wordml" xmlns:w16du="http://schemas.microsoft.com/office/word/2023/wordml/word16du" xmlns:w16sdtdh="http://schemas.microsoft.com/office/word/2020/wordml/sdtdatahash" xmlns:w16sdtfl="http://schemas.microsoft.com/office/word/2024/wordml/sdtformatlock" xmlns:w16se="http://schemas.microsoft.com/office/word/2015/wordml/symex" xmlns:wpg="http://schemas.microsoft.com/office/word/2010/wordprocessingGroup" xmlns:wpi="http://schemas.microsoft.com/office/word/2010/wordprocessingInk" xmlns:wne="http://schemas.microsoft.com/office/word/2006/wordml" xmlns:wps="http://schemas.microsoft.com/office/word/2010/wordprocessingShape" mc:Ignorable="w14 w15 w16se w16cid w16 w16cex w16sdtdh w16sdtfl w16du wp14">
   <w:body>
-    <w:tbl>
-      <w:tblPr>
-        <w:tblStyle w:val="TableGrid"/>
-        <w:tblW w:w="10641" w:type="dxa"/>
-        <w:tblLook w:val="04A0" w:firstRow="1" w:lastRow="0" w:firstColumn="1" w:lastColumn="0" w:noHBand="0" w:noVBand="1"/>
-      </w:tblPr>
-      <w:tblGrid>
-        <w:gridCol w:w="1430"/>
-        <w:gridCol w:w="9211"/>
-      </w:tblGrid>
-      <w:tr>
-        <w:trPr>
-          <w:trHeight w:val="1867"/>
-        </w:trPr>
-        <w:tc>
-          <w:tcPr>
-            <w:tcW w:w="1430" w:type="dxa"/>
-            <w:tcBorders>
-              <w:top w:val="nil"/>
-              <w:left w:val="nil"/>
-              <w:bottom w:val="nil"/>
-              <w:right w:val="nil"/>
-            </w:tcBorders>
-          </w:tcPr>
-          <w:p>
-            <w:pPr>
-              <w:pStyle w:val="Header"/>
-            </w:pPr>
-            <w:r>
-              <w:rPr>
-                <w:noProof/>
-              </w:rPr>
-              <w:drawing>
-                <wp:anchor distT="0" distB="0" distL="114300" distR="114300" simplePos="0" relativeHeight="251659264" behindDoc="1" locked="0" layoutInCell="1" allowOverlap="1" wp14:anchorId="55624262" wp14:editId="35998551">
-                  <wp:simplePos x="0" y="0"/>
-                  <wp:positionH relativeFrom="column">
-                    <wp:posOffset>689379</wp:posOffset>
-                  </wp:positionH>
-                  <wp:positionV relativeFrom="paragraph">
-                    <wp:posOffset>-11875</wp:posOffset>
-                  </wp:positionV>
-                  <wp:extent cx="78740" cy="1292225"/>
-                  <wp:effectExtent l="0" t="0" r="0" b="3175"/>
-                  <wp:wrapTight wrapText="bothSides">
-                    <wp:wrapPolygon edited="0">
-                      <wp:start x="0" y="0"/>
-                      <wp:lineTo x="0" y="21335"/>
-                      <wp:lineTo x="15677" y="21335"/>
-                      <wp:lineTo x="15677" y="0"/>
-                      <wp:lineTo x="0" y="0"/>
-                    </wp:wrapPolygon>
-                  </wp:wrapTight>
-                  <wp:docPr id="3" name="Picture 3"/>
-                  <wp:cNvGraphicFramePr>
-                    <a:graphicFrameLocks xmlns:a="http://schemas.openxmlformats.org/drawingml/2006/main" noChangeAspect="1"/>
-                  </wp:cNvGraphicFramePr>
-                  <a:graphic xmlns:a="http://schemas.openxmlformats.org/drawingml/2006/main">
-                    <a:graphicData uri="http://schemas.openxmlformats.org/drawingml/2006/picture">
-                      <pic:pic xmlns:pic="http://schemas.openxmlformats.org/drawingml/2006/picture">
-                        <pic:nvPicPr>
-                          <pic:cNvPr id="2" name="Picture 2"/>
-                          <pic:cNvPicPr>
-                            <a:picLocks noChangeAspect="1"/>
-                          </pic:cNvPicPr>
-                        </pic:nvPicPr>
-                        <pic:blipFill>
-                          <a:blip r:embed="rId7" cstate="print">
-                            <a:extLst>
-                              <a:ext uri="{28A0092B-C50C-407E-A947-70E740481C1C}">
-                                <a14:useLocalDpi xmlns:a14="http://schemas.microsoft.com/office/drawing/2010/main" val="0"/>
-                              </a:ext>
-                            </a:extLst>
-                          </a:blip>
-                          <a:stretch>
-                            <a:fillRect/>
-                          </a:stretch>
-                        </pic:blipFill>
-                        <pic:spPr>
-                          <a:xfrm>
-                            <a:off x="0" y="0"/>
-                            <a:ext cx="78740" cy="1292225"/>
-                          </a:xfrm>
-                          <a:prstGeom prst="rect">
-                            <a:avLst/>
-                          </a:prstGeom>
-                        </pic:spPr>
-                      </pic:pic>
-                    </a:graphicData>
-                  </a:graphic>
-                </wp:anchor>
-              </w:drawing>
-            </w:r>
-          </w:p>
-          <w:p>
-            <w:pPr>
-              <w:pStyle w:val="Header"/>
-            </w:pPr>
-            <w:r>
-              <w:rPr>
-                <w:noProof/>
-              </w:rPr>
-              <w:drawing>
-                <wp:anchor distT="0" distB="0" distL="114300" distR="114300" simplePos="0" relativeHeight="251660288" behindDoc="1" locked="0" layoutInCell="1" allowOverlap="1" wp14:anchorId="5D9C347D" wp14:editId="4C9684DD">
-                  <wp:simplePos x="0" y="0"/>
-                  <wp:positionH relativeFrom="column">
-                    <wp:posOffset>5847</wp:posOffset>
-                  </wp:positionH>
-                  <wp:positionV relativeFrom="paragraph">
-                    <wp:posOffset>100602</wp:posOffset>
-                  </wp:positionV>
-                  <wp:extent cx="648970" cy="819785"/>
-                  <wp:effectExtent l="0" t="0" r="0" b="0"/>
-                  <wp:wrapTight wrapText="bothSides">
-                    <wp:wrapPolygon edited="0">
-                      <wp:start x="8243" y="0"/>
-                      <wp:lineTo x="3804" y="3012"/>
-                      <wp:lineTo x="0" y="7027"/>
-                      <wp:lineTo x="0" y="10039"/>
-                      <wp:lineTo x="8877" y="16564"/>
-                      <wp:lineTo x="2536" y="17568"/>
-                      <wp:lineTo x="0" y="18572"/>
-                      <wp:lineTo x="0" y="21081"/>
-                      <wp:lineTo x="20924" y="21081"/>
-                      <wp:lineTo x="20924" y="19074"/>
-                      <wp:lineTo x="19656" y="18070"/>
-                      <wp:lineTo x="12047" y="16564"/>
-                      <wp:lineTo x="20924" y="9537"/>
-                      <wp:lineTo x="20924" y="7027"/>
-                      <wp:lineTo x="16485" y="3012"/>
-                      <wp:lineTo x="12681" y="0"/>
-                      <wp:lineTo x="8243" y="0"/>
-                    </wp:wrapPolygon>
-                  </wp:wrapTight>
-                  <wp:docPr id="2" name="Picture 2"/>
-                  <wp:cNvGraphicFramePr>
-                    <a:graphicFrameLocks xmlns:a="http://schemas.openxmlformats.org/drawingml/2006/main" noChangeAspect="1"/>
-                  </wp:cNvGraphicFramePr>
-                  <a:graphic xmlns:a="http://schemas.openxmlformats.org/drawingml/2006/main">
-                    <a:graphicData uri="http://schemas.openxmlformats.org/drawingml/2006/picture">
-                      <pic:pic xmlns:pic="http://schemas.openxmlformats.org/drawingml/2006/picture">
-                        <pic:nvPicPr>
-                          <pic:cNvPr id="1" name="Picture 1"/>
-                          <pic:cNvPicPr>
-                            <a:picLocks noChangeAspect="1"/>
-                          </pic:cNvPicPr>
-                        </pic:nvPicPr>
-                        <pic:blipFill>
-                          <a:blip r:embed="rId8" cstate="print">
-                            <a:extLst>
-                              <a:ext uri="{28A0092B-C50C-407E-A947-70E740481C1C}">
-                                <a14:useLocalDpi xmlns:a14="http://schemas.microsoft.com/office/drawing/2010/main" val="0"/>
-                              </a:ext>
-                            </a:extLst>
-                          </a:blip>
-                          <a:stretch>
-                            <a:fillRect/>
-                          </a:stretch>
-                        </pic:blipFill>
-                        <pic:spPr>
-                          <a:xfrm>
-                            <a:off x="0" y="0"/>
-                            <a:ext cx="648970" cy="819785"/>
-                          </a:xfrm>
-                          <a:prstGeom prst="rect">
-                            <a:avLst/>
-                          </a:prstGeom>
-                        </pic:spPr>
-                      </pic:pic>
-                    </a:graphicData>
-                  </a:graphic>
-                </wp:anchor>
-              </w:drawing>
-            </w:r>
-          </w:p>
-          <w:p>
-            <w:pPr>
-              <w:pStyle w:val="Header"/>
-            </w:pPr>
-          </w:p>
-        </w:tc>
-        <w:tc>
-          <w:tcPr>
-            <w:tcW w:w="9211" w:type="dxa"/>
-            <w:tcBorders>
-              <w:top w:val="nil"/>
-              <w:left w:val="nil"/>
-              <w:bottom w:val="nil"/>
-              <w:right w:val="nil"/>
-            </w:tcBorders>
-          </w:tcPr>
-          <w:p>
-            <w:pPr>
-              <w:rPr>
-                <w:rFonts w:ascii="Arial Narrow" w:hAnsi="Arial Narrow"/>
-                <w:szCs w:val="24"/>
-              </w:rPr>
-            </w:pPr>
-          </w:p>
-          <w:p>
-            <w:pPr>
-              <w:rPr>
-                <w:rFonts w:ascii="Arial Narrow" w:hAnsi="Arial Narrow"/>
-                <w:sz w:val="28"/>
-                <w:szCs w:val="28"/>
-              </w:rPr>
-            </w:pPr>
-          </w:p>
-          <w:p>
-            <w:pPr>
-              <w:rPr>
-                <w:rFonts w:ascii="Arial Narrow" w:hAnsi="Arial Narrow"/>
-                <w:sz w:val="28"/>
-                <w:szCs w:val="28"/>
-              </w:rPr>
-            </w:pPr>
-            <w:r>
-              <w:rPr>
-                <w:rFonts w:ascii="Arial Narrow" w:hAnsi="Arial Narrow"/>
-                <w:sz w:val="28"/>
-                <w:szCs w:val="28"/>
-              </w:rPr>
-              <w:t>KEMENTERIAN KETENAGAKERJAAN REPUBLIK INDONESIA</w:t>
-            </w:r>
-          </w:p>
-          <w:p>
-            <w:pPr>
-              <w:rPr>
-                <w:rFonts w:ascii="Arial Narrow" w:hAnsi="Arial Narrow"/>
-                <w:color w:val="284A61"/>
-                <w:sz w:val="32"/>
-                <w:szCs w:val="32"/>
-              </w:rPr>
-            </w:pPr>
-            <w:r>
-              <w:rPr>
-                <w:rFonts w:ascii="Arial Narrow" w:hAnsi="Arial Narrow"/>
-                <w:color w:val="284A61"/>
-                <w:sz w:val="32"/>
-                <w:szCs w:val="32"/>
-              </w:rPr>
-              <w:t>SEKRETARIAT JENDERAL</w:t>
-            </w:r>
-          </w:p>
-          <w:p>
-            <w:pPr>
-              <w:rPr>
-                <w:rFonts w:ascii="Arial Narrow" w:hAnsi="Arial Narrow"/>
-                <w:b/>
-                <w:color w:val="284A61"/>
-                <w:sz w:val="32"/>
-                <w:szCs w:val="32"/>
-              </w:rPr>
-            </w:pPr>
-          </w:p>
-          <w:p>
-            <w:pPr>
-              <w:rPr>
-                <w:rFonts w:ascii="Arial Narrow" w:hAnsi="Arial Narrow"/>
-                <w:color w:val="000000" w:themeColor="text1"/>
-                <w:sz w:val="18"/>
-                <w:szCs w:val="18"/>
-              </w:rPr>
-            </w:pPr>
-          </w:p>
-          <w:p/>
-          <w:p>
-            <w:pPr>
-              <w:pStyle w:val="Header"/>
-            </w:pPr>
-          </w:p>
-        </w:tc>
-      </w:tr>
-    </w:tbl>
     <w:p>
       <w:pPr>
         <w:pStyle w:val="Heading1"/>
@@ -294,9 +21,6 @@
         <w:spacing w:before="45"/>
         <w:ind w:right="139"/>
         <w:jc w:val="center"/>
-        <w:rPr>
-          <w:lang w:val="sv-SE"/>
-        </w:rPr>
       </w:pPr>
       <w:r>
         <w:t>Perjalanan</w:t>
@@ -326,15 +50,11 @@
         <w:t xml:space="preserve"> </w:t>
       </w:r>
       <w:r>
-        <w:rPr>
-          <w:lang w:val="sv-SE"/>
-        </w:rPr>
         <w:t>{{kota</w:t>
       </w:r>
       <w:r>
         <w:rPr>
           <w:spacing w:val="-2"/>
-          <w:lang w:val="sv-SE"/>
         </w:rPr>
         <w:t>}}, {{provinsi}}</w:t>
       </w:r>
@@ -345,14 +65,8 @@
         <w:spacing w:before="40"/>
         <w:ind w:right="78"/>
         <w:jc w:val="center"/>
-        <w:rPr>
-          <w:lang w:val="en-US"/>
-        </w:rPr>
-      </w:pPr>
-      <w:r>
-        <w:rPr>
-          <w:lang w:val="en-US"/>
-        </w:rPr>
+      </w:pPr>
+      <w:r>
         <w:t>Tanggal {{tanggal_mulai}} – {{tanggal_selesai}}</w:t>
       </w:r>
     </w:p>
@@ -551,7 +265,13 @@
                     <w:t xml:space="preserve"> </w:t>
                   </w:r>
                   <w:r>
-                    <w:t>Kementerian Ketenagakerjaan Nomor</w:t>
+                    <w:t>Kementerian Ketenagakerjaan</w:t>
+                  </w:r>
+                  <w:r>
+                    <w:t xml:space="preserve"> </w:t>
+                  </w:r>
+                  <w:r>
+                    <w:t>Nomor</w:t>
                   </w:r>
                   <w:r>
                     <w:rPr>
@@ -563,7 +283,19 @@
                     <w:rPr>
                       <w:spacing w:val="-5"/>
                     </w:rPr>
-                    <w:t>1/</w:t>
+                    <w:t>1</w:t>
+                  </w:r>
+                  <w:r>
+                    <w:rPr>
+                      <w:spacing w:val="-5"/>
+                    </w:rPr>
+                    <w:t>.5</w:t>
+                  </w:r>
+                  <w:r>
+                    <w:rPr>
+                      <w:spacing w:val="-5"/>
+                    </w:rPr>
+                    <w:t>/</w:t>
                   </w:r>
                   <w:r>
                     <w:t>{{no_surat}}</w:t>
@@ -1393,6 +1125,8 @@
               <w:jc w:val="center"/>
             </w:pPr>
           </w:p>
+          <w:p/>
+          <w:p/>
           <w:p>
             <w:pPr>
               <w:jc w:val="center"/>
@@ -1448,6 +1182,7 @@
           <w:lang w:val="en-US"/>
         </w:rPr>
         <w:sectPr>
+          <w:headerReference w:type="default" r:id="rId7"/>
           <w:type w:val="continuous"/>
           <w:pgSz w:w="12240" w:h="20160"/>
           <w:pgMar w:top="1200" w:right="1080" w:bottom="280" w:left="1080" w:header="340" w:footer="720" w:gutter="0"/>
@@ -1459,7 +1194,21 @@
         <w:rPr>
           <w:lang w:val="en-US"/>
         </w:rPr>
-        <w:t>{{isi_laporan}}</w:t>
+        <w:t>{{</w:t>
+      </w:r>
+      <w:proofErr w:type="spellStart"/>
+      <w:r>
+        <w:rPr>
+          <w:lang w:val="en-US"/>
+        </w:rPr>
+        <w:t>isi_laporan</w:t>
+      </w:r>
+      <w:proofErr w:type="spellEnd"/>
+      <w:r>
+        <w:rPr>
+          <w:lang w:val="en-US"/>
+        </w:rPr>
+        <w:t>}}</w:t>
       </w:r>
     </w:p>
     <w:p>
@@ -1731,7 +1480,15 @@
                 <w:spacing w:val="-2"/>
                 <w:lang w:val="en-US"/>
               </w:rPr>
-              <w:t>{{no_urut</w:t>
+              <w:t>{{</w:t>
+            </w:r>
+            <w:proofErr w:type="spellStart"/>
+            <w:r>
+              <w:rPr>
+                <w:spacing w:val="-2"/>
+                <w:lang w:val="en-US"/>
+              </w:rPr>
+              <w:t>no_urut</w:t>
             </w:r>
             <w:r>
               <w:rPr>
@@ -1740,6 +1497,7 @@
               </w:rPr>
               <w:t>_satu</w:t>
             </w:r>
+            <w:proofErr w:type="spellEnd"/>
             <w:r>
               <w:rPr>
                 <w:spacing w:val="-2"/>
@@ -1771,7 +1529,21 @@
               <w:rPr>
                 <w:lang w:val="en-US"/>
               </w:rPr>
-              <w:t>{{nama_petugas_satu}}</w:t>
+              <w:t>{{</w:t>
+            </w:r>
+            <w:proofErr w:type="spellStart"/>
+            <w:r>
+              <w:rPr>
+                <w:lang w:val="en-US"/>
+              </w:rPr>
+              <w:t>nama_petugas_satu</w:t>
+            </w:r>
+            <w:proofErr w:type="spellEnd"/>
+            <w:r>
+              <w:rPr>
+                <w:lang w:val="en-US"/>
+              </w:rPr>
+              <w:t>}}</w:t>
             </w:r>
           </w:p>
           <w:p>
@@ -1795,12 +1567,14 @@
               </w:rPr>
               <w:t>NIP. {{</w:t>
             </w:r>
+            <w:proofErr w:type="spellStart"/>
             <w:r>
               <w:rPr>
                 <w:lang w:val="en-US"/>
               </w:rPr>
               <w:t>nip_petugas_satu</w:t>
             </w:r>
+            <w:proofErr w:type="spellEnd"/>
             <w:r>
               <w:rPr>
                 <w:lang w:val="en-US"/>
@@ -1824,7 +1598,15 @@
                 <w:spacing w:val="-2"/>
                 <w:lang w:val="en-US"/>
               </w:rPr>
-              <w:t>{{no_urut</w:t>
+              <w:t>{{</w:t>
+            </w:r>
+            <w:proofErr w:type="spellStart"/>
+            <w:r>
+              <w:rPr>
+                <w:spacing w:val="-2"/>
+                <w:lang w:val="en-US"/>
+              </w:rPr>
+              <w:t>no_urut</w:t>
             </w:r>
             <w:r>
               <w:rPr>
@@ -1833,6 +1615,8 @@
               </w:rPr>
               <w:t>_satu</w:t>
             </w:r>
+            <w:proofErr w:type="spellEnd"/>
+            <w:proofErr w:type="gramStart"/>
             <w:r>
               <w:rPr>
                 <w:spacing w:val="-2"/>
@@ -1844,8 +1628,23 @@
               <w:rPr>
                 <w:spacing w:val="-2"/>
               </w:rPr>
-              <w:t>……………………..</w:t>
-            </w:r>
+              <w:t>…</w:t>
+            </w:r>
+            <w:proofErr w:type="gramEnd"/>
+            <w:r>
+              <w:rPr>
+                <w:spacing w:val="-2"/>
+              </w:rPr>
+              <w:t>………………</w:t>
+            </w:r>
+            <w:proofErr w:type="gramStart"/>
+            <w:r>
+              <w:rPr>
+                <w:spacing w:val="-2"/>
+              </w:rPr>
+              <w:t>…..</w:t>
+            </w:r>
+            <w:proofErr w:type="gramEnd"/>
           </w:p>
         </w:tc>
       </w:tr>
@@ -1877,7 +1676,15 @@
                 <w:spacing w:val="-2"/>
                 <w:lang w:val="en-US"/>
               </w:rPr>
-              <w:t>{{no_urut</w:t>
+              <w:t>{{</w:t>
+            </w:r>
+            <w:proofErr w:type="spellStart"/>
+            <w:r>
+              <w:rPr>
+                <w:spacing w:val="-2"/>
+                <w:lang w:val="en-US"/>
+              </w:rPr>
+              <w:t>no_urut</w:t>
             </w:r>
             <w:r>
               <w:rPr>
@@ -1886,6 +1693,7 @@
               </w:rPr>
               <w:t>_dua</w:t>
             </w:r>
+            <w:proofErr w:type="spellEnd"/>
             <w:r>
               <w:rPr>
                 <w:spacing w:val="-2"/>
@@ -1953,7 +1761,15 @@
                 <w:spacing w:val="-2"/>
                 <w:lang w:val="en-US"/>
               </w:rPr>
-              <w:t>{{no</w:t>
+              <w:t>{{</w:t>
+            </w:r>
+            <w:proofErr w:type="spellStart"/>
+            <w:r>
+              <w:rPr>
+                <w:spacing w:val="-2"/>
+                <w:lang w:val="en-US"/>
+              </w:rPr>
+              <w:t>no</w:t>
             </w:r>
             <w:r>
               <w:rPr>
@@ -1969,6 +1785,8 @@
               </w:rPr>
               <w:t>_dua</w:t>
             </w:r>
+            <w:proofErr w:type="spellEnd"/>
+            <w:proofErr w:type="gramStart"/>
             <w:r>
               <w:rPr>
                 <w:spacing w:val="-2"/>
@@ -1980,8 +1798,23 @@
               <w:rPr>
                 <w:spacing w:val="-2"/>
               </w:rPr>
-              <w:t>……………………..</w:t>
-            </w:r>
+              <w:t>…</w:t>
+            </w:r>
+            <w:proofErr w:type="gramEnd"/>
+            <w:r>
+              <w:rPr>
+                <w:spacing w:val="-2"/>
+              </w:rPr>
+              <w:t>………………</w:t>
+            </w:r>
+            <w:proofErr w:type="gramStart"/>
+            <w:r>
+              <w:rPr>
+                <w:spacing w:val="-2"/>
+              </w:rPr>
+              <w:t>…..</w:t>
+            </w:r>
+            <w:proofErr w:type="gramEnd"/>
           </w:p>
         </w:tc>
       </w:tr>
@@ -2013,7 +1846,15 @@
                 <w:spacing w:val="-2"/>
                 <w:lang w:val="en-US"/>
               </w:rPr>
-              <w:t>{{no_urut</w:t>
+              <w:t>{{</w:t>
+            </w:r>
+            <w:proofErr w:type="spellStart"/>
+            <w:r>
+              <w:rPr>
+                <w:spacing w:val="-2"/>
+                <w:lang w:val="en-US"/>
+              </w:rPr>
+              <w:t>no_urut</w:t>
             </w:r>
             <w:r>
               <w:rPr>
@@ -2022,6 +1863,7 @@
               </w:rPr>
               <w:t>_tiga</w:t>
             </w:r>
+            <w:proofErr w:type="spellEnd"/>
             <w:r>
               <w:rPr>
                 <w:spacing w:val="-2"/>
@@ -2094,7 +1936,15 @@
                 <w:spacing w:val="-2"/>
                 <w:lang w:val="en-US"/>
               </w:rPr>
-              <w:t>{{no_urut</w:t>
+              <w:t>{{</w:t>
+            </w:r>
+            <w:proofErr w:type="spellStart"/>
+            <w:r>
+              <w:rPr>
+                <w:spacing w:val="-2"/>
+                <w:lang w:val="en-US"/>
+              </w:rPr>
+              <w:t>no_urut</w:t>
             </w:r>
             <w:r>
               <w:rPr>
@@ -2103,6 +1953,8 @@
               </w:rPr>
               <w:t>_tiga</w:t>
             </w:r>
+            <w:proofErr w:type="spellEnd"/>
+            <w:proofErr w:type="gramStart"/>
             <w:r>
               <w:rPr>
                 <w:spacing w:val="-2"/>
@@ -2114,8 +1966,23 @@
               <w:rPr>
                 <w:spacing w:val="-2"/>
               </w:rPr>
-              <w:t>……………………..</w:t>
-            </w:r>
+              <w:t>…</w:t>
+            </w:r>
+            <w:proofErr w:type="gramEnd"/>
+            <w:r>
+              <w:rPr>
+                <w:spacing w:val="-2"/>
+              </w:rPr>
+              <w:t>………………</w:t>
+            </w:r>
+            <w:proofErr w:type="gramStart"/>
+            <w:r>
+              <w:rPr>
+                <w:spacing w:val="-2"/>
+              </w:rPr>
+              <w:t>…..</w:t>
+            </w:r>
+            <w:proofErr w:type="gramEnd"/>
           </w:p>
         </w:tc>
       </w:tr>
@@ -2147,7 +2014,15 @@
                 <w:spacing w:val="-2"/>
                 <w:lang w:val="en-US"/>
               </w:rPr>
-              <w:t>{{no_urut</w:t>
+              <w:t>{{</w:t>
+            </w:r>
+            <w:proofErr w:type="spellStart"/>
+            <w:r>
+              <w:rPr>
+                <w:spacing w:val="-2"/>
+                <w:lang w:val="en-US"/>
+              </w:rPr>
+              <w:t>no_urut</w:t>
             </w:r>
             <w:r>
               <w:rPr>
@@ -2156,6 +2031,7 @@
               </w:rPr>
               <w:t>_empat</w:t>
             </w:r>
+            <w:proofErr w:type="spellEnd"/>
             <w:r>
               <w:rPr>
                 <w:spacing w:val="-2"/>
@@ -2230,7 +2106,15 @@
                 <w:spacing w:val="-2"/>
                 <w:lang w:val="en-US"/>
               </w:rPr>
-              <w:t>{{no_urut</w:t>
+              <w:t>{{</w:t>
+            </w:r>
+            <w:proofErr w:type="spellStart"/>
+            <w:r>
+              <w:rPr>
+                <w:spacing w:val="-2"/>
+                <w:lang w:val="en-US"/>
+              </w:rPr>
+              <w:t>no_urut</w:t>
             </w:r>
             <w:r>
               <w:rPr>
@@ -2239,6 +2123,8 @@
               </w:rPr>
               <w:t>_empat</w:t>
             </w:r>
+            <w:proofErr w:type="spellEnd"/>
+            <w:proofErr w:type="gramStart"/>
             <w:r>
               <w:rPr>
                 <w:spacing w:val="-2"/>
@@ -2250,8 +2136,23 @@
               <w:rPr>
                 <w:spacing w:val="-2"/>
               </w:rPr>
-              <w:t>……………………..</w:t>
-            </w:r>
+              <w:t>…</w:t>
+            </w:r>
+            <w:proofErr w:type="gramEnd"/>
+            <w:r>
+              <w:rPr>
+                <w:spacing w:val="-2"/>
+              </w:rPr>
+              <w:t>………………</w:t>
+            </w:r>
+            <w:proofErr w:type="gramStart"/>
+            <w:r>
+              <w:rPr>
+                <w:spacing w:val="-2"/>
+              </w:rPr>
+              <w:t>…..</w:t>
+            </w:r>
+            <w:proofErr w:type="gramEnd"/>
           </w:p>
         </w:tc>
       </w:tr>
@@ -2283,7 +2184,15 @@
                 <w:spacing w:val="-2"/>
                 <w:lang w:val="en-US"/>
               </w:rPr>
-              <w:t>{{no_urut</w:t>
+              <w:t>{{</w:t>
+            </w:r>
+            <w:proofErr w:type="spellStart"/>
+            <w:r>
+              <w:rPr>
+                <w:spacing w:val="-2"/>
+                <w:lang w:val="en-US"/>
+              </w:rPr>
+              <w:t>no_urut</w:t>
             </w:r>
             <w:r>
               <w:rPr>
@@ -2292,6 +2201,7 @@
               </w:rPr>
               <w:t>_lima</w:t>
             </w:r>
+            <w:proofErr w:type="spellEnd"/>
             <w:r>
               <w:rPr>
                 <w:spacing w:val="-2"/>
@@ -2366,7 +2276,15 @@
                 <w:spacing w:val="-2"/>
                 <w:lang w:val="en-US"/>
               </w:rPr>
-              <w:t>{{no_urut</w:t>
+              <w:t>{{</w:t>
+            </w:r>
+            <w:proofErr w:type="spellStart"/>
+            <w:r>
+              <w:rPr>
+                <w:spacing w:val="-2"/>
+                <w:lang w:val="en-US"/>
+              </w:rPr>
+              <w:t>no_urut</w:t>
             </w:r>
             <w:r>
               <w:rPr>
@@ -2375,6 +2293,8 @@
               </w:rPr>
               <w:t>_lima</w:t>
             </w:r>
+            <w:proofErr w:type="spellEnd"/>
+            <w:proofErr w:type="gramStart"/>
             <w:r>
               <w:rPr>
                 <w:spacing w:val="-2"/>
@@ -2386,8 +2306,23 @@
               <w:rPr>
                 <w:spacing w:val="-2"/>
               </w:rPr>
-              <w:t>……………………..</w:t>
-            </w:r>
+              <w:t>…</w:t>
+            </w:r>
+            <w:proofErr w:type="gramEnd"/>
+            <w:r>
+              <w:rPr>
+                <w:spacing w:val="-2"/>
+              </w:rPr>
+              <w:t>………………</w:t>
+            </w:r>
+            <w:proofErr w:type="gramStart"/>
+            <w:r>
+              <w:rPr>
+                <w:spacing w:val="-2"/>
+              </w:rPr>
+              <w:t>…..</w:t>
+            </w:r>
+            <w:proofErr w:type="gramEnd"/>
           </w:p>
         </w:tc>
       </w:tr>
@@ -2419,7 +2354,15 @@
                 <w:spacing w:val="-2"/>
                 <w:lang w:val="en-US"/>
               </w:rPr>
-              <w:t>{{no_urut</w:t>
+              <w:t>{{</w:t>
+            </w:r>
+            <w:proofErr w:type="spellStart"/>
+            <w:r>
+              <w:rPr>
+                <w:spacing w:val="-2"/>
+                <w:lang w:val="en-US"/>
+              </w:rPr>
+              <w:t>no_urut</w:t>
             </w:r>
             <w:r>
               <w:rPr>
@@ -2428,6 +2371,7 @@
               </w:rPr>
               <w:t>_enam</w:t>
             </w:r>
+            <w:proofErr w:type="spellEnd"/>
             <w:r>
               <w:rPr>
                 <w:spacing w:val="-2"/>
@@ -2456,14 +2400,8 @@
               <w:pStyle w:val="TableParagraph"/>
               <w:spacing w:line="247" w:lineRule="exact"/>
               <w:ind w:left="145"/>
-              <w:rPr>
-                <w:lang w:val="sv-SE"/>
-              </w:rPr>
             </w:pPr>
             <w:r>
-              <w:rPr>
-                <w:lang w:val="sv-SE"/>
-              </w:rPr>
               <w:t>{{nama_petugas_enam}}</w:t>
             </w:r>
           </w:p>
@@ -2474,15 +2412,9 @@
               <w:ind w:left="145"/>
             </w:pPr>
             <w:r>
-              <w:rPr>
-                <w:lang w:val="sv-SE"/>
-              </w:rPr>
               <w:t xml:space="preserve">NIP. </w:t>
             </w:r>
             <w:r>
-              <w:rPr>
-                <w:lang w:val="sv-SE"/>
-              </w:rPr>
               <w:t>{{nip_petugas_enam}}</w:t>
             </w:r>
           </w:p>
@@ -2515,7 +2447,15 @@
                 <w:spacing w:val="-2"/>
                 <w:lang w:val="en-US"/>
               </w:rPr>
-              <w:t>{{no_urut</w:t>
+              <w:t>{{</w:t>
+            </w:r>
+            <w:proofErr w:type="spellStart"/>
+            <w:r>
+              <w:rPr>
+                <w:spacing w:val="-2"/>
+                <w:lang w:val="en-US"/>
+              </w:rPr>
+              <w:t>no_urut</w:t>
             </w:r>
             <w:r>
               <w:rPr>
@@ -2524,6 +2464,8 @@
               </w:rPr>
               <w:t>_enam</w:t>
             </w:r>
+            <w:proofErr w:type="spellEnd"/>
+            <w:proofErr w:type="gramStart"/>
             <w:r>
               <w:rPr>
                 <w:spacing w:val="-2"/>
@@ -2535,8 +2477,23 @@
               <w:rPr>
                 <w:spacing w:val="-2"/>
               </w:rPr>
-              <w:t>……………………..</w:t>
-            </w:r>
+              <w:t>…</w:t>
+            </w:r>
+            <w:proofErr w:type="gramEnd"/>
+            <w:r>
+              <w:rPr>
+                <w:spacing w:val="-2"/>
+              </w:rPr>
+              <w:t>………………</w:t>
+            </w:r>
+            <w:proofErr w:type="gramStart"/>
+            <w:r>
+              <w:rPr>
+                <w:spacing w:val="-2"/>
+              </w:rPr>
+              <w:t>…..</w:t>
+            </w:r>
+            <w:proofErr w:type="gramEnd"/>
           </w:p>
         </w:tc>
       </w:tr>
@@ -2572,7 +2529,15 @@
                 <w:spacing w:val="-2"/>
                 <w:lang w:val="en-US"/>
               </w:rPr>
-              <w:t>{{no_urut</w:t>
+              <w:t>{{</w:t>
+            </w:r>
+            <w:proofErr w:type="spellStart"/>
+            <w:r>
+              <w:rPr>
+                <w:spacing w:val="-2"/>
+                <w:lang w:val="en-US"/>
+              </w:rPr>
+              <w:t>no_urut</w:t>
             </w:r>
             <w:r>
               <w:rPr>
@@ -2581,6 +2546,7 @@
               </w:rPr>
               <w:t>_tujuh</w:t>
             </w:r>
+            <w:proofErr w:type="spellEnd"/>
             <w:r>
               <w:rPr>
                 <w:spacing w:val="-2"/>
@@ -2662,7 +2628,15 @@
                 <w:spacing w:val="-2"/>
                 <w:lang w:val="en-US"/>
               </w:rPr>
-              <w:t>{{no_urut</w:t>
+              <w:t>{{</w:t>
+            </w:r>
+            <w:proofErr w:type="spellStart"/>
+            <w:r>
+              <w:rPr>
+                <w:spacing w:val="-2"/>
+                <w:lang w:val="en-US"/>
+              </w:rPr>
+              <w:t>no_urut</w:t>
             </w:r>
             <w:r>
               <w:rPr>
@@ -2671,6 +2645,8 @@
               </w:rPr>
               <w:t>_tujuh</w:t>
             </w:r>
+            <w:proofErr w:type="spellEnd"/>
+            <w:proofErr w:type="gramStart"/>
             <w:r>
               <w:rPr>
                 <w:spacing w:val="-2"/>
@@ -2682,8 +2658,23 @@
               <w:rPr>
                 <w:spacing w:val="-2"/>
               </w:rPr>
-              <w:t>……………………..</w:t>
-            </w:r>
+              <w:t>…</w:t>
+            </w:r>
+            <w:proofErr w:type="gramEnd"/>
+            <w:r>
+              <w:rPr>
+                <w:spacing w:val="-2"/>
+              </w:rPr>
+              <w:t>………………</w:t>
+            </w:r>
+            <w:proofErr w:type="gramStart"/>
+            <w:r>
+              <w:rPr>
+                <w:spacing w:val="-2"/>
+              </w:rPr>
+              <w:t>…..</w:t>
+            </w:r>
+            <w:proofErr w:type="gramEnd"/>
           </w:p>
         </w:tc>
       </w:tr>
@@ -2692,7 +2683,7 @@
       <w:pPr>
         <w:pStyle w:val="TableParagraph"/>
         <w:sectPr>
-          <w:headerReference w:type="first" r:id="rId9"/>
+          <w:headerReference w:type="first" r:id="rId8"/>
           <w:pgSz w:w="12240" w:h="20160"/>
           <w:pgMar w:top="1420" w:right="1080" w:bottom="280" w:left="1080" w:header="720" w:footer="720" w:gutter="0"/>
           <w:cols w:space="720"/>
@@ -2722,26 +2713,6 @@
         <w:lastRenderedPageBreak/>
         <w:t>DOKUMENTASI</w:t>
       </w:r>
-    </w:p>
-    <w:p>
-      <w:pPr>
-        <w:pStyle w:val="BodyText"/>
-        <w:rPr>
-          <w:rFonts w:ascii="Arial"/>
-          <w:b/>
-          <w:sz w:val="20"/>
-        </w:rPr>
-      </w:pPr>
-    </w:p>
-    <w:p>
-      <w:pPr>
-        <w:pStyle w:val="BodyText"/>
-        <w:spacing w:before="132" w:after="1"/>
-        <w:jc w:val="center"/>
-        <w:rPr>
-          <w:lang w:val="en-US"/>
-        </w:rPr>
-      </w:pPr>
     </w:p>
     <w:tbl>
       <w:tblPr>
@@ -2784,7 +2755,21 @@
               <w:rPr>
                 <w:lang w:val="en-US"/>
               </w:rPr>
-              <w:t>{{foto_dokumentasi_satu}}</w:t>
+              <w:t>{{</w:t>
+            </w:r>
+            <w:proofErr w:type="spellStart"/>
+            <w:r>
+              <w:rPr>
+                <w:lang w:val="en-US"/>
+              </w:rPr>
+              <w:t>foto_dokumentasi_satu</w:t>
+            </w:r>
+            <w:proofErr w:type="spellEnd"/>
+            <w:r>
+              <w:rPr>
+                <w:lang w:val="en-US"/>
+              </w:rPr>
+              <w:t>}}</w:t>
             </w:r>
           </w:p>
         </w:tc>
@@ -2812,7 +2797,21 @@
               <w:rPr>
                 <w:lang w:val="en-US"/>
               </w:rPr>
-              <w:t>{{foto_dokumentasi_dua}}</w:t>
+              <w:t>{{</w:t>
+            </w:r>
+            <w:proofErr w:type="spellStart"/>
+            <w:r>
+              <w:rPr>
+                <w:lang w:val="en-US"/>
+              </w:rPr>
+              <w:t>foto_dokumentasi_dua</w:t>
+            </w:r>
+            <w:proofErr w:type="spellEnd"/>
+            <w:r>
+              <w:rPr>
+                <w:lang w:val="en-US"/>
+              </w:rPr>
+              <w:t>}}</w:t>
             </w:r>
           </w:p>
         </w:tc>
@@ -2840,7 +2839,21 @@
               <w:rPr>
                 <w:lang w:val="en-US"/>
               </w:rPr>
-              <w:t>{{foto_dokumentasi_tiga}}</w:t>
+              <w:t>{{</w:t>
+            </w:r>
+            <w:proofErr w:type="spellStart"/>
+            <w:r>
+              <w:rPr>
+                <w:lang w:val="en-US"/>
+              </w:rPr>
+              <w:t>foto_dokumentasi_tiga</w:t>
+            </w:r>
+            <w:proofErr w:type="spellEnd"/>
+            <w:r>
+              <w:rPr>
+                <w:lang w:val="en-US"/>
+              </w:rPr>
+              <w:t>}}</w:t>
             </w:r>
           </w:p>
         </w:tc>
@@ -2880,7 +2893,21 @@
               <w:rPr>
                 <w:lang w:val="en-US"/>
               </w:rPr>
-              <w:t>{{foto_dokumentasi_empat}}</w:t>
+              <w:t>{{</w:t>
+            </w:r>
+            <w:proofErr w:type="spellStart"/>
+            <w:r>
+              <w:rPr>
+                <w:lang w:val="en-US"/>
+              </w:rPr>
+              <w:t>foto_dokumentasi_empat</w:t>
+            </w:r>
+            <w:proofErr w:type="spellEnd"/>
+            <w:r>
+              <w:rPr>
+                <w:lang w:val="en-US"/>
+              </w:rPr>
+              <w:t>}}</w:t>
             </w:r>
           </w:p>
         </w:tc>
@@ -2908,8 +2935,2208 @@
         </w:rPr>
       </w:pPr>
     </w:p>
+    <w:p/>
+    <w:p/>
+    <w:p/>
+    <w:p/>
+    <w:p/>
+    <w:p/>
+    <w:p/>
+    <w:p/>
+    <w:p/>
+    <w:p/>
+    <w:p/>
+    <w:p/>
+    <w:p/>
+    <w:p/>
+    <w:p/>
+    <w:p/>
+    <w:p>
+      <w:pPr>
+        <w:rPr>
+          <w:rFonts w:ascii="Arial"/>
+          <w:b/>
+          <w:sz w:val="20"/>
+        </w:rPr>
+      </w:pPr>
+    </w:p>
+    <w:p>
+      <w:pPr>
+        <w:tabs>
+          <w:tab w:val="left" w:pos="4354"/>
+        </w:tabs>
+        <w:jc w:val="center"/>
+        <w:rPr>
+          <w:sz w:val="44"/>
+          <w:szCs w:val="44"/>
+        </w:rPr>
+      </w:pPr>
+      <w:r>
+        <w:br/>
+      </w:r>
+      <w:r>
+        <w:br/>
+      </w:r>
+      <w:r>
+        <w:br/>
+      </w:r>
+      <w:r>
+        <w:br/>
+      </w:r>
+      <w:r>
+        <w:rPr>
+          <w:sz w:val="44"/>
+          <w:szCs w:val="44"/>
+        </w:rPr>
+        <w:lastRenderedPageBreak/>
+        <w:t>{{lampiran_1}}</w:t>
+      </w:r>
+    </w:p>
+    <w:p>
+      <w:pPr>
+        <w:jc w:val="center"/>
+        <w:rPr>
+          <w:sz w:val="44"/>
+          <w:szCs w:val="44"/>
+        </w:rPr>
+      </w:pPr>
+      <w:r>
+        <w:rPr>
+          <w:sz w:val="44"/>
+          <w:szCs w:val="44"/>
+        </w:rPr>
+        <w:br w:type="page"/>
+      </w:r>
+    </w:p>
+    <w:p>
+      <w:pPr>
+        <w:tabs>
+          <w:tab w:val="left" w:pos="4354"/>
+        </w:tabs>
+        <w:jc w:val="center"/>
+        <w:rPr>
+          <w:sz w:val="44"/>
+          <w:szCs w:val="44"/>
+        </w:rPr>
+      </w:pPr>
+      <w:r>
+        <w:rPr>
+          <w:sz w:val="44"/>
+          <w:szCs w:val="44"/>
+        </w:rPr>
+        <w:lastRenderedPageBreak/>
+        <w:t>{{lampiran_2}}</w:t>
+      </w:r>
+    </w:p>
+    <w:p>
+      <w:pPr>
+        <w:jc w:val="center"/>
+        <w:rPr>
+          <w:sz w:val="44"/>
+          <w:szCs w:val="44"/>
+        </w:rPr>
+      </w:pPr>
+      <w:r>
+        <w:rPr>
+          <w:sz w:val="44"/>
+          <w:szCs w:val="44"/>
+        </w:rPr>
+        <w:br w:type="page"/>
+      </w:r>
+    </w:p>
+    <w:p>
+      <w:pPr>
+        <w:tabs>
+          <w:tab w:val="left" w:pos="4354"/>
+        </w:tabs>
+        <w:jc w:val="center"/>
+        <w:rPr>
+          <w:sz w:val="44"/>
+          <w:szCs w:val="44"/>
+        </w:rPr>
+      </w:pPr>
+      <w:r>
+        <w:rPr>
+          <w:sz w:val="44"/>
+          <w:szCs w:val="44"/>
+        </w:rPr>
+        <w:lastRenderedPageBreak/>
+        <w:t>{{lampiran_3}}</w:t>
+      </w:r>
+    </w:p>
+    <w:p>
+      <w:pPr>
+        <w:jc w:val="center"/>
+        <w:rPr>
+          <w:sz w:val="44"/>
+          <w:szCs w:val="44"/>
+        </w:rPr>
+      </w:pPr>
+      <w:r>
+        <w:rPr>
+          <w:sz w:val="44"/>
+          <w:szCs w:val="44"/>
+        </w:rPr>
+        <w:br w:type="page"/>
+      </w:r>
+    </w:p>
+    <w:p>
+      <w:pPr>
+        <w:tabs>
+          <w:tab w:val="left" w:pos="4354"/>
+        </w:tabs>
+        <w:jc w:val="center"/>
+        <w:rPr>
+          <w:sz w:val="44"/>
+          <w:szCs w:val="44"/>
+        </w:rPr>
+      </w:pPr>
+      <w:r>
+        <w:rPr>
+          <w:sz w:val="44"/>
+          <w:szCs w:val="44"/>
+        </w:rPr>
+        <w:lastRenderedPageBreak/>
+        <w:t>{{lampiran_4}}</w:t>
+      </w:r>
+    </w:p>
+    <w:p>
+      <w:pPr>
+        <w:jc w:val="center"/>
+        <w:rPr>
+          <w:sz w:val="44"/>
+          <w:szCs w:val="44"/>
+        </w:rPr>
+      </w:pPr>
+      <w:r>
+        <w:rPr>
+          <w:sz w:val="44"/>
+          <w:szCs w:val="44"/>
+        </w:rPr>
+        <w:br w:type="page"/>
+      </w:r>
+    </w:p>
+    <w:p>
+      <w:pPr>
+        <w:tabs>
+          <w:tab w:val="left" w:pos="4354"/>
+        </w:tabs>
+        <w:jc w:val="center"/>
+        <w:rPr>
+          <w:sz w:val="44"/>
+          <w:szCs w:val="44"/>
+        </w:rPr>
+      </w:pPr>
+      <w:r>
+        <w:rPr>
+          <w:sz w:val="44"/>
+          <w:szCs w:val="44"/>
+        </w:rPr>
+        <w:lastRenderedPageBreak/>
+        <w:t>{{lampiran_5}}</w:t>
+      </w:r>
+    </w:p>
+    <w:p>
+      <w:pPr>
+        <w:jc w:val="center"/>
+        <w:rPr>
+          <w:sz w:val="44"/>
+          <w:szCs w:val="44"/>
+        </w:rPr>
+      </w:pPr>
+      <w:r>
+        <w:rPr>
+          <w:sz w:val="44"/>
+          <w:szCs w:val="44"/>
+        </w:rPr>
+        <w:br w:type="page"/>
+      </w:r>
+    </w:p>
+    <w:p>
+      <w:pPr>
+        <w:tabs>
+          <w:tab w:val="left" w:pos="4354"/>
+        </w:tabs>
+        <w:jc w:val="center"/>
+        <w:rPr>
+          <w:sz w:val="44"/>
+          <w:szCs w:val="44"/>
+        </w:rPr>
+      </w:pPr>
+      <w:r>
+        <w:rPr>
+          <w:sz w:val="44"/>
+          <w:szCs w:val="44"/>
+        </w:rPr>
+        <w:lastRenderedPageBreak/>
+        <w:t>{{lampiran_6}}</w:t>
+      </w:r>
+    </w:p>
+    <w:p>
+      <w:pPr>
+        <w:jc w:val="center"/>
+        <w:rPr>
+          <w:sz w:val="44"/>
+          <w:szCs w:val="44"/>
+        </w:rPr>
+      </w:pPr>
+      <w:r>
+        <w:rPr>
+          <w:sz w:val="44"/>
+          <w:szCs w:val="44"/>
+        </w:rPr>
+        <w:br w:type="page"/>
+      </w:r>
+    </w:p>
+    <w:p>
+      <w:pPr>
+        <w:tabs>
+          <w:tab w:val="left" w:pos="4354"/>
+        </w:tabs>
+        <w:jc w:val="center"/>
+        <w:rPr>
+          <w:sz w:val="44"/>
+          <w:szCs w:val="44"/>
+        </w:rPr>
+      </w:pPr>
+      <w:r>
+        <w:rPr>
+          <w:sz w:val="44"/>
+          <w:szCs w:val="44"/>
+        </w:rPr>
+        <w:lastRenderedPageBreak/>
+        <w:t>{{lampiran_7}}</w:t>
+      </w:r>
+    </w:p>
+    <w:p>
+      <w:pPr>
+        <w:jc w:val="center"/>
+        <w:rPr>
+          <w:sz w:val="44"/>
+          <w:szCs w:val="44"/>
+        </w:rPr>
+      </w:pPr>
+      <w:r>
+        <w:rPr>
+          <w:sz w:val="44"/>
+          <w:szCs w:val="44"/>
+        </w:rPr>
+        <w:br w:type="page"/>
+      </w:r>
+    </w:p>
+    <w:p>
+      <w:pPr>
+        <w:tabs>
+          <w:tab w:val="left" w:pos="4354"/>
+        </w:tabs>
+        <w:jc w:val="center"/>
+        <w:rPr>
+          <w:sz w:val="44"/>
+          <w:szCs w:val="44"/>
+        </w:rPr>
+      </w:pPr>
+      <w:r>
+        <w:rPr>
+          <w:sz w:val="44"/>
+          <w:szCs w:val="44"/>
+        </w:rPr>
+        <w:lastRenderedPageBreak/>
+        <w:t>{{lampiran_8}}</w:t>
+      </w:r>
+    </w:p>
+    <w:p>
+      <w:pPr>
+        <w:jc w:val="center"/>
+        <w:rPr>
+          <w:sz w:val="44"/>
+          <w:szCs w:val="44"/>
+        </w:rPr>
+      </w:pPr>
+      <w:r>
+        <w:rPr>
+          <w:sz w:val="44"/>
+          <w:szCs w:val="44"/>
+        </w:rPr>
+        <w:br w:type="page"/>
+      </w:r>
+    </w:p>
+    <w:p>
+      <w:pPr>
+        <w:tabs>
+          <w:tab w:val="left" w:pos="4354"/>
+        </w:tabs>
+        <w:jc w:val="center"/>
+        <w:rPr>
+          <w:sz w:val="44"/>
+          <w:szCs w:val="44"/>
+        </w:rPr>
+      </w:pPr>
+      <w:r>
+        <w:rPr>
+          <w:sz w:val="44"/>
+          <w:szCs w:val="44"/>
+        </w:rPr>
+        <w:lastRenderedPageBreak/>
+        <w:t>{{lampiran_9}}</w:t>
+      </w:r>
+    </w:p>
+    <w:p>
+      <w:pPr>
+        <w:jc w:val="center"/>
+        <w:rPr>
+          <w:sz w:val="44"/>
+          <w:szCs w:val="44"/>
+        </w:rPr>
+      </w:pPr>
+      <w:r>
+        <w:rPr>
+          <w:sz w:val="44"/>
+          <w:szCs w:val="44"/>
+        </w:rPr>
+        <w:br w:type="page"/>
+      </w:r>
+    </w:p>
+    <w:p>
+      <w:pPr>
+        <w:tabs>
+          <w:tab w:val="left" w:pos="4354"/>
+        </w:tabs>
+        <w:jc w:val="center"/>
+        <w:rPr>
+          <w:sz w:val="44"/>
+          <w:szCs w:val="44"/>
+        </w:rPr>
+      </w:pPr>
+      <w:r>
+        <w:rPr>
+          <w:sz w:val="44"/>
+          <w:szCs w:val="44"/>
+        </w:rPr>
+        <w:lastRenderedPageBreak/>
+        <w:t>{{lampiran_10}}</w:t>
+      </w:r>
+    </w:p>
+    <w:p>
+      <w:pPr>
+        <w:tabs>
+          <w:tab w:val="left" w:pos="4354"/>
+        </w:tabs>
+        <w:jc w:val="center"/>
+        <w:rPr>
+          <w:sz w:val="44"/>
+          <w:szCs w:val="44"/>
+        </w:rPr>
+      </w:pPr>
+    </w:p>
+    <w:p>
+      <w:pPr>
+        <w:jc w:val="center"/>
+        <w:rPr>
+          <w:sz w:val="44"/>
+          <w:szCs w:val="44"/>
+        </w:rPr>
+      </w:pPr>
+      <w:r>
+        <w:rPr>
+          <w:sz w:val="44"/>
+          <w:szCs w:val="44"/>
+        </w:rPr>
+        <w:br w:type="page"/>
+      </w:r>
+    </w:p>
+    <w:p>
+      <w:pPr>
+        <w:tabs>
+          <w:tab w:val="left" w:pos="4354"/>
+        </w:tabs>
+        <w:jc w:val="center"/>
+        <w:rPr>
+          <w:sz w:val="44"/>
+          <w:szCs w:val="44"/>
+        </w:rPr>
+      </w:pPr>
+      <w:r>
+        <w:rPr>
+          <w:sz w:val="44"/>
+          <w:szCs w:val="44"/>
+        </w:rPr>
+        <w:lastRenderedPageBreak/>
+        <w:t>{{lampiran_11}}</w:t>
+      </w:r>
+    </w:p>
+    <w:p>
+      <w:pPr>
+        <w:jc w:val="center"/>
+        <w:rPr>
+          <w:sz w:val="44"/>
+          <w:szCs w:val="44"/>
+        </w:rPr>
+      </w:pPr>
+      <w:r>
+        <w:rPr>
+          <w:sz w:val="44"/>
+          <w:szCs w:val="44"/>
+        </w:rPr>
+        <w:br w:type="page"/>
+      </w:r>
+    </w:p>
+    <w:p>
+      <w:pPr>
+        <w:tabs>
+          <w:tab w:val="left" w:pos="4354"/>
+        </w:tabs>
+        <w:jc w:val="center"/>
+        <w:rPr>
+          <w:sz w:val="44"/>
+          <w:szCs w:val="44"/>
+        </w:rPr>
+      </w:pPr>
+      <w:r>
+        <w:rPr>
+          <w:sz w:val="44"/>
+          <w:szCs w:val="44"/>
+        </w:rPr>
+        <w:lastRenderedPageBreak/>
+        <w:t>{{lampiran_12}}</w:t>
+      </w:r>
+    </w:p>
+    <w:p>
+      <w:pPr>
+        <w:jc w:val="center"/>
+        <w:rPr>
+          <w:sz w:val="44"/>
+          <w:szCs w:val="44"/>
+        </w:rPr>
+      </w:pPr>
+      <w:r>
+        <w:rPr>
+          <w:sz w:val="44"/>
+          <w:szCs w:val="44"/>
+        </w:rPr>
+        <w:br w:type="page"/>
+      </w:r>
+    </w:p>
+    <w:p>
+      <w:pPr>
+        <w:tabs>
+          <w:tab w:val="left" w:pos="4354"/>
+        </w:tabs>
+        <w:jc w:val="center"/>
+        <w:rPr>
+          <w:sz w:val="44"/>
+          <w:szCs w:val="44"/>
+        </w:rPr>
+      </w:pPr>
+      <w:r>
+        <w:rPr>
+          <w:sz w:val="44"/>
+          <w:szCs w:val="44"/>
+        </w:rPr>
+        <w:lastRenderedPageBreak/>
+        <w:t>{{lampiran_13}}</w:t>
+      </w:r>
+    </w:p>
+    <w:p>
+      <w:pPr>
+        <w:jc w:val="center"/>
+        <w:rPr>
+          <w:sz w:val="44"/>
+          <w:szCs w:val="44"/>
+        </w:rPr>
+      </w:pPr>
+      <w:r>
+        <w:rPr>
+          <w:sz w:val="44"/>
+          <w:szCs w:val="44"/>
+        </w:rPr>
+        <w:br w:type="page"/>
+      </w:r>
+    </w:p>
+    <w:p>
+      <w:pPr>
+        <w:tabs>
+          <w:tab w:val="left" w:pos="4354"/>
+        </w:tabs>
+        <w:jc w:val="center"/>
+        <w:rPr>
+          <w:sz w:val="44"/>
+          <w:szCs w:val="44"/>
+        </w:rPr>
+      </w:pPr>
+      <w:r>
+        <w:rPr>
+          <w:sz w:val="44"/>
+          <w:szCs w:val="44"/>
+        </w:rPr>
+        <w:lastRenderedPageBreak/>
+        <w:t>{{lampiran_14}}</w:t>
+      </w:r>
+    </w:p>
+    <w:p>
+      <w:pPr>
+        <w:jc w:val="center"/>
+        <w:rPr>
+          <w:sz w:val="44"/>
+          <w:szCs w:val="44"/>
+        </w:rPr>
+      </w:pPr>
+      <w:r>
+        <w:rPr>
+          <w:sz w:val="44"/>
+          <w:szCs w:val="44"/>
+        </w:rPr>
+        <w:br w:type="page"/>
+      </w:r>
+    </w:p>
+    <w:p>
+      <w:pPr>
+        <w:tabs>
+          <w:tab w:val="left" w:pos="4354"/>
+        </w:tabs>
+        <w:jc w:val="center"/>
+        <w:rPr>
+          <w:sz w:val="44"/>
+          <w:szCs w:val="44"/>
+        </w:rPr>
+      </w:pPr>
+      <w:r>
+        <w:rPr>
+          <w:sz w:val="44"/>
+          <w:szCs w:val="44"/>
+        </w:rPr>
+        <w:lastRenderedPageBreak/>
+        <w:t>{{lampiran_15}}</w:t>
+      </w:r>
+    </w:p>
+    <w:p>
+      <w:pPr>
+        <w:jc w:val="center"/>
+        <w:rPr>
+          <w:sz w:val="44"/>
+          <w:szCs w:val="44"/>
+        </w:rPr>
+      </w:pPr>
+      <w:r>
+        <w:rPr>
+          <w:sz w:val="44"/>
+          <w:szCs w:val="44"/>
+        </w:rPr>
+        <w:br w:type="page"/>
+      </w:r>
+    </w:p>
+    <w:p>
+      <w:pPr>
+        <w:tabs>
+          <w:tab w:val="left" w:pos="4354"/>
+        </w:tabs>
+        <w:jc w:val="center"/>
+        <w:rPr>
+          <w:sz w:val="44"/>
+          <w:szCs w:val="44"/>
+        </w:rPr>
+      </w:pPr>
+      <w:r>
+        <w:rPr>
+          <w:sz w:val="44"/>
+          <w:szCs w:val="44"/>
+        </w:rPr>
+        <w:lastRenderedPageBreak/>
+        <w:t>{{lampiran_16}}</w:t>
+      </w:r>
+    </w:p>
+    <w:p>
+      <w:pPr>
+        <w:jc w:val="center"/>
+        <w:rPr>
+          <w:sz w:val="44"/>
+          <w:szCs w:val="44"/>
+        </w:rPr>
+      </w:pPr>
+      <w:r>
+        <w:rPr>
+          <w:sz w:val="44"/>
+          <w:szCs w:val="44"/>
+        </w:rPr>
+        <w:br w:type="page"/>
+      </w:r>
+    </w:p>
+    <w:p>
+      <w:pPr>
+        <w:tabs>
+          <w:tab w:val="left" w:pos="4354"/>
+        </w:tabs>
+        <w:jc w:val="center"/>
+        <w:rPr>
+          <w:sz w:val="44"/>
+          <w:szCs w:val="44"/>
+        </w:rPr>
+      </w:pPr>
+      <w:r>
+        <w:rPr>
+          <w:sz w:val="44"/>
+          <w:szCs w:val="44"/>
+        </w:rPr>
+        <w:lastRenderedPageBreak/>
+        <w:t>{{lampiran_17}}</w:t>
+      </w:r>
+    </w:p>
+    <w:p>
+      <w:pPr>
+        <w:jc w:val="center"/>
+        <w:rPr>
+          <w:sz w:val="44"/>
+          <w:szCs w:val="44"/>
+        </w:rPr>
+      </w:pPr>
+      <w:r>
+        <w:rPr>
+          <w:sz w:val="44"/>
+          <w:szCs w:val="44"/>
+        </w:rPr>
+        <w:br w:type="page"/>
+      </w:r>
+    </w:p>
+    <w:p>
+      <w:pPr>
+        <w:tabs>
+          <w:tab w:val="left" w:pos="4354"/>
+        </w:tabs>
+        <w:jc w:val="center"/>
+        <w:rPr>
+          <w:sz w:val="44"/>
+          <w:szCs w:val="44"/>
+        </w:rPr>
+      </w:pPr>
+      <w:r>
+        <w:rPr>
+          <w:sz w:val="44"/>
+          <w:szCs w:val="44"/>
+        </w:rPr>
+        <w:lastRenderedPageBreak/>
+        <w:t>{{lampiran_18}}</w:t>
+      </w:r>
+    </w:p>
+    <w:p>
+      <w:pPr>
+        <w:jc w:val="center"/>
+        <w:rPr>
+          <w:sz w:val="44"/>
+          <w:szCs w:val="44"/>
+        </w:rPr>
+      </w:pPr>
+      <w:r>
+        <w:rPr>
+          <w:sz w:val="44"/>
+          <w:szCs w:val="44"/>
+        </w:rPr>
+        <w:br w:type="page"/>
+      </w:r>
+    </w:p>
+    <w:p>
+      <w:pPr>
+        <w:tabs>
+          <w:tab w:val="left" w:pos="4354"/>
+        </w:tabs>
+        <w:jc w:val="center"/>
+        <w:rPr>
+          <w:sz w:val="44"/>
+          <w:szCs w:val="44"/>
+        </w:rPr>
+      </w:pPr>
+      <w:r>
+        <w:rPr>
+          <w:sz w:val="44"/>
+          <w:szCs w:val="44"/>
+        </w:rPr>
+        <w:lastRenderedPageBreak/>
+        <w:t>{{lampiran_19}}</w:t>
+      </w:r>
+    </w:p>
+    <w:p>
+      <w:pPr>
+        <w:jc w:val="center"/>
+        <w:rPr>
+          <w:sz w:val="44"/>
+          <w:szCs w:val="44"/>
+        </w:rPr>
+      </w:pPr>
+      <w:r>
+        <w:rPr>
+          <w:sz w:val="44"/>
+          <w:szCs w:val="44"/>
+        </w:rPr>
+        <w:br w:type="page"/>
+      </w:r>
+    </w:p>
+    <w:p>
+      <w:pPr>
+        <w:tabs>
+          <w:tab w:val="left" w:pos="4354"/>
+        </w:tabs>
+        <w:jc w:val="center"/>
+        <w:rPr>
+          <w:sz w:val="44"/>
+          <w:szCs w:val="44"/>
+        </w:rPr>
+      </w:pPr>
+      <w:r>
+        <w:rPr>
+          <w:sz w:val="44"/>
+          <w:szCs w:val="44"/>
+        </w:rPr>
+        <w:lastRenderedPageBreak/>
+        <w:t>{{lampiran_20}}</w:t>
+      </w:r>
+    </w:p>
+    <w:p>
+      <w:pPr>
+        <w:jc w:val="center"/>
+        <w:rPr>
+          <w:sz w:val="44"/>
+          <w:szCs w:val="44"/>
+        </w:rPr>
+      </w:pPr>
+      <w:r>
+        <w:rPr>
+          <w:sz w:val="44"/>
+          <w:szCs w:val="44"/>
+        </w:rPr>
+        <w:br w:type="page"/>
+      </w:r>
+    </w:p>
+    <w:p>
+      <w:pPr>
+        <w:tabs>
+          <w:tab w:val="left" w:pos="4354"/>
+        </w:tabs>
+        <w:jc w:val="center"/>
+        <w:rPr>
+          <w:sz w:val="44"/>
+          <w:szCs w:val="44"/>
+        </w:rPr>
+      </w:pPr>
+      <w:r>
+        <w:rPr>
+          <w:sz w:val="44"/>
+          <w:szCs w:val="44"/>
+        </w:rPr>
+        <w:lastRenderedPageBreak/>
+        <w:t>{{lampiran_21}}</w:t>
+      </w:r>
+    </w:p>
+    <w:p>
+      <w:pPr>
+        <w:jc w:val="center"/>
+        <w:rPr>
+          <w:sz w:val="44"/>
+          <w:szCs w:val="44"/>
+        </w:rPr>
+      </w:pPr>
+      <w:r>
+        <w:rPr>
+          <w:sz w:val="44"/>
+          <w:szCs w:val="44"/>
+        </w:rPr>
+        <w:br w:type="page"/>
+      </w:r>
+    </w:p>
+    <w:p>
+      <w:pPr>
+        <w:tabs>
+          <w:tab w:val="left" w:pos="4354"/>
+        </w:tabs>
+        <w:jc w:val="center"/>
+        <w:rPr>
+          <w:sz w:val="44"/>
+          <w:szCs w:val="44"/>
+        </w:rPr>
+      </w:pPr>
+      <w:r>
+        <w:rPr>
+          <w:sz w:val="44"/>
+          <w:szCs w:val="44"/>
+        </w:rPr>
+        <w:lastRenderedPageBreak/>
+        <w:t>{{lampiran_22}}</w:t>
+      </w:r>
+    </w:p>
+    <w:p>
+      <w:pPr>
+        <w:jc w:val="center"/>
+        <w:rPr>
+          <w:sz w:val="44"/>
+          <w:szCs w:val="44"/>
+        </w:rPr>
+      </w:pPr>
+      <w:r>
+        <w:rPr>
+          <w:sz w:val="44"/>
+          <w:szCs w:val="44"/>
+        </w:rPr>
+        <w:br w:type="page"/>
+      </w:r>
+    </w:p>
+    <w:p>
+      <w:pPr>
+        <w:tabs>
+          <w:tab w:val="left" w:pos="4354"/>
+        </w:tabs>
+        <w:jc w:val="center"/>
+        <w:rPr>
+          <w:sz w:val="44"/>
+          <w:szCs w:val="44"/>
+        </w:rPr>
+      </w:pPr>
+      <w:r>
+        <w:rPr>
+          <w:sz w:val="44"/>
+          <w:szCs w:val="44"/>
+        </w:rPr>
+        <w:lastRenderedPageBreak/>
+        <w:t>{{lampiran_23}}</w:t>
+      </w:r>
+    </w:p>
+    <w:p>
+      <w:pPr>
+        <w:jc w:val="center"/>
+        <w:rPr>
+          <w:sz w:val="44"/>
+          <w:szCs w:val="44"/>
+        </w:rPr>
+      </w:pPr>
+      <w:r>
+        <w:rPr>
+          <w:sz w:val="44"/>
+          <w:szCs w:val="44"/>
+        </w:rPr>
+        <w:br w:type="page"/>
+      </w:r>
+    </w:p>
+    <w:p>
+      <w:pPr>
+        <w:tabs>
+          <w:tab w:val="left" w:pos="4354"/>
+        </w:tabs>
+        <w:jc w:val="center"/>
+        <w:rPr>
+          <w:sz w:val="44"/>
+          <w:szCs w:val="44"/>
+        </w:rPr>
+      </w:pPr>
+      <w:r>
+        <w:rPr>
+          <w:sz w:val="44"/>
+          <w:szCs w:val="44"/>
+        </w:rPr>
+        <w:lastRenderedPageBreak/>
+        <w:t>{{lampiran_24}}</w:t>
+      </w:r>
+    </w:p>
+    <w:p>
+      <w:pPr>
+        <w:jc w:val="center"/>
+        <w:rPr>
+          <w:sz w:val="44"/>
+          <w:szCs w:val="44"/>
+        </w:rPr>
+      </w:pPr>
+      <w:r>
+        <w:rPr>
+          <w:sz w:val="44"/>
+          <w:szCs w:val="44"/>
+        </w:rPr>
+        <w:br w:type="page"/>
+      </w:r>
+    </w:p>
+    <w:p>
+      <w:pPr>
+        <w:tabs>
+          <w:tab w:val="left" w:pos="4354"/>
+        </w:tabs>
+        <w:jc w:val="center"/>
+        <w:rPr>
+          <w:sz w:val="44"/>
+          <w:szCs w:val="44"/>
+        </w:rPr>
+      </w:pPr>
+      <w:r>
+        <w:rPr>
+          <w:sz w:val="44"/>
+          <w:szCs w:val="44"/>
+        </w:rPr>
+        <w:lastRenderedPageBreak/>
+        <w:t>{{lampiran_25}}</w:t>
+      </w:r>
+    </w:p>
+    <w:p>
+      <w:pPr>
+        <w:jc w:val="center"/>
+        <w:rPr>
+          <w:sz w:val="44"/>
+          <w:szCs w:val="44"/>
+        </w:rPr>
+      </w:pPr>
+      <w:r>
+        <w:rPr>
+          <w:sz w:val="44"/>
+          <w:szCs w:val="44"/>
+        </w:rPr>
+        <w:br w:type="page"/>
+      </w:r>
+    </w:p>
+    <w:p>
+      <w:pPr>
+        <w:tabs>
+          <w:tab w:val="left" w:pos="4354"/>
+        </w:tabs>
+        <w:jc w:val="center"/>
+        <w:rPr>
+          <w:sz w:val="44"/>
+          <w:szCs w:val="44"/>
+        </w:rPr>
+      </w:pPr>
+      <w:r>
+        <w:rPr>
+          <w:sz w:val="44"/>
+          <w:szCs w:val="44"/>
+        </w:rPr>
+        <w:lastRenderedPageBreak/>
+        <w:t>{{lampiran_26}}</w:t>
+      </w:r>
+    </w:p>
+    <w:p>
+      <w:pPr>
+        <w:jc w:val="center"/>
+        <w:rPr>
+          <w:sz w:val="44"/>
+          <w:szCs w:val="44"/>
+        </w:rPr>
+      </w:pPr>
+      <w:r>
+        <w:rPr>
+          <w:sz w:val="44"/>
+          <w:szCs w:val="44"/>
+        </w:rPr>
+        <w:br w:type="page"/>
+      </w:r>
+    </w:p>
+    <w:p>
+      <w:pPr>
+        <w:tabs>
+          <w:tab w:val="left" w:pos="4354"/>
+        </w:tabs>
+        <w:jc w:val="center"/>
+        <w:rPr>
+          <w:sz w:val="44"/>
+          <w:szCs w:val="44"/>
+        </w:rPr>
+      </w:pPr>
+      <w:r>
+        <w:rPr>
+          <w:sz w:val="44"/>
+          <w:szCs w:val="44"/>
+        </w:rPr>
+        <w:lastRenderedPageBreak/>
+        <w:t>{{lampiran_27}}</w:t>
+      </w:r>
+    </w:p>
+    <w:p>
+      <w:pPr>
+        <w:jc w:val="center"/>
+        <w:rPr>
+          <w:sz w:val="44"/>
+          <w:szCs w:val="44"/>
+        </w:rPr>
+      </w:pPr>
+      <w:r>
+        <w:rPr>
+          <w:sz w:val="44"/>
+          <w:szCs w:val="44"/>
+        </w:rPr>
+        <w:br w:type="page"/>
+      </w:r>
+    </w:p>
+    <w:p>
+      <w:pPr>
+        <w:tabs>
+          <w:tab w:val="left" w:pos="4354"/>
+        </w:tabs>
+        <w:jc w:val="center"/>
+        <w:rPr>
+          <w:sz w:val="44"/>
+          <w:szCs w:val="44"/>
+        </w:rPr>
+      </w:pPr>
+      <w:r>
+        <w:rPr>
+          <w:sz w:val="44"/>
+          <w:szCs w:val="44"/>
+        </w:rPr>
+        <w:lastRenderedPageBreak/>
+        <w:t>{{lampiran_28}}</w:t>
+      </w:r>
+    </w:p>
+    <w:p>
+      <w:pPr>
+        <w:jc w:val="center"/>
+        <w:rPr>
+          <w:sz w:val="44"/>
+          <w:szCs w:val="44"/>
+        </w:rPr>
+      </w:pPr>
+      <w:r>
+        <w:rPr>
+          <w:sz w:val="44"/>
+          <w:szCs w:val="44"/>
+        </w:rPr>
+        <w:br w:type="page"/>
+      </w:r>
+    </w:p>
+    <w:p>
+      <w:pPr>
+        <w:tabs>
+          <w:tab w:val="left" w:pos="4354"/>
+        </w:tabs>
+        <w:jc w:val="center"/>
+        <w:rPr>
+          <w:sz w:val="44"/>
+          <w:szCs w:val="44"/>
+        </w:rPr>
+      </w:pPr>
+      <w:r>
+        <w:rPr>
+          <w:sz w:val="44"/>
+          <w:szCs w:val="44"/>
+        </w:rPr>
+        <w:lastRenderedPageBreak/>
+        <w:t>{{lampiran_29}}</w:t>
+      </w:r>
+    </w:p>
+    <w:p>
+      <w:pPr>
+        <w:jc w:val="center"/>
+        <w:rPr>
+          <w:sz w:val="44"/>
+          <w:szCs w:val="44"/>
+        </w:rPr>
+      </w:pPr>
+      <w:r>
+        <w:rPr>
+          <w:sz w:val="44"/>
+          <w:szCs w:val="44"/>
+        </w:rPr>
+        <w:br w:type="page"/>
+      </w:r>
+    </w:p>
+    <w:p>
+      <w:pPr>
+        <w:tabs>
+          <w:tab w:val="left" w:pos="4354"/>
+        </w:tabs>
+        <w:jc w:val="center"/>
+        <w:rPr>
+          <w:sz w:val="44"/>
+          <w:szCs w:val="44"/>
+        </w:rPr>
+      </w:pPr>
+      <w:r>
+        <w:rPr>
+          <w:sz w:val="44"/>
+          <w:szCs w:val="44"/>
+        </w:rPr>
+        <w:lastRenderedPageBreak/>
+        <w:t>{{lampiran_30}}</w:t>
+      </w:r>
+    </w:p>
+    <w:p>
+      <w:pPr>
+        <w:jc w:val="center"/>
+        <w:rPr>
+          <w:sz w:val="44"/>
+          <w:szCs w:val="44"/>
+        </w:rPr>
+      </w:pPr>
+      <w:r>
+        <w:rPr>
+          <w:sz w:val="44"/>
+          <w:szCs w:val="44"/>
+        </w:rPr>
+        <w:br w:type="page"/>
+      </w:r>
+    </w:p>
+    <w:p>
+      <w:pPr>
+        <w:tabs>
+          <w:tab w:val="left" w:pos="4354"/>
+        </w:tabs>
+        <w:jc w:val="center"/>
+        <w:rPr>
+          <w:sz w:val="44"/>
+          <w:szCs w:val="44"/>
+        </w:rPr>
+      </w:pPr>
+      <w:r>
+        <w:rPr>
+          <w:sz w:val="44"/>
+          <w:szCs w:val="44"/>
+        </w:rPr>
+        <w:lastRenderedPageBreak/>
+        <w:t>{{lampiran_31}}</w:t>
+      </w:r>
+    </w:p>
+    <w:p>
+      <w:pPr>
+        <w:jc w:val="center"/>
+        <w:rPr>
+          <w:sz w:val="44"/>
+          <w:szCs w:val="44"/>
+        </w:rPr>
+      </w:pPr>
+      <w:r>
+        <w:rPr>
+          <w:sz w:val="44"/>
+          <w:szCs w:val="44"/>
+        </w:rPr>
+        <w:br w:type="page"/>
+      </w:r>
+    </w:p>
+    <w:p>
+      <w:pPr>
+        <w:tabs>
+          <w:tab w:val="left" w:pos="4354"/>
+        </w:tabs>
+        <w:jc w:val="center"/>
+        <w:rPr>
+          <w:sz w:val="44"/>
+          <w:szCs w:val="44"/>
+        </w:rPr>
+      </w:pPr>
+      <w:r>
+        <w:rPr>
+          <w:sz w:val="44"/>
+          <w:szCs w:val="44"/>
+        </w:rPr>
+        <w:lastRenderedPageBreak/>
+        <w:t>{{lampiran_32}}</w:t>
+      </w:r>
+    </w:p>
+    <w:p>
+      <w:pPr>
+        <w:jc w:val="center"/>
+        <w:rPr>
+          <w:sz w:val="44"/>
+          <w:szCs w:val="44"/>
+        </w:rPr>
+      </w:pPr>
+      <w:r>
+        <w:rPr>
+          <w:sz w:val="44"/>
+          <w:szCs w:val="44"/>
+        </w:rPr>
+        <w:br w:type="page"/>
+      </w:r>
+    </w:p>
+    <w:p>
+      <w:pPr>
+        <w:tabs>
+          <w:tab w:val="left" w:pos="4354"/>
+        </w:tabs>
+        <w:jc w:val="center"/>
+        <w:rPr>
+          <w:sz w:val="44"/>
+          <w:szCs w:val="44"/>
+        </w:rPr>
+      </w:pPr>
+      <w:r>
+        <w:rPr>
+          <w:sz w:val="44"/>
+          <w:szCs w:val="44"/>
+        </w:rPr>
+        <w:lastRenderedPageBreak/>
+        <w:t>{{lampiran_33}}</w:t>
+      </w:r>
+    </w:p>
+    <w:p>
+      <w:pPr>
+        <w:jc w:val="center"/>
+        <w:rPr>
+          <w:sz w:val="44"/>
+          <w:szCs w:val="44"/>
+        </w:rPr>
+      </w:pPr>
+      <w:r>
+        <w:rPr>
+          <w:sz w:val="44"/>
+          <w:szCs w:val="44"/>
+        </w:rPr>
+        <w:br w:type="page"/>
+      </w:r>
+    </w:p>
+    <w:p>
+      <w:pPr>
+        <w:tabs>
+          <w:tab w:val="left" w:pos="4354"/>
+        </w:tabs>
+        <w:jc w:val="center"/>
+        <w:rPr>
+          <w:sz w:val="44"/>
+          <w:szCs w:val="44"/>
+        </w:rPr>
+      </w:pPr>
+      <w:r>
+        <w:rPr>
+          <w:sz w:val="44"/>
+          <w:szCs w:val="44"/>
+        </w:rPr>
+        <w:lastRenderedPageBreak/>
+        <w:t>{{lampiran_34}}</w:t>
+      </w:r>
+    </w:p>
+    <w:p>
+      <w:pPr>
+        <w:jc w:val="center"/>
+        <w:rPr>
+          <w:sz w:val="44"/>
+          <w:szCs w:val="44"/>
+        </w:rPr>
+      </w:pPr>
+      <w:r>
+        <w:rPr>
+          <w:sz w:val="44"/>
+          <w:szCs w:val="44"/>
+        </w:rPr>
+        <w:br w:type="page"/>
+      </w:r>
+    </w:p>
+    <w:p>
+      <w:pPr>
+        <w:tabs>
+          <w:tab w:val="left" w:pos="4354"/>
+        </w:tabs>
+        <w:jc w:val="center"/>
+        <w:rPr>
+          <w:sz w:val="44"/>
+          <w:szCs w:val="44"/>
+        </w:rPr>
+      </w:pPr>
+      <w:r>
+        <w:rPr>
+          <w:sz w:val="44"/>
+          <w:szCs w:val="44"/>
+        </w:rPr>
+        <w:lastRenderedPageBreak/>
+        <w:t>{{lampiran_35}}</w:t>
+      </w:r>
+    </w:p>
+    <w:p>
+      <w:pPr>
+        <w:jc w:val="center"/>
+        <w:rPr>
+          <w:sz w:val="44"/>
+          <w:szCs w:val="44"/>
+        </w:rPr>
+      </w:pPr>
+      <w:r>
+        <w:rPr>
+          <w:sz w:val="44"/>
+          <w:szCs w:val="44"/>
+        </w:rPr>
+        <w:br w:type="page"/>
+      </w:r>
+    </w:p>
+    <w:p>
+      <w:pPr>
+        <w:tabs>
+          <w:tab w:val="left" w:pos="4354"/>
+        </w:tabs>
+        <w:jc w:val="center"/>
+        <w:rPr>
+          <w:sz w:val="44"/>
+          <w:szCs w:val="44"/>
+        </w:rPr>
+      </w:pPr>
+      <w:r>
+        <w:rPr>
+          <w:sz w:val="44"/>
+          <w:szCs w:val="44"/>
+        </w:rPr>
+        <w:lastRenderedPageBreak/>
+        <w:t>{{lampiran_36}}</w:t>
+      </w:r>
+    </w:p>
+    <w:p>
+      <w:pPr>
+        <w:jc w:val="center"/>
+        <w:rPr>
+          <w:sz w:val="44"/>
+          <w:szCs w:val="44"/>
+        </w:rPr>
+      </w:pPr>
+      <w:r>
+        <w:rPr>
+          <w:sz w:val="44"/>
+          <w:szCs w:val="44"/>
+        </w:rPr>
+        <w:br w:type="page"/>
+      </w:r>
+    </w:p>
+    <w:p>
+      <w:pPr>
+        <w:tabs>
+          <w:tab w:val="left" w:pos="4354"/>
+        </w:tabs>
+        <w:jc w:val="center"/>
+        <w:rPr>
+          <w:sz w:val="44"/>
+          <w:szCs w:val="44"/>
+        </w:rPr>
+      </w:pPr>
+      <w:r>
+        <w:rPr>
+          <w:sz w:val="44"/>
+          <w:szCs w:val="44"/>
+        </w:rPr>
+        <w:lastRenderedPageBreak/>
+        <w:t>{{lampiran_37}}</w:t>
+      </w:r>
+    </w:p>
+    <w:p>
+      <w:pPr>
+        <w:jc w:val="center"/>
+        <w:rPr>
+          <w:sz w:val="44"/>
+          <w:szCs w:val="44"/>
+        </w:rPr>
+      </w:pPr>
+      <w:r>
+        <w:rPr>
+          <w:sz w:val="44"/>
+          <w:szCs w:val="44"/>
+        </w:rPr>
+        <w:br w:type="page"/>
+      </w:r>
+    </w:p>
+    <w:p>
+      <w:pPr>
+        <w:tabs>
+          <w:tab w:val="left" w:pos="4354"/>
+        </w:tabs>
+        <w:jc w:val="center"/>
+        <w:rPr>
+          <w:sz w:val="44"/>
+          <w:szCs w:val="44"/>
+        </w:rPr>
+      </w:pPr>
+      <w:r>
+        <w:rPr>
+          <w:sz w:val="44"/>
+          <w:szCs w:val="44"/>
+        </w:rPr>
+        <w:lastRenderedPageBreak/>
+        <w:t>{{lampiran_38}}</w:t>
+      </w:r>
+    </w:p>
+    <w:p>
+      <w:pPr>
+        <w:jc w:val="center"/>
+        <w:rPr>
+          <w:sz w:val="44"/>
+          <w:szCs w:val="44"/>
+        </w:rPr>
+      </w:pPr>
+      <w:r>
+        <w:rPr>
+          <w:sz w:val="44"/>
+          <w:szCs w:val="44"/>
+        </w:rPr>
+        <w:br w:type="page"/>
+      </w:r>
+    </w:p>
+    <w:p>
+      <w:pPr>
+        <w:tabs>
+          <w:tab w:val="left" w:pos="4354"/>
+        </w:tabs>
+        <w:jc w:val="center"/>
+        <w:rPr>
+          <w:sz w:val="44"/>
+          <w:szCs w:val="44"/>
+        </w:rPr>
+      </w:pPr>
+      <w:r>
+        <w:rPr>
+          <w:sz w:val="44"/>
+          <w:szCs w:val="44"/>
+        </w:rPr>
+        <w:lastRenderedPageBreak/>
+        <w:t>{{lampiran_39}}</w:t>
+      </w:r>
+    </w:p>
+    <w:p>
+      <w:pPr>
+        <w:jc w:val="center"/>
+        <w:rPr>
+          <w:sz w:val="44"/>
+          <w:szCs w:val="44"/>
+        </w:rPr>
+      </w:pPr>
+      <w:r>
+        <w:rPr>
+          <w:sz w:val="44"/>
+          <w:szCs w:val="44"/>
+        </w:rPr>
+        <w:br w:type="page"/>
+      </w:r>
+    </w:p>
+    <w:p>
+      <w:pPr>
+        <w:tabs>
+          <w:tab w:val="left" w:pos="4354"/>
+        </w:tabs>
+        <w:jc w:val="center"/>
+        <w:rPr>
+          <w:sz w:val="44"/>
+          <w:szCs w:val="44"/>
+        </w:rPr>
+      </w:pPr>
+      <w:r>
+        <w:rPr>
+          <w:sz w:val="44"/>
+          <w:szCs w:val="44"/>
+        </w:rPr>
+        <w:lastRenderedPageBreak/>
+        <w:t>{{lampiran_40}}</w:t>
+      </w:r>
+    </w:p>
+    <w:p>
+      <w:pPr>
+        <w:jc w:val="center"/>
+        <w:rPr>
+          <w:sz w:val="44"/>
+          <w:szCs w:val="44"/>
+        </w:rPr>
+      </w:pPr>
+      <w:r>
+        <w:rPr>
+          <w:sz w:val="44"/>
+          <w:szCs w:val="44"/>
+        </w:rPr>
+        <w:br w:type="page"/>
+      </w:r>
+    </w:p>
+    <w:p>
+      <w:pPr>
+        <w:tabs>
+          <w:tab w:val="left" w:pos="4354"/>
+        </w:tabs>
+        <w:jc w:val="center"/>
+        <w:rPr>
+          <w:sz w:val="44"/>
+          <w:szCs w:val="44"/>
+        </w:rPr>
+      </w:pPr>
+      <w:r>
+        <w:rPr>
+          <w:sz w:val="44"/>
+          <w:szCs w:val="44"/>
+        </w:rPr>
+        <w:lastRenderedPageBreak/>
+        <w:t>{{lampiran_41}}</w:t>
+      </w:r>
+    </w:p>
+    <w:p>
+      <w:pPr>
+        <w:jc w:val="center"/>
+        <w:rPr>
+          <w:sz w:val="44"/>
+          <w:szCs w:val="44"/>
+        </w:rPr>
+      </w:pPr>
+      <w:r>
+        <w:rPr>
+          <w:sz w:val="44"/>
+          <w:szCs w:val="44"/>
+        </w:rPr>
+        <w:br w:type="page"/>
+      </w:r>
+    </w:p>
+    <w:p>
+      <w:pPr>
+        <w:tabs>
+          <w:tab w:val="left" w:pos="4354"/>
+        </w:tabs>
+        <w:jc w:val="center"/>
+        <w:rPr>
+          <w:sz w:val="44"/>
+          <w:szCs w:val="44"/>
+        </w:rPr>
+      </w:pPr>
+      <w:r>
+        <w:rPr>
+          <w:sz w:val="44"/>
+          <w:szCs w:val="44"/>
+        </w:rPr>
+        <w:lastRenderedPageBreak/>
+        <w:t>{{lampiran_42}}</w:t>
+      </w:r>
+    </w:p>
+    <w:p>
+      <w:pPr>
+        <w:jc w:val="center"/>
+        <w:rPr>
+          <w:sz w:val="44"/>
+          <w:szCs w:val="44"/>
+        </w:rPr>
+      </w:pPr>
+      <w:r>
+        <w:rPr>
+          <w:sz w:val="44"/>
+          <w:szCs w:val="44"/>
+        </w:rPr>
+        <w:br w:type="page"/>
+      </w:r>
+    </w:p>
+    <w:p>
+      <w:pPr>
+        <w:tabs>
+          <w:tab w:val="left" w:pos="4354"/>
+        </w:tabs>
+        <w:jc w:val="center"/>
+        <w:rPr>
+          <w:sz w:val="44"/>
+          <w:szCs w:val="44"/>
+        </w:rPr>
+      </w:pPr>
+      <w:r>
+        <w:rPr>
+          <w:sz w:val="44"/>
+          <w:szCs w:val="44"/>
+        </w:rPr>
+        <w:lastRenderedPageBreak/>
+        <w:t>{{lampiran_43}}</w:t>
+      </w:r>
+    </w:p>
+    <w:p>
+      <w:pPr>
+        <w:jc w:val="center"/>
+        <w:rPr>
+          <w:sz w:val="44"/>
+          <w:szCs w:val="44"/>
+        </w:rPr>
+      </w:pPr>
+      <w:r>
+        <w:rPr>
+          <w:sz w:val="44"/>
+          <w:szCs w:val="44"/>
+        </w:rPr>
+        <w:br w:type="page"/>
+      </w:r>
+    </w:p>
+    <w:p>
+      <w:pPr>
+        <w:tabs>
+          <w:tab w:val="left" w:pos="4354"/>
+        </w:tabs>
+        <w:jc w:val="center"/>
+        <w:rPr>
+          <w:sz w:val="44"/>
+          <w:szCs w:val="44"/>
+        </w:rPr>
+      </w:pPr>
+      <w:r>
+        <w:rPr>
+          <w:sz w:val="44"/>
+          <w:szCs w:val="44"/>
+        </w:rPr>
+        <w:lastRenderedPageBreak/>
+        <w:t>{{lampiran_44}}</w:t>
+      </w:r>
+    </w:p>
+    <w:p>
+      <w:pPr>
+        <w:jc w:val="center"/>
+        <w:rPr>
+          <w:sz w:val="44"/>
+          <w:szCs w:val="44"/>
+        </w:rPr>
+      </w:pPr>
+      <w:r>
+        <w:rPr>
+          <w:sz w:val="44"/>
+          <w:szCs w:val="44"/>
+        </w:rPr>
+        <w:br w:type="page"/>
+      </w:r>
+    </w:p>
+    <w:p>
+      <w:pPr>
+        <w:tabs>
+          <w:tab w:val="left" w:pos="4354"/>
+        </w:tabs>
+        <w:jc w:val="center"/>
+        <w:rPr>
+          <w:sz w:val="44"/>
+          <w:szCs w:val="44"/>
+        </w:rPr>
+      </w:pPr>
+      <w:r>
+        <w:rPr>
+          <w:sz w:val="44"/>
+          <w:szCs w:val="44"/>
+        </w:rPr>
+        <w:lastRenderedPageBreak/>
+        <w:t>{{lampiran_45}}</w:t>
+      </w:r>
+    </w:p>
+    <w:p>
+      <w:pPr>
+        <w:jc w:val="center"/>
+        <w:rPr>
+          <w:sz w:val="44"/>
+          <w:szCs w:val="44"/>
+        </w:rPr>
+      </w:pPr>
+      <w:r>
+        <w:rPr>
+          <w:sz w:val="44"/>
+          <w:szCs w:val="44"/>
+        </w:rPr>
+        <w:br w:type="page"/>
+      </w:r>
+    </w:p>
+    <w:p>
+      <w:pPr>
+        <w:tabs>
+          <w:tab w:val="left" w:pos="4354"/>
+        </w:tabs>
+        <w:jc w:val="center"/>
+        <w:rPr>
+          <w:sz w:val="44"/>
+          <w:szCs w:val="44"/>
+        </w:rPr>
+      </w:pPr>
+      <w:r>
+        <w:rPr>
+          <w:sz w:val="44"/>
+          <w:szCs w:val="44"/>
+        </w:rPr>
+        <w:lastRenderedPageBreak/>
+        <w:t>{{lampiran_46}}</w:t>
+      </w:r>
+    </w:p>
+    <w:p>
+      <w:pPr>
+        <w:jc w:val="center"/>
+        <w:rPr>
+          <w:sz w:val="44"/>
+          <w:szCs w:val="44"/>
+        </w:rPr>
+      </w:pPr>
+      <w:r>
+        <w:rPr>
+          <w:sz w:val="44"/>
+          <w:szCs w:val="44"/>
+        </w:rPr>
+        <w:br w:type="page"/>
+      </w:r>
+    </w:p>
+    <w:p>
+      <w:pPr>
+        <w:tabs>
+          <w:tab w:val="left" w:pos="4354"/>
+        </w:tabs>
+        <w:jc w:val="center"/>
+        <w:rPr>
+          <w:sz w:val="44"/>
+          <w:szCs w:val="44"/>
+        </w:rPr>
+      </w:pPr>
+      <w:r>
+        <w:rPr>
+          <w:sz w:val="44"/>
+          <w:szCs w:val="44"/>
+        </w:rPr>
+        <w:lastRenderedPageBreak/>
+        <w:t>{{lampiran_47}}</w:t>
+      </w:r>
+    </w:p>
+    <w:p>
+      <w:pPr>
+        <w:jc w:val="center"/>
+        <w:rPr>
+          <w:sz w:val="44"/>
+          <w:szCs w:val="44"/>
+        </w:rPr>
+      </w:pPr>
+      <w:r>
+        <w:rPr>
+          <w:sz w:val="44"/>
+          <w:szCs w:val="44"/>
+        </w:rPr>
+        <w:br w:type="page"/>
+      </w:r>
+    </w:p>
+    <w:p>
+      <w:pPr>
+        <w:tabs>
+          <w:tab w:val="left" w:pos="4354"/>
+        </w:tabs>
+        <w:jc w:val="center"/>
+        <w:rPr>
+          <w:sz w:val="44"/>
+          <w:szCs w:val="44"/>
+        </w:rPr>
+      </w:pPr>
+      <w:r>
+        <w:rPr>
+          <w:sz w:val="44"/>
+          <w:szCs w:val="44"/>
+        </w:rPr>
+        <w:lastRenderedPageBreak/>
+        <w:t>{{lampiran_48}}</w:t>
+      </w:r>
+    </w:p>
+    <w:p>
+      <w:pPr>
+        <w:jc w:val="center"/>
+        <w:rPr>
+          <w:sz w:val="44"/>
+          <w:szCs w:val="44"/>
+        </w:rPr>
+      </w:pPr>
+      <w:r>
+        <w:rPr>
+          <w:sz w:val="44"/>
+          <w:szCs w:val="44"/>
+        </w:rPr>
+        <w:br w:type="page"/>
+      </w:r>
+    </w:p>
+    <w:p>
+      <w:pPr>
+        <w:tabs>
+          <w:tab w:val="left" w:pos="4354"/>
+        </w:tabs>
+        <w:jc w:val="center"/>
+        <w:rPr>
+          <w:sz w:val="44"/>
+          <w:szCs w:val="44"/>
+        </w:rPr>
+      </w:pPr>
+      <w:r>
+        <w:rPr>
+          <w:sz w:val="44"/>
+          <w:szCs w:val="44"/>
+        </w:rPr>
+        <w:lastRenderedPageBreak/>
+        <w:t>{{lampiran_49}}</w:t>
+      </w:r>
+    </w:p>
+    <w:p>
+      <w:pPr>
+        <w:jc w:val="center"/>
+        <w:rPr>
+          <w:sz w:val="44"/>
+          <w:szCs w:val="44"/>
+        </w:rPr>
+      </w:pPr>
+      <w:r>
+        <w:rPr>
+          <w:sz w:val="44"/>
+          <w:szCs w:val="44"/>
+        </w:rPr>
+        <w:br w:type="page"/>
+      </w:r>
+    </w:p>
+    <w:p>
+      <w:pPr>
+        <w:tabs>
+          <w:tab w:val="left" w:pos="4354"/>
+        </w:tabs>
+        <w:jc w:val="center"/>
+        <w:rPr>
+          <w:sz w:val="44"/>
+          <w:szCs w:val="44"/>
+        </w:rPr>
+      </w:pPr>
+      <w:r>
+        <w:rPr>
+          <w:sz w:val="44"/>
+          <w:szCs w:val="44"/>
+        </w:rPr>
+        <w:lastRenderedPageBreak/>
+        <w:t>{{lampiran_50}}</w:t>
+      </w:r>
+    </w:p>
+    <w:p>
+      <w:pPr>
+        <w:jc w:val="center"/>
+        <w:rPr>
+          <w:sz w:val="44"/>
+          <w:szCs w:val="44"/>
+        </w:rPr>
+      </w:pPr>
+      <w:r>
+        <w:rPr>
+          <w:sz w:val="44"/>
+          <w:szCs w:val="44"/>
+        </w:rPr>
+        <w:br w:type="page"/>
+      </w:r>
+    </w:p>
+    <w:p>
+      <w:pPr>
+        <w:tabs>
+          <w:tab w:val="left" w:pos="4354"/>
+        </w:tabs>
+        <w:jc w:val="center"/>
+        <w:rPr>
+          <w:sz w:val="44"/>
+          <w:szCs w:val="44"/>
+        </w:rPr>
+      </w:pPr>
+      <w:r>
+        <w:rPr>
+          <w:sz w:val="44"/>
+          <w:szCs w:val="44"/>
+        </w:rPr>
+        <w:lastRenderedPageBreak/>
+        <w:t>{{lampiran_51}}</w:t>
+      </w:r>
+    </w:p>
+    <w:p>
+      <w:pPr>
+        <w:jc w:val="center"/>
+        <w:rPr>
+          <w:sz w:val="44"/>
+          <w:szCs w:val="44"/>
+        </w:rPr>
+      </w:pPr>
+      <w:r>
+        <w:rPr>
+          <w:sz w:val="44"/>
+          <w:szCs w:val="44"/>
+        </w:rPr>
+        <w:br w:type="page"/>
+      </w:r>
+    </w:p>
+    <w:p>
+      <w:pPr>
+        <w:tabs>
+          <w:tab w:val="left" w:pos="4354"/>
+        </w:tabs>
+        <w:jc w:val="center"/>
+        <w:rPr>
+          <w:sz w:val="44"/>
+          <w:szCs w:val="44"/>
+        </w:rPr>
+      </w:pPr>
+      <w:r>
+        <w:rPr>
+          <w:sz w:val="44"/>
+          <w:szCs w:val="44"/>
+        </w:rPr>
+        <w:lastRenderedPageBreak/>
+        <w:t>{{lampiran_52}}</w:t>
+      </w:r>
+    </w:p>
+    <w:p>
+      <w:pPr>
+        <w:jc w:val="center"/>
+        <w:rPr>
+          <w:sz w:val="44"/>
+          <w:szCs w:val="44"/>
+        </w:rPr>
+      </w:pPr>
+      <w:r>
+        <w:rPr>
+          <w:sz w:val="44"/>
+          <w:szCs w:val="44"/>
+        </w:rPr>
+        <w:br w:type="page"/>
+      </w:r>
+    </w:p>
+    <w:p>
+      <w:pPr>
+        <w:tabs>
+          <w:tab w:val="left" w:pos="4354"/>
+        </w:tabs>
+        <w:jc w:val="center"/>
+        <w:rPr>
+          <w:sz w:val="44"/>
+          <w:szCs w:val="44"/>
+        </w:rPr>
+      </w:pPr>
+      <w:r>
+        <w:rPr>
+          <w:sz w:val="44"/>
+          <w:szCs w:val="44"/>
+        </w:rPr>
+        <w:lastRenderedPageBreak/>
+        <w:t>{{lampiran_53}}</w:t>
+      </w:r>
+    </w:p>
+    <w:p>
+      <w:pPr>
+        <w:jc w:val="center"/>
+        <w:rPr>
+          <w:sz w:val="44"/>
+          <w:szCs w:val="44"/>
+        </w:rPr>
+      </w:pPr>
+      <w:r>
+        <w:rPr>
+          <w:sz w:val="44"/>
+          <w:szCs w:val="44"/>
+        </w:rPr>
+        <w:br w:type="page"/>
+      </w:r>
+    </w:p>
+    <w:p>
+      <w:pPr>
+        <w:tabs>
+          <w:tab w:val="left" w:pos="4354"/>
+        </w:tabs>
+        <w:jc w:val="center"/>
+        <w:rPr>
+          <w:sz w:val="44"/>
+          <w:szCs w:val="44"/>
+        </w:rPr>
+      </w:pPr>
+      <w:r>
+        <w:rPr>
+          <w:sz w:val="44"/>
+          <w:szCs w:val="44"/>
+        </w:rPr>
+        <w:lastRenderedPageBreak/>
+        <w:t>{{lampiran_54}}</w:t>
+      </w:r>
+    </w:p>
+    <w:p>
+      <w:pPr>
+        <w:jc w:val="center"/>
+        <w:rPr>
+          <w:sz w:val="44"/>
+          <w:szCs w:val="44"/>
+        </w:rPr>
+      </w:pPr>
+      <w:r>
+        <w:rPr>
+          <w:sz w:val="44"/>
+          <w:szCs w:val="44"/>
+        </w:rPr>
+        <w:br w:type="page"/>
+      </w:r>
+    </w:p>
+    <w:p>
+      <w:pPr>
+        <w:tabs>
+          <w:tab w:val="left" w:pos="4354"/>
+        </w:tabs>
+        <w:jc w:val="center"/>
+        <w:rPr>
+          <w:sz w:val="44"/>
+          <w:szCs w:val="44"/>
+        </w:rPr>
+      </w:pPr>
+      <w:r>
+        <w:rPr>
+          <w:sz w:val="44"/>
+          <w:szCs w:val="44"/>
+        </w:rPr>
+        <w:lastRenderedPageBreak/>
+        <w:t>{{lampiran_55}}</w:t>
+      </w:r>
+    </w:p>
+    <w:p>
+      <w:pPr>
+        <w:jc w:val="center"/>
+        <w:rPr>
+          <w:sz w:val="44"/>
+          <w:szCs w:val="44"/>
+        </w:rPr>
+      </w:pPr>
+      <w:r>
+        <w:rPr>
+          <w:sz w:val="44"/>
+          <w:szCs w:val="44"/>
+        </w:rPr>
+        <w:br w:type="page"/>
+      </w:r>
+    </w:p>
+    <w:p>
+      <w:pPr>
+        <w:tabs>
+          <w:tab w:val="left" w:pos="4354"/>
+        </w:tabs>
+        <w:jc w:val="center"/>
+        <w:rPr>
+          <w:sz w:val="44"/>
+          <w:szCs w:val="44"/>
+        </w:rPr>
+      </w:pPr>
+      <w:r>
+        <w:rPr>
+          <w:sz w:val="44"/>
+          <w:szCs w:val="44"/>
+        </w:rPr>
+        <w:lastRenderedPageBreak/>
+        <w:t>{{lampiran_56}}</w:t>
+      </w:r>
+    </w:p>
+    <w:p>
+      <w:pPr>
+        <w:jc w:val="center"/>
+        <w:rPr>
+          <w:sz w:val="44"/>
+          <w:szCs w:val="44"/>
+        </w:rPr>
+      </w:pPr>
+      <w:r>
+        <w:rPr>
+          <w:sz w:val="44"/>
+          <w:szCs w:val="44"/>
+        </w:rPr>
+        <w:br w:type="page"/>
+      </w:r>
+    </w:p>
+    <w:p>
+      <w:pPr>
+        <w:tabs>
+          <w:tab w:val="left" w:pos="4354"/>
+        </w:tabs>
+        <w:jc w:val="center"/>
+        <w:rPr>
+          <w:sz w:val="44"/>
+          <w:szCs w:val="44"/>
+        </w:rPr>
+      </w:pPr>
+      <w:r>
+        <w:rPr>
+          <w:sz w:val="44"/>
+          <w:szCs w:val="44"/>
+        </w:rPr>
+        <w:lastRenderedPageBreak/>
+        <w:t>{{lampiran_57}}</w:t>
+      </w:r>
+    </w:p>
+    <w:p>
+      <w:pPr>
+        <w:jc w:val="center"/>
+        <w:rPr>
+          <w:sz w:val="44"/>
+          <w:szCs w:val="44"/>
+        </w:rPr>
+      </w:pPr>
+      <w:r>
+        <w:rPr>
+          <w:sz w:val="44"/>
+          <w:szCs w:val="44"/>
+        </w:rPr>
+        <w:br w:type="page"/>
+      </w:r>
+    </w:p>
+    <w:p>
+      <w:pPr>
+        <w:tabs>
+          <w:tab w:val="left" w:pos="4354"/>
+        </w:tabs>
+        <w:jc w:val="center"/>
+        <w:rPr>
+          <w:sz w:val="44"/>
+          <w:szCs w:val="44"/>
+        </w:rPr>
+      </w:pPr>
+      <w:r>
+        <w:rPr>
+          <w:sz w:val="44"/>
+          <w:szCs w:val="44"/>
+        </w:rPr>
+        <w:lastRenderedPageBreak/>
+        <w:t>{{lampiran_58}}</w:t>
+      </w:r>
+    </w:p>
+    <w:p>
+      <w:pPr>
+        <w:jc w:val="center"/>
+        <w:rPr>
+          <w:sz w:val="44"/>
+          <w:szCs w:val="44"/>
+        </w:rPr>
+      </w:pPr>
+      <w:r>
+        <w:rPr>
+          <w:sz w:val="44"/>
+          <w:szCs w:val="44"/>
+        </w:rPr>
+        <w:br w:type="page"/>
+      </w:r>
+    </w:p>
+    <w:p>
+      <w:pPr>
+        <w:tabs>
+          <w:tab w:val="left" w:pos="4354"/>
+        </w:tabs>
+        <w:jc w:val="center"/>
+        <w:rPr>
+          <w:sz w:val="44"/>
+          <w:szCs w:val="44"/>
+        </w:rPr>
+      </w:pPr>
+      <w:r>
+        <w:rPr>
+          <w:sz w:val="44"/>
+          <w:szCs w:val="44"/>
+        </w:rPr>
+        <w:lastRenderedPageBreak/>
+        <w:t>{{lampiran_59}}</w:t>
+      </w:r>
+    </w:p>
+    <w:p>
+      <w:pPr>
+        <w:jc w:val="center"/>
+        <w:rPr>
+          <w:sz w:val="44"/>
+          <w:szCs w:val="44"/>
+        </w:rPr>
+      </w:pPr>
+      <w:r>
+        <w:rPr>
+          <w:sz w:val="44"/>
+          <w:szCs w:val="44"/>
+        </w:rPr>
+        <w:br w:type="page"/>
+      </w:r>
+    </w:p>
+    <w:p>
+      <w:pPr>
+        <w:tabs>
+          <w:tab w:val="left" w:pos="4354"/>
+        </w:tabs>
+        <w:jc w:val="center"/>
+        <w:rPr>
+          <w:sz w:val="44"/>
+          <w:szCs w:val="44"/>
+        </w:rPr>
+      </w:pPr>
+      <w:r>
+        <w:rPr>
+          <w:sz w:val="44"/>
+          <w:szCs w:val="44"/>
+        </w:rPr>
+        <w:lastRenderedPageBreak/>
+        <w:t>{{lampiran_60}}</w:t>
+      </w:r>
+    </w:p>
+    <w:p>
+      <w:pPr>
+        <w:tabs>
+          <w:tab w:val="left" w:pos="4354"/>
+        </w:tabs>
+      </w:pPr>
+    </w:p>
     <w:sectPr>
-      <w:headerReference w:type="default" r:id="rId10"/>
+      <w:headerReference w:type="default" r:id="rId9"/>
       <w:pgSz w:w="12240" w:h="20160"/>
       <w:pgMar w:top="1480" w:right="1080" w:bottom="280" w:left="1080" w:header="1245" w:footer="0" w:gutter="0"/>
       <w:cols w:space="720"/>
@@ -2958,6 +5185,279 @@
 
 <file path=word/header1.xml><?xml version="1.0" encoding="utf-8"?>
 <w:hdr xmlns:wpc="http://schemas.microsoft.com/office/word/2010/wordprocessingCanvas" xmlns:cx="http://schemas.microsoft.com/office/drawing/2014/chartex" xmlns:cx1="http://schemas.microsoft.com/office/drawing/2015/9/8/chartex" xmlns:cx2="http://schemas.microsoft.com/office/drawing/2015/10/21/chartex" xmlns:cx3="http://schemas.microsoft.com/office/drawing/2016/5/9/chartex" xmlns:cx4="http://schemas.microsoft.com/office/drawing/2016/5/10/chartex" xmlns:cx5="http://schemas.microsoft.com/office/drawing/2016/5/11/chartex" xmlns:cx6="http://schemas.microsoft.com/office/drawing/2016/5/12/chartex" xmlns:cx7="http://schemas.microsoft.com/office/drawing/2016/5/13/chartex" xmlns:cx8="http://schemas.microsoft.com/office/drawing/2016/5/14/chartex" xmlns:mc="http://schemas.openxmlformats.org/markup-compatibility/2006" xmlns:aink="http://schemas.microsoft.com/office/drawing/2016/ink" xmlns:am3d="http://schemas.microsoft.com/office/drawing/2017/model3d" xmlns:o="urn:schemas-microsoft-com:office:office" xmlns:oel="http://schemas.microsoft.com/office/2019/extlst" xmlns:r="http://schemas.openxmlformats.org/officeDocument/2006/relationships" xmlns:m="http://schemas.openxmlformats.org/officeDocument/2006/math" xmlns:v="urn:schemas-microsoft-com:vml" xmlns:wp14="http://schemas.microsoft.com/office/word/2010/wordprocessingDrawing" xmlns:wp="http://schemas.openxmlformats.org/drawingml/2006/wordprocessingDrawing" xmlns:w10="urn:schemas-microsoft-com:office:word" xmlns:w="http://schemas.openxmlformats.org/wordprocessingml/2006/main" xmlns:w14="http://schemas.microsoft.com/office/word/2010/wordml" xmlns:w15="http://schemas.microsoft.com/office/word/2012/wordml" xmlns:w16cex="http://schemas.microsoft.com/office/word/2018/wordml/cex" xmlns:w16cid="http://schemas.microsoft.com/office/word/2016/wordml/cid" xmlns:w16="http://schemas.microsoft.com/office/word/2018/wordml" xmlns:w16du="http://schemas.microsoft.com/office/word/2023/wordml/word16du" xmlns:w16sdtdh="http://schemas.microsoft.com/office/word/2020/wordml/sdtdatahash" xmlns:w16sdtfl="http://schemas.microsoft.com/office/word/2024/wordml/sdtformatlock" xmlns:w16se="http://schemas.microsoft.com/office/word/2015/wordml/symex" xmlns:wpg="http://schemas.microsoft.com/office/word/2010/wordprocessingGroup" xmlns:wpi="http://schemas.microsoft.com/office/word/2010/wordprocessingInk" xmlns:wne="http://schemas.microsoft.com/office/word/2006/wordml" xmlns:wps="http://schemas.microsoft.com/office/word/2010/wordprocessingShape" mc:Ignorable="w14 w15 w16se w16cid w16 w16cex w16sdtdh w16sdtfl w16du wp14">
+  <w:tbl>
+    <w:tblPr>
+      <w:tblStyle w:val="TableGrid"/>
+      <w:tblW w:w="10641" w:type="dxa"/>
+      <w:tblLook w:val="04A0" w:firstRow="1" w:lastRow="0" w:firstColumn="1" w:lastColumn="0" w:noHBand="0" w:noVBand="1"/>
+    </w:tblPr>
+    <w:tblGrid>
+      <w:gridCol w:w="1430"/>
+      <w:gridCol w:w="9211"/>
+    </w:tblGrid>
+    <w:tr>
+      <w:trPr>
+        <w:trHeight w:val="1867"/>
+      </w:trPr>
+      <w:tc>
+        <w:tcPr>
+          <w:tcW w:w="1430" w:type="dxa"/>
+          <w:tcBorders>
+            <w:top w:val="nil"/>
+            <w:left w:val="nil"/>
+            <w:bottom w:val="nil"/>
+            <w:right w:val="nil"/>
+          </w:tcBorders>
+        </w:tcPr>
+        <w:p>
+          <w:pPr>
+            <w:pStyle w:val="Header"/>
+          </w:pPr>
+          <w:r>
+            <w:rPr>
+              <w:noProof/>
+            </w:rPr>
+            <w:drawing>
+              <wp:anchor distT="0" distB="0" distL="114300" distR="114300" simplePos="0" relativeHeight="251657216" behindDoc="1" locked="0" layoutInCell="1" allowOverlap="1" wp14:anchorId="6C1D62D8" wp14:editId="3E65E39E">
+                <wp:simplePos x="0" y="0"/>
+                <wp:positionH relativeFrom="column">
+                  <wp:posOffset>689379</wp:posOffset>
+                </wp:positionH>
+                <wp:positionV relativeFrom="paragraph">
+                  <wp:posOffset>-11875</wp:posOffset>
+                </wp:positionV>
+                <wp:extent cx="78740" cy="1292225"/>
+                <wp:effectExtent l="0" t="0" r="0" b="3175"/>
+                <wp:wrapTight wrapText="bothSides">
+                  <wp:wrapPolygon edited="0">
+                    <wp:start x="0" y="0"/>
+                    <wp:lineTo x="0" y="21335"/>
+                    <wp:lineTo x="15677" y="21335"/>
+                    <wp:lineTo x="15677" y="0"/>
+                    <wp:lineTo x="0" y="0"/>
+                  </wp:wrapPolygon>
+                </wp:wrapTight>
+                <wp:docPr id="3" name="Picture 3"/>
+                <wp:cNvGraphicFramePr>
+                  <a:graphicFrameLocks xmlns:a="http://schemas.openxmlformats.org/drawingml/2006/main" noChangeAspect="1"/>
+                </wp:cNvGraphicFramePr>
+                <a:graphic xmlns:a="http://schemas.openxmlformats.org/drawingml/2006/main">
+                  <a:graphicData uri="http://schemas.openxmlformats.org/drawingml/2006/picture">
+                    <pic:pic xmlns:pic="http://schemas.openxmlformats.org/drawingml/2006/picture">
+                      <pic:nvPicPr>
+                        <pic:cNvPr id="2" name="Picture 2"/>
+                        <pic:cNvPicPr>
+                          <a:picLocks noChangeAspect="1"/>
+                        </pic:cNvPicPr>
+                      </pic:nvPicPr>
+                      <pic:blipFill>
+                        <a:blip r:embed="rId1" cstate="print">
+                          <a:extLst>
+                            <a:ext uri="{28A0092B-C50C-407E-A947-70E740481C1C}">
+                              <a14:useLocalDpi xmlns:a14="http://schemas.microsoft.com/office/drawing/2010/main" val="0"/>
+                            </a:ext>
+                          </a:extLst>
+                        </a:blip>
+                        <a:stretch>
+                          <a:fillRect/>
+                        </a:stretch>
+                      </pic:blipFill>
+                      <pic:spPr>
+                        <a:xfrm>
+                          <a:off x="0" y="0"/>
+                          <a:ext cx="78740" cy="1292225"/>
+                        </a:xfrm>
+                        <a:prstGeom prst="rect">
+                          <a:avLst/>
+                        </a:prstGeom>
+                      </pic:spPr>
+                    </pic:pic>
+                  </a:graphicData>
+                </a:graphic>
+              </wp:anchor>
+            </w:drawing>
+          </w:r>
+        </w:p>
+        <w:p>
+          <w:pPr>
+            <w:pStyle w:val="Header"/>
+          </w:pPr>
+          <w:r>
+            <w:rPr>
+              <w:noProof/>
+            </w:rPr>
+            <w:drawing>
+              <wp:anchor distT="0" distB="0" distL="114300" distR="114300" simplePos="0" relativeHeight="251659264" behindDoc="1" locked="0" layoutInCell="1" allowOverlap="1" wp14:anchorId="65D9F4A5" wp14:editId="758B4C62">
+                <wp:simplePos x="0" y="0"/>
+                <wp:positionH relativeFrom="column">
+                  <wp:posOffset>5847</wp:posOffset>
+                </wp:positionH>
+                <wp:positionV relativeFrom="paragraph">
+                  <wp:posOffset>100602</wp:posOffset>
+                </wp:positionV>
+                <wp:extent cx="648970" cy="819785"/>
+                <wp:effectExtent l="0" t="0" r="0" b="0"/>
+                <wp:wrapTight wrapText="bothSides">
+                  <wp:wrapPolygon edited="0">
+                    <wp:start x="8243" y="0"/>
+                    <wp:lineTo x="3804" y="3012"/>
+                    <wp:lineTo x="0" y="7027"/>
+                    <wp:lineTo x="0" y="10039"/>
+                    <wp:lineTo x="8877" y="16564"/>
+                    <wp:lineTo x="2536" y="17568"/>
+                    <wp:lineTo x="0" y="18572"/>
+                    <wp:lineTo x="0" y="21081"/>
+                    <wp:lineTo x="20924" y="21081"/>
+                    <wp:lineTo x="20924" y="19074"/>
+                    <wp:lineTo x="19656" y="18070"/>
+                    <wp:lineTo x="12047" y="16564"/>
+                    <wp:lineTo x="20924" y="9537"/>
+                    <wp:lineTo x="20924" y="7027"/>
+                    <wp:lineTo x="16485" y="3012"/>
+                    <wp:lineTo x="12681" y="0"/>
+                    <wp:lineTo x="8243" y="0"/>
+                  </wp:wrapPolygon>
+                </wp:wrapTight>
+                <wp:docPr id="2" name="Picture 2"/>
+                <wp:cNvGraphicFramePr>
+                  <a:graphicFrameLocks xmlns:a="http://schemas.openxmlformats.org/drawingml/2006/main" noChangeAspect="1"/>
+                </wp:cNvGraphicFramePr>
+                <a:graphic xmlns:a="http://schemas.openxmlformats.org/drawingml/2006/main">
+                  <a:graphicData uri="http://schemas.openxmlformats.org/drawingml/2006/picture">
+                    <pic:pic xmlns:pic="http://schemas.openxmlformats.org/drawingml/2006/picture">
+                      <pic:nvPicPr>
+                        <pic:cNvPr id="1" name="Picture 1"/>
+                        <pic:cNvPicPr>
+                          <a:picLocks noChangeAspect="1"/>
+                        </pic:cNvPicPr>
+                      </pic:nvPicPr>
+                      <pic:blipFill>
+                        <a:blip r:embed="rId2" cstate="print">
+                          <a:extLst>
+                            <a:ext uri="{28A0092B-C50C-407E-A947-70E740481C1C}">
+                              <a14:useLocalDpi xmlns:a14="http://schemas.microsoft.com/office/drawing/2010/main" val="0"/>
+                            </a:ext>
+                          </a:extLst>
+                        </a:blip>
+                        <a:stretch>
+                          <a:fillRect/>
+                        </a:stretch>
+                      </pic:blipFill>
+                      <pic:spPr>
+                        <a:xfrm>
+                          <a:off x="0" y="0"/>
+                          <a:ext cx="648970" cy="819785"/>
+                        </a:xfrm>
+                        <a:prstGeom prst="rect">
+                          <a:avLst/>
+                        </a:prstGeom>
+                      </pic:spPr>
+                    </pic:pic>
+                  </a:graphicData>
+                </a:graphic>
+              </wp:anchor>
+            </w:drawing>
+          </w:r>
+        </w:p>
+        <w:p>
+          <w:pPr>
+            <w:pStyle w:val="Header"/>
+          </w:pPr>
+        </w:p>
+      </w:tc>
+      <w:tc>
+        <w:tcPr>
+          <w:tcW w:w="9211" w:type="dxa"/>
+          <w:tcBorders>
+            <w:top w:val="nil"/>
+            <w:left w:val="nil"/>
+            <w:bottom w:val="nil"/>
+            <w:right w:val="nil"/>
+          </w:tcBorders>
+        </w:tcPr>
+        <w:p>
+          <w:pPr>
+            <w:rPr>
+              <w:rFonts w:ascii="Arial Narrow" w:hAnsi="Arial Narrow"/>
+              <w:szCs w:val="24"/>
+            </w:rPr>
+          </w:pPr>
+        </w:p>
+        <w:p>
+          <w:pPr>
+            <w:rPr>
+              <w:rFonts w:ascii="Arial Narrow" w:hAnsi="Arial Narrow"/>
+              <w:sz w:val="28"/>
+              <w:szCs w:val="28"/>
+            </w:rPr>
+          </w:pPr>
+        </w:p>
+        <w:p>
+          <w:pPr>
+            <w:rPr>
+              <w:rFonts w:ascii="Arial Narrow" w:hAnsi="Arial Narrow"/>
+              <w:sz w:val="28"/>
+              <w:szCs w:val="28"/>
+            </w:rPr>
+          </w:pPr>
+          <w:r>
+            <w:rPr>
+              <w:rFonts w:ascii="Arial Narrow" w:hAnsi="Arial Narrow"/>
+              <w:sz w:val="28"/>
+              <w:szCs w:val="28"/>
+            </w:rPr>
+            <w:t>KEMENTERIAN KETENAGAKERJAAN REPUBLIK INDONESIA</w:t>
+          </w:r>
+        </w:p>
+        <w:p>
+          <w:pPr>
+            <w:rPr>
+              <w:rFonts w:ascii="Arial Narrow" w:hAnsi="Arial Narrow"/>
+              <w:color w:val="284A61"/>
+              <w:sz w:val="32"/>
+              <w:szCs w:val="32"/>
+            </w:rPr>
+          </w:pPr>
+          <w:r>
+            <w:rPr>
+              <w:rFonts w:ascii="Arial Narrow" w:hAnsi="Arial Narrow"/>
+              <w:color w:val="284A61"/>
+              <w:sz w:val="32"/>
+              <w:szCs w:val="32"/>
+            </w:rPr>
+            <w:t>SEKRETARIAT JENDERAL</w:t>
+          </w:r>
+        </w:p>
+        <w:p>
+          <w:pPr>
+            <w:rPr>
+              <w:rFonts w:ascii="Arial Narrow" w:hAnsi="Arial Narrow"/>
+              <w:b/>
+              <w:color w:val="284A61"/>
+              <w:sz w:val="32"/>
+              <w:szCs w:val="32"/>
+            </w:rPr>
+          </w:pPr>
+        </w:p>
+        <w:p>
+          <w:pPr>
+            <w:rPr>
+              <w:rFonts w:ascii="Arial Narrow" w:hAnsi="Arial Narrow"/>
+              <w:color w:val="000000" w:themeColor="text1"/>
+              <w:sz w:val="18"/>
+              <w:szCs w:val="18"/>
+            </w:rPr>
+          </w:pPr>
+        </w:p>
+        <w:p/>
+        <w:p>
+          <w:pPr>
+            <w:pStyle w:val="Header"/>
+          </w:pPr>
+        </w:p>
+      </w:tc>
+    </w:tr>
+  </w:tbl>
   <w:p>
     <w:pPr>
       <w:pStyle w:val="Header"/>
@@ -2967,6 +5467,16 @@
 </file>
 
 <file path=word/header2.xml><?xml version="1.0" encoding="utf-8"?>
+<w:hdr xmlns:wpc="http://schemas.microsoft.com/office/word/2010/wordprocessingCanvas" xmlns:cx="http://schemas.microsoft.com/office/drawing/2014/chartex" xmlns:cx1="http://schemas.microsoft.com/office/drawing/2015/9/8/chartex" xmlns:cx2="http://schemas.microsoft.com/office/drawing/2015/10/21/chartex" xmlns:cx3="http://schemas.microsoft.com/office/drawing/2016/5/9/chartex" xmlns:cx4="http://schemas.microsoft.com/office/drawing/2016/5/10/chartex" xmlns:cx5="http://schemas.microsoft.com/office/drawing/2016/5/11/chartex" xmlns:cx6="http://schemas.microsoft.com/office/drawing/2016/5/12/chartex" xmlns:cx7="http://schemas.microsoft.com/office/drawing/2016/5/13/chartex" xmlns:cx8="http://schemas.microsoft.com/office/drawing/2016/5/14/chartex" xmlns:mc="http://schemas.openxmlformats.org/markup-compatibility/2006" xmlns:aink="http://schemas.microsoft.com/office/drawing/2016/ink" xmlns:am3d="http://schemas.microsoft.com/office/drawing/2017/model3d" xmlns:o="urn:schemas-microsoft-com:office:office" xmlns:oel="http://schemas.microsoft.com/office/2019/extlst" xmlns:r="http://schemas.openxmlformats.org/officeDocument/2006/relationships" xmlns:m="http://schemas.openxmlformats.org/officeDocument/2006/math" xmlns:v="urn:schemas-microsoft-com:vml" xmlns:wp14="http://schemas.microsoft.com/office/word/2010/wordprocessingDrawing" xmlns:wp="http://schemas.openxmlformats.org/drawingml/2006/wordprocessingDrawing" xmlns:w10="urn:schemas-microsoft-com:office:word" xmlns:w="http://schemas.openxmlformats.org/wordprocessingml/2006/main" xmlns:w14="http://schemas.microsoft.com/office/word/2010/wordml" xmlns:w15="http://schemas.microsoft.com/office/word/2012/wordml" xmlns:w16cex="http://schemas.microsoft.com/office/word/2018/wordml/cex" xmlns:w16cid="http://schemas.microsoft.com/office/word/2016/wordml/cid" xmlns:w16="http://schemas.microsoft.com/office/word/2018/wordml" xmlns:w16du="http://schemas.microsoft.com/office/word/2023/wordml/word16du" xmlns:w16sdtdh="http://schemas.microsoft.com/office/word/2020/wordml/sdtdatahash" xmlns:w16sdtfl="http://schemas.microsoft.com/office/word/2024/wordml/sdtformatlock" xmlns:w16se="http://schemas.microsoft.com/office/word/2015/wordml/symex" xmlns:wpg="http://schemas.microsoft.com/office/word/2010/wordprocessingGroup" xmlns:wpi="http://schemas.microsoft.com/office/word/2010/wordprocessingInk" xmlns:wne="http://schemas.microsoft.com/office/word/2006/wordml" xmlns:wps="http://schemas.microsoft.com/office/word/2010/wordprocessingShape" mc:Ignorable="w14 w15 w16se w16cid w16 w16cex w16sdtdh w16sdtfl w16du wp14">
+  <w:p>
+    <w:pPr>
+      <w:pStyle w:val="Header"/>
+    </w:pPr>
+  </w:p>
+</w:hdr>
+</file>
+
+<file path=word/header3.xml><?xml version="1.0" encoding="utf-8"?>
 <w:hdr xmlns:wpc="http://schemas.microsoft.com/office/word/2010/wordprocessingCanvas" xmlns:cx="http://schemas.microsoft.com/office/drawing/2014/chartex" xmlns:cx1="http://schemas.microsoft.com/office/drawing/2015/9/8/chartex" xmlns:cx2="http://schemas.microsoft.com/office/drawing/2015/10/21/chartex" xmlns:cx3="http://schemas.microsoft.com/office/drawing/2016/5/9/chartex" xmlns:cx4="http://schemas.microsoft.com/office/drawing/2016/5/10/chartex" xmlns:cx5="http://schemas.microsoft.com/office/drawing/2016/5/11/chartex" xmlns:cx6="http://schemas.microsoft.com/office/drawing/2016/5/12/chartex" xmlns:cx7="http://schemas.microsoft.com/office/drawing/2016/5/13/chartex" xmlns:cx8="http://schemas.microsoft.com/office/drawing/2016/5/14/chartex" xmlns:mc="http://schemas.openxmlformats.org/markup-compatibility/2006" xmlns:aink="http://schemas.microsoft.com/office/drawing/2016/ink" xmlns:am3d="http://schemas.microsoft.com/office/drawing/2017/model3d" xmlns:o="urn:schemas-microsoft-com:office:office" xmlns:oel="http://schemas.microsoft.com/office/2019/extlst" xmlns:r="http://schemas.openxmlformats.org/officeDocument/2006/relationships" xmlns:m="http://schemas.openxmlformats.org/officeDocument/2006/math" xmlns:v="urn:schemas-microsoft-com:vml" xmlns:wp14="http://schemas.microsoft.com/office/word/2010/wordprocessingDrawing" xmlns:wp="http://schemas.openxmlformats.org/drawingml/2006/wordprocessingDrawing" xmlns:w10="urn:schemas-microsoft-com:office:word" xmlns:w="http://schemas.openxmlformats.org/wordprocessingml/2006/main" xmlns:w14="http://schemas.microsoft.com/office/word/2010/wordml" xmlns:w15="http://schemas.microsoft.com/office/word/2012/wordml" xmlns:w16cex="http://schemas.microsoft.com/office/word/2018/wordml/cex" xmlns:w16cid="http://schemas.microsoft.com/office/word/2016/wordml/cid" xmlns:w16="http://schemas.microsoft.com/office/word/2018/wordml" xmlns:w16du="http://schemas.microsoft.com/office/word/2023/wordml/word16du" xmlns:w16sdtdh="http://schemas.microsoft.com/office/word/2020/wordml/sdtdatahash" xmlns:w16sdtfl="http://schemas.microsoft.com/office/word/2024/wordml/sdtformatlock" xmlns:w16se="http://schemas.microsoft.com/office/word/2015/wordml/symex" xmlns:wpg="http://schemas.microsoft.com/office/word/2010/wordprocessingGroup" xmlns:wpi="http://schemas.microsoft.com/office/word/2010/wordprocessingInk" xmlns:wne="http://schemas.microsoft.com/office/word/2006/wordml" xmlns:wps="http://schemas.microsoft.com/office/word/2010/wordprocessingShape" mc:Ignorable="w14 w15 w16se w16cid w16 w16cex w16sdtdh w16sdtfl w16du wp14">
   <w:p>
     <w:pPr>
@@ -3603,22 +6113,22 @@
       </w:pPr>
     </w:lvl>
   </w:abstractNum>
-  <w:num w:numId="1" w16cid:durableId="1781340690">
+  <w:num w:numId="1" w16cid:durableId="623342622">
     <w:abstractNumId w:val="1"/>
   </w:num>
-  <w:num w:numId="2" w16cid:durableId="61216923">
+  <w:num w:numId="2" w16cid:durableId="1609003949">
     <w:abstractNumId w:val="2"/>
   </w:num>
-  <w:num w:numId="3" w16cid:durableId="623467952">
+  <w:num w:numId="3" w16cid:durableId="1881555620">
     <w:abstractNumId w:val="5"/>
   </w:num>
-  <w:num w:numId="4" w16cid:durableId="1681004111">
+  <w:num w:numId="4" w16cid:durableId="139272835">
     <w:abstractNumId w:val="0"/>
   </w:num>
-  <w:num w:numId="5" w16cid:durableId="2003047719">
+  <w:num w:numId="5" w16cid:durableId="511115746">
     <w:abstractNumId w:val="3"/>
   </w:num>
-  <w:num w:numId="6" w16cid:durableId="1766724767">
+  <w:num w:numId="6" w16cid:durableId="292712930">
     <w:abstractNumId w:val="4"/>
   </w:num>
 </w:numbering>
@@ -4024,6 +6534,7 @@
   <w:style w:type="paragraph" w:default="1" w:styleId="Normal">
     <w:name w:val="Normal"/>
     <w:qFormat/>
+    <w:rsid w:val="00FE441A"/>
     <w:rPr>
       <w:rFonts w:ascii="Arial MT" w:eastAsia="Arial MT" w:hAnsi="Arial MT" w:cs="Arial MT"/>
       <w:lang w:val="id"/>
@@ -4047,6 +6558,7 @@
   <w:style w:type="character" w:default="1" w:styleId="DefaultParagraphFont">
     <w:name w:val="Default Paragraph Font"/>
     <w:uiPriority w:val="1"/>
+    <w:semiHidden/>
     <w:unhideWhenUsed/>
   </w:style>
   <w:style w:type="table" w:default="1" w:styleId="TableNormal">

</xml_diff>

<commit_message>
feat: patriarchy sorting, report image scaling, force password change, and domain removal
</commit_message>
<xml_diff>
--- a/backend/templates/Berkas Luar Kota - Laporan.docx
+++ b/backend/templates/Berkas Luar Kota - Laporan.docx
@@ -1,6 +1,6 @@
 
 <file path=word/document.xml><?xml version="1.0" encoding="utf-8"?>
-<w:document xmlns:wpc="http://schemas.microsoft.com/office/word/2010/wordprocessingCanvas" xmlns:cx="http://schemas.microsoft.com/office/drawing/2014/chartex" xmlns:cx1="http://schemas.microsoft.com/office/drawing/2015/9/8/chartex" xmlns:cx2="http://schemas.microsoft.com/office/drawing/2015/10/21/chartex" xmlns:cx3="http://schemas.microsoft.com/office/drawing/2016/5/9/chartex" xmlns:cx4="http://schemas.microsoft.com/office/drawing/2016/5/10/chartex" xmlns:cx5="http://schemas.microsoft.com/office/drawing/2016/5/11/chartex" xmlns:cx6="http://schemas.microsoft.com/office/drawing/2016/5/12/chartex" xmlns:cx7="http://schemas.microsoft.com/office/drawing/2016/5/13/chartex" xmlns:cx8="http://schemas.microsoft.com/office/drawing/2016/5/14/chartex" xmlns:mc="http://schemas.openxmlformats.org/markup-compatibility/2006" xmlns:aink="http://schemas.microsoft.com/office/drawing/2016/ink" xmlns:am3d="http://schemas.microsoft.com/office/drawing/2017/model3d" xmlns:o="urn:schemas-microsoft-com:office:office" xmlns:oel="http://schemas.microsoft.com/office/2019/extlst" xmlns:r="http://schemas.openxmlformats.org/officeDocument/2006/relationships" xmlns:m="http://schemas.openxmlformats.org/officeDocument/2006/math" xmlns:v="urn:schemas-microsoft-com:vml" xmlns:wp14="http://schemas.microsoft.com/office/word/2010/wordprocessingDrawing" xmlns:wp="http://schemas.openxmlformats.org/drawingml/2006/wordprocessingDrawing" xmlns:w10="urn:schemas-microsoft-com:office:word" xmlns:w="http://schemas.openxmlformats.org/wordprocessingml/2006/main" xmlns:w14="http://schemas.microsoft.com/office/word/2010/wordml" xmlns:w15="http://schemas.microsoft.com/office/word/2012/wordml" xmlns:w16cex="http://schemas.microsoft.com/office/word/2018/wordml/cex" xmlns:w16cid="http://schemas.microsoft.com/office/word/2016/wordml/cid" xmlns:w16="http://schemas.microsoft.com/office/word/2018/wordml" xmlns:w16du="http://schemas.microsoft.com/office/word/2023/wordml/word16du" xmlns:w16sdtdh="http://schemas.microsoft.com/office/word/2020/wordml/sdtdatahash" xmlns:w16sdtfl="http://schemas.microsoft.com/office/word/2024/wordml/sdtformatlock" xmlns:w16se="http://schemas.microsoft.com/office/word/2015/wordml/symex" xmlns:wpg="http://schemas.microsoft.com/office/word/2010/wordprocessingGroup" xmlns:wpi="http://schemas.microsoft.com/office/word/2010/wordprocessingInk" xmlns:wne="http://schemas.microsoft.com/office/word/2006/wordml" xmlns:wps="http://schemas.microsoft.com/office/word/2010/wordprocessingShape" mc:Ignorable="w14 w15 w16se w16cid w16 w16cex w16sdtdh w16sdtfl w16du wp14">
+<w:document xmlns:wpc="http://schemas.microsoft.com/office/word/2010/wordprocessingCanvas" xmlns:cx="http://schemas.microsoft.com/office/drawing/2014/chartex" xmlns:cx1="http://schemas.microsoft.com/office/drawing/2015/9/8/chartex" xmlns:cx2="http://schemas.microsoft.com/office/drawing/2015/10/21/chartex" xmlns:cx3="http://schemas.microsoft.com/office/drawing/2016/5/9/chartex" xmlns:cx4="http://schemas.microsoft.com/office/drawing/2016/5/10/chartex" xmlns:cx5="http://schemas.microsoft.com/office/drawing/2016/5/11/chartex" xmlns:cx6="http://schemas.microsoft.com/office/drawing/2016/5/12/chartex" xmlns:cx7="http://schemas.microsoft.com/office/drawing/2016/5/13/chartex" xmlns:cx8="http://schemas.microsoft.com/office/drawing/2016/5/14/chartex" xmlns:mc="http://schemas.openxmlformats.org/markup-compatibility/2006" xmlns:aink="http://schemas.microsoft.com/office/drawing/2016/ink" xmlns:am3d="http://schemas.microsoft.com/office/drawing/2017/model3d" xmlns:o="urn:schemas-microsoft-com:office:office" xmlns:oel="http://schemas.microsoft.com/office/2019/extlst" xmlns:r="http://schemas.openxmlformats.org/officeDocument/2006/relationships" xmlns:m="http://schemas.openxmlformats.org/officeDocument/2006/math" xmlns:v="urn:schemas-microsoft-com:vml" xmlns:wp14="http://schemas.microsoft.com/office/word/2010/wordprocessingDrawing" xmlns:wp="http://schemas.openxmlformats.org/drawingml/2006/wordprocessingDrawing" xmlns:w10="urn:schemas-microsoft-com:office:word" xmlns:w="http://schemas.openxmlformats.org/wordprocessingml/2006/main" xmlns:w14="http://schemas.microsoft.com/office/word/2010/wordml" xmlns:w15="http://schemas.microsoft.com/office/word/2012/wordml" xmlns:w16cex="http://schemas.microsoft.com/office/word/2018/wordml/cex" xmlns:w16cid="http://schemas.microsoft.com/office/word/2016/wordml/cid" xmlns:w16="http://schemas.microsoft.com/office/word/2018/wordml" xmlns:w16sdtdh="http://schemas.microsoft.com/office/word/2020/wordml/sdtdatahash" xmlns:w16se="http://schemas.microsoft.com/office/word/2015/wordml/symex" xmlns:wpg="http://schemas.microsoft.com/office/word/2010/wordprocessingGroup" xmlns:wpi="http://schemas.microsoft.com/office/word/2010/wordprocessingInk" xmlns:wne="http://schemas.microsoft.com/office/word/2006/wordml" xmlns:wps="http://schemas.microsoft.com/office/word/2010/wordprocessingShape" mc:Ignorable="w14 w15 w16se w16cid w16 w16cex w16sdtdh wp14">
   <w:body>
     <w:p>
       <w:pPr>
@@ -1182,7 +1182,12 @@
           <w:lang w:val="en-US"/>
         </w:rPr>
         <w:sectPr>
-          <w:headerReference w:type="default" r:id="rId7"/>
+          <w:headerReference w:type="even" r:id="rId7"/>
+          <w:headerReference w:type="default" r:id="rId8"/>
+          <w:footerReference w:type="even" r:id="rId9"/>
+          <w:footerReference w:type="default" r:id="rId10"/>
+          <w:headerReference w:type="first" r:id="rId11"/>
+          <w:footerReference w:type="first" r:id="rId12"/>
           <w:type w:val="continuous"/>
           <w:pgSz w:w="12240" w:h="20160"/>
           <w:pgMar w:top="1200" w:right="1080" w:bottom="280" w:left="1080" w:header="340" w:footer="720" w:gutter="0"/>
@@ -1635,16 +1640,8 @@
               <w:rPr>
                 <w:spacing w:val="-2"/>
               </w:rPr>
-              <w:t>………………</w:t>
-            </w:r>
-            <w:proofErr w:type="gramStart"/>
-            <w:r>
-              <w:rPr>
-                <w:spacing w:val="-2"/>
-              </w:rPr>
-              <w:t>…..</w:t>
-            </w:r>
-            <w:proofErr w:type="gramEnd"/>
+              <w:t>…………………..</w:t>
+            </w:r>
           </w:p>
         </w:tc>
       </w:tr>
@@ -1805,16 +1802,8 @@
               <w:rPr>
                 <w:spacing w:val="-2"/>
               </w:rPr>
-              <w:t>………………</w:t>
-            </w:r>
-            <w:proofErr w:type="gramStart"/>
-            <w:r>
-              <w:rPr>
-                <w:spacing w:val="-2"/>
-              </w:rPr>
-              <w:t>…..</w:t>
-            </w:r>
-            <w:proofErr w:type="gramEnd"/>
+              <w:t>…………………..</w:t>
+            </w:r>
           </w:p>
         </w:tc>
       </w:tr>
@@ -1973,16 +1962,8 @@
               <w:rPr>
                 <w:spacing w:val="-2"/>
               </w:rPr>
-              <w:t>………………</w:t>
-            </w:r>
-            <w:proofErr w:type="gramStart"/>
-            <w:r>
-              <w:rPr>
-                <w:spacing w:val="-2"/>
-              </w:rPr>
-              <w:t>…..</w:t>
-            </w:r>
-            <w:proofErr w:type="gramEnd"/>
+              <w:t>…………………..</w:t>
+            </w:r>
           </w:p>
         </w:tc>
       </w:tr>
@@ -2143,16 +2124,8 @@
               <w:rPr>
                 <w:spacing w:val="-2"/>
               </w:rPr>
-              <w:t>………………</w:t>
-            </w:r>
-            <w:proofErr w:type="gramStart"/>
-            <w:r>
-              <w:rPr>
-                <w:spacing w:val="-2"/>
-              </w:rPr>
-              <w:t>…..</w:t>
-            </w:r>
-            <w:proofErr w:type="gramEnd"/>
+              <w:t>…………………..</w:t>
+            </w:r>
           </w:p>
         </w:tc>
       </w:tr>
@@ -2313,16 +2286,8 @@
               <w:rPr>
                 <w:spacing w:val="-2"/>
               </w:rPr>
-              <w:t>………………</w:t>
-            </w:r>
-            <w:proofErr w:type="gramStart"/>
-            <w:r>
-              <w:rPr>
-                <w:spacing w:val="-2"/>
-              </w:rPr>
-              <w:t>…..</w:t>
-            </w:r>
-            <w:proofErr w:type="gramEnd"/>
+              <w:t>…………………..</w:t>
+            </w:r>
           </w:p>
         </w:tc>
       </w:tr>
@@ -2484,16 +2449,8 @@
               <w:rPr>
                 <w:spacing w:val="-2"/>
               </w:rPr>
-              <w:t>………………</w:t>
-            </w:r>
-            <w:proofErr w:type="gramStart"/>
-            <w:r>
-              <w:rPr>
-                <w:spacing w:val="-2"/>
-              </w:rPr>
-              <w:t>…..</w:t>
-            </w:r>
-            <w:proofErr w:type="gramEnd"/>
+              <w:t>…………………..</w:t>
+            </w:r>
           </w:p>
         </w:tc>
       </w:tr>
@@ -2665,16 +2622,8 @@
               <w:rPr>
                 <w:spacing w:val="-2"/>
               </w:rPr>
-              <w:t>………………</w:t>
-            </w:r>
-            <w:proofErr w:type="gramStart"/>
-            <w:r>
-              <w:rPr>
-                <w:spacing w:val="-2"/>
-              </w:rPr>
-              <w:t>…..</w:t>
-            </w:r>
-            <w:proofErr w:type="gramEnd"/>
+              <w:t>…………………..</w:t>
+            </w:r>
           </w:p>
         </w:tc>
       </w:tr>
@@ -2683,7 +2632,7 @@
       <w:pPr>
         <w:pStyle w:val="TableParagraph"/>
         <w:sectPr>
-          <w:headerReference w:type="first" r:id="rId8"/>
+          <w:headerReference w:type="first" r:id="rId13"/>
           <w:pgSz w:w="12240" w:h="20160"/>
           <w:pgMar w:top="1420" w:right="1080" w:bottom="280" w:left="1080" w:header="720" w:footer="720" w:gutter="0"/>
           <w:cols w:space="720"/>
@@ -5136,7 +5085,7 @@
       </w:pPr>
     </w:p>
     <w:sectPr>
-      <w:headerReference w:type="default" r:id="rId9"/>
+      <w:headerReference w:type="default" r:id="rId14"/>
       <w:pgSz w:w="12240" w:h="20160"/>
       <w:pgMar w:top="1480" w:right="1080" w:bottom="280" w:left="1080" w:header="1245" w:footer="0" w:gutter="0"/>
       <w:cols w:space="720"/>
@@ -5146,7 +5095,7 @@
 </file>
 
 <file path=word/endnotes.xml><?xml version="1.0" encoding="utf-8"?>
-<w:endnotes xmlns:wpc="http://schemas.microsoft.com/office/word/2010/wordprocessingCanvas" xmlns:cx="http://schemas.microsoft.com/office/drawing/2014/chartex" xmlns:cx1="http://schemas.microsoft.com/office/drawing/2015/9/8/chartex" xmlns:cx2="http://schemas.microsoft.com/office/drawing/2015/10/21/chartex" xmlns:cx3="http://schemas.microsoft.com/office/drawing/2016/5/9/chartex" xmlns:cx4="http://schemas.microsoft.com/office/drawing/2016/5/10/chartex" xmlns:cx5="http://schemas.microsoft.com/office/drawing/2016/5/11/chartex" xmlns:cx6="http://schemas.microsoft.com/office/drawing/2016/5/12/chartex" xmlns:cx7="http://schemas.microsoft.com/office/drawing/2016/5/13/chartex" xmlns:cx8="http://schemas.microsoft.com/office/drawing/2016/5/14/chartex" xmlns:mc="http://schemas.openxmlformats.org/markup-compatibility/2006" xmlns:aink="http://schemas.microsoft.com/office/drawing/2016/ink" xmlns:am3d="http://schemas.microsoft.com/office/drawing/2017/model3d" xmlns:o="urn:schemas-microsoft-com:office:office" xmlns:oel="http://schemas.microsoft.com/office/2019/extlst" xmlns:r="http://schemas.openxmlformats.org/officeDocument/2006/relationships" xmlns:m="http://schemas.openxmlformats.org/officeDocument/2006/math" xmlns:v="urn:schemas-microsoft-com:vml" xmlns:wp14="http://schemas.microsoft.com/office/word/2010/wordprocessingDrawing" xmlns:wp="http://schemas.openxmlformats.org/drawingml/2006/wordprocessingDrawing" xmlns:w10="urn:schemas-microsoft-com:office:word" xmlns:w="http://schemas.openxmlformats.org/wordprocessingml/2006/main" xmlns:w14="http://schemas.microsoft.com/office/word/2010/wordml" xmlns:w15="http://schemas.microsoft.com/office/word/2012/wordml" xmlns:w16cex="http://schemas.microsoft.com/office/word/2018/wordml/cex" xmlns:w16cid="http://schemas.microsoft.com/office/word/2016/wordml/cid" xmlns:w16="http://schemas.microsoft.com/office/word/2018/wordml" xmlns:w16du="http://schemas.microsoft.com/office/word/2023/wordml/word16du" xmlns:w16sdtdh="http://schemas.microsoft.com/office/word/2020/wordml/sdtdatahash" xmlns:w16sdtfl="http://schemas.microsoft.com/office/word/2024/wordml/sdtformatlock" xmlns:w16se="http://schemas.microsoft.com/office/word/2015/wordml/symex" xmlns:wpg="http://schemas.microsoft.com/office/word/2010/wordprocessingGroup" xmlns:wpi="http://schemas.microsoft.com/office/word/2010/wordprocessingInk" xmlns:wne="http://schemas.microsoft.com/office/word/2006/wordml" xmlns:wps="http://schemas.microsoft.com/office/word/2010/wordprocessingShape" mc:Ignorable="w14 w15 w16se w16cid w16 w16cex w16sdtdh w16sdtfl w16du wp14">
+<w:endnotes xmlns:wpc="http://schemas.microsoft.com/office/word/2010/wordprocessingCanvas" xmlns:cx="http://schemas.microsoft.com/office/drawing/2014/chartex" xmlns:cx1="http://schemas.microsoft.com/office/drawing/2015/9/8/chartex" xmlns:cx2="http://schemas.microsoft.com/office/drawing/2015/10/21/chartex" xmlns:cx3="http://schemas.microsoft.com/office/drawing/2016/5/9/chartex" xmlns:cx4="http://schemas.microsoft.com/office/drawing/2016/5/10/chartex" xmlns:cx5="http://schemas.microsoft.com/office/drawing/2016/5/11/chartex" xmlns:cx6="http://schemas.microsoft.com/office/drawing/2016/5/12/chartex" xmlns:cx7="http://schemas.microsoft.com/office/drawing/2016/5/13/chartex" xmlns:cx8="http://schemas.microsoft.com/office/drawing/2016/5/14/chartex" xmlns:mc="http://schemas.openxmlformats.org/markup-compatibility/2006" xmlns:aink="http://schemas.microsoft.com/office/drawing/2016/ink" xmlns:am3d="http://schemas.microsoft.com/office/drawing/2017/model3d" xmlns:o="urn:schemas-microsoft-com:office:office" xmlns:oel="http://schemas.microsoft.com/office/2019/extlst" xmlns:r="http://schemas.openxmlformats.org/officeDocument/2006/relationships" xmlns:m="http://schemas.openxmlformats.org/officeDocument/2006/math" xmlns:v="urn:schemas-microsoft-com:vml" xmlns:wp14="http://schemas.microsoft.com/office/word/2010/wordprocessingDrawing" xmlns:wp="http://schemas.openxmlformats.org/drawingml/2006/wordprocessingDrawing" xmlns:w10="urn:schemas-microsoft-com:office:word" xmlns:w="http://schemas.openxmlformats.org/wordprocessingml/2006/main" xmlns:w14="http://schemas.microsoft.com/office/word/2010/wordml" xmlns:w15="http://schemas.microsoft.com/office/word/2012/wordml" xmlns:w16cex="http://schemas.microsoft.com/office/word/2018/wordml/cex" xmlns:w16cid="http://schemas.microsoft.com/office/word/2016/wordml/cid" xmlns:w16="http://schemas.microsoft.com/office/word/2018/wordml" xmlns:w16sdtdh="http://schemas.microsoft.com/office/word/2020/wordml/sdtdatahash" xmlns:w16se="http://schemas.microsoft.com/office/word/2015/wordml/symex" xmlns:wpg="http://schemas.microsoft.com/office/word/2010/wordprocessingGroup" xmlns:wpi="http://schemas.microsoft.com/office/word/2010/wordprocessingInk" xmlns:wne="http://schemas.microsoft.com/office/word/2006/wordml" xmlns:wps="http://schemas.microsoft.com/office/word/2010/wordprocessingShape" mc:Ignorable="w14 w15 w16se w16cid w16 w16cex w16sdtdh wp14">
   <w:endnote w:type="separator" w:id="-1">
     <w:p>
       <w:r>
@@ -5164,8 +5113,38 @@
 </w:endnotes>
 </file>
 
+<file path=word/footer1.xml><?xml version="1.0" encoding="utf-8"?>
+<w:ftr xmlns:wpc="http://schemas.microsoft.com/office/word/2010/wordprocessingCanvas" xmlns:cx="http://schemas.microsoft.com/office/drawing/2014/chartex" xmlns:cx1="http://schemas.microsoft.com/office/drawing/2015/9/8/chartex" xmlns:cx2="http://schemas.microsoft.com/office/drawing/2015/10/21/chartex" xmlns:cx3="http://schemas.microsoft.com/office/drawing/2016/5/9/chartex" xmlns:cx4="http://schemas.microsoft.com/office/drawing/2016/5/10/chartex" xmlns:cx5="http://schemas.microsoft.com/office/drawing/2016/5/11/chartex" xmlns:cx6="http://schemas.microsoft.com/office/drawing/2016/5/12/chartex" xmlns:cx7="http://schemas.microsoft.com/office/drawing/2016/5/13/chartex" xmlns:cx8="http://schemas.microsoft.com/office/drawing/2016/5/14/chartex" xmlns:mc="http://schemas.openxmlformats.org/markup-compatibility/2006" xmlns:aink="http://schemas.microsoft.com/office/drawing/2016/ink" xmlns:am3d="http://schemas.microsoft.com/office/drawing/2017/model3d" xmlns:o="urn:schemas-microsoft-com:office:office" xmlns:oel="http://schemas.microsoft.com/office/2019/extlst" xmlns:r="http://schemas.openxmlformats.org/officeDocument/2006/relationships" xmlns:m="http://schemas.openxmlformats.org/officeDocument/2006/math" xmlns:v="urn:schemas-microsoft-com:vml" xmlns:wp14="http://schemas.microsoft.com/office/word/2010/wordprocessingDrawing" xmlns:wp="http://schemas.openxmlformats.org/drawingml/2006/wordprocessingDrawing" xmlns:w10="urn:schemas-microsoft-com:office:word" xmlns:w="http://schemas.openxmlformats.org/wordprocessingml/2006/main" xmlns:w14="http://schemas.microsoft.com/office/word/2010/wordml" xmlns:w15="http://schemas.microsoft.com/office/word/2012/wordml" xmlns:w16cex="http://schemas.microsoft.com/office/word/2018/wordml/cex" xmlns:w16cid="http://schemas.microsoft.com/office/word/2016/wordml/cid" xmlns:w16="http://schemas.microsoft.com/office/word/2018/wordml" xmlns:w16sdtdh="http://schemas.microsoft.com/office/word/2020/wordml/sdtdatahash" xmlns:w16se="http://schemas.microsoft.com/office/word/2015/wordml/symex" xmlns:wpg="http://schemas.microsoft.com/office/word/2010/wordprocessingGroup" xmlns:wpi="http://schemas.microsoft.com/office/word/2010/wordprocessingInk" xmlns:wne="http://schemas.microsoft.com/office/word/2006/wordml" xmlns:wps="http://schemas.microsoft.com/office/word/2010/wordprocessingShape" mc:Ignorable="w14 w15 w16se w16cid w16 w16cex w16sdtdh wp14">
+  <w:p>
+    <w:pPr>
+      <w:pStyle w:val="Footer"/>
+    </w:pPr>
+  </w:p>
+</w:ftr>
+</file>
+
+<file path=word/footer2.xml><?xml version="1.0" encoding="utf-8"?>
+<w:ftr xmlns:wpc="http://schemas.microsoft.com/office/word/2010/wordprocessingCanvas" xmlns:cx="http://schemas.microsoft.com/office/drawing/2014/chartex" xmlns:cx1="http://schemas.microsoft.com/office/drawing/2015/9/8/chartex" xmlns:cx2="http://schemas.microsoft.com/office/drawing/2015/10/21/chartex" xmlns:cx3="http://schemas.microsoft.com/office/drawing/2016/5/9/chartex" xmlns:cx4="http://schemas.microsoft.com/office/drawing/2016/5/10/chartex" xmlns:cx5="http://schemas.microsoft.com/office/drawing/2016/5/11/chartex" xmlns:cx6="http://schemas.microsoft.com/office/drawing/2016/5/12/chartex" xmlns:cx7="http://schemas.microsoft.com/office/drawing/2016/5/13/chartex" xmlns:cx8="http://schemas.microsoft.com/office/drawing/2016/5/14/chartex" xmlns:mc="http://schemas.openxmlformats.org/markup-compatibility/2006" xmlns:aink="http://schemas.microsoft.com/office/drawing/2016/ink" xmlns:am3d="http://schemas.microsoft.com/office/drawing/2017/model3d" xmlns:o="urn:schemas-microsoft-com:office:office" xmlns:oel="http://schemas.microsoft.com/office/2019/extlst" xmlns:r="http://schemas.openxmlformats.org/officeDocument/2006/relationships" xmlns:m="http://schemas.openxmlformats.org/officeDocument/2006/math" xmlns:v="urn:schemas-microsoft-com:vml" xmlns:wp14="http://schemas.microsoft.com/office/word/2010/wordprocessingDrawing" xmlns:wp="http://schemas.openxmlformats.org/drawingml/2006/wordprocessingDrawing" xmlns:w10="urn:schemas-microsoft-com:office:word" xmlns:w="http://schemas.openxmlformats.org/wordprocessingml/2006/main" xmlns:w14="http://schemas.microsoft.com/office/word/2010/wordml" xmlns:w15="http://schemas.microsoft.com/office/word/2012/wordml" xmlns:w16cex="http://schemas.microsoft.com/office/word/2018/wordml/cex" xmlns:w16cid="http://schemas.microsoft.com/office/word/2016/wordml/cid" xmlns:w16="http://schemas.microsoft.com/office/word/2018/wordml" xmlns:w16sdtdh="http://schemas.microsoft.com/office/word/2020/wordml/sdtdatahash" xmlns:w16se="http://schemas.microsoft.com/office/word/2015/wordml/symex" xmlns:wpg="http://schemas.microsoft.com/office/word/2010/wordprocessingGroup" xmlns:wpi="http://schemas.microsoft.com/office/word/2010/wordprocessingInk" xmlns:wne="http://schemas.microsoft.com/office/word/2006/wordml" xmlns:wps="http://schemas.microsoft.com/office/word/2010/wordprocessingShape" mc:Ignorable="w14 w15 w16se w16cid w16 w16cex w16sdtdh wp14">
+  <w:p>
+    <w:pPr>
+      <w:pStyle w:val="Footer"/>
+    </w:pPr>
+  </w:p>
+</w:ftr>
+</file>
+
+<file path=word/footer3.xml><?xml version="1.0" encoding="utf-8"?>
+<w:ftr xmlns:wpc="http://schemas.microsoft.com/office/word/2010/wordprocessingCanvas" xmlns:cx="http://schemas.microsoft.com/office/drawing/2014/chartex" xmlns:cx1="http://schemas.microsoft.com/office/drawing/2015/9/8/chartex" xmlns:cx2="http://schemas.microsoft.com/office/drawing/2015/10/21/chartex" xmlns:cx3="http://schemas.microsoft.com/office/drawing/2016/5/9/chartex" xmlns:cx4="http://schemas.microsoft.com/office/drawing/2016/5/10/chartex" xmlns:cx5="http://schemas.microsoft.com/office/drawing/2016/5/11/chartex" xmlns:cx6="http://schemas.microsoft.com/office/drawing/2016/5/12/chartex" xmlns:cx7="http://schemas.microsoft.com/office/drawing/2016/5/13/chartex" xmlns:cx8="http://schemas.microsoft.com/office/drawing/2016/5/14/chartex" xmlns:mc="http://schemas.openxmlformats.org/markup-compatibility/2006" xmlns:aink="http://schemas.microsoft.com/office/drawing/2016/ink" xmlns:am3d="http://schemas.microsoft.com/office/drawing/2017/model3d" xmlns:o="urn:schemas-microsoft-com:office:office" xmlns:oel="http://schemas.microsoft.com/office/2019/extlst" xmlns:r="http://schemas.openxmlformats.org/officeDocument/2006/relationships" xmlns:m="http://schemas.openxmlformats.org/officeDocument/2006/math" xmlns:v="urn:schemas-microsoft-com:vml" xmlns:wp14="http://schemas.microsoft.com/office/word/2010/wordprocessingDrawing" xmlns:wp="http://schemas.openxmlformats.org/drawingml/2006/wordprocessingDrawing" xmlns:w10="urn:schemas-microsoft-com:office:word" xmlns:w="http://schemas.openxmlformats.org/wordprocessingml/2006/main" xmlns:w14="http://schemas.microsoft.com/office/word/2010/wordml" xmlns:w15="http://schemas.microsoft.com/office/word/2012/wordml" xmlns:w16cex="http://schemas.microsoft.com/office/word/2018/wordml/cex" xmlns:w16cid="http://schemas.microsoft.com/office/word/2016/wordml/cid" xmlns:w16="http://schemas.microsoft.com/office/word/2018/wordml" xmlns:w16sdtdh="http://schemas.microsoft.com/office/word/2020/wordml/sdtdatahash" xmlns:w16se="http://schemas.microsoft.com/office/word/2015/wordml/symex" xmlns:wpg="http://schemas.microsoft.com/office/word/2010/wordprocessingGroup" xmlns:wpi="http://schemas.microsoft.com/office/word/2010/wordprocessingInk" xmlns:wne="http://schemas.microsoft.com/office/word/2006/wordml" xmlns:wps="http://schemas.microsoft.com/office/word/2010/wordprocessingShape" mc:Ignorable="w14 w15 w16se w16cid w16 w16cex w16sdtdh wp14">
+  <w:p>
+    <w:pPr>
+      <w:pStyle w:val="Footer"/>
+    </w:pPr>
+  </w:p>
+</w:ftr>
+</file>
+
 <file path=word/footnotes.xml><?xml version="1.0" encoding="utf-8"?>
-<w:footnotes xmlns:wpc="http://schemas.microsoft.com/office/word/2010/wordprocessingCanvas" xmlns:cx="http://schemas.microsoft.com/office/drawing/2014/chartex" xmlns:cx1="http://schemas.microsoft.com/office/drawing/2015/9/8/chartex" xmlns:cx2="http://schemas.microsoft.com/office/drawing/2015/10/21/chartex" xmlns:cx3="http://schemas.microsoft.com/office/drawing/2016/5/9/chartex" xmlns:cx4="http://schemas.microsoft.com/office/drawing/2016/5/10/chartex" xmlns:cx5="http://schemas.microsoft.com/office/drawing/2016/5/11/chartex" xmlns:cx6="http://schemas.microsoft.com/office/drawing/2016/5/12/chartex" xmlns:cx7="http://schemas.microsoft.com/office/drawing/2016/5/13/chartex" xmlns:cx8="http://schemas.microsoft.com/office/drawing/2016/5/14/chartex" xmlns:mc="http://schemas.openxmlformats.org/markup-compatibility/2006" xmlns:aink="http://schemas.microsoft.com/office/drawing/2016/ink" xmlns:am3d="http://schemas.microsoft.com/office/drawing/2017/model3d" xmlns:o="urn:schemas-microsoft-com:office:office" xmlns:oel="http://schemas.microsoft.com/office/2019/extlst" xmlns:r="http://schemas.openxmlformats.org/officeDocument/2006/relationships" xmlns:m="http://schemas.openxmlformats.org/officeDocument/2006/math" xmlns:v="urn:schemas-microsoft-com:vml" xmlns:wp14="http://schemas.microsoft.com/office/word/2010/wordprocessingDrawing" xmlns:wp="http://schemas.openxmlformats.org/drawingml/2006/wordprocessingDrawing" xmlns:w10="urn:schemas-microsoft-com:office:word" xmlns:w="http://schemas.openxmlformats.org/wordprocessingml/2006/main" xmlns:w14="http://schemas.microsoft.com/office/word/2010/wordml" xmlns:w15="http://schemas.microsoft.com/office/word/2012/wordml" xmlns:w16cex="http://schemas.microsoft.com/office/word/2018/wordml/cex" xmlns:w16cid="http://schemas.microsoft.com/office/word/2016/wordml/cid" xmlns:w16="http://schemas.microsoft.com/office/word/2018/wordml" xmlns:w16du="http://schemas.microsoft.com/office/word/2023/wordml/word16du" xmlns:w16sdtdh="http://schemas.microsoft.com/office/word/2020/wordml/sdtdatahash" xmlns:w16sdtfl="http://schemas.microsoft.com/office/word/2024/wordml/sdtformatlock" xmlns:w16se="http://schemas.microsoft.com/office/word/2015/wordml/symex" xmlns:wpg="http://schemas.microsoft.com/office/word/2010/wordprocessingGroup" xmlns:wpi="http://schemas.microsoft.com/office/word/2010/wordprocessingInk" xmlns:wne="http://schemas.microsoft.com/office/word/2006/wordml" xmlns:wps="http://schemas.microsoft.com/office/word/2010/wordprocessingShape" mc:Ignorable="w14 w15 w16se w16cid w16 w16cex w16sdtdh w16sdtfl w16du wp14">
+<w:footnotes xmlns:wpc="http://schemas.microsoft.com/office/word/2010/wordprocessingCanvas" xmlns:cx="http://schemas.microsoft.com/office/drawing/2014/chartex" xmlns:cx1="http://schemas.microsoft.com/office/drawing/2015/9/8/chartex" xmlns:cx2="http://schemas.microsoft.com/office/drawing/2015/10/21/chartex" xmlns:cx3="http://schemas.microsoft.com/office/drawing/2016/5/9/chartex" xmlns:cx4="http://schemas.microsoft.com/office/drawing/2016/5/10/chartex" xmlns:cx5="http://schemas.microsoft.com/office/drawing/2016/5/11/chartex" xmlns:cx6="http://schemas.microsoft.com/office/drawing/2016/5/12/chartex" xmlns:cx7="http://schemas.microsoft.com/office/drawing/2016/5/13/chartex" xmlns:cx8="http://schemas.microsoft.com/office/drawing/2016/5/14/chartex" xmlns:mc="http://schemas.openxmlformats.org/markup-compatibility/2006" xmlns:aink="http://schemas.microsoft.com/office/drawing/2016/ink" xmlns:am3d="http://schemas.microsoft.com/office/drawing/2017/model3d" xmlns:o="urn:schemas-microsoft-com:office:office" xmlns:oel="http://schemas.microsoft.com/office/2019/extlst" xmlns:r="http://schemas.openxmlformats.org/officeDocument/2006/relationships" xmlns:m="http://schemas.openxmlformats.org/officeDocument/2006/math" xmlns:v="urn:schemas-microsoft-com:vml" xmlns:wp14="http://schemas.microsoft.com/office/word/2010/wordprocessingDrawing" xmlns:wp="http://schemas.openxmlformats.org/drawingml/2006/wordprocessingDrawing" xmlns:w10="urn:schemas-microsoft-com:office:word" xmlns:w="http://schemas.openxmlformats.org/wordprocessingml/2006/main" xmlns:w14="http://schemas.microsoft.com/office/word/2010/wordml" xmlns:w15="http://schemas.microsoft.com/office/word/2012/wordml" xmlns:w16cex="http://schemas.microsoft.com/office/word/2018/wordml/cex" xmlns:w16cid="http://schemas.microsoft.com/office/word/2016/wordml/cid" xmlns:w16="http://schemas.microsoft.com/office/word/2018/wordml" xmlns:w16sdtdh="http://schemas.microsoft.com/office/word/2020/wordml/sdtdatahash" xmlns:w16se="http://schemas.microsoft.com/office/word/2015/wordml/symex" xmlns:wpg="http://schemas.microsoft.com/office/word/2010/wordprocessingGroup" xmlns:wpi="http://schemas.microsoft.com/office/word/2010/wordprocessingInk" xmlns:wne="http://schemas.microsoft.com/office/word/2006/wordml" xmlns:wps="http://schemas.microsoft.com/office/word/2010/wordprocessingShape" mc:Ignorable="w14 w15 w16se w16cid w16 w16cex w16sdtdh wp14">
   <w:footnote w:type="separator" w:id="-1">
     <w:p>
       <w:r>
@@ -5184,7 +5163,17 @@
 </file>
 
 <file path=word/header1.xml><?xml version="1.0" encoding="utf-8"?>
-<w:hdr xmlns:wpc="http://schemas.microsoft.com/office/word/2010/wordprocessingCanvas" xmlns:cx="http://schemas.microsoft.com/office/drawing/2014/chartex" xmlns:cx1="http://schemas.microsoft.com/office/drawing/2015/9/8/chartex" xmlns:cx2="http://schemas.microsoft.com/office/drawing/2015/10/21/chartex" xmlns:cx3="http://schemas.microsoft.com/office/drawing/2016/5/9/chartex" xmlns:cx4="http://schemas.microsoft.com/office/drawing/2016/5/10/chartex" xmlns:cx5="http://schemas.microsoft.com/office/drawing/2016/5/11/chartex" xmlns:cx6="http://schemas.microsoft.com/office/drawing/2016/5/12/chartex" xmlns:cx7="http://schemas.microsoft.com/office/drawing/2016/5/13/chartex" xmlns:cx8="http://schemas.microsoft.com/office/drawing/2016/5/14/chartex" xmlns:mc="http://schemas.openxmlformats.org/markup-compatibility/2006" xmlns:aink="http://schemas.microsoft.com/office/drawing/2016/ink" xmlns:am3d="http://schemas.microsoft.com/office/drawing/2017/model3d" xmlns:o="urn:schemas-microsoft-com:office:office" xmlns:oel="http://schemas.microsoft.com/office/2019/extlst" xmlns:r="http://schemas.openxmlformats.org/officeDocument/2006/relationships" xmlns:m="http://schemas.openxmlformats.org/officeDocument/2006/math" xmlns:v="urn:schemas-microsoft-com:vml" xmlns:wp14="http://schemas.microsoft.com/office/word/2010/wordprocessingDrawing" xmlns:wp="http://schemas.openxmlformats.org/drawingml/2006/wordprocessingDrawing" xmlns:w10="urn:schemas-microsoft-com:office:word" xmlns:w="http://schemas.openxmlformats.org/wordprocessingml/2006/main" xmlns:w14="http://schemas.microsoft.com/office/word/2010/wordml" xmlns:w15="http://schemas.microsoft.com/office/word/2012/wordml" xmlns:w16cex="http://schemas.microsoft.com/office/word/2018/wordml/cex" xmlns:w16cid="http://schemas.microsoft.com/office/word/2016/wordml/cid" xmlns:w16="http://schemas.microsoft.com/office/word/2018/wordml" xmlns:w16du="http://schemas.microsoft.com/office/word/2023/wordml/word16du" xmlns:w16sdtdh="http://schemas.microsoft.com/office/word/2020/wordml/sdtdatahash" xmlns:w16sdtfl="http://schemas.microsoft.com/office/word/2024/wordml/sdtformatlock" xmlns:w16se="http://schemas.microsoft.com/office/word/2015/wordml/symex" xmlns:wpg="http://schemas.microsoft.com/office/word/2010/wordprocessingGroup" xmlns:wpi="http://schemas.microsoft.com/office/word/2010/wordprocessingInk" xmlns:wne="http://schemas.microsoft.com/office/word/2006/wordml" xmlns:wps="http://schemas.microsoft.com/office/word/2010/wordprocessingShape" mc:Ignorable="w14 w15 w16se w16cid w16 w16cex w16sdtdh w16sdtfl w16du wp14">
+<w:hdr xmlns:wpc="http://schemas.microsoft.com/office/word/2010/wordprocessingCanvas" xmlns:cx="http://schemas.microsoft.com/office/drawing/2014/chartex" xmlns:cx1="http://schemas.microsoft.com/office/drawing/2015/9/8/chartex" xmlns:cx2="http://schemas.microsoft.com/office/drawing/2015/10/21/chartex" xmlns:cx3="http://schemas.microsoft.com/office/drawing/2016/5/9/chartex" xmlns:cx4="http://schemas.microsoft.com/office/drawing/2016/5/10/chartex" xmlns:cx5="http://schemas.microsoft.com/office/drawing/2016/5/11/chartex" xmlns:cx6="http://schemas.microsoft.com/office/drawing/2016/5/12/chartex" xmlns:cx7="http://schemas.microsoft.com/office/drawing/2016/5/13/chartex" xmlns:cx8="http://schemas.microsoft.com/office/drawing/2016/5/14/chartex" xmlns:mc="http://schemas.openxmlformats.org/markup-compatibility/2006" xmlns:aink="http://schemas.microsoft.com/office/drawing/2016/ink" xmlns:am3d="http://schemas.microsoft.com/office/drawing/2017/model3d" xmlns:o="urn:schemas-microsoft-com:office:office" xmlns:oel="http://schemas.microsoft.com/office/2019/extlst" xmlns:r="http://schemas.openxmlformats.org/officeDocument/2006/relationships" xmlns:m="http://schemas.openxmlformats.org/officeDocument/2006/math" xmlns:v="urn:schemas-microsoft-com:vml" xmlns:wp14="http://schemas.microsoft.com/office/word/2010/wordprocessingDrawing" xmlns:wp="http://schemas.openxmlformats.org/drawingml/2006/wordprocessingDrawing" xmlns:w10="urn:schemas-microsoft-com:office:word" xmlns:w="http://schemas.openxmlformats.org/wordprocessingml/2006/main" xmlns:w14="http://schemas.microsoft.com/office/word/2010/wordml" xmlns:w15="http://schemas.microsoft.com/office/word/2012/wordml" xmlns:w16cex="http://schemas.microsoft.com/office/word/2018/wordml/cex" xmlns:w16cid="http://schemas.microsoft.com/office/word/2016/wordml/cid" xmlns:w16="http://schemas.microsoft.com/office/word/2018/wordml" xmlns:w16sdtdh="http://schemas.microsoft.com/office/word/2020/wordml/sdtdatahash" xmlns:w16se="http://schemas.microsoft.com/office/word/2015/wordml/symex" xmlns:wpg="http://schemas.microsoft.com/office/word/2010/wordprocessingGroup" xmlns:wpi="http://schemas.microsoft.com/office/word/2010/wordprocessingInk" xmlns:wne="http://schemas.microsoft.com/office/word/2006/wordml" xmlns:wps="http://schemas.microsoft.com/office/word/2010/wordprocessingShape" mc:Ignorable="w14 w15 w16se w16cid w16 w16cex w16sdtdh wp14">
+  <w:p>
+    <w:pPr>
+      <w:pStyle w:val="Header"/>
+    </w:pPr>
+  </w:p>
+</w:hdr>
+</file>
+
+<file path=word/header2.xml><?xml version="1.0" encoding="utf-8"?>
+<w:hdr xmlns:wpc="http://schemas.microsoft.com/office/word/2010/wordprocessingCanvas" xmlns:cx="http://schemas.microsoft.com/office/drawing/2014/chartex" xmlns:cx1="http://schemas.microsoft.com/office/drawing/2015/9/8/chartex" xmlns:cx2="http://schemas.microsoft.com/office/drawing/2015/10/21/chartex" xmlns:cx3="http://schemas.microsoft.com/office/drawing/2016/5/9/chartex" xmlns:cx4="http://schemas.microsoft.com/office/drawing/2016/5/10/chartex" xmlns:cx5="http://schemas.microsoft.com/office/drawing/2016/5/11/chartex" xmlns:cx6="http://schemas.microsoft.com/office/drawing/2016/5/12/chartex" xmlns:cx7="http://schemas.microsoft.com/office/drawing/2016/5/13/chartex" xmlns:cx8="http://schemas.microsoft.com/office/drawing/2016/5/14/chartex" xmlns:mc="http://schemas.openxmlformats.org/markup-compatibility/2006" xmlns:aink="http://schemas.microsoft.com/office/drawing/2016/ink" xmlns:am3d="http://schemas.microsoft.com/office/drawing/2017/model3d" xmlns:o="urn:schemas-microsoft-com:office:office" xmlns:oel="http://schemas.microsoft.com/office/2019/extlst" xmlns:r="http://schemas.openxmlformats.org/officeDocument/2006/relationships" xmlns:m="http://schemas.openxmlformats.org/officeDocument/2006/math" xmlns:v="urn:schemas-microsoft-com:vml" xmlns:wp14="http://schemas.microsoft.com/office/word/2010/wordprocessingDrawing" xmlns:wp="http://schemas.openxmlformats.org/drawingml/2006/wordprocessingDrawing" xmlns:w10="urn:schemas-microsoft-com:office:word" xmlns:w="http://schemas.openxmlformats.org/wordprocessingml/2006/main" xmlns:w14="http://schemas.microsoft.com/office/word/2010/wordml" xmlns:w15="http://schemas.microsoft.com/office/word/2012/wordml" xmlns:w16cex="http://schemas.microsoft.com/office/word/2018/wordml/cex" xmlns:w16cid="http://schemas.microsoft.com/office/word/2016/wordml/cid" xmlns:w16="http://schemas.microsoft.com/office/word/2018/wordml" xmlns:w16sdtdh="http://schemas.microsoft.com/office/word/2020/wordml/sdtdatahash" xmlns:w16se="http://schemas.microsoft.com/office/word/2015/wordml/symex" xmlns:wpg="http://schemas.microsoft.com/office/word/2010/wordprocessingGroup" xmlns:wpi="http://schemas.microsoft.com/office/word/2010/wordprocessingInk" xmlns:wne="http://schemas.microsoft.com/office/word/2006/wordml" xmlns:wps="http://schemas.microsoft.com/office/word/2010/wordprocessingShape" mc:Ignorable="w14 w15 w16se w16cid w16 w16cex w16sdtdh wp14">
   <w:tbl>
     <w:tblPr>
       <w:tblStyle w:val="TableGrid"/>
@@ -5359,11 +5348,6 @@
             </w:drawing>
           </w:r>
         </w:p>
-        <w:p>
-          <w:pPr>
-            <w:pStyle w:val="Header"/>
-          </w:pPr>
-        </w:p>
       </w:tc>
       <w:tc>
         <w:tcPr>
@@ -5428,33 +5412,6 @@
             <w:t>SEKRETARIAT JENDERAL</w:t>
           </w:r>
         </w:p>
-        <w:p>
-          <w:pPr>
-            <w:rPr>
-              <w:rFonts w:ascii="Arial Narrow" w:hAnsi="Arial Narrow"/>
-              <w:b/>
-              <w:color w:val="284A61"/>
-              <w:sz w:val="32"/>
-              <w:szCs w:val="32"/>
-            </w:rPr>
-          </w:pPr>
-        </w:p>
-        <w:p>
-          <w:pPr>
-            <w:rPr>
-              <w:rFonts w:ascii="Arial Narrow" w:hAnsi="Arial Narrow"/>
-              <w:color w:val="000000" w:themeColor="text1"/>
-              <w:sz w:val="18"/>
-              <w:szCs w:val="18"/>
-            </w:rPr>
-          </w:pPr>
-        </w:p>
-        <w:p/>
-        <w:p>
-          <w:pPr>
-            <w:pStyle w:val="Header"/>
-          </w:pPr>
-        </w:p>
       </w:tc>
     </w:tr>
   </w:tbl>
@@ -5466,8 +5423,8 @@
 </w:hdr>
 </file>
 
-<file path=word/header2.xml><?xml version="1.0" encoding="utf-8"?>
-<w:hdr xmlns:wpc="http://schemas.microsoft.com/office/word/2010/wordprocessingCanvas" xmlns:cx="http://schemas.microsoft.com/office/drawing/2014/chartex" xmlns:cx1="http://schemas.microsoft.com/office/drawing/2015/9/8/chartex" xmlns:cx2="http://schemas.microsoft.com/office/drawing/2015/10/21/chartex" xmlns:cx3="http://schemas.microsoft.com/office/drawing/2016/5/9/chartex" xmlns:cx4="http://schemas.microsoft.com/office/drawing/2016/5/10/chartex" xmlns:cx5="http://schemas.microsoft.com/office/drawing/2016/5/11/chartex" xmlns:cx6="http://schemas.microsoft.com/office/drawing/2016/5/12/chartex" xmlns:cx7="http://schemas.microsoft.com/office/drawing/2016/5/13/chartex" xmlns:cx8="http://schemas.microsoft.com/office/drawing/2016/5/14/chartex" xmlns:mc="http://schemas.openxmlformats.org/markup-compatibility/2006" xmlns:aink="http://schemas.microsoft.com/office/drawing/2016/ink" xmlns:am3d="http://schemas.microsoft.com/office/drawing/2017/model3d" xmlns:o="urn:schemas-microsoft-com:office:office" xmlns:oel="http://schemas.microsoft.com/office/2019/extlst" xmlns:r="http://schemas.openxmlformats.org/officeDocument/2006/relationships" xmlns:m="http://schemas.openxmlformats.org/officeDocument/2006/math" xmlns:v="urn:schemas-microsoft-com:vml" xmlns:wp14="http://schemas.microsoft.com/office/word/2010/wordprocessingDrawing" xmlns:wp="http://schemas.openxmlformats.org/drawingml/2006/wordprocessingDrawing" xmlns:w10="urn:schemas-microsoft-com:office:word" xmlns:w="http://schemas.openxmlformats.org/wordprocessingml/2006/main" xmlns:w14="http://schemas.microsoft.com/office/word/2010/wordml" xmlns:w15="http://schemas.microsoft.com/office/word/2012/wordml" xmlns:w16cex="http://schemas.microsoft.com/office/word/2018/wordml/cex" xmlns:w16cid="http://schemas.microsoft.com/office/word/2016/wordml/cid" xmlns:w16="http://schemas.microsoft.com/office/word/2018/wordml" xmlns:w16du="http://schemas.microsoft.com/office/word/2023/wordml/word16du" xmlns:w16sdtdh="http://schemas.microsoft.com/office/word/2020/wordml/sdtdatahash" xmlns:w16sdtfl="http://schemas.microsoft.com/office/word/2024/wordml/sdtformatlock" xmlns:w16se="http://schemas.microsoft.com/office/word/2015/wordml/symex" xmlns:wpg="http://schemas.microsoft.com/office/word/2010/wordprocessingGroup" xmlns:wpi="http://schemas.microsoft.com/office/word/2010/wordprocessingInk" xmlns:wne="http://schemas.microsoft.com/office/word/2006/wordml" xmlns:wps="http://schemas.microsoft.com/office/word/2010/wordprocessingShape" mc:Ignorable="w14 w15 w16se w16cid w16 w16cex w16sdtdh w16sdtfl w16du wp14">
+<file path=word/header3.xml><?xml version="1.0" encoding="utf-8"?>
+<w:hdr xmlns:wpc="http://schemas.microsoft.com/office/word/2010/wordprocessingCanvas" xmlns:cx="http://schemas.microsoft.com/office/drawing/2014/chartex" xmlns:cx1="http://schemas.microsoft.com/office/drawing/2015/9/8/chartex" xmlns:cx2="http://schemas.microsoft.com/office/drawing/2015/10/21/chartex" xmlns:cx3="http://schemas.microsoft.com/office/drawing/2016/5/9/chartex" xmlns:cx4="http://schemas.microsoft.com/office/drawing/2016/5/10/chartex" xmlns:cx5="http://schemas.microsoft.com/office/drawing/2016/5/11/chartex" xmlns:cx6="http://schemas.microsoft.com/office/drawing/2016/5/12/chartex" xmlns:cx7="http://schemas.microsoft.com/office/drawing/2016/5/13/chartex" xmlns:cx8="http://schemas.microsoft.com/office/drawing/2016/5/14/chartex" xmlns:mc="http://schemas.openxmlformats.org/markup-compatibility/2006" xmlns:aink="http://schemas.microsoft.com/office/drawing/2016/ink" xmlns:am3d="http://schemas.microsoft.com/office/drawing/2017/model3d" xmlns:o="urn:schemas-microsoft-com:office:office" xmlns:oel="http://schemas.microsoft.com/office/2019/extlst" xmlns:r="http://schemas.openxmlformats.org/officeDocument/2006/relationships" xmlns:m="http://schemas.openxmlformats.org/officeDocument/2006/math" xmlns:v="urn:schemas-microsoft-com:vml" xmlns:wp14="http://schemas.microsoft.com/office/word/2010/wordprocessingDrawing" xmlns:wp="http://schemas.openxmlformats.org/drawingml/2006/wordprocessingDrawing" xmlns:w10="urn:schemas-microsoft-com:office:word" xmlns:w="http://schemas.openxmlformats.org/wordprocessingml/2006/main" xmlns:w14="http://schemas.microsoft.com/office/word/2010/wordml" xmlns:w15="http://schemas.microsoft.com/office/word/2012/wordml" xmlns:w16cex="http://schemas.microsoft.com/office/word/2018/wordml/cex" xmlns:w16cid="http://schemas.microsoft.com/office/word/2016/wordml/cid" xmlns:w16="http://schemas.microsoft.com/office/word/2018/wordml" xmlns:w16sdtdh="http://schemas.microsoft.com/office/word/2020/wordml/sdtdatahash" xmlns:w16se="http://schemas.microsoft.com/office/word/2015/wordml/symex" xmlns:wpg="http://schemas.microsoft.com/office/word/2010/wordprocessingGroup" xmlns:wpi="http://schemas.microsoft.com/office/word/2010/wordprocessingInk" xmlns:wne="http://schemas.microsoft.com/office/word/2006/wordml" xmlns:wps="http://schemas.microsoft.com/office/word/2010/wordprocessingShape" mc:Ignorable="w14 w15 w16se w16cid w16 w16cex w16sdtdh wp14">
   <w:p>
     <w:pPr>
       <w:pStyle w:val="Header"/>
@@ -5476,8 +5433,18 @@
 </w:hdr>
 </file>
 
-<file path=word/header3.xml><?xml version="1.0" encoding="utf-8"?>
-<w:hdr xmlns:wpc="http://schemas.microsoft.com/office/word/2010/wordprocessingCanvas" xmlns:cx="http://schemas.microsoft.com/office/drawing/2014/chartex" xmlns:cx1="http://schemas.microsoft.com/office/drawing/2015/9/8/chartex" xmlns:cx2="http://schemas.microsoft.com/office/drawing/2015/10/21/chartex" xmlns:cx3="http://schemas.microsoft.com/office/drawing/2016/5/9/chartex" xmlns:cx4="http://schemas.microsoft.com/office/drawing/2016/5/10/chartex" xmlns:cx5="http://schemas.microsoft.com/office/drawing/2016/5/11/chartex" xmlns:cx6="http://schemas.microsoft.com/office/drawing/2016/5/12/chartex" xmlns:cx7="http://schemas.microsoft.com/office/drawing/2016/5/13/chartex" xmlns:cx8="http://schemas.microsoft.com/office/drawing/2016/5/14/chartex" xmlns:mc="http://schemas.openxmlformats.org/markup-compatibility/2006" xmlns:aink="http://schemas.microsoft.com/office/drawing/2016/ink" xmlns:am3d="http://schemas.microsoft.com/office/drawing/2017/model3d" xmlns:o="urn:schemas-microsoft-com:office:office" xmlns:oel="http://schemas.microsoft.com/office/2019/extlst" xmlns:r="http://schemas.openxmlformats.org/officeDocument/2006/relationships" xmlns:m="http://schemas.openxmlformats.org/officeDocument/2006/math" xmlns:v="urn:schemas-microsoft-com:vml" xmlns:wp14="http://schemas.microsoft.com/office/word/2010/wordprocessingDrawing" xmlns:wp="http://schemas.openxmlformats.org/drawingml/2006/wordprocessingDrawing" xmlns:w10="urn:schemas-microsoft-com:office:word" xmlns:w="http://schemas.openxmlformats.org/wordprocessingml/2006/main" xmlns:w14="http://schemas.microsoft.com/office/word/2010/wordml" xmlns:w15="http://schemas.microsoft.com/office/word/2012/wordml" xmlns:w16cex="http://schemas.microsoft.com/office/word/2018/wordml/cex" xmlns:w16cid="http://schemas.microsoft.com/office/word/2016/wordml/cid" xmlns:w16="http://schemas.microsoft.com/office/word/2018/wordml" xmlns:w16du="http://schemas.microsoft.com/office/word/2023/wordml/word16du" xmlns:w16sdtdh="http://schemas.microsoft.com/office/word/2020/wordml/sdtdatahash" xmlns:w16sdtfl="http://schemas.microsoft.com/office/word/2024/wordml/sdtformatlock" xmlns:w16se="http://schemas.microsoft.com/office/word/2015/wordml/symex" xmlns:wpg="http://schemas.microsoft.com/office/word/2010/wordprocessingGroup" xmlns:wpi="http://schemas.microsoft.com/office/word/2010/wordprocessingInk" xmlns:wne="http://schemas.microsoft.com/office/word/2006/wordml" xmlns:wps="http://schemas.microsoft.com/office/word/2010/wordprocessingShape" mc:Ignorable="w14 w15 w16se w16cid w16 w16cex w16sdtdh w16sdtfl w16du wp14">
+<file path=word/header4.xml><?xml version="1.0" encoding="utf-8"?>
+<w:hdr xmlns:wpc="http://schemas.microsoft.com/office/word/2010/wordprocessingCanvas" xmlns:cx="http://schemas.microsoft.com/office/drawing/2014/chartex" xmlns:cx1="http://schemas.microsoft.com/office/drawing/2015/9/8/chartex" xmlns:cx2="http://schemas.microsoft.com/office/drawing/2015/10/21/chartex" xmlns:cx3="http://schemas.microsoft.com/office/drawing/2016/5/9/chartex" xmlns:cx4="http://schemas.microsoft.com/office/drawing/2016/5/10/chartex" xmlns:cx5="http://schemas.microsoft.com/office/drawing/2016/5/11/chartex" xmlns:cx6="http://schemas.microsoft.com/office/drawing/2016/5/12/chartex" xmlns:cx7="http://schemas.microsoft.com/office/drawing/2016/5/13/chartex" xmlns:cx8="http://schemas.microsoft.com/office/drawing/2016/5/14/chartex" xmlns:mc="http://schemas.openxmlformats.org/markup-compatibility/2006" xmlns:aink="http://schemas.microsoft.com/office/drawing/2016/ink" xmlns:am3d="http://schemas.microsoft.com/office/drawing/2017/model3d" xmlns:o="urn:schemas-microsoft-com:office:office" xmlns:oel="http://schemas.microsoft.com/office/2019/extlst" xmlns:r="http://schemas.openxmlformats.org/officeDocument/2006/relationships" xmlns:m="http://schemas.openxmlformats.org/officeDocument/2006/math" xmlns:v="urn:schemas-microsoft-com:vml" xmlns:wp14="http://schemas.microsoft.com/office/word/2010/wordprocessingDrawing" xmlns:wp="http://schemas.openxmlformats.org/drawingml/2006/wordprocessingDrawing" xmlns:w10="urn:schemas-microsoft-com:office:word" xmlns:w="http://schemas.openxmlformats.org/wordprocessingml/2006/main" xmlns:w14="http://schemas.microsoft.com/office/word/2010/wordml" xmlns:w15="http://schemas.microsoft.com/office/word/2012/wordml" xmlns:w16cex="http://schemas.microsoft.com/office/word/2018/wordml/cex" xmlns:w16cid="http://schemas.microsoft.com/office/word/2016/wordml/cid" xmlns:w16="http://schemas.microsoft.com/office/word/2018/wordml" xmlns:w16sdtdh="http://schemas.microsoft.com/office/word/2020/wordml/sdtdatahash" xmlns:w16se="http://schemas.microsoft.com/office/word/2015/wordml/symex" xmlns:wpg="http://schemas.microsoft.com/office/word/2010/wordprocessingGroup" xmlns:wpi="http://schemas.microsoft.com/office/word/2010/wordprocessingInk" xmlns:wne="http://schemas.microsoft.com/office/word/2006/wordml" xmlns:wps="http://schemas.microsoft.com/office/word/2010/wordprocessingShape" mc:Ignorable="w14 w15 w16se w16cid w16 w16cex w16sdtdh wp14">
+  <w:p>
+    <w:pPr>
+      <w:pStyle w:val="Header"/>
+    </w:pPr>
+  </w:p>
+</w:hdr>
+</file>
+
+<file path=word/header5.xml><?xml version="1.0" encoding="utf-8"?>
+<w:hdr xmlns:wpc="http://schemas.microsoft.com/office/word/2010/wordprocessingCanvas" xmlns:cx="http://schemas.microsoft.com/office/drawing/2014/chartex" xmlns:cx1="http://schemas.microsoft.com/office/drawing/2015/9/8/chartex" xmlns:cx2="http://schemas.microsoft.com/office/drawing/2015/10/21/chartex" xmlns:cx3="http://schemas.microsoft.com/office/drawing/2016/5/9/chartex" xmlns:cx4="http://schemas.microsoft.com/office/drawing/2016/5/10/chartex" xmlns:cx5="http://schemas.microsoft.com/office/drawing/2016/5/11/chartex" xmlns:cx6="http://schemas.microsoft.com/office/drawing/2016/5/12/chartex" xmlns:cx7="http://schemas.microsoft.com/office/drawing/2016/5/13/chartex" xmlns:cx8="http://schemas.microsoft.com/office/drawing/2016/5/14/chartex" xmlns:mc="http://schemas.openxmlformats.org/markup-compatibility/2006" xmlns:aink="http://schemas.microsoft.com/office/drawing/2016/ink" xmlns:am3d="http://schemas.microsoft.com/office/drawing/2017/model3d" xmlns:o="urn:schemas-microsoft-com:office:office" xmlns:oel="http://schemas.microsoft.com/office/2019/extlst" xmlns:r="http://schemas.openxmlformats.org/officeDocument/2006/relationships" xmlns:m="http://schemas.openxmlformats.org/officeDocument/2006/math" xmlns:v="urn:schemas-microsoft-com:vml" xmlns:wp14="http://schemas.microsoft.com/office/word/2010/wordprocessingDrawing" xmlns:wp="http://schemas.openxmlformats.org/drawingml/2006/wordprocessingDrawing" xmlns:w10="urn:schemas-microsoft-com:office:word" xmlns:w="http://schemas.openxmlformats.org/wordprocessingml/2006/main" xmlns:w14="http://schemas.microsoft.com/office/word/2010/wordml" xmlns:w15="http://schemas.microsoft.com/office/word/2012/wordml" xmlns:w16cex="http://schemas.microsoft.com/office/word/2018/wordml/cex" xmlns:w16cid="http://schemas.microsoft.com/office/word/2016/wordml/cid" xmlns:w16="http://schemas.microsoft.com/office/word/2018/wordml" xmlns:w16sdtdh="http://schemas.microsoft.com/office/word/2020/wordml/sdtdatahash" xmlns:w16se="http://schemas.microsoft.com/office/word/2015/wordml/symex" xmlns:wpg="http://schemas.microsoft.com/office/word/2010/wordprocessingGroup" xmlns:wpi="http://schemas.microsoft.com/office/word/2010/wordprocessingInk" xmlns:wne="http://schemas.microsoft.com/office/word/2006/wordml" xmlns:wps="http://schemas.microsoft.com/office/word/2010/wordprocessingShape" mc:Ignorable="w14 w15 w16se w16cid w16 w16cex w16sdtdh wp14">
   <w:p>
     <w:pPr>
       <w:pStyle w:val="BodyText"/>
@@ -5491,7 +5458,7 @@
 </file>
 
 <file path=word/numbering.xml><?xml version="1.0" encoding="utf-8"?>
-<w:numbering xmlns:wpc="http://schemas.microsoft.com/office/word/2010/wordprocessingCanvas" xmlns:cx="http://schemas.microsoft.com/office/drawing/2014/chartex" xmlns:cx1="http://schemas.microsoft.com/office/drawing/2015/9/8/chartex" xmlns:cx2="http://schemas.microsoft.com/office/drawing/2015/10/21/chartex" xmlns:cx3="http://schemas.microsoft.com/office/drawing/2016/5/9/chartex" xmlns:cx4="http://schemas.microsoft.com/office/drawing/2016/5/10/chartex" xmlns:cx5="http://schemas.microsoft.com/office/drawing/2016/5/11/chartex" xmlns:cx6="http://schemas.microsoft.com/office/drawing/2016/5/12/chartex" xmlns:cx7="http://schemas.microsoft.com/office/drawing/2016/5/13/chartex" xmlns:cx8="http://schemas.microsoft.com/office/drawing/2016/5/14/chartex" xmlns:mc="http://schemas.openxmlformats.org/markup-compatibility/2006" xmlns:aink="http://schemas.microsoft.com/office/drawing/2016/ink" xmlns:am3d="http://schemas.microsoft.com/office/drawing/2017/model3d" xmlns:o="urn:schemas-microsoft-com:office:office" xmlns:oel="http://schemas.microsoft.com/office/2019/extlst" xmlns:r="http://schemas.openxmlformats.org/officeDocument/2006/relationships" xmlns:m="http://schemas.openxmlformats.org/officeDocument/2006/math" xmlns:v="urn:schemas-microsoft-com:vml" xmlns:wp14="http://schemas.microsoft.com/office/word/2010/wordprocessingDrawing" xmlns:wp="http://schemas.openxmlformats.org/drawingml/2006/wordprocessingDrawing" xmlns:w10="urn:schemas-microsoft-com:office:word" xmlns:w="http://schemas.openxmlformats.org/wordprocessingml/2006/main" xmlns:w14="http://schemas.microsoft.com/office/word/2010/wordml" xmlns:w15="http://schemas.microsoft.com/office/word/2012/wordml" xmlns:w16cex="http://schemas.microsoft.com/office/word/2018/wordml/cex" xmlns:w16cid="http://schemas.microsoft.com/office/word/2016/wordml/cid" xmlns:w16="http://schemas.microsoft.com/office/word/2018/wordml" xmlns:w16du="http://schemas.microsoft.com/office/word/2023/wordml/word16du" xmlns:w16sdtdh="http://schemas.microsoft.com/office/word/2020/wordml/sdtdatahash" xmlns:w16sdtfl="http://schemas.microsoft.com/office/word/2024/wordml/sdtformatlock" xmlns:w16se="http://schemas.microsoft.com/office/word/2015/wordml/symex" xmlns:wpg="http://schemas.microsoft.com/office/word/2010/wordprocessingGroup" xmlns:wpi="http://schemas.microsoft.com/office/word/2010/wordprocessingInk" xmlns:wne="http://schemas.microsoft.com/office/word/2006/wordml" xmlns:wps="http://schemas.microsoft.com/office/word/2010/wordprocessingShape" mc:Ignorable="w14 w15 w16se w16cid w16 w16cex w16sdtdh w16sdtfl w16du wp14">
+<w:numbering xmlns:wpc="http://schemas.microsoft.com/office/word/2010/wordprocessingCanvas" xmlns:cx="http://schemas.microsoft.com/office/drawing/2014/chartex" xmlns:cx1="http://schemas.microsoft.com/office/drawing/2015/9/8/chartex" xmlns:cx2="http://schemas.microsoft.com/office/drawing/2015/10/21/chartex" xmlns:cx3="http://schemas.microsoft.com/office/drawing/2016/5/9/chartex" xmlns:cx4="http://schemas.microsoft.com/office/drawing/2016/5/10/chartex" xmlns:cx5="http://schemas.microsoft.com/office/drawing/2016/5/11/chartex" xmlns:cx6="http://schemas.microsoft.com/office/drawing/2016/5/12/chartex" xmlns:cx7="http://schemas.microsoft.com/office/drawing/2016/5/13/chartex" xmlns:cx8="http://schemas.microsoft.com/office/drawing/2016/5/14/chartex" xmlns:mc="http://schemas.openxmlformats.org/markup-compatibility/2006" xmlns:aink="http://schemas.microsoft.com/office/drawing/2016/ink" xmlns:am3d="http://schemas.microsoft.com/office/drawing/2017/model3d" xmlns:o="urn:schemas-microsoft-com:office:office" xmlns:oel="http://schemas.microsoft.com/office/2019/extlst" xmlns:r="http://schemas.openxmlformats.org/officeDocument/2006/relationships" xmlns:m="http://schemas.openxmlformats.org/officeDocument/2006/math" xmlns:v="urn:schemas-microsoft-com:vml" xmlns:wp14="http://schemas.microsoft.com/office/word/2010/wordprocessingDrawing" xmlns:wp="http://schemas.openxmlformats.org/drawingml/2006/wordprocessingDrawing" xmlns:w10="urn:schemas-microsoft-com:office:word" xmlns:w="http://schemas.openxmlformats.org/wordprocessingml/2006/main" xmlns:w14="http://schemas.microsoft.com/office/word/2010/wordml" xmlns:w15="http://schemas.microsoft.com/office/word/2012/wordml" xmlns:w16cex="http://schemas.microsoft.com/office/word/2018/wordml/cex" xmlns:w16cid="http://schemas.microsoft.com/office/word/2016/wordml/cid" xmlns:w16="http://schemas.microsoft.com/office/word/2018/wordml" xmlns:w16sdtdh="http://schemas.microsoft.com/office/word/2020/wordml/sdtdatahash" xmlns:w16se="http://schemas.microsoft.com/office/word/2015/wordml/symex" xmlns:wpg="http://schemas.microsoft.com/office/word/2010/wordprocessingGroup" xmlns:wpi="http://schemas.microsoft.com/office/word/2010/wordprocessingInk" xmlns:wne="http://schemas.microsoft.com/office/word/2006/wordml" xmlns:wps="http://schemas.microsoft.com/office/word/2010/wordprocessingShape" mc:Ignorable="w14 w15 w16se w16cid w16 w16cex w16sdtdh wp14">
   <w:abstractNum w:abstractNumId="0" w15:restartNumberingAfterBreak="0">
     <w:nsid w:val="0CEB530B"/>
     <w:multiLevelType w:val="hybridMultilevel"/>
@@ -6135,7 +6102,7 @@
 </file>
 
 <file path=word/styles.xml><?xml version="1.0" encoding="utf-8"?>
-<w:styles xmlns:mc="http://schemas.openxmlformats.org/markup-compatibility/2006" xmlns:r="http://schemas.openxmlformats.org/officeDocument/2006/relationships" xmlns:w="http://schemas.openxmlformats.org/wordprocessingml/2006/main" xmlns:w14="http://schemas.microsoft.com/office/word/2010/wordml" xmlns:w15="http://schemas.microsoft.com/office/word/2012/wordml" xmlns:w16cex="http://schemas.microsoft.com/office/word/2018/wordml/cex" xmlns:w16cid="http://schemas.microsoft.com/office/word/2016/wordml/cid" xmlns:w16="http://schemas.microsoft.com/office/word/2018/wordml" xmlns:w16du="http://schemas.microsoft.com/office/word/2023/wordml/word16du" xmlns:w16sdtdh="http://schemas.microsoft.com/office/word/2020/wordml/sdtdatahash" xmlns:w16sdtfl="http://schemas.microsoft.com/office/word/2024/wordml/sdtformatlock" xmlns:w16se="http://schemas.microsoft.com/office/word/2015/wordml/symex" mc:Ignorable="w14 w15 w16se w16cid w16 w16cex w16sdtdh w16sdtfl w16du">
+<w:styles xmlns:mc="http://schemas.openxmlformats.org/markup-compatibility/2006" xmlns:r="http://schemas.openxmlformats.org/officeDocument/2006/relationships" xmlns:w="http://schemas.openxmlformats.org/wordprocessingml/2006/main" xmlns:w14="http://schemas.microsoft.com/office/word/2010/wordml" xmlns:w15="http://schemas.microsoft.com/office/word/2012/wordml" xmlns:w16cex="http://schemas.microsoft.com/office/word/2018/wordml/cex" xmlns:w16cid="http://schemas.microsoft.com/office/word/2016/wordml/cid" xmlns:w16="http://schemas.microsoft.com/office/word/2018/wordml" xmlns:w16sdtdh="http://schemas.microsoft.com/office/word/2020/wordml/sdtdatahash" xmlns:w16se="http://schemas.microsoft.com/office/word/2015/wordml/symex" mc:Ignorable="w14 w15 w16se w16cid w16 w16cex w16sdtdh">
   <w:docDefaults>
     <w:rPrDefault>
       <w:rPr>

</xml_diff>

<commit_message>
fix: update template Berkas Luar Kota - Laporan
</commit_message>
<xml_diff>
--- a/backend/templates/Berkas Luar Kota - Laporan.docx
+++ b/backend/templates/Berkas Luar Kota - Laporan.docx
@@ -304,7 +304,19 @@
                     <w:rPr>
                       <w:spacing w:val="-2"/>
                     </w:rPr>
-                    <w:t>/UM.06.00/{{bulan_romawi}}/{{tahun_saat_ini}}</w:t>
+                    <w:t>/UM.06.00/{{bulan_romawi</w:t>
+                  </w:r>
+                  <w:r>
+                    <w:rPr>
+                      <w:spacing w:val="-2"/>
+                    </w:rPr>
+                    <w:t>_st</w:t>
+                  </w:r>
+                  <w:r>
+                    <w:rPr>
+                      <w:spacing w:val="-2"/>
+                    </w:rPr>
+                    <w:t>}}/{{tahun_saat_ini}}</w:t>
                   </w:r>
                   <w:r>
                     <w:rPr>
@@ -1199,21 +1211,7 @@
         <w:rPr>
           <w:lang w:val="en-US"/>
         </w:rPr>
-        <w:t>{{</w:t>
-      </w:r>
-      <w:proofErr w:type="spellStart"/>
-      <w:r>
-        <w:rPr>
-          <w:lang w:val="en-US"/>
-        </w:rPr>
-        <w:t>isi_laporan</w:t>
-      </w:r>
-      <w:proofErr w:type="spellEnd"/>
-      <w:r>
-        <w:rPr>
-          <w:lang w:val="en-US"/>
-        </w:rPr>
-        <w:t>}}</w:t>
+        <w:t>{{isi_laporan}}</w:t>
       </w:r>
     </w:p>
     <w:p>
@@ -1485,24 +1483,15 @@
                 <w:spacing w:val="-2"/>
                 <w:lang w:val="en-US"/>
               </w:rPr>
-              <w:t>{{</w:t>
-            </w:r>
-            <w:proofErr w:type="spellStart"/>
+              <w:t>{{no_urut</w:t>
+            </w:r>
             <w:r>
               <w:rPr>
                 <w:spacing w:val="-2"/>
                 <w:lang w:val="en-US"/>
               </w:rPr>
-              <w:t>no_urut</w:t>
-            </w:r>
-            <w:r>
-              <w:rPr>
-                <w:spacing w:val="-2"/>
-                <w:lang w:val="en-US"/>
-              </w:rPr>
               <w:t>_satu</w:t>
             </w:r>
-            <w:proofErr w:type="spellEnd"/>
             <w:r>
               <w:rPr>
                 <w:spacing w:val="-2"/>
@@ -1534,21 +1523,7 @@
               <w:rPr>
                 <w:lang w:val="en-US"/>
               </w:rPr>
-              <w:t>{{</w:t>
-            </w:r>
-            <w:proofErr w:type="spellStart"/>
-            <w:r>
-              <w:rPr>
-                <w:lang w:val="en-US"/>
-              </w:rPr>
-              <w:t>nama_petugas_satu</w:t>
-            </w:r>
-            <w:proofErr w:type="spellEnd"/>
-            <w:r>
-              <w:rPr>
-                <w:lang w:val="en-US"/>
-              </w:rPr>
-              <w:t>}}</w:t>
+              <w:t>{{nama_petugas_satu}}</w:t>
             </w:r>
           </w:p>
           <w:p>
@@ -1572,14 +1547,12 @@
               </w:rPr>
               <w:t>NIP. {{</w:t>
             </w:r>
-            <w:proofErr w:type="spellStart"/>
             <w:r>
               <w:rPr>
                 <w:lang w:val="en-US"/>
               </w:rPr>
               <w:t>nip_petugas_satu</w:t>
             </w:r>
-            <w:proofErr w:type="spellEnd"/>
             <w:r>
               <w:rPr>
                 <w:lang w:val="en-US"/>
@@ -1603,44 +1576,27 @@
                 <w:spacing w:val="-2"/>
                 <w:lang w:val="en-US"/>
               </w:rPr>
-              <w:t>{{</w:t>
-            </w:r>
-            <w:proofErr w:type="spellStart"/>
+              <w:t>{{no_urut</w:t>
+            </w:r>
             <w:r>
               <w:rPr>
                 <w:spacing w:val="-2"/>
                 <w:lang w:val="en-US"/>
               </w:rPr>
-              <w:t>no_urut</w:t>
+              <w:t>_satu</w:t>
             </w:r>
             <w:r>
               <w:rPr>
                 <w:spacing w:val="-2"/>
                 <w:lang w:val="en-US"/>
               </w:rPr>
-              <w:t>_satu</w:t>
-            </w:r>
-            <w:proofErr w:type="spellEnd"/>
-            <w:proofErr w:type="gramStart"/>
+              <w:t>}}</w:t>
+            </w:r>
             <w:r>
               <w:rPr>
                 <w:spacing w:val="-2"/>
-                <w:lang w:val="en-US"/>
-              </w:rPr>
-              <w:t>}}</w:t>
-            </w:r>
-            <w:r>
-              <w:rPr>
-                <w:spacing w:val="-2"/>
-              </w:rPr>
-              <w:t>…</w:t>
-            </w:r>
-            <w:proofErr w:type="gramEnd"/>
-            <w:r>
-              <w:rPr>
-                <w:spacing w:val="-2"/>
-              </w:rPr>
-              <w:t>…………………..</w:t>
+              </w:rPr>
+              <w:t>……………………..</w:t>
             </w:r>
           </w:p>
         </w:tc>
@@ -1673,24 +1629,15 @@
                 <w:spacing w:val="-2"/>
                 <w:lang w:val="en-US"/>
               </w:rPr>
-              <w:t>{{</w:t>
-            </w:r>
-            <w:proofErr w:type="spellStart"/>
+              <w:t>{{no_urut</w:t>
+            </w:r>
             <w:r>
               <w:rPr>
                 <w:spacing w:val="-2"/>
                 <w:lang w:val="en-US"/>
               </w:rPr>
-              <w:t>no_urut</w:t>
-            </w:r>
-            <w:r>
-              <w:rPr>
-                <w:spacing w:val="-2"/>
-                <w:lang w:val="en-US"/>
-              </w:rPr>
               <w:t>_dua</w:t>
             </w:r>
-            <w:proofErr w:type="spellEnd"/>
             <w:r>
               <w:rPr>
                 <w:spacing w:val="-2"/>
@@ -1758,51 +1705,34 @@
                 <w:spacing w:val="-2"/>
                 <w:lang w:val="en-US"/>
               </w:rPr>
-              <w:t>{{</w:t>
-            </w:r>
-            <w:proofErr w:type="spellStart"/>
+              <w:t>{{no</w:t>
+            </w:r>
             <w:r>
               <w:rPr>
                 <w:spacing w:val="-2"/>
                 <w:lang w:val="en-US"/>
               </w:rPr>
-              <w:t>no</w:t>
+              <w:t>_urut</w:t>
             </w:r>
             <w:r>
               <w:rPr>
                 <w:spacing w:val="-2"/>
                 <w:lang w:val="en-US"/>
               </w:rPr>
-              <w:t>_urut</w:t>
+              <w:t>_dua</w:t>
             </w:r>
             <w:r>
               <w:rPr>
                 <w:spacing w:val="-2"/>
                 <w:lang w:val="en-US"/>
               </w:rPr>
-              <w:t>_dua</w:t>
-            </w:r>
-            <w:proofErr w:type="spellEnd"/>
-            <w:proofErr w:type="gramStart"/>
+              <w:t>}}</w:t>
+            </w:r>
             <w:r>
               <w:rPr>
                 <w:spacing w:val="-2"/>
-                <w:lang w:val="en-US"/>
-              </w:rPr>
-              <w:t>}}</w:t>
-            </w:r>
-            <w:r>
-              <w:rPr>
-                <w:spacing w:val="-2"/>
-              </w:rPr>
-              <w:t>…</w:t>
-            </w:r>
-            <w:proofErr w:type="gramEnd"/>
-            <w:r>
-              <w:rPr>
-                <w:spacing w:val="-2"/>
-              </w:rPr>
-              <w:t>…………………..</w:t>
+              </w:rPr>
+              <w:t>……………………..</w:t>
             </w:r>
           </w:p>
         </w:tc>
@@ -1835,24 +1765,15 @@
                 <w:spacing w:val="-2"/>
                 <w:lang w:val="en-US"/>
               </w:rPr>
-              <w:t>{{</w:t>
-            </w:r>
-            <w:proofErr w:type="spellStart"/>
+              <w:t>{{no_urut</w:t>
+            </w:r>
             <w:r>
               <w:rPr>
                 <w:spacing w:val="-2"/>
                 <w:lang w:val="en-US"/>
               </w:rPr>
-              <w:t>no_urut</w:t>
-            </w:r>
-            <w:r>
-              <w:rPr>
-                <w:spacing w:val="-2"/>
-                <w:lang w:val="en-US"/>
-              </w:rPr>
               <w:t>_tiga</w:t>
             </w:r>
-            <w:proofErr w:type="spellEnd"/>
             <w:r>
               <w:rPr>
                 <w:spacing w:val="-2"/>
@@ -1925,44 +1846,27 @@
                 <w:spacing w:val="-2"/>
                 <w:lang w:val="en-US"/>
               </w:rPr>
-              <w:t>{{</w:t>
-            </w:r>
-            <w:proofErr w:type="spellStart"/>
+              <w:t>{{no_urut</w:t>
+            </w:r>
             <w:r>
               <w:rPr>
                 <w:spacing w:val="-2"/>
                 <w:lang w:val="en-US"/>
               </w:rPr>
-              <w:t>no_urut</w:t>
+              <w:t>_tiga</w:t>
             </w:r>
             <w:r>
               <w:rPr>
                 <w:spacing w:val="-2"/>
                 <w:lang w:val="en-US"/>
               </w:rPr>
-              <w:t>_tiga</w:t>
-            </w:r>
-            <w:proofErr w:type="spellEnd"/>
-            <w:proofErr w:type="gramStart"/>
+              <w:t>}}</w:t>
+            </w:r>
             <w:r>
               <w:rPr>
                 <w:spacing w:val="-2"/>
-                <w:lang w:val="en-US"/>
-              </w:rPr>
-              <w:t>}}</w:t>
-            </w:r>
-            <w:r>
-              <w:rPr>
-                <w:spacing w:val="-2"/>
-              </w:rPr>
-              <w:t>…</w:t>
-            </w:r>
-            <w:proofErr w:type="gramEnd"/>
-            <w:r>
-              <w:rPr>
-                <w:spacing w:val="-2"/>
-              </w:rPr>
-              <w:t>…………………..</w:t>
+              </w:rPr>
+              <w:t>……………………..</w:t>
             </w:r>
           </w:p>
         </w:tc>
@@ -1995,24 +1899,15 @@
                 <w:spacing w:val="-2"/>
                 <w:lang w:val="en-US"/>
               </w:rPr>
-              <w:t>{{</w:t>
-            </w:r>
-            <w:proofErr w:type="spellStart"/>
+              <w:t>{{no_urut</w:t>
+            </w:r>
             <w:r>
               <w:rPr>
                 <w:spacing w:val="-2"/>
                 <w:lang w:val="en-US"/>
               </w:rPr>
-              <w:t>no_urut</w:t>
-            </w:r>
-            <w:r>
-              <w:rPr>
-                <w:spacing w:val="-2"/>
-                <w:lang w:val="en-US"/>
-              </w:rPr>
               <w:t>_empat</w:t>
             </w:r>
-            <w:proofErr w:type="spellEnd"/>
             <w:r>
               <w:rPr>
                 <w:spacing w:val="-2"/>
@@ -2087,44 +1982,27 @@
                 <w:spacing w:val="-2"/>
                 <w:lang w:val="en-US"/>
               </w:rPr>
-              <w:t>{{</w:t>
-            </w:r>
-            <w:proofErr w:type="spellStart"/>
+              <w:t>{{no_urut</w:t>
+            </w:r>
             <w:r>
               <w:rPr>
                 <w:spacing w:val="-2"/>
                 <w:lang w:val="en-US"/>
               </w:rPr>
-              <w:t>no_urut</w:t>
+              <w:t>_empat</w:t>
             </w:r>
             <w:r>
               <w:rPr>
                 <w:spacing w:val="-2"/>
                 <w:lang w:val="en-US"/>
               </w:rPr>
-              <w:t>_empat</w:t>
-            </w:r>
-            <w:proofErr w:type="spellEnd"/>
-            <w:proofErr w:type="gramStart"/>
+              <w:t>}}</w:t>
+            </w:r>
             <w:r>
               <w:rPr>
                 <w:spacing w:val="-2"/>
-                <w:lang w:val="en-US"/>
-              </w:rPr>
-              <w:t>}}</w:t>
-            </w:r>
-            <w:r>
-              <w:rPr>
-                <w:spacing w:val="-2"/>
-              </w:rPr>
-              <w:t>…</w:t>
-            </w:r>
-            <w:proofErr w:type="gramEnd"/>
-            <w:r>
-              <w:rPr>
-                <w:spacing w:val="-2"/>
-              </w:rPr>
-              <w:t>…………………..</w:t>
+              </w:rPr>
+              <w:t>……………………..</w:t>
             </w:r>
           </w:p>
         </w:tc>
@@ -2157,24 +2035,15 @@
                 <w:spacing w:val="-2"/>
                 <w:lang w:val="en-US"/>
               </w:rPr>
-              <w:t>{{</w:t>
-            </w:r>
-            <w:proofErr w:type="spellStart"/>
+              <w:t>{{no_urut</w:t>
+            </w:r>
             <w:r>
               <w:rPr>
                 <w:spacing w:val="-2"/>
                 <w:lang w:val="en-US"/>
               </w:rPr>
-              <w:t>no_urut</w:t>
-            </w:r>
-            <w:r>
-              <w:rPr>
-                <w:spacing w:val="-2"/>
-                <w:lang w:val="en-US"/>
-              </w:rPr>
               <w:t>_lima</w:t>
             </w:r>
-            <w:proofErr w:type="spellEnd"/>
             <w:r>
               <w:rPr>
                 <w:spacing w:val="-2"/>
@@ -2249,44 +2118,27 @@
                 <w:spacing w:val="-2"/>
                 <w:lang w:val="en-US"/>
               </w:rPr>
-              <w:t>{{</w:t>
-            </w:r>
-            <w:proofErr w:type="spellStart"/>
+              <w:t>{{no_urut</w:t>
+            </w:r>
             <w:r>
               <w:rPr>
                 <w:spacing w:val="-2"/>
                 <w:lang w:val="en-US"/>
               </w:rPr>
-              <w:t>no_urut</w:t>
+              <w:t>_lima</w:t>
             </w:r>
             <w:r>
               <w:rPr>
                 <w:spacing w:val="-2"/>
                 <w:lang w:val="en-US"/>
               </w:rPr>
-              <w:t>_lima</w:t>
-            </w:r>
-            <w:proofErr w:type="spellEnd"/>
-            <w:proofErr w:type="gramStart"/>
+              <w:t>}}</w:t>
+            </w:r>
             <w:r>
               <w:rPr>
                 <w:spacing w:val="-2"/>
-                <w:lang w:val="en-US"/>
-              </w:rPr>
-              <w:t>}}</w:t>
-            </w:r>
-            <w:r>
-              <w:rPr>
-                <w:spacing w:val="-2"/>
-              </w:rPr>
-              <w:t>…</w:t>
-            </w:r>
-            <w:proofErr w:type="gramEnd"/>
-            <w:r>
-              <w:rPr>
-                <w:spacing w:val="-2"/>
-              </w:rPr>
-              <w:t>…………………..</w:t>
+              </w:rPr>
+              <w:t>……………………..</w:t>
             </w:r>
           </w:p>
         </w:tc>
@@ -2319,24 +2171,15 @@
                 <w:spacing w:val="-2"/>
                 <w:lang w:val="en-US"/>
               </w:rPr>
-              <w:t>{{</w:t>
-            </w:r>
-            <w:proofErr w:type="spellStart"/>
+              <w:t>{{no_urut</w:t>
+            </w:r>
             <w:r>
               <w:rPr>
                 <w:spacing w:val="-2"/>
                 <w:lang w:val="en-US"/>
               </w:rPr>
-              <w:t>no_urut</w:t>
-            </w:r>
-            <w:r>
-              <w:rPr>
-                <w:spacing w:val="-2"/>
-                <w:lang w:val="en-US"/>
-              </w:rPr>
               <w:t>_enam</w:t>
             </w:r>
-            <w:proofErr w:type="spellEnd"/>
             <w:r>
               <w:rPr>
                 <w:spacing w:val="-2"/>
@@ -2412,44 +2255,27 @@
                 <w:spacing w:val="-2"/>
                 <w:lang w:val="en-US"/>
               </w:rPr>
-              <w:t>{{</w:t>
-            </w:r>
-            <w:proofErr w:type="spellStart"/>
+              <w:t>{{no_urut</w:t>
+            </w:r>
             <w:r>
               <w:rPr>
                 <w:spacing w:val="-2"/>
                 <w:lang w:val="en-US"/>
               </w:rPr>
-              <w:t>no_urut</w:t>
+              <w:t>_enam</w:t>
             </w:r>
             <w:r>
               <w:rPr>
                 <w:spacing w:val="-2"/>
                 <w:lang w:val="en-US"/>
               </w:rPr>
-              <w:t>_enam</w:t>
-            </w:r>
-            <w:proofErr w:type="spellEnd"/>
-            <w:proofErr w:type="gramStart"/>
+              <w:t>}}</w:t>
+            </w:r>
             <w:r>
               <w:rPr>
                 <w:spacing w:val="-2"/>
-                <w:lang w:val="en-US"/>
-              </w:rPr>
-              <w:t>}}</w:t>
-            </w:r>
-            <w:r>
-              <w:rPr>
-                <w:spacing w:val="-2"/>
-              </w:rPr>
-              <w:t>…</w:t>
-            </w:r>
-            <w:proofErr w:type="gramEnd"/>
-            <w:r>
-              <w:rPr>
-                <w:spacing w:val="-2"/>
-              </w:rPr>
-              <w:t>…………………..</w:t>
+              </w:rPr>
+              <w:t>……………………..</w:t>
             </w:r>
           </w:p>
         </w:tc>
@@ -2486,24 +2312,15 @@
                 <w:spacing w:val="-2"/>
                 <w:lang w:val="en-US"/>
               </w:rPr>
-              <w:t>{{</w:t>
-            </w:r>
-            <w:proofErr w:type="spellStart"/>
+              <w:t>{{no_urut</w:t>
+            </w:r>
             <w:r>
               <w:rPr>
                 <w:spacing w:val="-2"/>
                 <w:lang w:val="en-US"/>
               </w:rPr>
-              <w:t>no_urut</w:t>
-            </w:r>
-            <w:r>
-              <w:rPr>
-                <w:spacing w:val="-2"/>
-                <w:lang w:val="en-US"/>
-              </w:rPr>
               <w:t>_tujuh</w:t>
             </w:r>
-            <w:proofErr w:type="spellEnd"/>
             <w:r>
               <w:rPr>
                 <w:spacing w:val="-2"/>
@@ -2585,44 +2402,27 @@
                 <w:spacing w:val="-2"/>
                 <w:lang w:val="en-US"/>
               </w:rPr>
-              <w:t>{{</w:t>
-            </w:r>
-            <w:proofErr w:type="spellStart"/>
+              <w:t>{{no_urut</w:t>
+            </w:r>
             <w:r>
               <w:rPr>
                 <w:spacing w:val="-2"/>
                 <w:lang w:val="en-US"/>
               </w:rPr>
-              <w:t>no_urut</w:t>
+              <w:t>_tujuh</w:t>
             </w:r>
             <w:r>
               <w:rPr>
                 <w:spacing w:val="-2"/>
                 <w:lang w:val="en-US"/>
               </w:rPr>
-              <w:t>_tujuh</w:t>
-            </w:r>
-            <w:proofErr w:type="spellEnd"/>
-            <w:proofErr w:type="gramStart"/>
+              <w:t>}}</w:t>
+            </w:r>
             <w:r>
               <w:rPr>
                 <w:spacing w:val="-2"/>
-                <w:lang w:val="en-US"/>
-              </w:rPr>
-              <w:t>}}</w:t>
-            </w:r>
-            <w:r>
-              <w:rPr>
-                <w:spacing w:val="-2"/>
-              </w:rPr>
-              <w:t>…</w:t>
-            </w:r>
-            <w:proofErr w:type="gramEnd"/>
-            <w:r>
-              <w:rPr>
-                <w:spacing w:val="-2"/>
-              </w:rPr>
-              <w:t>…………………..</w:t>
+              </w:rPr>
+              <w:t>……………………..</w:t>
             </w:r>
           </w:p>
         </w:tc>
@@ -2704,21 +2504,7 @@
               <w:rPr>
                 <w:lang w:val="en-US"/>
               </w:rPr>
-              <w:t>{{</w:t>
-            </w:r>
-            <w:proofErr w:type="spellStart"/>
-            <w:r>
-              <w:rPr>
-                <w:lang w:val="en-US"/>
-              </w:rPr>
-              <w:t>foto_dokumentasi_satu</w:t>
-            </w:r>
-            <w:proofErr w:type="spellEnd"/>
-            <w:r>
-              <w:rPr>
-                <w:lang w:val="en-US"/>
-              </w:rPr>
-              <w:t>}}</w:t>
+              <w:t>{{foto_dokumentasi_satu}}</w:t>
             </w:r>
           </w:p>
         </w:tc>
@@ -2746,21 +2532,7 @@
               <w:rPr>
                 <w:lang w:val="en-US"/>
               </w:rPr>
-              <w:t>{{</w:t>
-            </w:r>
-            <w:proofErr w:type="spellStart"/>
-            <w:r>
-              <w:rPr>
-                <w:lang w:val="en-US"/>
-              </w:rPr>
-              <w:t>foto_dokumentasi_dua</w:t>
-            </w:r>
-            <w:proofErr w:type="spellEnd"/>
-            <w:r>
-              <w:rPr>
-                <w:lang w:val="en-US"/>
-              </w:rPr>
-              <w:t>}}</w:t>
+              <w:t>{{foto_dokumentasi_dua}}</w:t>
             </w:r>
           </w:p>
         </w:tc>
@@ -2788,21 +2560,7 @@
               <w:rPr>
                 <w:lang w:val="en-US"/>
               </w:rPr>
-              <w:t>{{</w:t>
-            </w:r>
-            <w:proofErr w:type="spellStart"/>
-            <w:r>
-              <w:rPr>
-                <w:lang w:val="en-US"/>
-              </w:rPr>
-              <w:t>foto_dokumentasi_tiga</w:t>
-            </w:r>
-            <w:proofErr w:type="spellEnd"/>
-            <w:r>
-              <w:rPr>
-                <w:lang w:val="en-US"/>
-              </w:rPr>
-              <w:t>}}</w:t>
+              <w:t>{{foto_dokumentasi_tiga}}</w:t>
             </w:r>
           </w:p>
         </w:tc>
@@ -2842,21 +2600,7 @@
               <w:rPr>
                 <w:lang w:val="en-US"/>
               </w:rPr>
-              <w:t>{{</w:t>
-            </w:r>
-            <w:proofErr w:type="spellStart"/>
-            <w:r>
-              <w:rPr>
-                <w:lang w:val="en-US"/>
-              </w:rPr>
-              <w:t>foto_dokumentasi_empat</w:t>
-            </w:r>
-            <w:proofErr w:type="spellEnd"/>
-            <w:r>
-              <w:rPr>
-                <w:lang w:val="en-US"/>
-              </w:rPr>
-              <w:t>}}</w:t>
+              <w:t>{{foto_dokumentasi_empat}}</w:t>
             </w:r>
           </w:p>
         </w:tc>

</xml_diff>

<commit_message>
feat: setup quadlets for production, fix cache bugs, clean debug logs
</commit_message>
<xml_diff>
--- a/backend/templates/Berkas Luar Kota - Laporan.docx
+++ b/backend/templates/Berkas Luar Kota - Laporan.docx
@@ -2410,6 +2410,447 @@
                 <w:lang w:val="en-US"/>
               </w:rPr>
               <w:t>_tujuh</w:t>
+            </w:r>
+            <w:r>
+              <w:rPr>
+                <w:spacing w:val="-2"/>
+                <w:lang w:val="en-US"/>
+              </w:rPr>
+              <w:t>}}</w:t>
+            </w:r>
+            <w:r>
+              <w:rPr>
+                <w:spacing w:val="-2"/>
+              </w:rPr>
+              <w:t>……………………..</w:t>
+            </w:r>
+          </w:p>
+        </w:tc>
+      </w:tr>
+      <w:tr>
+        <w:trPr>
+          <w:trHeight w:val="997"/>
+        </w:trPr>
+        <w:tc>
+          <w:tcPr>
+            <w:tcW w:w="567" w:type="dxa"/>
+          </w:tcPr>
+          <w:p>
+            <w:pPr>
+              <w:pStyle w:val="TableParagraph"/>
+              <w:spacing w:before="107"/>
+              <w:rPr>
+                <w:spacing w:val="-2"/>
+                <w:lang w:val="en-US"/>
+              </w:rPr>
+            </w:pPr>
+          </w:p>
+          <w:p>
+            <w:pPr>
+              <w:pStyle w:val="TableParagraph"/>
+              <w:spacing w:before="107"/>
+              <w:rPr>
+                <w:rFonts w:ascii="Arial"/>
+                <w:b/>
+              </w:rPr>
+            </w:pPr>
+            <w:r>
+              <w:rPr>
+                <w:spacing w:val="-2"/>
+                <w:lang w:val="en-US"/>
+              </w:rPr>
+              <w:t>{{no_urut</w:t>
+            </w:r>
+            <w:r>
+              <w:rPr>
+                <w:spacing w:val="-2"/>
+                <w:lang w:val="en-US"/>
+              </w:rPr>
+              <w:t>_delapan</w:t>
+            </w:r>
+            <w:r>
+              <w:rPr>
+                <w:spacing w:val="-2"/>
+                <w:lang w:val="en-US"/>
+              </w:rPr>
+              <w:t>}}</w:t>
+            </w:r>
+          </w:p>
+        </w:tc>
+        <w:tc>
+          <w:tcPr>
+            <w:tcW w:w="6667" w:type="dxa"/>
+          </w:tcPr>
+          <w:p>
+            <w:pPr>
+              <w:pStyle w:val="TableParagraph"/>
+              <w:spacing w:line="247" w:lineRule="exact"/>
+              <w:ind w:left="145"/>
+            </w:pPr>
+          </w:p>
+          <w:p>
+            <w:pPr>
+              <w:pStyle w:val="TableParagraph"/>
+              <w:spacing w:line="247" w:lineRule="exact"/>
+              <w:ind w:left="145"/>
+            </w:pPr>
+          </w:p>
+          <w:p>
+            <w:pPr>
+              <w:pStyle w:val="TableParagraph"/>
+              <w:spacing w:line="247" w:lineRule="exact"/>
+              <w:ind w:left="145"/>
+            </w:pPr>
+            <w:r>
+              <w:t>{{nama_petugas_delapan}}</w:t>
+            </w:r>
+          </w:p>
+          <w:p>
+            <w:pPr>
+              <w:pStyle w:val="TableParagraph"/>
+              <w:spacing w:before="111"/>
+              <w:rPr>
+                <w:rFonts w:ascii="Arial"/>
+                <w:b/>
+              </w:rPr>
+            </w:pPr>
+            <w:r>
+              <w:t xml:space="preserve">NIP. </w:t>
+            </w:r>
+            <w:r>
+              <w:t>{{nip_petugas_delapan}}</w:t>
+            </w:r>
+          </w:p>
+        </w:tc>
+        <w:tc>
+          <w:tcPr>
+            <w:tcW w:w="3260" w:type="dxa"/>
+          </w:tcPr>
+          <w:p>
+            <w:pPr>
+              <w:pStyle w:val="TableParagraph"/>
+              <w:spacing w:before="111"/>
+              <w:rPr>
+                <w:spacing w:val="-2"/>
+              </w:rPr>
+            </w:pPr>
+          </w:p>
+          <w:p>
+            <w:pPr>
+              <w:pStyle w:val="TableParagraph"/>
+              <w:spacing w:before="111"/>
+              <w:rPr>
+                <w:rFonts w:ascii="Arial"/>
+                <w:b/>
+              </w:rPr>
+            </w:pPr>
+            <w:r>
+              <w:rPr>
+                <w:spacing w:val="-2"/>
+                <w:lang w:val="en-US"/>
+              </w:rPr>
+              <w:t>{{no_urut</w:t>
+            </w:r>
+            <w:r>
+              <w:rPr>
+                <w:spacing w:val="-2"/>
+                <w:lang w:val="en-US"/>
+              </w:rPr>
+              <w:t>_delapan</w:t>
+            </w:r>
+            <w:r>
+              <w:rPr>
+                <w:spacing w:val="-2"/>
+                <w:lang w:val="en-US"/>
+              </w:rPr>
+              <w:t>}}</w:t>
+            </w:r>
+            <w:r>
+              <w:rPr>
+                <w:spacing w:val="-2"/>
+              </w:rPr>
+              <w:t>……………………..</w:t>
+            </w:r>
+          </w:p>
+        </w:tc>
+      </w:tr>
+      <w:tr>
+        <w:trPr>
+          <w:trHeight w:val="997"/>
+        </w:trPr>
+        <w:tc>
+          <w:tcPr>
+            <w:tcW w:w="567" w:type="dxa"/>
+          </w:tcPr>
+          <w:p>
+            <w:pPr>
+              <w:pStyle w:val="TableParagraph"/>
+              <w:spacing w:before="107"/>
+              <w:rPr>
+                <w:spacing w:val="-2"/>
+                <w:lang w:val="en-US"/>
+              </w:rPr>
+            </w:pPr>
+          </w:p>
+          <w:p>
+            <w:pPr>
+              <w:pStyle w:val="TableParagraph"/>
+              <w:spacing w:before="107"/>
+              <w:rPr>
+                <w:rFonts w:ascii="Arial"/>
+                <w:b/>
+              </w:rPr>
+            </w:pPr>
+            <w:r>
+              <w:rPr>
+                <w:spacing w:val="-2"/>
+                <w:lang w:val="en-US"/>
+              </w:rPr>
+              <w:t>{{no_urut</w:t>
+            </w:r>
+            <w:r>
+              <w:rPr>
+                <w:spacing w:val="-2"/>
+                <w:lang w:val="en-US"/>
+              </w:rPr>
+              <w:t>_sembilan</w:t>
+            </w:r>
+            <w:r>
+              <w:rPr>
+                <w:spacing w:val="-2"/>
+                <w:lang w:val="en-US"/>
+              </w:rPr>
+              <w:t>}}</w:t>
+            </w:r>
+          </w:p>
+        </w:tc>
+        <w:tc>
+          <w:tcPr>
+            <w:tcW w:w="6667" w:type="dxa"/>
+          </w:tcPr>
+          <w:p>
+            <w:pPr>
+              <w:pStyle w:val="TableParagraph"/>
+              <w:spacing w:line="247" w:lineRule="exact"/>
+              <w:ind w:left="145"/>
+            </w:pPr>
+          </w:p>
+          <w:p>
+            <w:pPr>
+              <w:pStyle w:val="TableParagraph"/>
+              <w:spacing w:line="247" w:lineRule="exact"/>
+              <w:ind w:left="145"/>
+            </w:pPr>
+          </w:p>
+          <w:p>
+            <w:pPr>
+              <w:pStyle w:val="TableParagraph"/>
+              <w:spacing w:line="247" w:lineRule="exact"/>
+              <w:ind w:left="145"/>
+            </w:pPr>
+            <w:r>
+              <w:t>{{nama_petugas_sembilan}}</w:t>
+            </w:r>
+          </w:p>
+          <w:p>
+            <w:pPr>
+              <w:pStyle w:val="TableParagraph"/>
+              <w:spacing w:before="111"/>
+              <w:rPr>
+                <w:rFonts w:ascii="Arial"/>
+                <w:b/>
+              </w:rPr>
+            </w:pPr>
+            <w:r>
+              <w:t xml:space="preserve">NIP. </w:t>
+            </w:r>
+            <w:r>
+              <w:t>{{nip_petugas_sembilan}}</w:t>
+            </w:r>
+          </w:p>
+        </w:tc>
+        <w:tc>
+          <w:tcPr>
+            <w:tcW w:w="3260" w:type="dxa"/>
+          </w:tcPr>
+          <w:p>
+            <w:pPr>
+              <w:pStyle w:val="TableParagraph"/>
+              <w:spacing w:before="111"/>
+              <w:rPr>
+                <w:spacing w:val="-2"/>
+              </w:rPr>
+            </w:pPr>
+          </w:p>
+          <w:p>
+            <w:pPr>
+              <w:pStyle w:val="TableParagraph"/>
+              <w:spacing w:before="111"/>
+              <w:rPr>
+                <w:rFonts w:ascii="Arial"/>
+                <w:b/>
+              </w:rPr>
+            </w:pPr>
+            <w:r>
+              <w:rPr>
+                <w:spacing w:val="-2"/>
+                <w:lang w:val="en-US"/>
+              </w:rPr>
+              <w:t>{{no_urut</w:t>
+            </w:r>
+            <w:r>
+              <w:rPr>
+                <w:spacing w:val="-2"/>
+                <w:lang w:val="en-US"/>
+              </w:rPr>
+              <w:t>_sembilan</w:t>
+            </w:r>
+            <w:r>
+              <w:rPr>
+                <w:spacing w:val="-2"/>
+                <w:lang w:val="en-US"/>
+              </w:rPr>
+              <w:t>}}</w:t>
+            </w:r>
+            <w:r>
+              <w:rPr>
+                <w:spacing w:val="-2"/>
+              </w:rPr>
+              <w:t>……………………..</w:t>
+            </w:r>
+          </w:p>
+        </w:tc>
+      </w:tr>
+      <w:tr>
+        <w:trPr>
+          <w:trHeight w:val="997"/>
+        </w:trPr>
+        <w:tc>
+          <w:tcPr>
+            <w:tcW w:w="567" w:type="dxa"/>
+          </w:tcPr>
+          <w:p>
+            <w:pPr>
+              <w:pStyle w:val="TableParagraph"/>
+              <w:spacing w:before="107"/>
+              <w:rPr>
+                <w:spacing w:val="-2"/>
+                <w:lang w:val="en-US"/>
+              </w:rPr>
+            </w:pPr>
+          </w:p>
+          <w:p>
+            <w:pPr>
+              <w:pStyle w:val="TableParagraph"/>
+              <w:spacing w:before="107"/>
+              <w:rPr>
+                <w:rFonts w:ascii="Arial"/>
+                <w:b/>
+              </w:rPr>
+            </w:pPr>
+            <w:r>
+              <w:rPr>
+                <w:spacing w:val="-2"/>
+                <w:lang w:val="en-US"/>
+              </w:rPr>
+              <w:t>{{no_urut</w:t>
+            </w:r>
+            <w:r>
+              <w:rPr>
+                <w:spacing w:val="-2"/>
+                <w:lang w:val="en-US"/>
+              </w:rPr>
+              <w:t>_sepuluh</w:t>
+            </w:r>
+            <w:r>
+              <w:rPr>
+                <w:spacing w:val="-2"/>
+                <w:lang w:val="en-US"/>
+              </w:rPr>
+              <w:t>}}</w:t>
+            </w:r>
+          </w:p>
+        </w:tc>
+        <w:tc>
+          <w:tcPr>
+            <w:tcW w:w="6667" w:type="dxa"/>
+          </w:tcPr>
+          <w:p>
+            <w:pPr>
+              <w:pStyle w:val="TableParagraph"/>
+              <w:spacing w:line="247" w:lineRule="exact"/>
+              <w:ind w:left="145"/>
+            </w:pPr>
+          </w:p>
+          <w:p>
+            <w:pPr>
+              <w:pStyle w:val="TableParagraph"/>
+              <w:spacing w:line="247" w:lineRule="exact"/>
+              <w:ind w:left="145"/>
+            </w:pPr>
+          </w:p>
+          <w:p>
+            <w:pPr>
+              <w:pStyle w:val="TableParagraph"/>
+              <w:spacing w:line="247" w:lineRule="exact"/>
+              <w:ind w:left="145"/>
+            </w:pPr>
+            <w:r>
+              <w:t>{{nama_petugas_sepuluh}}</w:t>
+            </w:r>
+          </w:p>
+          <w:p>
+            <w:pPr>
+              <w:pStyle w:val="TableParagraph"/>
+              <w:spacing w:before="111"/>
+              <w:rPr>
+                <w:rFonts w:ascii="Arial"/>
+                <w:b/>
+              </w:rPr>
+            </w:pPr>
+            <w:r>
+              <w:t xml:space="preserve">NIP. </w:t>
+            </w:r>
+            <w:r>
+              <w:t>{{nip_petugas_sepuluh}}</w:t>
+            </w:r>
+          </w:p>
+        </w:tc>
+        <w:tc>
+          <w:tcPr>
+            <w:tcW w:w="3260" w:type="dxa"/>
+          </w:tcPr>
+          <w:p>
+            <w:pPr>
+              <w:pStyle w:val="TableParagraph"/>
+              <w:spacing w:before="111"/>
+              <w:rPr>
+                <w:spacing w:val="-2"/>
+              </w:rPr>
+            </w:pPr>
+          </w:p>
+          <w:p>
+            <w:pPr>
+              <w:pStyle w:val="TableParagraph"/>
+              <w:spacing w:before="111"/>
+              <w:rPr>
+                <w:rFonts w:ascii="Arial"/>
+                <w:b/>
+              </w:rPr>
+            </w:pPr>
+            <w:r>
+              <w:rPr>
+                <w:spacing w:val="-2"/>
+                <w:lang w:val="en-US"/>
+              </w:rPr>
+              <w:t>{{no_urut</w:t>
+            </w:r>
+            <w:r>
+              <w:rPr>
+                <w:spacing w:val="-2"/>
+                <w:lang w:val="en-US"/>
+              </w:rPr>
+              <w:t>_sepuluh</w:t>
             </w:r>
             <w:r>
               <w:rPr>

</xml_diff>

<commit_message>
feat: sync all local UI and backend changes to production
</commit_message>
<xml_diff>
--- a/backend/templates/Berkas Luar Kota - Laporan.docx
+++ b/backend/templates/Berkas Luar Kota - Laporan.docx
@@ -1211,7 +1211,21 @@
         <w:rPr>
           <w:lang w:val="en-US"/>
         </w:rPr>
-        <w:t>{{isi_laporan}}</w:t>
+        <w:t>{{</w:t>
+      </w:r>
+      <w:proofErr w:type="spellStart"/>
+      <w:r>
+        <w:rPr>
+          <w:lang w:val="en-US"/>
+        </w:rPr>
+        <w:t>isi_laporan</w:t>
+      </w:r>
+      <w:proofErr w:type="spellEnd"/>
+      <w:r>
+        <w:rPr>
+          <w:lang w:val="en-US"/>
+        </w:rPr>
+        <w:t>}}</w:t>
       </w:r>
     </w:p>
     <w:p>
@@ -1437,6 +1451,9 @@
     <w:p>
       <w:pPr>
         <w:pStyle w:val="BodyText"/>
+        <w:tabs>
+          <w:tab w:val="left" w:pos="4266"/>
+        </w:tabs>
         <w:spacing w:before="187"/>
         <w:rPr>
           <w:rFonts w:ascii="Arial"/>
@@ -1444,11 +1461,19 @@
           <w:sz w:val="20"/>
         </w:rPr>
       </w:pPr>
+      <w:r>
+        <w:rPr>
+          <w:rFonts w:ascii="Arial"/>
+          <w:b/>
+          <w:sz w:val="20"/>
+        </w:rPr>
+        <w:tab/>
+      </w:r>
     </w:p>
     <w:tbl>
       <w:tblPr>
-        <w:tblW w:w="10494" w:type="dxa"/>
-        <w:tblInd w:w="284" w:type="dxa"/>
+        <w:tblW w:w="4786" w:type="pct"/>
+        <w:jc w:val="center"/>
         <w:tblLayout w:type="fixed"/>
         <w:tblCellMar>
           <w:left w:w="0" w:type="dxa"/>
@@ -1457,17 +1482,18 @@
         <w:tblLook w:val="01E0" w:firstRow="1" w:lastRow="1" w:firstColumn="1" w:lastColumn="1" w:noHBand="0" w:noVBand="0"/>
       </w:tblPr>
       <w:tblGrid>
-        <w:gridCol w:w="567"/>
-        <w:gridCol w:w="6667"/>
-        <w:gridCol w:w="3260"/>
+        <w:gridCol w:w="782"/>
+        <w:gridCol w:w="6233"/>
+        <w:gridCol w:w="2634"/>
       </w:tblGrid>
       <w:tr>
         <w:trPr>
-          <w:trHeight w:val="946"/>
+          <w:trHeight w:val="1177"/>
+          <w:jc w:val="center"/>
         </w:trPr>
         <w:tc>
           <w:tcPr>
-            <w:tcW w:w="567" w:type="dxa"/>
+            <w:tcW w:w="405" w:type="pct"/>
           </w:tcPr>
           <w:p>
             <w:pPr>
@@ -1483,7 +1509,15 @@
                 <w:spacing w:val="-2"/>
                 <w:lang w:val="en-US"/>
               </w:rPr>
-              <w:t>{{no_urut</w:t>
+              <w:t>{{</w:t>
+            </w:r>
+            <w:proofErr w:type="spellStart"/>
+            <w:r>
+              <w:rPr>
+                <w:spacing w:val="-2"/>
+                <w:lang w:val="en-US"/>
+              </w:rPr>
+              <w:t>no_urut</w:t>
             </w:r>
             <w:r>
               <w:rPr>
@@ -1492,6 +1526,7 @@
               </w:rPr>
               <w:t>_satu</w:t>
             </w:r>
+            <w:proofErr w:type="spellEnd"/>
             <w:r>
               <w:rPr>
                 <w:spacing w:val="-2"/>
@@ -1503,7 +1538,7 @@
         </w:tc>
         <w:tc>
           <w:tcPr>
-            <w:tcW w:w="6667" w:type="dxa"/>
+            <w:tcW w:w="3230" w:type="pct"/>
           </w:tcPr>
           <w:p>
             <w:pPr>
@@ -1517,20 +1552,30 @@
               <w:rPr>
                 <w:lang w:val="en-US"/>
               </w:rPr>
-              <w:t xml:space="preserve">  </w:t>
-            </w:r>
-            <w:r>
-              <w:rPr>
-                <w:lang w:val="en-US"/>
-              </w:rPr>
-              <w:t>{{nama_petugas_satu}}</w:t>
+              <w:t>{{</w:t>
+            </w:r>
+            <w:proofErr w:type="spellStart"/>
+            <w:r>
+              <w:rPr>
+                <w:lang w:val="en-US"/>
+              </w:rPr>
+              <w:t>nama_petugas_satu</w:t>
+            </w:r>
+            <w:proofErr w:type="spellEnd"/>
+            <w:r>
+              <w:rPr>
+                <w:lang w:val="en-US"/>
+              </w:rPr>
+              <w:t>}}</w:t>
             </w:r>
           </w:p>
           <w:p>
             <w:pPr>
               <w:pStyle w:val="TableParagraph"/>
-              <w:spacing w:before="126"/>
-              <w:ind w:right="-7185"/>
+              <w:tabs>
+                <w:tab w:val="left" w:pos="4252"/>
+              </w:tabs>
+              <w:spacing w:line="247" w:lineRule="exact"/>
               <w:rPr>
                 <w:lang w:val="en-US"/>
               </w:rPr>
@@ -1539,20 +1584,31 @@
               <w:rPr>
                 <w:lang w:val="en-US"/>
               </w:rPr>
-              <w:t xml:space="preserve">  </w:t>
-            </w:r>
+              <w:tab/>
+            </w:r>
+          </w:p>
+          <w:p>
+            <w:pPr>
+              <w:pStyle w:val="TableParagraph"/>
+              <w:spacing w:line="247" w:lineRule="exact"/>
+              <w:rPr>
+                <w:lang w:val="en-US"/>
+              </w:rPr>
+            </w:pPr>
             <w:r>
               <w:rPr>
                 <w:lang w:val="en-US"/>
               </w:rPr>
               <w:t>NIP. {{</w:t>
             </w:r>
+            <w:proofErr w:type="spellStart"/>
             <w:r>
               <w:rPr>
                 <w:lang w:val="en-US"/>
               </w:rPr>
               <w:t>nip_petugas_satu</w:t>
             </w:r>
+            <w:proofErr w:type="spellEnd"/>
             <w:r>
               <w:rPr>
                 <w:lang w:val="en-US"/>
@@ -1563,7 +1619,7 @@
         </w:tc>
         <w:tc>
           <w:tcPr>
-            <w:tcW w:w="3260" w:type="dxa"/>
+            <w:tcW w:w="1365" w:type="pct"/>
           </w:tcPr>
           <w:p>
             <w:pPr>
@@ -1576,7 +1632,15 @@
                 <w:spacing w:val="-2"/>
                 <w:lang w:val="en-US"/>
               </w:rPr>
-              <w:t>{{no_urut</w:t>
+              <w:t>{{</w:t>
+            </w:r>
+            <w:proofErr w:type="spellStart"/>
+            <w:r>
+              <w:rPr>
+                <w:spacing w:val="-2"/>
+                <w:lang w:val="en-US"/>
+              </w:rPr>
+              <w:t>no_urut</w:t>
             </w:r>
             <w:r>
               <w:rPr>
@@ -1585,6 +1649,8 @@
               </w:rPr>
               <w:t>_satu</w:t>
             </w:r>
+            <w:proofErr w:type="spellEnd"/>
+            <w:proofErr w:type="gramStart"/>
             <w:r>
               <w:rPr>
                 <w:spacing w:val="-2"/>
@@ -1596,131 +1662,185 @@
               <w:rPr>
                 <w:spacing w:val="-2"/>
               </w:rPr>
-              <w:t>……………………..</w:t>
+              <w:t>…</w:t>
+            </w:r>
+            <w:proofErr w:type="gramEnd"/>
+            <w:r>
+              <w:rPr>
+                <w:spacing w:val="-2"/>
+              </w:rPr>
+              <w:t>…………………..</w:t>
             </w:r>
           </w:p>
         </w:tc>
       </w:tr>
       <w:tr>
         <w:trPr>
-          <w:trHeight w:val="1336"/>
+          <w:trHeight w:val="1177"/>
+          <w:jc w:val="center"/>
         </w:trPr>
         <w:tc>
           <w:tcPr>
-            <w:tcW w:w="567" w:type="dxa"/>
-          </w:tcPr>
-          <w:p>
-            <w:pPr>
-              <w:pStyle w:val="TableParagraph"/>
-              <w:ind w:right="121"/>
-              <w:rPr>
-                <w:rFonts w:ascii="Arial"/>
-                <w:b/>
-              </w:rPr>
-            </w:pPr>
-          </w:p>
-          <w:p>
-            <w:pPr>
-              <w:pStyle w:val="TableParagraph"/>
-              <w:ind w:right="121"/>
-            </w:pPr>
-            <w:r>
-              <w:rPr>
-                <w:spacing w:val="-2"/>
-                <w:lang w:val="en-US"/>
-              </w:rPr>
-              <w:t>{{no_urut</w:t>
-            </w:r>
-            <w:r>
-              <w:rPr>
-                <w:spacing w:val="-2"/>
-                <w:lang w:val="en-US"/>
-              </w:rPr>
-              <w:t>_dua</w:t>
-            </w:r>
-            <w:r>
-              <w:rPr>
-                <w:spacing w:val="-2"/>
-                <w:lang w:val="en-US"/>
-              </w:rPr>
-              <w:t>}}</w:t>
-            </w:r>
-          </w:p>
-        </w:tc>
-        <w:tc>
-          <w:tcPr>
-            <w:tcW w:w="6667" w:type="dxa"/>
+            <w:tcW w:w="405" w:type="pct"/>
           </w:tcPr>
           <w:p>
             <w:pPr>
               <w:pStyle w:val="TableParagraph"/>
               <w:spacing w:line="247" w:lineRule="exact"/>
-              <w:ind w:left="145"/>
+              <w:ind w:right="121"/>
+              <w:rPr>
+                <w:spacing w:val="-2"/>
+                <w:lang w:val="en-US"/>
+              </w:rPr>
+            </w:pPr>
+            <w:r>
+              <w:rPr>
+                <w:spacing w:val="-2"/>
+                <w:lang w:val="en-US"/>
+              </w:rPr>
+              <w:t>{{</w:t>
+            </w:r>
+            <w:proofErr w:type="spellStart"/>
+            <w:r>
+              <w:rPr>
+                <w:spacing w:val="-2"/>
+                <w:lang w:val="en-US"/>
+              </w:rPr>
+              <w:t>no_urut_</w:t>
+            </w:r>
+            <w:r>
+              <w:rPr>
+                <w:spacing w:val="-2"/>
+                <w:lang w:val="en-US"/>
+              </w:rPr>
+              <w:t>dua</w:t>
+            </w:r>
+            <w:proofErr w:type="spellEnd"/>
+            <w:r>
+              <w:rPr>
+                <w:spacing w:val="-2"/>
+                <w:lang w:val="en-US"/>
+              </w:rPr>
+              <w:t>}}</w:t>
+            </w:r>
+          </w:p>
+        </w:tc>
+        <w:tc>
+          <w:tcPr>
+            <w:tcW w:w="3230" w:type="pct"/>
+          </w:tcPr>
+          <w:p>
+            <w:pPr>
+              <w:pStyle w:val="TableParagraph"/>
+              <w:spacing w:line="247" w:lineRule="exact"/>
+              <w:rPr>
+                <w:lang w:val="en-US"/>
+              </w:rPr>
+            </w:pPr>
+            <w:r>
+              <w:rPr>
+                <w:lang w:val="en-US"/>
+              </w:rPr>
+              <w:t>{{</w:t>
+            </w:r>
+            <w:proofErr w:type="spellStart"/>
+            <w:r>
+              <w:rPr>
+                <w:lang w:val="en-US"/>
+              </w:rPr>
+              <w:t>nama_petugas_</w:t>
+            </w:r>
+            <w:r>
+              <w:rPr>
+                <w:lang w:val="en-US"/>
+              </w:rPr>
+              <w:t>dua</w:t>
+            </w:r>
+            <w:proofErr w:type="spellEnd"/>
+            <w:r>
+              <w:rPr>
+                <w:lang w:val="en-US"/>
+              </w:rPr>
+              <w:t>}}</w:t>
+            </w:r>
+          </w:p>
+          <w:p>
+            <w:pPr>
+              <w:pStyle w:val="TableParagraph"/>
+              <w:spacing w:line="247" w:lineRule="exact"/>
+              <w:rPr>
+                <w:lang w:val="en-US"/>
+              </w:rPr>
             </w:pPr>
           </w:p>
           <w:p>
             <w:pPr>
               <w:pStyle w:val="TableParagraph"/>
               <w:spacing w:line="247" w:lineRule="exact"/>
-              <w:ind w:left="145"/>
+              <w:rPr>
+                <w:lang w:val="en-US"/>
+              </w:rPr>
             </w:pPr>
             <w:r>
-              <w:t>{{nama_petugas_dua}}</w:t>
-            </w:r>
-          </w:p>
-          <w:p>
-            <w:pPr>
-              <w:pStyle w:val="TableParagraph"/>
-              <w:spacing w:before="126"/>
-              <w:ind w:left="145"/>
-            </w:pPr>
-            <w:r>
-              <w:t xml:space="preserve">NIP. </w:t>
-            </w:r>
-            <w:r>
-              <w:t>{{nip_petugas_dua}}</w:t>
+              <w:rPr>
+                <w:lang w:val="en-US"/>
+              </w:rPr>
+              <w:t>NIP. {{</w:t>
+            </w:r>
+            <w:proofErr w:type="spellStart"/>
+            <w:r>
+              <w:rPr>
+                <w:lang w:val="en-US"/>
+              </w:rPr>
+              <w:t>nip_petugas_satu</w:t>
+            </w:r>
+            <w:proofErr w:type="spellEnd"/>
+            <w:r>
+              <w:rPr>
+                <w:lang w:val="en-US"/>
+              </w:rPr>
+              <w:t>}}</w:t>
             </w:r>
           </w:p>
         </w:tc>
         <w:tc>
           <w:tcPr>
-            <w:tcW w:w="3260" w:type="dxa"/>
+            <w:tcW w:w="1365" w:type="pct"/>
           </w:tcPr>
           <w:p>
             <w:pPr>
               <w:pStyle w:val="TableParagraph"/>
-              <w:ind w:right="51"/>
-              <w:rPr>
-                <w:spacing w:val="-2"/>
+              <w:spacing w:line="247" w:lineRule="exact"/>
+              <w:ind w:right="54"/>
+              <w:rPr>
+                <w:spacing w:val="-2"/>
+                <w:lang w:val="en-US"/>
               </w:rPr>
             </w:pPr>
-          </w:p>
-          <w:p>
-            <w:pPr>
-              <w:pStyle w:val="TableParagraph"/>
-              <w:ind w:right="51"/>
-            </w:pPr>
-            <w:r>
-              <w:rPr>
-                <w:spacing w:val="-2"/>
-                <w:lang w:val="en-US"/>
-              </w:rPr>
-              <w:t>{{no</w:t>
-            </w:r>
-            <w:r>
-              <w:rPr>
-                <w:spacing w:val="-2"/>
-                <w:lang w:val="en-US"/>
-              </w:rPr>
-              <w:t>_urut</w:t>
-            </w:r>
-            <w:r>
-              <w:rPr>
-                <w:spacing w:val="-2"/>
-                <w:lang w:val="en-US"/>
-              </w:rPr>
-              <w:t>_dua</w:t>
-            </w:r>
+            <w:r>
+              <w:rPr>
+                <w:spacing w:val="-2"/>
+                <w:lang w:val="en-US"/>
+              </w:rPr>
+              <w:t>{{</w:t>
+            </w:r>
+            <w:proofErr w:type="spellStart"/>
+            <w:r>
+              <w:rPr>
+                <w:spacing w:val="-2"/>
+                <w:lang w:val="en-US"/>
+              </w:rPr>
+              <w:t>no_urut_</w:t>
+            </w:r>
+            <w:r>
+              <w:rPr>
+                <w:spacing w:val="-2"/>
+                <w:lang w:val="en-US"/>
+              </w:rPr>
+              <w:t>dua</w:t>
+            </w:r>
+            <w:proofErr w:type="spellEnd"/>
+            <w:proofErr w:type="gramStart"/>
             <w:r>
               <w:rPr>
                 <w:spacing w:val="-2"/>
@@ -1732,68 +1852,114 @@
               <w:rPr>
                 <w:spacing w:val="-2"/>
               </w:rPr>
-              <w:t>……………………..</w:t>
+              <w:t>…</w:t>
+            </w:r>
+            <w:proofErr w:type="gramEnd"/>
+            <w:r>
+              <w:rPr>
+                <w:spacing w:val="-2"/>
+              </w:rPr>
+              <w:t>…………………..</w:t>
             </w:r>
           </w:p>
         </w:tc>
       </w:tr>
       <w:tr>
         <w:trPr>
-          <w:trHeight w:val="1346"/>
+          <w:trHeight w:val="1177"/>
+          <w:jc w:val="center"/>
         </w:trPr>
         <w:tc>
           <w:tcPr>
-            <w:tcW w:w="567" w:type="dxa"/>
+            <w:tcW w:w="405" w:type="pct"/>
           </w:tcPr>
           <w:p>
             <w:pPr>
               <w:pStyle w:val="TableParagraph"/>
-              <w:spacing w:before="131"/>
-              <w:rPr>
-                <w:rFonts w:ascii="Arial"/>
-                <w:b/>
+              <w:spacing w:line="247" w:lineRule="exact"/>
+              <w:ind w:right="121"/>
+              <w:rPr>
+                <w:spacing w:val="-2"/>
+                <w:lang w:val="en-US"/>
               </w:rPr>
             </w:pPr>
+            <w:r>
+              <w:rPr>
+                <w:spacing w:val="-2"/>
+                <w:lang w:val="en-US"/>
+              </w:rPr>
+              <w:t>{{</w:t>
+            </w:r>
+            <w:proofErr w:type="spellStart"/>
+            <w:r>
+              <w:rPr>
+                <w:spacing w:val="-2"/>
+                <w:lang w:val="en-US"/>
+              </w:rPr>
+              <w:t>no_urut_</w:t>
+            </w:r>
+            <w:r>
+              <w:rPr>
+                <w:spacing w:val="-2"/>
+                <w:lang w:val="en-US"/>
+              </w:rPr>
+              <w:t>tiga</w:t>
+            </w:r>
+            <w:proofErr w:type="spellEnd"/>
+            <w:r>
+              <w:rPr>
+                <w:spacing w:val="-2"/>
+                <w:lang w:val="en-US"/>
+              </w:rPr>
+              <w:t>}}</w:t>
+            </w:r>
+          </w:p>
+        </w:tc>
+        <w:tc>
+          <w:tcPr>
+            <w:tcW w:w="3230" w:type="pct"/>
+          </w:tcPr>
+          <w:p>
+            <w:pPr>
+              <w:pStyle w:val="TableParagraph"/>
+              <w:spacing w:line="247" w:lineRule="exact"/>
+              <w:rPr>
+                <w:lang w:val="en-US"/>
+              </w:rPr>
+            </w:pPr>
+            <w:r>
+              <w:rPr>
+                <w:lang w:val="en-US"/>
+              </w:rPr>
+              <w:t>{{</w:t>
+            </w:r>
+            <w:proofErr w:type="spellStart"/>
+            <w:r>
+              <w:rPr>
+                <w:lang w:val="en-US"/>
+              </w:rPr>
+              <w:t>nama_petugas_</w:t>
+            </w:r>
+            <w:r>
+              <w:rPr>
+                <w:lang w:val="en-US"/>
+              </w:rPr>
+              <w:t>tiga</w:t>
+            </w:r>
+            <w:proofErr w:type="spellEnd"/>
+            <w:r>
+              <w:rPr>
+                <w:lang w:val="en-US"/>
+              </w:rPr>
+              <w:t>}}</w:t>
+            </w:r>
           </w:p>
           <w:p>
             <w:pPr>
               <w:pStyle w:val="TableParagraph"/>
-              <w:ind w:right="64"/>
-            </w:pPr>
-            <w:r>
-              <w:rPr>
-                <w:spacing w:val="-2"/>
-                <w:lang w:val="en-US"/>
-              </w:rPr>
-              <w:t>{{no_urut</w:t>
-            </w:r>
-            <w:r>
-              <w:rPr>
-                <w:spacing w:val="-2"/>
-                <w:lang w:val="en-US"/>
-              </w:rPr>
-              <w:t>_tiga</w:t>
-            </w:r>
-            <w:r>
-              <w:rPr>
-                <w:spacing w:val="-2"/>
-                <w:lang w:val="en-US"/>
-              </w:rPr>
-              <w:t>}}</w:t>
-            </w:r>
-          </w:p>
-        </w:tc>
-        <w:tc>
-          <w:tcPr>
-            <w:tcW w:w="6667" w:type="dxa"/>
-          </w:tcPr>
-          <w:p>
-            <w:pPr>
-              <w:pStyle w:val="TableParagraph"/>
-              <w:spacing w:before="135"/>
-              <w:rPr>
-                <w:rFonts w:ascii="Arial"/>
-                <w:b/>
+              <w:spacing w:line="247" w:lineRule="exact"/>
+              <w:rPr>
+                <w:lang w:val="en-US"/>
               </w:rPr>
             </w:pPr>
           </w:p>
@@ -1801,60 +1967,70 @@
             <w:pPr>
               <w:pStyle w:val="TableParagraph"/>
               <w:spacing w:line="247" w:lineRule="exact"/>
-              <w:ind w:left="145"/>
+              <w:rPr>
+                <w:lang w:val="en-US"/>
+              </w:rPr>
             </w:pPr>
             <w:r>
-              <w:t>{{nama_petugas_tiga}}</w:t>
-            </w:r>
-          </w:p>
-          <w:p>
-            <w:pPr>
-              <w:pStyle w:val="TableParagraph"/>
-              <w:spacing w:before="126"/>
-              <w:ind w:left="145"/>
-            </w:pPr>
-            <w:r>
-              <w:t xml:space="preserve">NIP. </w:t>
-            </w:r>
-            <w:r>
-              <w:t>{{nip_petugas_tiga}}</w:t>
+              <w:rPr>
+                <w:lang w:val="en-US"/>
+              </w:rPr>
+              <w:t>NIP. {{</w:t>
+            </w:r>
+            <w:proofErr w:type="spellStart"/>
+            <w:r>
+              <w:rPr>
+                <w:lang w:val="en-US"/>
+              </w:rPr>
+              <w:t>nip_petugas_satu</w:t>
+            </w:r>
+            <w:proofErr w:type="spellEnd"/>
+            <w:r>
+              <w:rPr>
+                <w:lang w:val="en-US"/>
+              </w:rPr>
+              <w:t>}}</w:t>
             </w:r>
           </w:p>
         </w:tc>
         <w:tc>
           <w:tcPr>
-            <w:tcW w:w="3260" w:type="dxa"/>
+            <w:tcW w:w="1365" w:type="pct"/>
           </w:tcPr>
           <w:p>
             <w:pPr>
               <w:pStyle w:val="TableParagraph"/>
-              <w:spacing w:before="135"/>
-              <w:rPr>
-                <w:rFonts w:ascii="Arial"/>
-                <w:b/>
+              <w:spacing w:line="247" w:lineRule="exact"/>
+              <w:ind w:right="54"/>
+              <w:rPr>
+                <w:spacing w:val="-2"/>
+                <w:lang w:val="en-US"/>
               </w:rPr>
             </w:pPr>
-          </w:p>
-          <w:p>
-            <w:pPr>
-              <w:pStyle w:val="TableParagraph"/>
-              <w:spacing w:before="1"/>
-              <w:ind w:right="54"/>
-            </w:pPr>
-            <w:r>
-              <w:rPr>
-                <w:spacing w:val="-2"/>
-                <w:lang w:val="en-US"/>
-              </w:rPr>
-              <w:t>{{no_urut</w:t>
-            </w:r>
-            <w:r>
-              <w:rPr>
-                <w:spacing w:val="-2"/>
-                <w:lang w:val="en-US"/>
-              </w:rPr>
-              <w:t>_tiga</w:t>
-            </w:r>
+            <w:r>
+              <w:rPr>
+                <w:spacing w:val="-2"/>
+                <w:lang w:val="en-US"/>
+              </w:rPr>
+              <w:t>{{</w:t>
+            </w:r>
+            <w:proofErr w:type="spellStart"/>
+            <w:r>
+              <w:rPr>
+                <w:spacing w:val="-2"/>
+                <w:lang w:val="en-US"/>
+              </w:rPr>
+              <w:t>no_urut_</w:t>
+            </w:r>
+            <w:r>
+              <w:rPr>
+                <w:spacing w:val="-2"/>
+                <w:lang w:val="en-US"/>
+              </w:rPr>
+              <w:t>tiga</w:t>
+            </w:r>
+            <w:proofErr w:type="spellEnd"/>
+            <w:proofErr w:type="gramStart"/>
             <w:r>
               <w:rPr>
                 <w:spacing w:val="-2"/>
@@ -1866,68 +2042,114 @@
               <w:rPr>
                 <w:spacing w:val="-2"/>
               </w:rPr>
-              <w:t>……………………..</w:t>
+              <w:t>…</w:t>
+            </w:r>
+            <w:proofErr w:type="gramEnd"/>
+            <w:r>
+              <w:rPr>
+                <w:spacing w:val="-2"/>
+              </w:rPr>
+              <w:t>…………………..</w:t>
             </w:r>
           </w:p>
         </w:tc>
       </w:tr>
       <w:tr>
         <w:trPr>
-          <w:trHeight w:val="1313"/>
+          <w:trHeight w:val="1177"/>
+          <w:jc w:val="center"/>
         </w:trPr>
         <w:tc>
           <w:tcPr>
-            <w:tcW w:w="567" w:type="dxa"/>
+            <w:tcW w:w="405" w:type="pct"/>
           </w:tcPr>
           <w:p>
             <w:pPr>
               <w:pStyle w:val="TableParagraph"/>
-              <w:spacing w:before="66"/>
-              <w:rPr>
-                <w:rFonts w:ascii="Arial"/>
-                <w:b/>
+              <w:spacing w:line="247" w:lineRule="exact"/>
+              <w:ind w:right="121"/>
+              <w:rPr>
+                <w:spacing w:val="-2"/>
+                <w:lang w:val="en-US"/>
               </w:rPr>
             </w:pPr>
+            <w:r>
+              <w:rPr>
+                <w:spacing w:val="-2"/>
+                <w:lang w:val="en-US"/>
+              </w:rPr>
+              <w:t>{{</w:t>
+            </w:r>
+            <w:proofErr w:type="spellStart"/>
+            <w:r>
+              <w:rPr>
+                <w:spacing w:val="-2"/>
+                <w:lang w:val="en-US"/>
+              </w:rPr>
+              <w:t>no_urut_</w:t>
+            </w:r>
+            <w:r>
+              <w:rPr>
+                <w:spacing w:val="-2"/>
+                <w:lang w:val="en-US"/>
+              </w:rPr>
+              <w:t>empat</w:t>
+            </w:r>
+            <w:proofErr w:type="spellEnd"/>
+            <w:r>
+              <w:rPr>
+                <w:spacing w:val="-2"/>
+                <w:lang w:val="en-US"/>
+              </w:rPr>
+              <w:t>}}</w:t>
+            </w:r>
+          </w:p>
+        </w:tc>
+        <w:tc>
+          <w:tcPr>
+            <w:tcW w:w="3230" w:type="pct"/>
+          </w:tcPr>
+          <w:p>
+            <w:pPr>
+              <w:pStyle w:val="TableParagraph"/>
+              <w:spacing w:line="247" w:lineRule="exact"/>
+              <w:rPr>
+                <w:lang w:val="en-US"/>
+              </w:rPr>
+            </w:pPr>
+            <w:r>
+              <w:rPr>
+                <w:lang w:val="en-US"/>
+              </w:rPr>
+              <w:t>{{</w:t>
+            </w:r>
+            <w:proofErr w:type="spellStart"/>
+            <w:r>
+              <w:rPr>
+                <w:lang w:val="en-US"/>
+              </w:rPr>
+              <w:t>nama_petugas_</w:t>
+            </w:r>
+            <w:r>
+              <w:rPr>
+                <w:lang w:val="en-US"/>
+              </w:rPr>
+              <w:t>empat</w:t>
+            </w:r>
+            <w:proofErr w:type="spellEnd"/>
+            <w:r>
+              <w:rPr>
+                <w:lang w:val="en-US"/>
+              </w:rPr>
+              <w:t>}}</w:t>
+            </w:r>
           </w:p>
           <w:p>
             <w:pPr>
               <w:pStyle w:val="TableParagraph"/>
-              <w:ind w:right="64"/>
-            </w:pPr>
-            <w:r>
-              <w:rPr>
-                <w:spacing w:val="-2"/>
-                <w:lang w:val="en-US"/>
-              </w:rPr>
-              <w:t>{{no_urut</w:t>
-            </w:r>
-            <w:r>
-              <w:rPr>
-                <w:spacing w:val="-2"/>
-                <w:lang w:val="en-US"/>
-              </w:rPr>
-              <w:t>_empat</w:t>
-            </w:r>
-            <w:r>
-              <w:rPr>
-                <w:spacing w:val="-2"/>
-                <w:lang w:val="en-US"/>
-              </w:rPr>
-              <w:t>}}</w:t>
-            </w:r>
-          </w:p>
-        </w:tc>
-        <w:tc>
-          <w:tcPr>
-            <w:tcW w:w="6667" w:type="dxa"/>
-          </w:tcPr>
-          <w:p>
-            <w:pPr>
-              <w:pStyle w:val="TableParagraph"/>
-              <w:spacing w:before="71"/>
-              <w:rPr>
-                <w:rFonts w:ascii="Arial"/>
-                <w:b/>
+              <w:spacing w:line="247" w:lineRule="exact"/>
+              <w:rPr>
+                <w:lang w:val="en-US"/>
               </w:rPr>
             </w:pPr>
           </w:p>
@@ -1935,37 +2157,379 @@
             <w:pPr>
               <w:pStyle w:val="TableParagraph"/>
               <w:spacing w:line="247" w:lineRule="exact"/>
-              <w:ind w:left="145"/>
+              <w:rPr>
+                <w:lang w:val="en-US"/>
+              </w:rPr>
             </w:pPr>
             <w:r>
-              <w:t>{{nama_petugas_empat}}</w:t>
+              <w:rPr>
+                <w:lang w:val="en-US"/>
+              </w:rPr>
+              <w:t>NIP. {{</w:t>
+            </w:r>
+            <w:proofErr w:type="spellStart"/>
+            <w:r>
+              <w:rPr>
+                <w:lang w:val="en-US"/>
+              </w:rPr>
+              <w:t>nip_petugas_satu</w:t>
+            </w:r>
+            <w:proofErr w:type="spellEnd"/>
+            <w:r>
+              <w:rPr>
+                <w:lang w:val="en-US"/>
+              </w:rPr>
+              <w:t>}}</w:t>
+            </w:r>
+          </w:p>
+        </w:tc>
+        <w:tc>
+          <w:tcPr>
+            <w:tcW w:w="1365" w:type="pct"/>
+          </w:tcPr>
+          <w:p>
+            <w:pPr>
+              <w:pStyle w:val="TableParagraph"/>
+              <w:spacing w:line="247" w:lineRule="exact"/>
+              <w:ind w:right="54"/>
+              <w:rPr>
+                <w:spacing w:val="-2"/>
+                <w:lang w:val="en-US"/>
+              </w:rPr>
+            </w:pPr>
+            <w:r>
+              <w:rPr>
+                <w:spacing w:val="-2"/>
+                <w:lang w:val="en-US"/>
+              </w:rPr>
+              <w:t>{{</w:t>
+            </w:r>
+            <w:proofErr w:type="spellStart"/>
+            <w:r>
+              <w:rPr>
+                <w:spacing w:val="-2"/>
+                <w:lang w:val="en-US"/>
+              </w:rPr>
+              <w:t>no_urut_</w:t>
+            </w:r>
+            <w:r>
+              <w:rPr>
+                <w:spacing w:val="-2"/>
+                <w:lang w:val="en-US"/>
+              </w:rPr>
+              <w:t>empat</w:t>
+            </w:r>
+            <w:proofErr w:type="spellEnd"/>
+            <w:proofErr w:type="gramStart"/>
+            <w:r>
+              <w:rPr>
+                <w:spacing w:val="-2"/>
+                <w:lang w:val="en-US"/>
+              </w:rPr>
+              <w:t>}}</w:t>
+            </w:r>
+            <w:r>
+              <w:rPr>
+                <w:spacing w:val="-2"/>
+              </w:rPr>
+              <w:t>…</w:t>
+            </w:r>
+            <w:proofErr w:type="gramEnd"/>
+            <w:r>
+              <w:rPr>
+                <w:spacing w:val="-2"/>
+              </w:rPr>
+              <w:t>…………………..</w:t>
+            </w:r>
+          </w:p>
+        </w:tc>
+      </w:tr>
+      <w:tr>
+        <w:trPr>
+          <w:trHeight w:val="1177"/>
+          <w:jc w:val="center"/>
+        </w:trPr>
+        <w:tc>
+          <w:tcPr>
+            <w:tcW w:w="405" w:type="pct"/>
+          </w:tcPr>
+          <w:p>
+            <w:pPr>
+              <w:pStyle w:val="TableParagraph"/>
+              <w:spacing w:line="247" w:lineRule="exact"/>
+              <w:ind w:right="121"/>
+              <w:rPr>
+                <w:spacing w:val="-2"/>
+                <w:lang w:val="en-US"/>
+              </w:rPr>
+            </w:pPr>
+            <w:r>
+              <w:rPr>
+                <w:spacing w:val="-2"/>
+                <w:lang w:val="en-US"/>
+              </w:rPr>
+              <w:t>{{</w:t>
+            </w:r>
+            <w:proofErr w:type="spellStart"/>
+            <w:r>
+              <w:rPr>
+                <w:spacing w:val="-2"/>
+                <w:lang w:val="en-US"/>
+              </w:rPr>
+              <w:t>no_urut_</w:t>
+            </w:r>
+            <w:r>
+              <w:rPr>
+                <w:spacing w:val="-2"/>
+                <w:lang w:val="en-US"/>
+              </w:rPr>
+              <w:t>lima</w:t>
+            </w:r>
+            <w:proofErr w:type="spellEnd"/>
+            <w:r>
+              <w:rPr>
+                <w:spacing w:val="-2"/>
+                <w:lang w:val="en-US"/>
+              </w:rPr>
+              <w:t>}}</w:t>
+            </w:r>
+          </w:p>
+        </w:tc>
+        <w:tc>
+          <w:tcPr>
+            <w:tcW w:w="3230" w:type="pct"/>
+          </w:tcPr>
+          <w:p>
+            <w:pPr>
+              <w:pStyle w:val="TableParagraph"/>
+              <w:spacing w:line="247" w:lineRule="exact"/>
+              <w:rPr>
+                <w:lang w:val="en-US"/>
+              </w:rPr>
+            </w:pPr>
+            <w:r>
+              <w:rPr>
+                <w:lang w:val="en-US"/>
+              </w:rPr>
+              <w:t>{{</w:t>
+            </w:r>
+            <w:proofErr w:type="spellStart"/>
+            <w:r>
+              <w:rPr>
+                <w:lang w:val="en-US"/>
+              </w:rPr>
+              <w:t>nama_petugas_</w:t>
+            </w:r>
+            <w:r>
+              <w:rPr>
+                <w:lang w:val="en-US"/>
+              </w:rPr>
+              <w:t>lima</w:t>
+            </w:r>
+            <w:proofErr w:type="spellEnd"/>
+            <w:r>
+              <w:rPr>
+                <w:lang w:val="en-US"/>
+              </w:rPr>
+              <w:t>}}</w:t>
             </w:r>
           </w:p>
           <w:p>
             <w:pPr>
               <w:pStyle w:val="TableParagraph"/>
-              <w:spacing w:before="126"/>
-              <w:ind w:left="145"/>
+              <w:spacing w:line="247" w:lineRule="exact"/>
+              <w:rPr>
+                <w:lang w:val="en-US"/>
+              </w:rPr>
             </w:pPr>
-            <w:r>
-              <w:t xml:space="preserve">NIP. </w:t>
-            </w:r>
-            <w:r>
-              <w:t>{{nip_petugas_empat}}</w:t>
+          </w:p>
+          <w:p>
+            <w:pPr>
+              <w:pStyle w:val="TableParagraph"/>
+              <w:spacing w:line="247" w:lineRule="exact"/>
+              <w:rPr>
+                <w:lang w:val="en-US"/>
+              </w:rPr>
+            </w:pPr>
+            <w:r>
+              <w:rPr>
+                <w:lang w:val="en-US"/>
+              </w:rPr>
+              <w:t>NIP. {{</w:t>
+            </w:r>
+            <w:proofErr w:type="spellStart"/>
+            <w:r>
+              <w:rPr>
+                <w:lang w:val="en-US"/>
+              </w:rPr>
+              <w:t>nip_petugas_satu</w:t>
+            </w:r>
+            <w:proofErr w:type="spellEnd"/>
+            <w:r>
+              <w:rPr>
+                <w:lang w:val="en-US"/>
+              </w:rPr>
+              <w:t>}}</w:t>
             </w:r>
           </w:p>
         </w:tc>
         <w:tc>
           <w:tcPr>
-            <w:tcW w:w="3260" w:type="dxa"/>
+            <w:tcW w:w="1365" w:type="pct"/>
           </w:tcPr>
           <w:p>
             <w:pPr>
               <w:pStyle w:val="TableParagraph"/>
-              <w:spacing w:before="71"/>
-              <w:rPr>
-                <w:rFonts w:ascii="Arial"/>
-                <w:b/>
+              <w:spacing w:line="247" w:lineRule="exact"/>
+              <w:ind w:right="54"/>
+              <w:rPr>
+                <w:spacing w:val="-2"/>
+                <w:lang w:val="en-US"/>
+              </w:rPr>
+            </w:pPr>
+            <w:r>
+              <w:rPr>
+                <w:spacing w:val="-2"/>
+                <w:lang w:val="en-US"/>
+              </w:rPr>
+              <w:t>{{</w:t>
+            </w:r>
+            <w:proofErr w:type="spellStart"/>
+            <w:r>
+              <w:rPr>
+                <w:spacing w:val="-2"/>
+                <w:lang w:val="en-US"/>
+              </w:rPr>
+              <w:t>no_urut_</w:t>
+            </w:r>
+            <w:r>
+              <w:rPr>
+                <w:spacing w:val="-2"/>
+                <w:lang w:val="en-US"/>
+              </w:rPr>
+              <w:t>lima</w:t>
+            </w:r>
+            <w:proofErr w:type="spellEnd"/>
+            <w:proofErr w:type="gramStart"/>
+            <w:r>
+              <w:rPr>
+                <w:spacing w:val="-2"/>
+                <w:lang w:val="en-US"/>
+              </w:rPr>
+              <w:t>}}</w:t>
+            </w:r>
+            <w:r>
+              <w:rPr>
+                <w:spacing w:val="-2"/>
+              </w:rPr>
+              <w:t>…</w:t>
+            </w:r>
+            <w:proofErr w:type="gramEnd"/>
+            <w:r>
+              <w:rPr>
+                <w:spacing w:val="-2"/>
+              </w:rPr>
+              <w:t>…………………..</w:t>
+            </w:r>
+          </w:p>
+        </w:tc>
+      </w:tr>
+      <w:tr>
+        <w:trPr>
+          <w:trHeight w:val="1177"/>
+          <w:jc w:val="center"/>
+        </w:trPr>
+        <w:tc>
+          <w:tcPr>
+            <w:tcW w:w="405" w:type="pct"/>
+          </w:tcPr>
+          <w:p>
+            <w:pPr>
+              <w:pStyle w:val="TableParagraph"/>
+              <w:spacing w:line="247" w:lineRule="exact"/>
+              <w:ind w:right="121"/>
+              <w:rPr>
+                <w:spacing w:val="-2"/>
+                <w:lang w:val="en-US"/>
+              </w:rPr>
+            </w:pPr>
+            <w:r>
+              <w:rPr>
+                <w:spacing w:val="-2"/>
+                <w:lang w:val="en-US"/>
+              </w:rPr>
+              <w:t>{{</w:t>
+            </w:r>
+            <w:proofErr w:type="spellStart"/>
+            <w:r>
+              <w:rPr>
+                <w:spacing w:val="-2"/>
+                <w:lang w:val="en-US"/>
+              </w:rPr>
+              <w:t>no_urut_</w:t>
+            </w:r>
+            <w:r>
+              <w:rPr>
+                <w:spacing w:val="-2"/>
+                <w:lang w:val="en-US"/>
+              </w:rPr>
+              <w:t>enam</w:t>
+            </w:r>
+            <w:proofErr w:type="spellEnd"/>
+            <w:r>
+              <w:rPr>
+                <w:spacing w:val="-2"/>
+                <w:lang w:val="en-US"/>
+              </w:rPr>
+              <w:t>}}</w:t>
+            </w:r>
+          </w:p>
+        </w:tc>
+        <w:tc>
+          <w:tcPr>
+            <w:tcW w:w="3230" w:type="pct"/>
+          </w:tcPr>
+          <w:p>
+            <w:pPr>
+              <w:pStyle w:val="TableParagraph"/>
+              <w:spacing w:line="247" w:lineRule="exact"/>
+              <w:rPr>
+                <w:lang w:val="en-US"/>
+              </w:rPr>
+            </w:pPr>
+            <w:r>
+              <w:rPr>
+                <w:lang w:val="en-US"/>
+              </w:rPr>
+              <w:t>{{</w:t>
+            </w:r>
+            <w:proofErr w:type="spellStart"/>
+            <w:r>
+              <w:rPr>
+                <w:lang w:val="en-US"/>
+              </w:rPr>
+              <w:t>nama_petugas_</w:t>
+            </w:r>
+            <w:r>
+              <w:rPr>
+                <w:lang w:val="en-US"/>
+              </w:rPr>
+              <w:t>enam</w:t>
+            </w:r>
+            <w:proofErr w:type="spellEnd"/>
+            <w:r>
+              <w:rPr>
+                <w:lang w:val="en-US"/>
+              </w:rPr>
+              <w:t>}}</w:t>
+            </w:r>
+          </w:p>
+          <w:p>
+            <w:pPr>
+              <w:pStyle w:val="TableParagraph"/>
+              <w:spacing w:line="247" w:lineRule="exact"/>
+              <w:rPr>
+                <w:lang w:val="en-US"/>
               </w:rPr>
             </w:pPr>
           </w:p>
@@ -1973,97 +2537,192 @@
             <w:pPr>
               <w:pStyle w:val="TableParagraph"/>
               <w:tabs>
-                <w:tab w:val="left" w:leader="dot" w:pos="2271"/>
+                <w:tab w:val="left" w:pos="1060"/>
               </w:tabs>
-              <w:ind w:right="47"/>
+              <w:spacing w:line="247" w:lineRule="exact"/>
+              <w:rPr>
+                <w:lang w:val="en-US"/>
+              </w:rPr>
             </w:pPr>
             <w:r>
               <w:rPr>
-                <w:spacing w:val="-2"/>
-                <w:lang w:val="en-US"/>
-              </w:rPr>
-              <w:t>{{no_urut</w:t>
-            </w:r>
-            <w:r>
-              <w:rPr>
-                <w:spacing w:val="-2"/>
-                <w:lang w:val="en-US"/>
-              </w:rPr>
-              <w:t>_empat</w:t>
-            </w:r>
-            <w:r>
-              <w:rPr>
-                <w:spacing w:val="-2"/>
+                <w:lang w:val="en-US"/>
+              </w:rPr>
+              <w:t>NIP. {{</w:t>
+            </w:r>
+            <w:proofErr w:type="spellStart"/>
+            <w:r>
+              <w:rPr>
+                <w:lang w:val="en-US"/>
+              </w:rPr>
+              <w:t>nip_petugas_satu</w:t>
+            </w:r>
+            <w:proofErr w:type="spellEnd"/>
+            <w:r>
+              <w:rPr>
                 <w:lang w:val="en-US"/>
               </w:rPr>
               <w:t>}}</w:t>
             </w:r>
-            <w:r>
-              <w:rPr>
-                <w:spacing w:val="-2"/>
-              </w:rPr>
-              <w:t>……………………..</w:t>
+          </w:p>
+        </w:tc>
+        <w:tc>
+          <w:tcPr>
+            <w:tcW w:w="1365" w:type="pct"/>
+          </w:tcPr>
+          <w:p>
+            <w:pPr>
+              <w:pStyle w:val="TableParagraph"/>
+              <w:spacing w:line="247" w:lineRule="exact"/>
+              <w:ind w:right="54"/>
+              <w:rPr>
+                <w:spacing w:val="-2"/>
+                <w:lang w:val="en-US"/>
+              </w:rPr>
+            </w:pPr>
+            <w:r>
+              <w:rPr>
+                <w:spacing w:val="-2"/>
+                <w:lang w:val="en-US"/>
+              </w:rPr>
+              <w:t>{{</w:t>
+            </w:r>
+            <w:proofErr w:type="spellStart"/>
+            <w:r>
+              <w:rPr>
+                <w:spacing w:val="-2"/>
+                <w:lang w:val="en-US"/>
+              </w:rPr>
+              <w:t>no_urut_</w:t>
+            </w:r>
+            <w:r>
+              <w:rPr>
+                <w:spacing w:val="-2"/>
+                <w:lang w:val="en-US"/>
+              </w:rPr>
+              <w:t>enam</w:t>
+            </w:r>
+            <w:proofErr w:type="spellEnd"/>
+            <w:proofErr w:type="gramStart"/>
+            <w:r>
+              <w:rPr>
+                <w:spacing w:val="-2"/>
+                <w:lang w:val="en-US"/>
+              </w:rPr>
+              <w:t>}}</w:t>
+            </w:r>
+            <w:r>
+              <w:rPr>
+                <w:spacing w:val="-2"/>
+              </w:rPr>
+              <w:t>…</w:t>
+            </w:r>
+            <w:proofErr w:type="gramEnd"/>
+            <w:r>
+              <w:rPr>
+                <w:spacing w:val="-2"/>
+              </w:rPr>
+              <w:t>…………………..</w:t>
             </w:r>
           </w:p>
         </w:tc>
       </w:tr>
       <w:tr>
         <w:trPr>
-          <w:trHeight w:val="1353"/>
+          <w:trHeight w:val="1177"/>
+          <w:jc w:val="center"/>
         </w:trPr>
         <w:tc>
           <w:tcPr>
-            <w:tcW w:w="567" w:type="dxa"/>
+            <w:tcW w:w="405" w:type="pct"/>
           </w:tcPr>
           <w:p>
             <w:pPr>
               <w:pStyle w:val="TableParagraph"/>
-              <w:spacing w:before="97"/>
-              <w:rPr>
-                <w:rFonts w:ascii="Arial"/>
-                <w:b/>
+              <w:spacing w:line="247" w:lineRule="exact"/>
+              <w:ind w:right="121"/>
+              <w:rPr>
+                <w:spacing w:val="-2"/>
+                <w:lang w:val="en-US"/>
               </w:rPr>
             </w:pPr>
+            <w:r>
+              <w:rPr>
+                <w:spacing w:val="-2"/>
+                <w:lang w:val="en-US"/>
+              </w:rPr>
+              <w:t>{{</w:t>
+            </w:r>
+            <w:proofErr w:type="spellStart"/>
+            <w:r>
+              <w:rPr>
+                <w:spacing w:val="-2"/>
+                <w:lang w:val="en-US"/>
+              </w:rPr>
+              <w:t>no_urut_</w:t>
+            </w:r>
+            <w:r>
+              <w:rPr>
+                <w:spacing w:val="-2"/>
+                <w:lang w:val="en-US"/>
+              </w:rPr>
+              <w:t>tujuh</w:t>
+            </w:r>
+            <w:proofErr w:type="spellEnd"/>
+            <w:r>
+              <w:rPr>
+                <w:spacing w:val="-2"/>
+                <w:lang w:val="en-US"/>
+              </w:rPr>
+              <w:t>}}</w:t>
+            </w:r>
+          </w:p>
+        </w:tc>
+        <w:tc>
+          <w:tcPr>
+            <w:tcW w:w="3230" w:type="pct"/>
+          </w:tcPr>
+          <w:p>
+            <w:pPr>
+              <w:pStyle w:val="TableParagraph"/>
+              <w:spacing w:line="247" w:lineRule="exact"/>
+              <w:rPr>
+                <w:lang w:val="en-US"/>
+              </w:rPr>
+            </w:pPr>
+            <w:r>
+              <w:rPr>
+                <w:lang w:val="en-US"/>
+              </w:rPr>
+              <w:t>{{</w:t>
+            </w:r>
+            <w:proofErr w:type="spellStart"/>
+            <w:r>
+              <w:rPr>
+                <w:lang w:val="en-US"/>
+              </w:rPr>
+              <w:t>nama_petugas_</w:t>
+            </w:r>
+            <w:r>
+              <w:rPr>
+                <w:lang w:val="en-US"/>
+              </w:rPr>
+              <w:t>tujuh</w:t>
+            </w:r>
+            <w:proofErr w:type="spellEnd"/>
+            <w:r>
+              <w:rPr>
+                <w:lang w:val="en-US"/>
+              </w:rPr>
+              <w:t>}}</w:t>
+            </w:r>
           </w:p>
           <w:p>
             <w:pPr>
               <w:pStyle w:val="TableParagraph"/>
-              <w:ind w:right="121"/>
-            </w:pPr>
-            <w:r>
-              <w:rPr>
-                <w:spacing w:val="-2"/>
-                <w:lang w:val="en-US"/>
-              </w:rPr>
-              <w:t>{{no_urut</w:t>
-            </w:r>
-            <w:r>
-              <w:rPr>
-                <w:spacing w:val="-2"/>
-                <w:lang w:val="en-US"/>
-              </w:rPr>
-              <w:t>_lima</w:t>
-            </w:r>
-            <w:r>
-              <w:rPr>
-                <w:spacing w:val="-2"/>
-                <w:lang w:val="en-US"/>
-              </w:rPr>
-              <w:t>}}</w:t>
-            </w:r>
-          </w:p>
-        </w:tc>
-        <w:tc>
-          <w:tcPr>
-            <w:tcW w:w="6667" w:type="dxa"/>
-          </w:tcPr>
-          <w:p>
-            <w:pPr>
-              <w:pStyle w:val="TableParagraph"/>
-              <w:spacing w:before="102"/>
-              <w:rPr>
-                <w:rFonts w:ascii="Arial"/>
-                <w:b/>
+              <w:spacing w:line="247" w:lineRule="exact"/>
+              <w:rPr>
+                <w:lang w:val="en-US"/>
               </w:rPr>
             </w:pPr>
           </w:p>
@@ -2071,62 +2730,70 @@
             <w:pPr>
               <w:pStyle w:val="TableParagraph"/>
               <w:spacing w:line="247" w:lineRule="exact"/>
-              <w:ind w:left="145"/>
+              <w:rPr>
+                <w:lang w:val="en-US"/>
+              </w:rPr>
             </w:pPr>
             <w:r>
-              <w:t>{{nama_petugas_lima}}</w:t>
-            </w:r>
-          </w:p>
-          <w:p>
-            <w:pPr>
-              <w:pStyle w:val="TableParagraph"/>
-              <w:spacing w:before="126"/>
-              <w:ind w:left="145"/>
-            </w:pPr>
-            <w:r>
-              <w:t xml:space="preserve">NIP. </w:t>
-            </w:r>
-            <w:r>
-              <w:t>{{nip_petugas_lima}}</w:t>
+              <w:rPr>
+                <w:lang w:val="en-US"/>
+              </w:rPr>
+              <w:t>NIP. {{</w:t>
+            </w:r>
+            <w:proofErr w:type="spellStart"/>
+            <w:r>
+              <w:rPr>
+                <w:lang w:val="en-US"/>
+              </w:rPr>
+              <w:t>nip_petugas_satu</w:t>
+            </w:r>
+            <w:proofErr w:type="spellEnd"/>
+            <w:r>
+              <w:rPr>
+                <w:lang w:val="en-US"/>
+              </w:rPr>
+              <w:t>}}</w:t>
             </w:r>
           </w:p>
         </w:tc>
         <w:tc>
           <w:tcPr>
-            <w:tcW w:w="3260" w:type="dxa"/>
+            <w:tcW w:w="1365" w:type="pct"/>
           </w:tcPr>
           <w:p>
             <w:pPr>
               <w:pStyle w:val="TableParagraph"/>
-              <w:spacing w:before="102"/>
-              <w:rPr>
-                <w:rFonts w:ascii="Arial"/>
-                <w:b/>
+              <w:spacing w:line="247" w:lineRule="exact"/>
+              <w:ind w:right="54"/>
+              <w:rPr>
+                <w:spacing w:val="-2"/>
+                <w:lang w:val="en-US"/>
               </w:rPr>
             </w:pPr>
-          </w:p>
-          <w:p>
-            <w:pPr>
-              <w:pStyle w:val="TableParagraph"/>
-              <w:tabs>
-                <w:tab w:val="left" w:leader="dot" w:pos="2271"/>
-              </w:tabs>
-              <w:ind w:right="47"/>
-            </w:pPr>
-            <w:r>
-              <w:rPr>
-                <w:spacing w:val="-2"/>
-                <w:lang w:val="en-US"/>
-              </w:rPr>
-              <w:t>{{no_urut</w:t>
-            </w:r>
-            <w:r>
-              <w:rPr>
-                <w:spacing w:val="-2"/>
-                <w:lang w:val="en-US"/>
-              </w:rPr>
-              <w:t>_lima</w:t>
-            </w:r>
+            <w:r>
+              <w:rPr>
+                <w:spacing w:val="-2"/>
+                <w:lang w:val="en-US"/>
+              </w:rPr>
+              <w:t>{{</w:t>
+            </w:r>
+            <w:proofErr w:type="spellStart"/>
+            <w:r>
+              <w:rPr>
+                <w:spacing w:val="-2"/>
+                <w:lang w:val="en-US"/>
+              </w:rPr>
+              <w:t>no_urut_</w:t>
+            </w:r>
+            <w:r>
+              <w:rPr>
+                <w:spacing w:val="-2"/>
+                <w:lang w:val="en-US"/>
+              </w:rPr>
+              <w:t>tujuh</w:t>
+            </w:r>
+            <w:proofErr w:type="spellEnd"/>
+            <w:proofErr w:type="gramStart"/>
             <w:r>
               <w:rPr>
                 <w:spacing w:val="-2"/>
@@ -2138,68 +2805,114 @@
               <w:rPr>
                 <w:spacing w:val="-2"/>
               </w:rPr>
-              <w:t>……………………..</w:t>
+              <w:t>…</w:t>
+            </w:r>
+            <w:proofErr w:type="gramEnd"/>
+            <w:r>
+              <w:rPr>
+                <w:spacing w:val="-2"/>
+              </w:rPr>
+              <w:t>…………………..</w:t>
             </w:r>
           </w:p>
         </w:tc>
       </w:tr>
       <w:tr>
         <w:trPr>
-          <w:trHeight w:val="997"/>
+          <w:trHeight w:val="1177"/>
+          <w:jc w:val="center"/>
         </w:trPr>
         <w:tc>
           <w:tcPr>
-            <w:tcW w:w="567" w:type="dxa"/>
+            <w:tcW w:w="405" w:type="pct"/>
           </w:tcPr>
           <w:p>
             <w:pPr>
               <w:pStyle w:val="TableParagraph"/>
-              <w:spacing w:before="107"/>
-              <w:rPr>
-                <w:rFonts w:ascii="Arial"/>
-                <w:b/>
+              <w:spacing w:line="247" w:lineRule="exact"/>
+              <w:ind w:right="121"/>
+              <w:rPr>
+                <w:spacing w:val="-2"/>
+                <w:lang w:val="en-US"/>
               </w:rPr>
             </w:pPr>
+            <w:r>
+              <w:rPr>
+                <w:spacing w:val="-2"/>
+                <w:lang w:val="en-US"/>
+              </w:rPr>
+              <w:t>{{</w:t>
+            </w:r>
+            <w:proofErr w:type="spellStart"/>
+            <w:r>
+              <w:rPr>
+                <w:spacing w:val="-2"/>
+                <w:lang w:val="en-US"/>
+              </w:rPr>
+              <w:t>no_urut_</w:t>
+            </w:r>
+            <w:r>
+              <w:rPr>
+                <w:spacing w:val="-2"/>
+                <w:lang w:val="en-US"/>
+              </w:rPr>
+              <w:t>delapan</w:t>
+            </w:r>
+            <w:proofErr w:type="spellEnd"/>
+            <w:r>
+              <w:rPr>
+                <w:spacing w:val="-2"/>
+                <w:lang w:val="en-US"/>
+              </w:rPr>
+              <w:t>}}</w:t>
+            </w:r>
+          </w:p>
+        </w:tc>
+        <w:tc>
+          <w:tcPr>
+            <w:tcW w:w="3230" w:type="pct"/>
+          </w:tcPr>
+          <w:p>
+            <w:pPr>
+              <w:pStyle w:val="TableParagraph"/>
+              <w:spacing w:line="247" w:lineRule="exact"/>
+              <w:rPr>
+                <w:lang w:val="en-US"/>
+              </w:rPr>
+            </w:pPr>
+            <w:r>
+              <w:rPr>
+                <w:lang w:val="en-US"/>
+              </w:rPr>
+              <w:t>{{</w:t>
+            </w:r>
+            <w:proofErr w:type="spellStart"/>
+            <w:r>
+              <w:rPr>
+                <w:lang w:val="en-US"/>
+              </w:rPr>
+              <w:t>nama_petugas</w:t>
+            </w:r>
+            <w:r>
+              <w:rPr>
+                <w:lang w:val="en-US"/>
+              </w:rPr>
+              <w:t>_delapan</w:t>
+            </w:r>
+            <w:proofErr w:type="spellEnd"/>
+            <w:r>
+              <w:rPr>
+                <w:lang w:val="en-US"/>
+              </w:rPr>
+              <w:t>}}</w:t>
+            </w:r>
           </w:p>
           <w:p>
             <w:pPr>
               <w:pStyle w:val="TableParagraph"/>
-              <w:ind w:right="121"/>
-            </w:pPr>
-            <w:r>
-              <w:rPr>
-                <w:spacing w:val="-2"/>
-                <w:lang w:val="en-US"/>
-              </w:rPr>
-              <w:t>{{no_urut</w:t>
-            </w:r>
-            <w:r>
-              <w:rPr>
-                <w:spacing w:val="-2"/>
-                <w:lang w:val="en-US"/>
-              </w:rPr>
-              <w:t>_enam</w:t>
-            </w:r>
-            <w:r>
-              <w:rPr>
-                <w:spacing w:val="-2"/>
-                <w:lang w:val="en-US"/>
-              </w:rPr>
-              <w:t>}}</w:t>
-            </w:r>
-          </w:p>
-        </w:tc>
-        <w:tc>
-          <w:tcPr>
-            <w:tcW w:w="6667" w:type="dxa"/>
-          </w:tcPr>
-          <w:p>
-            <w:pPr>
-              <w:pStyle w:val="TableParagraph"/>
-              <w:spacing w:before="111"/>
-              <w:rPr>
-                <w:rFonts w:ascii="Arial"/>
-                <w:b/>
+              <w:spacing w:line="247" w:lineRule="exact"/>
+              <w:rPr>
+                <w:lang w:val="en-US"/>
               </w:rPr>
             </w:pPr>
           </w:p>
@@ -2207,63 +2920,70 @@
             <w:pPr>
               <w:pStyle w:val="TableParagraph"/>
               <w:spacing w:line="247" w:lineRule="exact"/>
-              <w:ind w:left="145"/>
+              <w:rPr>
+                <w:lang w:val="en-US"/>
+              </w:rPr>
             </w:pPr>
             <w:r>
-              <w:t>{{nama_petugas_enam}}</w:t>
-            </w:r>
-          </w:p>
-          <w:p>
-            <w:pPr>
-              <w:pStyle w:val="TableParagraph"/>
-              <w:spacing w:before="126" w:line="233" w:lineRule="exact"/>
-              <w:ind w:left="145"/>
-            </w:pPr>
-            <w:r>
-              <w:t xml:space="preserve">NIP. </w:t>
-            </w:r>
-            <w:r>
-              <w:t>{{nip_petugas_enam}}</w:t>
+              <w:rPr>
+                <w:lang w:val="en-US"/>
+              </w:rPr>
+              <w:t>NIP. {{</w:t>
+            </w:r>
+            <w:proofErr w:type="spellStart"/>
+            <w:r>
+              <w:rPr>
+                <w:lang w:val="en-US"/>
+              </w:rPr>
+              <w:t>nip_petugas_satu</w:t>
+            </w:r>
+            <w:proofErr w:type="spellEnd"/>
+            <w:r>
+              <w:rPr>
+                <w:lang w:val="en-US"/>
+              </w:rPr>
+              <w:t>}}</w:t>
             </w:r>
           </w:p>
         </w:tc>
         <w:tc>
           <w:tcPr>
-            <w:tcW w:w="3260" w:type="dxa"/>
+            <w:tcW w:w="1365" w:type="pct"/>
           </w:tcPr>
           <w:p>
             <w:pPr>
               <w:pStyle w:val="TableParagraph"/>
-              <w:spacing w:before="111"/>
-              <w:rPr>
-                <w:rFonts w:ascii="Arial"/>
-                <w:b/>
+              <w:spacing w:line="247" w:lineRule="exact"/>
+              <w:ind w:right="54"/>
+              <w:rPr>
+                <w:spacing w:val="-2"/>
+                <w:lang w:val="en-US"/>
               </w:rPr>
             </w:pPr>
-          </w:p>
-          <w:p>
-            <w:pPr>
-              <w:pStyle w:val="TableParagraph"/>
-              <w:tabs>
-                <w:tab w:val="left" w:leader="dot" w:pos="2271"/>
-              </w:tabs>
-              <w:spacing w:before="1"/>
-              <w:ind w:right="47"/>
-            </w:pPr>
-            <w:r>
-              <w:rPr>
-                <w:spacing w:val="-2"/>
-                <w:lang w:val="en-US"/>
-              </w:rPr>
-              <w:t>{{no_urut</w:t>
-            </w:r>
-            <w:r>
-              <w:rPr>
-                <w:spacing w:val="-2"/>
-                <w:lang w:val="en-US"/>
-              </w:rPr>
-              <w:t>_enam</w:t>
-            </w:r>
+            <w:r>
+              <w:rPr>
+                <w:spacing w:val="-2"/>
+                <w:lang w:val="en-US"/>
+              </w:rPr>
+              <w:t>{{</w:t>
+            </w:r>
+            <w:proofErr w:type="spellStart"/>
+            <w:r>
+              <w:rPr>
+                <w:spacing w:val="-2"/>
+                <w:lang w:val="en-US"/>
+              </w:rPr>
+              <w:t>no_urut_</w:t>
+            </w:r>
+            <w:r>
+              <w:rPr>
+                <w:spacing w:val="-2"/>
+                <w:lang w:val="en-US"/>
+              </w:rPr>
+              <w:t>delapan</w:t>
+            </w:r>
+            <w:proofErr w:type="spellEnd"/>
+            <w:proofErr w:type="gramStart"/>
             <w:r>
               <w:rPr>
                 <w:spacing w:val="-2"/>
@@ -2275,289 +2995,375 @@
               <w:rPr>
                 <w:spacing w:val="-2"/>
               </w:rPr>
-              <w:t>……………………..</w:t>
+              <w:t>…</w:t>
+            </w:r>
+            <w:proofErr w:type="gramEnd"/>
+            <w:r>
+              <w:rPr>
+                <w:spacing w:val="-2"/>
+              </w:rPr>
+              <w:t>…………………..</w:t>
             </w:r>
           </w:p>
         </w:tc>
       </w:tr>
       <w:tr>
         <w:trPr>
-          <w:trHeight w:val="997"/>
+          <w:trHeight w:val="1177"/>
+          <w:jc w:val="center"/>
         </w:trPr>
         <w:tc>
           <w:tcPr>
-            <w:tcW w:w="567" w:type="dxa"/>
-          </w:tcPr>
-          <w:p>
-            <w:pPr>
-              <w:pStyle w:val="TableParagraph"/>
-              <w:spacing w:before="107"/>
-              <w:rPr>
-                <w:spacing w:val="-2"/>
-                <w:lang w:val="en-US"/>
-              </w:rPr>
-            </w:pPr>
-          </w:p>
-          <w:p>
-            <w:pPr>
-              <w:pStyle w:val="TableParagraph"/>
-              <w:spacing w:before="107"/>
-              <w:rPr>
-                <w:rFonts w:ascii="Arial"/>
-                <w:b/>
-              </w:rPr>
-            </w:pPr>
-            <w:r>
-              <w:rPr>
-                <w:spacing w:val="-2"/>
-                <w:lang w:val="en-US"/>
-              </w:rPr>
-              <w:t>{{no_urut</w:t>
-            </w:r>
-            <w:r>
-              <w:rPr>
-                <w:spacing w:val="-2"/>
-                <w:lang w:val="en-US"/>
-              </w:rPr>
-              <w:t>_tujuh</w:t>
-            </w:r>
-            <w:r>
-              <w:rPr>
-                <w:spacing w:val="-2"/>
-                <w:lang w:val="en-US"/>
-              </w:rPr>
-              <w:t>}}</w:t>
-            </w:r>
-          </w:p>
-        </w:tc>
-        <w:tc>
-          <w:tcPr>
-            <w:tcW w:w="6667" w:type="dxa"/>
+            <w:tcW w:w="405" w:type="pct"/>
           </w:tcPr>
           <w:p>
             <w:pPr>
               <w:pStyle w:val="TableParagraph"/>
               <w:spacing w:line="247" w:lineRule="exact"/>
-              <w:ind w:left="145"/>
+              <w:ind w:right="121"/>
+              <w:rPr>
+                <w:spacing w:val="-2"/>
+                <w:lang w:val="en-US"/>
+              </w:rPr>
+            </w:pPr>
+            <w:r>
+              <w:rPr>
+                <w:spacing w:val="-2"/>
+                <w:lang w:val="en-US"/>
+              </w:rPr>
+              <w:t>{{</w:t>
+            </w:r>
+            <w:proofErr w:type="spellStart"/>
+            <w:r>
+              <w:rPr>
+                <w:spacing w:val="-2"/>
+                <w:lang w:val="en-US"/>
+              </w:rPr>
+              <w:t>no_urut_</w:t>
+            </w:r>
+            <w:r>
+              <w:rPr>
+                <w:spacing w:val="-2"/>
+                <w:lang w:val="en-US"/>
+              </w:rPr>
+              <w:t>sembilan</w:t>
+            </w:r>
+            <w:proofErr w:type="spellEnd"/>
+            <w:r>
+              <w:rPr>
+                <w:spacing w:val="-2"/>
+                <w:lang w:val="en-US"/>
+              </w:rPr>
+              <w:t>}}</w:t>
+            </w:r>
+          </w:p>
+        </w:tc>
+        <w:tc>
+          <w:tcPr>
+            <w:tcW w:w="3230" w:type="pct"/>
+          </w:tcPr>
+          <w:p>
+            <w:pPr>
+              <w:pStyle w:val="TableParagraph"/>
+              <w:spacing w:line="247" w:lineRule="exact"/>
+              <w:rPr>
+                <w:lang w:val="en-US"/>
+              </w:rPr>
+            </w:pPr>
+            <w:r>
+              <w:rPr>
+                <w:lang w:val="en-US"/>
+              </w:rPr>
+              <w:t>{{</w:t>
+            </w:r>
+            <w:proofErr w:type="spellStart"/>
+            <w:r>
+              <w:rPr>
+                <w:lang w:val="en-US"/>
+              </w:rPr>
+              <w:t>nama_petugas_</w:t>
+            </w:r>
+            <w:r>
+              <w:rPr>
+                <w:lang w:val="en-US"/>
+              </w:rPr>
+              <w:t>sembilan</w:t>
+            </w:r>
+            <w:proofErr w:type="spellEnd"/>
+            <w:r>
+              <w:rPr>
+                <w:lang w:val="en-US"/>
+              </w:rPr>
+              <w:t>}}</w:t>
+            </w:r>
+          </w:p>
+          <w:p>
+            <w:pPr>
+              <w:pStyle w:val="TableParagraph"/>
+              <w:spacing w:line="247" w:lineRule="exact"/>
+              <w:rPr>
+                <w:lang w:val="en-US"/>
+              </w:rPr>
             </w:pPr>
           </w:p>
           <w:p>
             <w:pPr>
               <w:pStyle w:val="TableParagraph"/>
               <w:spacing w:line="247" w:lineRule="exact"/>
-              <w:ind w:left="145"/>
+              <w:rPr>
+                <w:lang w:val="en-US"/>
+              </w:rPr>
+            </w:pPr>
+            <w:r>
+              <w:rPr>
+                <w:lang w:val="en-US"/>
+              </w:rPr>
+              <w:t>NIP. {{</w:t>
+            </w:r>
+            <w:proofErr w:type="spellStart"/>
+            <w:r>
+              <w:rPr>
+                <w:lang w:val="en-US"/>
+              </w:rPr>
+              <w:t>nip_petugas_satu</w:t>
+            </w:r>
+            <w:proofErr w:type="spellEnd"/>
+            <w:r>
+              <w:rPr>
+                <w:lang w:val="en-US"/>
+              </w:rPr>
+              <w:t>}}</w:t>
+            </w:r>
+          </w:p>
+        </w:tc>
+        <w:tc>
+          <w:tcPr>
+            <w:tcW w:w="1365" w:type="pct"/>
+          </w:tcPr>
+          <w:p>
+            <w:pPr>
+              <w:pStyle w:val="TableParagraph"/>
+              <w:spacing w:line="247" w:lineRule="exact"/>
+              <w:ind w:right="54"/>
+              <w:rPr>
+                <w:spacing w:val="-2"/>
+                <w:lang w:val="en-US"/>
+              </w:rPr>
+            </w:pPr>
+            <w:r>
+              <w:rPr>
+                <w:spacing w:val="-2"/>
+                <w:lang w:val="en-US"/>
+              </w:rPr>
+              <w:t>{{</w:t>
+            </w:r>
+            <w:proofErr w:type="spellStart"/>
+            <w:r>
+              <w:rPr>
+                <w:spacing w:val="-2"/>
+                <w:lang w:val="en-US"/>
+              </w:rPr>
+              <w:t>no_urut_</w:t>
+            </w:r>
+            <w:r>
+              <w:rPr>
+                <w:spacing w:val="-2"/>
+                <w:lang w:val="en-US"/>
+              </w:rPr>
+              <w:t>sembilan</w:t>
+            </w:r>
+            <w:proofErr w:type="spellEnd"/>
+            <w:proofErr w:type="gramStart"/>
+            <w:r>
+              <w:rPr>
+                <w:spacing w:val="-2"/>
+                <w:lang w:val="en-US"/>
+              </w:rPr>
+              <w:t>}}</w:t>
+            </w:r>
+            <w:r>
+              <w:rPr>
+                <w:spacing w:val="-2"/>
+              </w:rPr>
+              <w:t>…</w:t>
+            </w:r>
+            <w:proofErr w:type="gramEnd"/>
+            <w:r>
+              <w:rPr>
+                <w:spacing w:val="-2"/>
+              </w:rPr>
+              <w:t>…………………..</w:t>
+            </w:r>
+          </w:p>
+        </w:tc>
+      </w:tr>
+      <w:tr>
+        <w:trPr>
+          <w:trHeight w:val="1177"/>
+          <w:jc w:val="center"/>
+        </w:trPr>
+        <w:tc>
+          <w:tcPr>
+            <w:tcW w:w="405" w:type="pct"/>
+          </w:tcPr>
+          <w:p>
+            <w:pPr>
+              <w:pStyle w:val="TableParagraph"/>
+              <w:spacing w:line="247" w:lineRule="exact"/>
+              <w:ind w:right="121"/>
+              <w:rPr>
+                <w:spacing w:val="-2"/>
+                <w:lang w:val="en-US"/>
+              </w:rPr>
+            </w:pPr>
+            <w:r>
+              <w:rPr>
+                <w:spacing w:val="-2"/>
+                <w:lang w:val="en-US"/>
+              </w:rPr>
+              <w:t>{{</w:t>
+            </w:r>
+            <w:proofErr w:type="spellStart"/>
+            <w:r>
+              <w:rPr>
+                <w:spacing w:val="-2"/>
+                <w:lang w:val="en-US"/>
+              </w:rPr>
+              <w:t>no_urut_</w:t>
+            </w:r>
+            <w:r>
+              <w:rPr>
+                <w:spacing w:val="-2"/>
+                <w:lang w:val="en-US"/>
+              </w:rPr>
+              <w:t>sepuluh</w:t>
+            </w:r>
+            <w:proofErr w:type="spellEnd"/>
+            <w:r>
+              <w:rPr>
+                <w:spacing w:val="-2"/>
+                <w:lang w:val="en-US"/>
+              </w:rPr>
+              <w:t>}}</w:t>
+            </w:r>
+          </w:p>
+        </w:tc>
+        <w:tc>
+          <w:tcPr>
+            <w:tcW w:w="3230" w:type="pct"/>
+          </w:tcPr>
+          <w:p>
+            <w:pPr>
+              <w:pStyle w:val="TableParagraph"/>
+              <w:spacing w:line="247" w:lineRule="exact"/>
+              <w:rPr>
+                <w:lang w:val="en-US"/>
+              </w:rPr>
+            </w:pPr>
+            <w:r>
+              <w:rPr>
+                <w:lang w:val="en-US"/>
+              </w:rPr>
+              <w:t>{{</w:t>
+            </w:r>
+            <w:proofErr w:type="spellStart"/>
+            <w:r>
+              <w:rPr>
+                <w:lang w:val="en-US"/>
+              </w:rPr>
+              <w:t>nama_petugas_s</w:t>
+            </w:r>
+            <w:r>
+              <w:rPr>
+                <w:lang w:val="en-US"/>
+              </w:rPr>
+              <w:t>epuluh</w:t>
+            </w:r>
+            <w:proofErr w:type="spellEnd"/>
+            <w:r>
+              <w:rPr>
+                <w:lang w:val="en-US"/>
+              </w:rPr>
+              <w:t>}}</w:t>
+            </w:r>
+          </w:p>
+          <w:p>
+            <w:pPr>
+              <w:pStyle w:val="TableParagraph"/>
+              <w:spacing w:line="247" w:lineRule="exact"/>
+              <w:rPr>
+                <w:lang w:val="en-US"/>
+              </w:rPr>
             </w:pPr>
           </w:p>
           <w:p>
             <w:pPr>
               <w:pStyle w:val="TableParagraph"/>
               <w:spacing w:line="247" w:lineRule="exact"/>
-              <w:ind w:left="145"/>
+              <w:rPr>
+                <w:lang w:val="en-US"/>
+              </w:rPr>
             </w:pPr>
             <w:r>
-              <w:t>{{nama_petugas_tujuh}}</w:t>
-            </w:r>
-          </w:p>
-          <w:p>
-            <w:pPr>
-              <w:pStyle w:val="TableParagraph"/>
-              <w:spacing w:before="111"/>
-              <w:rPr>
-                <w:rFonts w:ascii="Arial"/>
-                <w:b/>
-              </w:rPr>
-            </w:pPr>
-            <w:r>
-              <w:t xml:space="preserve">NIP. </w:t>
-            </w:r>
-            <w:r>
-              <w:t>{{nip_petugas_tujuh}}</w:t>
+              <w:rPr>
+                <w:lang w:val="en-US"/>
+              </w:rPr>
+              <w:t>NIP. {{</w:t>
+            </w:r>
+            <w:proofErr w:type="spellStart"/>
+            <w:r>
+              <w:rPr>
+                <w:lang w:val="en-US"/>
+              </w:rPr>
+              <w:t>nip_petugas_satu</w:t>
+            </w:r>
+            <w:proofErr w:type="spellEnd"/>
+            <w:r>
+              <w:rPr>
+                <w:lang w:val="en-US"/>
+              </w:rPr>
+              <w:t>}}</w:t>
             </w:r>
           </w:p>
         </w:tc>
         <w:tc>
           <w:tcPr>
-            <w:tcW w:w="3260" w:type="dxa"/>
-          </w:tcPr>
-          <w:p>
-            <w:pPr>
-              <w:pStyle w:val="TableParagraph"/>
-              <w:spacing w:before="111"/>
-              <w:rPr>
-                <w:spacing w:val="-2"/>
-              </w:rPr>
-            </w:pPr>
-          </w:p>
-          <w:p>
-            <w:pPr>
-              <w:pStyle w:val="TableParagraph"/>
-              <w:spacing w:before="111"/>
-              <w:rPr>
-                <w:rFonts w:ascii="Arial"/>
-                <w:b/>
-              </w:rPr>
-            </w:pPr>
-            <w:r>
-              <w:rPr>
-                <w:spacing w:val="-2"/>
-                <w:lang w:val="en-US"/>
-              </w:rPr>
-              <w:t>{{no_urut</w:t>
-            </w:r>
-            <w:r>
-              <w:rPr>
-                <w:spacing w:val="-2"/>
-                <w:lang w:val="en-US"/>
-              </w:rPr>
-              <w:t>_tujuh</w:t>
-            </w:r>
-            <w:r>
-              <w:rPr>
-                <w:spacing w:val="-2"/>
-                <w:lang w:val="en-US"/>
-              </w:rPr>
-              <w:t>}}</w:t>
-            </w:r>
-            <w:r>
-              <w:rPr>
-                <w:spacing w:val="-2"/>
-              </w:rPr>
-              <w:t>……………………..</w:t>
-            </w:r>
-          </w:p>
-        </w:tc>
-      </w:tr>
-      <w:tr>
-        <w:trPr>
-          <w:trHeight w:val="997"/>
-        </w:trPr>
-        <w:tc>
-          <w:tcPr>
-            <w:tcW w:w="567" w:type="dxa"/>
-          </w:tcPr>
-          <w:p>
-            <w:pPr>
-              <w:pStyle w:val="TableParagraph"/>
-              <w:spacing w:before="107"/>
-              <w:rPr>
-                <w:spacing w:val="-2"/>
-                <w:lang w:val="en-US"/>
-              </w:rPr>
-            </w:pPr>
-          </w:p>
-          <w:p>
-            <w:pPr>
-              <w:pStyle w:val="TableParagraph"/>
-              <w:spacing w:before="107"/>
-              <w:rPr>
-                <w:rFonts w:ascii="Arial"/>
-                <w:b/>
-              </w:rPr>
-            </w:pPr>
-            <w:r>
-              <w:rPr>
-                <w:spacing w:val="-2"/>
-                <w:lang w:val="en-US"/>
-              </w:rPr>
-              <w:t>{{no_urut</w:t>
-            </w:r>
-            <w:r>
-              <w:rPr>
-                <w:spacing w:val="-2"/>
-                <w:lang w:val="en-US"/>
-              </w:rPr>
-              <w:t>_delapan</w:t>
-            </w:r>
-            <w:r>
-              <w:rPr>
-                <w:spacing w:val="-2"/>
-                <w:lang w:val="en-US"/>
-              </w:rPr>
-              <w:t>}}</w:t>
-            </w:r>
-          </w:p>
-        </w:tc>
-        <w:tc>
-          <w:tcPr>
-            <w:tcW w:w="6667" w:type="dxa"/>
+            <w:tcW w:w="1365" w:type="pct"/>
           </w:tcPr>
           <w:p>
             <w:pPr>
               <w:pStyle w:val="TableParagraph"/>
               <w:spacing w:line="247" w:lineRule="exact"/>
-              <w:ind w:left="145"/>
+              <w:ind w:right="54"/>
+              <w:rPr>
+                <w:spacing w:val="-2"/>
+                <w:lang w:val="en-US"/>
+              </w:rPr>
             </w:pPr>
-          </w:p>
-          <w:p>
-            <w:pPr>
-              <w:pStyle w:val="TableParagraph"/>
-              <w:spacing w:line="247" w:lineRule="exact"/>
-              <w:ind w:left="145"/>
-            </w:pPr>
-          </w:p>
-          <w:p>
-            <w:pPr>
-              <w:pStyle w:val="TableParagraph"/>
-              <w:spacing w:line="247" w:lineRule="exact"/>
-              <w:ind w:left="145"/>
-            </w:pPr>
-            <w:r>
-              <w:t>{{nama_petugas_delapan}}</w:t>
-            </w:r>
-          </w:p>
-          <w:p>
-            <w:pPr>
-              <w:pStyle w:val="TableParagraph"/>
-              <w:spacing w:before="111"/>
-              <w:rPr>
-                <w:rFonts w:ascii="Arial"/>
-                <w:b/>
-              </w:rPr>
-            </w:pPr>
-            <w:r>
-              <w:t xml:space="preserve">NIP. </w:t>
-            </w:r>
-            <w:r>
-              <w:t>{{nip_petugas_delapan}}</w:t>
-            </w:r>
-          </w:p>
-        </w:tc>
-        <w:tc>
-          <w:tcPr>
-            <w:tcW w:w="3260" w:type="dxa"/>
-          </w:tcPr>
-          <w:p>
-            <w:pPr>
-              <w:pStyle w:val="TableParagraph"/>
-              <w:spacing w:before="111"/>
-              <w:rPr>
-                <w:spacing w:val="-2"/>
-              </w:rPr>
-            </w:pPr>
-          </w:p>
-          <w:p>
-            <w:pPr>
-              <w:pStyle w:val="TableParagraph"/>
-              <w:spacing w:before="111"/>
-              <w:rPr>
-                <w:rFonts w:ascii="Arial"/>
-                <w:b/>
-              </w:rPr>
-            </w:pPr>
-            <w:r>
-              <w:rPr>
-                <w:spacing w:val="-2"/>
-                <w:lang w:val="en-US"/>
-              </w:rPr>
-              <w:t>{{no_urut</w:t>
-            </w:r>
-            <w:r>
-              <w:rPr>
-                <w:spacing w:val="-2"/>
-                <w:lang w:val="en-US"/>
-              </w:rPr>
-              <w:t>_delapan</w:t>
-            </w:r>
+            <w:r>
+              <w:rPr>
+                <w:spacing w:val="-2"/>
+                <w:lang w:val="en-US"/>
+              </w:rPr>
+              <w:t>{{</w:t>
+            </w:r>
+            <w:proofErr w:type="spellStart"/>
+            <w:r>
+              <w:rPr>
+                <w:spacing w:val="-2"/>
+                <w:lang w:val="en-US"/>
+              </w:rPr>
+              <w:t>no_urut_s</w:t>
+            </w:r>
+            <w:r>
+              <w:rPr>
+                <w:spacing w:val="-2"/>
+                <w:lang w:val="en-US"/>
+              </w:rPr>
+              <w:t>epuluh</w:t>
+            </w:r>
+            <w:proofErr w:type="spellEnd"/>
+            <w:proofErr w:type="gramStart"/>
             <w:r>
               <w:rPr>
                 <w:spacing w:val="-2"/>
@@ -2569,301 +3375,14 @@
               <w:rPr>
                 <w:spacing w:val="-2"/>
               </w:rPr>
-              <w:t>……………………..</w:t>
-            </w:r>
-          </w:p>
-        </w:tc>
-      </w:tr>
-      <w:tr>
-        <w:trPr>
-          <w:trHeight w:val="997"/>
-        </w:trPr>
-        <w:tc>
-          <w:tcPr>
-            <w:tcW w:w="567" w:type="dxa"/>
-          </w:tcPr>
-          <w:p>
-            <w:pPr>
-              <w:pStyle w:val="TableParagraph"/>
-              <w:spacing w:before="107"/>
-              <w:rPr>
-                <w:spacing w:val="-2"/>
-                <w:lang w:val="en-US"/>
-              </w:rPr>
-            </w:pPr>
-          </w:p>
-          <w:p>
-            <w:pPr>
-              <w:pStyle w:val="TableParagraph"/>
-              <w:spacing w:before="107"/>
-              <w:rPr>
-                <w:rFonts w:ascii="Arial"/>
-                <w:b/>
-              </w:rPr>
-            </w:pPr>
-            <w:r>
-              <w:rPr>
-                <w:spacing w:val="-2"/>
-                <w:lang w:val="en-US"/>
-              </w:rPr>
-              <w:t>{{no_urut</w:t>
-            </w:r>
-            <w:r>
-              <w:rPr>
-                <w:spacing w:val="-2"/>
-                <w:lang w:val="en-US"/>
-              </w:rPr>
-              <w:t>_sembilan</w:t>
-            </w:r>
-            <w:r>
-              <w:rPr>
-                <w:spacing w:val="-2"/>
-                <w:lang w:val="en-US"/>
-              </w:rPr>
-              <w:t>}}</w:t>
-            </w:r>
-          </w:p>
-        </w:tc>
-        <w:tc>
-          <w:tcPr>
-            <w:tcW w:w="6667" w:type="dxa"/>
-          </w:tcPr>
-          <w:p>
-            <w:pPr>
-              <w:pStyle w:val="TableParagraph"/>
-              <w:spacing w:line="247" w:lineRule="exact"/>
-              <w:ind w:left="145"/>
-            </w:pPr>
-          </w:p>
-          <w:p>
-            <w:pPr>
-              <w:pStyle w:val="TableParagraph"/>
-              <w:spacing w:line="247" w:lineRule="exact"/>
-              <w:ind w:left="145"/>
-            </w:pPr>
-          </w:p>
-          <w:p>
-            <w:pPr>
-              <w:pStyle w:val="TableParagraph"/>
-              <w:spacing w:line="247" w:lineRule="exact"/>
-              <w:ind w:left="145"/>
-            </w:pPr>
-            <w:r>
-              <w:t>{{nama_petugas_sembilan}}</w:t>
-            </w:r>
-          </w:p>
-          <w:p>
-            <w:pPr>
-              <w:pStyle w:val="TableParagraph"/>
-              <w:spacing w:before="111"/>
-              <w:rPr>
-                <w:rFonts w:ascii="Arial"/>
-                <w:b/>
-              </w:rPr>
-            </w:pPr>
-            <w:r>
-              <w:t xml:space="preserve">NIP. </w:t>
-            </w:r>
-            <w:r>
-              <w:t>{{nip_petugas_sembilan}}</w:t>
-            </w:r>
-          </w:p>
-        </w:tc>
-        <w:tc>
-          <w:tcPr>
-            <w:tcW w:w="3260" w:type="dxa"/>
-          </w:tcPr>
-          <w:p>
-            <w:pPr>
-              <w:pStyle w:val="TableParagraph"/>
-              <w:spacing w:before="111"/>
-              <w:rPr>
-                <w:spacing w:val="-2"/>
-              </w:rPr>
-            </w:pPr>
-          </w:p>
-          <w:p>
-            <w:pPr>
-              <w:pStyle w:val="TableParagraph"/>
-              <w:spacing w:before="111"/>
-              <w:rPr>
-                <w:rFonts w:ascii="Arial"/>
-                <w:b/>
-              </w:rPr>
-            </w:pPr>
-            <w:r>
-              <w:rPr>
-                <w:spacing w:val="-2"/>
-                <w:lang w:val="en-US"/>
-              </w:rPr>
-              <w:t>{{no_urut</w:t>
-            </w:r>
-            <w:r>
-              <w:rPr>
-                <w:spacing w:val="-2"/>
-                <w:lang w:val="en-US"/>
-              </w:rPr>
-              <w:t>_sembilan</w:t>
-            </w:r>
-            <w:r>
-              <w:rPr>
-                <w:spacing w:val="-2"/>
-                <w:lang w:val="en-US"/>
-              </w:rPr>
-              <w:t>}}</w:t>
-            </w:r>
-            <w:r>
-              <w:rPr>
-                <w:spacing w:val="-2"/>
-              </w:rPr>
-              <w:t>……………………..</w:t>
-            </w:r>
-          </w:p>
-        </w:tc>
-      </w:tr>
-      <w:tr>
-        <w:trPr>
-          <w:trHeight w:val="997"/>
-        </w:trPr>
-        <w:tc>
-          <w:tcPr>
-            <w:tcW w:w="567" w:type="dxa"/>
-          </w:tcPr>
-          <w:p>
-            <w:pPr>
-              <w:pStyle w:val="TableParagraph"/>
-              <w:spacing w:before="107"/>
-              <w:rPr>
-                <w:spacing w:val="-2"/>
-                <w:lang w:val="en-US"/>
-              </w:rPr>
-            </w:pPr>
-          </w:p>
-          <w:p>
-            <w:pPr>
-              <w:pStyle w:val="TableParagraph"/>
-              <w:spacing w:before="107"/>
-              <w:rPr>
-                <w:rFonts w:ascii="Arial"/>
-                <w:b/>
-              </w:rPr>
-            </w:pPr>
-            <w:r>
-              <w:rPr>
-                <w:spacing w:val="-2"/>
-                <w:lang w:val="en-US"/>
-              </w:rPr>
-              <w:t>{{no_urut</w:t>
-            </w:r>
-            <w:r>
-              <w:rPr>
-                <w:spacing w:val="-2"/>
-                <w:lang w:val="en-US"/>
-              </w:rPr>
-              <w:t>_sepuluh</w:t>
-            </w:r>
-            <w:r>
-              <w:rPr>
-                <w:spacing w:val="-2"/>
-                <w:lang w:val="en-US"/>
-              </w:rPr>
-              <w:t>}}</w:t>
-            </w:r>
-          </w:p>
-        </w:tc>
-        <w:tc>
-          <w:tcPr>
-            <w:tcW w:w="6667" w:type="dxa"/>
-          </w:tcPr>
-          <w:p>
-            <w:pPr>
-              <w:pStyle w:val="TableParagraph"/>
-              <w:spacing w:line="247" w:lineRule="exact"/>
-              <w:ind w:left="145"/>
-            </w:pPr>
-          </w:p>
-          <w:p>
-            <w:pPr>
-              <w:pStyle w:val="TableParagraph"/>
-              <w:spacing w:line="247" w:lineRule="exact"/>
-              <w:ind w:left="145"/>
-            </w:pPr>
-          </w:p>
-          <w:p>
-            <w:pPr>
-              <w:pStyle w:val="TableParagraph"/>
-              <w:spacing w:line="247" w:lineRule="exact"/>
-              <w:ind w:left="145"/>
-            </w:pPr>
-            <w:r>
-              <w:t>{{nama_petugas_sepuluh}}</w:t>
-            </w:r>
-          </w:p>
-          <w:p>
-            <w:pPr>
-              <w:pStyle w:val="TableParagraph"/>
-              <w:spacing w:before="111"/>
-              <w:rPr>
-                <w:rFonts w:ascii="Arial"/>
-                <w:b/>
-              </w:rPr>
-            </w:pPr>
-            <w:r>
-              <w:t xml:space="preserve">NIP. </w:t>
-            </w:r>
-            <w:r>
-              <w:t>{{nip_petugas_sepuluh}}</w:t>
-            </w:r>
-          </w:p>
-        </w:tc>
-        <w:tc>
-          <w:tcPr>
-            <w:tcW w:w="3260" w:type="dxa"/>
-          </w:tcPr>
-          <w:p>
-            <w:pPr>
-              <w:pStyle w:val="TableParagraph"/>
-              <w:spacing w:before="111"/>
-              <w:rPr>
-                <w:spacing w:val="-2"/>
-              </w:rPr>
-            </w:pPr>
-          </w:p>
-          <w:p>
-            <w:pPr>
-              <w:pStyle w:val="TableParagraph"/>
-              <w:spacing w:before="111"/>
-              <w:rPr>
-                <w:rFonts w:ascii="Arial"/>
-                <w:b/>
-              </w:rPr>
-            </w:pPr>
-            <w:r>
-              <w:rPr>
-                <w:spacing w:val="-2"/>
-                <w:lang w:val="en-US"/>
-              </w:rPr>
-              <w:t>{{no_urut</w:t>
-            </w:r>
-            <w:r>
-              <w:rPr>
-                <w:spacing w:val="-2"/>
-                <w:lang w:val="en-US"/>
-              </w:rPr>
-              <w:t>_sepuluh</w:t>
-            </w:r>
-            <w:r>
-              <w:rPr>
-                <w:spacing w:val="-2"/>
-                <w:lang w:val="en-US"/>
-              </w:rPr>
-              <w:t>}}</w:t>
-            </w:r>
-            <w:r>
-              <w:rPr>
-                <w:spacing w:val="-2"/>
-              </w:rPr>
-              <w:t>……………………..</w:t>
+              <w:t>…</w:t>
+            </w:r>
+            <w:proofErr w:type="gramEnd"/>
+            <w:r>
+              <w:rPr>
+                <w:spacing w:val="-2"/>
+              </w:rPr>
+              <w:t>…………………..</w:t>
             </w:r>
           </w:p>
         </w:tc>
@@ -2904,11 +3423,33 @@
         <w:t>DOKUMENTASI</w:t>
       </w:r>
     </w:p>
+    <w:p>
+      <w:pPr>
+        <w:pStyle w:val="BodyText"/>
+        <w:spacing w:before="132" w:after="1"/>
+        <w:jc w:val="center"/>
+        <w:rPr>
+          <w:rFonts w:ascii="Arial"/>
+          <w:b/>
+          <w:sz w:val="20"/>
+        </w:rPr>
+      </w:pPr>
+    </w:p>
+    <w:p>
+      <w:pPr>
+        <w:pStyle w:val="BodyText"/>
+        <w:rPr>
+          <w:rFonts w:ascii="Arial"/>
+          <w:b/>
+          <w:sz w:val="20"/>
+        </w:rPr>
+      </w:pPr>
+    </w:p>
     <w:tbl>
       <w:tblPr>
         <w:tblStyle w:val="TableGrid"/>
+        <w:tblpPr w:leftFromText="180" w:rightFromText="180" w:vertAnchor="page" w:horzAnchor="margin" w:tblpXSpec="center" w:tblpY="2283"/>
         <w:tblW w:w="0" w:type="auto"/>
-        <w:jc w:val="center"/>
         <w:tblBorders>
           <w:top w:val="none" w:sz="0" w:space="0" w:color="auto"/>
           <w:left w:val="none" w:sz="0" w:space="0" w:color="auto"/>
@@ -2925,7 +3466,6 @@
       <w:tr>
         <w:trPr>
           <w:trHeight w:val="3118"/>
-          <w:jc w:val="center"/>
         </w:trPr>
         <w:tc>
           <w:tcPr>
@@ -2945,7 +3485,21 @@
               <w:rPr>
                 <w:lang w:val="en-US"/>
               </w:rPr>
-              <w:t>{{foto_dokumentasi_satu}}</w:t>
+              <w:t>{{</w:t>
+            </w:r>
+            <w:proofErr w:type="spellStart"/>
+            <w:r>
+              <w:rPr>
+                <w:lang w:val="en-US"/>
+              </w:rPr>
+              <w:t>foto_dokumentasi_satu</w:t>
+            </w:r>
+            <w:proofErr w:type="spellEnd"/>
+            <w:r>
+              <w:rPr>
+                <w:lang w:val="en-US"/>
+              </w:rPr>
+              <w:t>}}</w:t>
             </w:r>
           </w:p>
         </w:tc>
@@ -2953,7 +3507,6 @@
       <w:tr>
         <w:trPr>
           <w:trHeight w:val="3241"/>
-          <w:jc w:val="center"/>
         </w:trPr>
         <w:tc>
           <w:tcPr>
@@ -2973,7 +3526,21 @@
               <w:rPr>
                 <w:lang w:val="en-US"/>
               </w:rPr>
-              <w:t>{{foto_dokumentasi_dua}}</w:t>
+              <w:t>{{</w:t>
+            </w:r>
+            <w:proofErr w:type="spellStart"/>
+            <w:r>
+              <w:rPr>
+                <w:lang w:val="en-US"/>
+              </w:rPr>
+              <w:t>foto_dokumentasi_dua</w:t>
+            </w:r>
+            <w:proofErr w:type="spellEnd"/>
+            <w:r>
+              <w:rPr>
+                <w:lang w:val="en-US"/>
+              </w:rPr>
+              <w:t>}}</w:t>
             </w:r>
           </w:p>
         </w:tc>
@@ -2981,7 +3548,6 @@
       <w:tr>
         <w:trPr>
           <w:trHeight w:val="2968"/>
-          <w:jc w:val="center"/>
         </w:trPr>
         <w:tc>
           <w:tcPr>
@@ -3001,15 +3567,28 @@
               <w:rPr>
                 <w:lang w:val="en-US"/>
               </w:rPr>
-              <w:t>{{foto_dokumentasi_tiga}}</w:t>
+              <w:t>{{</w:t>
+            </w:r>
+            <w:proofErr w:type="spellStart"/>
+            <w:r>
+              <w:rPr>
+                <w:lang w:val="en-US"/>
+              </w:rPr>
+              <w:t>foto_dokumentasi_tiga</w:t>
+            </w:r>
+            <w:proofErr w:type="spellEnd"/>
+            <w:r>
+              <w:rPr>
+                <w:lang w:val="en-US"/>
+              </w:rPr>
+              <w:t>}}</w:t>
             </w:r>
           </w:p>
         </w:tc>
       </w:tr>
       <w:tr>
         <w:trPr>
-          <w:trHeight w:val="2826"/>
-          <w:jc w:val="center"/>
+          <w:trHeight w:val="3701"/>
         </w:trPr>
         <w:tc>
           <w:tcPr>
@@ -3041,34 +3620,26 @@
               <w:rPr>
                 <w:lang w:val="en-US"/>
               </w:rPr>
-              <w:t>{{foto_dokumentasi_empat}}</w:t>
+              <w:t>{{</w:t>
+            </w:r>
+            <w:proofErr w:type="spellStart"/>
+            <w:r>
+              <w:rPr>
+                <w:lang w:val="en-US"/>
+              </w:rPr>
+              <w:t>foto_dokumentasi_empat</w:t>
+            </w:r>
+            <w:proofErr w:type="spellEnd"/>
+            <w:r>
+              <w:rPr>
+                <w:lang w:val="en-US"/>
+              </w:rPr>
+              <w:t>}}</w:t>
             </w:r>
           </w:p>
         </w:tc>
       </w:tr>
     </w:tbl>
-    <w:p>
-      <w:pPr>
-        <w:pStyle w:val="BodyText"/>
-        <w:spacing w:before="132" w:after="1"/>
-        <w:jc w:val="center"/>
-        <w:rPr>
-          <w:rFonts w:ascii="Arial"/>
-          <w:b/>
-          <w:sz w:val="20"/>
-        </w:rPr>
-      </w:pPr>
-    </w:p>
-    <w:p>
-      <w:pPr>
-        <w:pStyle w:val="BodyText"/>
-        <w:rPr>
-          <w:rFonts w:ascii="Arial"/>
-          <w:b/>
-          <w:sz w:val="20"/>
-        </w:rPr>
-      </w:pPr>
-    </w:p>
     <w:p/>
     <w:p/>
     <w:p/>
@@ -3117,6 +3688,33 @@
       <w:r>
         <w:br/>
       </w:r>
+    </w:p>
+    <w:p>
+      <w:pPr>
+        <w:rPr>
+          <w:sz w:val="44"/>
+          <w:szCs w:val="44"/>
+        </w:rPr>
+      </w:pPr>
+      <w:r>
+        <w:rPr>
+          <w:sz w:val="44"/>
+          <w:szCs w:val="44"/>
+        </w:rPr>
+        <w:br w:type="page"/>
+      </w:r>
+    </w:p>
+    <w:p>
+      <w:pPr>
+        <w:tabs>
+          <w:tab w:val="left" w:pos="4354"/>
+        </w:tabs>
+        <w:jc w:val="center"/>
+        <w:rPr>
+          <w:sz w:val="44"/>
+          <w:szCs w:val="44"/>
+        </w:rPr>
+      </w:pPr>
       <w:r>
         <w:rPr>
           <w:sz w:val="44"/>

</xml_diff>

<commit_message>
fix(dashboard): isolate dashboard summary statistics and redis cache keys by role and user ID
</commit_message>
<xml_diff>
--- a/backend/templates/Berkas Luar Kota - Laporan.docx
+++ b/backend/templates/Berkas Luar Kota - Laporan.docx
@@ -1178,18 +1178,30 @@
     <w:p>
       <w:pPr>
         <w:pStyle w:val="BodyText"/>
+        <w:tabs>
+          <w:tab w:val="left" w:pos="2717"/>
+        </w:tabs>
         <w:spacing w:before="180"/>
+        <w:jc w:val="both"/>
         <w:rPr>
           <w:rFonts w:ascii="Arial"/>
           <w:b/>
         </w:rPr>
       </w:pPr>
+      <w:r>
+        <w:rPr>
+          <w:rFonts w:ascii="Arial"/>
+          <w:b/>
+        </w:rPr>
+        <w:tab/>
+      </w:r>
     </w:p>
     <w:p>
       <w:pPr>
         <w:pStyle w:val="BodyText"/>
         <w:spacing w:before="1"/>
         <w:ind w:left="1225"/>
+        <w:jc w:val="both"/>
         <w:rPr>
           <w:lang w:val="en-US"/>
         </w:rPr>
@@ -1706,14 +1718,7 @@
                 <w:spacing w:val="-2"/>
                 <w:lang w:val="en-US"/>
               </w:rPr>
-              <w:t>no_urut_</w:t>
-            </w:r>
-            <w:r>
-              <w:rPr>
-                <w:spacing w:val="-2"/>
-                <w:lang w:val="en-US"/>
-              </w:rPr>
-              <w:t>dua</w:t>
+              <w:t>no_urut_dua</w:t>
             </w:r>
             <w:proofErr w:type="spellEnd"/>
             <w:r>
@@ -1896,14 +1901,7 @@
                 <w:spacing w:val="-2"/>
                 <w:lang w:val="en-US"/>
               </w:rPr>
-              <w:t>no_urut_</w:t>
-            </w:r>
-            <w:r>
-              <w:rPr>
-                <w:spacing w:val="-2"/>
-                <w:lang w:val="en-US"/>
-              </w:rPr>
-              <w:t>tiga</w:t>
+              <w:t>no_urut_tiga</w:t>
             </w:r>
             <w:proofErr w:type="spellEnd"/>
             <w:r>
@@ -2086,14 +2084,7 @@
                 <w:spacing w:val="-2"/>
                 <w:lang w:val="en-US"/>
               </w:rPr>
-              <w:t>no_urut_</w:t>
-            </w:r>
-            <w:r>
-              <w:rPr>
-                <w:spacing w:val="-2"/>
-                <w:lang w:val="en-US"/>
-              </w:rPr>
-              <w:t>empat</w:t>
+              <w:t>no_urut_empat</w:t>
             </w:r>
             <w:proofErr w:type="spellEnd"/>
             <w:r>
@@ -2276,14 +2267,7 @@
                 <w:spacing w:val="-2"/>
                 <w:lang w:val="en-US"/>
               </w:rPr>
-              <w:t>no_urut_</w:t>
-            </w:r>
-            <w:r>
-              <w:rPr>
-                <w:spacing w:val="-2"/>
-                <w:lang w:val="en-US"/>
-              </w:rPr>
-              <w:t>lima</w:t>
+              <w:t>no_urut_lima</w:t>
             </w:r>
             <w:proofErr w:type="spellEnd"/>
             <w:r>
@@ -2466,14 +2450,7 @@
                 <w:spacing w:val="-2"/>
                 <w:lang w:val="en-US"/>
               </w:rPr>
-              <w:t>no_urut_</w:t>
-            </w:r>
-            <w:r>
-              <w:rPr>
-                <w:spacing w:val="-2"/>
-                <w:lang w:val="en-US"/>
-              </w:rPr>
-              <w:t>enam</w:t>
+              <w:t>no_urut_enam</w:t>
             </w:r>
             <w:proofErr w:type="spellEnd"/>
             <w:r>
@@ -2659,14 +2636,7 @@
                 <w:spacing w:val="-2"/>
                 <w:lang w:val="en-US"/>
               </w:rPr>
-              <w:t>no_urut_</w:t>
-            </w:r>
-            <w:r>
-              <w:rPr>
-                <w:spacing w:val="-2"/>
-                <w:lang w:val="en-US"/>
-              </w:rPr>
-              <w:t>tujuh</w:t>
+              <w:t>no_urut_tujuh</w:t>
             </w:r>
             <w:proofErr w:type="spellEnd"/>
             <w:r>
@@ -2849,14 +2819,7 @@
                 <w:spacing w:val="-2"/>
                 <w:lang w:val="en-US"/>
               </w:rPr>
-              <w:t>no_urut_</w:t>
-            </w:r>
-            <w:r>
-              <w:rPr>
-                <w:spacing w:val="-2"/>
-                <w:lang w:val="en-US"/>
-              </w:rPr>
-              <w:t>delapan</w:t>
+              <w:t>no_urut_delapan</w:t>
             </w:r>
             <w:proofErr w:type="spellEnd"/>
             <w:r>
@@ -2877,32 +2840,24 @@
               <w:pStyle w:val="TableParagraph"/>
               <w:spacing w:line="247" w:lineRule="exact"/>
               <w:rPr>
-                <w:lang w:val="en-US"/>
+                <w:lang w:val="sv-SE"/>
               </w:rPr>
             </w:pPr>
             <w:r>
               <w:rPr>
-                <w:lang w:val="en-US"/>
-              </w:rPr>
-              <w:t>{{</w:t>
-            </w:r>
-            <w:proofErr w:type="spellStart"/>
-            <w:r>
-              <w:rPr>
-                <w:lang w:val="en-US"/>
-              </w:rPr>
-              <w:t>nama_petugas</w:t>
-            </w:r>
-            <w:r>
-              <w:rPr>
-                <w:lang w:val="en-US"/>
+                <w:lang w:val="sv-SE"/>
+              </w:rPr>
+              <w:t>{{nama_petugas</w:t>
+            </w:r>
+            <w:r>
+              <w:rPr>
+                <w:lang w:val="sv-SE"/>
               </w:rPr>
               <w:t>_delapan</w:t>
             </w:r>
-            <w:proofErr w:type="spellEnd"/>
-            <w:r>
-              <w:rPr>
-                <w:lang w:val="en-US"/>
+            <w:r>
+              <w:rPr>
+                <w:lang w:val="sv-SE"/>
               </w:rPr>
               <w:t>}}</w:t>
             </w:r>
@@ -2912,7 +2867,7 @@
               <w:pStyle w:val="TableParagraph"/>
               <w:spacing w:line="247" w:lineRule="exact"/>
               <w:rPr>
-                <w:lang w:val="en-US"/>
+                <w:lang w:val="sv-SE"/>
               </w:rPr>
             </w:pPr>
           </w:p>
@@ -2921,28 +2876,14 @@
               <w:pStyle w:val="TableParagraph"/>
               <w:spacing w:line="247" w:lineRule="exact"/>
               <w:rPr>
-                <w:lang w:val="en-US"/>
+                <w:lang w:val="sv-SE"/>
               </w:rPr>
             </w:pPr>
             <w:r>
               <w:rPr>
-                <w:lang w:val="en-US"/>
-              </w:rPr>
-              <w:t>NIP. {{</w:t>
-            </w:r>
-            <w:proofErr w:type="spellStart"/>
-            <w:r>
-              <w:rPr>
-                <w:lang w:val="en-US"/>
-              </w:rPr>
-              <w:t>nip_petugas_satu</w:t>
-            </w:r>
-            <w:proofErr w:type="spellEnd"/>
-            <w:r>
-              <w:rPr>
-                <w:lang w:val="en-US"/>
-              </w:rPr>
-              <w:t>}}</w:t>
+                <w:lang w:val="sv-SE"/>
+              </w:rPr>
+              <w:t>NIP. {{nip_petugas_satu}}</w:t>
             </w:r>
           </w:p>
         </w:tc>
@@ -3039,14 +2980,7 @@
                 <w:spacing w:val="-2"/>
                 <w:lang w:val="en-US"/>
               </w:rPr>
-              <w:t>no_urut_</w:t>
-            </w:r>
-            <w:r>
-              <w:rPr>
-                <w:spacing w:val="-2"/>
-                <w:lang w:val="en-US"/>
-              </w:rPr>
-              <w:t>sembilan</w:t>
+              <w:t>no_urut_sembilan</w:t>
             </w:r>
             <w:proofErr w:type="spellEnd"/>
             <w:r>
@@ -3229,14 +3163,7 @@
                 <w:spacing w:val="-2"/>
                 <w:lang w:val="en-US"/>
               </w:rPr>
-              <w:t>no_urut_</w:t>
-            </w:r>
-            <w:r>
-              <w:rPr>
-                <w:spacing w:val="-2"/>
-                <w:lang w:val="en-US"/>
-              </w:rPr>
-              <w:t>sepuluh</w:t>
+              <w:t>no_urut_sepuluh</w:t>
             </w:r>
             <w:proofErr w:type="spellEnd"/>
             <w:r>

</xml_diff>

<commit_message>
feat: improve document viewing, reporting, and backend record handling with comprehensive tests
</commit_message>
<xml_diff>
--- a/backend/templates/Berkas Luar Kota - Laporan.docx
+++ b/backend/templates/Berkas Luar Kota - Laporan.docx
@@ -1797,7 +1797,7 @@
               <w:rPr>
                 <w:lang w:val="en-US"/>
               </w:rPr>
-              <w:t>nip_petugas_satu</w:t>
+              <w:t>nip_petugas_dua</w:t>
             </w:r>
             <w:proofErr w:type="spellEnd"/>
             <w:r>
@@ -1980,7 +1980,7 @@
               <w:rPr>
                 <w:lang w:val="en-US"/>
               </w:rPr>
-              <w:t>nip_petugas_satu</w:t>
+              <w:t>nip_petugas_tiga</w:t>
             </w:r>
             <w:proofErr w:type="spellEnd"/>
             <w:r>
@@ -2163,7 +2163,7 @@
               <w:rPr>
                 <w:lang w:val="en-US"/>
               </w:rPr>
-              <w:t>nip_petugas_satu</w:t>
+              <w:t>nip_petugas_empat</w:t>
             </w:r>
             <w:proofErr w:type="spellEnd"/>
             <w:r>
@@ -2346,7 +2346,7 @@
               <w:rPr>
                 <w:lang w:val="en-US"/>
               </w:rPr>
-              <w:t>nip_petugas_satu</w:t>
+              <w:t>nip_petugas_lima</w:t>
             </w:r>
             <w:proofErr w:type="spellEnd"/>
             <w:r>
@@ -2471,32 +2471,24 @@
               <w:pStyle w:val="TableParagraph"/>
               <w:spacing w:line="247" w:lineRule="exact"/>
               <w:rPr>
-                <w:lang w:val="en-US"/>
+                <w:lang w:val="sv-SE"/>
               </w:rPr>
             </w:pPr>
             <w:r>
               <w:rPr>
-                <w:lang w:val="en-US"/>
-              </w:rPr>
-              <w:t>{{</w:t>
-            </w:r>
-            <w:proofErr w:type="spellStart"/>
-            <w:r>
-              <w:rPr>
-                <w:lang w:val="en-US"/>
-              </w:rPr>
-              <w:t>nama_petugas_</w:t>
-            </w:r>
-            <w:r>
-              <w:rPr>
-                <w:lang w:val="en-US"/>
+                <w:lang w:val="sv-SE"/>
+              </w:rPr>
+              <w:t>{{nama_petugas_</w:t>
+            </w:r>
+            <w:r>
+              <w:rPr>
+                <w:lang w:val="sv-SE"/>
               </w:rPr>
               <w:t>enam</w:t>
             </w:r>
-            <w:proofErr w:type="spellEnd"/>
-            <w:r>
-              <w:rPr>
-                <w:lang w:val="en-US"/>
+            <w:r>
+              <w:rPr>
+                <w:lang w:val="sv-SE"/>
               </w:rPr>
               <w:t>}}</w:t>
             </w:r>
@@ -2506,7 +2498,7 @@
               <w:pStyle w:val="TableParagraph"/>
               <w:spacing w:line="247" w:lineRule="exact"/>
               <w:rPr>
-                <w:lang w:val="en-US"/>
+                <w:lang w:val="sv-SE"/>
               </w:rPr>
             </w:pPr>
           </w:p>
@@ -2518,28 +2510,14 @@
               </w:tabs>
               <w:spacing w:line="247" w:lineRule="exact"/>
               <w:rPr>
-                <w:lang w:val="en-US"/>
+                <w:lang w:val="sv-SE"/>
               </w:rPr>
             </w:pPr>
             <w:r>
               <w:rPr>
-                <w:lang w:val="en-US"/>
-              </w:rPr>
-              <w:t>NIP. {{</w:t>
-            </w:r>
-            <w:proofErr w:type="spellStart"/>
-            <w:r>
-              <w:rPr>
-                <w:lang w:val="en-US"/>
-              </w:rPr>
-              <w:t>nip_petugas_satu</w:t>
-            </w:r>
-            <w:proofErr w:type="spellEnd"/>
-            <w:r>
-              <w:rPr>
-                <w:lang w:val="en-US"/>
-              </w:rPr>
-              <w:t>}}</w:t>
+                <w:lang w:val="sv-SE"/>
+              </w:rPr>
+              <w:t>NIP. {{nip_petugas_enam}}</w:t>
             </w:r>
           </w:p>
         </w:tc>
@@ -2715,7 +2693,7 @@
               <w:rPr>
                 <w:lang w:val="en-US"/>
               </w:rPr>
-              <w:t>nip_petugas_satu</w:t>
+              <w:t>nip_petugas_tujuh</w:t>
             </w:r>
             <w:proofErr w:type="spellEnd"/>
             <w:r>
@@ -2883,7 +2861,7 @@
               <w:rPr>
                 <w:lang w:val="sv-SE"/>
               </w:rPr>
-              <w:t>NIP. {{nip_petugas_satu}}</w:t>
+              <w:t>NIP. {{nip_petugas_delapan}}</w:t>
             </w:r>
           </w:p>
         </w:tc>
@@ -3059,7 +3037,7 @@
               <w:rPr>
                 <w:lang w:val="en-US"/>
               </w:rPr>
-              <w:t>nip_petugas_satu</w:t>
+              <w:t>nip_petugas_sembilan</w:t>
             </w:r>
             <w:proofErr w:type="spellEnd"/>
             <w:r>
@@ -3242,7 +3220,7 @@
               <w:rPr>
                 <w:lang w:val="en-US"/>
               </w:rPr>
-              <w:t>nip_petugas_satu</w:t>
+              <w:t>nip_petugas_sepuluh</w:t>
             </w:r>
             <w:proofErr w:type="spellEnd"/>
             <w:r>
@@ -5887,12 +5865,21 @@
   <w:tbl>
     <w:tblPr>
       <w:tblStyle w:val="TableGrid"/>
-      <w:tblW w:w="10641" w:type="dxa"/>
+      <w:tblW w:w="10915" w:type="dxa"/>
+      <w:tblInd w:w="108" w:type="dxa"/>
+      <w:tblBorders>
+        <w:top w:val="none" w:sz="0" w:space="0" w:color="auto"/>
+        <w:left w:val="none" w:sz="0" w:space="0" w:color="auto"/>
+        <w:bottom w:val="none" w:sz="0" w:space="0" w:color="auto"/>
+        <w:right w:val="none" w:sz="0" w:space="0" w:color="auto"/>
+        <w:insideH w:val="none" w:sz="0" w:space="0" w:color="auto"/>
+        <w:insideV w:val="none" w:sz="0" w:space="0" w:color="auto"/>
+      </w:tblBorders>
       <w:tblLook w:val="04A0" w:firstRow="1" w:lastRow="0" w:firstColumn="1" w:lastColumn="0" w:noHBand="0" w:noVBand="1"/>
     </w:tblPr>
     <w:tblGrid>
-      <w:gridCol w:w="1430"/>
-      <w:gridCol w:w="9211"/>
+      <w:gridCol w:w="1322"/>
+      <w:gridCol w:w="9593"/>
     </w:tblGrid>
     <w:tr>
       <w:trPr>
@@ -5900,13 +5887,7 @@
       </w:trPr>
       <w:tc>
         <w:tcPr>
-          <w:tcW w:w="1430" w:type="dxa"/>
-          <w:tcBorders>
-            <w:top w:val="nil"/>
-            <w:left w:val="nil"/>
-            <w:bottom w:val="nil"/>
-            <w:right w:val="nil"/>
-          </w:tcBorders>
+          <w:tcW w:w="1322" w:type="dxa"/>
         </w:tcPr>
         <w:p>
           <w:pPr>
@@ -5917,7 +5898,7 @@
               <w:noProof/>
             </w:rPr>
             <w:drawing>
-              <wp:anchor distT="0" distB="0" distL="114300" distR="114300" simplePos="0" relativeHeight="251657216" behindDoc="1" locked="0" layoutInCell="1" allowOverlap="1" wp14:anchorId="6C1D62D8" wp14:editId="3E65E39E">
+              <wp:anchor distT="0" distB="0" distL="114300" distR="114300" simplePos="0" relativeHeight="251656192" behindDoc="1" locked="0" layoutInCell="1" allowOverlap="1" wp14:anchorId="6C1D62D8" wp14:editId="3E65E39E">
                 <wp:simplePos x="0" y="0"/>
                 <wp:positionH relativeFrom="column">
                   <wp:posOffset>689379</wp:posOffset>
@@ -5936,7 +5917,7 @@
                     <wp:lineTo x="0" y="0"/>
                   </wp:wrapPolygon>
                 </wp:wrapTight>
-                <wp:docPr id="3" name="Picture 3"/>
+                <wp:docPr id="9" name="Picture 9"/>
                 <wp:cNvGraphicFramePr>
                   <a:graphicFrameLocks xmlns:a="http://schemas.openxmlformats.org/drawingml/2006/main" noChangeAspect="1"/>
                 </wp:cNvGraphicFramePr>
@@ -6017,7 +5998,7 @@
                     <wp:lineTo x="8243" y="0"/>
                   </wp:wrapPolygon>
                 </wp:wrapTight>
-                <wp:docPr id="2" name="Picture 2"/>
+                <wp:docPr id="10" name="Picture 10"/>
                 <wp:cNvGraphicFramePr>
                   <a:graphicFrameLocks xmlns:a="http://schemas.openxmlformats.org/drawingml/2006/main" noChangeAspect="1"/>
                 </wp:cNvGraphicFramePr>
@@ -6061,19 +6042,16 @@
       </w:tc>
       <w:tc>
         <w:tcPr>
-          <w:tcW w:w="9211" w:type="dxa"/>
-          <w:tcBorders>
-            <w:top w:val="nil"/>
-            <w:left w:val="nil"/>
-            <w:bottom w:val="nil"/>
-            <w:right w:val="nil"/>
-          </w:tcBorders>
+          <w:tcW w:w="9593" w:type="dxa"/>
         </w:tcPr>
         <w:p>
           <w:pPr>
             <w:rPr>
               <w:rFonts w:ascii="Arial Narrow" w:hAnsi="Arial Narrow"/>
-              <w:szCs w:val="24"/>
+              <w:b/>
+              <w:bCs/>
+              <w:sz w:val="32"/>
+              <w:szCs w:val="32"/>
             </w:rPr>
           </w:pPr>
         </w:p>
@@ -6081,24 +6059,29 @@
           <w:pPr>
             <w:rPr>
               <w:rFonts w:ascii="Arial Narrow" w:hAnsi="Arial Narrow"/>
-              <w:sz w:val="28"/>
-              <w:szCs w:val="28"/>
-            </w:rPr>
-          </w:pPr>
-        </w:p>
-        <w:p>
-          <w:pPr>
-            <w:rPr>
-              <w:rFonts w:ascii="Arial Narrow" w:hAnsi="Arial Narrow"/>
-              <w:sz w:val="28"/>
-              <w:szCs w:val="28"/>
+              <w:b/>
+              <w:bCs/>
+              <w:sz w:val="32"/>
+              <w:szCs w:val="32"/>
             </w:rPr>
           </w:pPr>
           <w:r>
             <w:rPr>
               <w:rFonts w:ascii="Arial Narrow" w:hAnsi="Arial Narrow"/>
-              <w:sz w:val="28"/>
-              <w:szCs w:val="28"/>
+              <w:b/>
+              <w:bCs/>
+              <w:sz w:val="32"/>
+              <w:szCs w:val="32"/>
+            </w:rPr>
+            <w:t xml:space="preserve"> </w:t>
+          </w:r>
+          <w:r>
+            <w:rPr>
+              <w:rFonts w:ascii="Arial Narrow" w:hAnsi="Arial Narrow"/>
+              <w:b/>
+              <w:bCs/>
+              <w:sz w:val="32"/>
+              <w:szCs w:val="32"/>
             </w:rPr>
             <w:t>KEMENTERIAN KETENAGAKERJAAN REPUBLIK INDONESIA</w:t>
           </w:r>
@@ -6112,6 +6095,15 @@
               <w:szCs w:val="32"/>
             </w:rPr>
           </w:pPr>
+          <w:r>
+            <w:rPr>
+              <w:rFonts w:ascii="Arial Narrow" w:hAnsi="Arial Narrow"/>
+              <w:color w:val="284A61"/>
+              <w:sz w:val="32"/>
+              <w:szCs w:val="32"/>
+            </w:rPr>
+            <w:t xml:space="preserve"> </w:t>
+          </w:r>
           <w:r>
             <w:rPr>
               <w:rFonts w:ascii="Arial Narrow" w:hAnsi="Arial Narrow"/>

</xml_diff>

<commit_message>
fix: upgrade node to v22 and force npm ci to prevent cache corruption, fix docx layout
</commit_message>
<xml_diff>
--- a/backend/templates/Berkas Luar Kota - Laporan.docx
+++ b/backend/templates/Berkas Luar Kota - Laporan.docx
@@ -1,7 +1,287 @@
 
 <file path=word/document.xml><?xml version="1.0" encoding="utf-8"?>
-<w:document xmlns:wpc="http://schemas.microsoft.com/office/word/2010/wordprocessingCanvas" xmlns:cx="http://schemas.microsoft.com/office/drawing/2014/chartex" xmlns:cx1="http://schemas.microsoft.com/office/drawing/2015/9/8/chartex" xmlns:cx2="http://schemas.microsoft.com/office/drawing/2015/10/21/chartex" xmlns:cx3="http://schemas.microsoft.com/office/drawing/2016/5/9/chartex" xmlns:cx4="http://schemas.microsoft.com/office/drawing/2016/5/10/chartex" xmlns:cx5="http://schemas.microsoft.com/office/drawing/2016/5/11/chartex" xmlns:cx6="http://schemas.microsoft.com/office/drawing/2016/5/12/chartex" xmlns:cx7="http://schemas.microsoft.com/office/drawing/2016/5/13/chartex" xmlns:cx8="http://schemas.microsoft.com/office/drawing/2016/5/14/chartex" xmlns:mc="http://schemas.openxmlformats.org/markup-compatibility/2006" xmlns:aink="http://schemas.microsoft.com/office/drawing/2016/ink" xmlns:am3d="http://schemas.microsoft.com/office/drawing/2017/model3d" xmlns:o="urn:schemas-microsoft-com:office:office" xmlns:oel="http://schemas.microsoft.com/office/2019/extlst" xmlns:r="http://schemas.openxmlformats.org/officeDocument/2006/relationships" xmlns:m="http://schemas.openxmlformats.org/officeDocument/2006/math" xmlns:v="urn:schemas-microsoft-com:vml" xmlns:wp14="http://schemas.microsoft.com/office/word/2010/wordprocessingDrawing" xmlns:wp="http://schemas.openxmlformats.org/drawingml/2006/wordprocessingDrawing" xmlns:w10="urn:schemas-microsoft-com:office:word" xmlns:w="http://schemas.openxmlformats.org/wordprocessingml/2006/main" xmlns:w14="http://schemas.microsoft.com/office/word/2010/wordml" xmlns:w15="http://schemas.microsoft.com/office/word/2012/wordml" xmlns:w16cex="http://schemas.microsoft.com/office/word/2018/wordml/cex" xmlns:w16cid="http://schemas.microsoft.com/office/word/2016/wordml/cid" xmlns:w16="http://schemas.microsoft.com/office/word/2018/wordml" xmlns:w16sdtdh="http://schemas.microsoft.com/office/word/2020/wordml/sdtdatahash" xmlns:w16se="http://schemas.microsoft.com/office/word/2015/wordml/symex" xmlns:wpg="http://schemas.microsoft.com/office/word/2010/wordprocessingGroup" xmlns:wpi="http://schemas.microsoft.com/office/word/2010/wordprocessingInk" xmlns:wne="http://schemas.microsoft.com/office/word/2006/wordml" xmlns:wps="http://schemas.microsoft.com/office/word/2010/wordprocessingShape" mc:Ignorable="w14 w15 w16se w16cid w16 w16cex w16sdtdh wp14">
+<w:document xmlns:wpc="http://schemas.microsoft.com/office/word/2010/wordprocessingCanvas" xmlns:cx="http://schemas.microsoft.com/office/drawing/2014/chartex" xmlns:cx1="http://schemas.microsoft.com/office/drawing/2015/9/8/chartex" xmlns:cx2="http://schemas.microsoft.com/office/drawing/2015/10/21/chartex" xmlns:cx3="http://schemas.microsoft.com/office/drawing/2016/5/9/chartex" xmlns:cx4="http://schemas.microsoft.com/office/drawing/2016/5/10/chartex" xmlns:cx5="http://schemas.microsoft.com/office/drawing/2016/5/11/chartex" xmlns:cx6="http://schemas.microsoft.com/office/drawing/2016/5/12/chartex" xmlns:cx7="http://schemas.microsoft.com/office/drawing/2016/5/13/chartex" xmlns:cx8="http://schemas.microsoft.com/office/drawing/2016/5/14/chartex" xmlns:mc="http://schemas.openxmlformats.org/markup-compatibility/2006" xmlns:aink="http://schemas.microsoft.com/office/drawing/2016/ink" xmlns:am3d="http://schemas.microsoft.com/office/drawing/2017/model3d" xmlns:o="urn:schemas-microsoft-com:office:office" xmlns:oel="http://schemas.microsoft.com/office/2019/extlst" xmlns:r="http://schemas.openxmlformats.org/officeDocument/2006/relationships" xmlns:m="http://schemas.openxmlformats.org/officeDocument/2006/math" xmlns:v="urn:schemas-microsoft-com:vml" xmlns:wp14="http://schemas.microsoft.com/office/word/2010/wordprocessingDrawing" xmlns:wp="http://schemas.openxmlformats.org/drawingml/2006/wordprocessingDrawing" xmlns:w10="urn:schemas-microsoft-com:office:word" xmlns:w="http://schemas.openxmlformats.org/wordprocessingml/2006/main" xmlns:w14="http://schemas.microsoft.com/office/word/2010/wordml" xmlns:w15="http://schemas.microsoft.com/office/word/2012/wordml" xmlns:w16cex="http://schemas.microsoft.com/office/word/2018/wordml/cex" xmlns:w16cid="http://schemas.microsoft.com/office/word/2016/wordml/cid" xmlns:w16="http://schemas.microsoft.com/office/word/2018/wordml" xmlns:w16du="http://schemas.microsoft.com/office/word/2023/wordml/word16du" xmlns:w16sdtdh="http://schemas.microsoft.com/office/word/2020/wordml/sdtdatahash" xmlns:w16sdtfl="http://schemas.microsoft.com/office/word/2024/wordml/sdtformatlock" xmlns:w16se="http://schemas.microsoft.com/office/word/2015/wordml/symex" xmlns:wpg="http://schemas.microsoft.com/office/word/2010/wordprocessingGroup" xmlns:wpi="http://schemas.microsoft.com/office/word/2010/wordprocessingInk" xmlns:wne="http://schemas.microsoft.com/office/word/2006/wordml" xmlns:wps="http://schemas.microsoft.com/office/word/2010/wordprocessingShape" mc:Ignorable="w14 w15 w16se w16cid w16 w16cex w16sdtdh w16sdtfl w16du wp14">
   <w:body>
+    <w:tbl>
+      <w:tblPr>
+        <w:tblStyle w:val="TableGrid"/>
+        <w:tblW w:w="10915" w:type="dxa"/>
+        <w:tblInd w:w="108" w:type="dxa"/>
+        <w:tblBorders>
+          <w:top w:val="none" w:sz="0" w:space="0" w:color="auto"/>
+          <w:left w:val="none" w:sz="0" w:space="0" w:color="auto"/>
+          <w:bottom w:val="none" w:sz="0" w:space="0" w:color="auto"/>
+          <w:right w:val="none" w:sz="0" w:space="0" w:color="auto"/>
+          <w:insideH w:val="none" w:sz="0" w:space="0" w:color="auto"/>
+          <w:insideV w:val="none" w:sz="0" w:space="0" w:color="auto"/>
+        </w:tblBorders>
+        <w:tblLook w:val="04A0" w:firstRow="1" w:lastRow="0" w:firstColumn="1" w:lastColumn="0" w:noHBand="0" w:noVBand="1"/>
+      </w:tblPr>
+      <w:tblGrid>
+        <w:gridCol w:w="1322"/>
+        <w:gridCol w:w="9593"/>
+      </w:tblGrid>
+      <w:tr>
+        <w:trPr>
+          <w:trHeight w:val="1867"/>
+        </w:trPr>
+        <w:tc>
+          <w:tcPr>
+            <w:tcW w:w="1322" w:type="dxa"/>
+          </w:tcPr>
+          <w:p>
+            <w:pPr>
+              <w:pStyle w:val="Header"/>
+            </w:pPr>
+            <w:r>
+              <w:rPr>
+                <w:noProof/>
+              </w:rPr>
+              <w:drawing>
+                <wp:anchor distT="0" distB="0" distL="114300" distR="114300" simplePos="0" relativeHeight="251659264" behindDoc="1" locked="0" layoutInCell="1" allowOverlap="1" wp14:anchorId="4D77D877" wp14:editId="66B5DCF9">
+                  <wp:simplePos x="0" y="0"/>
+                  <wp:positionH relativeFrom="column">
+                    <wp:posOffset>5715</wp:posOffset>
+                  </wp:positionH>
+                  <wp:positionV relativeFrom="paragraph">
+                    <wp:posOffset>224459</wp:posOffset>
+                  </wp:positionV>
+                  <wp:extent cx="648970" cy="819785"/>
+                  <wp:effectExtent l="0" t="0" r="0" b="0"/>
+                  <wp:wrapTight wrapText="bothSides">
+                    <wp:wrapPolygon edited="0">
+                      <wp:start x="8877" y="0"/>
+                      <wp:lineTo x="5072" y="2008"/>
+                      <wp:lineTo x="0" y="6525"/>
+                      <wp:lineTo x="0" y="10541"/>
+                      <wp:lineTo x="7609" y="16062"/>
+                      <wp:lineTo x="10779" y="16062"/>
+                      <wp:lineTo x="0" y="18070"/>
+                      <wp:lineTo x="0" y="21081"/>
+                      <wp:lineTo x="3170" y="21081"/>
+                      <wp:lineTo x="5706" y="21081"/>
+                      <wp:lineTo x="20924" y="21081"/>
+                      <wp:lineTo x="20924" y="18572"/>
+                      <wp:lineTo x="12681" y="16062"/>
+                      <wp:lineTo x="20924" y="9537"/>
+                      <wp:lineTo x="20924" y="6525"/>
+                      <wp:lineTo x="15851" y="2510"/>
+                      <wp:lineTo x="11413" y="0"/>
+                      <wp:lineTo x="8877" y="0"/>
+                    </wp:wrapPolygon>
+                  </wp:wrapTight>
+                  <wp:docPr id="269144722" name="Picture 269144722"/>
+                  <wp:cNvGraphicFramePr>
+                    <a:graphicFrameLocks xmlns:a="http://schemas.openxmlformats.org/drawingml/2006/main" noChangeAspect="1"/>
+                  </wp:cNvGraphicFramePr>
+                  <a:graphic xmlns:a="http://schemas.openxmlformats.org/drawingml/2006/main">
+                    <a:graphicData uri="http://schemas.openxmlformats.org/drawingml/2006/picture">
+                      <pic:pic xmlns:pic="http://schemas.openxmlformats.org/drawingml/2006/picture">
+                        <pic:nvPicPr>
+                          <pic:cNvPr id="1" name="Picture 1"/>
+                          <pic:cNvPicPr>
+                            <a:picLocks noChangeAspect="1"/>
+                          </pic:cNvPicPr>
+                        </pic:nvPicPr>
+                        <pic:blipFill>
+                          <a:blip r:embed="rId7" cstate="print">
+                            <a:extLst>
+                              <a:ext uri="{28A0092B-C50C-407E-A947-70E740481C1C}">
+                                <a14:useLocalDpi xmlns:a14="http://schemas.microsoft.com/office/drawing/2010/main" val="0"/>
+                              </a:ext>
+                            </a:extLst>
+                          </a:blip>
+                          <a:stretch>
+                            <a:fillRect/>
+                          </a:stretch>
+                        </pic:blipFill>
+                        <pic:spPr>
+                          <a:xfrm>
+                            <a:off x="0" y="0"/>
+                            <a:ext cx="648970" cy="819785"/>
+                          </a:xfrm>
+                          <a:prstGeom prst="rect">
+                            <a:avLst/>
+                          </a:prstGeom>
+                        </pic:spPr>
+                      </pic:pic>
+                    </a:graphicData>
+                  </a:graphic>
+                </wp:anchor>
+              </w:drawing>
+            </w:r>
+            <w:r>
+              <w:rPr>
+                <w:noProof/>
+              </w:rPr>
+              <w:drawing>
+                <wp:anchor distT="0" distB="0" distL="114300" distR="114300" simplePos="0" relativeHeight="251658240" behindDoc="1" locked="0" layoutInCell="1" allowOverlap="1" wp14:anchorId="2179C7AA" wp14:editId="6CA944F7">
+                  <wp:simplePos x="0" y="0"/>
+                  <wp:positionH relativeFrom="column">
+                    <wp:posOffset>689379</wp:posOffset>
+                  </wp:positionH>
+                  <wp:positionV relativeFrom="paragraph">
+                    <wp:posOffset>-11875</wp:posOffset>
+                  </wp:positionV>
+                  <wp:extent cx="78740" cy="1292225"/>
+                  <wp:effectExtent l="0" t="0" r="0" b="3175"/>
+                  <wp:wrapTight wrapText="bothSides">
+                    <wp:wrapPolygon edited="0">
+                      <wp:start x="0" y="0"/>
+                      <wp:lineTo x="0" y="21335"/>
+                      <wp:lineTo x="15677" y="21335"/>
+                      <wp:lineTo x="15677" y="0"/>
+                      <wp:lineTo x="0" y="0"/>
+                    </wp:wrapPolygon>
+                  </wp:wrapTight>
+                  <wp:docPr id="1716352736" name="Picture 1716352736"/>
+                  <wp:cNvGraphicFramePr>
+                    <a:graphicFrameLocks xmlns:a="http://schemas.openxmlformats.org/drawingml/2006/main" noChangeAspect="1"/>
+                  </wp:cNvGraphicFramePr>
+                  <a:graphic xmlns:a="http://schemas.openxmlformats.org/drawingml/2006/main">
+                    <a:graphicData uri="http://schemas.openxmlformats.org/drawingml/2006/picture">
+                      <pic:pic xmlns:pic="http://schemas.openxmlformats.org/drawingml/2006/picture">
+                        <pic:nvPicPr>
+                          <pic:cNvPr id="2" name="Picture 2"/>
+                          <pic:cNvPicPr>
+                            <a:picLocks noChangeAspect="1"/>
+                          </pic:cNvPicPr>
+                        </pic:nvPicPr>
+                        <pic:blipFill>
+                          <a:blip r:embed="rId8" cstate="print">
+                            <a:extLst>
+                              <a:ext uri="{28A0092B-C50C-407E-A947-70E740481C1C}">
+                                <a14:useLocalDpi xmlns:a14="http://schemas.microsoft.com/office/drawing/2010/main" val="0"/>
+                              </a:ext>
+                            </a:extLst>
+                          </a:blip>
+                          <a:stretch>
+                            <a:fillRect/>
+                          </a:stretch>
+                        </pic:blipFill>
+                        <pic:spPr>
+                          <a:xfrm>
+                            <a:off x="0" y="0"/>
+                            <a:ext cx="78740" cy="1292225"/>
+                          </a:xfrm>
+                          <a:prstGeom prst="rect">
+                            <a:avLst/>
+                          </a:prstGeom>
+                        </pic:spPr>
+                      </pic:pic>
+                    </a:graphicData>
+                  </a:graphic>
+                </wp:anchor>
+              </w:drawing>
+            </w:r>
+          </w:p>
+          <w:p>
+            <w:pPr>
+              <w:pStyle w:val="Header"/>
+            </w:pPr>
+          </w:p>
+        </w:tc>
+        <w:tc>
+          <w:tcPr>
+            <w:tcW w:w="9593" w:type="dxa"/>
+          </w:tcPr>
+          <w:tbl>
+            <w:tblPr>
+              <w:tblStyle w:val="TableGrid"/>
+              <w:tblpPr w:leftFromText="180" w:rightFromText="180" w:vertAnchor="page" w:horzAnchor="margin" w:tblpY="515"/>
+              <w:tblOverlap w:val="never"/>
+              <w:tblW w:w="0" w:type="auto"/>
+              <w:tblBorders>
+                <w:top w:val="none" w:sz="0" w:space="0" w:color="auto"/>
+                <w:left w:val="none" w:sz="0" w:space="0" w:color="auto"/>
+                <w:bottom w:val="none" w:sz="0" w:space="0" w:color="auto"/>
+                <w:right w:val="none" w:sz="0" w:space="0" w:color="auto"/>
+                <w:insideH w:val="none" w:sz="0" w:space="0" w:color="auto"/>
+                <w:insideV w:val="none" w:sz="0" w:space="0" w:color="auto"/>
+              </w:tblBorders>
+              <w:tblLook w:val="04A0" w:firstRow="1" w:lastRow="0" w:firstColumn="1" w:lastColumn="0" w:noHBand="0" w:noVBand="1"/>
+            </w:tblPr>
+            <w:tblGrid>
+              <w:gridCol w:w="8505"/>
+            </w:tblGrid>
+            <w:tr>
+              <w:tc>
+                <w:tcPr>
+                  <w:tcW w:w="8505" w:type="dxa"/>
+                </w:tcPr>
+                <w:p>
+                  <w:pPr>
+                    <w:rPr>
+                      <w:rFonts w:ascii="Arial Narrow" w:hAnsi="Arial Narrow"/>
+                      <w:b/>
+                      <w:bCs/>
+                      <w:sz w:val="29"/>
+                      <w:szCs w:val="29"/>
+                    </w:rPr>
+                  </w:pPr>
+                  <w:r>
+                    <w:rPr>
+                      <w:rFonts w:ascii="Arial Narrow" w:hAnsi="Arial Narrow"/>
+                      <w:b/>
+                      <w:bCs/>
+                      <w:sz w:val="29"/>
+                      <w:szCs w:val="29"/>
+                    </w:rPr>
+                    <w:t>KEMENTERIAN KETENAGAKERJAAN REPUBLIK INDONESIA</w:t>
+                  </w:r>
+                </w:p>
+              </w:tc>
+            </w:tr>
+            <w:tr>
+              <w:tc>
+                <w:tcPr>
+                  <w:tcW w:w="8505" w:type="dxa"/>
+                </w:tcPr>
+                <w:p>
+                  <w:pPr>
+                    <w:rPr>
+                      <w:rFonts w:ascii="Arial Narrow" w:hAnsi="Arial Narrow"/>
+                      <w:color w:val="284A61"/>
+                      <w:sz w:val="32"/>
+                      <w:szCs w:val="32"/>
+                    </w:rPr>
+                  </w:pPr>
+                  <w:r>
+                    <w:rPr>
+                      <w:rFonts w:ascii="Arial Narrow" w:hAnsi="Arial Narrow"/>
+                      <w:color w:val="284A61"/>
+                      <w:sz w:val="29"/>
+                      <w:szCs w:val="29"/>
+                    </w:rPr>
+                    <w:t>SEKRETARIAT JENDERAL</w:t>
+                  </w:r>
+                </w:p>
+              </w:tc>
+            </w:tr>
+          </w:tbl>
+          <w:p>
+            <w:pPr>
+              <w:rPr>
+                <w:rFonts w:ascii="Arial Narrow" w:hAnsi="Arial Narrow"/>
+                <w:color w:val="284A61"/>
+                <w:sz w:val="32"/>
+                <w:szCs w:val="32"/>
+              </w:rPr>
+            </w:pPr>
+          </w:p>
+        </w:tc>
+      </w:tr>
+    </w:tbl>
+    <w:p>
+      <w:pPr>
+        <w:pStyle w:val="Heading1"/>
+        <w:ind w:left="0" w:right="137"/>
+        <w:jc w:val="center"/>
+        <w:rPr>
+          <w:spacing w:val="-2"/>
+        </w:rPr>
+      </w:pPr>
+    </w:p>
     <w:p>
       <w:pPr>
         <w:pStyle w:val="Heading1"/>
@@ -143,7 +423,7 @@
         <w:tblLook w:val="04A0" w:firstRow="1" w:lastRow="0" w:firstColumn="1" w:lastColumn="0" w:noHBand="0" w:noVBand="1"/>
       </w:tblPr>
       <w:tblGrid>
-        <w:gridCol w:w="9478"/>
+        <w:gridCol w:w="9484"/>
       </w:tblGrid>
       <w:tr>
         <w:tc>
@@ -1055,7 +1335,7 @@
               <w:tblLook w:val="04A0" w:firstRow="1" w:lastRow="0" w:firstColumn="1" w:lastColumn="0" w:noHBand="0" w:noVBand="1"/>
             </w:tblPr>
             <w:tblGrid>
-              <w:gridCol w:w="1452"/>
+              <w:gridCol w:w="1453"/>
             </w:tblGrid>
             <w:tr>
               <w:tc>
@@ -1200,50 +1480,44 @@
       <w:pPr>
         <w:pStyle w:val="BodyText"/>
         <w:spacing w:before="1"/>
-        <w:ind w:left="1225"/>
+        <w:ind w:left="1225" w:right="447"/>
         <w:jc w:val="both"/>
         <w:rPr>
           <w:lang w:val="en-US"/>
         </w:rPr>
-        <w:sectPr>
-          <w:headerReference w:type="even" r:id="rId7"/>
-          <w:headerReference w:type="default" r:id="rId8"/>
-          <w:footerReference w:type="even" r:id="rId9"/>
-          <w:footerReference w:type="default" r:id="rId10"/>
-          <w:headerReference w:type="first" r:id="rId11"/>
-          <w:footerReference w:type="first" r:id="rId12"/>
-          <w:type w:val="continuous"/>
-          <w:pgSz w:w="12240" w:h="20160"/>
-          <w:pgMar w:top="1200" w:right="1080" w:bottom="280" w:left="1080" w:header="340" w:footer="720" w:gutter="0"/>
-          <w:cols w:space="720"/>
-          <w:docGrid w:linePitch="299"/>
-        </w:sectPr>
       </w:pPr>
       <w:r>
         <w:rPr>
           <w:lang w:val="en-US"/>
         </w:rPr>
-        <w:t>{{</w:t>
-      </w:r>
-      <w:proofErr w:type="spellStart"/>
-      <w:r>
+        <w:t>{{isi_laporan}}</w:t>
+      </w:r>
+    </w:p>
+    <w:p>
+      <w:pPr>
+        <w:pStyle w:val="BodyText"/>
+        <w:spacing w:before="1"/>
+        <w:jc w:val="both"/>
         <w:rPr>
           <w:lang w:val="en-US"/>
         </w:rPr>
-        <w:t>isi_laporan</w:t>
-      </w:r>
-      <w:proofErr w:type="spellEnd"/>
-      <w:r>
+      </w:pPr>
+    </w:p>
+    <w:p>
+      <w:pPr>
+        <w:pStyle w:val="BodyText"/>
+        <w:spacing w:before="1"/>
+        <w:jc w:val="both"/>
         <w:rPr>
           <w:lang w:val="en-US"/>
         </w:rPr>
-        <w:t>}}</w:t>
-      </w:r>
+      </w:pPr>
     </w:p>
     <w:p>
       <w:pPr>
         <w:pStyle w:val="BodyText"/>
-        <w:spacing w:before="51"/>
+        <w:spacing w:before="1"/>
+        <w:jc w:val="both"/>
       </w:pPr>
     </w:p>
     <w:p>
@@ -1495,8 +1769,8 @@
       </w:tblPr>
       <w:tblGrid>
         <w:gridCol w:w="782"/>
-        <w:gridCol w:w="6233"/>
-        <w:gridCol w:w="2634"/>
+        <w:gridCol w:w="6236"/>
+        <w:gridCol w:w="2636"/>
       </w:tblGrid>
       <w:tr>
         <w:trPr>
@@ -1521,15 +1795,8 @@
                 <w:spacing w:val="-2"/>
                 <w:lang w:val="en-US"/>
               </w:rPr>
-              <w:t>{{</w:t>
-            </w:r>
-            <w:proofErr w:type="spellStart"/>
-            <w:r>
-              <w:rPr>
-                <w:spacing w:val="-2"/>
-                <w:lang w:val="en-US"/>
-              </w:rPr>
-              <w:t>no_urut</w:t>
+              <w:lastRenderedPageBreak/>
+              <w:t>{{no_urut</w:t>
             </w:r>
             <w:r>
               <w:rPr>
@@ -1538,7 +1805,6 @@
               </w:rPr>
               <w:t>_satu</w:t>
             </w:r>
-            <w:proofErr w:type="spellEnd"/>
             <w:r>
               <w:rPr>
                 <w:spacing w:val="-2"/>
@@ -1564,21 +1830,7 @@
               <w:rPr>
                 <w:lang w:val="en-US"/>
               </w:rPr>
-              <w:t>{{</w:t>
-            </w:r>
-            <w:proofErr w:type="spellStart"/>
-            <w:r>
-              <w:rPr>
-                <w:lang w:val="en-US"/>
-              </w:rPr>
-              <w:t>nama_petugas_satu</w:t>
-            </w:r>
-            <w:proofErr w:type="spellEnd"/>
-            <w:r>
-              <w:rPr>
-                <w:lang w:val="en-US"/>
-              </w:rPr>
-              <w:t>}}</w:t>
+              <w:t>{{nama_petugas_satu}}</w:t>
             </w:r>
           </w:p>
           <w:p>
@@ -1611,21 +1863,7 @@
               <w:rPr>
                 <w:lang w:val="en-US"/>
               </w:rPr>
-              <w:t>NIP. {{</w:t>
-            </w:r>
-            <w:proofErr w:type="spellStart"/>
-            <w:r>
-              <w:rPr>
-                <w:lang w:val="en-US"/>
-              </w:rPr>
-              <w:t>nip_petugas_satu</w:t>
-            </w:r>
-            <w:proofErr w:type="spellEnd"/>
-            <w:r>
-              <w:rPr>
-                <w:lang w:val="en-US"/>
-              </w:rPr>
-              <w:t>}}</w:t>
+              <w:t>NIP. {{nip_petugas_satu}}</w:t>
             </w:r>
           </w:p>
         </w:tc>
@@ -1644,15 +1882,7 @@
                 <w:spacing w:val="-2"/>
                 <w:lang w:val="en-US"/>
               </w:rPr>
-              <w:t>{{</w:t>
-            </w:r>
-            <w:proofErr w:type="spellStart"/>
-            <w:r>
-              <w:rPr>
-                <w:spacing w:val="-2"/>
-                <w:lang w:val="en-US"/>
-              </w:rPr>
-              <w:t>no_urut</w:t>
+              <w:t>{{no_urut</w:t>
             </w:r>
             <w:r>
               <w:rPr>
@@ -1661,7 +1891,6 @@
               </w:rPr>
               <w:t>_satu</w:t>
             </w:r>
-            <w:proofErr w:type="spellEnd"/>
             <w:proofErr w:type="gramStart"/>
             <w:r>
               <w:rPr>
@@ -1681,8 +1910,16 @@
               <w:rPr>
                 <w:spacing w:val="-2"/>
               </w:rPr>
-              <w:t>…………………..</w:t>
-            </w:r>
+              <w:t>………………</w:t>
+            </w:r>
+            <w:proofErr w:type="gramStart"/>
+            <w:r>
+              <w:rPr>
+                <w:spacing w:val="-2"/>
+              </w:rPr>
+              <w:t>…..</w:t>
+            </w:r>
+            <w:proofErr w:type="gramEnd"/>
           </w:p>
         </w:tc>
       </w:tr>
@@ -1710,23 +1947,7 @@
                 <w:spacing w:val="-2"/>
                 <w:lang w:val="en-US"/>
               </w:rPr>
-              <w:t>{{</w:t>
-            </w:r>
-            <w:proofErr w:type="spellStart"/>
-            <w:r>
-              <w:rPr>
-                <w:spacing w:val="-2"/>
-                <w:lang w:val="en-US"/>
-              </w:rPr>
-              <w:t>no_urut_dua</w:t>
-            </w:r>
-            <w:proofErr w:type="spellEnd"/>
-            <w:r>
-              <w:rPr>
-                <w:spacing w:val="-2"/>
-                <w:lang w:val="en-US"/>
-              </w:rPr>
-              <w:t>}}</w:t>
+              <w:t>{{no_urut_dua}}</w:t>
             </w:r>
           </w:p>
         </w:tc>
@@ -1746,14 +1967,7 @@
               <w:rPr>
                 <w:lang w:val="en-US"/>
               </w:rPr>
-              <w:t>{{</w:t>
-            </w:r>
-            <w:proofErr w:type="spellStart"/>
-            <w:r>
-              <w:rPr>
-                <w:lang w:val="en-US"/>
-              </w:rPr>
-              <w:t>nama_petugas_</w:t>
+              <w:t>{{nama_petugas_</w:t>
             </w:r>
             <w:r>
               <w:rPr>
@@ -1761,7 +1975,6 @@
               </w:rPr>
               <w:t>dua</w:t>
             </w:r>
-            <w:proofErr w:type="spellEnd"/>
             <w:r>
               <w:rPr>
                 <w:lang w:val="en-US"/>
@@ -1790,21 +2003,7 @@
               <w:rPr>
                 <w:lang w:val="en-US"/>
               </w:rPr>
-              <w:t>NIP. {{</w:t>
-            </w:r>
-            <w:proofErr w:type="spellStart"/>
-            <w:r>
-              <w:rPr>
-                <w:lang w:val="en-US"/>
-              </w:rPr>
-              <w:t>nip_petugas_dua</w:t>
-            </w:r>
-            <w:proofErr w:type="spellEnd"/>
-            <w:r>
-              <w:rPr>
-                <w:lang w:val="en-US"/>
-              </w:rPr>
-              <w:t>}}</w:t>
+              <w:t>NIP. {{nip_petugas_dua}}</w:t>
             </w:r>
           </w:p>
         </w:tc>
@@ -1827,15 +2026,7 @@
                 <w:spacing w:val="-2"/>
                 <w:lang w:val="en-US"/>
               </w:rPr>
-              <w:t>{{</w:t>
-            </w:r>
-            <w:proofErr w:type="spellStart"/>
-            <w:r>
-              <w:rPr>
-                <w:spacing w:val="-2"/>
-                <w:lang w:val="en-US"/>
-              </w:rPr>
-              <w:t>no_urut_</w:t>
+              <w:t>{{no_urut_</w:t>
             </w:r>
             <w:r>
               <w:rPr>
@@ -1844,7 +2035,6 @@
               </w:rPr>
               <w:t>dua</w:t>
             </w:r>
-            <w:proofErr w:type="spellEnd"/>
             <w:proofErr w:type="gramStart"/>
             <w:r>
               <w:rPr>
@@ -1864,8 +2054,16 @@
               <w:rPr>
                 <w:spacing w:val="-2"/>
               </w:rPr>
-              <w:t>…………………..</w:t>
-            </w:r>
+              <w:t>………………</w:t>
+            </w:r>
+            <w:proofErr w:type="gramStart"/>
+            <w:r>
+              <w:rPr>
+                <w:spacing w:val="-2"/>
+              </w:rPr>
+              <w:t>…..</w:t>
+            </w:r>
+            <w:proofErr w:type="gramEnd"/>
           </w:p>
         </w:tc>
       </w:tr>
@@ -1893,23 +2091,7 @@
                 <w:spacing w:val="-2"/>
                 <w:lang w:val="en-US"/>
               </w:rPr>
-              <w:t>{{</w:t>
-            </w:r>
-            <w:proofErr w:type="spellStart"/>
-            <w:r>
-              <w:rPr>
-                <w:spacing w:val="-2"/>
-                <w:lang w:val="en-US"/>
-              </w:rPr>
-              <w:t>no_urut_tiga</w:t>
-            </w:r>
-            <w:proofErr w:type="spellEnd"/>
-            <w:r>
-              <w:rPr>
-                <w:spacing w:val="-2"/>
-                <w:lang w:val="en-US"/>
-              </w:rPr>
-              <w:t>}}</w:t>
+              <w:t>{{no_urut_tiga}}</w:t>
             </w:r>
           </w:p>
         </w:tc>
@@ -1929,14 +2111,7 @@
               <w:rPr>
                 <w:lang w:val="en-US"/>
               </w:rPr>
-              <w:t>{{</w:t>
-            </w:r>
-            <w:proofErr w:type="spellStart"/>
-            <w:r>
-              <w:rPr>
-                <w:lang w:val="en-US"/>
-              </w:rPr>
-              <w:t>nama_petugas_</w:t>
+              <w:t>{{nama_petugas_</w:t>
             </w:r>
             <w:r>
               <w:rPr>
@@ -1944,7 +2119,6 @@
               </w:rPr>
               <w:t>tiga</w:t>
             </w:r>
-            <w:proofErr w:type="spellEnd"/>
             <w:r>
               <w:rPr>
                 <w:lang w:val="en-US"/>
@@ -1973,21 +2147,7 @@
               <w:rPr>
                 <w:lang w:val="en-US"/>
               </w:rPr>
-              <w:t>NIP. {{</w:t>
-            </w:r>
-            <w:proofErr w:type="spellStart"/>
-            <w:r>
-              <w:rPr>
-                <w:lang w:val="en-US"/>
-              </w:rPr>
-              <w:t>nip_petugas_tiga</w:t>
-            </w:r>
-            <w:proofErr w:type="spellEnd"/>
-            <w:r>
-              <w:rPr>
-                <w:lang w:val="en-US"/>
-              </w:rPr>
-              <w:t>}}</w:t>
+              <w:t>NIP. {{nip_petugas_tiga}}</w:t>
             </w:r>
           </w:p>
         </w:tc>
@@ -2010,15 +2170,7 @@
                 <w:spacing w:val="-2"/>
                 <w:lang w:val="en-US"/>
               </w:rPr>
-              <w:t>{{</w:t>
-            </w:r>
-            <w:proofErr w:type="spellStart"/>
-            <w:r>
-              <w:rPr>
-                <w:spacing w:val="-2"/>
-                <w:lang w:val="en-US"/>
-              </w:rPr>
-              <w:t>no_urut_</w:t>
+              <w:t>{{no_urut_</w:t>
             </w:r>
             <w:r>
               <w:rPr>
@@ -2027,7 +2179,6 @@
               </w:rPr>
               <w:t>tiga</w:t>
             </w:r>
-            <w:proofErr w:type="spellEnd"/>
             <w:proofErr w:type="gramStart"/>
             <w:r>
               <w:rPr>
@@ -2047,8 +2198,16 @@
               <w:rPr>
                 <w:spacing w:val="-2"/>
               </w:rPr>
-              <w:t>…………………..</w:t>
-            </w:r>
+              <w:t>………………</w:t>
+            </w:r>
+            <w:proofErr w:type="gramStart"/>
+            <w:r>
+              <w:rPr>
+                <w:spacing w:val="-2"/>
+              </w:rPr>
+              <w:t>…..</w:t>
+            </w:r>
+            <w:proofErr w:type="gramEnd"/>
           </w:p>
         </w:tc>
       </w:tr>
@@ -2076,23 +2235,7 @@
                 <w:spacing w:val="-2"/>
                 <w:lang w:val="en-US"/>
               </w:rPr>
-              <w:t>{{</w:t>
-            </w:r>
-            <w:proofErr w:type="spellStart"/>
-            <w:r>
-              <w:rPr>
-                <w:spacing w:val="-2"/>
-                <w:lang w:val="en-US"/>
-              </w:rPr>
-              <w:t>no_urut_empat</w:t>
-            </w:r>
-            <w:proofErr w:type="spellEnd"/>
-            <w:r>
-              <w:rPr>
-                <w:spacing w:val="-2"/>
-                <w:lang w:val="en-US"/>
-              </w:rPr>
-              <w:t>}}</w:t>
+              <w:t>{{no_urut_empat}}</w:t>
             </w:r>
           </w:p>
         </w:tc>
@@ -2112,14 +2255,7 @@
               <w:rPr>
                 <w:lang w:val="en-US"/>
               </w:rPr>
-              <w:t>{{</w:t>
-            </w:r>
-            <w:proofErr w:type="spellStart"/>
-            <w:r>
-              <w:rPr>
-                <w:lang w:val="en-US"/>
-              </w:rPr>
-              <w:t>nama_petugas_</w:t>
+              <w:t>{{nama_petugas_</w:t>
             </w:r>
             <w:r>
               <w:rPr>
@@ -2127,7 +2263,6 @@
               </w:rPr>
               <w:t>empat</w:t>
             </w:r>
-            <w:proofErr w:type="spellEnd"/>
             <w:r>
               <w:rPr>
                 <w:lang w:val="en-US"/>
@@ -2156,21 +2291,7 @@
               <w:rPr>
                 <w:lang w:val="en-US"/>
               </w:rPr>
-              <w:t>NIP. {{</w:t>
-            </w:r>
-            <w:proofErr w:type="spellStart"/>
-            <w:r>
-              <w:rPr>
-                <w:lang w:val="en-US"/>
-              </w:rPr>
-              <w:t>nip_petugas_empat</w:t>
-            </w:r>
-            <w:proofErr w:type="spellEnd"/>
-            <w:r>
-              <w:rPr>
-                <w:lang w:val="en-US"/>
-              </w:rPr>
-              <w:t>}}</w:t>
+              <w:t>NIP. {{nip_petugas_empat}}</w:t>
             </w:r>
           </w:p>
         </w:tc>
@@ -2193,15 +2314,7 @@
                 <w:spacing w:val="-2"/>
                 <w:lang w:val="en-US"/>
               </w:rPr>
-              <w:t>{{</w:t>
-            </w:r>
-            <w:proofErr w:type="spellStart"/>
-            <w:r>
-              <w:rPr>
-                <w:spacing w:val="-2"/>
-                <w:lang w:val="en-US"/>
-              </w:rPr>
-              <w:t>no_urut_</w:t>
+              <w:t>{{no_urut_</w:t>
             </w:r>
             <w:r>
               <w:rPr>
@@ -2210,7 +2323,6 @@
               </w:rPr>
               <w:t>empat</w:t>
             </w:r>
-            <w:proofErr w:type="spellEnd"/>
             <w:proofErr w:type="gramStart"/>
             <w:r>
               <w:rPr>
@@ -2230,8 +2342,16 @@
               <w:rPr>
                 <w:spacing w:val="-2"/>
               </w:rPr>
-              <w:t>…………………..</w:t>
-            </w:r>
+              <w:t>………………</w:t>
+            </w:r>
+            <w:proofErr w:type="gramStart"/>
+            <w:r>
+              <w:rPr>
+                <w:spacing w:val="-2"/>
+              </w:rPr>
+              <w:t>…..</w:t>
+            </w:r>
+            <w:proofErr w:type="gramEnd"/>
           </w:p>
         </w:tc>
       </w:tr>
@@ -2259,23 +2379,7 @@
                 <w:spacing w:val="-2"/>
                 <w:lang w:val="en-US"/>
               </w:rPr>
-              <w:t>{{</w:t>
-            </w:r>
-            <w:proofErr w:type="spellStart"/>
-            <w:r>
-              <w:rPr>
-                <w:spacing w:val="-2"/>
-                <w:lang w:val="en-US"/>
-              </w:rPr>
-              <w:t>no_urut_lima</w:t>
-            </w:r>
-            <w:proofErr w:type="spellEnd"/>
-            <w:r>
-              <w:rPr>
-                <w:spacing w:val="-2"/>
-                <w:lang w:val="en-US"/>
-              </w:rPr>
-              <w:t>}}</w:t>
+              <w:t>{{no_urut_lima}}</w:t>
             </w:r>
           </w:p>
         </w:tc>
@@ -2295,14 +2399,7 @@
               <w:rPr>
                 <w:lang w:val="en-US"/>
               </w:rPr>
-              <w:t>{{</w:t>
-            </w:r>
-            <w:proofErr w:type="spellStart"/>
-            <w:r>
-              <w:rPr>
-                <w:lang w:val="en-US"/>
-              </w:rPr>
-              <w:t>nama_petugas_</w:t>
+              <w:t>{{nama_petugas_</w:t>
             </w:r>
             <w:r>
               <w:rPr>
@@ -2310,7 +2407,6 @@
               </w:rPr>
               <w:t>lima</w:t>
             </w:r>
-            <w:proofErr w:type="spellEnd"/>
             <w:r>
               <w:rPr>
                 <w:lang w:val="en-US"/>
@@ -2339,21 +2435,7 @@
               <w:rPr>
                 <w:lang w:val="en-US"/>
               </w:rPr>
-              <w:t>NIP. {{</w:t>
-            </w:r>
-            <w:proofErr w:type="spellStart"/>
-            <w:r>
-              <w:rPr>
-                <w:lang w:val="en-US"/>
-              </w:rPr>
-              <w:t>nip_petugas_lima</w:t>
-            </w:r>
-            <w:proofErr w:type="spellEnd"/>
-            <w:r>
-              <w:rPr>
-                <w:lang w:val="en-US"/>
-              </w:rPr>
-              <w:t>}}</w:t>
+              <w:t>NIP. {{nip_petugas_lima}}</w:t>
             </w:r>
           </w:p>
         </w:tc>
@@ -2376,15 +2458,7 @@
                 <w:spacing w:val="-2"/>
                 <w:lang w:val="en-US"/>
               </w:rPr>
-              <w:t>{{</w:t>
-            </w:r>
-            <w:proofErr w:type="spellStart"/>
-            <w:r>
-              <w:rPr>
-                <w:spacing w:val="-2"/>
-                <w:lang w:val="en-US"/>
-              </w:rPr>
-              <w:t>no_urut_</w:t>
+              <w:t>{{no_urut_</w:t>
             </w:r>
             <w:r>
               <w:rPr>
@@ -2393,7 +2467,6 @@
               </w:rPr>
               <w:t>lima</w:t>
             </w:r>
-            <w:proofErr w:type="spellEnd"/>
             <w:proofErr w:type="gramStart"/>
             <w:r>
               <w:rPr>
@@ -2413,8 +2486,16 @@
               <w:rPr>
                 <w:spacing w:val="-2"/>
               </w:rPr>
-              <w:t>…………………..</w:t>
-            </w:r>
+              <w:t>………………</w:t>
+            </w:r>
+            <w:proofErr w:type="gramStart"/>
+            <w:r>
+              <w:rPr>
+                <w:spacing w:val="-2"/>
+              </w:rPr>
+              <w:t>…..</w:t>
+            </w:r>
+            <w:proofErr w:type="gramEnd"/>
           </w:p>
         </w:tc>
       </w:tr>
@@ -2442,23 +2523,7 @@
                 <w:spacing w:val="-2"/>
                 <w:lang w:val="en-US"/>
               </w:rPr>
-              <w:t>{{</w:t>
-            </w:r>
-            <w:proofErr w:type="spellStart"/>
-            <w:r>
-              <w:rPr>
-                <w:spacing w:val="-2"/>
-                <w:lang w:val="en-US"/>
-              </w:rPr>
-              <w:t>no_urut_enam</w:t>
-            </w:r>
-            <w:proofErr w:type="spellEnd"/>
-            <w:r>
-              <w:rPr>
-                <w:spacing w:val="-2"/>
-                <w:lang w:val="en-US"/>
-              </w:rPr>
-              <w:t>}}</w:t>
+              <w:t>{{no_urut_enam}}</w:t>
             </w:r>
           </w:p>
         </w:tc>
@@ -2540,15 +2605,7 @@
                 <w:spacing w:val="-2"/>
                 <w:lang w:val="en-US"/>
               </w:rPr>
-              <w:t>{{</w:t>
-            </w:r>
-            <w:proofErr w:type="spellStart"/>
-            <w:r>
-              <w:rPr>
-                <w:spacing w:val="-2"/>
-                <w:lang w:val="en-US"/>
-              </w:rPr>
-              <w:t>no_urut_</w:t>
+              <w:t>{{no_urut_</w:t>
             </w:r>
             <w:r>
               <w:rPr>
@@ -2557,7 +2614,6 @@
               </w:rPr>
               <w:t>enam</w:t>
             </w:r>
-            <w:proofErr w:type="spellEnd"/>
             <w:proofErr w:type="gramStart"/>
             <w:r>
               <w:rPr>
@@ -2577,8 +2633,16 @@
               <w:rPr>
                 <w:spacing w:val="-2"/>
               </w:rPr>
-              <w:t>…………………..</w:t>
-            </w:r>
+              <w:t>………………</w:t>
+            </w:r>
+            <w:proofErr w:type="gramStart"/>
+            <w:r>
+              <w:rPr>
+                <w:spacing w:val="-2"/>
+              </w:rPr>
+              <w:t>…..</w:t>
+            </w:r>
+            <w:proofErr w:type="gramEnd"/>
           </w:p>
         </w:tc>
       </w:tr>
@@ -2606,23 +2670,7 @@
                 <w:spacing w:val="-2"/>
                 <w:lang w:val="en-US"/>
               </w:rPr>
-              <w:t>{{</w:t>
-            </w:r>
-            <w:proofErr w:type="spellStart"/>
-            <w:r>
-              <w:rPr>
-                <w:spacing w:val="-2"/>
-                <w:lang w:val="en-US"/>
-              </w:rPr>
-              <w:t>no_urut_tujuh</w:t>
-            </w:r>
-            <w:proofErr w:type="spellEnd"/>
-            <w:r>
-              <w:rPr>
-                <w:spacing w:val="-2"/>
-                <w:lang w:val="en-US"/>
-              </w:rPr>
-              <w:t>}}</w:t>
+              <w:t>{{no_urut_tujuh}}</w:t>
             </w:r>
           </w:p>
         </w:tc>
@@ -2642,14 +2690,7 @@
               <w:rPr>
                 <w:lang w:val="en-US"/>
               </w:rPr>
-              <w:t>{{</w:t>
-            </w:r>
-            <w:proofErr w:type="spellStart"/>
-            <w:r>
-              <w:rPr>
-                <w:lang w:val="en-US"/>
-              </w:rPr>
-              <w:t>nama_petugas_</w:t>
+              <w:t>{{nama_petugas_</w:t>
             </w:r>
             <w:r>
               <w:rPr>
@@ -2657,7 +2698,6 @@
               </w:rPr>
               <w:t>tujuh</w:t>
             </w:r>
-            <w:proofErr w:type="spellEnd"/>
             <w:r>
               <w:rPr>
                 <w:lang w:val="en-US"/>
@@ -2686,21 +2726,7 @@
               <w:rPr>
                 <w:lang w:val="en-US"/>
               </w:rPr>
-              <w:t>NIP. {{</w:t>
-            </w:r>
-            <w:proofErr w:type="spellStart"/>
-            <w:r>
-              <w:rPr>
-                <w:lang w:val="en-US"/>
-              </w:rPr>
-              <w:t>nip_petugas_tujuh</w:t>
-            </w:r>
-            <w:proofErr w:type="spellEnd"/>
-            <w:r>
-              <w:rPr>
-                <w:lang w:val="en-US"/>
-              </w:rPr>
-              <w:t>}}</w:t>
+              <w:t>NIP. {{nip_petugas_tujuh}}</w:t>
             </w:r>
           </w:p>
         </w:tc>
@@ -2723,15 +2749,7 @@
                 <w:spacing w:val="-2"/>
                 <w:lang w:val="en-US"/>
               </w:rPr>
-              <w:t>{{</w:t>
-            </w:r>
-            <w:proofErr w:type="spellStart"/>
-            <w:r>
-              <w:rPr>
-                <w:spacing w:val="-2"/>
-                <w:lang w:val="en-US"/>
-              </w:rPr>
-              <w:t>no_urut_</w:t>
+              <w:t>{{no_urut_</w:t>
             </w:r>
             <w:r>
               <w:rPr>
@@ -2740,7 +2758,6 @@
               </w:rPr>
               <w:t>tujuh</w:t>
             </w:r>
-            <w:proofErr w:type="spellEnd"/>
             <w:proofErr w:type="gramStart"/>
             <w:r>
               <w:rPr>
@@ -2760,8 +2777,16 @@
               <w:rPr>
                 <w:spacing w:val="-2"/>
               </w:rPr>
-              <w:t>…………………..</w:t>
-            </w:r>
+              <w:t>………………</w:t>
+            </w:r>
+            <w:proofErr w:type="gramStart"/>
+            <w:r>
+              <w:rPr>
+                <w:spacing w:val="-2"/>
+              </w:rPr>
+              <w:t>…..</w:t>
+            </w:r>
+            <w:proofErr w:type="gramEnd"/>
           </w:p>
         </w:tc>
       </w:tr>
@@ -2789,23 +2814,7 @@
                 <w:spacing w:val="-2"/>
                 <w:lang w:val="en-US"/>
               </w:rPr>
-              <w:t>{{</w:t>
-            </w:r>
-            <w:proofErr w:type="spellStart"/>
-            <w:r>
-              <w:rPr>
-                <w:spacing w:val="-2"/>
-                <w:lang w:val="en-US"/>
-              </w:rPr>
-              <w:t>no_urut_delapan</w:t>
-            </w:r>
-            <w:proofErr w:type="spellEnd"/>
-            <w:r>
-              <w:rPr>
-                <w:spacing w:val="-2"/>
-                <w:lang w:val="en-US"/>
-              </w:rPr>
-              <w:t>}}</w:t>
+              <w:t>{{no_urut_delapan}}</w:t>
             </w:r>
           </w:p>
         </w:tc>
@@ -2884,15 +2893,7 @@
                 <w:spacing w:val="-2"/>
                 <w:lang w:val="en-US"/>
               </w:rPr>
-              <w:t>{{</w:t>
-            </w:r>
-            <w:proofErr w:type="spellStart"/>
-            <w:r>
-              <w:rPr>
-                <w:spacing w:val="-2"/>
-                <w:lang w:val="en-US"/>
-              </w:rPr>
-              <w:t>no_urut_</w:t>
+              <w:t>{{no_urut_</w:t>
             </w:r>
             <w:r>
               <w:rPr>
@@ -2901,7 +2902,6 @@
               </w:rPr>
               <w:t>delapan</w:t>
             </w:r>
-            <w:proofErr w:type="spellEnd"/>
             <w:proofErr w:type="gramStart"/>
             <w:r>
               <w:rPr>
@@ -2921,8 +2921,16 @@
               <w:rPr>
                 <w:spacing w:val="-2"/>
               </w:rPr>
-              <w:t>…………………..</w:t>
-            </w:r>
+              <w:t>………………</w:t>
+            </w:r>
+            <w:proofErr w:type="gramStart"/>
+            <w:r>
+              <w:rPr>
+                <w:spacing w:val="-2"/>
+              </w:rPr>
+              <w:t>…..</w:t>
+            </w:r>
+            <w:proofErr w:type="gramEnd"/>
           </w:p>
         </w:tc>
       </w:tr>
@@ -2950,23 +2958,7 @@
                 <w:spacing w:val="-2"/>
                 <w:lang w:val="en-US"/>
               </w:rPr>
-              <w:t>{{</w:t>
-            </w:r>
-            <w:proofErr w:type="spellStart"/>
-            <w:r>
-              <w:rPr>
-                <w:spacing w:val="-2"/>
-                <w:lang w:val="en-US"/>
-              </w:rPr>
-              <w:t>no_urut_sembilan</w:t>
-            </w:r>
-            <w:proofErr w:type="spellEnd"/>
-            <w:r>
-              <w:rPr>
-                <w:spacing w:val="-2"/>
-                <w:lang w:val="en-US"/>
-              </w:rPr>
-              <w:t>}}</w:t>
+              <w:t>{{no_urut_sembilan}}</w:t>
             </w:r>
           </w:p>
         </w:tc>
@@ -2986,14 +2978,7 @@
               <w:rPr>
                 <w:lang w:val="en-US"/>
               </w:rPr>
-              <w:t>{{</w:t>
-            </w:r>
-            <w:proofErr w:type="spellStart"/>
-            <w:r>
-              <w:rPr>
-                <w:lang w:val="en-US"/>
-              </w:rPr>
-              <w:t>nama_petugas_</w:t>
+              <w:t>{{nama_petugas_</w:t>
             </w:r>
             <w:r>
               <w:rPr>
@@ -3001,7 +2986,6 @@
               </w:rPr>
               <w:t>sembilan</w:t>
             </w:r>
-            <w:proofErr w:type="spellEnd"/>
             <w:r>
               <w:rPr>
                 <w:lang w:val="en-US"/>
@@ -3030,21 +3014,7 @@
               <w:rPr>
                 <w:lang w:val="en-US"/>
               </w:rPr>
-              <w:t>NIP. {{</w:t>
-            </w:r>
-            <w:proofErr w:type="spellStart"/>
-            <w:r>
-              <w:rPr>
-                <w:lang w:val="en-US"/>
-              </w:rPr>
-              <w:t>nip_petugas_sembilan</w:t>
-            </w:r>
-            <w:proofErr w:type="spellEnd"/>
-            <w:r>
-              <w:rPr>
-                <w:lang w:val="en-US"/>
-              </w:rPr>
-              <w:t>}}</w:t>
+              <w:t>NIP. {{nip_petugas_sembilan}}</w:t>
             </w:r>
           </w:p>
         </w:tc>
@@ -3067,15 +3037,7 @@
                 <w:spacing w:val="-2"/>
                 <w:lang w:val="en-US"/>
               </w:rPr>
-              <w:t>{{</w:t>
-            </w:r>
-            <w:proofErr w:type="spellStart"/>
-            <w:r>
-              <w:rPr>
-                <w:spacing w:val="-2"/>
-                <w:lang w:val="en-US"/>
-              </w:rPr>
-              <w:t>no_urut_</w:t>
+              <w:t>{{no_urut_</w:t>
             </w:r>
             <w:r>
               <w:rPr>
@@ -3084,7 +3046,6 @@
               </w:rPr>
               <w:t>sembilan</w:t>
             </w:r>
-            <w:proofErr w:type="spellEnd"/>
             <w:proofErr w:type="gramStart"/>
             <w:r>
               <w:rPr>
@@ -3104,8 +3065,16 @@
               <w:rPr>
                 <w:spacing w:val="-2"/>
               </w:rPr>
-              <w:t>…………………..</w:t>
-            </w:r>
+              <w:t>………………</w:t>
+            </w:r>
+            <w:proofErr w:type="gramStart"/>
+            <w:r>
+              <w:rPr>
+                <w:spacing w:val="-2"/>
+              </w:rPr>
+              <w:t>…..</w:t>
+            </w:r>
+            <w:proofErr w:type="gramEnd"/>
           </w:p>
         </w:tc>
       </w:tr>
@@ -3133,23 +3102,7 @@
                 <w:spacing w:val="-2"/>
                 <w:lang w:val="en-US"/>
               </w:rPr>
-              <w:t>{{</w:t>
-            </w:r>
-            <w:proofErr w:type="spellStart"/>
-            <w:r>
-              <w:rPr>
-                <w:spacing w:val="-2"/>
-                <w:lang w:val="en-US"/>
-              </w:rPr>
-              <w:t>no_urut_sepuluh</w:t>
-            </w:r>
-            <w:proofErr w:type="spellEnd"/>
-            <w:r>
-              <w:rPr>
-                <w:spacing w:val="-2"/>
-                <w:lang w:val="en-US"/>
-              </w:rPr>
-              <w:t>}}</w:t>
+              <w:t>{{no_urut_sepuluh}}</w:t>
             </w:r>
           </w:p>
         </w:tc>
@@ -3169,14 +3122,7 @@
               <w:rPr>
                 <w:lang w:val="en-US"/>
               </w:rPr>
-              <w:t>{{</w:t>
-            </w:r>
-            <w:proofErr w:type="spellStart"/>
-            <w:r>
-              <w:rPr>
-                <w:lang w:val="en-US"/>
-              </w:rPr>
-              <w:t>nama_petugas_s</w:t>
+              <w:t>{{nama_petugas_s</w:t>
             </w:r>
             <w:r>
               <w:rPr>
@@ -3184,7 +3130,6 @@
               </w:rPr>
               <w:t>epuluh</w:t>
             </w:r>
-            <w:proofErr w:type="spellEnd"/>
             <w:r>
               <w:rPr>
                 <w:lang w:val="en-US"/>
@@ -3213,21 +3158,7 @@
               <w:rPr>
                 <w:lang w:val="en-US"/>
               </w:rPr>
-              <w:t>NIP. {{</w:t>
-            </w:r>
-            <w:proofErr w:type="spellStart"/>
-            <w:r>
-              <w:rPr>
-                <w:lang w:val="en-US"/>
-              </w:rPr>
-              <w:t>nip_petugas_sepuluh</w:t>
-            </w:r>
-            <w:proofErr w:type="spellEnd"/>
-            <w:r>
-              <w:rPr>
-                <w:lang w:val="en-US"/>
-              </w:rPr>
-              <w:t>}}</w:t>
+              <w:t>NIP. {{nip_petugas_sepuluh}}</w:t>
             </w:r>
           </w:p>
         </w:tc>
@@ -3250,15 +3181,7 @@
                 <w:spacing w:val="-2"/>
                 <w:lang w:val="en-US"/>
               </w:rPr>
-              <w:t>{{</w:t>
-            </w:r>
-            <w:proofErr w:type="spellStart"/>
-            <w:r>
-              <w:rPr>
-                <w:spacing w:val="-2"/>
-                <w:lang w:val="en-US"/>
-              </w:rPr>
-              <w:t>no_urut_s</w:t>
+              <w:t>{{no_urut_s</w:t>
             </w:r>
             <w:r>
               <w:rPr>
@@ -3267,7 +3190,6 @@
               </w:rPr>
               <w:t>epuluh</w:t>
             </w:r>
-            <w:proofErr w:type="spellEnd"/>
             <w:proofErr w:type="gramStart"/>
             <w:r>
               <w:rPr>
@@ -3287,8 +3209,16 @@
               <w:rPr>
                 <w:spacing w:val="-2"/>
               </w:rPr>
-              <w:t>…………………..</w:t>
-            </w:r>
+              <w:t>………………</w:t>
+            </w:r>
+            <w:proofErr w:type="gramStart"/>
+            <w:r>
+              <w:rPr>
+                <w:spacing w:val="-2"/>
+              </w:rPr>
+              <w:t>…..</w:t>
+            </w:r>
+            <w:proofErr w:type="gramEnd"/>
           </w:p>
         </w:tc>
       </w:tr>
@@ -3297,9 +3227,8 @@
       <w:pPr>
         <w:pStyle w:val="TableParagraph"/>
         <w:sectPr>
-          <w:headerReference w:type="first" r:id="rId13"/>
           <w:pgSz w:w="12240" w:h="20160"/>
-          <w:pgMar w:top="1420" w:right="1080" w:bottom="280" w:left="1080" w:header="720" w:footer="720" w:gutter="0"/>
+          <w:pgMar w:top="1418" w:right="1077" w:bottom="1418" w:left="1077" w:header="720" w:footer="720" w:gutter="0"/>
           <w:cols w:space="720"/>
           <w:titlePg/>
           <w:docGrid w:linePitch="299"/>
@@ -3390,21 +3319,7 @@
               <w:rPr>
                 <w:lang w:val="en-US"/>
               </w:rPr>
-              <w:t>{{</w:t>
-            </w:r>
-            <w:proofErr w:type="spellStart"/>
-            <w:r>
-              <w:rPr>
-                <w:lang w:val="en-US"/>
-              </w:rPr>
-              <w:t>foto_dokumentasi_satu</w:t>
-            </w:r>
-            <w:proofErr w:type="spellEnd"/>
-            <w:r>
-              <w:rPr>
-                <w:lang w:val="en-US"/>
-              </w:rPr>
-              <w:t>}}</w:t>
+              <w:t>{{foto_dokumentasi_satu}}</w:t>
             </w:r>
           </w:p>
         </w:tc>
@@ -3431,21 +3346,7 @@
               <w:rPr>
                 <w:lang w:val="en-US"/>
               </w:rPr>
-              <w:t>{{</w:t>
-            </w:r>
-            <w:proofErr w:type="spellStart"/>
-            <w:r>
-              <w:rPr>
-                <w:lang w:val="en-US"/>
-              </w:rPr>
-              <w:t>foto_dokumentasi_dua</w:t>
-            </w:r>
-            <w:proofErr w:type="spellEnd"/>
-            <w:r>
-              <w:rPr>
-                <w:lang w:val="en-US"/>
-              </w:rPr>
-              <w:t>}}</w:t>
+              <w:t>{{foto_dokumentasi_dua}}</w:t>
             </w:r>
           </w:p>
         </w:tc>
@@ -3472,21 +3373,7 @@
               <w:rPr>
                 <w:lang w:val="en-US"/>
               </w:rPr>
-              <w:t>{{</w:t>
-            </w:r>
-            <w:proofErr w:type="spellStart"/>
-            <w:r>
-              <w:rPr>
-                <w:lang w:val="en-US"/>
-              </w:rPr>
-              <w:t>foto_dokumentasi_tiga</w:t>
-            </w:r>
-            <w:proofErr w:type="spellEnd"/>
-            <w:r>
-              <w:rPr>
-                <w:lang w:val="en-US"/>
-              </w:rPr>
-              <w:t>}}</w:t>
+              <w:t>{{foto_dokumentasi_tiga}}</w:t>
             </w:r>
           </w:p>
         </w:tc>
@@ -3525,21 +3412,7 @@
               <w:rPr>
                 <w:lang w:val="en-US"/>
               </w:rPr>
-              <w:t>{{</w:t>
-            </w:r>
-            <w:proofErr w:type="spellStart"/>
-            <w:r>
-              <w:rPr>
-                <w:lang w:val="en-US"/>
-              </w:rPr>
-              <w:t>foto_dokumentasi_empat</w:t>
-            </w:r>
-            <w:proofErr w:type="spellEnd"/>
-            <w:r>
-              <w:rPr>
-                <w:lang w:val="en-US"/>
-              </w:rPr>
-              <w:t>}}</w:t>
+              <w:t>{{foto_dokumentasi_empat}}</w:t>
             </w:r>
           </w:p>
         </w:tc>
@@ -5773,17 +5646,19 @@
       </w:pPr>
     </w:p>
     <w:sectPr>
-      <w:headerReference w:type="default" r:id="rId14"/>
+      <w:headerReference w:type="default" r:id="rId9"/>
       <w:pgSz w:w="12240" w:h="20160"/>
       <w:pgMar w:top="1480" w:right="1080" w:bottom="280" w:left="1080" w:header="1245" w:footer="0" w:gutter="0"/>
       <w:cols w:space="720"/>
+      <w:titlePg/>
+      <w:docGrid w:linePitch="299"/>
     </w:sectPr>
   </w:body>
 </w:document>
 </file>
 
 <file path=word/endnotes.xml><?xml version="1.0" encoding="utf-8"?>
-<w:endnotes xmlns:wpc="http://schemas.microsoft.com/office/word/2010/wordprocessingCanvas" xmlns:cx="http://schemas.microsoft.com/office/drawing/2014/chartex" xmlns:cx1="http://schemas.microsoft.com/office/drawing/2015/9/8/chartex" xmlns:cx2="http://schemas.microsoft.com/office/drawing/2015/10/21/chartex" xmlns:cx3="http://schemas.microsoft.com/office/drawing/2016/5/9/chartex" xmlns:cx4="http://schemas.microsoft.com/office/drawing/2016/5/10/chartex" xmlns:cx5="http://schemas.microsoft.com/office/drawing/2016/5/11/chartex" xmlns:cx6="http://schemas.microsoft.com/office/drawing/2016/5/12/chartex" xmlns:cx7="http://schemas.microsoft.com/office/drawing/2016/5/13/chartex" xmlns:cx8="http://schemas.microsoft.com/office/drawing/2016/5/14/chartex" xmlns:mc="http://schemas.openxmlformats.org/markup-compatibility/2006" xmlns:aink="http://schemas.microsoft.com/office/drawing/2016/ink" xmlns:am3d="http://schemas.microsoft.com/office/drawing/2017/model3d" xmlns:o="urn:schemas-microsoft-com:office:office" xmlns:oel="http://schemas.microsoft.com/office/2019/extlst" xmlns:r="http://schemas.openxmlformats.org/officeDocument/2006/relationships" xmlns:m="http://schemas.openxmlformats.org/officeDocument/2006/math" xmlns:v="urn:schemas-microsoft-com:vml" xmlns:wp14="http://schemas.microsoft.com/office/word/2010/wordprocessingDrawing" xmlns:wp="http://schemas.openxmlformats.org/drawingml/2006/wordprocessingDrawing" xmlns:w10="urn:schemas-microsoft-com:office:word" xmlns:w="http://schemas.openxmlformats.org/wordprocessingml/2006/main" xmlns:w14="http://schemas.microsoft.com/office/word/2010/wordml" xmlns:w15="http://schemas.microsoft.com/office/word/2012/wordml" xmlns:w16cex="http://schemas.microsoft.com/office/word/2018/wordml/cex" xmlns:w16cid="http://schemas.microsoft.com/office/word/2016/wordml/cid" xmlns:w16="http://schemas.microsoft.com/office/word/2018/wordml" xmlns:w16sdtdh="http://schemas.microsoft.com/office/word/2020/wordml/sdtdatahash" xmlns:w16se="http://schemas.microsoft.com/office/word/2015/wordml/symex" xmlns:wpg="http://schemas.microsoft.com/office/word/2010/wordprocessingGroup" xmlns:wpi="http://schemas.microsoft.com/office/word/2010/wordprocessingInk" xmlns:wne="http://schemas.microsoft.com/office/word/2006/wordml" xmlns:wps="http://schemas.microsoft.com/office/word/2010/wordprocessingShape" mc:Ignorable="w14 w15 w16se w16cid w16 w16cex w16sdtdh wp14">
+<w:endnotes xmlns:wpc="http://schemas.microsoft.com/office/word/2010/wordprocessingCanvas" xmlns:cx="http://schemas.microsoft.com/office/drawing/2014/chartex" xmlns:cx1="http://schemas.microsoft.com/office/drawing/2015/9/8/chartex" xmlns:cx2="http://schemas.microsoft.com/office/drawing/2015/10/21/chartex" xmlns:cx3="http://schemas.microsoft.com/office/drawing/2016/5/9/chartex" xmlns:cx4="http://schemas.microsoft.com/office/drawing/2016/5/10/chartex" xmlns:cx5="http://schemas.microsoft.com/office/drawing/2016/5/11/chartex" xmlns:cx6="http://schemas.microsoft.com/office/drawing/2016/5/12/chartex" xmlns:cx7="http://schemas.microsoft.com/office/drawing/2016/5/13/chartex" xmlns:cx8="http://schemas.microsoft.com/office/drawing/2016/5/14/chartex" xmlns:mc="http://schemas.openxmlformats.org/markup-compatibility/2006" xmlns:aink="http://schemas.microsoft.com/office/drawing/2016/ink" xmlns:am3d="http://schemas.microsoft.com/office/drawing/2017/model3d" xmlns:o="urn:schemas-microsoft-com:office:office" xmlns:oel="http://schemas.microsoft.com/office/2019/extlst" xmlns:r="http://schemas.openxmlformats.org/officeDocument/2006/relationships" xmlns:m="http://schemas.openxmlformats.org/officeDocument/2006/math" xmlns:v="urn:schemas-microsoft-com:vml" xmlns:wp14="http://schemas.microsoft.com/office/word/2010/wordprocessingDrawing" xmlns:wp="http://schemas.openxmlformats.org/drawingml/2006/wordprocessingDrawing" xmlns:w10="urn:schemas-microsoft-com:office:word" xmlns:w="http://schemas.openxmlformats.org/wordprocessingml/2006/main" xmlns:w14="http://schemas.microsoft.com/office/word/2010/wordml" xmlns:w15="http://schemas.microsoft.com/office/word/2012/wordml" xmlns:w16cex="http://schemas.microsoft.com/office/word/2018/wordml/cex" xmlns:w16cid="http://schemas.microsoft.com/office/word/2016/wordml/cid" xmlns:w16="http://schemas.microsoft.com/office/word/2018/wordml" xmlns:w16du="http://schemas.microsoft.com/office/word/2023/wordml/word16du" xmlns:w16sdtdh="http://schemas.microsoft.com/office/word/2020/wordml/sdtdatahash" xmlns:w16sdtfl="http://schemas.microsoft.com/office/word/2024/wordml/sdtformatlock" xmlns:w16se="http://schemas.microsoft.com/office/word/2015/wordml/symex" xmlns:wpg="http://schemas.microsoft.com/office/word/2010/wordprocessingGroup" xmlns:wpi="http://schemas.microsoft.com/office/word/2010/wordprocessingInk" xmlns:wne="http://schemas.microsoft.com/office/word/2006/wordml" xmlns:wps="http://schemas.microsoft.com/office/word/2010/wordprocessingShape" mc:Ignorable="w14 w15 w16se w16cid w16 w16cex w16sdtdh w16sdtfl w16du wp14">
   <w:endnote w:type="separator" w:id="-1">
     <w:p>
       <w:r>
@@ -5801,38 +5676,8 @@
 </w:endnotes>
 </file>
 
-<file path=word/footer1.xml><?xml version="1.0" encoding="utf-8"?>
-<w:ftr xmlns:wpc="http://schemas.microsoft.com/office/word/2010/wordprocessingCanvas" xmlns:cx="http://schemas.microsoft.com/office/drawing/2014/chartex" xmlns:cx1="http://schemas.microsoft.com/office/drawing/2015/9/8/chartex" xmlns:cx2="http://schemas.microsoft.com/office/drawing/2015/10/21/chartex" xmlns:cx3="http://schemas.microsoft.com/office/drawing/2016/5/9/chartex" xmlns:cx4="http://schemas.microsoft.com/office/drawing/2016/5/10/chartex" xmlns:cx5="http://schemas.microsoft.com/office/drawing/2016/5/11/chartex" xmlns:cx6="http://schemas.microsoft.com/office/drawing/2016/5/12/chartex" xmlns:cx7="http://schemas.microsoft.com/office/drawing/2016/5/13/chartex" xmlns:cx8="http://schemas.microsoft.com/office/drawing/2016/5/14/chartex" xmlns:mc="http://schemas.openxmlformats.org/markup-compatibility/2006" xmlns:aink="http://schemas.microsoft.com/office/drawing/2016/ink" xmlns:am3d="http://schemas.microsoft.com/office/drawing/2017/model3d" xmlns:o="urn:schemas-microsoft-com:office:office" xmlns:oel="http://schemas.microsoft.com/office/2019/extlst" xmlns:r="http://schemas.openxmlformats.org/officeDocument/2006/relationships" xmlns:m="http://schemas.openxmlformats.org/officeDocument/2006/math" xmlns:v="urn:schemas-microsoft-com:vml" xmlns:wp14="http://schemas.microsoft.com/office/word/2010/wordprocessingDrawing" xmlns:wp="http://schemas.openxmlformats.org/drawingml/2006/wordprocessingDrawing" xmlns:w10="urn:schemas-microsoft-com:office:word" xmlns:w="http://schemas.openxmlformats.org/wordprocessingml/2006/main" xmlns:w14="http://schemas.microsoft.com/office/word/2010/wordml" xmlns:w15="http://schemas.microsoft.com/office/word/2012/wordml" xmlns:w16cex="http://schemas.microsoft.com/office/word/2018/wordml/cex" xmlns:w16cid="http://schemas.microsoft.com/office/word/2016/wordml/cid" xmlns:w16="http://schemas.microsoft.com/office/word/2018/wordml" xmlns:w16sdtdh="http://schemas.microsoft.com/office/word/2020/wordml/sdtdatahash" xmlns:w16se="http://schemas.microsoft.com/office/word/2015/wordml/symex" xmlns:wpg="http://schemas.microsoft.com/office/word/2010/wordprocessingGroup" xmlns:wpi="http://schemas.microsoft.com/office/word/2010/wordprocessingInk" xmlns:wne="http://schemas.microsoft.com/office/word/2006/wordml" xmlns:wps="http://schemas.microsoft.com/office/word/2010/wordprocessingShape" mc:Ignorable="w14 w15 w16se w16cid w16 w16cex w16sdtdh wp14">
-  <w:p>
-    <w:pPr>
-      <w:pStyle w:val="Footer"/>
-    </w:pPr>
-  </w:p>
-</w:ftr>
-</file>
-
-<file path=word/footer2.xml><?xml version="1.0" encoding="utf-8"?>
-<w:ftr xmlns:wpc="http://schemas.microsoft.com/office/word/2010/wordprocessingCanvas" xmlns:cx="http://schemas.microsoft.com/office/drawing/2014/chartex" xmlns:cx1="http://schemas.microsoft.com/office/drawing/2015/9/8/chartex" xmlns:cx2="http://schemas.microsoft.com/office/drawing/2015/10/21/chartex" xmlns:cx3="http://schemas.microsoft.com/office/drawing/2016/5/9/chartex" xmlns:cx4="http://schemas.microsoft.com/office/drawing/2016/5/10/chartex" xmlns:cx5="http://schemas.microsoft.com/office/drawing/2016/5/11/chartex" xmlns:cx6="http://schemas.microsoft.com/office/drawing/2016/5/12/chartex" xmlns:cx7="http://schemas.microsoft.com/office/drawing/2016/5/13/chartex" xmlns:cx8="http://schemas.microsoft.com/office/drawing/2016/5/14/chartex" xmlns:mc="http://schemas.openxmlformats.org/markup-compatibility/2006" xmlns:aink="http://schemas.microsoft.com/office/drawing/2016/ink" xmlns:am3d="http://schemas.microsoft.com/office/drawing/2017/model3d" xmlns:o="urn:schemas-microsoft-com:office:office" xmlns:oel="http://schemas.microsoft.com/office/2019/extlst" xmlns:r="http://schemas.openxmlformats.org/officeDocument/2006/relationships" xmlns:m="http://schemas.openxmlformats.org/officeDocument/2006/math" xmlns:v="urn:schemas-microsoft-com:vml" xmlns:wp14="http://schemas.microsoft.com/office/word/2010/wordprocessingDrawing" xmlns:wp="http://schemas.openxmlformats.org/drawingml/2006/wordprocessingDrawing" xmlns:w10="urn:schemas-microsoft-com:office:word" xmlns:w="http://schemas.openxmlformats.org/wordprocessingml/2006/main" xmlns:w14="http://schemas.microsoft.com/office/word/2010/wordml" xmlns:w15="http://schemas.microsoft.com/office/word/2012/wordml" xmlns:w16cex="http://schemas.microsoft.com/office/word/2018/wordml/cex" xmlns:w16cid="http://schemas.microsoft.com/office/word/2016/wordml/cid" xmlns:w16="http://schemas.microsoft.com/office/word/2018/wordml" xmlns:w16sdtdh="http://schemas.microsoft.com/office/word/2020/wordml/sdtdatahash" xmlns:w16se="http://schemas.microsoft.com/office/word/2015/wordml/symex" xmlns:wpg="http://schemas.microsoft.com/office/word/2010/wordprocessingGroup" xmlns:wpi="http://schemas.microsoft.com/office/word/2010/wordprocessingInk" xmlns:wne="http://schemas.microsoft.com/office/word/2006/wordml" xmlns:wps="http://schemas.microsoft.com/office/word/2010/wordprocessingShape" mc:Ignorable="w14 w15 w16se w16cid w16 w16cex w16sdtdh wp14">
-  <w:p>
-    <w:pPr>
-      <w:pStyle w:val="Footer"/>
-    </w:pPr>
-  </w:p>
-</w:ftr>
-</file>
-
-<file path=word/footer3.xml><?xml version="1.0" encoding="utf-8"?>
-<w:ftr xmlns:wpc="http://schemas.microsoft.com/office/word/2010/wordprocessingCanvas" xmlns:cx="http://schemas.microsoft.com/office/drawing/2014/chartex" xmlns:cx1="http://schemas.microsoft.com/office/drawing/2015/9/8/chartex" xmlns:cx2="http://schemas.microsoft.com/office/drawing/2015/10/21/chartex" xmlns:cx3="http://schemas.microsoft.com/office/drawing/2016/5/9/chartex" xmlns:cx4="http://schemas.microsoft.com/office/drawing/2016/5/10/chartex" xmlns:cx5="http://schemas.microsoft.com/office/drawing/2016/5/11/chartex" xmlns:cx6="http://schemas.microsoft.com/office/drawing/2016/5/12/chartex" xmlns:cx7="http://schemas.microsoft.com/office/drawing/2016/5/13/chartex" xmlns:cx8="http://schemas.microsoft.com/office/drawing/2016/5/14/chartex" xmlns:mc="http://schemas.openxmlformats.org/markup-compatibility/2006" xmlns:aink="http://schemas.microsoft.com/office/drawing/2016/ink" xmlns:am3d="http://schemas.microsoft.com/office/drawing/2017/model3d" xmlns:o="urn:schemas-microsoft-com:office:office" xmlns:oel="http://schemas.microsoft.com/office/2019/extlst" xmlns:r="http://schemas.openxmlformats.org/officeDocument/2006/relationships" xmlns:m="http://schemas.openxmlformats.org/officeDocument/2006/math" xmlns:v="urn:schemas-microsoft-com:vml" xmlns:wp14="http://schemas.microsoft.com/office/word/2010/wordprocessingDrawing" xmlns:wp="http://schemas.openxmlformats.org/drawingml/2006/wordprocessingDrawing" xmlns:w10="urn:schemas-microsoft-com:office:word" xmlns:w="http://schemas.openxmlformats.org/wordprocessingml/2006/main" xmlns:w14="http://schemas.microsoft.com/office/word/2010/wordml" xmlns:w15="http://schemas.microsoft.com/office/word/2012/wordml" xmlns:w16cex="http://schemas.microsoft.com/office/word/2018/wordml/cex" xmlns:w16cid="http://schemas.microsoft.com/office/word/2016/wordml/cid" xmlns:w16="http://schemas.microsoft.com/office/word/2018/wordml" xmlns:w16sdtdh="http://schemas.microsoft.com/office/word/2020/wordml/sdtdatahash" xmlns:w16se="http://schemas.microsoft.com/office/word/2015/wordml/symex" xmlns:wpg="http://schemas.microsoft.com/office/word/2010/wordprocessingGroup" xmlns:wpi="http://schemas.microsoft.com/office/word/2010/wordprocessingInk" xmlns:wne="http://schemas.microsoft.com/office/word/2006/wordml" xmlns:wps="http://schemas.microsoft.com/office/word/2010/wordprocessingShape" mc:Ignorable="w14 w15 w16se w16cid w16 w16cex w16sdtdh wp14">
-  <w:p>
-    <w:pPr>
-      <w:pStyle w:val="Footer"/>
-    </w:pPr>
-  </w:p>
-</w:ftr>
-</file>
-
 <file path=word/footnotes.xml><?xml version="1.0" encoding="utf-8"?>
-<w:footnotes xmlns:wpc="http://schemas.microsoft.com/office/word/2010/wordprocessingCanvas" xmlns:cx="http://schemas.microsoft.com/office/drawing/2014/chartex" xmlns:cx1="http://schemas.microsoft.com/office/drawing/2015/9/8/chartex" xmlns:cx2="http://schemas.microsoft.com/office/drawing/2015/10/21/chartex" xmlns:cx3="http://schemas.microsoft.com/office/drawing/2016/5/9/chartex" xmlns:cx4="http://schemas.microsoft.com/office/drawing/2016/5/10/chartex" xmlns:cx5="http://schemas.microsoft.com/office/drawing/2016/5/11/chartex" xmlns:cx6="http://schemas.microsoft.com/office/drawing/2016/5/12/chartex" xmlns:cx7="http://schemas.microsoft.com/office/drawing/2016/5/13/chartex" xmlns:cx8="http://schemas.microsoft.com/office/drawing/2016/5/14/chartex" xmlns:mc="http://schemas.openxmlformats.org/markup-compatibility/2006" xmlns:aink="http://schemas.microsoft.com/office/drawing/2016/ink" xmlns:am3d="http://schemas.microsoft.com/office/drawing/2017/model3d" xmlns:o="urn:schemas-microsoft-com:office:office" xmlns:oel="http://schemas.microsoft.com/office/2019/extlst" xmlns:r="http://schemas.openxmlformats.org/officeDocument/2006/relationships" xmlns:m="http://schemas.openxmlformats.org/officeDocument/2006/math" xmlns:v="urn:schemas-microsoft-com:vml" xmlns:wp14="http://schemas.microsoft.com/office/word/2010/wordprocessingDrawing" xmlns:wp="http://schemas.openxmlformats.org/drawingml/2006/wordprocessingDrawing" xmlns:w10="urn:schemas-microsoft-com:office:word" xmlns:w="http://schemas.openxmlformats.org/wordprocessingml/2006/main" xmlns:w14="http://schemas.microsoft.com/office/word/2010/wordml" xmlns:w15="http://schemas.microsoft.com/office/word/2012/wordml" xmlns:w16cex="http://schemas.microsoft.com/office/word/2018/wordml/cex" xmlns:w16cid="http://schemas.microsoft.com/office/word/2016/wordml/cid" xmlns:w16="http://schemas.microsoft.com/office/word/2018/wordml" xmlns:w16sdtdh="http://schemas.microsoft.com/office/word/2020/wordml/sdtdatahash" xmlns:w16se="http://schemas.microsoft.com/office/word/2015/wordml/symex" xmlns:wpg="http://schemas.microsoft.com/office/word/2010/wordprocessingGroup" xmlns:wpi="http://schemas.microsoft.com/office/word/2010/wordprocessingInk" xmlns:wne="http://schemas.microsoft.com/office/word/2006/wordml" xmlns:wps="http://schemas.microsoft.com/office/word/2010/wordprocessingShape" mc:Ignorable="w14 w15 w16se w16cid w16 w16cex w16sdtdh wp14">
+<w:footnotes xmlns:wpc="http://schemas.microsoft.com/office/word/2010/wordprocessingCanvas" xmlns:cx="http://schemas.microsoft.com/office/drawing/2014/chartex" xmlns:cx1="http://schemas.microsoft.com/office/drawing/2015/9/8/chartex" xmlns:cx2="http://schemas.microsoft.com/office/drawing/2015/10/21/chartex" xmlns:cx3="http://schemas.microsoft.com/office/drawing/2016/5/9/chartex" xmlns:cx4="http://schemas.microsoft.com/office/drawing/2016/5/10/chartex" xmlns:cx5="http://schemas.microsoft.com/office/drawing/2016/5/11/chartex" xmlns:cx6="http://schemas.microsoft.com/office/drawing/2016/5/12/chartex" xmlns:cx7="http://schemas.microsoft.com/office/drawing/2016/5/13/chartex" xmlns:cx8="http://schemas.microsoft.com/office/drawing/2016/5/14/chartex" xmlns:mc="http://schemas.openxmlformats.org/markup-compatibility/2006" xmlns:aink="http://schemas.microsoft.com/office/drawing/2016/ink" xmlns:am3d="http://schemas.microsoft.com/office/drawing/2017/model3d" xmlns:o="urn:schemas-microsoft-com:office:office" xmlns:oel="http://schemas.microsoft.com/office/2019/extlst" xmlns:r="http://schemas.openxmlformats.org/officeDocument/2006/relationships" xmlns:m="http://schemas.openxmlformats.org/officeDocument/2006/math" xmlns:v="urn:schemas-microsoft-com:vml" xmlns:wp14="http://schemas.microsoft.com/office/word/2010/wordprocessingDrawing" xmlns:wp="http://schemas.openxmlformats.org/drawingml/2006/wordprocessingDrawing" xmlns:w10="urn:schemas-microsoft-com:office:word" xmlns:w="http://schemas.openxmlformats.org/wordprocessingml/2006/main" xmlns:w14="http://schemas.microsoft.com/office/word/2010/wordml" xmlns:w15="http://schemas.microsoft.com/office/word/2012/wordml" xmlns:w16cex="http://schemas.microsoft.com/office/word/2018/wordml/cex" xmlns:w16cid="http://schemas.microsoft.com/office/word/2016/wordml/cid" xmlns:w16="http://schemas.microsoft.com/office/word/2018/wordml" xmlns:w16du="http://schemas.microsoft.com/office/word/2023/wordml/word16du" xmlns:w16sdtdh="http://schemas.microsoft.com/office/word/2020/wordml/sdtdatahash" xmlns:w16sdtfl="http://schemas.microsoft.com/office/word/2024/wordml/sdtformatlock" xmlns:w16se="http://schemas.microsoft.com/office/word/2015/wordml/symex" xmlns:wpg="http://schemas.microsoft.com/office/word/2010/wordprocessingGroup" xmlns:wpi="http://schemas.microsoft.com/office/word/2010/wordprocessingInk" xmlns:wne="http://schemas.microsoft.com/office/word/2006/wordml" xmlns:wps="http://schemas.microsoft.com/office/word/2010/wordprocessingShape" mc:Ignorable="w14 w15 w16se w16cid w16 w16cex w16sdtdh w16sdtfl w16du wp14">
   <w:footnote w:type="separator" w:id="-1">
     <w:p>
       <w:r>
@@ -5851,302 +5696,7 @@
 </file>
 
 <file path=word/header1.xml><?xml version="1.0" encoding="utf-8"?>
-<w:hdr xmlns:wpc="http://schemas.microsoft.com/office/word/2010/wordprocessingCanvas" xmlns:cx="http://schemas.microsoft.com/office/drawing/2014/chartex" xmlns:cx1="http://schemas.microsoft.com/office/drawing/2015/9/8/chartex" xmlns:cx2="http://schemas.microsoft.com/office/drawing/2015/10/21/chartex" xmlns:cx3="http://schemas.microsoft.com/office/drawing/2016/5/9/chartex" xmlns:cx4="http://schemas.microsoft.com/office/drawing/2016/5/10/chartex" xmlns:cx5="http://schemas.microsoft.com/office/drawing/2016/5/11/chartex" xmlns:cx6="http://schemas.microsoft.com/office/drawing/2016/5/12/chartex" xmlns:cx7="http://schemas.microsoft.com/office/drawing/2016/5/13/chartex" xmlns:cx8="http://schemas.microsoft.com/office/drawing/2016/5/14/chartex" xmlns:mc="http://schemas.openxmlformats.org/markup-compatibility/2006" xmlns:aink="http://schemas.microsoft.com/office/drawing/2016/ink" xmlns:am3d="http://schemas.microsoft.com/office/drawing/2017/model3d" xmlns:o="urn:schemas-microsoft-com:office:office" xmlns:oel="http://schemas.microsoft.com/office/2019/extlst" xmlns:r="http://schemas.openxmlformats.org/officeDocument/2006/relationships" xmlns:m="http://schemas.openxmlformats.org/officeDocument/2006/math" xmlns:v="urn:schemas-microsoft-com:vml" xmlns:wp14="http://schemas.microsoft.com/office/word/2010/wordprocessingDrawing" xmlns:wp="http://schemas.openxmlformats.org/drawingml/2006/wordprocessingDrawing" xmlns:w10="urn:schemas-microsoft-com:office:word" xmlns:w="http://schemas.openxmlformats.org/wordprocessingml/2006/main" xmlns:w14="http://schemas.microsoft.com/office/word/2010/wordml" xmlns:w15="http://schemas.microsoft.com/office/word/2012/wordml" xmlns:w16cex="http://schemas.microsoft.com/office/word/2018/wordml/cex" xmlns:w16cid="http://schemas.microsoft.com/office/word/2016/wordml/cid" xmlns:w16="http://schemas.microsoft.com/office/word/2018/wordml" xmlns:w16sdtdh="http://schemas.microsoft.com/office/word/2020/wordml/sdtdatahash" xmlns:w16se="http://schemas.microsoft.com/office/word/2015/wordml/symex" xmlns:wpg="http://schemas.microsoft.com/office/word/2010/wordprocessingGroup" xmlns:wpi="http://schemas.microsoft.com/office/word/2010/wordprocessingInk" xmlns:wne="http://schemas.microsoft.com/office/word/2006/wordml" xmlns:wps="http://schemas.microsoft.com/office/word/2010/wordprocessingShape" mc:Ignorable="w14 w15 w16se w16cid w16 w16cex w16sdtdh wp14">
-  <w:p>
-    <w:pPr>
-      <w:pStyle w:val="Header"/>
-    </w:pPr>
-  </w:p>
-</w:hdr>
-</file>
-
-<file path=word/header2.xml><?xml version="1.0" encoding="utf-8"?>
-<w:hdr xmlns:wpc="http://schemas.microsoft.com/office/word/2010/wordprocessingCanvas" xmlns:cx="http://schemas.microsoft.com/office/drawing/2014/chartex" xmlns:cx1="http://schemas.microsoft.com/office/drawing/2015/9/8/chartex" xmlns:cx2="http://schemas.microsoft.com/office/drawing/2015/10/21/chartex" xmlns:cx3="http://schemas.microsoft.com/office/drawing/2016/5/9/chartex" xmlns:cx4="http://schemas.microsoft.com/office/drawing/2016/5/10/chartex" xmlns:cx5="http://schemas.microsoft.com/office/drawing/2016/5/11/chartex" xmlns:cx6="http://schemas.microsoft.com/office/drawing/2016/5/12/chartex" xmlns:cx7="http://schemas.microsoft.com/office/drawing/2016/5/13/chartex" xmlns:cx8="http://schemas.microsoft.com/office/drawing/2016/5/14/chartex" xmlns:mc="http://schemas.openxmlformats.org/markup-compatibility/2006" xmlns:aink="http://schemas.microsoft.com/office/drawing/2016/ink" xmlns:am3d="http://schemas.microsoft.com/office/drawing/2017/model3d" xmlns:o="urn:schemas-microsoft-com:office:office" xmlns:oel="http://schemas.microsoft.com/office/2019/extlst" xmlns:r="http://schemas.openxmlformats.org/officeDocument/2006/relationships" xmlns:m="http://schemas.openxmlformats.org/officeDocument/2006/math" xmlns:v="urn:schemas-microsoft-com:vml" xmlns:wp14="http://schemas.microsoft.com/office/word/2010/wordprocessingDrawing" xmlns:wp="http://schemas.openxmlformats.org/drawingml/2006/wordprocessingDrawing" xmlns:w10="urn:schemas-microsoft-com:office:word" xmlns:w="http://schemas.openxmlformats.org/wordprocessingml/2006/main" xmlns:w14="http://schemas.microsoft.com/office/word/2010/wordml" xmlns:w15="http://schemas.microsoft.com/office/word/2012/wordml" xmlns:w16cex="http://schemas.microsoft.com/office/word/2018/wordml/cex" xmlns:w16cid="http://schemas.microsoft.com/office/word/2016/wordml/cid" xmlns:w16="http://schemas.microsoft.com/office/word/2018/wordml" xmlns:w16sdtdh="http://schemas.microsoft.com/office/word/2020/wordml/sdtdatahash" xmlns:w16se="http://schemas.microsoft.com/office/word/2015/wordml/symex" xmlns:wpg="http://schemas.microsoft.com/office/word/2010/wordprocessingGroup" xmlns:wpi="http://schemas.microsoft.com/office/word/2010/wordprocessingInk" xmlns:wne="http://schemas.microsoft.com/office/word/2006/wordml" xmlns:wps="http://schemas.microsoft.com/office/word/2010/wordprocessingShape" mc:Ignorable="w14 w15 w16se w16cid w16 w16cex w16sdtdh wp14">
-  <w:tbl>
-    <w:tblPr>
-      <w:tblStyle w:val="TableGrid"/>
-      <w:tblW w:w="10915" w:type="dxa"/>
-      <w:tblInd w:w="108" w:type="dxa"/>
-      <w:tblBorders>
-        <w:top w:val="none" w:sz="0" w:space="0" w:color="auto"/>
-        <w:left w:val="none" w:sz="0" w:space="0" w:color="auto"/>
-        <w:bottom w:val="none" w:sz="0" w:space="0" w:color="auto"/>
-        <w:right w:val="none" w:sz="0" w:space="0" w:color="auto"/>
-        <w:insideH w:val="none" w:sz="0" w:space="0" w:color="auto"/>
-        <w:insideV w:val="none" w:sz="0" w:space="0" w:color="auto"/>
-      </w:tblBorders>
-      <w:tblLook w:val="04A0" w:firstRow="1" w:lastRow="0" w:firstColumn="1" w:lastColumn="0" w:noHBand="0" w:noVBand="1"/>
-    </w:tblPr>
-    <w:tblGrid>
-      <w:gridCol w:w="1322"/>
-      <w:gridCol w:w="9593"/>
-    </w:tblGrid>
-    <w:tr>
-      <w:trPr>
-        <w:trHeight w:val="1867"/>
-      </w:trPr>
-      <w:tc>
-        <w:tcPr>
-          <w:tcW w:w="1322" w:type="dxa"/>
-        </w:tcPr>
-        <w:p>
-          <w:pPr>
-            <w:pStyle w:val="Header"/>
-          </w:pPr>
-          <w:r>
-            <w:rPr>
-              <w:noProof/>
-            </w:rPr>
-            <w:drawing>
-              <wp:anchor distT="0" distB="0" distL="114300" distR="114300" simplePos="0" relativeHeight="251656192" behindDoc="1" locked="0" layoutInCell="1" allowOverlap="1" wp14:anchorId="6C1D62D8" wp14:editId="3E65E39E">
-                <wp:simplePos x="0" y="0"/>
-                <wp:positionH relativeFrom="column">
-                  <wp:posOffset>689379</wp:posOffset>
-                </wp:positionH>
-                <wp:positionV relativeFrom="paragraph">
-                  <wp:posOffset>-11875</wp:posOffset>
-                </wp:positionV>
-                <wp:extent cx="78740" cy="1292225"/>
-                <wp:effectExtent l="0" t="0" r="0" b="3175"/>
-                <wp:wrapTight wrapText="bothSides">
-                  <wp:wrapPolygon edited="0">
-                    <wp:start x="0" y="0"/>
-                    <wp:lineTo x="0" y="21335"/>
-                    <wp:lineTo x="15677" y="21335"/>
-                    <wp:lineTo x="15677" y="0"/>
-                    <wp:lineTo x="0" y="0"/>
-                  </wp:wrapPolygon>
-                </wp:wrapTight>
-                <wp:docPr id="9" name="Picture 9"/>
-                <wp:cNvGraphicFramePr>
-                  <a:graphicFrameLocks xmlns:a="http://schemas.openxmlformats.org/drawingml/2006/main" noChangeAspect="1"/>
-                </wp:cNvGraphicFramePr>
-                <a:graphic xmlns:a="http://schemas.openxmlformats.org/drawingml/2006/main">
-                  <a:graphicData uri="http://schemas.openxmlformats.org/drawingml/2006/picture">
-                    <pic:pic xmlns:pic="http://schemas.openxmlformats.org/drawingml/2006/picture">
-                      <pic:nvPicPr>
-                        <pic:cNvPr id="2" name="Picture 2"/>
-                        <pic:cNvPicPr>
-                          <a:picLocks noChangeAspect="1"/>
-                        </pic:cNvPicPr>
-                      </pic:nvPicPr>
-                      <pic:blipFill>
-                        <a:blip r:embed="rId1" cstate="print">
-                          <a:extLst>
-                            <a:ext uri="{28A0092B-C50C-407E-A947-70E740481C1C}">
-                              <a14:useLocalDpi xmlns:a14="http://schemas.microsoft.com/office/drawing/2010/main" val="0"/>
-                            </a:ext>
-                          </a:extLst>
-                        </a:blip>
-                        <a:stretch>
-                          <a:fillRect/>
-                        </a:stretch>
-                      </pic:blipFill>
-                      <pic:spPr>
-                        <a:xfrm>
-                          <a:off x="0" y="0"/>
-                          <a:ext cx="78740" cy="1292225"/>
-                        </a:xfrm>
-                        <a:prstGeom prst="rect">
-                          <a:avLst/>
-                        </a:prstGeom>
-                      </pic:spPr>
-                    </pic:pic>
-                  </a:graphicData>
-                </a:graphic>
-              </wp:anchor>
-            </w:drawing>
-          </w:r>
-        </w:p>
-        <w:p>
-          <w:pPr>
-            <w:pStyle w:val="Header"/>
-          </w:pPr>
-          <w:r>
-            <w:rPr>
-              <w:noProof/>
-            </w:rPr>
-            <w:drawing>
-              <wp:anchor distT="0" distB="0" distL="114300" distR="114300" simplePos="0" relativeHeight="251659264" behindDoc="1" locked="0" layoutInCell="1" allowOverlap="1" wp14:anchorId="65D9F4A5" wp14:editId="758B4C62">
-                <wp:simplePos x="0" y="0"/>
-                <wp:positionH relativeFrom="column">
-                  <wp:posOffset>5847</wp:posOffset>
-                </wp:positionH>
-                <wp:positionV relativeFrom="paragraph">
-                  <wp:posOffset>100602</wp:posOffset>
-                </wp:positionV>
-                <wp:extent cx="648970" cy="819785"/>
-                <wp:effectExtent l="0" t="0" r="0" b="0"/>
-                <wp:wrapTight wrapText="bothSides">
-                  <wp:wrapPolygon edited="0">
-                    <wp:start x="8243" y="0"/>
-                    <wp:lineTo x="3804" y="3012"/>
-                    <wp:lineTo x="0" y="7027"/>
-                    <wp:lineTo x="0" y="10039"/>
-                    <wp:lineTo x="8877" y="16564"/>
-                    <wp:lineTo x="2536" y="17568"/>
-                    <wp:lineTo x="0" y="18572"/>
-                    <wp:lineTo x="0" y="21081"/>
-                    <wp:lineTo x="20924" y="21081"/>
-                    <wp:lineTo x="20924" y="19074"/>
-                    <wp:lineTo x="19656" y="18070"/>
-                    <wp:lineTo x="12047" y="16564"/>
-                    <wp:lineTo x="20924" y="9537"/>
-                    <wp:lineTo x="20924" y="7027"/>
-                    <wp:lineTo x="16485" y="3012"/>
-                    <wp:lineTo x="12681" y="0"/>
-                    <wp:lineTo x="8243" y="0"/>
-                  </wp:wrapPolygon>
-                </wp:wrapTight>
-                <wp:docPr id="10" name="Picture 10"/>
-                <wp:cNvGraphicFramePr>
-                  <a:graphicFrameLocks xmlns:a="http://schemas.openxmlformats.org/drawingml/2006/main" noChangeAspect="1"/>
-                </wp:cNvGraphicFramePr>
-                <a:graphic xmlns:a="http://schemas.openxmlformats.org/drawingml/2006/main">
-                  <a:graphicData uri="http://schemas.openxmlformats.org/drawingml/2006/picture">
-                    <pic:pic xmlns:pic="http://schemas.openxmlformats.org/drawingml/2006/picture">
-                      <pic:nvPicPr>
-                        <pic:cNvPr id="1" name="Picture 1"/>
-                        <pic:cNvPicPr>
-                          <a:picLocks noChangeAspect="1"/>
-                        </pic:cNvPicPr>
-                      </pic:nvPicPr>
-                      <pic:blipFill>
-                        <a:blip r:embed="rId2" cstate="print">
-                          <a:extLst>
-                            <a:ext uri="{28A0092B-C50C-407E-A947-70E740481C1C}">
-                              <a14:useLocalDpi xmlns:a14="http://schemas.microsoft.com/office/drawing/2010/main" val="0"/>
-                            </a:ext>
-                          </a:extLst>
-                        </a:blip>
-                        <a:stretch>
-                          <a:fillRect/>
-                        </a:stretch>
-                      </pic:blipFill>
-                      <pic:spPr>
-                        <a:xfrm>
-                          <a:off x="0" y="0"/>
-                          <a:ext cx="648970" cy="819785"/>
-                        </a:xfrm>
-                        <a:prstGeom prst="rect">
-                          <a:avLst/>
-                        </a:prstGeom>
-                      </pic:spPr>
-                    </pic:pic>
-                  </a:graphicData>
-                </a:graphic>
-              </wp:anchor>
-            </w:drawing>
-          </w:r>
-        </w:p>
-      </w:tc>
-      <w:tc>
-        <w:tcPr>
-          <w:tcW w:w="9593" w:type="dxa"/>
-        </w:tcPr>
-        <w:p>
-          <w:pPr>
-            <w:rPr>
-              <w:rFonts w:ascii="Arial Narrow" w:hAnsi="Arial Narrow"/>
-              <w:b/>
-              <w:bCs/>
-              <w:sz w:val="32"/>
-              <w:szCs w:val="32"/>
-            </w:rPr>
-          </w:pPr>
-        </w:p>
-        <w:p>
-          <w:pPr>
-            <w:rPr>
-              <w:rFonts w:ascii="Arial Narrow" w:hAnsi="Arial Narrow"/>
-              <w:b/>
-              <w:bCs/>
-              <w:sz w:val="32"/>
-              <w:szCs w:val="32"/>
-            </w:rPr>
-          </w:pPr>
-          <w:r>
-            <w:rPr>
-              <w:rFonts w:ascii="Arial Narrow" w:hAnsi="Arial Narrow"/>
-              <w:b/>
-              <w:bCs/>
-              <w:sz w:val="32"/>
-              <w:szCs w:val="32"/>
-            </w:rPr>
-            <w:t xml:space="preserve"> </w:t>
-          </w:r>
-          <w:r>
-            <w:rPr>
-              <w:rFonts w:ascii="Arial Narrow" w:hAnsi="Arial Narrow"/>
-              <w:b/>
-              <w:bCs/>
-              <w:sz w:val="32"/>
-              <w:szCs w:val="32"/>
-            </w:rPr>
-            <w:t>KEMENTERIAN KETENAGAKERJAAN REPUBLIK INDONESIA</w:t>
-          </w:r>
-        </w:p>
-        <w:p>
-          <w:pPr>
-            <w:rPr>
-              <w:rFonts w:ascii="Arial Narrow" w:hAnsi="Arial Narrow"/>
-              <w:color w:val="284A61"/>
-              <w:sz w:val="32"/>
-              <w:szCs w:val="32"/>
-            </w:rPr>
-          </w:pPr>
-          <w:r>
-            <w:rPr>
-              <w:rFonts w:ascii="Arial Narrow" w:hAnsi="Arial Narrow"/>
-              <w:color w:val="284A61"/>
-              <w:sz w:val="32"/>
-              <w:szCs w:val="32"/>
-            </w:rPr>
-            <w:t xml:space="preserve"> </w:t>
-          </w:r>
-          <w:r>
-            <w:rPr>
-              <w:rFonts w:ascii="Arial Narrow" w:hAnsi="Arial Narrow"/>
-              <w:color w:val="284A61"/>
-              <w:sz w:val="32"/>
-              <w:szCs w:val="32"/>
-            </w:rPr>
-            <w:t>SEKRETARIAT JENDERAL</w:t>
-          </w:r>
-        </w:p>
-      </w:tc>
-    </w:tr>
-  </w:tbl>
-  <w:p>
-    <w:pPr>
-      <w:pStyle w:val="Header"/>
-    </w:pPr>
-  </w:p>
-</w:hdr>
-</file>
-
-<file path=word/header3.xml><?xml version="1.0" encoding="utf-8"?>
-<w:hdr xmlns:wpc="http://schemas.microsoft.com/office/word/2010/wordprocessingCanvas" xmlns:cx="http://schemas.microsoft.com/office/drawing/2014/chartex" xmlns:cx1="http://schemas.microsoft.com/office/drawing/2015/9/8/chartex" xmlns:cx2="http://schemas.microsoft.com/office/drawing/2015/10/21/chartex" xmlns:cx3="http://schemas.microsoft.com/office/drawing/2016/5/9/chartex" xmlns:cx4="http://schemas.microsoft.com/office/drawing/2016/5/10/chartex" xmlns:cx5="http://schemas.microsoft.com/office/drawing/2016/5/11/chartex" xmlns:cx6="http://schemas.microsoft.com/office/drawing/2016/5/12/chartex" xmlns:cx7="http://schemas.microsoft.com/office/drawing/2016/5/13/chartex" xmlns:cx8="http://schemas.microsoft.com/office/drawing/2016/5/14/chartex" xmlns:mc="http://schemas.openxmlformats.org/markup-compatibility/2006" xmlns:aink="http://schemas.microsoft.com/office/drawing/2016/ink" xmlns:am3d="http://schemas.microsoft.com/office/drawing/2017/model3d" xmlns:o="urn:schemas-microsoft-com:office:office" xmlns:oel="http://schemas.microsoft.com/office/2019/extlst" xmlns:r="http://schemas.openxmlformats.org/officeDocument/2006/relationships" xmlns:m="http://schemas.openxmlformats.org/officeDocument/2006/math" xmlns:v="urn:schemas-microsoft-com:vml" xmlns:wp14="http://schemas.microsoft.com/office/word/2010/wordprocessingDrawing" xmlns:wp="http://schemas.openxmlformats.org/drawingml/2006/wordprocessingDrawing" xmlns:w10="urn:schemas-microsoft-com:office:word" xmlns:w="http://schemas.openxmlformats.org/wordprocessingml/2006/main" xmlns:w14="http://schemas.microsoft.com/office/word/2010/wordml" xmlns:w15="http://schemas.microsoft.com/office/word/2012/wordml" xmlns:w16cex="http://schemas.microsoft.com/office/word/2018/wordml/cex" xmlns:w16cid="http://schemas.microsoft.com/office/word/2016/wordml/cid" xmlns:w16="http://schemas.microsoft.com/office/word/2018/wordml" xmlns:w16sdtdh="http://schemas.microsoft.com/office/word/2020/wordml/sdtdatahash" xmlns:w16se="http://schemas.microsoft.com/office/word/2015/wordml/symex" xmlns:wpg="http://schemas.microsoft.com/office/word/2010/wordprocessingGroup" xmlns:wpi="http://schemas.microsoft.com/office/word/2010/wordprocessingInk" xmlns:wne="http://schemas.microsoft.com/office/word/2006/wordml" xmlns:wps="http://schemas.microsoft.com/office/word/2010/wordprocessingShape" mc:Ignorable="w14 w15 w16se w16cid w16 w16cex w16sdtdh wp14">
-  <w:p>
-    <w:pPr>
-      <w:pStyle w:val="Header"/>
-    </w:pPr>
-  </w:p>
-</w:hdr>
-</file>
-
-<file path=word/header4.xml><?xml version="1.0" encoding="utf-8"?>
-<w:hdr xmlns:wpc="http://schemas.microsoft.com/office/word/2010/wordprocessingCanvas" xmlns:cx="http://schemas.microsoft.com/office/drawing/2014/chartex" xmlns:cx1="http://schemas.microsoft.com/office/drawing/2015/9/8/chartex" xmlns:cx2="http://schemas.microsoft.com/office/drawing/2015/10/21/chartex" xmlns:cx3="http://schemas.microsoft.com/office/drawing/2016/5/9/chartex" xmlns:cx4="http://schemas.microsoft.com/office/drawing/2016/5/10/chartex" xmlns:cx5="http://schemas.microsoft.com/office/drawing/2016/5/11/chartex" xmlns:cx6="http://schemas.microsoft.com/office/drawing/2016/5/12/chartex" xmlns:cx7="http://schemas.microsoft.com/office/drawing/2016/5/13/chartex" xmlns:cx8="http://schemas.microsoft.com/office/drawing/2016/5/14/chartex" xmlns:mc="http://schemas.openxmlformats.org/markup-compatibility/2006" xmlns:aink="http://schemas.microsoft.com/office/drawing/2016/ink" xmlns:am3d="http://schemas.microsoft.com/office/drawing/2017/model3d" xmlns:o="urn:schemas-microsoft-com:office:office" xmlns:oel="http://schemas.microsoft.com/office/2019/extlst" xmlns:r="http://schemas.openxmlformats.org/officeDocument/2006/relationships" xmlns:m="http://schemas.openxmlformats.org/officeDocument/2006/math" xmlns:v="urn:schemas-microsoft-com:vml" xmlns:wp14="http://schemas.microsoft.com/office/word/2010/wordprocessingDrawing" xmlns:wp="http://schemas.openxmlformats.org/drawingml/2006/wordprocessingDrawing" xmlns:w10="urn:schemas-microsoft-com:office:word" xmlns:w="http://schemas.openxmlformats.org/wordprocessingml/2006/main" xmlns:w14="http://schemas.microsoft.com/office/word/2010/wordml" xmlns:w15="http://schemas.microsoft.com/office/word/2012/wordml" xmlns:w16cex="http://schemas.microsoft.com/office/word/2018/wordml/cex" xmlns:w16cid="http://schemas.microsoft.com/office/word/2016/wordml/cid" xmlns:w16="http://schemas.microsoft.com/office/word/2018/wordml" xmlns:w16sdtdh="http://schemas.microsoft.com/office/word/2020/wordml/sdtdatahash" xmlns:w16se="http://schemas.microsoft.com/office/word/2015/wordml/symex" xmlns:wpg="http://schemas.microsoft.com/office/word/2010/wordprocessingGroup" xmlns:wpi="http://schemas.microsoft.com/office/word/2010/wordprocessingInk" xmlns:wne="http://schemas.microsoft.com/office/word/2006/wordml" xmlns:wps="http://schemas.microsoft.com/office/word/2010/wordprocessingShape" mc:Ignorable="w14 w15 w16se w16cid w16 w16cex w16sdtdh wp14">
-  <w:p>
-    <w:pPr>
-      <w:pStyle w:val="Header"/>
-    </w:pPr>
-  </w:p>
-</w:hdr>
-</file>
-
-<file path=word/header5.xml><?xml version="1.0" encoding="utf-8"?>
-<w:hdr xmlns:wpc="http://schemas.microsoft.com/office/word/2010/wordprocessingCanvas" xmlns:cx="http://schemas.microsoft.com/office/drawing/2014/chartex" xmlns:cx1="http://schemas.microsoft.com/office/drawing/2015/9/8/chartex" xmlns:cx2="http://schemas.microsoft.com/office/drawing/2015/10/21/chartex" xmlns:cx3="http://schemas.microsoft.com/office/drawing/2016/5/9/chartex" xmlns:cx4="http://schemas.microsoft.com/office/drawing/2016/5/10/chartex" xmlns:cx5="http://schemas.microsoft.com/office/drawing/2016/5/11/chartex" xmlns:cx6="http://schemas.microsoft.com/office/drawing/2016/5/12/chartex" xmlns:cx7="http://schemas.microsoft.com/office/drawing/2016/5/13/chartex" xmlns:cx8="http://schemas.microsoft.com/office/drawing/2016/5/14/chartex" xmlns:mc="http://schemas.openxmlformats.org/markup-compatibility/2006" xmlns:aink="http://schemas.microsoft.com/office/drawing/2016/ink" xmlns:am3d="http://schemas.microsoft.com/office/drawing/2017/model3d" xmlns:o="urn:schemas-microsoft-com:office:office" xmlns:oel="http://schemas.microsoft.com/office/2019/extlst" xmlns:r="http://schemas.openxmlformats.org/officeDocument/2006/relationships" xmlns:m="http://schemas.openxmlformats.org/officeDocument/2006/math" xmlns:v="urn:schemas-microsoft-com:vml" xmlns:wp14="http://schemas.microsoft.com/office/word/2010/wordprocessingDrawing" xmlns:wp="http://schemas.openxmlformats.org/drawingml/2006/wordprocessingDrawing" xmlns:w10="urn:schemas-microsoft-com:office:word" xmlns:w="http://schemas.openxmlformats.org/wordprocessingml/2006/main" xmlns:w14="http://schemas.microsoft.com/office/word/2010/wordml" xmlns:w15="http://schemas.microsoft.com/office/word/2012/wordml" xmlns:w16cex="http://schemas.microsoft.com/office/word/2018/wordml/cex" xmlns:w16cid="http://schemas.microsoft.com/office/word/2016/wordml/cid" xmlns:w16="http://schemas.microsoft.com/office/word/2018/wordml" xmlns:w16sdtdh="http://schemas.microsoft.com/office/word/2020/wordml/sdtdatahash" xmlns:w16se="http://schemas.microsoft.com/office/word/2015/wordml/symex" xmlns:wpg="http://schemas.microsoft.com/office/word/2010/wordprocessingGroup" xmlns:wpi="http://schemas.microsoft.com/office/word/2010/wordprocessingInk" xmlns:wne="http://schemas.microsoft.com/office/word/2006/wordml" xmlns:wps="http://schemas.microsoft.com/office/word/2010/wordprocessingShape" mc:Ignorable="w14 w15 w16se w16cid w16 w16cex w16sdtdh wp14">
+<w:hdr xmlns:wpc="http://schemas.microsoft.com/office/word/2010/wordprocessingCanvas" xmlns:cx="http://schemas.microsoft.com/office/drawing/2014/chartex" xmlns:cx1="http://schemas.microsoft.com/office/drawing/2015/9/8/chartex" xmlns:cx2="http://schemas.microsoft.com/office/drawing/2015/10/21/chartex" xmlns:cx3="http://schemas.microsoft.com/office/drawing/2016/5/9/chartex" xmlns:cx4="http://schemas.microsoft.com/office/drawing/2016/5/10/chartex" xmlns:cx5="http://schemas.microsoft.com/office/drawing/2016/5/11/chartex" xmlns:cx6="http://schemas.microsoft.com/office/drawing/2016/5/12/chartex" xmlns:cx7="http://schemas.microsoft.com/office/drawing/2016/5/13/chartex" xmlns:cx8="http://schemas.microsoft.com/office/drawing/2016/5/14/chartex" xmlns:mc="http://schemas.openxmlformats.org/markup-compatibility/2006" xmlns:aink="http://schemas.microsoft.com/office/drawing/2016/ink" xmlns:am3d="http://schemas.microsoft.com/office/drawing/2017/model3d" xmlns:o="urn:schemas-microsoft-com:office:office" xmlns:oel="http://schemas.microsoft.com/office/2019/extlst" xmlns:r="http://schemas.openxmlformats.org/officeDocument/2006/relationships" xmlns:m="http://schemas.openxmlformats.org/officeDocument/2006/math" xmlns:v="urn:schemas-microsoft-com:vml" xmlns:wp14="http://schemas.microsoft.com/office/word/2010/wordprocessingDrawing" xmlns:wp="http://schemas.openxmlformats.org/drawingml/2006/wordprocessingDrawing" xmlns:w10="urn:schemas-microsoft-com:office:word" xmlns:w="http://schemas.openxmlformats.org/wordprocessingml/2006/main" xmlns:w14="http://schemas.microsoft.com/office/word/2010/wordml" xmlns:w15="http://schemas.microsoft.com/office/word/2012/wordml" xmlns:w16cex="http://schemas.microsoft.com/office/word/2018/wordml/cex" xmlns:w16cid="http://schemas.microsoft.com/office/word/2016/wordml/cid" xmlns:w16="http://schemas.microsoft.com/office/word/2018/wordml" xmlns:w16du="http://schemas.microsoft.com/office/word/2023/wordml/word16du" xmlns:w16sdtdh="http://schemas.microsoft.com/office/word/2020/wordml/sdtdatahash" xmlns:w16sdtfl="http://schemas.microsoft.com/office/word/2024/wordml/sdtformatlock" xmlns:w16se="http://schemas.microsoft.com/office/word/2015/wordml/symex" xmlns:wpg="http://schemas.microsoft.com/office/word/2010/wordprocessingGroup" xmlns:wpi="http://schemas.microsoft.com/office/word/2010/wordprocessingInk" xmlns:wne="http://schemas.microsoft.com/office/word/2006/wordml" xmlns:wps="http://schemas.microsoft.com/office/word/2010/wordprocessingShape" mc:Ignorable="w14 w15 w16se w16cid w16 w16cex w16sdtdh w16sdtfl w16du wp14">
   <w:p>
     <w:pPr>
       <w:pStyle w:val="BodyText"/>
@@ -6160,7 +5710,7 @@
 </file>
 
 <file path=word/numbering.xml><?xml version="1.0" encoding="utf-8"?>
-<w:numbering xmlns:wpc="http://schemas.microsoft.com/office/word/2010/wordprocessingCanvas" xmlns:cx="http://schemas.microsoft.com/office/drawing/2014/chartex" xmlns:cx1="http://schemas.microsoft.com/office/drawing/2015/9/8/chartex" xmlns:cx2="http://schemas.microsoft.com/office/drawing/2015/10/21/chartex" xmlns:cx3="http://schemas.microsoft.com/office/drawing/2016/5/9/chartex" xmlns:cx4="http://schemas.microsoft.com/office/drawing/2016/5/10/chartex" xmlns:cx5="http://schemas.microsoft.com/office/drawing/2016/5/11/chartex" xmlns:cx6="http://schemas.microsoft.com/office/drawing/2016/5/12/chartex" xmlns:cx7="http://schemas.microsoft.com/office/drawing/2016/5/13/chartex" xmlns:cx8="http://schemas.microsoft.com/office/drawing/2016/5/14/chartex" xmlns:mc="http://schemas.openxmlformats.org/markup-compatibility/2006" xmlns:aink="http://schemas.microsoft.com/office/drawing/2016/ink" xmlns:am3d="http://schemas.microsoft.com/office/drawing/2017/model3d" xmlns:o="urn:schemas-microsoft-com:office:office" xmlns:oel="http://schemas.microsoft.com/office/2019/extlst" xmlns:r="http://schemas.openxmlformats.org/officeDocument/2006/relationships" xmlns:m="http://schemas.openxmlformats.org/officeDocument/2006/math" xmlns:v="urn:schemas-microsoft-com:vml" xmlns:wp14="http://schemas.microsoft.com/office/word/2010/wordprocessingDrawing" xmlns:wp="http://schemas.openxmlformats.org/drawingml/2006/wordprocessingDrawing" xmlns:w10="urn:schemas-microsoft-com:office:word" xmlns:w="http://schemas.openxmlformats.org/wordprocessingml/2006/main" xmlns:w14="http://schemas.microsoft.com/office/word/2010/wordml" xmlns:w15="http://schemas.microsoft.com/office/word/2012/wordml" xmlns:w16cex="http://schemas.microsoft.com/office/word/2018/wordml/cex" xmlns:w16cid="http://schemas.microsoft.com/office/word/2016/wordml/cid" xmlns:w16="http://schemas.microsoft.com/office/word/2018/wordml" xmlns:w16sdtdh="http://schemas.microsoft.com/office/word/2020/wordml/sdtdatahash" xmlns:w16se="http://schemas.microsoft.com/office/word/2015/wordml/symex" xmlns:wpg="http://schemas.microsoft.com/office/word/2010/wordprocessingGroup" xmlns:wpi="http://schemas.microsoft.com/office/word/2010/wordprocessingInk" xmlns:wne="http://schemas.microsoft.com/office/word/2006/wordml" xmlns:wps="http://schemas.microsoft.com/office/word/2010/wordprocessingShape" mc:Ignorable="w14 w15 w16se w16cid w16 w16cex w16sdtdh wp14">
+<w:numbering xmlns:wpc="http://schemas.microsoft.com/office/word/2010/wordprocessingCanvas" xmlns:cx="http://schemas.microsoft.com/office/drawing/2014/chartex" xmlns:cx1="http://schemas.microsoft.com/office/drawing/2015/9/8/chartex" xmlns:cx2="http://schemas.microsoft.com/office/drawing/2015/10/21/chartex" xmlns:cx3="http://schemas.microsoft.com/office/drawing/2016/5/9/chartex" xmlns:cx4="http://schemas.microsoft.com/office/drawing/2016/5/10/chartex" xmlns:cx5="http://schemas.microsoft.com/office/drawing/2016/5/11/chartex" xmlns:cx6="http://schemas.microsoft.com/office/drawing/2016/5/12/chartex" xmlns:cx7="http://schemas.microsoft.com/office/drawing/2016/5/13/chartex" xmlns:cx8="http://schemas.microsoft.com/office/drawing/2016/5/14/chartex" xmlns:mc="http://schemas.openxmlformats.org/markup-compatibility/2006" xmlns:aink="http://schemas.microsoft.com/office/drawing/2016/ink" xmlns:am3d="http://schemas.microsoft.com/office/drawing/2017/model3d" xmlns:o="urn:schemas-microsoft-com:office:office" xmlns:oel="http://schemas.microsoft.com/office/2019/extlst" xmlns:r="http://schemas.openxmlformats.org/officeDocument/2006/relationships" xmlns:m="http://schemas.openxmlformats.org/officeDocument/2006/math" xmlns:v="urn:schemas-microsoft-com:vml" xmlns:wp14="http://schemas.microsoft.com/office/word/2010/wordprocessingDrawing" xmlns:wp="http://schemas.openxmlformats.org/drawingml/2006/wordprocessingDrawing" xmlns:w10="urn:schemas-microsoft-com:office:word" xmlns:w="http://schemas.openxmlformats.org/wordprocessingml/2006/main" xmlns:w14="http://schemas.microsoft.com/office/word/2010/wordml" xmlns:w15="http://schemas.microsoft.com/office/word/2012/wordml" xmlns:w16cex="http://schemas.microsoft.com/office/word/2018/wordml/cex" xmlns:w16cid="http://schemas.microsoft.com/office/word/2016/wordml/cid" xmlns:w16="http://schemas.microsoft.com/office/word/2018/wordml" xmlns:w16du="http://schemas.microsoft.com/office/word/2023/wordml/word16du" xmlns:w16sdtdh="http://schemas.microsoft.com/office/word/2020/wordml/sdtdatahash" xmlns:w16sdtfl="http://schemas.microsoft.com/office/word/2024/wordml/sdtformatlock" xmlns:w16se="http://schemas.microsoft.com/office/word/2015/wordml/symex" xmlns:wpg="http://schemas.microsoft.com/office/word/2010/wordprocessingGroup" xmlns:wpi="http://schemas.microsoft.com/office/word/2010/wordprocessingInk" xmlns:wne="http://schemas.microsoft.com/office/word/2006/wordml" xmlns:wps="http://schemas.microsoft.com/office/word/2010/wordprocessingShape" mc:Ignorable="w14 w15 w16se w16cid w16 w16cex w16sdtdh w16sdtfl w16du wp14">
   <w:abstractNum w:abstractNumId="0" w15:restartNumberingAfterBreak="0">
     <w:nsid w:val="0CEB530B"/>
     <w:multiLevelType w:val="hybridMultilevel"/>
@@ -6804,7 +6354,7 @@
 </file>
 
 <file path=word/styles.xml><?xml version="1.0" encoding="utf-8"?>
-<w:styles xmlns:mc="http://schemas.openxmlformats.org/markup-compatibility/2006" xmlns:r="http://schemas.openxmlformats.org/officeDocument/2006/relationships" xmlns:w="http://schemas.openxmlformats.org/wordprocessingml/2006/main" xmlns:w14="http://schemas.microsoft.com/office/word/2010/wordml" xmlns:w15="http://schemas.microsoft.com/office/word/2012/wordml" xmlns:w16cex="http://schemas.microsoft.com/office/word/2018/wordml/cex" xmlns:w16cid="http://schemas.microsoft.com/office/word/2016/wordml/cid" xmlns:w16="http://schemas.microsoft.com/office/word/2018/wordml" xmlns:w16sdtdh="http://schemas.microsoft.com/office/word/2020/wordml/sdtdatahash" xmlns:w16se="http://schemas.microsoft.com/office/word/2015/wordml/symex" mc:Ignorable="w14 w15 w16se w16cid w16 w16cex w16sdtdh">
+<w:styles xmlns:mc="http://schemas.openxmlformats.org/markup-compatibility/2006" xmlns:r="http://schemas.openxmlformats.org/officeDocument/2006/relationships" xmlns:w="http://schemas.openxmlformats.org/wordprocessingml/2006/main" xmlns:w14="http://schemas.microsoft.com/office/word/2010/wordml" xmlns:w15="http://schemas.microsoft.com/office/word/2012/wordml" xmlns:w16cex="http://schemas.microsoft.com/office/word/2018/wordml/cex" xmlns:w16cid="http://schemas.microsoft.com/office/word/2016/wordml/cid" xmlns:w16="http://schemas.microsoft.com/office/word/2018/wordml" xmlns:w16du="http://schemas.microsoft.com/office/word/2023/wordml/word16du" xmlns:w16sdtdh="http://schemas.microsoft.com/office/word/2020/wordml/sdtdatahash" xmlns:w16sdtfl="http://schemas.microsoft.com/office/word/2024/wordml/sdtformatlock" xmlns:w16se="http://schemas.microsoft.com/office/word/2015/wordml/symex" mc:Ignorable="w14 w15 w16se w16cid w16 w16cex w16sdtdh w16sdtfl w16du">
   <w:docDefaults>
     <w:rPrDefault>
       <w:rPr>

</xml_diff>

<commit_message>
fix(templates): convert floating header tables and logo to inline to fix Gotenberg PDF rendering misalignment
</commit_message>
<xml_diff>
--- a/backend/templates/Berkas Luar Kota - Laporan.docx
+++ b/backend/templates/Berkas Luar Kota - Laporan.docx
@@ -1,6 +1,6 @@
 
 <file path=word/document.xml><?xml version="1.0" encoding="utf-8"?>
-<w:document xmlns:wpc="http://schemas.microsoft.com/office/word/2010/wordprocessingCanvas" xmlns:cx="http://schemas.microsoft.com/office/drawing/2014/chartex" xmlns:cx1="http://schemas.microsoft.com/office/drawing/2015/9/8/chartex" xmlns:cx2="http://schemas.microsoft.com/office/drawing/2015/10/21/chartex" xmlns:cx3="http://schemas.microsoft.com/office/drawing/2016/5/9/chartex" xmlns:cx4="http://schemas.microsoft.com/office/drawing/2016/5/10/chartex" xmlns:cx5="http://schemas.microsoft.com/office/drawing/2016/5/11/chartex" xmlns:cx6="http://schemas.microsoft.com/office/drawing/2016/5/12/chartex" xmlns:cx7="http://schemas.microsoft.com/office/drawing/2016/5/13/chartex" xmlns:cx8="http://schemas.microsoft.com/office/drawing/2016/5/14/chartex" xmlns:mc="http://schemas.openxmlformats.org/markup-compatibility/2006" xmlns:aink="http://schemas.microsoft.com/office/drawing/2016/ink" xmlns:am3d="http://schemas.microsoft.com/office/drawing/2017/model3d" xmlns:o="urn:schemas-microsoft-com:office:office" xmlns:oel="http://schemas.microsoft.com/office/2019/extlst" xmlns:r="http://schemas.openxmlformats.org/officeDocument/2006/relationships" xmlns:m="http://schemas.openxmlformats.org/officeDocument/2006/math" xmlns:v="urn:schemas-microsoft-com:vml" xmlns:wp14="http://schemas.microsoft.com/office/word/2010/wordprocessingDrawing" xmlns:wp="http://schemas.openxmlformats.org/drawingml/2006/wordprocessingDrawing" xmlns:w10="urn:schemas-microsoft-com:office:word" xmlns:w="http://schemas.openxmlformats.org/wordprocessingml/2006/main" xmlns:w14="http://schemas.microsoft.com/office/word/2010/wordml" xmlns:w15="http://schemas.microsoft.com/office/word/2012/wordml" xmlns:w16cex="http://schemas.microsoft.com/office/word/2018/wordml/cex" xmlns:w16cid="http://schemas.microsoft.com/office/word/2016/wordml/cid" xmlns:w16="http://schemas.microsoft.com/office/word/2018/wordml" xmlns:w16du="http://schemas.microsoft.com/office/word/2023/wordml/word16du" xmlns:w16sdtdh="http://schemas.microsoft.com/office/word/2020/wordml/sdtdatahash" xmlns:w16sdtfl="http://schemas.microsoft.com/office/word/2024/wordml/sdtformatlock" xmlns:w16se="http://schemas.microsoft.com/office/word/2015/wordml/symex" xmlns:wpg="http://schemas.microsoft.com/office/word/2010/wordprocessingGroup" xmlns:wpi="http://schemas.microsoft.com/office/word/2010/wordprocessingInk" xmlns:wne="http://schemas.microsoft.com/office/word/2006/wordml" xmlns:wps="http://schemas.microsoft.com/office/word/2010/wordprocessingShape" mc:Ignorable="w14 w15 w16se w16cid w16 w16cex w16sdtdh w16sdtfl w16du wp14">
+<w:document xmlns:a="http://schemas.openxmlformats.org/drawingml/2006/main" xmlns:ns1="http://schemas.openxmlformats.org/markup-compatibility/2006" xmlns:ns7="http://schemas.microsoft.com/office/drawing/2010/main" xmlns:pic="http://schemas.openxmlformats.org/drawingml/2006/picture" xmlns:r="http://schemas.openxmlformats.org/officeDocument/2006/relationships" xmlns:w="http://schemas.openxmlformats.org/wordprocessingml/2006/main" xmlns:w14="http://schemas.microsoft.com/office/word/2010/wordml" xmlns:wp="http://schemas.openxmlformats.org/drawingml/2006/wordprocessingDrawing" ns1:Ignorable="w14 w15 w16se w16cid w16 w16cex w16sdtdh w16sdtfl w16du wp14">
   <w:body>
     <w:tbl>
       <w:tblPr>
@@ -38,45 +38,16 @@
                 <w:noProof/>
               </w:rPr>
               <w:drawing>
-                <wp:anchor distT="0" distB="0" distL="114300" distR="114300" simplePos="0" relativeHeight="251659264" behindDoc="1" locked="0" layoutInCell="1" allowOverlap="1" wp14:anchorId="4D77D877" wp14:editId="66B5DCF9">
-                  <wp:simplePos x="0" y="0"/>
-                  <wp:positionH relativeFrom="column">
-                    <wp:posOffset>5715</wp:posOffset>
-                  </wp:positionH>
-                  <wp:positionV relativeFrom="paragraph">
-                    <wp:posOffset>224459</wp:posOffset>
-                  </wp:positionV>
+                <wp:inline distT="0" distB="0" distL="114300" distR="114300">
                   <wp:extent cx="648970" cy="819785"/>
                   <wp:effectExtent l="0" t="0" r="0" b="0"/>
-                  <wp:wrapTight wrapText="bothSides">
-                    <wp:wrapPolygon edited="0">
-                      <wp:start x="8877" y="0"/>
-                      <wp:lineTo x="5072" y="2008"/>
-                      <wp:lineTo x="0" y="6525"/>
-                      <wp:lineTo x="0" y="10541"/>
-                      <wp:lineTo x="7609" y="16062"/>
-                      <wp:lineTo x="10779" y="16062"/>
-                      <wp:lineTo x="0" y="18070"/>
-                      <wp:lineTo x="0" y="21081"/>
-                      <wp:lineTo x="3170" y="21081"/>
-                      <wp:lineTo x="5706" y="21081"/>
-                      <wp:lineTo x="20924" y="21081"/>
-                      <wp:lineTo x="20924" y="18572"/>
-                      <wp:lineTo x="12681" y="16062"/>
-                      <wp:lineTo x="20924" y="9537"/>
-                      <wp:lineTo x="20924" y="6525"/>
-                      <wp:lineTo x="15851" y="2510"/>
-                      <wp:lineTo x="11413" y="0"/>
-                      <wp:lineTo x="8877" y="0"/>
-                    </wp:wrapPolygon>
-                  </wp:wrapTight>
                   <wp:docPr id="269144722" name="Picture 269144722"/>
                   <wp:cNvGraphicFramePr>
-                    <a:graphicFrameLocks xmlns:a="http://schemas.openxmlformats.org/drawingml/2006/main" noChangeAspect="1"/>
+                    <a:graphicFrameLocks noChangeAspect="1"/>
                   </wp:cNvGraphicFramePr>
-                  <a:graphic xmlns:a="http://schemas.openxmlformats.org/drawingml/2006/main">
+                  <a:graphic>
                     <a:graphicData uri="http://schemas.openxmlformats.org/drawingml/2006/picture">
-                      <pic:pic xmlns:pic="http://schemas.openxmlformats.org/drawingml/2006/picture">
+                      <pic:pic>
                         <pic:nvPicPr>
                           <pic:cNvPr id="1" name="Picture 1"/>
                           <pic:cNvPicPr>
@@ -87,7 +58,7 @@
                           <a:blip r:embed="rId7" cstate="print">
                             <a:extLst>
                               <a:ext uri="{28A0092B-C50C-407E-A947-70E740481C1C}">
-                                <a14:useLocalDpi xmlns:a14="http://schemas.microsoft.com/office/drawing/2010/main" val="0"/>
+                                <ns7:useLocalDpi val="0"/>
                               </a:ext>
                             </a:extLst>
                           </a:blip>
@@ -107,7 +78,7 @@
                       </pic:pic>
                     </a:graphicData>
                   </a:graphic>
-                </wp:anchor>
+                </wp:inline>
               </w:drawing>
             </w:r>
             <w:r>
@@ -115,32 +86,16 @@
                 <w:noProof/>
               </w:rPr>
               <w:drawing>
-                <wp:anchor distT="0" distB="0" distL="114300" distR="114300" simplePos="0" relativeHeight="251658240" behindDoc="1" locked="0" layoutInCell="1" allowOverlap="1" wp14:anchorId="2179C7AA" wp14:editId="6CA944F7">
-                  <wp:simplePos x="0" y="0"/>
-                  <wp:positionH relativeFrom="column">
-                    <wp:posOffset>689379</wp:posOffset>
-                  </wp:positionH>
-                  <wp:positionV relativeFrom="paragraph">
-                    <wp:posOffset>-11875</wp:posOffset>
-                  </wp:positionV>
+                <wp:inline distT="0" distB="0" distL="114300" distR="114300">
                   <wp:extent cx="78740" cy="1292225"/>
                   <wp:effectExtent l="0" t="0" r="0" b="3175"/>
-                  <wp:wrapTight wrapText="bothSides">
-                    <wp:wrapPolygon edited="0">
-                      <wp:start x="0" y="0"/>
-                      <wp:lineTo x="0" y="21335"/>
-                      <wp:lineTo x="15677" y="21335"/>
-                      <wp:lineTo x="15677" y="0"/>
-                      <wp:lineTo x="0" y="0"/>
-                    </wp:wrapPolygon>
-                  </wp:wrapTight>
                   <wp:docPr id="1716352736" name="Picture 1716352736"/>
                   <wp:cNvGraphicFramePr>
-                    <a:graphicFrameLocks xmlns:a="http://schemas.openxmlformats.org/drawingml/2006/main" noChangeAspect="1"/>
+                    <a:graphicFrameLocks noChangeAspect="1"/>
                   </wp:cNvGraphicFramePr>
-                  <a:graphic xmlns:a="http://schemas.openxmlformats.org/drawingml/2006/main">
+                  <a:graphic>
                     <a:graphicData uri="http://schemas.openxmlformats.org/drawingml/2006/picture">
-                      <pic:pic xmlns:pic="http://schemas.openxmlformats.org/drawingml/2006/picture">
+                      <pic:pic>
                         <pic:nvPicPr>
                           <pic:cNvPr id="2" name="Picture 2"/>
                           <pic:cNvPicPr>
@@ -151,7 +106,7 @@
                           <a:blip r:embed="rId8" cstate="print">
                             <a:extLst>
                               <a:ext uri="{28A0092B-C50C-407E-A947-70E740481C1C}">
-                                <a14:useLocalDpi xmlns:a14="http://schemas.microsoft.com/office/drawing/2010/main" val="0"/>
+                                <ns7:useLocalDpi val="0"/>
                               </a:ext>
                             </a:extLst>
                           </a:blip>
@@ -171,7 +126,7 @@
                       </pic:pic>
                     </a:graphicData>
                   </a:graphic>
-                </wp:anchor>
+                </wp:inline>
               </w:drawing>
             </w:r>
           </w:p>
@@ -188,7 +143,6 @@
           <w:tbl>
             <w:tblPr>
               <w:tblStyle w:val="TableGrid"/>
-              <w:tblpPr w:leftFromText="180" w:rightFromText="180" w:vertAnchor="page" w:horzAnchor="margin" w:tblpY="515"/>
               <w:tblOverlap w:val="never"/>
               <w:tblW w:w="0" w:type="auto"/>
               <w:tblBorders>
@@ -433,7 +387,6 @@
           <w:tbl>
             <w:tblPr>
               <w:tblStyle w:val="TableGrid"/>
-              <w:tblpPr w:leftFromText="180" w:rightFromText="180" w:vertAnchor="text" w:horzAnchor="page" w:tblpX="1997" w:tblpY="-27"/>
               <w:tblOverlap w:val="never"/>
               <w:tblW w:w="0" w:type="auto"/>
               <w:tblBorders>
@@ -3282,7 +3235,6 @@
     <w:tbl>
       <w:tblPr>
         <w:tblStyle w:val="TableGrid"/>
-        <w:tblpPr w:leftFromText="180" w:rightFromText="180" w:vertAnchor="page" w:horzAnchor="margin" w:tblpXSpec="center" w:tblpY="2283"/>
         <w:tblW w:w="0" w:type="auto"/>
         <w:tblBorders>
           <w:top w:val="none" w:sz="0" w:space="0" w:color="auto"/>

</xml_diff>

<commit_message>
Revert "fix(templates): convert floating header tables and logo to inline to fix Gotenberg PDF rendering misalignment"
This reverts commit 3b13945c2d6a3720497abef4a7cdd41fc0e7b2a6.
</commit_message>
<xml_diff>
--- a/backend/templates/Berkas Luar Kota - Laporan.docx
+++ b/backend/templates/Berkas Luar Kota - Laporan.docx
@@ -1,6 +1,6 @@
 
 <file path=word/document.xml><?xml version="1.0" encoding="utf-8"?>
-<w:document xmlns:a="http://schemas.openxmlformats.org/drawingml/2006/main" xmlns:ns1="http://schemas.openxmlformats.org/markup-compatibility/2006" xmlns:ns7="http://schemas.microsoft.com/office/drawing/2010/main" xmlns:pic="http://schemas.openxmlformats.org/drawingml/2006/picture" xmlns:r="http://schemas.openxmlformats.org/officeDocument/2006/relationships" xmlns:w="http://schemas.openxmlformats.org/wordprocessingml/2006/main" xmlns:w14="http://schemas.microsoft.com/office/word/2010/wordml" xmlns:wp="http://schemas.openxmlformats.org/drawingml/2006/wordprocessingDrawing" ns1:Ignorable="w14 w15 w16se w16cid w16 w16cex w16sdtdh w16sdtfl w16du wp14">
+<w:document xmlns:wpc="http://schemas.microsoft.com/office/word/2010/wordprocessingCanvas" xmlns:cx="http://schemas.microsoft.com/office/drawing/2014/chartex" xmlns:cx1="http://schemas.microsoft.com/office/drawing/2015/9/8/chartex" xmlns:cx2="http://schemas.microsoft.com/office/drawing/2015/10/21/chartex" xmlns:cx3="http://schemas.microsoft.com/office/drawing/2016/5/9/chartex" xmlns:cx4="http://schemas.microsoft.com/office/drawing/2016/5/10/chartex" xmlns:cx5="http://schemas.microsoft.com/office/drawing/2016/5/11/chartex" xmlns:cx6="http://schemas.microsoft.com/office/drawing/2016/5/12/chartex" xmlns:cx7="http://schemas.microsoft.com/office/drawing/2016/5/13/chartex" xmlns:cx8="http://schemas.microsoft.com/office/drawing/2016/5/14/chartex" xmlns:mc="http://schemas.openxmlformats.org/markup-compatibility/2006" xmlns:aink="http://schemas.microsoft.com/office/drawing/2016/ink" xmlns:am3d="http://schemas.microsoft.com/office/drawing/2017/model3d" xmlns:o="urn:schemas-microsoft-com:office:office" xmlns:oel="http://schemas.microsoft.com/office/2019/extlst" xmlns:r="http://schemas.openxmlformats.org/officeDocument/2006/relationships" xmlns:m="http://schemas.openxmlformats.org/officeDocument/2006/math" xmlns:v="urn:schemas-microsoft-com:vml" xmlns:wp14="http://schemas.microsoft.com/office/word/2010/wordprocessingDrawing" xmlns:wp="http://schemas.openxmlformats.org/drawingml/2006/wordprocessingDrawing" xmlns:w10="urn:schemas-microsoft-com:office:word" xmlns:w="http://schemas.openxmlformats.org/wordprocessingml/2006/main" xmlns:w14="http://schemas.microsoft.com/office/word/2010/wordml" xmlns:w15="http://schemas.microsoft.com/office/word/2012/wordml" xmlns:w16cex="http://schemas.microsoft.com/office/word/2018/wordml/cex" xmlns:w16cid="http://schemas.microsoft.com/office/word/2016/wordml/cid" xmlns:w16="http://schemas.microsoft.com/office/word/2018/wordml" xmlns:w16du="http://schemas.microsoft.com/office/word/2023/wordml/word16du" xmlns:w16sdtdh="http://schemas.microsoft.com/office/word/2020/wordml/sdtdatahash" xmlns:w16sdtfl="http://schemas.microsoft.com/office/word/2024/wordml/sdtformatlock" xmlns:w16se="http://schemas.microsoft.com/office/word/2015/wordml/symex" xmlns:wpg="http://schemas.microsoft.com/office/word/2010/wordprocessingGroup" xmlns:wpi="http://schemas.microsoft.com/office/word/2010/wordprocessingInk" xmlns:wne="http://schemas.microsoft.com/office/word/2006/wordml" xmlns:wps="http://schemas.microsoft.com/office/word/2010/wordprocessingShape" mc:Ignorable="w14 w15 w16se w16cid w16 w16cex w16sdtdh w16sdtfl w16du wp14">
   <w:body>
     <w:tbl>
       <w:tblPr>
@@ -38,16 +38,45 @@
                 <w:noProof/>
               </w:rPr>
               <w:drawing>
-                <wp:inline distT="0" distB="0" distL="114300" distR="114300">
+                <wp:anchor distT="0" distB="0" distL="114300" distR="114300" simplePos="0" relativeHeight="251659264" behindDoc="1" locked="0" layoutInCell="1" allowOverlap="1" wp14:anchorId="4D77D877" wp14:editId="66B5DCF9">
+                  <wp:simplePos x="0" y="0"/>
+                  <wp:positionH relativeFrom="column">
+                    <wp:posOffset>5715</wp:posOffset>
+                  </wp:positionH>
+                  <wp:positionV relativeFrom="paragraph">
+                    <wp:posOffset>224459</wp:posOffset>
+                  </wp:positionV>
                   <wp:extent cx="648970" cy="819785"/>
                   <wp:effectExtent l="0" t="0" r="0" b="0"/>
+                  <wp:wrapTight wrapText="bothSides">
+                    <wp:wrapPolygon edited="0">
+                      <wp:start x="8877" y="0"/>
+                      <wp:lineTo x="5072" y="2008"/>
+                      <wp:lineTo x="0" y="6525"/>
+                      <wp:lineTo x="0" y="10541"/>
+                      <wp:lineTo x="7609" y="16062"/>
+                      <wp:lineTo x="10779" y="16062"/>
+                      <wp:lineTo x="0" y="18070"/>
+                      <wp:lineTo x="0" y="21081"/>
+                      <wp:lineTo x="3170" y="21081"/>
+                      <wp:lineTo x="5706" y="21081"/>
+                      <wp:lineTo x="20924" y="21081"/>
+                      <wp:lineTo x="20924" y="18572"/>
+                      <wp:lineTo x="12681" y="16062"/>
+                      <wp:lineTo x="20924" y="9537"/>
+                      <wp:lineTo x="20924" y="6525"/>
+                      <wp:lineTo x="15851" y="2510"/>
+                      <wp:lineTo x="11413" y="0"/>
+                      <wp:lineTo x="8877" y="0"/>
+                    </wp:wrapPolygon>
+                  </wp:wrapTight>
                   <wp:docPr id="269144722" name="Picture 269144722"/>
                   <wp:cNvGraphicFramePr>
-                    <a:graphicFrameLocks noChangeAspect="1"/>
+                    <a:graphicFrameLocks xmlns:a="http://schemas.openxmlformats.org/drawingml/2006/main" noChangeAspect="1"/>
                   </wp:cNvGraphicFramePr>
-                  <a:graphic>
+                  <a:graphic xmlns:a="http://schemas.openxmlformats.org/drawingml/2006/main">
                     <a:graphicData uri="http://schemas.openxmlformats.org/drawingml/2006/picture">
-                      <pic:pic>
+                      <pic:pic xmlns:pic="http://schemas.openxmlformats.org/drawingml/2006/picture">
                         <pic:nvPicPr>
                           <pic:cNvPr id="1" name="Picture 1"/>
                           <pic:cNvPicPr>
@@ -58,7 +87,7 @@
                           <a:blip r:embed="rId7" cstate="print">
                             <a:extLst>
                               <a:ext uri="{28A0092B-C50C-407E-A947-70E740481C1C}">
-                                <ns7:useLocalDpi val="0"/>
+                                <a14:useLocalDpi xmlns:a14="http://schemas.microsoft.com/office/drawing/2010/main" val="0"/>
                               </a:ext>
                             </a:extLst>
                           </a:blip>
@@ -78,7 +107,7 @@
                       </pic:pic>
                     </a:graphicData>
                   </a:graphic>
-                </wp:inline>
+                </wp:anchor>
               </w:drawing>
             </w:r>
             <w:r>
@@ -86,16 +115,32 @@
                 <w:noProof/>
               </w:rPr>
               <w:drawing>
-                <wp:inline distT="0" distB="0" distL="114300" distR="114300">
+                <wp:anchor distT="0" distB="0" distL="114300" distR="114300" simplePos="0" relativeHeight="251658240" behindDoc="1" locked="0" layoutInCell="1" allowOverlap="1" wp14:anchorId="2179C7AA" wp14:editId="6CA944F7">
+                  <wp:simplePos x="0" y="0"/>
+                  <wp:positionH relativeFrom="column">
+                    <wp:posOffset>689379</wp:posOffset>
+                  </wp:positionH>
+                  <wp:positionV relativeFrom="paragraph">
+                    <wp:posOffset>-11875</wp:posOffset>
+                  </wp:positionV>
                   <wp:extent cx="78740" cy="1292225"/>
                   <wp:effectExtent l="0" t="0" r="0" b="3175"/>
+                  <wp:wrapTight wrapText="bothSides">
+                    <wp:wrapPolygon edited="0">
+                      <wp:start x="0" y="0"/>
+                      <wp:lineTo x="0" y="21335"/>
+                      <wp:lineTo x="15677" y="21335"/>
+                      <wp:lineTo x="15677" y="0"/>
+                      <wp:lineTo x="0" y="0"/>
+                    </wp:wrapPolygon>
+                  </wp:wrapTight>
                   <wp:docPr id="1716352736" name="Picture 1716352736"/>
                   <wp:cNvGraphicFramePr>
-                    <a:graphicFrameLocks noChangeAspect="1"/>
+                    <a:graphicFrameLocks xmlns:a="http://schemas.openxmlformats.org/drawingml/2006/main" noChangeAspect="1"/>
                   </wp:cNvGraphicFramePr>
-                  <a:graphic>
+                  <a:graphic xmlns:a="http://schemas.openxmlformats.org/drawingml/2006/main">
                     <a:graphicData uri="http://schemas.openxmlformats.org/drawingml/2006/picture">
-                      <pic:pic>
+                      <pic:pic xmlns:pic="http://schemas.openxmlformats.org/drawingml/2006/picture">
                         <pic:nvPicPr>
                           <pic:cNvPr id="2" name="Picture 2"/>
                           <pic:cNvPicPr>
@@ -106,7 +151,7 @@
                           <a:blip r:embed="rId8" cstate="print">
                             <a:extLst>
                               <a:ext uri="{28A0092B-C50C-407E-A947-70E740481C1C}">
-                                <ns7:useLocalDpi val="0"/>
+                                <a14:useLocalDpi xmlns:a14="http://schemas.microsoft.com/office/drawing/2010/main" val="0"/>
                               </a:ext>
                             </a:extLst>
                           </a:blip>
@@ -126,7 +171,7 @@
                       </pic:pic>
                     </a:graphicData>
                   </a:graphic>
-                </wp:inline>
+                </wp:anchor>
               </w:drawing>
             </w:r>
           </w:p>
@@ -143,6 +188,7 @@
           <w:tbl>
             <w:tblPr>
               <w:tblStyle w:val="TableGrid"/>
+              <w:tblpPr w:leftFromText="180" w:rightFromText="180" w:vertAnchor="page" w:horzAnchor="margin" w:tblpY="515"/>
               <w:tblOverlap w:val="never"/>
               <w:tblW w:w="0" w:type="auto"/>
               <w:tblBorders>
@@ -387,6 +433,7 @@
           <w:tbl>
             <w:tblPr>
               <w:tblStyle w:val="TableGrid"/>
+              <w:tblpPr w:leftFromText="180" w:rightFromText="180" w:vertAnchor="text" w:horzAnchor="page" w:tblpX="1997" w:tblpY="-27"/>
               <w:tblOverlap w:val="never"/>
               <w:tblW w:w="0" w:type="auto"/>
               <w:tblBorders>
@@ -3235,6 +3282,7 @@
     <w:tbl>
       <w:tblPr>
         <w:tblStyle w:val="TableGrid"/>
+        <w:tblpPr w:leftFromText="180" w:rightFromText="180" w:vertAnchor="page" w:horzAnchor="margin" w:tblpXSpec="center" w:tblpY="2283"/>
         <w:tblW w:w="0" w:type="auto"/>
         <w:tblBorders>
           <w:top w:val="none" w:sz="0" w:space="0" w:color="auto"/>

</xml_diff>

<commit_message>
revert(templates): restore all templates to pristine original state from 071af7f
</commit_message>
<xml_diff>
--- a/backend/templates/Berkas Luar Kota - Laporan.docx
+++ b/backend/templates/Berkas Luar Kota - Laporan.docx
@@ -1,287 +1,7 @@
 
 <file path=word/document.xml><?xml version="1.0" encoding="utf-8"?>
-<w:document xmlns:wpc="http://schemas.microsoft.com/office/word/2010/wordprocessingCanvas" xmlns:cx="http://schemas.microsoft.com/office/drawing/2014/chartex" xmlns:cx1="http://schemas.microsoft.com/office/drawing/2015/9/8/chartex" xmlns:cx2="http://schemas.microsoft.com/office/drawing/2015/10/21/chartex" xmlns:cx3="http://schemas.microsoft.com/office/drawing/2016/5/9/chartex" xmlns:cx4="http://schemas.microsoft.com/office/drawing/2016/5/10/chartex" xmlns:cx5="http://schemas.microsoft.com/office/drawing/2016/5/11/chartex" xmlns:cx6="http://schemas.microsoft.com/office/drawing/2016/5/12/chartex" xmlns:cx7="http://schemas.microsoft.com/office/drawing/2016/5/13/chartex" xmlns:cx8="http://schemas.microsoft.com/office/drawing/2016/5/14/chartex" xmlns:mc="http://schemas.openxmlformats.org/markup-compatibility/2006" xmlns:aink="http://schemas.microsoft.com/office/drawing/2016/ink" xmlns:am3d="http://schemas.microsoft.com/office/drawing/2017/model3d" xmlns:o="urn:schemas-microsoft-com:office:office" xmlns:oel="http://schemas.microsoft.com/office/2019/extlst" xmlns:r="http://schemas.openxmlformats.org/officeDocument/2006/relationships" xmlns:m="http://schemas.openxmlformats.org/officeDocument/2006/math" xmlns:v="urn:schemas-microsoft-com:vml" xmlns:wp14="http://schemas.microsoft.com/office/word/2010/wordprocessingDrawing" xmlns:wp="http://schemas.openxmlformats.org/drawingml/2006/wordprocessingDrawing" xmlns:w10="urn:schemas-microsoft-com:office:word" xmlns:w="http://schemas.openxmlformats.org/wordprocessingml/2006/main" xmlns:w14="http://schemas.microsoft.com/office/word/2010/wordml" xmlns:w15="http://schemas.microsoft.com/office/word/2012/wordml" xmlns:w16cex="http://schemas.microsoft.com/office/word/2018/wordml/cex" xmlns:w16cid="http://schemas.microsoft.com/office/word/2016/wordml/cid" xmlns:w16="http://schemas.microsoft.com/office/word/2018/wordml" xmlns:w16du="http://schemas.microsoft.com/office/word/2023/wordml/word16du" xmlns:w16sdtdh="http://schemas.microsoft.com/office/word/2020/wordml/sdtdatahash" xmlns:w16sdtfl="http://schemas.microsoft.com/office/word/2024/wordml/sdtformatlock" xmlns:w16se="http://schemas.microsoft.com/office/word/2015/wordml/symex" xmlns:wpg="http://schemas.microsoft.com/office/word/2010/wordprocessingGroup" xmlns:wpi="http://schemas.microsoft.com/office/word/2010/wordprocessingInk" xmlns:wne="http://schemas.microsoft.com/office/word/2006/wordml" xmlns:wps="http://schemas.microsoft.com/office/word/2010/wordprocessingShape" mc:Ignorable="w14 w15 w16se w16cid w16 w16cex w16sdtdh w16sdtfl w16du wp14">
+<w:document xmlns:wpc="http://schemas.microsoft.com/office/word/2010/wordprocessingCanvas" xmlns:cx="http://schemas.microsoft.com/office/drawing/2014/chartex" xmlns:cx1="http://schemas.microsoft.com/office/drawing/2015/9/8/chartex" xmlns:cx2="http://schemas.microsoft.com/office/drawing/2015/10/21/chartex" xmlns:cx3="http://schemas.microsoft.com/office/drawing/2016/5/9/chartex" xmlns:cx4="http://schemas.microsoft.com/office/drawing/2016/5/10/chartex" xmlns:cx5="http://schemas.microsoft.com/office/drawing/2016/5/11/chartex" xmlns:cx6="http://schemas.microsoft.com/office/drawing/2016/5/12/chartex" xmlns:cx7="http://schemas.microsoft.com/office/drawing/2016/5/13/chartex" xmlns:cx8="http://schemas.microsoft.com/office/drawing/2016/5/14/chartex" xmlns:mc="http://schemas.openxmlformats.org/markup-compatibility/2006" xmlns:aink="http://schemas.microsoft.com/office/drawing/2016/ink" xmlns:am3d="http://schemas.microsoft.com/office/drawing/2017/model3d" xmlns:o="urn:schemas-microsoft-com:office:office" xmlns:oel="http://schemas.microsoft.com/office/2019/extlst" xmlns:r="http://schemas.openxmlformats.org/officeDocument/2006/relationships" xmlns:m="http://schemas.openxmlformats.org/officeDocument/2006/math" xmlns:v="urn:schemas-microsoft-com:vml" xmlns:wp14="http://schemas.microsoft.com/office/word/2010/wordprocessingDrawing" xmlns:wp="http://schemas.openxmlformats.org/drawingml/2006/wordprocessingDrawing" xmlns:w10="urn:schemas-microsoft-com:office:word" xmlns:w="http://schemas.openxmlformats.org/wordprocessingml/2006/main" xmlns:w14="http://schemas.microsoft.com/office/word/2010/wordml" xmlns:w15="http://schemas.microsoft.com/office/word/2012/wordml" xmlns:w16cex="http://schemas.microsoft.com/office/word/2018/wordml/cex" xmlns:w16cid="http://schemas.microsoft.com/office/word/2016/wordml/cid" xmlns:w16="http://schemas.microsoft.com/office/word/2018/wordml" xmlns:w16sdtdh="http://schemas.microsoft.com/office/word/2020/wordml/sdtdatahash" xmlns:w16se="http://schemas.microsoft.com/office/word/2015/wordml/symex" xmlns:wpg="http://schemas.microsoft.com/office/word/2010/wordprocessingGroup" xmlns:wpi="http://schemas.microsoft.com/office/word/2010/wordprocessingInk" xmlns:wne="http://schemas.microsoft.com/office/word/2006/wordml" xmlns:wps="http://schemas.microsoft.com/office/word/2010/wordprocessingShape" mc:Ignorable="w14 w15 w16se w16cid w16 w16cex w16sdtdh wp14">
   <w:body>
-    <w:tbl>
-      <w:tblPr>
-        <w:tblStyle w:val="TableGrid"/>
-        <w:tblW w:w="10915" w:type="dxa"/>
-        <w:tblInd w:w="108" w:type="dxa"/>
-        <w:tblBorders>
-          <w:top w:val="none" w:sz="0" w:space="0" w:color="auto"/>
-          <w:left w:val="none" w:sz="0" w:space="0" w:color="auto"/>
-          <w:bottom w:val="none" w:sz="0" w:space="0" w:color="auto"/>
-          <w:right w:val="none" w:sz="0" w:space="0" w:color="auto"/>
-          <w:insideH w:val="none" w:sz="0" w:space="0" w:color="auto"/>
-          <w:insideV w:val="none" w:sz="0" w:space="0" w:color="auto"/>
-        </w:tblBorders>
-        <w:tblLook w:val="04A0" w:firstRow="1" w:lastRow="0" w:firstColumn="1" w:lastColumn="0" w:noHBand="0" w:noVBand="1"/>
-      </w:tblPr>
-      <w:tblGrid>
-        <w:gridCol w:w="1322"/>
-        <w:gridCol w:w="9593"/>
-      </w:tblGrid>
-      <w:tr>
-        <w:trPr>
-          <w:trHeight w:val="1867"/>
-        </w:trPr>
-        <w:tc>
-          <w:tcPr>
-            <w:tcW w:w="1322" w:type="dxa"/>
-          </w:tcPr>
-          <w:p>
-            <w:pPr>
-              <w:pStyle w:val="Header"/>
-            </w:pPr>
-            <w:r>
-              <w:rPr>
-                <w:noProof/>
-              </w:rPr>
-              <w:drawing>
-                <wp:anchor distT="0" distB="0" distL="114300" distR="114300" simplePos="0" relativeHeight="251659264" behindDoc="1" locked="0" layoutInCell="1" allowOverlap="1" wp14:anchorId="4D77D877" wp14:editId="66B5DCF9">
-                  <wp:simplePos x="0" y="0"/>
-                  <wp:positionH relativeFrom="column">
-                    <wp:posOffset>5715</wp:posOffset>
-                  </wp:positionH>
-                  <wp:positionV relativeFrom="paragraph">
-                    <wp:posOffset>224459</wp:posOffset>
-                  </wp:positionV>
-                  <wp:extent cx="648970" cy="819785"/>
-                  <wp:effectExtent l="0" t="0" r="0" b="0"/>
-                  <wp:wrapTight wrapText="bothSides">
-                    <wp:wrapPolygon edited="0">
-                      <wp:start x="8877" y="0"/>
-                      <wp:lineTo x="5072" y="2008"/>
-                      <wp:lineTo x="0" y="6525"/>
-                      <wp:lineTo x="0" y="10541"/>
-                      <wp:lineTo x="7609" y="16062"/>
-                      <wp:lineTo x="10779" y="16062"/>
-                      <wp:lineTo x="0" y="18070"/>
-                      <wp:lineTo x="0" y="21081"/>
-                      <wp:lineTo x="3170" y="21081"/>
-                      <wp:lineTo x="5706" y="21081"/>
-                      <wp:lineTo x="20924" y="21081"/>
-                      <wp:lineTo x="20924" y="18572"/>
-                      <wp:lineTo x="12681" y="16062"/>
-                      <wp:lineTo x="20924" y="9537"/>
-                      <wp:lineTo x="20924" y="6525"/>
-                      <wp:lineTo x="15851" y="2510"/>
-                      <wp:lineTo x="11413" y="0"/>
-                      <wp:lineTo x="8877" y="0"/>
-                    </wp:wrapPolygon>
-                  </wp:wrapTight>
-                  <wp:docPr id="269144722" name="Picture 269144722"/>
-                  <wp:cNvGraphicFramePr>
-                    <a:graphicFrameLocks xmlns:a="http://schemas.openxmlformats.org/drawingml/2006/main" noChangeAspect="1"/>
-                  </wp:cNvGraphicFramePr>
-                  <a:graphic xmlns:a="http://schemas.openxmlformats.org/drawingml/2006/main">
-                    <a:graphicData uri="http://schemas.openxmlformats.org/drawingml/2006/picture">
-                      <pic:pic xmlns:pic="http://schemas.openxmlformats.org/drawingml/2006/picture">
-                        <pic:nvPicPr>
-                          <pic:cNvPr id="1" name="Picture 1"/>
-                          <pic:cNvPicPr>
-                            <a:picLocks noChangeAspect="1"/>
-                          </pic:cNvPicPr>
-                        </pic:nvPicPr>
-                        <pic:blipFill>
-                          <a:blip r:embed="rId7" cstate="print">
-                            <a:extLst>
-                              <a:ext uri="{28A0092B-C50C-407E-A947-70E740481C1C}">
-                                <a14:useLocalDpi xmlns:a14="http://schemas.microsoft.com/office/drawing/2010/main" val="0"/>
-                              </a:ext>
-                            </a:extLst>
-                          </a:blip>
-                          <a:stretch>
-                            <a:fillRect/>
-                          </a:stretch>
-                        </pic:blipFill>
-                        <pic:spPr>
-                          <a:xfrm>
-                            <a:off x="0" y="0"/>
-                            <a:ext cx="648970" cy="819785"/>
-                          </a:xfrm>
-                          <a:prstGeom prst="rect">
-                            <a:avLst/>
-                          </a:prstGeom>
-                        </pic:spPr>
-                      </pic:pic>
-                    </a:graphicData>
-                  </a:graphic>
-                </wp:anchor>
-              </w:drawing>
-            </w:r>
-            <w:r>
-              <w:rPr>
-                <w:noProof/>
-              </w:rPr>
-              <w:drawing>
-                <wp:anchor distT="0" distB="0" distL="114300" distR="114300" simplePos="0" relativeHeight="251658240" behindDoc="1" locked="0" layoutInCell="1" allowOverlap="1" wp14:anchorId="2179C7AA" wp14:editId="6CA944F7">
-                  <wp:simplePos x="0" y="0"/>
-                  <wp:positionH relativeFrom="column">
-                    <wp:posOffset>689379</wp:posOffset>
-                  </wp:positionH>
-                  <wp:positionV relativeFrom="paragraph">
-                    <wp:posOffset>-11875</wp:posOffset>
-                  </wp:positionV>
-                  <wp:extent cx="78740" cy="1292225"/>
-                  <wp:effectExtent l="0" t="0" r="0" b="3175"/>
-                  <wp:wrapTight wrapText="bothSides">
-                    <wp:wrapPolygon edited="0">
-                      <wp:start x="0" y="0"/>
-                      <wp:lineTo x="0" y="21335"/>
-                      <wp:lineTo x="15677" y="21335"/>
-                      <wp:lineTo x="15677" y="0"/>
-                      <wp:lineTo x="0" y="0"/>
-                    </wp:wrapPolygon>
-                  </wp:wrapTight>
-                  <wp:docPr id="1716352736" name="Picture 1716352736"/>
-                  <wp:cNvGraphicFramePr>
-                    <a:graphicFrameLocks xmlns:a="http://schemas.openxmlformats.org/drawingml/2006/main" noChangeAspect="1"/>
-                  </wp:cNvGraphicFramePr>
-                  <a:graphic xmlns:a="http://schemas.openxmlformats.org/drawingml/2006/main">
-                    <a:graphicData uri="http://schemas.openxmlformats.org/drawingml/2006/picture">
-                      <pic:pic xmlns:pic="http://schemas.openxmlformats.org/drawingml/2006/picture">
-                        <pic:nvPicPr>
-                          <pic:cNvPr id="2" name="Picture 2"/>
-                          <pic:cNvPicPr>
-                            <a:picLocks noChangeAspect="1"/>
-                          </pic:cNvPicPr>
-                        </pic:nvPicPr>
-                        <pic:blipFill>
-                          <a:blip r:embed="rId8" cstate="print">
-                            <a:extLst>
-                              <a:ext uri="{28A0092B-C50C-407E-A947-70E740481C1C}">
-                                <a14:useLocalDpi xmlns:a14="http://schemas.microsoft.com/office/drawing/2010/main" val="0"/>
-                              </a:ext>
-                            </a:extLst>
-                          </a:blip>
-                          <a:stretch>
-                            <a:fillRect/>
-                          </a:stretch>
-                        </pic:blipFill>
-                        <pic:spPr>
-                          <a:xfrm>
-                            <a:off x="0" y="0"/>
-                            <a:ext cx="78740" cy="1292225"/>
-                          </a:xfrm>
-                          <a:prstGeom prst="rect">
-                            <a:avLst/>
-                          </a:prstGeom>
-                        </pic:spPr>
-                      </pic:pic>
-                    </a:graphicData>
-                  </a:graphic>
-                </wp:anchor>
-              </w:drawing>
-            </w:r>
-          </w:p>
-          <w:p>
-            <w:pPr>
-              <w:pStyle w:val="Header"/>
-            </w:pPr>
-          </w:p>
-        </w:tc>
-        <w:tc>
-          <w:tcPr>
-            <w:tcW w:w="9593" w:type="dxa"/>
-          </w:tcPr>
-          <w:tbl>
-            <w:tblPr>
-              <w:tblStyle w:val="TableGrid"/>
-              <w:tblpPr w:leftFromText="180" w:rightFromText="180" w:vertAnchor="page" w:horzAnchor="margin" w:tblpY="515"/>
-              <w:tblOverlap w:val="never"/>
-              <w:tblW w:w="0" w:type="auto"/>
-              <w:tblBorders>
-                <w:top w:val="none" w:sz="0" w:space="0" w:color="auto"/>
-                <w:left w:val="none" w:sz="0" w:space="0" w:color="auto"/>
-                <w:bottom w:val="none" w:sz="0" w:space="0" w:color="auto"/>
-                <w:right w:val="none" w:sz="0" w:space="0" w:color="auto"/>
-                <w:insideH w:val="none" w:sz="0" w:space="0" w:color="auto"/>
-                <w:insideV w:val="none" w:sz="0" w:space="0" w:color="auto"/>
-              </w:tblBorders>
-              <w:tblLook w:val="04A0" w:firstRow="1" w:lastRow="0" w:firstColumn="1" w:lastColumn="0" w:noHBand="0" w:noVBand="1"/>
-            </w:tblPr>
-            <w:tblGrid>
-              <w:gridCol w:w="8505"/>
-            </w:tblGrid>
-            <w:tr>
-              <w:tc>
-                <w:tcPr>
-                  <w:tcW w:w="8505" w:type="dxa"/>
-                </w:tcPr>
-                <w:p>
-                  <w:pPr>
-                    <w:rPr>
-                      <w:rFonts w:ascii="Arial Narrow" w:hAnsi="Arial Narrow"/>
-                      <w:b/>
-                      <w:bCs/>
-                      <w:sz w:val="29"/>
-                      <w:szCs w:val="29"/>
-                    </w:rPr>
-                  </w:pPr>
-                  <w:r>
-                    <w:rPr>
-                      <w:rFonts w:ascii="Arial Narrow" w:hAnsi="Arial Narrow"/>
-                      <w:b/>
-                      <w:bCs/>
-                      <w:sz w:val="29"/>
-                      <w:szCs w:val="29"/>
-                    </w:rPr>
-                    <w:t>KEMENTERIAN KETENAGAKERJAAN REPUBLIK INDONESIA</w:t>
-                  </w:r>
-                </w:p>
-              </w:tc>
-            </w:tr>
-            <w:tr>
-              <w:tc>
-                <w:tcPr>
-                  <w:tcW w:w="8505" w:type="dxa"/>
-                </w:tcPr>
-                <w:p>
-                  <w:pPr>
-                    <w:rPr>
-                      <w:rFonts w:ascii="Arial Narrow" w:hAnsi="Arial Narrow"/>
-                      <w:color w:val="284A61"/>
-                      <w:sz w:val="32"/>
-                      <w:szCs w:val="32"/>
-                    </w:rPr>
-                  </w:pPr>
-                  <w:r>
-                    <w:rPr>
-                      <w:rFonts w:ascii="Arial Narrow" w:hAnsi="Arial Narrow"/>
-                      <w:color w:val="284A61"/>
-                      <w:sz w:val="29"/>
-                      <w:szCs w:val="29"/>
-                    </w:rPr>
-                    <w:t>SEKRETARIAT JENDERAL</w:t>
-                  </w:r>
-                </w:p>
-              </w:tc>
-            </w:tr>
-          </w:tbl>
-          <w:p>
-            <w:pPr>
-              <w:rPr>
-                <w:rFonts w:ascii="Arial Narrow" w:hAnsi="Arial Narrow"/>
-                <w:color w:val="284A61"/>
-                <w:sz w:val="32"/>
-                <w:szCs w:val="32"/>
-              </w:rPr>
-            </w:pPr>
-          </w:p>
-        </w:tc>
-      </w:tr>
-    </w:tbl>
-    <w:p>
-      <w:pPr>
-        <w:pStyle w:val="Heading1"/>
-        <w:ind w:left="0" w:right="137"/>
-        <w:jc w:val="center"/>
-        <w:rPr>
-          <w:spacing w:val="-2"/>
-        </w:rPr>
-      </w:pPr>
-    </w:p>
     <w:p>
       <w:pPr>
         <w:pStyle w:val="Heading1"/>
@@ -423,7 +143,7 @@
         <w:tblLook w:val="04A0" w:firstRow="1" w:lastRow="0" w:firstColumn="1" w:lastColumn="0" w:noHBand="0" w:noVBand="1"/>
       </w:tblPr>
       <w:tblGrid>
-        <w:gridCol w:w="9484"/>
+        <w:gridCol w:w="9478"/>
       </w:tblGrid>
       <w:tr>
         <w:tc>
@@ -1335,7 +1055,7 @@
               <w:tblLook w:val="04A0" w:firstRow="1" w:lastRow="0" w:firstColumn="1" w:lastColumn="0" w:noHBand="0" w:noVBand="1"/>
             </w:tblPr>
             <w:tblGrid>
-              <w:gridCol w:w="1453"/>
+              <w:gridCol w:w="1452"/>
             </w:tblGrid>
             <w:tr>
               <w:tc>
@@ -1480,44 +1200,50 @@
       <w:pPr>
         <w:pStyle w:val="BodyText"/>
         <w:spacing w:before="1"/>
-        <w:ind w:left="1225" w:right="447"/>
+        <w:ind w:left="1225"/>
         <w:jc w:val="both"/>
         <w:rPr>
           <w:lang w:val="en-US"/>
         </w:rPr>
+        <w:sectPr>
+          <w:headerReference w:type="even" r:id="rId7"/>
+          <w:headerReference w:type="default" r:id="rId8"/>
+          <w:footerReference w:type="even" r:id="rId9"/>
+          <w:footerReference w:type="default" r:id="rId10"/>
+          <w:headerReference w:type="first" r:id="rId11"/>
+          <w:footerReference w:type="first" r:id="rId12"/>
+          <w:type w:val="continuous"/>
+          <w:pgSz w:w="12240" w:h="20160"/>
+          <w:pgMar w:top="1200" w:right="1080" w:bottom="280" w:left="1080" w:header="340" w:footer="720" w:gutter="0"/>
+          <w:cols w:space="720"/>
+          <w:docGrid w:linePitch="299"/>
+        </w:sectPr>
       </w:pPr>
       <w:r>
         <w:rPr>
           <w:lang w:val="en-US"/>
         </w:rPr>
-        <w:t>{{isi_laporan}}</w:t>
+        <w:t>{{</w:t>
+      </w:r>
+      <w:proofErr w:type="spellStart"/>
+      <w:r>
+        <w:rPr>
+          <w:lang w:val="en-US"/>
+        </w:rPr>
+        <w:t>isi_laporan</w:t>
+      </w:r>
+      <w:proofErr w:type="spellEnd"/>
+      <w:r>
+        <w:rPr>
+          <w:lang w:val="en-US"/>
+        </w:rPr>
+        <w:t>}}</w:t>
       </w:r>
     </w:p>
     <w:p>
       <w:pPr>
         <w:pStyle w:val="BodyText"/>
-        <w:spacing w:before="1"/>
-        <w:jc w:val="both"/>
-        <w:rPr>
-          <w:lang w:val="en-US"/>
-        </w:rPr>
-      </w:pPr>
-    </w:p>
-    <w:p>
-      <w:pPr>
-        <w:pStyle w:val="BodyText"/>
-        <w:spacing w:before="1"/>
-        <w:jc w:val="both"/>
-        <w:rPr>
-          <w:lang w:val="en-US"/>
-        </w:rPr>
-      </w:pPr>
-    </w:p>
-    <w:p>
-      <w:pPr>
-        <w:pStyle w:val="BodyText"/>
-        <w:spacing w:before="1"/>
-        <w:jc w:val="both"/>
+        <w:spacing w:before="51"/>
       </w:pPr>
     </w:p>
     <w:p>
@@ -1769,8 +1495,8 @@
       </w:tblPr>
       <w:tblGrid>
         <w:gridCol w:w="782"/>
-        <w:gridCol w:w="6236"/>
-        <w:gridCol w:w="2636"/>
+        <w:gridCol w:w="6233"/>
+        <w:gridCol w:w="2634"/>
       </w:tblGrid>
       <w:tr>
         <w:trPr>
@@ -1795,8 +1521,15 @@
                 <w:spacing w:val="-2"/>
                 <w:lang w:val="en-US"/>
               </w:rPr>
-              <w:lastRenderedPageBreak/>
-              <w:t>{{no_urut</w:t>
+              <w:t>{{</w:t>
+            </w:r>
+            <w:proofErr w:type="spellStart"/>
+            <w:r>
+              <w:rPr>
+                <w:spacing w:val="-2"/>
+                <w:lang w:val="en-US"/>
+              </w:rPr>
+              <w:t>no_urut</w:t>
             </w:r>
             <w:r>
               <w:rPr>
@@ -1805,6 +1538,7 @@
               </w:rPr>
               <w:t>_satu</w:t>
             </w:r>
+            <w:proofErr w:type="spellEnd"/>
             <w:r>
               <w:rPr>
                 <w:spacing w:val="-2"/>
@@ -1830,7 +1564,21 @@
               <w:rPr>
                 <w:lang w:val="en-US"/>
               </w:rPr>
-              <w:t>{{nama_petugas_satu}}</w:t>
+              <w:t>{{</w:t>
+            </w:r>
+            <w:proofErr w:type="spellStart"/>
+            <w:r>
+              <w:rPr>
+                <w:lang w:val="en-US"/>
+              </w:rPr>
+              <w:t>nama_petugas_satu</w:t>
+            </w:r>
+            <w:proofErr w:type="spellEnd"/>
+            <w:r>
+              <w:rPr>
+                <w:lang w:val="en-US"/>
+              </w:rPr>
+              <w:t>}}</w:t>
             </w:r>
           </w:p>
           <w:p>
@@ -1863,7 +1611,21 @@
               <w:rPr>
                 <w:lang w:val="en-US"/>
               </w:rPr>
-              <w:t>NIP. {{nip_petugas_satu}}</w:t>
+              <w:t>NIP. {{</w:t>
+            </w:r>
+            <w:proofErr w:type="spellStart"/>
+            <w:r>
+              <w:rPr>
+                <w:lang w:val="en-US"/>
+              </w:rPr>
+              <w:t>nip_petugas_satu</w:t>
+            </w:r>
+            <w:proofErr w:type="spellEnd"/>
+            <w:r>
+              <w:rPr>
+                <w:lang w:val="en-US"/>
+              </w:rPr>
+              <w:t>}}</w:t>
             </w:r>
           </w:p>
         </w:tc>
@@ -1882,7 +1644,15 @@
                 <w:spacing w:val="-2"/>
                 <w:lang w:val="en-US"/>
               </w:rPr>
-              <w:t>{{no_urut</w:t>
+              <w:t>{{</w:t>
+            </w:r>
+            <w:proofErr w:type="spellStart"/>
+            <w:r>
+              <w:rPr>
+                <w:spacing w:val="-2"/>
+                <w:lang w:val="en-US"/>
+              </w:rPr>
+              <w:t>no_urut</w:t>
             </w:r>
             <w:r>
               <w:rPr>
@@ -1891,6 +1661,7 @@
               </w:rPr>
               <w:t>_satu</w:t>
             </w:r>
+            <w:proofErr w:type="spellEnd"/>
             <w:proofErr w:type="gramStart"/>
             <w:r>
               <w:rPr>
@@ -1910,16 +1681,8 @@
               <w:rPr>
                 <w:spacing w:val="-2"/>
               </w:rPr>
-              <w:t>………………</w:t>
-            </w:r>
-            <w:proofErr w:type="gramStart"/>
-            <w:r>
-              <w:rPr>
-                <w:spacing w:val="-2"/>
-              </w:rPr>
-              <w:t>…..</w:t>
-            </w:r>
-            <w:proofErr w:type="gramEnd"/>
+              <w:t>…………………..</w:t>
+            </w:r>
           </w:p>
         </w:tc>
       </w:tr>
@@ -1947,7 +1710,23 @@
                 <w:spacing w:val="-2"/>
                 <w:lang w:val="en-US"/>
               </w:rPr>
-              <w:t>{{no_urut_dua}}</w:t>
+              <w:t>{{</w:t>
+            </w:r>
+            <w:proofErr w:type="spellStart"/>
+            <w:r>
+              <w:rPr>
+                <w:spacing w:val="-2"/>
+                <w:lang w:val="en-US"/>
+              </w:rPr>
+              <w:t>no_urut_dua</w:t>
+            </w:r>
+            <w:proofErr w:type="spellEnd"/>
+            <w:r>
+              <w:rPr>
+                <w:spacing w:val="-2"/>
+                <w:lang w:val="en-US"/>
+              </w:rPr>
+              <w:t>}}</w:t>
             </w:r>
           </w:p>
         </w:tc>
@@ -1967,7 +1746,14 @@
               <w:rPr>
                 <w:lang w:val="en-US"/>
               </w:rPr>
-              <w:t>{{nama_petugas_</w:t>
+              <w:t>{{</w:t>
+            </w:r>
+            <w:proofErr w:type="spellStart"/>
+            <w:r>
+              <w:rPr>
+                <w:lang w:val="en-US"/>
+              </w:rPr>
+              <w:t>nama_petugas_</w:t>
             </w:r>
             <w:r>
               <w:rPr>
@@ -1975,6 +1761,7 @@
               </w:rPr>
               <w:t>dua</w:t>
             </w:r>
+            <w:proofErr w:type="spellEnd"/>
             <w:r>
               <w:rPr>
                 <w:lang w:val="en-US"/>
@@ -2003,7 +1790,21 @@
               <w:rPr>
                 <w:lang w:val="en-US"/>
               </w:rPr>
-              <w:t>NIP. {{nip_petugas_dua}}</w:t>
+              <w:t>NIP. {{</w:t>
+            </w:r>
+            <w:proofErr w:type="spellStart"/>
+            <w:r>
+              <w:rPr>
+                <w:lang w:val="en-US"/>
+              </w:rPr>
+              <w:t>nip_petugas_dua</w:t>
+            </w:r>
+            <w:proofErr w:type="spellEnd"/>
+            <w:r>
+              <w:rPr>
+                <w:lang w:val="en-US"/>
+              </w:rPr>
+              <w:t>}}</w:t>
             </w:r>
           </w:p>
         </w:tc>
@@ -2026,7 +1827,15 @@
                 <w:spacing w:val="-2"/>
                 <w:lang w:val="en-US"/>
               </w:rPr>
-              <w:t>{{no_urut_</w:t>
+              <w:t>{{</w:t>
+            </w:r>
+            <w:proofErr w:type="spellStart"/>
+            <w:r>
+              <w:rPr>
+                <w:spacing w:val="-2"/>
+                <w:lang w:val="en-US"/>
+              </w:rPr>
+              <w:t>no_urut_</w:t>
             </w:r>
             <w:r>
               <w:rPr>
@@ -2035,6 +1844,7 @@
               </w:rPr>
               <w:t>dua</w:t>
             </w:r>
+            <w:proofErr w:type="spellEnd"/>
             <w:proofErr w:type="gramStart"/>
             <w:r>
               <w:rPr>
@@ -2054,16 +1864,8 @@
               <w:rPr>
                 <w:spacing w:val="-2"/>
               </w:rPr>
-              <w:t>………………</w:t>
-            </w:r>
-            <w:proofErr w:type="gramStart"/>
-            <w:r>
-              <w:rPr>
-                <w:spacing w:val="-2"/>
-              </w:rPr>
-              <w:t>…..</w:t>
-            </w:r>
-            <w:proofErr w:type="gramEnd"/>
+              <w:t>…………………..</w:t>
+            </w:r>
           </w:p>
         </w:tc>
       </w:tr>
@@ -2091,7 +1893,23 @@
                 <w:spacing w:val="-2"/>
                 <w:lang w:val="en-US"/>
               </w:rPr>
-              <w:t>{{no_urut_tiga}}</w:t>
+              <w:t>{{</w:t>
+            </w:r>
+            <w:proofErr w:type="spellStart"/>
+            <w:r>
+              <w:rPr>
+                <w:spacing w:val="-2"/>
+                <w:lang w:val="en-US"/>
+              </w:rPr>
+              <w:t>no_urut_tiga</w:t>
+            </w:r>
+            <w:proofErr w:type="spellEnd"/>
+            <w:r>
+              <w:rPr>
+                <w:spacing w:val="-2"/>
+                <w:lang w:val="en-US"/>
+              </w:rPr>
+              <w:t>}}</w:t>
             </w:r>
           </w:p>
         </w:tc>
@@ -2111,7 +1929,14 @@
               <w:rPr>
                 <w:lang w:val="en-US"/>
               </w:rPr>
-              <w:t>{{nama_petugas_</w:t>
+              <w:t>{{</w:t>
+            </w:r>
+            <w:proofErr w:type="spellStart"/>
+            <w:r>
+              <w:rPr>
+                <w:lang w:val="en-US"/>
+              </w:rPr>
+              <w:t>nama_petugas_</w:t>
             </w:r>
             <w:r>
               <w:rPr>
@@ -2119,6 +1944,7 @@
               </w:rPr>
               <w:t>tiga</w:t>
             </w:r>
+            <w:proofErr w:type="spellEnd"/>
             <w:r>
               <w:rPr>
                 <w:lang w:val="en-US"/>
@@ -2147,7 +1973,21 @@
               <w:rPr>
                 <w:lang w:val="en-US"/>
               </w:rPr>
-              <w:t>NIP. {{nip_petugas_tiga}}</w:t>
+              <w:t>NIP. {{</w:t>
+            </w:r>
+            <w:proofErr w:type="spellStart"/>
+            <w:r>
+              <w:rPr>
+                <w:lang w:val="en-US"/>
+              </w:rPr>
+              <w:t>nip_petugas_tiga</w:t>
+            </w:r>
+            <w:proofErr w:type="spellEnd"/>
+            <w:r>
+              <w:rPr>
+                <w:lang w:val="en-US"/>
+              </w:rPr>
+              <w:t>}}</w:t>
             </w:r>
           </w:p>
         </w:tc>
@@ -2170,7 +2010,15 @@
                 <w:spacing w:val="-2"/>
                 <w:lang w:val="en-US"/>
               </w:rPr>
-              <w:t>{{no_urut_</w:t>
+              <w:t>{{</w:t>
+            </w:r>
+            <w:proofErr w:type="spellStart"/>
+            <w:r>
+              <w:rPr>
+                <w:spacing w:val="-2"/>
+                <w:lang w:val="en-US"/>
+              </w:rPr>
+              <w:t>no_urut_</w:t>
             </w:r>
             <w:r>
               <w:rPr>
@@ -2179,6 +2027,7 @@
               </w:rPr>
               <w:t>tiga</w:t>
             </w:r>
+            <w:proofErr w:type="spellEnd"/>
             <w:proofErr w:type="gramStart"/>
             <w:r>
               <w:rPr>
@@ -2198,16 +2047,8 @@
               <w:rPr>
                 <w:spacing w:val="-2"/>
               </w:rPr>
-              <w:t>………………</w:t>
-            </w:r>
-            <w:proofErr w:type="gramStart"/>
-            <w:r>
-              <w:rPr>
-                <w:spacing w:val="-2"/>
-              </w:rPr>
-              <w:t>…..</w:t>
-            </w:r>
-            <w:proofErr w:type="gramEnd"/>
+              <w:t>…………………..</w:t>
+            </w:r>
           </w:p>
         </w:tc>
       </w:tr>
@@ -2235,7 +2076,23 @@
                 <w:spacing w:val="-2"/>
                 <w:lang w:val="en-US"/>
               </w:rPr>
-              <w:t>{{no_urut_empat}}</w:t>
+              <w:t>{{</w:t>
+            </w:r>
+            <w:proofErr w:type="spellStart"/>
+            <w:r>
+              <w:rPr>
+                <w:spacing w:val="-2"/>
+                <w:lang w:val="en-US"/>
+              </w:rPr>
+              <w:t>no_urut_empat</w:t>
+            </w:r>
+            <w:proofErr w:type="spellEnd"/>
+            <w:r>
+              <w:rPr>
+                <w:spacing w:val="-2"/>
+                <w:lang w:val="en-US"/>
+              </w:rPr>
+              <w:t>}}</w:t>
             </w:r>
           </w:p>
         </w:tc>
@@ -2255,7 +2112,14 @@
               <w:rPr>
                 <w:lang w:val="en-US"/>
               </w:rPr>
-              <w:t>{{nama_petugas_</w:t>
+              <w:t>{{</w:t>
+            </w:r>
+            <w:proofErr w:type="spellStart"/>
+            <w:r>
+              <w:rPr>
+                <w:lang w:val="en-US"/>
+              </w:rPr>
+              <w:t>nama_petugas_</w:t>
             </w:r>
             <w:r>
               <w:rPr>
@@ -2263,6 +2127,7 @@
               </w:rPr>
               <w:t>empat</w:t>
             </w:r>
+            <w:proofErr w:type="spellEnd"/>
             <w:r>
               <w:rPr>
                 <w:lang w:val="en-US"/>
@@ -2291,7 +2156,21 @@
               <w:rPr>
                 <w:lang w:val="en-US"/>
               </w:rPr>
-              <w:t>NIP. {{nip_petugas_empat}}</w:t>
+              <w:t>NIP. {{</w:t>
+            </w:r>
+            <w:proofErr w:type="spellStart"/>
+            <w:r>
+              <w:rPr>
+                <w:lang w:val="en-US"/>
+              </w:rPr>
+              <w:t>nip_petugas_empat</w:t>
+            </w:r>
+            <w:proofErr w:type="spellEnd"/>
+            <w:r>
+              <w:rPr>
+                <w:lang w:val="en-US"/>
+              </w:rPr>
+              <w:t>}}</w:t>
             </w:r>
           </w:p>
         </w:tc>
@@ -2314,7 +2193,15 @@
                 <w:spacing w:val="-2"/>
                 <w:lang w:val="en-US"/>
               </w:rPr>
-              <w:t>{{no_urut_</w:t>
+              <w:t>{{</w:t>
+            </w:r>
+            <w:proofErr w:type="spellStart"/>
+            <w:r>
+              <w:rPr>
+                <w:spacing w:val="-2"/>
+                <w:lang w:val="en-US"/>
+              </w:rPr>
+              <w:t>no_urut_</w:t>
             </w:r>
             <w:r>
               <w:rPr>
@@ -2323,6 +2210,7 @@
               </w:rPr>
               <w:t>empat</w:t>
             </w:r>
+            <w:proofErr w:type="spellEnd"/>
             <w:proofErr w:type="gramStart"/>
             <w:r>
               <w:rPr>
@@ -2342,16 +2230,8 @@
               <w:rPr>
                 <w:spacing w:val="-2"/>
               </w:rPr>
-              <w:t>………………</w:t>
-            </w:r>
-            <w:proofErr w:type="gramStart"/>
-            <w:r>
-              <w:rPr>
-                <w:spacing w:val="-2"/>
-              </w:rPr>
-              <w:t>…..</w:t>
-            </w:r>
-            <w:proofErr w:type="gramEnd"/>
+              <w:t>…………………..</w:t>
+            </w:r>
           </w:p>
         </w:tc>
       </w:tr>
@@ -2379,7 +2259,23 @@
                 <w:spacing w:val="-2"/>
                 <w:lang w:val="en-US"/>
               </w:rPr>
-              <w:t>{{no_urut_lima}}</w:t>
+              <w:t>{{</w:t>
+            </w:r>
+            <w:proofErr w:type="spellStart"/>
+            <w:r>
+              <w:rPr>
+                <w:spacing w:val="-2"/>
+                <w:lang w:val="en-US"/>
+              </w:rPr>
+              <w:t>no_urut_lima</w:t>
+            </w:r>
+            <w:proofErr w:type="spellEnd"/>
+            <w:r>
+              <w:rPr>
+                <w:spacing w:val="-2"/>
+                <w:lang w:val="en-US"/>
+              </w:rPr>
+              <w:t>}}</w:t>
             </w:r>
           </w:p>
         </w:tc>
@@ -2399,7 +2295,14 @@
               <w:rPr>
                 <w:lang w:val="en-US"/>
               </w:rPr>
-              <w:t>{{nama_petugas_</w:t>
+              <w:t>{{</w:t>
+            </w:r>
+            <w:proofErr w:type="spellStart"/>
+            <w:r>
+              <w:rPr>
+                <w:lang w:val="en-US"/>
+              </w:rPr>
+              <w:t>nama_petugas_</w:t>
             </w:r>
             <w:r>
               <w:rPr>
@@ -2407,6 +2310,7 @@
               </w:rPr>
               <w:t>lima</w:t>
             </w:r>
+            <w:proofErr w:type="spellEnd"/>
             <w:r>
               <w:rPr>
                 <w:lang w:val="en-US"/>
@@ -2435,7 +2339,21 @@
               <w:rPr>
                 <w:lang w:val="en-US"/>
               </w:rPr>
-              <w:t>NIP. {{nip_petugas_lima}}</w:t>
+              <w:t>NIP. {{</w:t>
+            </w:r>
+            <w:proofErr w:type="spellStart"/>
+            <w:r>
+              <w:rPr>
+                <w:lang w:val="en-US"/>
+              </w:rPr>
+              <w:t>nip_petugas_lima</w:t>
+            </w:r>
+            <w:proofErr w:type="spellEnd"/>
+            <w:r>
+              <w:rPr>
+                <w:lang w:val="en-US"/>
+              </w:rPr>
+              <w:t>}}</w:t>
             </w:r>
           </w:p>
         </w:tc>
@@ -2458,7 +2376,15 @@
                 <w:spacing w:val="-2"/>
                 <w:lang w:val="en-US"/>
               </w:rPr>
-              <w:t>{{no_urut_</w:t>
+              <w:t>{{</w:t>
+            </w:r>
+            <w:proofErr w:type="spellStart"/>
+            <w:r>
+              <w:rPr>
+                <w:spacing w:val="-2"/>
+                <w:lang w:val="en-US"/>
+              </w:rPr>
+              <w:t>no_urut_</w:t>
             </w:r>
             <w:r>
               <w:rPr>
@@ -2467,6 +2393,7 @@
               </w:rPr>
               <w:t>lima</w:t>
             </w:r>
+            <w:proofErr w:type="spellEnd"/>
             <w:proofErr w:type="gramStart"/>
             <w:r>
               <w:rPr>
@@ -2486,16 +2413,8 @@
               <w:rPr>
                 <w:spacing w:val="-2"/>
               </w:rPr>
-              <w:t>………………</w:t>
-            </w:r>
-            <w:proofErr w:type="gramStart"/>
-            <w:r>
-              <w:rPr>
-                <w:spacing w:val="-2"/>
-              </w:rPr>
-              <w:t>…..</w:t>
-            </w:r>
-            <w:proofErr w:type="gramEnd"/>
+              <w:t>…………………..</w:t>
+            </w:r>
           </w:p>
         </w:tc>
       </w:tr>
@@ -2523,7 +2442,23 @@
                 <w:spacing w:val="-2"/>
                 <w:lang w:val="en-US"/>
               </w:rPr>
-              <w:t>{{no_urut_enam}}</w:t>
+              <w:t>{{</w:t>
+            </w:r>
+            <w:proofErr w:type="spellStart"/>
+            <w:r>
+              <w:rPr>
+                <w:spacing w:val="-2"/>
+                <w:lang w:val="en-US"/>
+              </w:rPr>
+              <w:t>no_urut_enam</w:t>
+            </w:r>
+            <w:proofErr w:type="spellEnd"/>
+            <w:r>
+              <w:rPr>
+                <w:spacing w:val="-2"/>
+                <w:lang w:val="en-US"/>
+              </w:rPr>
+              <w:t>}}</w:t>
             </w:r>
           </w:p>
         </w:tc>
@@ -2605,7 +2540,15 @@
                 <w:spacing w:val="-2"/>
                 <w:lang w:val="en-US"/>
               </w:rPr>
-              <w:t>{{no_urut_</w:t>
+              <w:t>{{</w:t>
+            </w:r>
+            <w:proofErr w:type="spellStart"/>
+            <w:r>
+              <w:rPr>
+                <w:spacing w:val="-2"/>
+                <w:lang w:val="en-US"/>
+              </w:rPr>
+              <w:t>no_urut_</w:t>
             </w:r>
             <w:r>
               <w:rPr>
@@ -2614,6 +2557,7 @@
               </w:rPr>
               <w:t>enam</w:t>
             </w:r>
+            <w:proofErr w:type="spellEnd"/>
             <w:proofErr w:type="gramStart"/>
             <w:r>
               <w:rPr>
@@ -2633,16 +2577,8 @@
               <w:rPr>
                 <w:spacing w:val="-2"/>
               </w:rPr>
-              <w:t>………………</w:t>
-            </w:r>
-            <w:proofErr w:type="gramStart"/>
-            <w:r>
-              <w:rPr>
-                <w:spacing w:val="-2"/>
-              </w:rPr>
-              <w:t>…..</w:t>
-            </w:r>
-            <w:proofErr w:type="gramEnd"/>
+              <w:t>…………………..</w:t>
+            </w:r>
           </w:p>
         </w:tc>
       </w:tr>
@@ -2670,7 +2606,23 @@
                 <w:spacing w:val="-2"/>
                 <w:lang w:val="en-US"/>
               </w:rPr>
-              <w:t>{{no_urut_tujuh}}</w:t>
+              <w:t>{{</w:t>
+            </w:r>
+            <w:proofErr w:type="spellStart"/>
+            <w:r>
+              <w:rPr>
+                <w:spacing w:val="-2"/>
+                <w:lang w:val="en-US"/>
+              </w:rPr>
+              <w:t>no_urut_tujuh</w:t>
+            </w:r>
+            <w:proofErr w:type="spellEnd"/>
+            <w:r>
+              <w:rPr>
+                <w:spacing w:val="-2"/>
+                <w:lang w:val="en-US"/>
+              </w:rPr>
+              <w:t>}}</w:t>
             </w:r>
           </w:p>
         </w:tc>
@@ -2690,7 +2642,14 @@
               <w:rPr>
                 <w:lang w:val="en-US"/>
               </w:rPr>
-              <w:t>{{nama_petugas_</w:t>
+              <w:t>{{</w:t>
+            </w:r>
+            <w:proofErr w:type="spellStart"/>
+            <w:r>
+              <w:rPr>
+                <w:lang w:val="en-US"/>
+              </w:rPr>
+              <w:t>nama_petugas_</w:t>
             </w:r>
             <w:r>
               <w:rPr>
@@ -2698,6 +2657,7 @@
               </w:rPr>
               <w:t>tujuh</w:t>
             </w:r>
+            <w:proofErr w:type="spellEnd"/>
             <w:r>
               <w:rPr>
                 <w:lang w:val="en-US"/>
@@ -2726,7 +2686,21 @@
               <w:rPr>
                 <w:lang w:val="en-US"/>
               </w:rPr>
-              <w:t>NIP. {{nip_petugas_tujuh}}</w:t>
+              <w:t>NIP. {{</w:t>
+            </w:r>
+            <w:proofErr w:type="spellStart"/>
+            <w:r>
+              <w:rPr>
+                <w:lang w:val="en-US"/>
+              </w:rPr>
+              <w:t>nip_petugas_tujuh</w:t>
+            </w:r>
+            <w:proofErr w:type="spellEnd"/>
+            <w:r>
+              <w:rPr>
+                <w:lang w:val="en-US"/>
+              </w:rPr>
+              <w:t>}}</w:t>
             </w:r>
           </w:p>
         </w:tc>
@@ -2749,7 +2723,15 @@
                 <w:spacing w:val="-2"/>
                 <w:lang w:val="en-US"/>
               </w:rPr>
-              <w:t>{{no_urut_</w:t>
+              <w:t>{{</w:t>
+            </w:r>
+            <w:proofErr w:type="spellStart"/>
+            <w:r>
+              <w:rPr>
+                <w:spacing w:val="-2"/>
+                <w:lang w:val="en-US"/>
+              </w:rPr>
+              <w:t>no_urut_</w:t>
             </w:r>
             <w:r>
               <w:rPr>
@@ -2758,6 +2740,7 @@
               </w:rPr>
               <w:t>tujuh</w:t>
             </w:r>
+            <w:proofErr w:type="spellEnd"/>
             <w:proofErr w:type="gramStart"/>
             <w:r>
               <w:rPr>
@@ -2777,16 +2760,8 @@
               <w:rPr>
                 <w:spacing w:val="-2"/>
               </w:rPr>
-              <w:t>………………</w:t>
-            </w:r>
-            <w:proofErr w:type="gramStart"/>
-            <w:r>
-              <w:rPr>
-                <w:spacing w:val="-2"/>
-              </w:rPr>
-              <w:t>…..</w:t>
-            </w:r>
-            <w:proofErr w:type="gramEnd"/>
+              <w:t>…………………..</w:t>
+            </w:r>
           </w:p>
         </w:tc>
       </w:tr>
@@ -2814,7 +2789,23 @@
                 <w:spacing w:val="-2"/>
                 <w:lang w:val="en-US"/>
               </w:rPr>
-              <w:t>{{no_urut_delapan}}</w:t>
+              <w:t>{{</w:t>
+            </w:r>
+            <w:proofErr w:type="spellStart"/>
+            <w:r>
+              <w:rPr>
+                <w:spacing w:val="-2"/>
+                <w:lang w:val="en-US"/>
+              </w:rPr>
+              <w:t>no_urut_delapan</w:t>
+            </w:r>
+            <w:proofErr w:type="spellEnd"/>
+            <w:r>
+              <w:rPr>
+                <w:spacing w:val="-2"/>
+                <w:lang w:val="en-US"/>
+              </w:rPr>
+              <w:t>}}</w:t>
             </w:r>
           </w:p>
         </w:tc>
@@ -2893,7 +2884,15 @@
                 <w:spacing w:val="-2"/>
                 <w:lang w:val="en-US"/>
               </w:rPr>
-              <w:t>{{no_urut_</w:t>
+              <w:t>{{</w:t>
+            </w:r>
+            <w:proofErr w:type="spellStart"/>
+            <w:r>
+              <w:rPr>
+                <w:spacing w:val="-2"/>
+                <w:lang w:val="en-US"/>
+              </w:rPr>
+              <w:t>no_urut_</w:t>
             </w:r>
             <w:r>
               <w:rPr>
@@ -2902,6 +2901,7 @@
               </w:rPr>
               <w:t>delapan</w:t>
             </w:r>
+            <w:proofErr w:type="spellEnd"/>
             <w:proofErr w:type="gramStart"/>
             <w:r>
               <w:rPr>
@@ -2921,16 +2921,8 @@
               <w:rPr>
                 <w:spacing w:val="-2"/>
               </w:rPr>
-              <w:t>………………</w:t>
-            </w:r>
-            <w:proofErr w:type="gramStart"/>
-            <w:r>
-              <w:rPr>
-                <w:spacing w:val="-2"/>
-              </w:rPr>
-              <w:t>…..</w:t>
-            </w:r>
-            <w:proofErr w:type="gramEnd"/>
+              <w:t>…………………..</w:t>
+            </w:r>
           </w:p>
         </w:tc>
       </w:tr>
@@ -2958,7 +2950,23 @@
                 <w:spacing w:val="-2"/>
                 <w:lang w:val="en-US"/>
               </w:rPr>
-              <w:t>{{no_urut_sembilan}}</w:t>
+              <w:t>{{</w:t>
+            </w:r>
+            <w:proofErr w:type="spellStart"/>
+            <w:r>
+              <w:rPr>
+                <w:spacing w:val="-2"/>
+                <w:lang w:val="en-US"/>
+              </w:rPr>
+              <w:t>no_urut_sembilan</w:t>
+            </w:r>
+            <w:proofErr w:type="spellEnd"/>
+            <w:r>
+              <w:rPr>
+                <w:spacing w:val="-2"/>
+                <w:lang w:val="en-US"/>
+              </w:rPr>
+              <w:t>}}</w:t>
             </w:r>
           </w:p>
         </w:tc>
@@ -2978,7 +2986,14 @@
               <w:rPr>
                 <w:lang w:val="en-US"/>
               </w:rPr>
-              <w:t>{{nama_petugas_</w:t>
+              <w:t>{{</w:t>
+            </w:r>
+            <w:proofErr w:type="spellStart"/>
+            <w:r>
+              <w:rPr>
+                <w:lang w:val="en-US"/>
+              </w:rPr>
+              <w:t>nama_petugas_</w:t>
             </w:r>
             <w:r>
               <w:rPr>
@@ -2986,6 +3001,7 @@
               </w:rPr>
               <w:t>sembilan</w:t>
             </w:r>
+            <w:proofErr w:type="spellEnd"/>
             <w:r>
               <w:rPr>
                 <w:lang w:val="en-US"/>
@@ -3014,7 +3030,21 @@
               <w:rPr>
                 <w:lang w:val="en-US"/>
               </w:rPr>
-              <w:t>NIP. {{nip_petugas_sembilan}}</w:t>
+              <w:t>NIP. {{</w:t>
+            </w:r>
+            <w:proofErr w:type="spellStart"/>
+            <w:r>
+              <w:rPr>
+                <w:lang w:val="en-US"/>
+              </w:rPr>
+              <w:t>nip_petugas_sembilan</w:t>
+            </w:r>
+            <w:proofErr w:type="spellEnd"/>
+            <w:r>
+              <w:rPr>
+                <w:lang w:val="en-US"/>
+              </w:rPr>
+              <w:t>}}</w:t>
             </w:r>
           </w:p>
         </w:tc>
@@ -3037,7 +3067,15 @@
                 <w:spacing w:val="-2"/>
                 <w:lang w:val="en-US"/>
               </w:rPr>
-              <w:t>{{no_urut_</w:t>
+              <w:t>{{</w:t>
+            </w:r>
+            <w:proofErr w:type="spellStart"/>
+            <w:r>
+              <w:rPr>
+                <w:spacing w:val="-2"/>
+                <w:lang w:val="en-US"/>
+              </w:rPr>
+              <w:t>no_urut_</w:t>
             </w:r>
             <w:r>
               <w:rPr>
@@ -3046,6 +3084,7 @@
               </w:rPr>
               <w:t>sembilan</w:t>
             </w:r>
+            <w:proofErr w:type="spellEnd"/>
             <w:proofErr w:type="gramStart"/>
             <w:r>
               <w:rPr>
@@ -3065,16 +3104,8 @@
               <w:rPr>
                 <w:spacing w:val="-2"/>
               </w:rPr>
-              <w:t>………………</w:t>
-            </w:r>
-            <w:proofErr w:type="gramStart"/>
-            <w:r>
-              <w:rPr>
-                <w:spacing w:val="-2"/>
-              </w:rPr>
-              <w:t>…..</w:t>
-            </w:r>
-            <w:proofErr w:type="gramEnd"/>
+              <w:t>…………………..</w:t>
+            </w:r>
           </w:p>
         </w:tc>
       </w:tr>
@@ -3102,7 +3133,23 @@
                 <w:spacing w:val="-2"/>
                 <w:lang w:val="en-US"/>
               </w:rPr>
-              <w:t>{{no_urut_sepuluh}}</w:t>
+              <w:t>{{</w:t>
+            </w:r>
+            <w:proofErr w:type="spellStart"/>
+            <w:r>
+              <w:rPr>
+                <w:spacing w:val="-2"/>
+                <w:lang w:val="en-US"/>
+              </w:rPr>
+              <w:t>no_urut_sepuluh</w:t>
+            </w:r>
+            <w:proofErr w:type="spellEnd"/>
+            <w:r>
+              <w:rPr>
+                <w:spacing w:val="-2"/>
+                <w:lang w:val="en-US"/>
+              </w:rPr>
+              <w:t>}}</w:t>
             </w:r>
           </w:p>
         </w:tc>
@@ -3122,7 +3169,14 @@
               <w:rPr>
                 <w:lang w:val="en-US"/>
               </w:rPr>
-              <w:t>{{nama_petugas_s</w:t>
+              <w:t>{{</w:t>
+            </w:r>
+            <w:proofErr w:type="spellStart"/>
+            <w:r>
+              <w:rPr>
+                <w:lang w:val="en-US"/>
+              </w:rPr>
+              <w:t>nama_petugas_s</w:t>
             </w:r>
             <w:r>
               <w:rPr>
@@ -3130,6 +3184,7 @@
               </w:rPr>
               <w:t>epuluh</w:t>
             </w:r>
+            <w:proofErr w:type="spellEnd"/>
             <w:r>
               <w:rPr>
                 <w:lang w:val="en-US"/>
@@ -3158,7 +3213,21 @@
               <w:rPr>
                 <w:lang w:val="en-US"/>
               </w:rPr>
-              <w:t>NIP. {{nip_petugas_sepuluh}}</w:t>
+              <w:t>NIP. {{</w:t>
+            </w:r>
+            <w:proofErr w:type="spellStart"/>
+            <w:r>
+              <w:rPr>
+                <w:lang w:val="en-US"/>
+              </w:rPr>
+              <w:t>nip_petugas_sepuluh</w:t>
+            </w:r>
+            <w:proofErr w:type="spellEnd"/>
+            <w:r>
+              <w:rPr>
+                <w:lang w:val="en-US"/>
+              </w:rPr>
+              <w:t>}}</w:t>
             </w:r>
           </w:p>
         </w:tc>
@@ -3181,7 +3250,15 @@
                 <w:spacing w:val="-2"/>
                 <w:lang w:val="en-US"/>
               </w:rPr>
-              <w:t>{{no_urut_s</w:t>
+              <w:t>{{</w:t>
+            </w:r>
+            <w:proofErr w:type="spellStart"/>
+            <w:r>
+              <w:rPr>
+                <w:spacing w:val="-2"/>
+                <w:lang w:val="en-US"/>
+              </w:rPr>
+              <w:t>no_urut_s</w:t>
             </w:r>
             <w:r>
               <w:rPr>
@@ -3190,6 +3267,7 @@
               </w:rPr>
               <w:t>epuluh</w:t>
             </w:r>
+            <w:proofErr w:type="spellEnd"/>
             <w:proofErr w:type="gramStart"/>
             <w:r>
               <w:rPr>
@@ -3209,16 +3287,8 @@
               <w:rPr>
                 <w:spacing w:val="-2"/>
               </w:rPr>
-              <w:t>………………</w:t>
-            </w:r>
-            <w:proofErr w:type="gramStart"/>
-            <w:r>
-              <w:rPr>
-                <w:spacing w:val="-2"/>
-              </w:rPr>
-              <w:t>…..</w:t>
-            </w:r>
-            <w:proofErr w:type="gramEnd"/>
+              <w:t>…………………..</w:t>
+            </w:r>
           </w:p>
         </w:tc>
       </w:tr>
@@ -3227,8 +3297,9 @@
       <w:pPr>
         <w:pStyle w:val="TableParagraph"/>
         <w:sectPr>
+          <w:headerReference w:type="first" r:id="rId13"/>
           <w:pgSz w:w="12240" w:h="20160"/>
-          <w:pgMar w:top="1418" w:right="1077" w:bottom="1418" w:left="1077" w:header="720" w:footer="720" w:gutter="0"/>
+          <w:pgMar w:top="1420" w:right="1080" w:bottom="280" w:left="1080" w:header="720" w:footer="720" w:gutter="0"/>
           <w:cols w:space="720"/>
           <w:titlePg/>
           <w:docGrid w:linePitch="299"/>
@@ -3319,7 +3390,21 @@
               <w:rPr>
                 <w:lang w:val="en-US"/>
               </w:rPr>
-              <w:t>{{foto_dokumentasi_satu}}</w:t>
+              <w:t>{{</w:t>
+            </w:r>
+            <w:proofErr w:type="spellStart"/>
+            <w:r>
+              <w:rPr>
+                <w:lang w:val="en-US"/>
+              </w:rPr>
+              <w:t>foto_dokumentasi_satu</w:t>
+            </w:r>
+            <w:proofErr w:type="spellEnd"/>
+            <w:r>
+              <w:rPr>
+                <w:lang w:val="en-US"/>
+              </w:rPr>
+              <w:t>}}</w:t>
             </w:r>
           </w:p>
         </w:tc>
@@ -3346,7 +3431,21 @@
               <w:rPr>
                 <w:lang w:val="en-US"/>
               </w:rPr>
-              <w:t>{{foto_dokumentasi_dua}}</w:t>
+              <w:t>{{</w:t>
+            </w:r>
+            <w:proofErr w:type="spellStart"/>
+            <w:r>
+              <w:rPr>
+                <w:lang w:val="en-US"/>
+              </w:rPr>
+              <w:t>foto_dokumentasi_dua</w:t>
+            </w:r>
+            <w:proofErr w:type="spellEnd"/>
+            <w:r>
+              <w:rPr>
+                <w:lang w:val="en-US"/>
+              </w:rPr>
+              <w:t>}}</w:t>
             </w:r>
           </w:p>
         </w:tc>
@@ -3373,7 +3472,21 @@
               <w:rPr>
                 <w:lang w:val="en-US"/>
               </w:rPr>
-              <w:t>{{foto_dokumentasi_tiga}}</w:t>
+              <w:t>{{</w:t>
+            </w:r>
+            <w:proofErr w:type="spellStart"/>
+            <w:r>
+              <w:rPr>
+                <w:lang w:val="en-US"/>
+              </w:rPr>
+              <w:t>foto_dokumentasi_tiga</w:t>
+            </w:r>
+            <w:proofErr w:type="spellEnd"/>
+            <w:r>
+              <w:rPr>
+                <w:lang w:val="en-US"/>
+              </w:rPr>
+              <w:t>}}</w:t>
             </w:r>
           </w:p>
         </w:tc>
@@ -3412,7 +3525,21 @@
               <w:rPr>
                 <w:lang w:val="en-US"/>
               </w:rPr>
-              <w:t>{{foto_dokumentasi_empat}}</w:t>
+              <w:t>{{</w:t>
+            </w:r>
+            <w:proofErr w:type="spellStart"/>
+            <w:r>
+              <w:rPr>
+                <w:lang w:val="en-US"/>
+              </w:rPr>
+              <w:t>foto_dokumentasi_empat</w:t>
+            </w:r>
+            <w:proofErr w:type="spellEnd"/>
+            <w:r>
+              <w:rPr>
+                <w:lang w:val="en-US"/>
+              </w:rPr>
+              <w:t>}}</w:t>
             </w:r>
           </w:p>
         </w:tc>
@@ -5646,19 +5773,17 @@
       </w:pPr>
     </w:p>
     <w:sectPr>
-      <w:headerReference w:type="default" r:id="rId9"/>
+      <w:headerReference w:type="default" r:id="rId14"/>
       <w:pgSz w:w="12240" w:h="20160"/>
       <w:pgMar w:top="1480" w:right="1080" w:bottom="280" w:left="1080" w:header="1245" w:footer="0" w:gutter="0"/>
       <w:cols w:space="720"/>
-      <w:titlePg/>
-      <w:docGrid w:linePitch="299"/>
     </w:sectPr>
   </w:body>
 </w:document>
 </file>
 
 <file path=word/endnotes.xml><?xml version="1.0" encoding="utf-8"?>
-<w:endnotes xmlns:wpc="http://schemas.microsoft.com/office/word/2010/wordprocessingCanvas" xmlns:cx="http://schemas.microsoft.com/office/drawing/2014/chartex" xmlns:cx1="http://schemas.microsoft.com/office/drawing/2015/9/8/chartex" xmlns:cx2="http://schemas.microsoft.com/office/drawing/2015/10/21/chartex" xmlns:cx3="http://schemas.microsoft.com/office/drawing/2016/5/9/chartex" xmlns:cx4="http://schemas.microsoft.com/office/drawing/2016/5/10/chartex" xmlns:cx5="http://schemas.microsoft.com/office/drawing/2016/5/11/chartex" xmlns:cx6="http://schemas.microsoft.com/office/drawing/2016/5/12/chartex" xmlns:cx7="http://schemas.microsoft.com/office/drawing/2016/5/13/chartex" xmlns:cx8="http://schemas.microsoft.com/office/drawing/2016/5/14/chartex" xmlns:mc="http://schemas.openxmlformats.org/markup-compatibility/2006" xmlns:aink="http://schemas.microsoft.com/office/drawing/2016/ink" xmlns:am3d="http://schemas.microsoft.com/office/drawing/2017/model3d" xmlns:o="urn:schemas-microsoft-com:office:office" xmlns:oel="http://schemas.microsoft.com/office/2019/extlst" xmlns:r="http://schemas.openxmlformats.org/officeDocument/2006/relationships" xmlns:m="http://schemas.openxmlformats.org/officeDocument/2006/math" xmlns:v="urn:schemas-microsoft-com:vml" xmlns:wp14="http://schemas.microsoft.com/office/word/2010/wordprocessingDrawing" xmlns:wp="http://schemas.openxmlformats.org/drawingml/2006/wordprocessingDrawing" xmlns:w10="urn:schemas-microsoft-com:office:word" xmlns:w="http://schemas.openxmlformats.org/wordprocessingml/2006/main" xmlns:w14="http://schemas.microsoft.com/office/word/2010/wordml" xmlns:w15="http://schemas.microsoft.com/office/word/2012/wordml" xmlns:w16cex="http://schemas.microsoft.com/office/word/2018/wordml/cex" xmlns:w16cid="http://schemas.microsoft.com/office/word/2016/wordml/cid" xmlns:w16="http://schemas.microsoft.com/office/word/2018/wordml" xmlns:w16du="http://schemas.microsoft.com/office/word/2023/wordml/word16du" xmlns:w16sdtdh="http://schemas.microsoft.com/office/word/2020/wordml/sdtdatahash" xmlns:w16sdtfl="http://schemas.microsoft.com/office/word/2024/wordml/sdtformatlock" xmlns:w16se="http://schemas.microsoft.com/office/word/2015/wordml/symex" xmlns:wpg="http://schemas.microsoft.com/office/word/2010/wordprocessingGroup" xmlns:wpi="http://schemas.microsoft.com/office/word/2010/wordprocessingInk" xmlns:wne="http://schemas.microsoft.com/office/word/2006/wordml" xmlns:wps="http://schemas.microsoft.com/office/word/2010/wordprocessingShape" mc:Ignorable="w14 w15 w16se w16cid w16 w16cex w16sdtdh w16sdtfl w16du wp14">
+<w:endnotes xmlns:wpc="http://schemas.microsoft.com/office/word/2010/wordprocessingCanvas" xmlns:cx="http://schemas.microsoft.com/office/drawing/2014/chartex" xmlns:cx1="http://schemas.microsoft.com/office/drawing/2015/9/8/chartex" xmlns:cx2="http://schemas.microsoft.com/office/drawing/2015/10/21/chartex" xmlns:cx3="http://schemas.microsoft.com/office/drawing/2016/5/9/chartex" xmlns:cx4="http://schemas.microsoft.com/office/drawing/2016/5/10/chartex" xmlns:cx5="http://schemas.microsoft.com/office/drawing/2016/5/11/chartex" xmlns:cx6="http://schemas.microsoft.com/office/drawing/2016/5/12/chartex" xmlns:cx7="http://schemas.microsoft.com/office/drawing/2016/5/13/chartex" xmlns:cx8="http://schemas.microsoft.com/office/drawing/2016/5/14/chartex" xmlns:mc="http://schemas.openxmlformats.org/markup-compatibility/2006" xmlns:aink="http://schemas.microsoft.com/office/drawing/2016/ink" xmlns:am3d="http://schemas.microsoft.com/office/drawing/2017/model3d" xmlns:o="urn:schemas-microsoft-com:office:office" xmlns:oel="http://schemas.microsoft.com/office/2019/extlst" xmlns:r="http://schemas.openxmlformats.org/officeDocument/2006/relationships" xmlns:m="http://schemas.openxmlformats.org/officeDocument/2006/math" xmlns:v="urn:schemas-microsoft-com:vml" xmlns:wp14="http://schemas.microsoft.com/office/word/2010/wordprocessingDrawing" xmlns:wp="http://schemas.openxmlformats.org/drawingml/2006/wordprocessingDrawing" xmlns:w10="urn:schemas-microsoft-com:office:word" xmlns:w="http://schemas.openxmlformats.org/wordprocessingml/2006/main" xmlns:w14="http://schemas.microsoft.com/office/word/2010/wordml" xmlns:w15="http://schemas.microsoft.com/office/word/2012/wordml" xmlns:w16cex="http://schemas.microsoft.com/office/word/2018/wordml/cex" xmlns:w16cid="http://schemas.microsoft.com/office/word/2016/wordml/cid" xmlns:w16="http://schemas.microsoft.com/office/word/2018/wordml" xmlns:w16sdtdh="http://schemas.microsoft.com/office/word/2020/wordml/sdtdatahash" xmlns:w16se="http://schemas.microsoft.com/office/word/2015/wordml/symex" xmlns:wpg="http://schemas.microsoft.com/office/word/2010/wordprocessingGroup" xmlns:wpi="http://schemas.microsoft.com/office/word/2010/wordprocessingInk" xmlns:wne="http://schemas.microsoft.com/office/word/2006/wordml" xmlns:wps="http://schemas.microsoft.com/office/word/2010/wordprocessingShape" mc:Ignorable="w14 w15 w16se w16cid w16 w16cex w16sdtdh wp14">
   <w:endnote w:type="separator" w:id="-1">
     <w:p>
       <w:r>
@@ -5676,8 +5801,38 @@
 </w:endnotes>
 </file>
 
+<file path=word/footer1.xml><?xml version="1.0" encoding="utf-8"?>
+<w:ftr xmlns:wpc="http://schemas.microsoft.com/office/word/2010/wordprocessingCanvas" xmlns:cx="http://schemas.microsoft.com/office/drawing/2014/chartex" xmlns:cx1="http://schemas.microsoft.com/office/drawing/2015/9/8/chartex" xmlns:cx2="http://schemas.microsoft.com/office/drawing/2015/10/21/chartex" xmlns:cx3="http://schemas.microsoft.com/office/drawing/2016/5/9/chartex" xmlns:cx4="http://schemas.microsoft.com/office/drawing/2016/5/10/chartex" xmlns:cx5="http://schemas.microsoft.com/office/drawing/2016/5/11/chartex" xmlns:cx6="http://schemas.microsoft.com/office/drawing/2016/5/12/chartex" xmlns:cx7="http://schemas.microsoft.com/office/drawing/2016/5/13/chartex" xmlns:cx8="http://schemas.microsoft.com/office/drawing/2016/5/14/chartex" xmlns:mc="http://schemas.openxmlformats.org/markup-compatibility/2006" xmlns:aink="http://schemas.microsoft.com/office/drawing/2016/ink" xmlns:am3d="http://schemas.microsoft.com/office/drawing/2017/model3d" xmlns:o="urn:schemas-microsoft-com:office:office" xmlns:oel="http://schemas.microsoft.com/office/2019/extlst" xmlns:r="http://schemas.openxmlformats.org/officeDocument/2006/relationships" xmlns:m="http://schemas.openxmlformats.org/officeDocument/2006/math" xmlns:v="urn:schemas-microsoft-com:vml" xmlns:wp14="http://schemas.microsoft.com/office/word/2010/wordprocessingDrawing" xmlns:wp="http://schemas.openxmlformats.org/drawingml/2006/wordprocessingDrawing" xmlns:w10="urn:schemas-microsoft-com:office:word" xmlns:w="http://schemas.openxmlformats.org/wordprocessingml/2006/main" xmlns:w14="http://schemas.microsoft.com/office/word/2010/wordml" xmlns:w15="http://schemas.microsoft.com/office/word/2012/wordml" xmlns:w16cex="http://schemas.microsoft.com/office/word/2018/wordml/cex" xmlns:w16cid="http://schemas.microsoft.com/office/word/2016/wordml/cid" xmlns:w16="http://schemas.microsoft.com/office/word/2018/wordml" xmlns:w16sdtdh="http://schemas.microsoft.com/office/word/2020/wordml/sdtdatahash" xmlns:w16se="http://schemas.microsoft.com/office/word/2015/wordml/symex" xmlns:wpg="http://schemas.microsoft.com/office/word/2010/wordprocessingGroup" xmlns:wpi="http://schemas.microsoft.com/office/word/2010/wordprocessingInk" xmlns:wne="http://schemas.microsoft.com/office/word/2006/wordml" xmlns:wps="http://schemas.microsoft.com/office/word/2010/wordprocessingShape" mc:Ignorable="w14 w15 w16se w16cid w16 w16cex w16sdtdh wp14">
+  <w:p>
+    <w:pPr>
+      <w:pStyle w:val="Footer"/>
+    </w:pPr>
+  </w:p>
+</w:ftr>
+</file>
+
+<file path=word/footer2.xml><?xml version="1.0" encoding="utf-8"?>
+<w:ftr xmlns:wpc="http://schemas.microsoft.com/office/word/2010/wordprocessingCanvas" xmlns:cx="http://schemas.microsoft.com/office/drawing/2014/chartex" xmlns:cx1="http://schemas.microsoft.com/office/drawing/2015/9/8/chartex" xmlns:cx2="http://schemas.microsoft.com/office/drawing/2015/10/21/chartex" xmlns:cx3="http://schemas.microsoft.com/office/drawing/2016/5/9/chartex" xmlns:cx4="http://schemas.microsoft.com/office/drawing/2016/5/10/chartex" xmlns:cx5="http://schemas.microsoft.com/office/drawing/2016/5/11/chartex" xmlns:cx6="http://schemas.microsoft.com/office/drawing/2016/5/12/chartex" xmlns:cx7="http://schemas.microsoft.com/office/drawing/2016/5/13/chartex" xmlns:cx8="http://schemas.microsoft.com/office/drawing/2016/5/14/chartex" xmlns:mc="http://schemas.openxmlformats.org/markup-compatibility/2006" xmlns:aink="http://schemas.microsoft.com/office/drawing/2016/ink" xmlns:am3d="http://schemas.microsoft.com/office/drawing/2017/model3d" xmlns:o="urn:schemas-microsoft-com:office:office" xmlns:oel="http://schemas.microsoft.com/office/2019/extlst" xmlns:r="http://schemas.openxmlformats.org/officeDocument/2006/relationships" xmlns:m="http://schemas.openxmlformats.org/officeDocument/2006/math" xmlns:v="urn:schemas-microsoft-com:vml" xmlns:wp14="http://schemas.microsoft.com/office/word/2010/wordprocessingDrawing" xmlns:wp="http://schemas.openxmlformats.org/drawingml/2006/wordprocessingDrawing" xmlns:w10="urn:schemas-microsoft-com:office:word" xmlns:w="http://schemas.openxmlformats.org/wordprocessingml/2006/main" xmlns:w14="http://schemas.microsoft.com/office/word/2010/wordml" xmlns:w15="http://schemas.microsoft.com/office/word/2012/wordml" xmlns:w16cex="http://schemas.microsoft.com/office/word/2018/wordml/cex" xmlns:w16cid="http://schemas.microsoft.com/office/word/2016/wordml/cid" xmlns:w16="http://schemas.microsoft.com/office/word/2018/wordml" xmlns:w16sdtdh="http://schemas.microsoft.com/office/word/2020/wordml/sdtdatahash" xmlns:w16se="http://schemas.microsoft.com/office/word/2015/wordml/symex" xmlns:wpg="http://schemas.microsoft.com/office/word/2010/wordprocessingGroup" xmlns:wpi="http://schemas.microsoft.com/office/word/2010/wordprocessingInk" xmlns:wne="http://schemas.microsoft.com/office/word/2006/wordml" xmlns:wps="http://schemas.microsoft.com/office/word/2010/wordprocessingShape" mc:Ignorable="w14 w15 w16se w16cid w16 w16cex w16sdtdh wp14">
+  <w:p>
+    <w:pPr>
+      <w:pStyle w:val="Footer"/>
+    </w:pPr>
+  </w:p>
+</w:ftr>
+</file>
+
+<file path=word/footer3.xml><?xml version="1.0" encoding="utf-8"?>
+<w:ftr xmlns:wpc="http://schemas.microsoft.com/office/word/2010/wordprocessingCanvas" xmlns:cx="http://schemas.microsoft.com/office/drawing/2014/chartex" xmlns:cx1="http://schemas.microsoft.com/office/drawing/2015/9/8/chartex" xmlns:cx2="http://schemas.microsoft.com/office/drawing/2015/10/21/chartex" xmlns:cx3="http://schemas.microsoft.com/office/drawing/2016/5/9/chartex" xmlns:cx4="http://schemas.microsoft.com/office/drawing/2016/5/10/chartex" xmlns:cx5="http://schemas.microsoft.com/office/drawing/2016/5/11/chartex" xmlns:cx6="http://schemas.microsoft.com/office/drawing/2016/5/12/chartex" xmlns:cx7="http://schemas.microsoft.com/office/drawing/2016/5/13/chartex" xmlns:cx8="http://schemas.microsoft.com/office/drawing/2016/5/14/chartex" xmlns:mc="http://schemas.openxmlformats.org/markup-compatibility/2006" xmlns:aink="http://schemas.microsoft.com/office/drawing/2016/ink" xmlns:am3d="http://schemas.microsoft.com/office/drawing/2017/model3d" xmlns:o="urn:schemas-microsoft-com:office:office" xmlns:oel="http://schemas.microsoft.com/office/2019/extlst" xmlns:r="http://schemas.openxmlformats.org/officeDocument/2006/relationships" xmlns:m="http://schemas.openxmlformats.org/officeDocument/2006/math" xmlns:v="urn:schemas-microsoft-com:vml" xmlns:wp14="http://schemas.microsoft.com/office/word/2010/wordprocessingDrawing" xmlns:wp="http://schemas.openxmlformats.org/drawingml/2006/wordprocessingDrawing" xmlns:w10="urn:schemas-microsoft-com:office:word" xmlns:w="http://schemas.openxmlformats.org/wordprocessingml/2006/main" xmlns:w14="http://schemas.microsoft.com/office/word/2010/wordml" xmlns:w15="http://schemas.microsoft.com/office/word/2012/wordml" xmlns:w16cex="http://schemas.microsoft.com/office/word/2018/wordml/cex" xmlns:w16cid="http://schemas.microsoft.com/office/word/2016/wordml/cid" xmlns:w16="http://schemas.microsoft.com/office/word/2018/wordml" xmlns:w16sdtdh="http://schemas.microsoft.com/office/word/2020/wordml/sdtdatahash" xmlns:w16se="http://schemas.microsoft.com/office/word/2015/wordml/symex" xmlns:wpg="http://schemas.microsoft.com/office/word/2010/wordprocessingGroup" xmlns:wpi="http://schemas.microsoft.com/office/word/2010/wordprocessingInk" xmlns:wne="http://schemas.microsoft.com/office/word/2006/wordml" xmlns:wps="http://schemas.microsoft.com/office/word/2010/wordprocessingShape" mc:Ignorable="w14 w15 w16se w16cid w16 w16cex w16sdtdh wp14">
+  <w:p>
+    <w:pPr>
+      <w:pStyle w:val="Footer"/>
+    </w:pPr>
+  </w:p>
+</w:ftr>
+</file>
+
 <file path=word/footnotes.xml><?xml version="1.0" encoding="utf-8"?>
-<w:footnotes xmlns:wpc="http://schemas.microsoft.com/office/word/2010/wordprocessingCanvas" xmlns:cx="http://schemas.microsoft.com/office/drawing/2014/chartex" xmlns:cx1="http://schemas.microsoft.com/office/drawing/2015/9/8/chartex" xmlns:cx2="http://schemas.microsoft.com/office/drawing/2015/10/21/chartex" xmlns:cx3="http://schemas.microsoft.com/office/drawing/2016/5/9/chartex" xmlns:cx4="http://schemas.microsoft.com/office/drawing/2016/5/10/chartex" xmlns:cx5="http://schemas.microsoft.com/office/drawing/2016/5/11/chartex" xmlns:cx6="http://schemas.microsoft.com/office/drawing/2016/5/12/chartex" xmlns:cx7="http://schemas.microsoft.com/office/drawing/2016/5/13/chartex" xmlns:cx8="http://schemas.microsoft.com/office/drawing/2016/5/14/chartex" xmlns:mc="http://schemas.openxmlformats.org/markup-compatibility/2006" xmlns:aink="http://schemas.microsoft.com/office/drawing/2016/ink" xmlns:am3d="http://schemas.microsoft.com/office/drawing/2017/model3d" xmlns:o="urn:schemas-microsoft-com:office:office" xmlns:oel="http://schemas.microsoft.com/office/2019/extlst" xmlns:r="http://schemas.openxmlformats.org/officeDocument/2006/relationships" xmlns:m="http://schemas.openxmlformats.org/officeDocument/2006/math" xmlns:v="urn:schemas-microsoft-com:vml" xmlns:wp14="http://schemas.microsoft.com/office/word/2010/wordprocessingDrawing" xmlns:wp="http://schemas.openxmlformats.org/drawingml/2006/wordprocessingDrawing" xmlns:w10="urn:schemas-microsoft-com:office:word" xmlns:w="http://schemas.openxmlformats.org/wordprocessingml/2006/main" xmlns:w14="http://schemas.microsoft.com/office/word/2010/wordml" xmlns:w15="http://schemas.microsoft.com/office/word/2012/wordml" xmlns:w16cex="http://schemas.microsoft.com/office/word/2018/wordml/cex" xmlns:w16cid="http://schemas.microsoft.com/office/word/2016/wordml/cid" xmlns:w16="http://schemas.microsoft.com/office/word/2018/wordml" xmlns:w16du="http://schemas.microsoft.com/office/word/2023/wordml/word16du" xmlns:w16sdtdh="http://schemas.microsoft.com/office/word/2020/wordml/sdtdatahash" xmlns:w16sdtfl="http://schemas.microsoft.com/office/word/2024/wordml/sdtformatlock" xmlns:w16se="http://schemas.microsoft.com/office/word/2015/wordml/symex" xmlns:wpg="http://schemas.microsoft.com/office/word/2010/wordprocessingGroup" xmlns:wpi="http://schemas.microsoft.com/office/word/2010/wordprocessingInk" xmlns:wne="http://schemas.microsoft.com/office/word/2006/wordml" xmlns:wps="http://schemas.microsoft.com/office/word/2010/wordprocessingShape" mc:Ignorable="w14 w15 w16se w16cid w16 w16cex w16sdtdh w16sdtfl w16du wp14">
+<w:footnotes xmlns:wpc="http://schemas.microsoft.com/office/word/2010/wordprocessingCanvas" xmlns:cx="http://schemas.microsoft.com/office/drawing/2014/chartex" xmlns:cx1="http://schemas.microsoft.com/office/drawing/2015/9/8/chartex" xmlns:cx2="http://schemas.microsoft.com/office/drawing/2015/10/21/chartex" xmlns:cx3="http://schemas.microsoft.com/office/drawing/2016/5/9/chartex" xmlns:cx4="http://schemas.microsoft.com/office/drawing/2016/5/10/chartex" xmlns:cx5="http://schemas.microsoft.com/office/drawing/2016/5/11/chartex" xmlns:cx6="http://schemas.microsoft.com/office/drawing/2016/5/12/chartex" xmlns:cx7="http://schemas.microsoft.com/office/drawing/2016/5/13/chartex" xmlns:cx8="http://schemas.microsoft.com/office/drawing/2016/5/14/chartex" xmlns:mc="http://schemas.openxmlformats.org/markup-compatibility/2006" xmlns:aink="http://schemas.microsoft.com/office/drawing/2016/ink" xmlns:am3d="http://schemas.microsoft.com/office/drawing/2017/model3d" xmlns:o="urn:schemas-microsoft-com:office:office" xmlns:oel="http://schemas.microsoft.com/office/2019/extlst" xmlns:r="http://schemas.openxmlformats.org/officeDocument/2006/relationships" xmlns:m="http://schemas.openxmlformats.org/officeDocument/2006/math" xmlns:v="urn:schemas-microsoft-com:vml" xmlns:wp14="http://schemas.microsoft.com/office/word/2010/wordprocessingDrawing" xmlns:wp="http://schemas.openxmlformats.org/drawingml/2006/wordprocessingDrawing" xmlns:w10="urn:schemas-microsoft-com:office:word" xmlns:w="http://schemas.openxmlformats.org/wordprocessingml/2006/main" xmlns:w14="http://schemas.microsoft.com/office/word/2010/wordml" xmlns:w15="http://schemas.microsoft.com/office/word/2012/wordml" xmlns:w16cex="http://schemas.microsoft.com/office/word/2018/wordml/cex" xmlns:w16cid="http://schemas.microsoft.com/office/word/2016/wordml/cid" xmlns:w16="http://schemas.microsoft.com/office/word/2018/wordml" xmlns:w16sdtdh="http://schemas.microsoft.com/office/word/2020/wordml/sdtdatahash" xmlns:w16se="http://schemas.microsoft.com/office/word/2015/wordml/symex" xmlns:wpg="http://schemas.microsoft.com/office/word/2010/wordprocessingGroup" xmlns:wpi="http://schemas.microsoft.com/office/word/2010/wordprocessingInk" xmlns:wne="http://schemas.microsoft.com/office/word/2006/wordml" xmlns:wps="http://schemas.microsoft.com/office/word/2010/wordprocessingShape" mc:Ignorable="w14 w15 w16se w16cid w16 w16cex w16sdtdh wp14">
   <w:footnote w:type="separator" w:id="-1">
     <w:p>
       <w:r>
@@ -5696,7 +5851,302 @@
 </file>
 
 <file path=word/header1.xml><?xml version="1.0" encoding="utf-8"?>
-<w:hdr xmlns:wpc="http://schemas.microsoft.com/office/word/2010/wordprocessingCanvas" xmlns:cx="http://schemas.microsoft.com/office/drawing/2014/chartex" xmlns:cx1="http://schemas.microsoft.com/office/drawing/2015/9/8/chartex" xmlns:cx2="http://schemas.microsoft.com/office/drawing/2015/10/21/chartex" xmlns:cx3="http://schemas.microsoft.com/office/drawing/2016/5/9/chartex" xmlns:cx4="http://schemas.microsoft.com/office/drawing/2016/5/10/chartex" xmlns:cx5="http://schemas.microsoft.com/office/drawing/2016/5/11/chartex" xmlns:cx6="http://schemas.microsoft.com/office/drawing/2016/5/12/chartex" xmlns:cx7="http://schemas.microsoft.com/office/drawing/2016/5/13/chartex" xmlns:cx8="http://schemas.microsoft.com/office/drawing/2016/5/14/chartex" xmlns:mc="http://schemas.openxmlformats.org/markup-compatibility/2006" xmlns:aink="http://schemas.microsoft.com/office/drawing/2016/ink" xmlns:am3d="http://schemas.microsoft.com/office/drawing/2017/model3d" xmlns:o="urn:schemas-microsoft-com:office:office" xmlns:oel="http://schemas.microsoft.com/office/2019/extlst" xmlns:r="http://schemas.openxmlformats.org/officeDocument/2006/relationships" xmlns:m="http://schemas.openxmlformats.org/officeDocument/2006/math" xmlns:v="urn:schemas-microsoft-com:vml" xmlns:wp14="http://schemas.microsoft.com/office/word/2010/wordprocessingDrawing" xmlns:wp="http://schemas.openxmlformats.org/drawingml/2006/wordprocessingDrawing" xmlns:w10="urn:schemas-microsoft-com:office:word" xmlns:w="http://schemas.openxmlformats.org/wordprocessingml/2006/main" xmlns:w14="http://schemas.microsoft.com/office/word/2010/wordml" xmlns:w15="http://schemas.microsoft.com/office/word/2012/wordml" xmlns:w16cex="http://schemas.microsoft.com/office/word/2018/wordml/cex" xmlns:w16cid="http://schemas.microsoft.com/office/word/2016/wordml/cid" xmlns:w16="http://schemas.microsoft.com/office/word/2018/wordml" xmlns:w16du="http://schemas.microsoft.com/office/word/2023/wordml/word16du" xmlns:w16sdtdh="http://schemas.microsoft.com/office/word/2020/wordml/sdtdatahash" xmlns:w16sdtfl="http://schemas.microsoft.com/office/word/2024/wordml/sdtformatlock" xmlns:w16se="http://schemas.microsoft.com/office/word/2015/wordml/symex" xmlns:wpg="http://schemas.microsoft.com/office/word/2010/wordprocessingGroup" xmlns:wpi="http://schemas.microsoft.com/office/word/2010/wordprocessingInk" xmlns:wne="http://schemas.microsoft.com/office/word/2006/wordml" xmlns:wps="http://schemas.microsoft.com/office/word/2010/wordprocessingShape" mc:Ignorable="w14 w15 w16se w16cid w16 w16cex w16sdtdh w16sdtfl w16du wp14">
+<w:hdr xmlns:wpc="http://schemas.microsoft.com/office/word/2010/wordprocessingCanvas" xmlns:cx="http://schemas.microsoft.com/office/drawing/2014/chartex" xmlns:cx1="http://schemas.microsoft.com/office/drawing/2015/9/8/chartex" xmlns:cx2="http://schemas.microsoft.com/office/drawing/2015/10/21/chartex" xmlns:cx3="http://schemas.microsoft.com/office/drawing/2016/5/9/chartex" xmlns:cx4="http://schemas.microsoft.com/office/drawing/2016/5/10/chartex" xmlns:cx5="http://schemas.microsoft.com/office/drawing/2016/5/11/chartex" xmlns:cx6="http://schemas.microsoft.com/office/drawing/2016/5/12/chartex" xmlns:cx7="http://schemas.microsoft.com/office/drawing/2016/5/13/chartex" xmlns:cx8="http://schemas.microsoft.com/office/drawing/2016/5/14/chartex" xmlns:mc="http://schemas.openxmlformats.org/markup-compatibility/2006" xmlns:aink="http://schemas.microsoft.com/office/drawing/2016/ink" xmlns:am3d="http://schemas.microsoft.com/office/drawing/2017/model3d" xmlns:o="urn:schemas-microsoft-com:office:office" xmlns:oel="http://schemas.microsoft.com/office/2019/extlst" xmlns:r="http://schemas.openxmlformats.org/officeDocument/2006/relationships" xmlns:m="http://schemas.openxmlformats.org/officeDocument/2006/math" xmlns:v="urn:schemas-microsoft-com:vml" xmlns:wp14="http://schemas.microsoft.com/office/word/2010/wordprocessingDrawing" xmlns:wp="http://schemas.openxmlformats.org/drawingml/2006/wordprocessingDrawing" xmlns:w10="urn:schemas-microsoft-com:office:word" xmlns:w="http://schemas.openxmlformats.org/wordprocessingml/2006/main" xmlns:w14="http://schemas.microsoft.com/office/word/2010/wordml" xmlns:w15="http://schemas.microsoft.com/office/word/2012/wordml" xmlns:w16cex="http://schemas.microsoft.com/office/word/2018/wordml/cex" xmlns:w16cid="http://schemas.microsoft.com/office/word/2016/wordml/cid" xmlns:w16="http://schemas.microsoft.com/office/word/2018/wordml" xmlns:w16sdtdh="http://schemas.microsoft.com/office/word/2020/wordml/sdtdatahash" xmlns:w16se="http://schemas.microsoft.com/office/word/2015/wordml/symex" xmlns:wpg="http://schemas.microsoft.com/office/word/2010/wordprocessingGroup" xmlns:wpi="http://schemas.microsoft.com/office/word/2010/wordprocessingInk" xmlns:wne="http://schemas.microsoft.com/office/word/2006/wordml" xmlns:wps="http://schemas.microsoft.com/office/word/2010/wordprocessingShape" mc:Ignorable="w14 w15 w16se w16cid w16 w16cex w16sdtdh wp14">
+  <w:p>
+    <w:pPr>
+      <w:pStyle w:val="Header"/>
+    </w:pPr>
+  </w:p>
+</w:hdr>
+</file>
+
+<file path=word/header2.xml><?xml version="1.0" encoding="utf-8"?>
+<w:hdr xmlns:wpc="http://schemas.microsoft.com/office/word/2010/wordprocessingCanvas" xmlns:cx="http://schemas.microsoft.com/office/drawing/2014/chartex" xmlns:cx1="http://schemas.microsoft.com/office/drawing/2015/9/8/chartex" xmlns:cx2="http://schemas.microsoft.com/office/drawing/2015/10/21/chartex" xmlns:cx3="http://schemas.microsoft.com/office/drawing/2016/5/9/chartex" xmlns:cx4="http://schemas.microsoft.com/office/drawing/2016/5/10/chartex" xmlns:cx5="http://schemas.microsoft.com/office/drawing/2016/5/11/chartex" xmlns:cx6="http://schemas.microsoft.com/office/drawing/2016/5/12/chartex" xmlns:cx7="http://schemas.microsoft.com/office/drawing/2016/5/13/chartex" xmlns:cx8="http://schemas.microsoft.com/office/drawing/2016/5/14/chartex" xmlns:mc="http://schemas.openxmlformats.org/markup-compatibility/2006" xmlns:aink="http://schemas.microsoft.com/office/drawing/2016/ink" xmlns:am3d="http://schemas.microsoft.com/office/drawing/2017/model3d" xmlns:o="urn:schemas-microsoft-com:office:office" xmlns:oel="http://schemas.microsoft.com/office/2019/extlst" xmlns:r="http://schemas.openxmlformats.org/officeDocument/2006/relationships" xmlns:m="http://schemas.openxmlformats.org/officeDocument/2006/math" xmlns:v="urn:schemas-microsoft-com:vml" xmlns:wp14="http://schemas.microsoft.com/office/word/2010/wordprocessingDrawing" xmlns:wp="http://schemas.openxmlformats.org/drawingml/2006/wordprocessingDrawing" xmlns:w10="urn:schemas-microsoft-com:office:word" xmlns:w="http://schemas.openxmlformats.org/wordprocessingml/2006/main" xmlns:w14="http://schemas.microsoft.com/office/word/2010/wordml" xmlns:w15="http://schemas.microsoft.com/office/word/2012/wordml" xmlns:w16cex="http://schemas.microsoft.com/office/word/2018/wordml/cex" xmlns:w16cid="http://schemas.microsoft.com/office/word/2016/wordml/cid" xmlns:w16="http://schemas.microsoft.com/office/word/2018/wordml" xmlns:w16sdtdh="http://schemas.microsoft.com/office/word/2020/wordml/sdtdatahash" xmlns:w16se="http://schemas.microsoft.com/office/word/2015/wordml/symex" xmlns:wpg="http://schemas.microsoft.com/office/word/2010/wordprocessingGroup" xmlns:wpi="http://schemas.microsoft.com/office/word/2010/wordprocessingInk" xmlns:wne="http://schemas.microsoft.com/office/word/2006/wordml" xmlns:wps="http://schemas.microsoft.com/office/word/2010/wordprocessingShape" mc:Ignorable="w14 w15 w16se w16cid w16 w16cex w16sdtdh wp14">
+  <w:tbl>
+    <w:tblPr>
+      <w:tblStyle w:val="TableGrid"/>
+      <w:tblW w:w="10915" w:type="dxa"/>
+      <w:tblInd w:w="108" w:type="dxa"/>
+      <w:tblBorders>
+        <w:top w:val="none" w:sz="0" w:space="0" w:color="auto"/>
+        <w:left w:val="none" w:sz="0" w:space="0" w:color="auto"/>
+        <w:bottom w:val="none" w:sz="0" w:space="0" w:color="auto"/>
+        <w:right w:val="none" w:sz="0" w:space="0" w:color="auto"/>
+        <w:insideH w:val="none" w:sz="0" w:space="0" w:color="auto"/>
+        <w:insideV w:val="none" w:sz="0" w:space="0" w:color="auto"/>
+      </w:tblBorders>
+      <w:tblLook w:val="04A0" w:firstRow="1" w:lastRow="0" w:firstColumn="1" w:lastColumn="0" w:noHBand="0" w:noVBand="1"/>
+    </w:tblPr>
+    <w:tblGrid>
+      <w:gridCol w:w="1322"/>
+      <w:gridCol w:w="9593"/>
+    </w:tblGrid>
+    <w:tr>
+      <w:trPr>
+        <w:trHeight w:val="1867"/>
+      </w:trPr>
+      <w:tc>
+        <w:tcPr>
+          <w:tcW w:w="1322" w:type="dxa"/>
+        </w:tcPr>
+        <w:p>
+          <w:pPr>
+            <w:pStyle w:val="Header"/>
+          </w:pPr>
+          <w:r>
+            <w:rPr>
+              <w:noProof/>
+            </w:rPr>
+            <w:drawing>
+              <wp:anchor distT="0" distB="0" distL="114300" distR="114300" simplePos="0" relativeHeight="251656192" behindDoc="1" locked="0" layoutInCell="1" allowOverlap="1" wp14:anchorId="6C1D62D8" wp14:editId="3E65E39E">
+                <wp:simplePos x="0" y="0"/>
+                <wp:positionH relativeFrom="column">
+                  <wp:posOffset>689379</wp:posOffset>
+                </wp:positionH>
+                <wp:positionV relativeFrom="paragraph">
+                  <wp:posOffset>-11875</wp:posOffset>
+                </wp:positionV>
+                <wp:extent cx="78740" cy="1292225"/>
+                <wp:effectExtent l="0" t="0" r="0" b="3175"/>
+                <wp:wrapTight wrapText="bothSides">
+                  <wp:wrapPolygon edited="0">
+                    <wp:start x="0" y="0"/>
+                    <wp:lineTo x="0" y="21335"/>
+                    <wp:lineTo x="15677" y="21335"/>
+                    <wp:lineTo x="15677" y="0"/>
+                    <wp:lineTo x="0" y="0"/>
+                  </wp:wrapPolygon>
+                </wp:wrapTight>
+                <wp:docPr id="9" name="Picture 9"/>
+                <wp:cNvGraphicFramePr>
+                  <a:graphicFrameLocks xmlns:a="http://schemas.openxmlformats.org/drawingml/2006/main" noChangeAspect="1"/>
+                </wp:cNvGraphicFramePr>
+                <a:graphic xmlns:a="http://schemas.openxmlformats.org/drawingml/2006/main">
+                  <a:graphicData uri="http://schemas.openxmlformats.org/drawingml/2006/picture">
+                    <pic:pic xmlns:pic="http://schemas.openxmlformats.org/drawingml/2006/picture">
+                      <pic:nvPicPr>
+                        <pic:cNvPr id="2" name="Picture 2"/>
+                        <pic:cNvPicPr>
+                          <a:picLocks noChangeAspect="1"/>
+                        </pic:cNvPicPr>
+                      </pic:nvPicPr>
+                      <pic:blipFill>
+                        <a:blip r:embed="rId1" cstate="print">
+                          <a:extLst>
+                            <a:ext uri="{28A0092B-C50C-407E-A947-70E740481C1C}">
+                              <a14:useLocalDpi xmlns:a14="http://schemas.microsoft.com/office/drawing/2010/main" val="0"/>
+                            </a:ext>
+                          </a:extLst>
+                        </a:blip>
+                        <a:stretch>
+                          <a:fillRect/>
+                        </a:stretch>
+                      </pic:blipFill>
+                      <pic:spPr>
+                        <a:xfrm>
+                          <a:off x="0" y="0"/>
+                          <a:ext cx="78740" cy="1292225"/>
+                        </a:xfrm>
+                        <a:prstGeom prst="rect">
+                          <a:avLst/>
+                        </a:prstGeom>
+                      </pic:spPr>
+                    </pic:pic>
+                  </a:graphicData>
+                </a:graphic>
+              </wp:anchor>
+            </w:drawing>
+          </w:r>
+        </w:p>
+        <w:p>
+          <w:pPr>
+            <w:pStyle w:val="Header"/>
+          </w:pPr>
+          <w:r>
+            <w:rPr>
+              <w:noProof/>
+            </w:rPr>
+            <w:drawing>
+              <wp:anchor distT="0" distB="0" distL="114300" distR="114300" simplePos="0" relativeHeight="251659264" behindDoc="1" locked="0" layoutInCell="1" allowOverlap="1" wp14:anchorId="65D9F4A5" wp14:editId="758B4C62">
+                <wp:simplePos x="0" y="0"/>
+                <wp:positionH relativeFrom="column">
+                  <wp:posOffset>5847</wp:posOffset>
+                </wp:positionH>
+                <wp:positionV relativeFrom="paragraph">
+                  <wp:posOffset>100602</wp:posOffset>
+                </wp:positionV>
+                <wp:extent cx="648970" cy="819785"/>
+                <wp:effectExtent l="0" t="0" r="0" b="0"/>
+                <wp:wrapTight wrapText="bothSides">
+                  <wp:wrapPolygon edited="0">
+                    <wp:start x="8243" y="0"/>
+                    <wp:lineTo x="3804" y="3012"/>
+                    <wp:lineTo x="0" y="7027"/>
+                    <wp:lineTo x="0" y="10039"/>
+                    <wp:lineTo x="8877" y="16564"/>
+                    <wp:lineTo x="2536" y="17568"/>
+                    <wp:lineTo x="0" y="18572"/>
+                    <wp:lineTo x="0" y="21081"/>
+                    <wp:lineTo x="20924" y="21081"/>
+                    <wp:lineTo x="20924" y="19074"/>
+                    <wp:lineTo x="19656" y="18070"/>
+                    <wp:lineTo x="12047" y="16564"/>
+                    <wp:lineTo x="20924" y="9537"/>
+                    <wp:lineTo x="20924" y="7027"/>
+                    <wp:lineTo x="16485" y="3012"/>
+                    <wp:lineTo x="12681" y="0"/>
+                    <wp:lineTo x="8243" y="0"/>
+                  </wp:wrapPolygon>
+                </wp:wrapTight>
+                <wp:docPr id="10" name="Picture 10"/>
+                <wp:cNvGraphicFramePr>
+                  <a:graphicFrameLocks xmlns:a="http://schemas.openxmlformats.org/drawingml/2006/main" noChangeAspect="1"/>
+                </wp:cNvGraphicFramePr>
+                <a:graphic xmlns:a="http://schemas.openxmlformats.org/drawingml/2006/main">
+                  <a:graphicData uri="http://schemas.openxmlformats.org/drawingml/2006/picture">
+                    <pic:pic xmlns:pic="http://schemas.openxmlformats.org/drawingml/2006/picture">
+                      <pic:nvPicPr>
+                        <pic:cNvPr id="1" name="Picture 1"/>
+                        <pic:cNvPicPr>
+                          <a:picLocks noChangeAspect="1"/>
+                        </pic:cNvPicPr>
+                      </pic:nvPicPr>
+                      <pic:blipFill>
+                        <a:blip r:embed="rId2" cstate="print">
+                          <a:extLst>
+                            <a:ext uri="{28A0092B-C50C-407E-A947-70E740481C1C}">
+                              <a14:useLocalDpi xmlns:a14="http://schemas.microsoft.com/office/drawing/2010/main" val="0"/>
+                            </a:ext>
+                          </a:extLst>
+                        </a:blip>
+                        <a:stretch>
+                          <a:fillRect/>
+                        </a:stretch>
+                      </pic:blipFill>
+                      <pic:spPr>
+                        <a:xfrm>
+                          <a:off x="0" y="0"/>
+                          <a:ext cx="648970" cy="819785"/>
+                        </a:xfrm>
+                        <a:prstGeom prst="rect">
+                          <a:avLst/>
+                        </a:prstGeom>
+                      </pic:spPr>
+                    </pic:pic>
+                  </a:graphicData>
+                </a:graphic>
+              </wp:anchor>
+            </w:drawing>
+          </w:r>
+        </w:p>
+      </w:tc>
+      <w:tc>
+        <w:tcPr>
+          <w:tcW w:w="9593" w:type="dxa"/>
+        </w:tcPr>
+        <w:p>
+          <w:pPr>
+            <w:rPr>
+              <w:rFonts w:ascii="Arial Narrow" w:hAnsi="Arial Narrow"/>
+              <w:b/>
+              <w:bCs/>
+              <w:sz w:val="32"/>
+              <w:szCs w:val="32"/>
+            </w:rPr>
+          </w:pPr>
+        </w:p>
+        <w:p>
+          <w:pPr>
+            <w:rPr>
+              <w:rFonts w:ascii="Arial Narrow" w:hAnsi="Arial Narrow"/>
+              <w:b/>
+              <w:bCs/>
+              <w:sz w:val="32"/>
+              <w:szCs w:val="32"/>
+            </w:rPr>
+          </w:pPr>
+          <w:r>
+            <w:rPr>
+              <w:rFonts w:ascii="Arial Narrow" w:hAnsi="Arial Narrow"/>
+              <w:b/>
+              <w:bCs/>
+              <w:sz w:val="32"/>
+              <w:szCs w:val="32"/>
+            </w:rPr>
+            <w:t xml:space="preserve"> </w:t>
+          </w:r>
+          <w:r>
+            <w:rPr>
+              <w:rFonts w:ascii="Arial Narrow" w:hAnsi="Arial Narrow"/>
+              <w:b/>
+              <w:bCs/>
+              <w:sz w:val="32"/>
+              <w:szCs w:val="32"/>
+            </w:rPr>
+            <w:t>KEMENTERIAN KETENAGAKERJAAN REPUBLIK INDONESIA</w:t>
+          </w:r>
+        </w:p>
+        <w:p>
+          <w:pPr>
+            <w:rPr>
+              <w:rFonts w:ascii="Arial Narrow" w:hAnsi="Arial Narrow"/>
+              <w:color w:val="284A61"/>
+              <w:sz w:val="32"/>
+              <w:szCs w:val="32"/>
+            </w:rPr>
+          </w:pPr>
+          <w:r>
+            <w:rPr>
+              <w:rFonts w:ascii="Arial Narrow" w:hAnsi="Arial Narrow"/>
+              <w:color w:val="284A61"/>
+              <w:sz w:val="32"/>
+              <w:szCs w:val="32"/>
+            </w:rPr>
+            <w:t xml:space="preserve"> </w:t>
+          </w:r>
+          <w:r>
+            <w:rPr>
+              <w:rFonts w:ascii="Arial Narrow" w:hAnsi="Arial Narrow"/>
+              <w:color w:val="284A61"/>
+              <w:sz w:val="32"/>
+              <w:szCs w:val="32"/>
+            </w:rPr>
+            <w:t>SEKRETARIAT JENDERAL</w:t>
+          </w:r>
+        </w:p>
+      </w:tc>
+    </w:tr>
+  </w:tbl>
+  <w:p>
+    <w:pPr>
+      <w:pStyle w:val="Header"/>
+    </w:pPr>
+  </w:p>
+</w:hdr>
+</file>
+
+<file path=word/header3.xml><?xml version="1.0" encoding="utf-8"?>
+<w:hdr xmlns:wpc="http://schemas.microsoft.com/office/word/2010/wordprocessingCanvas" xmlns:cx="http://schemas.microsoft.com/office/drawing/2014/chartex" xmlns:cx1="http://schemas.microsoft.com/office/drawing/2015/9/8/chartex" xmlns:cx2="http://schemas.microsoft.com/office/drawing/2015/10/21/chartex" xmlns:cx3="http://schemas.microsoft.com/office/drawing/2016/5/9/chartex" xmlns:cx4="http://schemas.microsoft.com/office/drawing/2016/5/10/chartex" xmlns:cx5="http://schemas.microsoft.com/office/drawing/2016/5/11/chartex" xmlns:cx6="http://schemas.microsoft.com/office/drawing/2016/5/12/chartex" xmlns:cx7="http://schemas.microsoft.com/office/drawing/2016/5/13/chartex" xmlns:cx8="http://schemas.microsoft.com/office/drawing/2016/5/14/chartex" xmlns:mc="http://schemas.openxmlformats.org/markup-compatibility/2006" xmlns:aink="http://schemas.microsoft.com/office/drawing/2016/ink" xmlns:am3d="http://schemas.microsoft.com/office/drawing/2017/model3d" xmlns:o="urn:schemas-microsoft-com:office:office" xmlns:oel="http://schemas.microsoft.com/office/2019/extlst" xmlns:r="http://schemas.openxmlformats.org/officeDocument/2006/relationships" xmlns:m="http://schemas.openxmlformats.org/officeDocument/2006/math" xmlns:v="urn:schemas-microsoft-com:vml" xmlns:wp14="http://schemas.microsoft.com/office/word/2010/wordprocessingDrawing" xmlns:wp="http://schemas.openxmlformats.org/drawingml/2006/wordprocessingDrawing" xmlns:w10="urn:schemas-microsoft-com:office:word" xmlns:w="http://schemas.openxmlformats.org/wordprocessingml/2006/main" xmlns:w14="http://schemas.microsoft.com/office/word/2010/wordml" xmlns:w15="http://schemas.microsoft.com/office/word/2012/wordml" xmlns:w16cex="http://schemas.microsoft.com/office/word/2018/wordml/cex" xmlns:w16cid="http://schemas.microsoft.com/office/word/2016/wordml/cid" xmlns:w16="http://schemas.microsoft.com/office/word/2018/wordml" xmlns:w16sdtdh="http://schemas.microsoft.com/office/word/2020/wordml/sdtdatahash" xmlns:w16se="http://schemas.microsoft.com/office/word/2015/wordml/symex" xmlns:wpg="http://schemas.microsoft.com/office/word/2010/wordprocessingGroup" xmlns:wpi="http://schemas.microsoft.com/office/word/2010/wordprocessingInk" xmlns:wne="http://schemas.microsoft.com/office/word/2006/wordml" xmlns:wps="http://schemas.microsoft.com/office/word/2010/wordprocessingShape" mc:Ignorable="w14 w15 w16se w16cid w16 w16cex w16sdtdh wp14">
+  <w:p>
+    <w:pPr>
+      <w:pStyle w:val="Header"/>
+    </w:pPr>
+  </w:p>
+</w:hdr>
+</file>
+
+<file path=word/header4.xml><?xml version="1.0" encoding="utf-8"?>
+<w:hdr xmlns:wpc="http://schemas.microsoft.com/office/word/2010/wordprocessingCanvas" xmlns:cx="http://schemas.microsoft.com/office/drawing/2014/chartex" xmlns:cx1="http://schemas.microsoft.com/office/drawing/2015/9/8/chartex" xmlns:cx2="http://schemas.microsoft.com/office/drawing/2015/10/21/chartex" xmlns:cx3="http://schemas.microsoft.com/office/drawing/2016/5/9/chartex" xmlns:cx4="http://schemas.microsoft.com/office/drawing/2016/5/10/chartex" xmlns:cx5="http://schemas.microsoft.com/office/drawing/2016/5/11/chartex" xmlns:cx6="http://schemas.microsoft.com/office/drawing/2016/5/12/chartex" xmlns:cx7="http://schemas.microsoft.com/office/drawing/2016/5/13/chartex" xmlns:cx8="http://schemas.microsoft.com/office/drawing/2016/5/14/chartex" xmlns:mc="http://schemas.openxmlformats.org/markup-compatibility/2006" xmlns:aink="http://schemas.microsoft.com/office/drawing/2016/ink" xmlns:am3d="http://schemas.microsoft.com/office/drawing/2017/model3d" xmlns:o="urn:schemas-microsoft-com:office:office" xmlns:oel="http://schemas.microsoft.com/office/2019/extlst" xmlns:r="http://schemas.openxmlformats.org/officeDocument/2006/relationships" xmlns:m="http://schemas.openxmlformats.org/officeDocument/2006/math" xmlns:v="urn:schemas-microsoft-com:vml" xmlns:wp14="http://schemas.microsoft.com/office/word/2010/wordprocessingDrawing" xmlns:wp="http://schemas.openxmlformats.org/drawingml/2006/wordprocessingDrawing" xmlns:w10="urn:schemas-microsoft-com:office:word" xmlns:w="http://schemas.openxmlformats.org/wordprocessingml/2006/main" xmlns:w14="http://schemas.microsoft.com/office/word/2010/wordml" xmlns:w15="http://schemas.microsoft.com/office/word/2012/wordml" xmlns:w16cex="http://schemas.microsoft.com/office/word/2018/wordml/cex" xmlns:w16cid="http://schemas.microsoft.com/office/word/2016/wordml/cid" xmlns:w16="http://schemas.microsoft.com/office/word/2018/wordml" xmlns:w16sdtdh="http://schemas.microsoft.com/office/word/2020/wordml/sdtdatahash" xmlns:w16se="http://schemas.microsoft.com/office/word/2015/wordml/symex" xmlns:wpg="http://schemas.microsoft.com/office/word/2010/wordprocessingGroup" xmlns:wpi="http://schemas.microsoft.com/office/word/2010/wordprocessingInk" xmlns:wne="http://schemas.microsoft.com/office/word/2006/wordml" xmlns:wps="http://schemas.microsoft.com/office/word/2010/wordprocessingShape" mc:Ignorable="w14 w15 w16se w16cid w16 w16cex w16sdtdh wp14">
+  <w:p>
+    <w:pPr>
+      <w:pStyle w:val="Header"/>
+    </w:pPr>
+  </w:p>
+</w:hdr>
+</file>
+
+<file path=word/header5.xml><?xml version="1.0" encoding="utf-8"?>
+<w:hdr xmlns:wpc="http://schemas.microsoft.com/office/word/2010/wordprocessingCanvas" xmlns:cx="http://schemas.microsoft.com/office/drawing/2014/chartex" xmlns:cx1="http://schemas.microsoft.com/office/drawing/2015/9/8/chartex" xmlns:cx2="http://schemas.microsoft.com/office/drawing/2015/10/21/chartex" xmlns:cx3="http://schemas.microsoft.com/office/drawing/2016/5/9/chartex" xmlns:cx4="http://schemas.microsoft.com/office/drawing/2016/5/10/chartex" xmlns:cx5="http://schemas.microsoft.com/office/drawing/2016/5/11/chartex" xmlns:cx6="http://schemas.microsoft.com/office/drawing/2016/5/12/chartex" xmlns:cx7="http://schemas.microsoft.com/office/drawing/2016/5/13/chartex" xmlns:cx8="http://schemas.microsoft.com/office/drawing/2016/5/14/chartex" xmlns:mc="http://schemas.openxmlformats.org/markup-compatibility/2006" xmlns:aink="http://schemas.microsoft.com/office/drawing/2016/ink" xmlns:am3d="http://schemas.microsoft.com/office/drawing/2017/model3d" xmlns:o="urn:schemas-microsoft-com:office:office" xmlns:oel="http://schemas.microsoft.com/office/2019/extlst" xmlns:r="http://schemas.openxmlformats.org/officeDocument/2006/relationships" xmlns:m="http://schemas.openxmlformats.org/officeDocument/2006/math" xmlns:v="urn:schemas-microsoft-com:vml" xmlns:wp14="http://schemas.microsoft.com/office/word/2010/wordprocessingDrawing" xmlns:wp="http://schemas.openxmlformats.org/drawingml/2006/wordprocessingDrawing" xmlns:w10="urn:schemas-microsoft-com:office:word" xmlns:w="http://schemas.openxmlformats.org/wordprocessingml/2006/main" xmlns:w14="http://schemas.microsoft.com/office/word/2010/wordml" xmlns:w15="http://schemas.microsoft.com/office/word/2012/wordml" xmlns:w16cex="http://schemas.microsoft.com/office/word/2018/wordml/cex" xmlns:w16cid="http://schemas.microsoft.com/office/word/2016/wordml/cid" xmlns:w16="http://schemas.microsoft.com/office/word/2018/wordml" xmlns:w16sdtdh="http://schemas.microsoft.com/office/word/2020/wordml/sdtdatahash" xmlns:w16se="http://schemas.microsoft.com/office/word/2015/wordml/symex" xmlns:wpg="http://schemas.microsoft.com/office/word/2010/wordprocessingGroup" xmlns:wpi="http://schemas.microsoft.com/office/word/2010/wordprocessingInk" xmlns:wne="http://schemas.microsoft.com/office/word/2006/wordml" xmlns:wps="http://schemas.microsoft.com/office/word/2010/wordprocessingShape" mc:Ignorable="w14 w15 w16se w16cid w16 w16cex w16sdtdh wp14">
   <w:p>
     <w:pPr>
       <w:pStyle w:val="BodyText"/>
@@ -5710,7 +6160,7 @@
 </file>
 
 <file path=word/numbering.xml><?xml version="1.0" encoding="utf-8"?>
-<w:numbering xmlns:wpc="http://schemas.microsoft.com/office/word/2010/wordprocessingCanvas" xmlns:cx="http://schemas.microsoft.com/office/drawing/2014/chartex" xmlns:cx1="http://schemas.microsoft.com/office/drawing/2015/9/8/chartex" xmlns:cx2="http://schemas.microsoft.com/office/drawing/2015/10/21/chartex" xmlns:cx3="http://schemas.microsoft.com/office/drawing/2016/5/9/chartex" xmlns:cx4="http://schemas.microsoft.com/office/drawing/2016/5/10/chartex" xmlns:cx5="http://schemas.microsoft.com/office/drawing/2016/5/11/chartex" xmlns:cx6="http://schemas.microsoft.com/office/drawing/2016/5/12/chartex" xmlns:cx7="http://schemas.microsoft.com/office/drawing/2016/5/13/chartex" xmlns:cx8="http://schemas.microsoft.com/office/drawing/2016/5/14/chartex" xmlns:mc="http://schemas.openxmlformats.org/markup-compatibility/2006" xmlns:aink="http://schemas.microsoft.com/office/drawing/2016/ink" xmlns:am3d="http://schemas.microsoft.com/office/drawing/2017/model3d" xmlns:o="urn:schemas-microsoft-com:office:office" xmlns:oel="http://schemas.microsoft.com/office/2019/extlst" xmlns:r="http://schemas.openxmlformats.org/officeDocument/2006/relationships" xmlns:m="http://schemas.openxmlformats.org/officeDocument/2006/math" xmlns:v="urn:schemas-microsoft-com:vml" xmlns:wp14="http://schemas.microsoft.com/office/word/2010/wordprocessingDrawing" xmlns:wp="http://schemas.openxmlformats.org/drawingml/2006/wordprocessingDrawing" xmlns:w10="urn:schemas-microsoft-com:office:word" xmlns:w="http://schemas.openxmlformats.org/wordprocessingml/2006/main" xmlns:w14="http://schemas.microsoft.com/office/word/2010/wordml" xmlns:w15="http://schemas.microsoft.com/office/word/2012/wordml" xmlns:w16cex="http://schemas.microsoft.com/office/word/2018/wordml/cex" xmlns:w16cid="http://schemas.microsoft.com/office/word/2016/wordml/cid" xmlns:w16="http://schemas.microsoft.com/office/word/2018/wordml" xmlns:w16du="http://schemas.microsoft.com/office/word/2023/wordml/word16du" xmlns:w16sdtdh="http://schemas.microsoft.com/office/word/2020/wordml/sdtdatahash" xmlns:w16sdtfl="http://schemas.microsoft.com/office/word/2024/wordml/sdtformatlock" xmlns:w16se="http://schemas.microsoft.com/office/word/2015/wordml/symex" xmlns:wpg="http://schemas.microsoft.com/office/word/2010/wordprocessingGroup" xmlns:wpi="http://schemas.microsoft.com/office/word/2010/wordprocessingInk" xmlns:wne="http://schemas.microsoft.com/office/word/2006/wordml" xmlns:wps="http://schemas.microsoft.com/office/word/2010/wordprocessingShape" mc:Ignorable="w14 w15 w16se w16cid w16 w16cex w16sdtdh w16sdtfl w16du wp14">
+<w:numbering xmlns:wpc="http://schemas.microsoft.com/office/word/2010/wordprocessingCanvas" xmlns:cx="http://schemas.microsoft.com/office/drawing/2014/chartex" xmlns:cx1="http://schemas.microsoft.com/office/drawing/2015/9/8/chartex" xmlns:cx2="http://schemas.microsoft.com/office/drawing/2015/10/21/chartex" xmlns:cx3="http://schemas.microsoft.com/office/drawing/2016/5/9/chartex" xmlns:cx4="http://schemas.microsoft.com/office/drawing/2016/5/10/chartex" xmlns:cx5="http://schemas.microsoft.com/office/drawing/2016/5/11/chartex" xmlns:cx6="http://schemas.microsoft.com/office/drawing/2016/5/12/chartex" xmlns:cx7="http://schemas.microsoft.com/office/drawing/2016/5/13/chartex" xmlns:cx8="http://schemas.microsoft.com/office/drawing/2016/5/14/chartex" xmlns:mc="http://schemas.openxmlformats.org/markup-compatibility/2006" xmlns:aink="http://schemas.microsoft.com/office/drawing/2016/ink" xmlns:am3d="http://schemas.microsoft.com/office/drawing/2017/model3d" xmlns:o="urn:schemas-microsoft-com:office:office" xmlns:oel="http://schemas.microsoft.com/office/2019/extlst" xmlns:r="http://schemas.openxmlformats.org/officeDocument/2006/relationships" xmlns:m="http://schemas.openxmlformats.org/officeDocument/2006/math" xmlns:v="urn:schemas-microsoft-com:vml" xmlns:wp14="http://schemas.microsoft.com/office/word/2010/wordprocessingDrawing" xmlns:wp="http://schemas.openxmlformats.org/drawingml/2006/wordprocessingDrawing" xmlns:w10="urn:schemas-microsoft-com:office:word" xmlns:w="http://schemas.openxmlformats.org/wordprocessingml/2006/main" xmlns:w14="http://schemas.microsoft.com/office/word/2010/wordml" xmlns:w15="http://schemas.microsoft.com/office/word/2012/wordml" xmlns:w16cex="http://schemas.microsoft.com/office/word/2018/wordml/cex" xmlns:w16cid="http://schemas.microsoft.com/office/word/2016/wordml/cid" xmlns:w16="http://schemas.microsoft.com/office/word/2018/wordml" xmlns:w16sdtdh="http://schemas.microsoft.com/office/word/2020/wordml/sdtdatahash" xmlns:w16se="http://schemas.microsoft.com/office/word/2015/wordml/symex" xmlns:wpg="http://schemas.microsoft.com/office/word/2010/wordprocessingGroup" xmlns:wpi="http://schemas.microsoft.com/office/word/2010/wordprocessingInk" xmlns:wne="http://schemas.microsoft.com/office/word/2006/wordml" xmlns:wps="http://schemas.microsoft.com/office/word/2010/wordprocessingShape" mc:Ignorable="w14 w15 w16se w16cid w16 w16cex w16sdtdh wp14">
   <w:abstractNum w:abstractNumId="0" w15:restartNumberingAfterBreak="0">
     <w:nsid w:val="0CEB530B"/>
     <w:multiLevelType w:val="hybridMultilevel"/>
@@ -6354,7 +6804,7 @@
 </file>
 
 <file path=word/styles.xml><?xml version="1.0" encoding="utf-8"?>
-<w:styles xmlns:mc="http://schemas.openxmlformats.org/markup-compatibility/2006" xmlns:r="http://schemas.openxmlformats.org/officeDocument/2006/relationships" xmlns:w="http://schemas.openxmlformats.org/wordprocessingml/2006/main" xmlns:w14="http://schemas.microsoft.com/office/word/2010/wordml" xmlns:w15="http://schemas.microsoft.com/office/word/2012/wordml" xmlns:w16cex="http://schemas.microsoft.com/office/word/2018/wordml/cex" xmlns:w16cid="http://schemas.microsoft.com/office/word/2016/wordml/cid" xmlns:w16="http://schemas.microsoft.com/office/word/2018/wordml" xmlns:w16du="http://schemas.microsoft.com/office/word/2023/wordml/word16du" xmlns:w16sdtdh="http://schemas.microsoft.com/office/word/2020/wordml/sdtdatahash" xmlns:w16sdtfl="http://schemas.microsoft.com/office/word/2024/wordml/sdtformatlock" xmlns:w16se="http://schemas.microsoft.com/office/word/2015/wordml/symex" mc:Ignorable="w14 w15 w16se w16cid w16 w16cex w16sdtdh w16sdtfl w16du">
+<w:styles xmlns:mc="http://schemas.openxmlformats.org/markup-compatibility/2006" xmlns:r="http://schemas.openxmlformats.org/officeDocument/2006/relationships" xmlns:w="http://schemas.openxmlformats.org/wordprocessingml/2006/main" xmlns:w14="http://schemas.microsoft.com/office/word/2010/wordml" xmlns:w15="http://schemas.microsoft.com/office/word/2012/wordml" xmlns:w16cex="http://schemas.microsoft.com/office/word/2018/wordml/cex" xmlns:w16cid="http://schemas.microsoft.com/office/word/2016/wordml/cid" xmlns:w16="http://schemas.microsoft.com/office/word/2018/wordml" xmlns:w16sdtdh="http://schemas.microsoft.com/office/word/2020/wordml/sdtdatahash" xmlns:w16se="http://schemas.microsoft.com/office/word/2015/wordml/symex" mc:Ignorable="w14 w15 w16se w16cid w16 w16cex w16sdtdh">
   <w:docDefaults>
     <w:rPrDefault>
       <w:rPr>

</xml_diff>

<commit_message>
Revert "revert(templates): restore all templates to pristine original state from 071af7f"
This reverts commit ff7e48418ac56b95d0b56028dfadb134f5038419.
</commit_message>
<xml_diff>
--- a/backend/templates/Berkas Luar Kota - Laporan.docx
+++ b/backend/templates/Berkas Luar Kota - Laporan.docx
@@ -1,7 +1,287 @@
 
 <file path=word/document.xml><?xml version="1.0" encoding="utf-8"?>
-<w:document xmlns:wpc="http://schemas.microsoft.com/office/word/2010/wordprocessingCanvas" xmlns:cx="http://schemas.microsoft.com/office/drawing/2014/chartex" xmlns:cx1="http://schemas.microsoft.com/office/drawing/2015/9/8/chartex" xmlns:cx2="http://schemas.microsoft.com/office/drawing/2015/10/21/chartex" xmlns:cx3="http://schemas.microsoft.com/office/drawing/2016/5/9/chartex" xmlns:cx4="http://schemas.microsoft.com/office/drawing/2016/5/10/chartex" xmlns:cx5="http://schemas.microsoft.com/office/drawing/2016/5/11/chartex" xmlns:cx6="http://schemas.microsoft.com/office/drawing/2016/5/12/chartex" xmlns:cx7="http://schemas.microsoft.com/office/drawing/2016/5/13/chartex" xmlns:cx8="http://schemas.microsoft.com/office/drawing/2016/5/14/chartex" xmlns:mc="http://schemas.openxmlformats.org/markup-compatibility/2006" xmlns:aink="http://schemas.microsoft.com/office/drawing/2016/ink" xmlns:am3d="http://schemas.microsoft.com/office/drawing/2017/model3d" xmlns:o="urn:schemas-microsoft-com:office:office" xmlns:oel="http://schemas.microsoft.com/office/2019/extlst" xmlns:r="http://schemas.openxmlformats.org/officeDocument/2006/relationships" xmlns:m="http://schemas.openxmlformats.org/officeDocument/2006/math" xmlns:v="urn:schemas-microsoft-com:vml" xmlns:wp14="http://schemas.microsoft.com/office/word/2010/wordprocessingDrawing" xmlns:wp="http://schemas.openxmlformats.org/drawingml/2006/wordprocessingDrawing" xmlns:w10="urn:schemas-microsoft-com:office:word" xmlns:w="http://schemas.openxmlformats.org/wordprocessingml/2006/main" xmlns:w14="http://schemas.microsoft.com/office/word/2010/wordml" xmlns:w15="http://schemas.microsoft.com/office/word/2012/wordml" xmlns:w16cex="http://schemas.microsoft.com/office/word/2018/wordml/cex" xmlns:w16cid="http://schemas.microsoft.com/office/word/2016/wordml/cid" xmlns:w16="http://schemas.microsoft.com/office/word/2018/wordml" xmlns:w16sdtdh="http://schemas.microsoft.com/office/word/2020/wordml/sdtdatahash" xmlns:w16se="http://schemas.microsoft.com/office/word/2015/wordml/symex" xmlns:wpg="http://schemas.microsoft.com/office/word/2010/wordprocessingGroup" xmlns:wpi="http://schemas.microsoft.com/office/word/2010/wordprocessingInk" xmlns:wne="http://schemas.microsoft.com/office/word/2006/wordml" xmlns:wps="http://schemas.microsoft.com/office/word/2010/wordprocessingShape" mc:Ignorable="w14 w15 w16se w16cid w16 w16cex w16sdtdh wp14">
+<w:document xmlns:wpc="http://schemas.microsoft.com/office/word/2010/wordprocessingCanvas" xmlns:cx="http://schemas.microsoft.com/office/drawing/2014/chartex" xmlns:cx1="http://schemas.microsoft.com/office/drawing/2015/9/8/chartex" xmlns:cx2="http://schemas.microsoft.com/office/drawing/2015/10/21/chartex" xmlns:cx3="http://schemas.microsoft.com/office/drawing/2016/5/9/chartex" xmlns:cx4="http://schemas.microsoft.com/office/drawing/2016/5/10/chartex" xmlns:cx5="http://schemas.microsoft.com/office/drawing/2016/5/11/chartex" xmlns:cx6="http://schemas.microsoft.com/office/drawing/2016/5/12/chartex" xmlns:cx7="http://schemas.microsoft.com/office/drawing/2016/5/13/chartex" xmlns:cx8="http://schemas.microsoft.com/office/drawing/2016/5/14/chartex" xmlns:mc="http://schemas.openxmlformats.org/markup-compatibility/2006" xmlns:aink="http://schemas.microsoft.com/office/drawing/2016/ink" xmlns:am3d="http://schemas.microsoft.com/office/drawing/2017/model3d" xmlns:o="urn:schemas-microsoft-com:office:office" xmlns:oel="http://schemas.microsoft.com/office/2019/extlst" xmlns:r="http://schemas.openxmlformats.org/officeDocument/2006/relationships" xmlns:m="http://schemas.openxmlformats.org/officeDocument/2006/math" xmlns:v="urn:schemas-microsoft-com:vml" xmlns:wp14="http://schemas.microsoft.com/office/word/2010/wordprocessingDrawing" xmlns:wp="http://schemas.openxmlformats.org/drawingml/2006/wordprocessingDrawing" xmlns:w10="urn:schemas-microsoft-com:office:word" xmlns:w="http://schemas.openxmlformats.org/wordprocessingml/2006/main" xmlns:w14="http://schemas.microsoft.com/office/word/2010/wordml" xmlns:w15="http://schemas.microsoft.com/office/word/2012/wordml" xmlns:w16cex="http://schemas.microsoft.com/office/word/2018/wordml/cex" xmlns:w16cid="http://schemas.microsoft.com/office/word/2016/wordml/cid" xmlns:w16="http://schemas.microsoft.com/office/word/2018/wordml" xmlns:w16du="http://schemas.microsoft.com/office/word/2023/wordml/word16du" xmlns:w16sdtdh="http://schemas.microsoft.com/office/word/2020/wordml/sdtdatahash" xmlns:w16sdtfl="http://schemas.microsoft.com/office/word/2024/wordml/sdtformatlock" xmlns:w16se="http://schemas.microsoft.com/office/word/2015/wordml/symex" xmlns:wpg="http://schemas.microsoft.com/office/word/2010/wordprocessingGroup" xmlns:wpi="http://schemas.microsoft.com/office/word/2010/wordprocessingInk" xmlns:wne="http://schemas.microsoft.com/office/word/2006/wordml" xmlns:wps="http://schemas.microsoft.com/office/word/2010/wordprocessingShape" mc:Ignorable="w14 w15 w16se w16cid w16 w16cex w16sdtdh w16sdtfl w16du wp14">
   <w:body>
+    <w:tbl>
+      <w:tblPr>
+        <w:tblStyle w:val="TableGrid"/>
+        <w:tblW w:w="10915" w:type="dxa"/>
+        <w:tblInd w:w="108" w:type="dxa"/>
+        <w:tblBorders>
+          <w:top w:val="none" w:sz="0" w:space="0" w:color="auto"/>
+          <w:left w:val="none" w:sz="0" w:space="0" w:color="auto"/>
+          <w:bottom w:val="none" w:sz="0" w:space="0" w:color="auto"/>
+          <w:right w:val="none" w:sz="0" w:space="0" w:color="auto"/>
+          <w:insideH w:val="none" w:sz="0" w:space="0" w:color="auto"/>
+          <w:insideV w:val="none" w:sz="0" w:space="0" w:color="auto"/>
+        </w:tblBorders>
+        <w:tblLook w:val="04A0" w:firstRow="1" w:lastRow="0" w:firstColumn="1" w:lastColumn="0" w:noHBand="0" w:noVBand="1"/>
+      </w:tblPr>
+      <w:tblGrid>
+        <w:gridCol w:w="1322"/>
+        <w:gridCol w:w="9593"/>
+      </w:tblGrid>
+      <w:tr>
+        <w:trPr>
+          <w:trHeight w:val="1867"/>
+        </w:trPr>
+        <w:tc>
+          <w:tcPr>
+            <w:tcW w:w="1322" w:type="dxa"/>
+          </w:tcPr>
+          <w:p>
+            <w:pPr>
+              <w:pStyle w:val="Header"/>
+            </w:pPr>
+            <w:r>
+              <w:rPr>
+                <w:noProof/>
+              </w:rPr>
+              <w:drawing>
+                <wp:anchor distT="0" distB="0" distL="114300" distR="114300" simplePos="0" relativeHeight="251659264" behindDoc="1" locked="0" layoutInCell="1" allowOverlap="1" wp14:anchorId="4D77D877" wp14:editId="66B5DCF9">
+                  <wp:simplePos x="0" y="0"/>
+                  <wp:positionH relativeFrom="column">
+                    <wp:posOffset>5715</wp:posOffset>
+                  </wp:positionH>
+                  <wp:positionV relativeFrom="paragraph">
+                    <wp:posOffset>224459</wp:posOffset>
+                  </wp:positionV>
+                  <wp:extent cx="648970" cy="819785"/>
+                  <wp:effectExtent l="0" t="0" r="0" b="0"/>
+                  <wp:wrapTight wrapText="bothSides">
+                    <wp:wrapPolygon edited="0">
+                      <wp:start x="8877" y="0"/>
+                      <wp:lineTo x="5072" y="2008"/>
+                      <wp:lineTo x="0" y="6525"/>
+                      <wp:lineTo x="0" y="10541"/>
+                      <wp:lineTo x="7609" y="16062"/>
+                      <wp:lineTo x="10779" y="16062"/>
+                      <wp:lineTo x="0" y="18070"/>
+                      <wp:lineTo x="0" y="21081"/>
+                      <wp:lineTo x="3170" y="21081"/>
+                      <wp:lineTo x="5706" y="21081"/>
+                      <wp:lineTo x="20924" y="21081"/>
+                      <wp:lineTo x="20924" y="18572"/>
+                      <wp:lineTo x="12681" y="16062"/>
+                      <wp:lineTo x="20924" y="9537"/>
+                      <wp:lineTo x="20924" y="6525"/>
+                      <wp:lineTo x="15851" y="2510"/>
+                      <wp:lineTo x="11413" y="0"/>
+                      <wp:lineTo x="8877" y="0"/>
+                    </wp:wrapPolygon>
+                  </wp:wrapTight>
+                  <wp:docPr id="269144722" name="Picture 269144722"/>
+                  <wp:cNvGraphicFramePr>
+                    <a:graphicFrameLocks xmlns:a="http://schemas.openxmlformats.org/drawingml/2006/main" noChangeAspect="1"/>
+                  </wp:cNvGraphicFramePr>
+                  <a:graphic xmlns:a="http://schemas.openxmlformats.org/drawingml/2006/main">
+                    <a:graphicData uri="http://schemas.openxmlformats.org/drawingml/2006/picture">
+                      <pic:pic xmlns:pic="http://schemas.openxmlformats.org/drawingml/2006/picture">
+                        <pic:nvPicPr>
+                          <pic:cNvPr id="1" name="Picture 1"/>
+                          <pic:cNvPicPr>
+                            <a:picLocks noChangeAspect="1"/>
+                          </pic:cNvPicPr>
+                        </pic:nvPicPr>
+                        <pic:blipFill>
+                          <a:blip r:embed="rId7" cstate="print">
+                            <a:extLst>
+                              <a:ext uri="{28A0092B-C50C-407E-A947-70E740481C1C}">
+                                <a14:useLocalDpi xmlns:a14="http://schemas.microsoft.com/office/drawing/2010/main" val="0"/>
+                              </a:ext>
+                            </a:extLst>
+                          </a:blip>
+                          <a:stretch>
+                            <a:fillRect/>
+                          </a:stretch>
+                        </pic:blipFill>
+                        <pic:spPr>
+                          <a:xfrm>
+                            <a:off x="0" y="0"/>
+                            <a:ext cx="648970" cy="819785"/>
+                          </a:xfrm>
+                          <a:prstGeom prst="rect">
+                            <a:avLst/>
+                          </a:prstGeom>
+                        </pic:spPr>
+                      </pic:pic>
+                    </a:graphicData>
+                  </a:graphic>
+                </wp:anchor>
+              </w:drawing>
+            </w:r>
+            <w:r>
+              <w:rPr>
+                <w:noProof/>
+              </w:rPr>
+              <w:drawing>
+                <wp:anchor distT="0" distB="0" distL="114300" distR="114300" simplePos="0" relativeHeight="251658240" behindDoc="1" locked="0" layoutInCell="1" allowOverlap="1" wp14:anchorId="2179C7AA" wp14:editId="6CA944F7">
+                  <wp:simplePos x="0" y="0"/>
+                  <wp:positionH relativeFrom="column">
+                    <wp:posOffset>689379</wp:posOffset>
+                  </wp:positionH>
+                  <wp:positionV relativeFrom="paragraph">
+                    <wp:posOffset>-11875</wp:posOffset>
+                  </wp:positionV>
+                  <wp:extent cx="78740" cy="1292225"/>
+                  <wp:effectExtent l="0" t="0" r="0" b="3175"/>
+                  <wp:wrapTight wrapText="bothSides">
+                    <wp:wrapPolygon edited="0">
+                      <wp:start x="0" y="0"/>
+                      <wp:lineTo x="0" y="21335"/>
+                      <wp:lineTo x="15677" y="21335"/>
+                      <wp:lineTo x="15677" y="0"/>
+                      <wp:lineTo x="0" y="0"/>
+                    </wp:wrapPolygon>
+                  </wp:wrapTight>
+                  <wp:docPr id="1716352736" name="Picture 1716352736"/>
+                  <wp:cNvGraphicFramePr>
+                    <a:graphicFrameLocks xmlns:a="http://schemas.openxmlformats.org/drawingml/2006/main" noChangeAspect="1"/>
+                  </wp:cNvGraphicFramePr>
+                  <a:graphic xmlns:a="http://schemas.openxmlformats.org/drawingml/2006/main">
+                    <a:graphicData uri="http://schemas.openxmlformats.org/drawingml/2006/picture">
+                      <pic:pic xmlns:pic="http://schemas.openxmlformats.org/drawingml/2006/picture">
+                        <pic:nvPicPr>
+                          <pic:cNvPr id="2" name="Picture 2"/>
+                          <pic:cNvPicPr>
+                            <a:picLocks noChangeAspect="1"/>
+                          </pic:cNvPicPr>
+                        </pic:nvPicPr>
+                        <pic:blipFill>
+                          <a:blip r:embed="rId8" cstate="print">
+                            <a:extLst>
+                              <a:ext uri="{28A0092B-C50C-407E-A947-70E740481C1C}">
+                                <a14:useLocalDpi xmlns:a14="http://schemas.microsoft.com/office/drawing/2010/main" val="0"/>
+                              </a:ext>
+                            </a:extLst>
+                          </a:blip>
+                          <a:stretch>
+                            <a:fillRect/>
+                          </a:stretch>
+                        </pic:blipFill>
+                        <pic:spPr>
+                          <a:xfrm>
+                            <a:off x="0" y="0"/>
+                            <a:ext cx="78740" cy="1292225"/>
+                          </a:xfrm>
+                          <a:prstGeom prst="rect">
+                            <a:avLst/>
+                          </a:prstGeom>
+                        </pic:spPr>
+                      </pic:pic>
+                    </a:graphicData>
+                  </a:graphic>
+                </wp:anchor>
+              </w:drawing>
+            </w:r>
+          </w:p>
+          <w:p>
+            <w:pPr>
+              <w:pStyle w:val="Header"/>
+            </w:pPr>
+          </w:p>
+        </w:tc>
+        <w:tc>
+          <w:tcPr>
+            <w:tcW w:w="9593" w:type="dxa"/>
+          </w:tcPr>
+          <w:tbl>
+            <w:tblPr>
+              <w:tblStyle w:val="TableGrid"/>
+              <w:tblpPr w:leftFromText="180" w:rightFromText="180" w:vertAnchor="page" w:horzAnchor="margin" w:tblpY="515"/>
+              <w:tblOverlap w:val="never"/>
+              <w:tblW w:w="0" w:type="auto"/>
+              <w:tblBorders>
+                <w:top w:val="none" w:sz="0" w:space="0" w:color="auto"/>
+                <w:left w:val="none" w:sz="0" w:space="0" w:color="auto"/>
+                <w:bottom w:val="none" w:sz="0" w:space="0" w:color="auto"/>
+                <w:right w:val="none" w:sz="0" w:space="0" w:color="auto"/>
+                <w:insideH w:val="none" w:sz="0" w:space="0" w:color="auto"/>
+                <w:insideV w:val="none" w:sz="0" w:space="0" w:color="auto"/>
+              </w:tblBorders>
+              <w:tblLook w:val="04A0" w:firstRow="1" w:lastRow="0" w:firstColumn="1" w:lastColumn="0" w:noHBand="0" w:noVBand="1"/>
+            </w:tblPr>
+            <w:tblGrid>
+              <w:gridCol w:w="8505"/>
+            </w:tblGrid>
+            <w:tr>
+              <w:tc>
+                <w:tcPr>
+                  <w:tcW w:w="8505" w:type="dxa"/>
+                </w:tcPr>
+                <w:p>
+                  <w:pPr>
+                    <w:rPr>
+                      <w:rFonts w:ascii="Arial Narrow" w:hAnsi="Arial Narrow"/>
+                      <w:b/>
+                      <w:bCs/>
+                      <w:sz w:val="29"/>
+                      <w:szCs w:val="29"/>
+                    </w:rPr>
+                  </w:pPr>
+                  <w:r>
+                    <w:rPr>
+                      <w:rFonts w:ascii="Arial Narrow" w:hAnsi="Arial Narrow"/>
+                      <w:b/>
+                      <w:bCs/>
+                      <w:sz w:val="29"/>
+                      <w:szCs w:val="29"/>
+                    </w:rPr>
+                    <w:t>KEMENTERIAN KETENAGAKERJAAN REPUBLIK INDONESIA</w:t>
+                  </w:r>
+                </w:p>
+              </w:tc>
+            </w:tr>
+            <w:tr>
+              <w:tc>
+                <w:tcPr>
+                  <w:tcW w:w="8505" w:type="dxa"/>
+                </w:tcPr>
+                <w:p>
+                  <w:pPr>
+                    <w:rPr>
+                      <w:rFonts w:ascii="Arial Narrow" w:hAnsi="Arial Narrow"/>
+                      <w:color w:val="284A61"/>
+                      <w:sz w:val="32"/>
+                      <w:szCs w:val="32"/>
+                    </w:rPr>
+                  </w:pPr>
+                  <w:r>
+                    <w:rPr>
+                      <w:rFonts w:ascii="Arial Narrow" w:hAnsi="Arial Narrow"/>
+                      <w:color w:val="284A61"/>
+                      <w:sz w:val="29"/>
+                      <w:szCs w:val="29"/>
+                    </w:rPr>
+                    <w:t>SEKRETARIAT JENDERAL</w:t>
+                  </w:r>
+                </w:p>
+              </w:tc>
+            </w:tr>
+          </w:tbl>
+          <w:p>
+            <w:pPr>
+              <w:rPr>
+                <w:rFonts w:ascii="Arial Narrow" w:hAnsi="Arial Narrow"/>
+                <w:color w:val="284A61"/>
+                <w:sz w:val="32"/>
+                <w:szCs w:val="32"/>
+              </w:rPr>
+            </w:pPr>
+          </w:p>
+        </w:tc>
+      </w:tr>
+    </w:tbl>
+    <w:p>
+      <w:pPr>
+        <w:pStyle w:val="Heading1"/>
+        <w:ind w:left="0" w:right="137"/>
+        <w:jc w:val="center"/>
+        <w:rPr>
+          <w:spacing w:val="-2"/>
+        </w:rPr>
+      </w:pPr>
+    </w:p>
     <w:p>
       <w:pPr>
         <w:pStyle w:val="Heading1"/>
@@ -143,7 +423,7 @@
         <w:tblLook w:val="04A0" w:firstRow="1" w:lastRow="0" w:firstColumn="1" w:lastColumn="0" w:noHBand="0" w:noVBand="1"/>
       </w:tblPr>
       <w:tblGrid>
-        <w:gridCol w:w="9478"/>
+        <w:gridCol w:w="9484"/>
       </w:tblGrid>
       <w:tr>
         <w:tc>
@@ -1055,7 +1335,7 @@
               <w:tblLook w:val="04A0" w:firstRow="1" w:lastRow="0" w:firstColumn="1" w:lastColumn="0" w:noHBand="0" w:noVBand="1"/>
             </w:tblPr>
             <w:tblGrid>
-              <w:gridCol w:w="1452"/>
+              <w:gridCol w:w="1453"/>
             </w:tblGrid>
             <w:tr>
               <w:tc>
@@ -1200,50 +1480,44 @@
       <w:pPr>
         <w:pStyle w:val="BodyText"/>
         <w:spacing w:before="1"/>
-        <w:ind w:left="1225"/>
+        <w:ind w:left="1225" w:right="447"/>
         <w:jc w:val="both"/>
         <w:rPr>
           <w:lang w:val="en-US"/>
         </w:rPr>
-        <w:sectPr>
-          <w:headerReference w:type="even" r:id="rId7"/>
-          <w:headerReference w:type="default" r:id="rId8"/>
-          <w:footerReference w:type="even" r:id="rId9"/>
-          <w:footerReference w:type="default" r:id="rId10"/>
-          <w:headerReference w:type="first" r:id="rId11"/>
-          <w:footerReference w:type="first" r:id="rId12"/>
-          <w:type w:val="continuous"/>
-          <w:pgSz w:w="12240" w:h="20160"/>
-          <w:pgMar w:top="1200" w:right="1080" w:bottom="280" w:left="1080" w:header="340" w:footer="720" w:gutter="0"/>
-          <w:cols w:space="720"/>
-          <w:docGrid w:linePitch="299"/>
-        </w:sectPr>
       </w:pPr>
       <w:r>
         <w:rPr>
           <w:lang w:val="en-US"/>
         </w:rPr>
-        <w:t>{{</w:t>
-      </w:r>
-      <w:proofErr w:type="spellStart"/>
-      <w:r>
+        <w:t>{{isi_laporan}}</w:t>
+      </w:r>
+    </w:p>
+    <w:p>
+      <w:pPr>
+        <w:pStyle w:val="BodyText"/>
+        <w:spacing w:before="1"/>
+        <w:jc w:val="both"/>
         <w:rPr>
           <w:lang w:val="en-US"/>
         </w:rPr>
-        <w:t>isi_laporan</w:t>
-      </w:r>
-      <w:proofErr w:type="spellEnd"/>
-      <w:r>
+      </w:pPr>
+    </w:p>
+    <w:p>
+      <w:pPr>
+        <w:pStyle w:val="BodyText"/>
+        <w:spacing w:before="1"/>
+        <w:jc w:val="both"/>
         <w:rPr>
           <w:lang w:val="en-US"/>
         </w:rPr>
-        <w:t>}}</w:t>
-      </w:r>
+      </w:pPr>
     </w:p>
     <w:p>
       <w:pPr>
         <w:pStyle w:val="BodyText"/>
-        <w:spacing w:before="51"/>
+        <w:spacing w:before="1"/>
+        <w:jc w:val="both"/>
       </w:pPr>
     </w:p>
     <w:p>
@@ -1495,8 +1769,8 @@
       </w:tblPr>
       <w:tblGrid>
         <w:gridCol w:w="782"/>
-        <w:gridCol w:w="6233"/>
-        <w:gridCol w:w="2634"/>
+        <w:gridCol w:w="6236"/>
+        <w:gridCol w:w="2636"/>
       </w:tblGrid>
       <w:tr>
         <w:trPr>
@@ -1521,15 +1795,8 @@
                 <w:spacing w:val="-2"/>
                 <w:lang w:val="en-US"/>
               </w:rPr>
-              <w:t>{{</w:t>
-            </w:r>
-            <w:proofErr w:type="spellStart"/>
-            <w:r>
-              <w:rPr>
-                <w:spacing w:val="-2"/>
-                <w:lang w:val="en-US"/>
-              </w:rPr>
-              <w:t>no_urut</w:t>
+              <w:lastRenderedPageBreak/>
+              <w:t>{{no_urut</w:t>
             </w:r>
             <w:r>
               <w:rPr>
@@ -1538,7 +1805,6 @@
               </w:rPr>
               <w:t>_satu</w:t>
             </w:r>
-            <w:proofErr w:type="spellEnd"/>
             <w:r>
               <w:rPr>
                 <w:spacing w:val="-2"/>
@@ -1564,21 +1830,7 @@
               <w:rPr>
                 <w:lang w:val="en-US"/>
               </w:rPr>
-              <w:t>{{</w:t>
-            </w:r>
-            <w:proofErr w:type="spellStart"/>
-            <w:r>
-              <w:rPr>
-                <w:lang w:val="en-US"/>
-              </w:rPr>
-              <w:t>nama_petugas_satu</w:t>
-            </w:r>
-            <w:proofErr w:type="spellEnd"/>
-            <w:r>
-              <w:rPr>
-                <w:lang w:val="en-US"/>
-              </w:rPr>
-              <w:t>}}</w:t>
+              <w:t>{{nama_petugas_satu}}</w:t>
             </w:r>
           </w:p>
           <w:p>
@@ -1611,21 +1863,7 @@
               <w:rPr>
                 <w:lang w:val="en-US"/>
               </w:rPr>
-              <w:t>NIP. {{</w:t>
-            </w:r>
-            <w:proofErr w:type="spellStart"/>
-            <w:r>
-              <w:rPr>
-                <w:lang w:val="en-US"/>
-              </w:rPr>
-              <w:t>nip_petugas_satu</w:t>
-            </w:r>
-            <w:proofErr w:type="spellEnd"/>
-            <w:r>
-              <w:rPr>
-                <w:lang w:val="en-US"/>
-              </w:rPr>
-              <w:t>}}</w:t>
+              <w:t>NIP. {{nip_petugas_satu}}</w:t>
             </w:r>
           </w:p>
         </w:tc>
@@ -1644,15 +1882,7 @@
                 <w:spacing w:val="-2"/>
                 <w:lang w:val="en-US"/>
               </w:rPr>
-              <w:t>{{</w:t>
-            </w:r>
-            <w:proofErr w:type="spellStart"/>
-            <w:r>
-              <w:rPr>
-                <w:spacing w:val="-2"/>
-                <w:lang w:val="en-US"/>
-              </w:rPr>
-              <w:t>no_urut</w:t>
+              <w:t>{{no_urut</w:t>
             </w:r>
             <w:r>
               <w:rPr>
@@ -1661,7 +1891,6 @@
               </w:rPr>
               <w:t>_satu</w:t>
             </w:r>
-            <w:proofErr w:type="spellEnd"/>
             <w:proofErr w:type="gramStart"/>
             <w:r>
               <w:rPr>
@@ -1681,8 +1910,16 @@
               <w:rPr>
                 <w:spacing w:val="-2"/>
               </w:rPr>
-              <w:t>…………………..</w:t>
-            </w:r>
+              <w:t>………………</w:t>
+            </w:r>
+            <w:proofErr w:type="gramStart"/>
+            <w:r>
+              <w:rPr>
+                <w:spacing w:val="-2"/>
+              </w:rPr>
+              <w:t>…..</w:t>
+            </w:r>
+            <w:proofErr w:type="gramEnd"/>
           </w:p>
         </w:tc>
       </w:tr>
@@ -1710,23 +1947,7 @@
                 <w:spacing w:val="-2"/>
                 <w:lang w:val="en-US"/>
               </w:rPr>
-              <w:t>{{</w:t>
-            </w:r>
-            <w:proofErr w:type="spellStart"/>
-            <w:r>
-              <w:rPr>
-                <w:spacing w:val="-2"/>
-                <w:lang w:val="en-US"/>
-              </w:rPr>
-              <w:t>no_urut_dua</w:t>
-            </w:r>
-            <w:proofErr w:type="spellEnd"/>
-            <w:r>
-              <w:rPr>
-                <w:spacing w:val="-2"/>
-                <w:lang w:val="en-US"/>
-              </w:rPr>
-              <w:t>}}</w:t>
+              <w:t>{{no_urut_dua}}</w:t>
             </w:r>
           </w:p>
         </w:tc>
@@ -1746,14 +1967,7 @@
               <w:rPr>
                 <w:lang w:val="en-US"/>
               </w:rPr>
-              <w:t>{{</w:t>
-            </w:r>
-            <w:proofErr w:type="spellStart"/>
-            <w:r>
-              <w:rPr>
-                <w:lang w:val="en-US"/>
-              </w:rPr>
-              <w:t>nama_petugas_</w:t>
+              <w:t>{{nama_petugas_</w:t>
             </w:r>
             <w:r>
               <w:rPr>
@@ -1761,7 +1975,6 @@
               </w:rPr>
               <w:t>dua</w:t>
             </w:r>
-            <w:proofErr w:type="spellEnd"/>
             <w:r>
               <w:rPr>
                 <w:lang w:val="en-US"/>
@@ -1790,21 +2003,7 @@
               <w:rPr>
                 <w:lang w:val="en-US"/>
               </w:rPr>
-              <w:t>NIP. {{</w:t>
-            </w:r>
-            <w:proofErr w:type="spellStart"/>
-            <w:r>
-              <w:rPr>
-                <w:lang w:val="en-US"/>
-              </w:rPr>
-              <w:t>nip_petugas_dua</w:t>
-            </w:r>
-            <w:proofErr w:type="spellEnd"/>
-            <w:r>
-              <w:rPr>
-                <w:lang w:val="en-US"/>
-              </w:rPr>
-              <w:t>}}</w:t>
+              <w:t>NIP. {{nip_petugas_dua}}</w:t>
             </w:r>
           </w:p>
         </w:tc>
@@ -1827,15 +2026,7 @@
                 <w:spacing w:val="-2"/>
                 <w:lang w:val="en-US"/>
               </w:rPr>
-              <w:t>{{</w:t>
-            </w:r>
-            <w:proofErr w:type="spellStart"/>
-            <w:r>
-              <w:rPr>
-                <w:spacing w:val="-2"/>
-                <w:lang w:val="en-US"/>
-              </w:rPr>
-              <w:t>no_urut_</w:t>
+              <w:t>{{no_urut_</w:t>
             </w:r>
             <w:r>
               <w:rPr>
@@ -1844,7 +2035,6 @@
               </w:rPr>
               <w:t>dua</w:t>
             </w:r>
-            <w:proofErr w:type="spellEnd"/>
             <w:proofErr w:type="gramStart"/>
             <w:r>
               <w:rPr>
@@ -1864,8 +2054,16 @@
               <w:rPr>
                 <w:spacing w:val="-2"/>
               </w:rPr>
-              <w:t>…………………..</w:t>
-            </w:r>
+              <w:t>………………</w:t>
+            </w:r>
+            <w:proofErr w:type="gramStart"/>
+            <w:r>
+              <w:rPr>
+                <w:spacing w:val="-2"/>
+              </w:rPr>
+              <w:t>…..</w:t>
+            </w:r>
+            <w:proofErr w:type="gramEnd"/>
           </w:p>
         </w:tc>
       </w:tr>
@@ -1893,23 +2091,7 @@
                 <w:spacing w:val="-2"/>
                 <w:lang w:val="en-US"/>
               </w:rPr>
-              <w:t>{{</w:t>
-            </w:r>
-            <w:proofErr w:type="spellStart"/>
-            <w:r>
-              <w:rPr>
-                <w:spacing w:val="-2"/>
-                <w:lang w:val="en-US"/>
-              </w:rPr>
-              <w:t>no_urut_tiga</w:t>
-            </w:r>
-            <w:proofErr w:type="spellEnd"/>
-            <w:r>
-              <w:rPr>
-                <w:spacing w:val="-2"/>
-                <w:lang w:val="en-US"/>
-              </w:rPr>
-              <w:t>}}</w:t>
+              <w:t>{{no_urut_tiga}}</w:t>
             </w:r>
           </w:p>
         </w:tc>
@@ -1929,14 +2111,7 @@
               <w:rPr>
                 <w:lang w:val="en-US"/>
               </w:rPr>
-              <w:t>{{</w:t>
-            </w:r>
-            <w:proofErr w:type="spellStart"/>
-            <w:r>
-              <w:rPr>
-                <w:lang w:val="en-US"/>
-              </w:rPr>
-              <w:t>nama_petugas_</w:t>
+              <w:t>{{nama_petugas_</w:t>
             </w:r>
             <w:r>
               <w:rPr>
@@ -1944,7 +2119,6 @@
               </w:rPr>
               <w:t>tiga</w:t>
             </w:r>
-            <w:proofErr w:type="spellEnd"/>
             <w:r>
               <w:rPr>
                 <w:lang w:val="en-US"/>
@@ -1973,21 +2147,7 @@
               <w:rPr>
                 <w:lang w:val="en-US"/>
               </w:rPr>
-              <w:t>NIP. {{</w:t>
-            </w:r>
-            <w:proofErr w:type="spellStart"/>
-            <w:r>
-              <w:rPr>
-                <w:lang w:val="en-US"/>
-              </w:rPr>
-              <w:t>nip_petugas_tiga</w:t>
-            </w:r>
-            <w:proofErr w:type="spellEnd"/>
-            <w:r>
-              <w:rPr>
-                <w:lang w:val="en-US"/>
-              </w:rPr>
-              <w:t>}}</w:t>
+              <w:t>NIP. {{nip_petugas_tiga}}</w:t>
             </w:r>
           </w:p>
         </w:tc>
@@ -2010,15 +2170,7 @@
                 <w:spacing w:val="-2"/>
                 <w:lang w:val="en-US"/>
               </w:rPr>
-              <w:t>{{</w:t>
-            </w:r>
-            <w:proofErr w:type="spellStart"/>
-            <w:r>
-              <w:rPr>
-                <w:spacing w:val="-2"/>
-                <w:lang w:val="en-US"/>
-              </w:rPr>
-              <w:t>no_urut_</w:t>
+              <w:t>{{no_urut_</w:t>
             </w:r>
             <w:r>
               <w:rPr>
@@ -2027,7 +2179,6 @@
               </w:rPr>
               <w:t>tiga</w:t>
             </w:r>
-            <w:proofErr w:type="spellEnd"/>
             <w:proofErr w:type="gramStart"/>
             <w:r>
               <w:rPr>
@@ -2047,8 +2198,16 @@
               <w:rPr>
                 <w:spacing w:val="-2"/>
               </w:rPr>
-              <w:t>…………………..</w:t>
-            </w:r>
+              <w:t>………………</w:t>
+            </w:r>
+            <w:proofErr w:type="gramStart"/>
+            <w:r>
+              <w:rPr>
+                <w:spacing w:val="-2"/>
+              </w:rPr>
+              <w:t>…..</w:t>
+            </w:r>
+            <w:proofErr w:type="gramEnd"/>
           </w:p>
         </w:tc>
       </w:tr>
@@ -2076,23 +2235,7 @@
                 <w:spacing w:val="-2"/>
                 <w:lang w:val="en-US"/>
               </w:rPr>
-              <w:t>{{</w:t>
-            </w:r>
-            <w:proofErr w:type="spellStart"/>
-            <w:r>
-              <w:rPr>
-                <w:spacing w:val="-2"/>
-                <w:lang w:val="en-US"/>
-              </w:rPr>
-              <w:t>no_urut_empat</w:t>
-            </w:r>
-            <w:proofErr w:type="spellEnd"/>
-            <w:r>
-              <w:rPr>
-                <w:spacing w:val="-2"/>
-                <w:lang w:val="en-US"/>
-              </w:rPr>
-              <w:t>}}</w:t>
+              <w:t>{{no_urut_empat}}</w:t>
             </w:r>
           </w:p>
         </w:tc>
@@ -2112,14 +2255,7 @@
               <w:rPr>
                 <w:lang w:val="en-US"/>
               </w:rPr>
-              <w:t>{{</w:t>
-            </w:r>
-            <w:proofErr w:type="spellStart"/>
-            <w:r>
-              <w:rPr>
-                <w:lang w:val="en-US"/>
-              </w:rPr>
-              <w:t>nama_petugas_</w:t>
+              <w:t>{{nama_petugas_</w:t>
             </w:r>
             <w:r>
               <w:rPr>
@@ -2127,7 +2263,6 @@
               </w:rPr>
               <w:t>empat</w:t>
             </w:r>
-            <w:proofErr w:type="spellEnd"/>
             <w:r>
               <w:rPr>
                 <w:lang w:val="en-US"/>
@@ -2156,21 +2291,7 @@
               <w:rPr>
                 <w:lang w:val="en-US"/>
               </w:rPr>
-              <w:t>NIP. {{</w:t>
-            </w:r>
-            <w:proofErr w:type="spellStart"/>
-            <w:r>
-              <w:rPr>
-                <w:lang w:val="en-US"/>
-              </w:rPr>
-              <w:t>nip_petugas_empat</w:t>
-            </w:r>
-            <w:proofErr w:type="spellEnd"/>
-            <w:r>
-              <w:rPr>
-                <w:lang w:val="en-US"/>
-              </w:rPr>
-              <w:t>}}</w:t>
+              <w:t>NIP. {{nip_petugas_empat}}</w:t>
             </w:r>
           </w:p>
         </w:tc>
@@ -2193,15 +2314,7 @@
                 <w:spacing w:val="-2"/>
                 <w:lang w:val="en-US"/>
               </w:rPr>
-              <w:t>{{</w:t>
-            </w:r>
-            <w:proofErr w:type="spellStart"/>
-            <w:r>
-              <w:rPr>
-                <w:spacing w:val="-2"/>
-                <w:lang w:val="en-US"/>
-              </w:rPr>
-              <w:t>no_urut_</w:t>
+              <w:t>{{no_urut_</w:t>
             </w:r>
             <w:r>
               <w:rPr>
@@ -2210,7 +2323,6 @@
               </w:rPr>
               <w:t>empat</w:t>
             </w:r>
-            <w:proofErr w:type="spellEnd"/>
             <w:proofErr w:type="gramStart"/>
             <w:r>
               <w:rPr>
@@ -2230,8 +2342,16 @@
               <w:rPr>
                 <w:spacing w:val="-2"/>
               </w:rPr>
-              <w:t>…………………..</w:t>
-            </w:r>
+              <w:t>………………</w:t>
+            </w:r>
+            <w:proofErr w:type="gramStart"/>
+            <w:r>
+              <w:rPr>
+                <w:spacing w:val="-2"/>
+              </w:rPr>
+              <w:t>…..</w:t>
+            </w:r>
+            <w:proofErr w:type="gramEnd"/>
           </w:p>
         </w:tc>
       </w:tr>
@@ -2259,23 +2379,7 @@
                 <w:spacing w:val="-2"/>
                 <w:lang w:val="en-US"/>
               </w:rPr>
-              <w:t>{{</w:t>
-            </w:r>
-            <w:proofErr w:type="spellStart"/>
-            <w:r>
-              <w:rPr>
-                <w:spacing w:val="-2"/>
-                <w:lang w:val="en-US"/>
-              </w:rPr>
-              <w:t>no_urut_lima</w:t>
-            </w:r>
-            <w:proofErr w:type="spellEnd"/>
-            <w:r>
-              <w:rPr>
-                <w:spacing w:val="-2"/>
-                <w:lang w:val="en-US"/>
-              </w:rPr>
-              <w:t>}}</w:t>
+              <w:t>{{no_urut_lima}}</w:t>
             </w:r>
           </w:p>
         </w:tc>
@@ -2295,14 +2399,7 @@
               <w:rPr>
                 <w:lang w:val="en-US"/>
               </w:rPr>
-              <w:t>{{</w:t>
-            </w:r>
-            <w:proofErr w:type="spellStart"/>
-            <w:r>
-              <w:rPr>
-                <w:lang w:val="en-US"/>
-              </w:rPr>
-              <w:t>nama_petugas_</w:t>
+              <w:t>{{nama_petugas_</w:t>
             </w:r>
             <w:r>
               <w:rPr>
@@ -2310,7 +2407,6 @@
               </w:rPr>
               <w:t>lima</w:t>
             </w:r>
-            <w:proofErr w:type="spellEnd"/>
             <w:r>
               <w:rPr>
                 <w:lang w:val="en-US"/>
@@ -2339,21 +2435,7 @@
               <w:rPr>
                 <w:lang w:val="en-US"/>
               </w:rPr>
-              <w:t>NIP. {{</w:t>
-            </w:r>
-            <w:proofErr w:type="spellStart"/>
-            <w:r>
-              <w:rPr>
-                <w:lang w:val="en-US"/>
-              </w:rPr>
-              <w:t>nip_petugas_lima</w:t>
-            </w:r>
-            <w:proofErr w:type="spellEnd"/>
-            <w:r>
-              <w:rPr>
-                <w:lang w:val="en-US"/>
-              </w:rPr>
-              <w:t>}}</w:t>
+              <w:t>NIP. {{nip_petugas_lima}}</w:t>
             </w:r>
           </w:p>
         </w:tc>
@@ -2376,15 +2458,7 @@
                 <w:spacing w:val="-2"/>
                 <w:lang w:val="en-US"/>
               </w:rPr>
-              <w:t>{{</w:t>
-            </w:r>
-            <w:proofErr w:type="spellStart"/>
-            <w:r>
-              <w:rPr>
-                <w:spacing w:val="-2"/>
-                <w:lang w:val="en-US"/>
-              </w:rPr>
-              <w:t>no_urut_</w:t>
+              <w:t>{{no_urut_</w:t>
             </w:r>
             <w:r>
               <w:rPr>
@@ -2393,7 +2467,6 @@
               </w:rPr>
               <w:t>lima</w:t>
             </w:r>
-            <w:proofErr w:type="spellEnd"/>
             <w:proofErr w:type="gramStart"/>
             <w:r>
               <w:rPr>
@@ -2413,8 +2486,16 @@
               <w:rPr>
                 <w:spacing w:val="-2"/>
               </w:rPr>
-              <w:t>…………………..</w:t>
-            </w:r>
+              <w:t>………………</w:t>
+            </w:r>
+            <w:proofErr w:type="gramStart"/>
+            <w:r>
+              <w:rPr>
+                <w:spacing w:val="-2"/>
+              </w:rPr>
+              <w:t>…..</w:t>
+            </w:r>
+            <w:proofErr w:type="gramEnd"/>
           </w:p>
         </w:tc>
       </w:tr>
@@ -2442,23 +2523,7 @@
                 <w:spacing w:val="-2"/>
                 <w:lang w:val="en-US"/>
               </w:rPr>
-              <w:t>{{</w:t>
-            </w:r>
-            <w:proofErr w:type="spellStart"/>
-            <w:r>
-              <w:rPr>
-                <w:spacing w:val="-2"/>
-                <w:lang w:val="en-US"/>
-              </w:rPr>
-              <w:t>no_urut_enam</w:t>
-            </w:r>
-            <w:proofErr w:type="spellEnd"/>
-            <w:r>
-              <w:rPr>
-                <w:spacing w:val="-2"/>
-                <w:lang w:val="en-US"/>
-              </w:rPr>
-              <w:t>}}</w:t>
+              <w:t>{{no_urut_enam}}</w:t>
             </w:r>
           </w:p>
         </w:tc>
@@ -2540,15 +2605,7 @@
                 <w:spacing w:val="-2"/>
                 <w:lang w:val="en-US"/>
               </w:rPr>
-              <w:t>{{</w:t>
-            </w:r>
-            <w:proofErr w:type="spellStart"/>
-            <w:r>
-              <w:rPr>
-                <w:spacing w:val="-2"/>
-                <w:lang w:val="en-US"/>
-              </w:rPr>
-              <w:t>no_urut_</w:t>
+              <w:t>{{no_urut_</w:t>
             </w:r>
             <w:r>
               <w:rPr>
@@ -2557,7 +2614,6 @@
               </w:rPr>
               <w:t>enam</w:t>
             </w:r>
-            <w:proofErr w:type="spellEnd"/>
             <w:proofErr w:type="gramStart"/>
             <w:r>
               <w:rPr>
@@ -2577,8 +2633,16 @@
               <w:rPr>
                 <w:spacing w:val="-2"/>
               </w:rPr>
-              <w:t>…………………..</w:t>
-            </w:r>
+              <w:t>………………</w:t>
+            </w:r>
+            <w:proofErr w:type="gramStart"/>
+            <w:r>
+              <w:rPr>
+                <w:spacing w:val="-2"/>
+              </w:rPr>
+              <w:t>…..</w:t>
+            </w:r>
+            <w:proofErr w:type="gramEnd"/>
           </w:p>
         </w:tc>
       </w:tr>
@@ -2606,23 +2670,7 @@
                 <w:spacing w:val="-2"/>
                 <w:lang w:val="en-US"/>
               </w:rPr>
-              <w:t>{{</w:t>
-            </w:r>
-            <w:proofErr w:type="spellStart"/>
-            <w:r>
-              <w:rPr>
-                <w:spacing w:val="-2"/>
-                <w:lang w:val="en-US"/>
-              </w:rPr>
-              <w:t>no_urut_tujuh</w:t>
-            </w:r>
-            <w:proofErr w:type="spellEnd"/>
-            <w:r>
-              <w:rPr>
-                <w:spacing w:val="-2"/>
-                <w:lang w:val="en-US"/>
-              </w:rPr>
-              <w:t>}}</w:t>
+              <w:t>{{no_urut_tujuh}}</w:t>
             </w:r>
           </w:p>
         </w:tc>
@@ -2642,14 +2690,7 @@
               <w:rPr>
                 <w:lang w:val="en-US"/>
               </w:rPr>
-              <w:t>{{</w:t>
-            </w:r>
-            <w:proofErr w:type="spellStart"/>
-            <w:r>
-              <w:rPr>
-                <w:lang w:val="en-US"/>
-              </w:rPr>
-              <w:t>nama_petugas_</w:t>
+              <w:t>{{nama_petugas_</w:t>
             </w:r>
             <w:r>
               <w:rPr>
@@ -2657,7 +2698,6 @@
               </w:rPr>
               <w:t>tujuh</w:t>
             </w:r>
-            <w:proofErr w:type="spellEnd"/>
             <w:r>
               <w:rPr>
                 <w:lang w:val="en-US"/>
@@ -2686,21 +2726,7 @@
               <w:rPr>
                 <w:lang w:val="en-US"/>
               </w:rPr>
-              <w:t>NIP. {{</w:t>
-            </w:r>
-            <w:proofErr w:type="spellStart"/>
-            <w:r>
-              <w:rPr>
-                <w:lang w:val="en-US"/>
-              </w:rPr>
-              <w:t>nip_petugas_tujuh</w:t>
-            </w:r>
-            <w:proofErr w:type="spellEnd"/>
-            <w:r>
-              <w:rPr>
-                <w:lang w:val="en-US"/>
-              </w:rPr>
-              <w:t>}}</w:t>
+              <w:t>NIP. {{nip_petugas_tujuh}}</w:t>
             </w:r>
           </w:p>
         </w:tc>
@@ -2723,15 +2749,7 @@
                 <w:spacing w:val="-2"/>
                 <w:lang w:val="en-US"/>
               </w:rPr>
-              <w:t>{{</w:t>
-            </w:r>
-            <w:proofErr w:type="spellStart"/>
-            <w:r>
-              <w:rPr>
-                <w:spacing w:val="-2"/>
-                <w:lang w:val="en-US"/>
-              </w:rPr>
-              <w:t>no_urut_</w:t>
+              <w:t>{{no_urut_</w:t>
             </w:r>
             <w:r>
               <w:rPr>
@@ -2740,7 +2758,6 @@
               </w:rPr>
               <w:t>tujuh</w:t>
             </w:r>
-            <w:proofErr w:type="spellEnd"/>
             <w:proofErr w:type="gramStart"/>
             <w:r>
               <w:rPr>
@@ -2760,8 +2777,16 @@
               <w:rPr>
                 <w:spacing w:val="-2"/>
               </w:rPr>
-              <w:t>…………………..</w:t>
-            </w:r>
+              <w:t>………………</w:t>
+            </w:r>
+            <w:proofErr w:type="gramStart"/>
+            <w:r>
+              <w:rPr>
+                <w:spacing w:val="-2"/>
+              </w:rPr>
+              <w:t>…..</w:t>
+            </w:r>
+            <w:proofErr w:type="gramEnd"/>
           </w:p>
         </w:tc>
       </w:tr>
@@ -2789,23 +2814,7 @@
                 <w:spacing w:val="-2"/>
                 <w:lang w:val="en-US"/>
               </w:rPr>
-              <w:t>{{</w:t>
-            </w:r>
-            <w:proofErr w:type="spellStart"/>
-            <w:r>
-              <w:rPr>
-                <w:spacing w:val="-2"/>
-                <w:lang w:val="en-US"/>
-              </w:rPr>
-              <w:t>no_urut_delapan</w:t>
-            </w:r>
-            <w:proofErr w:type="spellEnd"/>
-            <w:r>
-              <w:rPr>
-                <w:spacing w:val="-2"/>
-                <w:lang w:val="en-US"/>
-              </w:rPr>
-              <w:t>}}</w:t>
+              <w:t>{{no_urut_delapan}}</w:t>
             </w:r>
           </w:p>
         </w:tc>
@@ -2884,15 +2893,7 @@
                 <w:spacing w:val="-2"/>
                 <w:lang w:val="en-US"/>
               </w:rPr>
-              <w:t>{{</w:t>
-            </w:r>
-            <w:proofErr w:type="spellStart"/>
-            <w:r>
-              <w:rPr>
-                <w:spacing w:val="-2"/>
-                <w:lang w:val="en-US"/>
-              </w:rPr>
-              <w:t>no_urut_</w:t>
+              <w:t>{{no_urut_</w:t>
             </w:r>
             <w:r>
               <w:rPr>
@@ -2901,7 +2902,6 @@
               </w:rPr>
               <w:t>delapan</w:t>
             </w:r>
-            <w:proofErr w:type="spellEnd"/>
             <w:proofErr w:type="gramStart"/>
             <w:r>
               <w:rPr>
@@ -2921,8 +2921,16 @@
               <w:rPr>
                 <w:spacing w:val="-2"/>
               </w:rPr>
-              <w:t>…………………..</w:t>
-            </w:r>
+              <w:t>………………</w:t>
+            </w:r>
+            <w:proofErr w:type="gramStart"/>
+            <w:r>
+              <w:rPr>
+                <w:spacing w:val="-2"/>
+              </w:rPr>
+              <w:t>…..</w:t>
+            </w:r>
+            <w:proofErr w:type="gramEnd"/>
           </w:p>
         </w:tc>
       </w:tr>
@@ -2950,23 +2958,7 @@
                 <w:spacing w:val="-2"/>
                 <w:lang w:val="en-US"/>
               </w:rPr>
-              <w:t>{{</w:t>
-            </w:r>
-            <w:proofErr w:type="spellStart"/>
-            <w:r>
-              <w:rPr>
-                <w:spacing w:val="-2"/>
-                <w:lang w:val="en-US"/>
-              </w:rPr>
-              <w:t>no_urut_sembilan</w:t>
-            </w:r>
-            <w:proofErr w:type="spellEnd"/>
-            <w:r>
-              <w:rPr>
-                <w:spacing w:val="-2"/>
-                <w:lang w:val="en-US"/>
-              </w:rPr>
-              <w:t>}}</w:t>
+              <w:t>{{no_urut_sembilan}}</w:t>
             </w:r>
           </w:p>
         </w:tc>
@@ -2986,14 +2978,7 @@
               <w:rPr>
                 <w:lang w:val="en-US"/>
               </w:rPr>
-              <w:t>{{</w:t>
-            </w:r>
-            <w:proofErr w:type="spellStart"/>
-            <w:r>
-              <w:rPr>
-                <w:lang w:val="en-US"/>
-              </w:rPr>
-              <w:t>nama_petugas_</w:t>
+              <w:t>{{nama_petugas_</w:t>
             </w:r>
             <w:r>
               <w:rPr>
@@ -3001,7 +2986,6 @@
               </w:rPr>
               <w:t>sembilan</w:t>
             </w:r>
-            <w:proofErr w:type="spellEnd"/>
             <w:r>
               <w:rPr>
                 <w:lang w:val="en-US"/>
@@ -3030,21 +3014,7 @@
               <w:rPr>
                 <w:lang w:val="en-US"/>
               </w:rPr>
-              <w:t>NIP. {{</w:t>
-            </w:r>
-            <w:proofErr w:type="spellStart"/>
-            <w:r>
-              <w:rPr>
-                <w:lang w:val="en-US"/>
-              </w:rPr>
-              <w:t>nip_petugas_sembilan</w:t>
-            </w:r>
-            <w:proofErr w:type="spellEnd"/>
-            <w:r>
-              <w:rPr>
-                <w:lang w:val="en-US"/>
-              </w:rPr>
-              <w:t>}}</w:t>
+              <w:t>NIP. {{nip_petugas_sembilan}}</w:t>
             </w:r>
           </w:p>
         </w:tc>
@@ -3067,15 +3037,7 @@
                 <w:spacing w:val="-2"/>
                 <w:lang w:val="en-US"/>
               </w:rPr>
-              <w:t>{{</w:t>
-            </w:r>
-            <w:proofErr w:type="spellStart"/>
-            <w:r>
-              <w:rPr>
-                <w:spacing w:val="-2"/>
-                <w:lang w:val="en-US"/>
-              </w:rPr>
-              <w:t>no_urut_</w:t>
+              <w:t>{{no_urut_</w:t>
             </w:r>
             <w:r>
               <w:rPr>
@@ -3084,7 +3046,6 @@
               </w:rPr>
               <w:t>sembilan</w:t>
             </w:r>
-            <w:proofErr w:type="spellEnd"/>
             <w:proofErr w:type="gramStart"/>
             <w:r>
               <w:rPr>
@@ -3104,8 +3065,16 @@
               <w:rPr>
                 <w:spacing w:val="-2"/>
               </w:rPr>
-              <w:t>…………………..</w:t>
-            </w:r>
+              <w:t>………………</w:t>
+            </w:r>
+            <w:proofErr w:type="gramStart"/>
+            <w:r>
+              <w:rPr>
+                <w:spacing w:val="-2"/>
+              </w:rPr>
+              <w:t>…..</w:t>
+            </w:r>
+            <w:proofErr w:type="gramEnd"/>
           </w:p>
         </w:tc>
       </w:tr>
@@ -3133,23 +3102,7 @@
                 <w:spacing w:val="-2"/>
                 <w:lang w:val="en-US"/>
               </w:rPr>
-              <w:t>{{</w:t>
-            </w:r>
-            <w:proofErr w:type="spellStart"/>
-            <w:r>
-              <w:rPr>
-                <w:spacing w:val="-2"/>
-                <w:lang w:val="en-US"/>
-              </w:rPr>
-              <w:t>no_urut_sepuluh</w:t>
-            </w:r>
-            <w:proofErr w:type="spellEnd"/>
-            <w:r>
-              <w:rPr>
-                <w:spacing w:val="-2"/>
-                <w:lang w:val="en-US"/>
-              </w:rPr>
-              <w:t>}}</w:t>
+              <w:t>{{no_urut_sepuluh}}</w:t>
             </w:r>
           </w:p>
         </w:tc>
@@ -3169,14 +3122,7 @@
               <w:rPr>
                 <w:lang w:val="en-US"/>
               </w:rPr>
-              <w:t>{{</w:t>
-            </w:r>
-            <w:proofErr w:type="spellStart"/>
-            <w:r>
-              <w:rPr>
-                <w:lang w:val="en-US"/>
-              </w:rPr>
-              <w:t>nama_petugas_s</w:t>
+              <w:t>{{nama_petugas_s</w:t>
             </w:r>
             <w:r>
               <w:rPr>
@@ -3184,7 +3130,6 @@
               </w:rPr>
               <w:t>epuluh</w:t>
             </w:r>
-            <w:proofErr w:type="spellEnd"/>
             <w:r>
               <w:rPr>
                 <w:lang w:val="en-US"/>
@@ -3213,21 +3158,7 @@
               <w:rPr>
                 <w:lang w:val="en-US"/>
               </w:rPr>
-              <w:t>NIP. {{</w:t>
-            </w:r>
-            <w:proofErr w:type="spellStart"/>
-            <w:r>
-              <w:rPr>
-                <w:lang w:val="en-US"/>
-              </w:rPr>
-              <w:t>nip_petugas_sepuluh</w:t>
-            </w:r>
-            <w:proofErr w:type="spellEnd"/>
-            <w:r>
-              <w:rPr>
-                <w:lang w:val="en-US"/>
-              </w:rPr>
-              <w:t>}}</w:t>
+              <w:t>NIP. {{nip_petugas_sepuluh}}</w:t>
             </w:r>
           </w:p>
         </w:tc>
@@ -3250,15 +3181,7 @@
                 <w:spacing w:val="-2"/>
                 <w:lang w:val="en-US"/>
               </w:rPr>
-              <w:t>{{</w:t>
-            </w:r>
-            <w:proofErr w:type="spellStart"/>
-            <w:r>
-              <w:rPr>
-                <w:spacing w:val="-2"/>
-                <w:lang w:val="en-US"/>
-              </w:rPr>
-              <w:t>no_urut_s</w:t>
+              <w:t>{{no_urut_s</w:t>
             </w:r>
             <w:r>
               <w:rPr>
@@ -3267,7 +3190,6 @@
               </w:rPr>
               <w:t>epuluh</w:t>
             </w:r>
-            <w:proofErr w:type="spellEnd"/>
             <w:proofErr w:type="gramStart"/>
             <w:r>
               <w:rPr>
@@ -3287,8 +3209,16 @@
               <w:rPr>
                 <w:spacing w:val="-2"/>
               </w:rPr>
-              <w:t>…………………..</w:t>
-            </w:r>
+              <w:t>………………</w:t>
+            </w:r>
+            <w:proofErr w:type="gramStart"/>
+            <w:r>
+              <w:rPr>
+                <w:spacing w:val="-2"/>
+              </w:rPr>
+              <w:t>…..</w:t>
+            </w:r>
+            <w:proofErr w:type="gramEnd"/>
           </w:p>
         </w:tc>
       </w:tr>
@@ -3297,9 +3227,8 @@
       <w:pPr>
         <w:pStyle w:val="TableParagraph"/>
         <w:sectPr>
-          <w:headerReference w:type="first" r:id="rId13"/>
           <w:pgSz w:w="12240" w:h="20160"/>
-          <w:pgMar w:top="1420" w:right="1080" w:bottom="280" w:left="1080" w:header="720" w:footer="720" w:gutter="0"/>
+          <w:pgMar w:top="1418" w:right="1077" w:bottom="1418" w:left="1077" w:header="720" w:footer="720" w:gutter="0"/>
           <w:cols w:space="720"/>
           <w:titlePg/>
           <w:docGrid w:linePitch="299"/>
@@ -3390,21 +3319,7 @@
               <w:rPr>
                 <w:lang w:val="en-US"/>
               </w:rPr>
-              <w:t>{{</w:t>
-            </w:r>
-            <w:proofErr w:type="spellStart"/>
-            <w:r>
-              <w:rPr>
-                <w:lang w:val="en-US"/>
-              </w:rPr>
-              <w:t>foto_dokumentasi_satu</w:t>
-            </w:r>
-            <w:proofErr w:type="spellEnd"/>
-            <w:r>
-              <w:rPr>
-                <w:lang w:val="en-US"/>
-              </w:rPr>
-              <w:t>}}</w:t>
+              <w:t>{{foto_dokumentasi_satu}}</w:t>
             </w:r>
           </w:p>
         </w:tc>
@@ -3431,21 +3346,7 @@
               <w:rPr>
                 <w:lang w:val="en-US"/>
               </w:rPr>
-              <w:t>{{</w:t>
-            </w:r>
-            <w:proofErr w:type="spellStart"/>
-            <w:r>
-              <w:rPr>
-                <w:lang w:val="en-US"/>
-              </w:rPr>
-              <w:t>foto_dokumentasi_dua</w:t>
-            </w:r>
-            <w:proofErr w:type="spellEnd"/>
-            <w:r>
-              <w:rPr>
-                <w:lang w:val="en-US"/>
-              </w:rPr>
-              <w:t>}}</w:t>
+              <w:t>{{foto_dokumentasi_dua}}</w:t>
             </w:r>
           </w:p>
         </w:tc>
@@ -3472,21 +3373,7 @@
               <w:rPr>
                 <w:lang w:val="en-US"/>
               </w:rPr>
-              <w:t>{{</w:t>
-            </w:r>
-            <w:proofErr w:type="spellStart"/>
-            <w:r>
-              <w:rPr>
-                <w:lang w:val="en-US"/>
-              </w:rPr>
-              <w:t>foto_dokumentasi_tiga</w:t>
-            </w:r>
-            <w:proofErr w:type="spellEnd"/>
-            <w:r>
-              <w:rPr>
-                <w:lang w:val="en-US"/>
-              </w:rPr>
-              <w:t>}}</w:t>
+              <w:t>{{foto_dokumentasi_tiga}}</w:t>
             </w:r>
           </w:p>
         </w:tc>
@@ -3525,21 +3412,7 @@
               <w:rPr>
                 <w:lang w:val="en-US"/>
               </w:rPr>
-              <w:t>{{</w:t>
-            </w:r>
-            <w:proofErr w:type="spellStart"/>
-            <w:r>
-              <w:rPr>
-                <w:lang w:val="en-US"/>
-              </w:rPr>
-              <w:t>foto_dokumentasi_empat</w:t>
-            </w:r>
-            <w:proofErr w:type="spellEnd"/>
-            <w:r>
-              <w:rPr>
-                <w:lang w:val="en-US"/>
-              </w:rPr>
-              <w:t>}}</w:t>
+              <w:t>{{foto_dokumentasi_empat}}</w:t>
             </w:r>
           </w:p>
         </w:tc>
@@ -5773,17 +5646,19 @@
       </w:pPr>
     </w:p>
     <w:sectPr>
-      <w:headerReference w:type="default" r:id="rId14"/>
+      <w:headerReference w:type="default" r:id="rId9"/>
       <w:pgSz w:w="12240" w:h="20160"/>
       <w:pgMar w:top="1480" w:right="1080" w:bottom="280" w:left="1080" w:header="1245" w:footer="0" w:gutter="0"/>
       <w:cols w:space="720"/>
+      <w:titlePg/>
+      <w:docGrid w:linePitch="299"/>
     </w:sectPr>
   </w:body>
 </w:document>
 </file>
 
 <file path=word/endnotes.xml><?xml version="1.0" encoding="utf-8"?>
-<w:endnotes xmlns:wpc="http://schemas.microsoft.com/office/word/2010/wordprocessingCanvas" xmlns:cx="http://schemas.microsoft.com/office/drawing/2014/chartex" xmlns:cx1="http://schemas.microsoft.com/office/drawing/2015/9/8/chartex" xmlns:cx2="http://schemas.microsoft.com/office/drawing/2015/10/21/chartex" xmlns:cx3="http://schemas.microsoft.com/office/drawing/2016/5/9/chartex" xmlns:cx4="http://schemas.microsoft.com/office/drawing/2016/5/10/chartex" xmlns:cx5="http://schemas.microsoft.com/office/drawing/2016/5/11/chartex" xmlns:cx6="http://schemas.microsoft.com/office/drawing/2016/5/12/chartex" xmlns:cx7="http://schemas.microsoft.com/office/drawing/2016/5/13/chartex" xmlns:cx8="http://schemas.microsoft.com/office/drawing/2016/5/14/chartex" xmlns:mc="http://schemas.openxmlformats.org/markup-compatibility/2006" xmlns:aink="http://schemas.microsoft.com/office/drawing/2016/ink" xmlns:am3d="http://schemas.microsoft.com/office/drawing/2017/model3d" xmlns:o="urn:schemas-microsoft-com:office:office" xmlns:oel="http://schemas.microsoft.com/office/2019/extlst" xmlns:r="http://schemas.openxmlformats.org/officeDocument/2006/relationships" xmlns:m="http://schemas.openxmlformats.org/officeDocument/2006/math" xmlns:v="urn:schemas-microsoft-com:vml" xmlns:wp14="http://schemas.microsoft.com/office/word/2010/wordprocessingDrawing" xmlns:wp="http://schemas.openxmlformats.org/drawingml/2006/wordprocessingDrawing" xmlns:w10="urn:schemas-microsoft-com:office:word" xmlns:w="http://schemas.openxmlformats.org/wordprocessingml/2006/main" xmlns:w14="http://schemas.microsoft.com/office/word/2010/wordml" xmlns:w15="http://schemas.microsoft.com/office/word/2012/wordml" xmlns:w16cex="http://schemas.microsoft.com/office/word/2018/wordml/cex" xmlns:w16cid="http://schemas.microsoft.com/office/word/2016/wordml/cid" xmlns:w16="http://schemas.microsoft.com/office/word/2018/wordml" xmlns:w16sdtdh="http://schemas.microsoft.com/office/word/2020/wordml/sdtdatahash" xmlns:w16se="http://schemas.microsoft.com/office/word/2015/wordml/symex" xmlns:wpg="http://schemas.microsoft.com/office/word/2010/wordprocessingGroup" xmlns:wpi="http://schemas.microsoft.com/office/word/2010/wordprocessingInk" xmlns:wne="http://schemas.microsoft.com/office/word/2006/wordml" xmlns:wps="http://schemas.microsoft.com/office/word/2010/wordprocessingShape" mc:Ignorable="w14 w15 w16se w16cid w16 w16cex w16sdtdh wp14">
+<w:endnotes xmlns:wpc="http://schemas.microsoft.com/office/word/2010/wordprocessingCanvas" xmlns:cx="http://schemas.microsoft.com/office/drawing/2014/chartex" xmlns:cx1="http://schemas.microsoft.com/office/drawing/2015/9/8/chartex" xmlns:cx2="http://schemas.microsoft.com/office/drawing/2015/10/21/chartex" xmlns:cx3="http://schemas.microsoft.com/office/drawing/2016/5/9/chartex" xmlns:cx4="http://schemas.microsoft.com/office/drawing/2016/5/10/chartex" xmlns:cx5="http://schemas.microsoft.com/office/drawing/2016/5/11/chartex" xmlns:cx6="http://schemas.microsoft.com/office/drawing/2016/5/12/chartex" xmlns:cx7="http://schemas.microsoft.com/office/drawing/2016/5/13/chartex" xmlns:cx8="http://schemas.microsoft.com/office/drawing/2016/5/14/chartex" xmlns:mc="http://schemas.openxmlformats.org/markup-compatibility/2006" xmlns:aink="http://schemas.microsoft.com/office/drawing/2016/ink" xmlns:am3d="http://schemas.microsoft.com/office/drawing/2017/model3d" xmlns:o="urn:schemas-microsoft-com:office:office" xmlns:oel="http://schemas.microsoft.com/office/2019/extlst" xmlns:r="http://schemas.openxmlformats.org/officeDocument/2006/relationships" xmlns:m="http://schemas.openxmlformats.org/officeDocument/2006/math" xmlns:v="urn:schemas-microsoft-com:vml" xmlns:wp14="http://schemas.microsoft.com/office/word/2010/wordprocessingDrawing" xmlns:wp="http://schemas.openxmlformats.org/drawingml/2006/wordprocessingDrawing" xmlns:w10="urn:schemas-microsoft-com:office:word" xmlns:w="http://schemas.openxmlformats.org/wordprocessingml/2006/main" xmlns:w14="http://schemas.microsoft.com/office/word/2010/wordml" xmlns:w15="http://schemas.microsoft.com/office/word/2012/wordml" xmlns:w16cex="http://schemas.microsoft.com/office/word/2018/wordml/cex" xmlns:w16cid="http://schemas.microsoft.com/office/word/2016/wordml/cid" xmlns:w16="http://schemas.microsoft.com/office/word/2018/wordml" xmlns:w16du="http://schemas.microsoft.com/office/word/2023/wordml/word16du" xmlns:w16sdtdh="http://schemas.microsoft.com/office/word/2020/wordml/sdtdatahash" xmlns:w16sdtfl="http://schemas.microsoft.com/office/word/2024/wordml/sdtformatlock" xmlns:w16se="http://schemas.microsoft.com/office/word/2015/wordml/symex" xmlns:wpg="http://schemas.microsoft.com/office/word/2010/wordprocessingGroup" xmlns:wpi="http://schemas.microsoft.com/office/word/2010/wordprocessingInk" xmlns:wne="http://schemas.microsoft.com/office/word/2006/wordml" xmlns:wps="http://schemas.microsoft.com/office/word/2010/wordprocessingShape" mc:Ignorable="w14 w15 w16se w16cid w16 w16cex w16sdtdh w16sdtfl w16du wp14">
   <w:endnote w:type="separator" w:id="-1">
     <w:p>
       <w:r>
@@ -5801,38 +5676,8 @@
 </w:endnotes>
 </file>
 
-<file path=word/footer1.xml><?xml version="1.0" encoding="utf-8"?>
-<w:ftr xmlns:wpc="http://schemas.microsoft.com/office/word/2010/wordprocessingCanvas" xmlns:cx="http://schemas.microsoft.com/office/drawing/2014/chartex" xmlns:cx1="http://schemas.microsoft.com/office/drawing/2015/9/8/chartex" xmlns:cx2="http://schemas.microsoft.com/office/drawing/2015/10/21/chartex" xmlns:cx3="http://schemas.microsoft.com/office/drawing/2016/5/9/chartex" xmlns:cx4="http://schemas.microsoft.com/office/drawing/2016/5/10/chartex" xmlns:cx5="http://schemas.microsoft.com/office/drawing/2016/5/11/chartex" xmlns:cx6="http://schemas.microsoft.com/office/drawing/2016/5/12/chartex" xmlns:cx7="http://schemas.microsoft.com/office/drawing/2016/5/13/chartex" xmlns:cx8="http://schemas.microsoft.com/office/drawing/2016/5/14/chartex" xmlns:mc="http://schemas.openxmlformats.org/markup-compatibility/2006" xmlns:aink="http://schemas.microsoft.com/office/drawing/2016/ink" xmlns:am3d="http://schemas.microsoft.com/office/drawing/2017/model3d" xmlns:o="urn:schemas-microsoft-com:office:office" xmlns:oel="http://schemas.microsoft.com/office/2019/extlst" xmlns:r="http://schemas.openxmlformats.org/officeDocument/2006/relationships" xmlns:m="http://schemas.openxmlformats.org/officeDocument/2006/math" xmlns:v="urn:schemas-microsoft-com:vml" xmlns:wp14="http://schemas.microsoft.com/office/word/2010/wordprocessingDrawing" xmlns:wp="http://schemas.openxmlformats.org/drawingml/2006/wordprocessingDrawing" xmlns:w10="urn:schemas-microsoft-com:office:word" xmlns:w="http://schemas.openxmlformats.org/wordprocessingml/2006/main" xmlns:w14="http://schemas.microsoft.com/office/word/2010/wordml" xmlns:w15="http://schemas.microsoft.com/office/word/2012/wordml" xmlns:w16cex="http://schemas.microsoft.com/office/word/2018/wordml/cex" xmlns:w16cid="http://schemas.microsoft.com/office/word/2016/wordml/cid" xmlns:w16="http://schemas.microsoft.com/office/word/2018/wordml" xmlns:w16sdtdh="http://schemas.microsoft.com/office/word/2020/wordml/sdtdatahash" xmlns:w16se="http://schemas.microsoft.com/office/word/2015/wordml/symex" xmlns:wpg="http://schemas.microsoft.com/office/word/2010/wordprocessingGroup" xmlns:wpi="http://schemas.microsoft.com/office/word/2010/wordprocessingInk" xmlns:wne="http://schemas.microsoft.com/office/word/2006/wordml" xmlns:wps="http://schemas.microsoft.com/office/word/2010/wordprocessingShape" mc:Ignorable="w14 w15 w16se w16cid w16 w16cex w16sdtdh wp14">
-  <w:p>
-    <w:pPr>
-      <w:pStyle w:val="Footer"/>
-    </w:pPr>
-  </w:p>
-</w:ftr>
-</file>
-
-<file path=word/footer2.xml><?xml version="1.0" encoding="utf-8"?>
-<w:ftr xmlns:wpc="http://schemas.microsoft.com/office/word/2010/wordprocessingCanvas" xmlns:cx="http://schemas.microsoft.com/office/drawing/2014/chartex" xmlns:cx1="http://schemas.microsoft.com/office/drawing/2015/9/8/chartex" xmlns:cx2="http://schemas.microsoft.com/office/drawing/2015/10/21/chartex" xmlns:cx3="http://schemas.microsoft.com/office/drawing/2016/5/9/chartex" xmlns:cx4="http://schemas.microsoft.com/office/drawing/2016/5/10/chartex" xmlns:cx5="http://schemas.microsoft.com/office/drawing/2016/5/11/chartex" xmlns:cx6="http://schemas.microsoft.com/office/drawing/2016/5/12/chartex" xmlns:cx7="http://schemas.microsoft.com/office/drawing/2016/5/13/chartex" xmlns:cx8="http://schemas.microsoft.com/office/drawing/2016/5/14/chartex" xmlns:mc="http://schemas.openxmlformats.org/markup-compatibility/2006" xmlns:aink="http://schemas.microsoft.com/office/drawing/2016/ink" xmlns:am3d="http://schemas.microsoft.com/office/drawing/2017/model3d" xmlns:o="urn:schemas-microsoft-com:office:office" xmlns:oel="http://schemas.microsoft.com/office/2019/extlst" xmlns:r="http://schemas.openxmlformats.org/officeDocument/2006/relationships" xmlns:m="http://schemas.openxmlformats.org/officeDocument/2006/math" xmlns:v="urn:schemas-microsoft-com:vml" xmlns:wp14="http://schemas.microsoft.com/office/word/2010/wordprocessingDrawing" xmlns:wp="http://schemas.openxmlformats.org/drawingml/2006/wordprocessingDrawing" xmlns:w10="urn:schemas-microsoft-com:office:word" xmlns:w="http://schemas.openxmlformats.org/wordprocessingml/2006/main" xmlns:w14="http://schemas.microsoft.com/office/word/2010/wordml" xmlns:w15="http://schemas.microsoft.com/office/word/2012/wordml" xmlns:w16cex="http://schemas.microsoft.com/office/word/2018/wordml/cex" xmlns:w16cid="http://schemas.microsoft.com/office/word/2016/wordml/cid" xmlns:w16="http://schemas.microsoft.com/office/word/2018/wordml" xmlns:w16sdtdh="http://schemas.microsoft.com/office/word/2020/wordml/sdtdatahash" xmlns:w16se="http://schemas.microsoft.com/office/word/2015/wordml/symex" xmlns:wpg="http://schemas.microsoft.com/office/word/2010/wordprocessingGroup" xmlns:wpi="http://schemas.microsoft.com/office/word/2010/wordprocessingInk" xmlns:wne="http://schemas.microsoft.com/office/word/2006/wordml" xmlns:wps="http://schemas.microsoft.com/office/word/2010/wordprocessingShape" mc:Ignorable="w14 w15 w16se w16cid w16 w16cex w16sdtdh wp14">
-  <w:p>
-    <w:pPr>
-      <w:pStyle w:val="Footer"/>
-    </w:pPr>
-  </w:p>
-</w:ftr>
-</file>
-
-<file path=word/footer3.xml><?xml version="1.0" encoding="utf-8"?>
-<w:ftr xmlns:wpc="http://schemas.microsoft.com/office/word/2010/wordprocessingCanvas" xmlns:cx="http://schemas.microsoft.com/office/drawing/2014/chartex" xmlns:cx1="http://schemas.microsoft.com/office/drawing/2015/9/8/chartex" xmlns:cx2="http://schemas.microsoft.com/office/drawing/2015/10/21/chartex" xmlns:cx3="http://schemas.microsoft.com/office/drawing/2016/5/9/chartex" xmlns:cx4="http://schemas.microsoft.com/office/drawing/2016/5/10/chartex" xmlns:cx5="http://schemas.microsoft.com/office/drawing/2016/5/11/chartex" xmlns:cx6="http://schemas.microsoft.com/office/drawing/2016/5/12/chartex" xmlns:cx7="http://schemas.microsoft.com/office/drawing/2016/5/13/chartex" xmlns:cx8="http://schemas.microsoft.com/office/drawing/2016/5/14/chartex" xmlns:mc="http://schemas.openxmlformats.org/markup-compatibility/2006" xmlns:aink="http://schemas.microsoft.com/office/drawing/2016/ink" xmlns:am3d="http://schemas.microsoft.com/office/drawing/2017/model3d" xmlns:o="urn:schemas-microsoft-com:office:office" xmlns:oel="http://schemas.microsoft.com/office/2019/extlst" xmlns:r="http://schemas.openxmlformats.org/officeDocument/2006/relationships" xmlns:m="http://schemas.openxmlformats.org/officeDocument/2006/math" xmlns:v="urn:schemas-microsoft-com:vml" xmlns:wp14="http://schemas.microsoft.com/office/word/2010/wordprocessingDrawing" xmlns:wp="http://schemas.openxmlformats.org/drawingml/2006/wordprocessingDrawing" xmlns:w10="urn:schemas-microsoft-com:office:word" xmlns:w="http://schemas.openxmlformats.org/wordprocessingml/2006/main" xmlns:w14="http://schemas.microsoft.com/office/word/2010/wordml" xmlns:w15="http://schemas.microsoft.com/office/word/2012/wordml" xmlns:w16cex="http://schemas.microsoft.com/office/word/2018/wordml/cex" xmlns:w16cid="http://schemas.microsoft.com/office/word/2016/wordml/cid" xmlns:w16="http://schemas.microsoft.com/office/word/2018/wordml" xmlns:w16sdtdh="http://schemas.microsoft.com/office/word/2020/wordml/sdtdatahash" xmlns:w16se="http://schemas.microsoft.com/office/word/2015/wordml/symex" xmlns:wpg="http://schemas.microsoft.com/office/word/2010/wordprocessingGroup" xmlns:wpi="http://schemas.microsoft.com/office/word/2010/wordprocessingInk" xmlns:wne="http://schemas.microsoft.com/office/word/2006/wordml" xmlns:wps="http://schemas.microsoft.com/office/word/2010/wordprocessingShape" mc:Ignorable="w14 w15 w16se w16cid w16 w16cex w16sdtdh wp14">
-  <w:p>
-    <w:pPr>
-      <w:pStyle w:val="Footer"/>
-    </w:pPr>
-  </w:p>
-</w:ftr>
-</file>
-
 <file path=word/footnotes.xml><?xml version="1.0" encoding="utf-8"?>
-<w:footnotes xmlns:wpc="http://schemas.microsoft.com/office/word/2010/wordprocessingCanvas" xmlns:cx="http://schemas.microsoft.com/office/drawing/2014/chartex" xmlns:cx1="http://schemas.microsoft.com/office/drawing/2015/9/8/chartex" xmlns:cx2="http://schemas.microsoft.com/office/drawing/2015/10/21/chartex" xmlns:cx3="http://schemas.microsoft.com/office/drawing/2016/5/9/chartex" xmlns:cx4="http://schemas.microsoft.com/office/drawing/2016/5/10/chartex" xmlns:cx5="http://schemas.microsoft.com/office/drawing/2016/5/11/chartex" xmlns:cx6="http://schemas.microsoft.com/office/drawing/2016/5/12/chartex" xmlns:cx7="http://schemas.microsoft.com/office/drawing/2016/5/13/chartex" xmlns:cx8="http://schemas.microsoft.com/office/drawing/2016/5/14/chartex" xmlns:mc="http://schemas.openxmlformats.org/markup-compatibility/2006" xmlns:aink="http://schemas.microsoft.com/office/drawing/2016/ink" xmlns:am3d="http://schemas.microsoft.com/office/drawing/2017/model3d" xmlns:o="urn:schemas-microsoft-com:office:office" xmlns:oel="http://schemas.microsoft.com/office/2019/extlst" xmlns:r="http://schemas.openxmlformats.org/officeDocument/2006/relationships" xmlns:m="http://schemas.openxmlformats.org/officeDocument/2006/math" xmlns:v="urn:schemas-microsoft-com:vml" xmlns:wp14="http://schemas.microsoft.com/office/word/2010/wordprocessingDrawing" xmlns:wp="http://schemas.openxmlformats.org/drawingml/2006/wordprocessingDrawing" xmlns:w10="urn:schemas-microsoft-com:office:word" xmlns:w="http://schemas.openxmlformats.org/wordprocessingml/2006/main" xmlns:w14="http://schemas.microsoft.com/office/word/2010/wordml" xmlns:w15="http://schemas.microsoft.com/office/word/2012/wordml" xmlns:w16cex="http://schemas.microsoft.com/office/word/2018/wordml/cex" xmlns:w16cid="http://schemas.microsoft.com/office/word/2016/wordml/cid" xmlns:w16="http://schemas.microsoft.com/office/word/2018/wordml" xmlns:w16sdtdh="http://schemas.microsoft.com/office/word/2020/wordml/sdtdatahash" xmlns:w16se="http://schemas.microsoft.com/office/word/2015/wordml/symex" xmlns:wpg="http://schemas.microsoft.com/office/word/2010/wordprocessingGroup" xmlns:wpi="http://schemas.microsoft.com/office/word/2010/wordprocessingInk" xmlns:wne="http://schemas.microsoft.com/office/word/2006/wordml" xmlns:wps="http://schemas.microsoft.com/office/word/2010/wordprocessingShape" mc:Ignorable="w14 w15 w16se w16cid w16 w16cex w16sdtdh wp14">
+<w:footnotes xmlns:wpc="http://schemas.microsoft.com/office/word/2010/wordprocessingCanvas" xmlns:cx="http://schemas.microsoft.com/office/drawing/2014/chartex" xmlns:cx1="http://schemas.microsoft.com/office/drawing/2015/9/8/chartex" xmlns:cx2="http://schemas.microsoft.com/office/drawing/2015/10/21/chartex" xmlns:cx3="http://schemas.microsoft.com/office/drawing/2016/5/9/chartex" xmlns:cx4="http://schemas.microsoft.com/office/drawing/2016/5/10/chartex" xmlns:cx5="http://schemas.microsoft.com/office/drawing/2016/5/11/chartex" xmlns:cx6="http://schemas.microsoft.com/office/drawing/2016/5/12/chartex" xmlns:cx7="http://schemas.microsoft.com/office/drawing/2016/5/13/chartex" xmlns:cx8="http://schemas.microsoft.com/office/drawing/2016/5/14/chartex" xmlns:mc="http://schemas.openxmlformats.org/markup-compatibility/2006" xmlns:aink="http://schemas.microsoft.com/office/drawing/2016/ink" xmlns:am3d="http://schemas.microsoft.com/office/drawing/2017/model3d" xmlns:o="urn:schemas-microsoft-com:office:office" xmlns:oel="http://schemas.microsoft.com/office/2019/extlst" xmlns:r="http://schemas.openxmlformats.org/officeDocument/2006/relationships" xmlns:m="http://schemas.openxmlformats.org/officeDocument/2006/math" xmlns:v="urn:schemas-microsoft-com:vml" xmlns:wp14="http://schemas.microsoft.com/office/word/2010/wordprocessingDrawing" xmlns:wp="http://schemas.openxmlformats.org/drawingml/2006/wordprocessingDrawing" xmlns:w10="urn:schemas-microsoft-com:office:word" xmlns:w="http://schemas.openxmlformats.org/wordprocessingml/2006/main" xmlns:w14="http://schemas.microsoft.com/office/word/2010/wordml" xmlns:w15="http://schemas.microsoft.com/office/word/2012/wordml" xmlns:w16cex="http://schemas.microsoft.com/office/word/2018/wordml/cex" xmlns:w16cid="http://schemas.microsoft.com/office/word/2016/wordml/cid" xmlns:w16="http://schemas.microsoft.com/office/word/2018/wordml" xmlns:w16du="http://schemas.microsoft.com/office/word/2023/wordml/word16du" xmlns:w16sdtdh="http://schemas.microsoft.com/office/word/2020/wordml/sdtdatahash" xmlns:w16sdtfl="http://schemas.microsoft.com/office/word/2024/wordml/sdtformatlock" xmlns:w16se="http://schemas.microsoft.com/office/word/2015/wordml/symex" xmlns:wpg="http://schemas.microsoft.com/office/word/2010/wordprocessingGroup" xmlns:wpi="http://schemas.microsoft.com/office/word/2010/wordprocessingInk" xmlns:wne="http://schemas.microsoft.com/office/word/2006/wordml" xmlns:wps="http://schemas.microsoft.com/office/word/2010/wordprocessingShape" mc:Ignorable="w14 w15 w16se w16cid w16 w16cex w16sdtdh w16sdtfl w16du wp14">
   <w:footnote w:type="separator" w:id="-1">
     <w:p>
       <w:r>
@@ -5851,302 +5696,7 @@
 </file>
 
 <file path=word/header1.xml><?xml version="1.0" encoding="utf-8"?>
-<w:hdr xmlns:wpc="http://schemas.microsoft.com/office/word/2010/wordprocessingCanvas" xmlns:cx="http://schemas.microsoft.com/office/drawing/2014/chartex" xmlns:cx1="http://schemas.microsoft.com/office/drawing/2015/9/8/chartex" xmlns:cx2="http://schemas.microsoft.com/office/drawing/2015/10/21/chartex" xmlns:cx3="http://schemas.microsoft.com/office/drawing/2016/5/9/chartex" xmlns:cx4="http://schemas.microsoft.com/office/drawing/2016/5/10/chartex" xmlns:cx5="http://schemas.microsoft.com/office/drawing/2016/5/11/chartex" xmlns:cx6="http://schemas.microsoft.com/office/drawing/2016/5/12/chartex" xmlns:cx7="http://schemas.microsoft.com/office/drawing/2016/5/13/chartex" xmlns:cx8="http://schemas.microsoft.com/office/drawing/2016/5/14/chartex" xmlns:mc="http://schemas.openxmlformats.org/markup-compatibility/2006" xmlns:aink="http://schemas.microsoft.com/office/drawing/2016/ink" xmlns:am3d="http://schemas.microsoft.com/office/drawing/2017/model3d" xmlns:o="urn:schemas-microsoft-com:office:office" xmlns:oel="http://schemas.microsoft.com/office/2019/extlst" xmlns:r="http://schemas.openxmlformats.org/officeDocument/2006/relationships" xmlns:m="http://schemas.openxmlformats.org/officeDocument/2006/math" xmlns:v="urn:schemas-microsoft-com:vml" xmlns:wp14="http://schemas.microsoft.com/office/word/2010/wordprocessingDrawing" xmlns:wp="http://schemas.openxmlformats.org/drawingml/2006/wordprocessingDrawing" xmlns:w10="urn:schemas-microsoft-com:office:word" xmlns:w="http://schemas.openxmlformats.org/wordprocessingml/2006/main" xmlns:w14="http://schemas.microsoft.com/office/word/2010/wordml" xmlns:w15="http://schemas.microsoft.com/office/word/2012/wordml" xmlns:w16cex="http://schemas.microsoft.com/office/word/2018/wordml/cex" xmlns:w16cid="http://schemas.microsoft.com/office/word/2016/wordml/cid" xmlns:w16="http://schemas.microsoft.com/office/word/2018/wordml" xmlns:w16sdtdh="http://schemas.microsoft.com/office/word/2020/wordml/sdtdatahash" xmlns:w16se="http://schemas.microsoft.com/office/word/2015/wordml/symex" xmlns:wpg="http://schemas.microsoft.com/office/word/2010/wordprocessingGroup" xmlns:wpi="http://schemas.microsoft.com/office/word/2010/wordprocessingInk" xmlns:wne="http://schemas.microsoft.com/office/word/2006/wordml" xmlns:wps="http://schemas.microsoft.com/office/word/2010/wordprocessingShape" mc:Ignorable="w14 w15 w16se w16cid w16 w16cex w16sdtdh wp14">
-  <w:p>
-    <w:pPr>
-      <w:pStyle w:val="Header"/>
-    </w:pPr>
-  </w:p>
-</w:hdr>
-</file>
-
-<file path=word/header2.xml><?xml version="1.0" encoding="utf-8"?>
-<w:hdr xmlns:wpc="http://schemas.microsoft.com/office/word/2010/wordprocessingCanvas" xmlns:cx="http://schemas.microsoft.com/office/drawing/2014/chartex" xmlns:cx1="http://schemas.microsoft.com/office/drawing/2015/9/8/chartex" xmlns:cx2="http://schemas.microsoft.com/office/drawing/2015/10/21/chartex" xmlns:cx3="http://schemas.microsoft.com/office/drawing/2016/5/9/chartex" xmlns:cx4="http://schemas.microsoft.com/office/drawing/2016/5/10/chartex" xmlns:cx5="http://schemas.microsoft.com/office/drawing/2016/5/11/chartex" xmlns:cx6="http://schemas.microsoft.com/office/drawing/2016/5/12/chartex" xmlns:cx7="http://schemas.microsoft.com/office/drawing/2016/5/13/chartex" xmlns:cx8="http://schemas.microsoft.com/office/drawing/2016/5/14/chartex" xmlns:mc="http://schemas.openxmlformats.org/markup-compatibility/2006" xmlns:aink="http://schemas.microsoft.com/office/drawing/2016/ink" xmlns:am3d="http://schemas.microsoft.com/office/drawing/2017/model3d" xmlns:o="urn:schemas-microsoft-com:office:office" xmlns:oel="http://schemas.microsoft.com/office/2019/extlst" xmlns:r="http://schemas.openxmlformats.org/officeDocument/2006/relationships" xmlns:m="http://schemas.openxmlformats.org/officeDocument/2006/math" xmlns:v="urn:schemas-microsoft-com:vml" xmlns:wp14="http://schemas.microsoft.com/office/word/2010/wordprocessingDrawing" xmlns:wp="http://schemas.openxmlformats.org/drawingml/2006/wordprocessingDrawing" xmlns:w10="urn:schemas-microsoft-com:office:word" xmlns:w="http://schemas.openxmlformats.org/wordprocessingml/2006/main" xmlns:w14="http://schemas.microsoft.com/office/word/2010/wordml" xmlns:w15="http://schemas.microsoft.com/office/word/2012/wordml" xmlns:w16cex="http://schemas.microsoft.com/office/word/2018/wordml/cex" xmlns:w16cid="http://schemas.microsoft.com/office/word/2016/wordml/cid" xmlns:w16="http://schemas.microsoft.com/office/word/2018/wordml" xmlns:w16sdtdh="http://schemas.microsoft.com/office/word/2020/wordml/sdtdatahash" xmlns:w16se="http://schemas.microsoft.com/office/word/2015/wordml/symex" xmlns:wpg="http://schemas.microsoft.com/office/word/2010/wordprocessingGroup" xmlns:wpi="http://schemas.microsoft.com/office/word/2010/wordprocessingInk" xmlns:wne="http://schemas.microsoft.com/office/word/2006/wordml" xmlns:wps="http://schemas.microsoft.com/office/word/2010/wordprocessingShape" mc:Ignorable="w14 w15 w16se w16cid w16 w16cex w16sdtdh wp14">
-  <w:tbl>
-    <w:tblPr>
-      <w:tblStyle w:val="TableGrid"/>
-      <w:tblW w:w="10915" w:type="dxa"/>
-      <w:tblInd w:w="108" w:type="dxa"/>
-      <w:tblBorders>
-        <w:top w:val="none" w:sz="0" w:space="0" w:color="auto"/>
-        <w:left w:val="none" w:sz="0" w:space="0" w:color="auto"/>
-        <w:bottom w:val="none" w:sz="0" w:space="0" w:color="auto"/>
-        <w:right w:val="none" w:sz="0" w:space="0" w:color="auto"/>
-        <w:insideH w:val="none" w:sz="0" w:space="0" w:color="auto"/>
-        <w:insideV w:val="none" w:sz="0" w:space="0" w:color="auto"/>
-      </w:tblBorders>
-      <w:tblLook w:val="04A0" w:firstRow="1" w:lastRow="0" w:firstColumn="1" w:lastColumn="0" w:noHBand="0" w:noVBand="1"/>
-    </w:tblPr>
-    <w:tblGrid>
-      <w:gridCol w:w="1322"/>
-      <w:gridCol w:w="9593"/>
-    </w:tblGrid>
-    <w:tr>
-      <w:trPr>
-        <w:trHeight w:val="1867"/>
-      </w:trPr>
-      <w:tc>
-        <w:tcPr>
-          <w:tcW w:w="1322" w:type="dxa"/>
-        </w:tcPr>
-        <w:p>
-          <w:pPr>
-            <w:pStyle w:val="Header"/>
-          </w:pPr>
-          <w:r>
-            <w:rPr>
-              <w:noProof/>
-            </w:rPr>
-            <w:drawing>
-              <wp:anchor distT="0" distB="0" distL="114300" distR="114300" simplePos="0" relativeHeight="251656192" behindDoc="1" locked="0" layoutInCell="1" allowOverlap="1" wp14:anchorId="6C1D62D8" wp14:editId="3E65E39E">
-                <wp:simplePos x="0" y="0"/>
-                <wp:positionH relativeFrom="column">
-                  <wp:posOffset>689379</wp:posOffset>
-                </wp:positionH>
-                <wp:positionV relativeFrom="paragraph">
-                  <wp:posOffset>-11875</wp:posOffset>
-                </wp:positionV>
-                <wp:extent cx="78740" cy="1292225"/>
-                <wp:effectExtent l="0" t="0" r="0" b="3175"/>
-                <wp:wrapTight wrapText="bothSides">
-                  <wp:wrapPolygon edited="0">
-                    <wp:start x="0" y="0"/>
-                    <wp:lineTo x="0" y="21335"/>
-                    <wp:lineTo x="15677" y="21335"/>
-                    <wp:lineTo x="15677" y="0"/>
-                    <wp:lineTo x="0" y="0"/>
-                  </wp:wrapPolygon>
-                </wp:wrapTight>
-                <wp:docPr id="9" name="Picture 9"/>
-                <wp:cNvGraphicFramePr>
-                  <a:graphicFrameLocks xmlns:a="http://schemas.openxmlformats.org/drawingml/2006/main" noChangeAspect="1"/>
-                </wp:cNvGraphicFramePr>
-                <a:graphic xmlns:a="http://schemas.openxmlformats.org/drawingml/2006/main">
-                  <a:graphicData uri="http://schemas.openxmlformats.org/drawingml/2006/picture">
-                    <pic:pic xmlns:pic="http://schemas.openxmlformats.org/drawingml/2006/picture">
-                      <pic:nvPicPr>
-                        <pic:cNvPr id="2" name="Picture 2"/>
-                        <pic:cNvPicPr>
-                          <a:picLocks noChangeAspect="1"/>
-                        </pic:cNvPicPr>
-                      </pic:nvPicPr>
-                      <pic:blipFill>
-                        <a:blip r:embed="rId1" cstate="print">
-                          <a:extLst>
-                            <a:ext uri="{28A0092B-C50C-407E-A947-70E740481C1C}">
-                              <a14:useLocalDpi xmlns:a14="http://schemas.microsoft.com/office/drawing/2010/main" val="0"/>
-                            </a:ext>
-                          </a:extLst>
-                        </a:blip>
-                        <a:stretch>
-                          <a:fillRect/>
-                        </a:stretch>
-                      </pic:blipFill>
-                      <pic:spPr>
-                        <a:xfrm>
-                          <a:off x="0" y="0"/>
-                          <a:ext cx="78740" cy="1292225"/>
-                        </a:xfrm>
-                        <a:prstGeom prst="rect">
-                          <a:avLst/>
-                        </a:prstGeom>
-                      </pic:spPr>
-                    </pic:pic>
-                  </a:graphicData>
-                </a:graphic>
-              </wp:anchor>
-            </w:drawing>
-          </w:r>
-        </w:p>
-        <w:p>
-          <w:pPr>
-            <w:pStyle w:val="Header"/>
-          </w:pPr>
-          <w:r>
-            <w:rPr>
-              <w:noProof/>
-            </w:rPr>
-            <w:drawing>
-              <wp:anchor distT="0" distB="0" distL="114300" distR="114300" simplePos="0" relativeHeight="251659264" behindDoc="1" locked="0" layoutInCell="1" allowOverlap="1" wp14:anchorId="65D9F4A5" wp14:editId="758B4C62">
-                <wp:simplePos x="0" y="0"/>
-                <wp:positionH relativeFrom="column">
-                  <wp:posOffset>5847</wp:posOffset>
-                </wp:positionH>
-                <wp:positionV relativeFrom="paragraph">
-                  <wp:posOffset>100602</wp:posOffset>
-                </wp:positionV>
-                <wp:extent cx="648970" cy="819785"/>
-                <wp:effectExtent l="0" t="0" r="0" b="0"/>
-                <wp:wrapTight wrapText="bothSides">
-                  <wp:wrapPolygon edited="0">
-                    <wp:start x="8243" y="0"/>
-                    <wp:lineTo x="3804" y="3012"/>
-                    <wp:lineTo x="0" y="7027"/>
-                    <wp:lineTo x="0" y="10039"/>
-                    <wp:lineTo x="8877" y="16564"/>
-                    <wp:lineTo x="2536" y="17568"/>
-                    <wp:lineTo x="0" y="18572"/>
-                    <wp:lineTo x="0" y="21081"/>
-                    <wp:lineTo x="20924" y="21081"/>
-                    <wp:lineTo x="20924" y="19074"/>
-                    <wp:lineTo x="19656" y="18070"/>
-                    <wp:lineTo x="12047" y="16564"/>
-                    <wp:lineTo x="20924" y="9537"/>
-                    <wp:lineTo x="20924" y="7027"/>
-                    <wp:lineTo x="16485" y="3012"/>
-                    <wp:lineTo x="12681" y="0"/>
-                    <wp:lineTo x="8243" y="0"/>
-                  </wp:wrapPolygon>
-                </wp:wrapTight>
-                <wp:docPr id="10" name="Picture 10"/>
-                <wp:cNvGraphicFramePr>
-                  <a:graphicFrameLocks xmlns:a="http://schemas.openxmlformats.org/drawingml/2006/main" noChangeAspect="1"/>
-                </wp:cNvGraphicFramePr>
-                <a:graphic xmlns:a="http://schemas.openxmlformats.org/drawingml/2006/main">
-                  <a:graphicData uri="http://schemas.openxmlformats.org/drawingml/2006/picture">
-                    <pic:pic xmlns:pic="http://schemas.openxmlformats.org/drawingml/2006/picture">
-                      <pic:nvPicPr>
-                        <pic:cNvPr id="1" name="Picture 1"/>
-                        <pic:cNvPicPr>
-                          <a:picLocks noChangeAspect="1"/>
-                        </pic:cNvPicPr>
-                      </pic:nvPicPr>
-                      <pic:blipFill>
-                        <a:blip r:embed="rId2" cstate="print">
-                          <a:extLst>
-                            <a:ext uri="{28A0092B-C50C-407E-A947-70E740481C1C}">
-                              <a14:useLocalDpi xmlns:a14="http://schemas.microsoft.com/office/drawing/2010/main" val="0"/>
-                            </a:ext>
-                          </a:extLst>
-                        </a:blip>
-                        <a:stretch>
-                          <a:fillRect/>
-                        </a:stretch>
-                      </pic:blipFill>
-                      <pic:spPr>
-                        <a:xfrm>
-                          <a:off x="0" y="0"/>
-                          <a:ext cx="648970" cy="819785"/>
-                        </a:xfrm>
-                        <a:prstGeom prst="rect">
-                          <a:avLst/>
-                        </a:prstGeom>
-                      </pic:spPr>
-                    </pic:pic>
-                  </a:graphicData>
-                </a:graphic>
-              </wp:anchor>
-            </w:drawing>
-          </w:r>
-        </w:p>
-      </w:tc>
-      <w:tc>
-        <w:tcPr>
-          <w:tcW w:w="9593" w:type="dxa"/>
-        </w:tcPr>
-        <w:p>
-          <w:pPr>
-            <w:rPr>
-              <w:rFonts w:ascii="Arial Narrow" w:hAnsi="Arial Narrow"/>
-              <w:b/>
-              <w:bCs/>
-              <w:sz w:val="32"/>
-              <w:szCs w:val="32"/>
-            </w:rPr>
-          </w:pPr>
-        </w:p>
-        <w:p>
-          <w:pPr>
-            <w:rPr>
-              <w:rFonts w:ascii="Arial Narrow" w:hAnsi="Arial Narrow"/>
-              <w:b/>
-              <w:bCs/>
-              <w:sz w:val="32"/>
-              <w:szCs w:val="32"/>
-            </w:rPr>
-          </w:pPr>
-          <w:r>
-            <w:rPr>
-              <w:rFonts w:ascii="Arial Narrow" w:hAnsi="Arial Narrow"/>
-              <w:b/>
-              <w:bCs/>
-              <w:sz w:val="32"/>
-              <w:szCs w:val="32"/>
-            </w:rPr>
-            <w:t xml:space="preserve"> </w:t>
-          </w:r>
-          <w:r>
-            <w:rPr>
-              <w:rFonts w:ascii="Arial Narrow" w:hAnsi="Arial Narrow"/>
-              <w:b/>
-              <w:bCs/>
-              <w:sz w:val="32"/>
-              <w:szCs w:val="32"/>
-            </w:rPr>
-            <w:t>KEMENTERIAN KETENAGAKERJAAN REPUBLIK INDONESIA</w:t>
-          </w:r>
-        </w:p>
-        <w:p>
-          <w:pPr>
-            <w:rPr>
-              <w:rFonts w:ascii="Arial Narrow" w:hAnsi="Arial Narrow"/>
-              <w:color w:val="284A61"/>
-              <w:sz w:val="32"/>
-              <w:szCs w:val="32"/>
-            </w:rPr>
-          </w:pPr>
-          <w:r>
-            <w:rPr>
-              <w:rFonts w:ascii="Arial Narrow" w:hAnsi="Arial Narrow"/>
-              <w:color w:val="284A61"/>
-              <w:sz w:val="32"/>
-              <w:szCs w:val="32"/>
-            </w:rPr>
-            <w:t xml:space="preserve"> </w:t>
-          </w:r>
-          <w:r>
-            <w:rPr>
-              <w:rFonts w:ascii="Arial Narrow" w:hAnsi="Arial Narrow"/>
-              <w:color w:val="284A61"/>
-              <w:sz w:val="32"/>
-              <w:szCs w:val="32"/>
-            </w:rPr>
-            <w:t>SEKRETARIAT JENDERAL</w:t>
-          </w:r>
-        </w:p>
-      </w:tc>
-    </w:tr>
-  </w:tbl>
-  <w:p>
-    <w:pPr>
-      <w:pStyle w:val="Header"/>
-    </w:pPr>
-  </w:p>
-</w:hdr>
-</file>
-
-<file path=word/header3.xml><?xml version="1.0" encoding="utf-8"?>
-<w:hdr xmlns:wpc="http://schemas.microsoft.com/office/word/2010/wordprocessingCanvas" xmlns:cx="http://schemas.microsoft.com/office/drawing/2014/chartex" xmlns:cx1="http://schemas.microsoft.com/office/drawing/2015/9/8/chartex" xmlns:cx2="http://schemas.microsoft.com/office/drawing/2015/10/21/chartex" xmlns:cx3="http://schemas.microsoft.com/office/drawing/2016/5/9/chartex" xmlns:cx4="http://schemas.microsoft.com/office/drawing/2016/5/10/chartex" xmlns:cx5="http://schemas.microsoft.com/office/drawing/2016/5/11/chartex" xmlns:cx6="http://schemas.microsoft.com/office/drawing/2016/5/12/chartex" xmlns:cx7="http://schemas.microsoft.com/office/drawing/2016/5/13/chartex" xmlns:cx8="http://schemas.microsoft.com/office/drawing/2016/5/14/chartex" xmlns:mc="http://schemas.openxmlformats.org/markup-compatibility/2006" xmlns:aink="http://schemas.microsoft.com/office/drawing/2016/ink" xmlns:am3d="http://schemas.microsoft.com/office/drawing/2017/model3d" xmlns:o="urn:schemas-microsoft-com:office:office" xmlns:oel="http://schemas.microsoft.com/office/2019/extlst" xmlns:r="http://schemas.openxmlformats.org/officeDocument/2006/relationships" xmlns:m="http://schemas.openxmlformats.org/officeDocument/2006/math" xmlns:v="urn:schemas-microsoft-com:vml" xmlns:wp14="http://schemas.microsoft.com/office/word/2010/wordprocessingDrawing" xmlns:wp="http://schemas.openxmlformats.org/drawingml/2006/wordprocessingDrawing" xmlns:w10="urn:schemas-microsoft-com:office:word" xmlns:w="http://schemas.openxmlformats.org/wordprocessingml/2006/main" xmlns:w14="http://schemas.microsoft.com/office/word/2010/wordml" xmlns:w15="http://schemas.microsoft.com/office/word/2012/wordml" xmlns:w16cex="http://schemas.microsoft.com/office/word/2018/wordml/cex" xmlns:w16cid="http://schemas.microsoft.com/office/word/2016/wordml/cid" xmlns:w16="http://schemas.microsoft.com/office/word/2018/wordml" xmlns:w16sdtdh="http://schemas.microsoft.com/office/word/2020/wordml/sdtdatahash" xmlns:w16se="http://schemas.microsoft.com/office/word/2015/wordml/symex" xmlns:wpg="http://schemas.microsoft.com/office/word/2010/wordprocessingGroup" xmlns:wpi="http://schemas.microsoft.com/office/word/2010/wordprocessingInk" xmlns:wne="http://schemas.microsoft.com/office/word/2006/wordml" xmlns:wps="http://schemas.microsoft.com/office/word/2010/wordprocessingShape" mc:Ignorable="w14 w15 w16se w16cid w16 w16cex w16sdtdh wp14">
-  <w:p>
-    <w:pPr>
-      <w:pStyle w:val="Header"/>
-    </w:pPr>
-  </w:p>
-</w:hdr>
-</file>
-
-<file path=word/header4.xml><?xml version="1.0" encoding="utf-8"?>
-<w:hdr xmlns:wpc="http://schemas.microsoft.com/office/word/2010/wordprocessingCanvas" xmlns:cx="http://schemas.microsoft.com/office/drawing/2014/chartex" xmlns:cx1="http://schemas.microsoft.com/office/drawing/2015/9/8/chartex" xmlns:cx2="http://schemas.microsoft.com/office/drawing/2015/10/21/chartex" xmlns:cx3="http://schemas.microsoft.com/office/drawing/2016/5/9/chartex" xmlns:cx4="http://schemas.microsoft.com/office/drawing/2016/5/10/chartex" xmlns:cx5="http://schemas.microsoft.com/office/drawing/2016/5/11/chartex" xmlns:cx6="http://schemas.microsoft.com/office/drawing/2016/5/12/chartex" xmlns:cx7="http://schemas.microsoft.com/office/drawing/2016/5/13/chartex" xmlns:cx8="http://schemas.microsoft.com/office/drawing/2016/5/14/chartex" xmlns:mc="http://schemas.openxmlformats.org/markup-compatibility/2006" xmlns:aink="http://schemas.microsoft.com/office/drawing/2016/ink" xmlns:am3d="http://schemas.microsoft.com/office/drawing/2017/model3d" xmlns:o="urn:schemas-microsoft-com:office:office" xmlns:oel="http://schemas.microsoft.com/office/2019/extlst" xmlns:r="http://schemas.openxmlformats.org/officeDocument/2006/relationships" xmlns:m="http://schemas.openxmlformats.org/officeDocument/2006/math" xmlns:v="urn:schemas-microsoft-com:vml" xmlns:wp14="http://schemas.microsoft.com/office/word/2010/wordprocessingDrawing" xmlns:wp="http://schemas.openxmlformats.org/drawingml/2006/wordprocessingDrawing" xmlns:w10="urn:schemas-microsoft-com:office:word" xmlns:w="http://schemas.openxmlformats.org/wordprocessingml/2006/main" xmlns:w14="http://schemas.microsoft.com/office/word/2010/wordml" xmlns:w15="http://schemas.microsoft.com/office/word/2012/wordml" xmlns:w16cex="http://schemas.microsoft.com/office/word/2018/wordml/cex" xmlns:w16cid="http://schemas.microsoft.com/office/word/2016/wordml/cid" xmlns:w16="http://schemas.microsoft.com/office/word/2018/wordml" xmlns:w16sdtdh="http://schemas.microsoft.com/office/word/2020/wordml/sdtdatahash" xmlns:w16se="http://schemas.microsoft.com/office/word/2015/wordml/symex" xmlns:wpg="http://schemas.microsoft.com/office/word/2010/wordprocessingGroup" xmlns:wpi="http://schemas.microsoft.com/office/word/2010/wordprocessingInk" xmlns:wne="http://schemas.microsoft.com/office/word/2006/wordml" xmlns:wps="http://schemas.microsoft.com/office/word/2010/wordprocessingShape" mc:Ignorable="w14 w15 w16se w16cid w16 w16cex w16sdtdh wp14">
-  <w:p>
-    <w:pPr>
-      <w:pStyle w:val="Header"/>
-    </w:pPr>
-  </w:p>
-</w:hdr>
-</file>
-
-<file path=word/header5.xml><?xml version="1.0" encoding="utf-8"?>
-<w:hdr xmlns:wpc="http://schemas.microsoft.com/office/word/2010/wordprocessingCanvas" xmlns:cx="http://schemas.microsoft.com/office/drawing/2014/chartex" xmlns:cx1="http://schemas.microsoft.com/office/drawing/2015/9/8/chartex" xmlns:cx2="http://schemas.microsoft.com/office/drawing/2015/10/21/chartex" xmlns:cx3="http://schemas.microsoft.com/office/drawing/2016/5/9/chartex" xmlns:cx4="http://schemas.microsoft.com/office/drawing/2016/5/10/chartex" xmlns:cx5="http://schemas.microsoft.com/office/drawing/2016/5/11/chartex" xmlns:cx6="http://schemas.microsoft.com/office/drawing/2016/5/12/chartex" xmlns:cx7="http://schemas.microsoft.com/office/drawing/2016/5/13/chartex" xmlns:cx8="http://schemas.microsoft.com/office/drawing/2016/5/14/chartex" xmlns:mc="http://schemas.openxmlformats.org/markup-compatibility/2006" xmlns:aink="http://schemas.microsoft.com/office/drawing/2016/ink" xmlns:am3d="http://schemas.microsoft.com/office/drawing/2017/model3d" xmlns:o="urn:schemas-microsoft-com:office:office" xmlns:oel="http://schemas.microsoft.com/office/2019/extlst" xmlns:r="http://schemas.openxmlformats.org/officeDocument/2006/relationships" xmlns:m="http://schemas.openxmlformats.org/officeDocument/2006/math" xmlns:v="urn:schemas-microsoft-com:vml" xmlns:wp14="http://schemas.microsoft.com/office/word/2010/wordprocessingDrawing" xmlns:wp="http://schemas.openxmlformats.org/drawingml/2006/wordprocessingDrawing" xmlns:w10="urn:schemas-microsoft-com:office:word" xmlns:w="http://schemas.openxmlformats.org/wordprocessingml/2006/main" xmlns:w14="http://schemas.microsoft.com/office/word/2010/wordml" xmlns:w15="http://schemas.microsoft.com/office/word/2012/wordml" xmlns:w16cex="http://schemas.microsoft.com/office/word/2018/wordml/cex" xmlns:w16cid="http://schemas.microsoft.com/office/word/2016/wordml/cid" xmlns:w16="http://schemas.microsoft.com/office/word/2018/wordml" xmlns:w16sdtdh="http://schemas.microsoft.com/office/word/2020/wordml/sdtdatahash" xmlns:w16se="http://schemas.microsoft.com/office/word/2015/wordml/symex" xmlns:wpg="http://schemas.microsoft.com/office/word/2010/wordprocessingGroup" xmlns:wpi="http://schemas.microsoft.com/office/word/2010/wordprocessingInk" xmlns:wne="http://schemas.microsoft.com/office/word/2006/wordml" xmlns:wps="http://schemas.microsoft.com/office/word/2010/wordprocessingShape" mc:Ignorable="w14 w15 w16se w16cid w16 w16cex w16sdtdh wp14">
+<w:hdr xmlns:wpc="http://schemas.microsoft.com/office/word/2010/wordprocessingCanvas" xmlns:cx="http://schemas.microsoft.com/office/drawing/2014/chartex" xmlns:cx1="http://schemas.microsoft.com/office/drawing/2015/9/8/chartex" xmlns:cx2="http://schemas.microsoft.com/office/drawing/2015/10/21/chartex" xmlns:cx3="http://schemas.microsoft.com/office/drawing/2016/5/9/chartex" xmlns:cx4="http://schemas.microsoft.com/office/drawing/2016/5/10/chartex" xmlns:cx5="http://schemas.microsoft.com/office/drawing/2016/5/11/chartex" xmlns:cx6="http://schemas.microsoft.com/office/drawing/2016/5/12/chartex" xmlns:cx7="http://schemas.microsoft.com/office/drawing/2016/5/13/chartex" xmlns:cx8="http://schemas.microsoft.com/office/drawing/2016/5/14/chartex" xmlns:mc="http://schemas.openxmlformats.org/markup-compatibility/2006" xmlns:aink="http://schemas.microsoft.com/office/drawing/2016/ink" xmlns:am3d="http://schemas.microsoft.com/office/drawing/2017/model3d" xmlns:o="urn:schemas-microsoft-com:office:office" xmlns:oel="http://schemas.microsoft.com/office/2019/extlst" xmlns:r="http://schemas.openxmlformats.org/officeDocument/2006/relationships" xmlns:m="http://schemas.openxmlformats.org/officeDocument/2006/math" xmlns:v="urn:schemas-microsoft-com:vml" xmlns:wp14="http://schemas.microsoft.com/office/word/2010/wordprocessingDrawing" xmlns:wp="http://schemas.openxmlformats.org/drawingml/2006/wordprocessingDrawing" xmlns:w10="urn:schemas-microsoft-com:office:word" xmlns:w="http://schemas.openxmlformats.org/wordprocessingml/2006/main" xmlns:w14="http://schemas.microsoft.com/office/word/2010/wordml" xmlns:w15="http://schemas.microsoft.com/office/word/2012/wordml" xmlns:w16cex="http://schemas.microsoft.com/office/word/2018/wordml/cex" xmlns:w16cid="http://schemas.microsoft.com/office/word/2016/wordml/cid" xmlns:w16="http://schemas.microsoft.com/office/word/2018/wordml" xmlns:w16du="http://schemas.microsoft.com/office/word/2023/wordml/word16du" xmlns:w16sdtdh="http://schemas.microsoft.com/office/word/2020/wordml/sdtdatahash" xmlns:w16sdtfl="http://schemas.microsoft.com/office/word/2024/wordml/sdtformatlock" xmlns:w16se="http://schemas.microsoft.com/office/word/2015/wordml/symex" xmlns:wpg="http://schemas.microsoft.com/office/word/2010/wordprocessingGroup" xmlns:wpi="http://schemas.microsoft.com/office/word/2010/wordprocessingInk" xmlns:wne="http://schemas.microsoft.com/office/word/2006/wordml" xmlns:wps="http://schemas.microsoft.com/office/word/2010/wordprocessingShape" mc:Ignorable="w14 w15 w16se w16cid w16 w16cex w16sdtdh w16sdtfl w16du wp14">
   <w:p>
     <w:pPr>
       <w:pStyle w:val="BodyText"/>
@@ -6160,7 +5710,7 @@
 </file>
 
 <file path=word/numbering.xml><?xml version="1.0" encoding="utf-8"?>
-<w:numbering xmlns:wpc="http://schemas.microsoft.com/office/word/2010/wordprocessingCanvas" xmlns:cx="http://schemas.microsoft.com/office/drawing/2014/chartex" xmlns:cx1="http://schemas.microsoft.com/office/drawing/2015/9/8/chartex" xmlns:cx2="http://schemas.microsoft.com/office/drawing/2015/10/21/chartex" xmlns:cx3="http://schemas.microsoft.com/office/drawing/2016/5/9/chartex" xmlns:cx4="http://schemas.microsoft.com/office/drawing/2016/5/10/chartex" xmlns:cx5="http://schemas.microsoft.com/office/drawing/2016/5/11/chartex" xmlns:cx6="http://schemas.microsoft.com/office/drawing/2016/5/12/chartex" xmlns:cx7="http://schemas.microsoft.com/office/drawing/2016/5/13/chartex" xmlns:cx8="http://schemas.microsoft.com/office/drawing/2016/5/14/chartex" xmlns:mc="http://schemas.openxmlformats.org/markup-compatibility/2006" xmlns:aink="http://schemas.microsoft.com/office/drawing/2016/ink" xmlns:am3d="http://schemas.microsoft.com/office/drawing/2017/model3d" xmlns:o="urn:schemas-microsoft-com:office:office" xmlns:oel="http://schemas.microsoft.com/office/2019/extlst" xmlns:r="http://schemas.openxmlformats.org/officeDocument/2006/relationships" xmlns:m="http://schemas.openxmlformats.org/officeDocument/2006/math" xmlns:v="urn:schemas-microsoft-com:vml" xmlns:wp14="http://schemas.microsoft.com/office/word/2010/wordprocessingDrawing" xmlns:wp="http://schemas.openxmlformats.org/drawingml/2006/wordprocessingDrawing" xmlns:w10="urn:schemas-microsoft-com:office:word" xmlns:w="http://schemas.openxmlformats.org/wordprocessingml/2006/main" xmlns:w14="http://schemas.microsoft.com/office/word/2010/wordml" xmlns:w15="http://schemas.microsoft.com/office/word/2012/wordml" xmlns:w16cex="http://schemas.microsoft.com/office/word/2018/wordml/cex" xmlns:w16cid="http://schemas.microsoft.com/office/word/2016/wordml/cid" xmlns:w16="http://schemas.microsoft.com/office/word/2018/wordml" xmlns:w16sdtdh="http://schemas.microsoft.com/office/word/2020/wordml/sdtdatahash" xmlns:w16se="http://schemas.microsoft.com/office/word/2015/wordml/symex" xmlns:wpg="http://schemas.microsoft.com/office/word/2010/wordprocessingGroup" xmlns:wpi="http://schemas.microsoft.com/office/word/2010/wordprocessingInk" xmlns:wne="http://schemas.microsoft.com/office/word/2006/wordml" xmlns:wps="http://schemas.microsoft.com/office/word/2010/wordprocessingShape" mc:Ignorable="w14 w15 w16se w16cid w16 w16cex w16sdtdh wp14">
+<w:numbering xmlns:wpc="http://schemas.microsoft.com/office/word/2010/wordprocessingCanvas" xmlns:cx="http://schemas.microsoft.com/office/drawing/2014/chartex" xmlns:cx1="http://schemas.microsoft.com/office/drawing/2015/9/8/chartex" xmlns:cx2="http://schemas.microsoft.com/office/drawing/2015/10/21/chartex" xmlns:cx3="http://schemas.microsoft.com/office/drawing/2016/5/9/chartex" xmlns:cx4="http://schemas.microsoft.com/office/drawing/2016/5/10/chartex" xmlns:cx5="http://schemas.microsoft.com/office/drawing/2016/5/11/chartex" xmlns:cx6="http://schemas.microsoft.com/office/drawing/2016/5/12/chartex" xmlns:cx7="http://schemas.microsoft.com/office/drawing/2016/5/13/chartex" xmlns:cx8="http://schemas.microsoft.com/office/drawing/2016/5/14/chartex" xmlns:mc="http://schemas.openxmlformats.org/markup-compatibility/2006" xmlns:aink="http://schemas.microsoft.com/office/drawing/2016/ink" xmlns:am3d="http://schemas.microsoft.com/office/drawing/2017/model3d" xmlns:o="urn:schemas-microsoft-com:office:office" xmlns:oel="http://schemas.microsoft.com/office/2019/extlst" xmlns:r="http://schemas.openxmlformats.org/officeDocument/2006/relationships" xmlns:m="http://schemas.openxmlformats.org/officeDocument/2006/math" xmlns:v="urn:schemas-microsoft-com:vml" xmlns:wp14="http://schemas.microsoft.com/office/word/2010/wordprocessingDrawing" xmlns:wp="http://schemas.openxmlformats.org/drawingml/2006/wordprocessingDrawing" xmlns:w10="urn:schemas-microsoft-com:office:word" xmlns:w="http://schemas.openxmlformats.org/wordprocessingml/2006/main" xmlns:w14="http://schemas.microsoft.com/office/word/2010/wordml" xmlns:w15="http://schemas.microsoft.com/office/word/2012/wordml" xmlns:w16cex="http://schemas.microsoft.com/office/word/2018/wordml/cex" xmlns:w16cid="http://schemas.microsoft.com/office/word/2016/wordml/cid" xmlns:w16="http://schemas.microsoft.com/office/word/2018/wordml" xmlns:w16du="http://schemas.microsoft.com/office/word/2023/wordml/word16du" xmlns:w16sdtdh="http://schemas.microsoft.com/office/word/2020/wordml/sdtdatahash" xmlns:w16sdtfl="http://schemas.microsoft.com/office/word/2024/wordml/sdtformatlock" xmlns:w16se="http://schemas.microsoft.com/office/word/2015/wordml/symex" xmlns:wpg="http://schemas.microsoft.com/office/word/2010/wordprocessingGroup" xmlns:wpi="http://schemas.microsoft.com/office/word/2010/wordprocessingInk" xmlns:wne="http://schemas.microsoft.com/office/word/2006/wordml" xmlns:wps="http://schemas.microsoft.com/office/word/2010/wordprocessingShape" mc:Ignorable="w14 w15 w16se w16cid w16 w16cex w16sdtdh w16sdtfl w16du wp14">
   <w:abstractNum w:abstractNumId="0" w15:restartNumberingAfterBreak="0">
     <w:nsid w:val="0CEB530B"/>
     <w:multiLevelType w:val="hybridMultilevel"/>
@@ -6804,7 +6354,7 @@
 </file>
 
 <file path=word/styles.xml><?xml version="1.0" encoding="utf-8"?>
-<w:styles xmlns:mc="http://schemas.openxmlformats.org/markup-compatibility/2006" xmlns:r="http://schemas.openxmlformats.org/officeDocument/2006/relationships" xmlns:w="http://schemas.openxmlformats.org/wordprocessingml/2006/main" xmlns:w14="http://schemas.microsoft.com/office/word/2010/wordml" xmlns:w15="http://schemas.microsoft.com/office/word/2012/wordml" xmlns:w16cex="http://schemas.microsoft.com/office/word/2018/wordml/cex" xmlns:w16cid="http://schemas.microsoft.com/office/word/2016/wordml/cid" xmlns:w16="http://schemas.microsoft.com/office/word/2018/wordml" xmlns:w16sdtdh="http://schemas.microsoft.com/office/word/2020/wordml/sdtdatahash" xmlns:w16se="http://schemas.microsoft.com/office/word/2015/wordml/symex" mc:Ignorable="w14 w15 w16se w16cid w16 w16cex w16sdtdh">
+<w:styles xmlns:mc="http://schemas.openxmlformats.org/markup-compatibility/2006" xmlns:r="http://schemas.openxmlformats.org/officeDocument/2006/relationships" xmlns:w="http://schemas.openxmlformats.org/wordprocessingml/2006/main" xmlns:w14="http://schemas.microsoft.com/office/word/2010/wordml" xmlns:w15="http://schemas.microsoft.com/office/word/2012/wordml" xmlns:w16cex="http://schemas.microsoft.com/office/word/2018/wordml/cex" xmlns:w16cid="http://schemas.microsoft.com/office/word/2016/wordml/cid" xmlns:w16="http://schemas.microsoft.com/office/word/2018/wordml" xmlns:w16du="http://schemas.microsoft.com/office/word/2023/wordml/word16du" xmlns:w16sdtdh="http://schemas.microsoft.com/office/word/2020/wordml/sdtdatahash" xmlns:w16sdtfl="http://schemas.microsoft.com/office/word/2024/wordml/sdtformatlock" xmlns:w16se="http://schemas.microsoft.com/office/word/2015/wordml/symex" mc:Ignorable="w14 w15 w16se w16cid w16 w16cex w16sdtdh w16sdtfl w16du">
   <w:docDefaults>
     <w:rPrDefault>
       <w:rPr>

</xml_diff>

<commit_message>
fix(templates): remove trailing empty paragraph causing blank pages in PDF
</commit_message>
<xml_diff>
--- a/backend/templates/Berkas Luar Kota - Laporan.docx
+++ b/backend/templates/Berkas Luar Kota - Laporan.docx
@@ -5637,13 +5637,6 @@
         <w:lastRenderedPageBreak/>
         <w:t>{{lampiran_60}}</w:t>
       </w:r>
-    </w:p>
-    <w:p>
-      <w:pPr>
-        <w:tabs>
-          <w:tab w:val="left" w:pos="4354"/>
-        </w:tabs>
-      </w:pPr>
     </w:p>
     <w:sectPr>
       <w:headerReference w:type="default" r:id="rId9"/>

</xml_diff>